<commit_message>
Refine Persian paper: academic restrained tone, honest SVD comparison, and robust definitions
</commit_message>
<xml_diff>
--- a/FA_From_Transactional_Data_to_Organizational_Intelligence.docx
+++ b/FA_From_Transactional_Data_to_Organizational_Intelligence.docx
@@ -201,7 +201,7 @@
           <w:rFonts w:hint="cs"/>
           <w:rtl/>
         </w:rPr>
-        <w:t>شرکت‌های ارائه‌دهنده خدمات پرداخت و بانک‌های پذیرنده روزانه جریان عظیمی از تراکنش‌های مالی را در پایانه‌های فروشگاهی و درگاه‌های پرداخت پردازش می‌کنند؛ با این‌حال، رویکردهای متداول تحلیل سبد مشتریان در صنعت بانکداری همچنان بر شاخص‌های جدولی و تک‌بعدی تازگی، تکرار و ارزش مالی استوار بوده و از بازشناسی ساختار هم‌رخدادی و پیوندهای توپولوژیک چندسطحی میان کارت‌های پرداخت، پایانه‌های پذیرندگی و اصناف تجاری ناتوان هستند. در این مقاله، برای نخستین بار چارچوبی معماری مبتنی بر خودرمزگذار عصبی توجه‌محور مجهز به انحنای گسسته فرمن-ریچی روی ابرگراف دوبخشی کارت-پذیرنده (</w:t>
+        <w:t>تحلیل رفتار مشتریان در شبکه پرداخت الکترونیک اغلب بر شاخص‌های خلاصه‌شده جدولی نظیر تازگی، تکرار و ارزش مالی استوار است و ساختار تعاملی میان ابزارهای پرداخت، پایانه‌های پذیرندگی و اصناف تجاری را به صورت مستقیم لحاظ نمی‌کند. در این مقاله، چارچوبی مبتنی بر خودرمزگذار شبکه عصبی توجه‌محور به همراه انحنای گسسته فرمن-ریچی روی ابرگراف دوبخشی کارت-پذیرنده (</w:t>
       </w:r>
       <w:r>
         <w:rPr>
@@ -214,7 +214,7 @@
           <w:rFonts w:hint="cs"/>
           <w:rtl/>
         </w:rPr>
-        <w:t xml:space="preserve">) جهت تبدیل داده‌های خام تراکنشی به هوشمندی سازمانی و کشف رفتاری مشتریان ارائه می‌شود. در این چارچوب نوآورانه، تراکنش‌های پرداخت به‌صورت یک ابرگراف دوبخشی مدل‌سازی شده و با تصویرسازی توپولوژیک، انحنای ریمانی گسسته فرمن-ریچی بر روی یال‌های شبکه محاسبه می‌گردد تا پل‌های گلوگاهی جریان نقدینگی و خوشه‌های متراکم تجاری به دقت وزن‌دهی شوند. سپس یک شبکه توجه گراف چندسر با هدایت ضرایب هندسی انحنا، بردارهای بازنمایی فشرده کارت‌های پرداخت را در یک سازوکار خودنظارتی سه‌گانه فرا می‌گیرد. ارزیابی تجربی بر روی جریان تراکنش‌های واقعی شبیه‌سازی‌شده با </w:t>
+        <w:t xml:space="preserve">) جهت استخراج بازنمایی رفتار تراکنشی و بخش‌بندی کارت‌های پرداخت بررسی می‌شود. در این الگو، تراکنش‌ها به صورت یک ابرگراف دوبخشی مدل‌سازی شده و انحنای فرمن-ریچی بر روی یال‌های شبکه تصویرشده جهت تعدیل وزن‌های مکانیزم توجه گراف محاسبه می‌گردد تا پیوندهای گلوگاهی و خوشه‌های تجاری وزن‌دهی مناسب‌تری بیابند. ارزیابی تجربی بر روی یک مجموعه داده شبیه‌سازی‌شده شامل </w:t>
       </w:r>
       <w:r>
         <w:rPr>
@@ -259,14 +259,27 @@
         <w:rPr>
           <w:rFonts w:ascii="Times New Roman" w:hAnsi="Times New Roman" w:cs="Times New Roman"/>
         </w:rPr>
-        <w:t>35000</w:t>
-      </w:r>
-      <w:r>
-        <w:rPr>
-          <w:rFonts w:hint="cs"/>
-          <w:rtl/>
-        </w:rPr>
-        <w:t xml:space="preserve"> تراکنش مالی نشان می‌دهد که روش پیشنهادی به اطلاعات متقابل نرمال‌شده (</w:t>
+        <w:t>35</w:t>
+      </w:r>
+      <w:r>
+        <w:rPr>
+          <w:rFonts w:hint="cs"/>
+          <w:rtl/>
+        </w:rPr>
+        <w:t>,</w:t>
+      </w:r>
+      <w:r>
+        <w:rPr>
+          <w:rFonts w:ascii="Times New Roman" w:hAnsi="Times New Roman" w:cs="Times New Roman"/>
+        </w:rPr>
+        <w:t>000</w:t>
+      </w:r>
+      <w:r>
+        <w:rPr>
+          <w:rFonts w:hint="cs"/>
+          <w:rtl/>
+        </w:rPr>
+        <w:t xml:space="preserve"> تراکنش نشان می‌دهد که روش پیشنهادی به شاخص اطلاعات متقابل نرمال‌شده (</w:t>
       </w:r>
       <w:r>
         <w:rPr>
@@ -292,7 +305,7 @@
           <w:rFonts w:hint="cs"/>
           <w:rtl/>
         </w:rPr>
-        <w:t xml:space="preserve"> و ضریب تصادفی تعدیل‌شده (</w:t>
+        <w:t xml:space="preserve"> و شاخص رند تعدیل‌شده (</w:t>
       </w:r>
       <w:r>
         <w:rPr>
@@ -318,33 +331,33 @@
           <w:rFonts w:hint="cs"/>
           <w:rtl/>
         </w:rPr>
-        <w:t xml:space="preserve"> دست یافته است؛ مقادیری که در مقایسه با روش متداول جدولی، بهبودی به میزان ۳۹۶.۷ درصد در </w:t>
-      </w:r>
-      <w:r>
-        <w:rPr>
-          <w:rFonts w:ascii="Times New Roman" w:hAnsi="Times New Roman" w:cs="Times New Roman"/>
-        </w:rPr>
-        <w:t>NMI</w:t>
-      </w:r>
-      <w:r>
-        <w:rPr>
-          <w:rFonts w:hint="cs"/>
-          <w:rtl/>
-        </w:rPr>
-        <w:t xml:space="preserve"> و بیش از ۱۷۳۰ درصد در </w:t>
-      </w:r>
-      <w:r>
-        <w:rPr>
-          <w:rFonts w:ascii="Times New Roman" w:hAnsi="Times New Roman" w:cs="Times New Roman"/>
-        </w:rPr>
-        <w:t>ARI</w:t>
-      </w:r>
-      <w:r>
-        <w:rPr>
-          <w:rFonts w:hint="cs"/>
-          <w:rtl/>
-        </w:rPr>
-        <w:t xml:space="preserve"> را به ثبت رسانده و پنج پرسونای استراتژیک سازمانی با دقت تفکیک بسیار بالا استخراج می‌نماید.</w:t>
+        <w:t xml:space="preserve"> دست می‌یابد؛ این نتایج نسبت به مدل جدولی </w:t>
+      </w:r>
+      <w:r>
+        <w:rPr>
+          <w:rFonts w:ascii="Times New Roman" w:hAnsi="Times New Roman" w:cs="Times New Roman"/>
+        </w:rPr>
+        <w:t>RFM</w:t>
+      </w:r>
+      <w:r>
+        <w:rPr>
+          <w:rFonts w:hint="cs"/>
+          <w:rtl/>
+        </w:rPr>
+        <w:t xml:space="preserve"> بهبود قابل‌ملاحظه‌ای را نشان می‌دهند و در عین حال عملکردی هم‌سطح با تجزیه ماتریسی </w:t>
+      </w:r>
+      <w:r>
+        <w:rPr>
+          <w:rFonts w:ascii="Times New Roman" w:hAnsi="Times New Roman" w:cs="Times New Roman"/>
+        </w:rPr>
+        <w:t>SVD</w:t>
+      </w:r>
+      <w:r>
+        <w:rPr>
+          <w:rFonts w:hint="cs"/>
+          <w:rtl/>
+        </w:rPr>
+        <w:t xml:space="preserve"> ثبت می‌کنند، با این مزیت که امکان تلفیق ویژگی‌های گره‌ای و استنتاج بر ساختار رابطه‌ای را فراهم می‌سازد.</w:t>
       </w:r>
     </w:p>
     <w:p>
@@ -368,7 +381,7 @@
           <w:rFonts w:hint="cs"/>
           <w:rtl/>
         </w:rPr>
-        <w:t>پرداخت الکترونیک، کشف مشتری، هوشمندی سازمانی، شبکه عصبی گراف، انحنای فرمن-ریچی، ابرگراف دوبخشی، خودرمزگذار هندسی، پرسونای رفتاری</w:t>
+        <w:t>پرداخت الکترونیک، کشف مشتری، شبکه عصبی گراف، انحنای فرمن-ریچی، خودرمزگذار گراف، بازنمایی رفتار مالی</w:t>
       </w:r>
     </w:p>
     <w:p>
@@ -419,7 +432,7 @@
           <w:rFonts w:hint="cs"/>
           <w:rtl/>
         </w:rPr>
-        <w:t>تراکنش‌های کارتی در شبکه پرداخت الکترونیک، دقیق‌ترین و زنده‌ترین تصویر رفتاری از سبک زندگی، نیازهای مالی و توانگری اقتصادی آحاد جامعه را ترسیم می‌کنند. در هر لحظه از ثبت تراکنش در سوییچ‌های بانکی، مؤلفه‌های کلیدی رفتار اقتصادی شامل اطلاعات هویتی کارت بانکی پرداخت‌کننده، حجم ریالی مبادله، شناسه یکتای پایانه پذیرنده، مهر زمانی وقوع رویداد و رسته فعالیت صنف اقتصادی (همچون طلافروشی، سوپرمارکت، آهن‌آلات و مصالح ساختمانی، خدمات گردشگری و پزشکی) به ثبت می‌رسند. با این وجود، سامانه‌های سنتی هوش تجاری در صنعت پرداخت عموماً این سرمایه غنی داده‌ای را صرفاً در سطح تسویه مالی و گزارش‌های آماری ایستا مصرف کرده و ارزش استراتژیک پنهان در هم‌تنیدگی رفتاری مشتریان را نادیده می‌گذارند.</w:t>
+        <w:t>تراکنش‌های کارتی در شبکه پرداخت الکترونیک از مهم‌ترین منابع داده‌های رفتاری به شمار می‌روند. هر تراکنش در لحظه ثبت دست‌کم پنج مؤلفه را در بر دارد: مشخصه کارت بانکی، ارزش ریالی تراکنش، شناسه پایانه پذیرنده، زمان وقوع و رسته فعالیت صنف اقتصادی (مانند طلافروشی، سوپرمارکت، آهن‌آلات، خدمات مسافرتی و پزشکی). در سامانه‌های متداول گزارش‌گیری بانکی، این سوابق بیشتر برای تسویه مالی و گزارش‌های آماری جمع‌بندی می‌شوند و از ساختار ارتباطی میان آن‌ها استفاده محدودی صورت می‌گیرد.</w:t>
       </w:r>
     </w:p>
     <w:p>
@@ -431,7 +444,7 @@
           <w:rFonts w:hint="cs"/>
           <w:rtl/>
         </w:rPr>
-        <w:t>رویکرد مسلط دهه‌های اخیر در دسته‌بندی مشتریان بانکی، مدل تازگی، تکرار و ارزش مالی (</w:t>
+        <w:t>الگوی رایج بخش‌بندی مشتریان در صنعت بانکداری، مدل تازگی، تکرار و ارزش مالی (</w:t>
       </w:r>
       <w:r>
         <w:rPr>
@@ -457,7 +470,7 @@
           <w:rFonts w:hint="cs"/>
           <w:rtl/>
         </w:rPr>
-        <w:t xml:space="preserve">. این متدولوژی با خلاصه‌سازی تراکنش‌ها در قالب شاخص‌های اسکالر و اعمال الگوریتم‌هایی نظیر </w:t>
+        <w:t xml:space="preserve">. این الگو با خلاصه‌سازی داده‌ها در چند متغیر اسکالر و اعمال الگوریتم‌هایی نظیر </w:t>
       </w:r>
       <w:r>
         <w:rPr>
@@ -470,7 +483,20 @@
           <w:rFonts w:hint="cs"/>
           <w:rtl/>
         </w:rPr>
-        <w:t>، با محدودیت‌های بنیادین روبه‌رو است: نخست، فرض استقلال مشاهدات باعث کوری ساختاری نسبت به الگوهای پیوند میان مشتریان می‌گردد؛ دوم، جمع‌بندی خطی مبالغ، تمایز کیفی میان خریدهای سرمایه‌گذاری سنگین در طلافروشی با تجمیع خریدهای مکرر روزمره در سوپرمارکت‌ها را محو می‌سازد؛ و سوم، ناتوانی در شناسایی شباهت‌های توپولوژیک چندمرحله‌ای مانع از درک زنجیره هم‌رخدادی اصناف در سبد مصرفی می‌گردد.</w:t>
+        <w:t xml:space="preserve"> پیاده‌سازی می‌شود. این رویکرد دارای محدودیت‌هایی است: نخست آنکه مشتریان را مستقل از یکدیگر فرض می‌کند و ساختار ارتباطات شبکه‌ای را نادیده می‌گیرد؛ دوم، با تجمیع مبالغ، تمایز کیفی میان یک تراکنش سنگین سرمایه‌ای با مجموعه‌ای از تراکنش‌های خرد روزمره از بین می‌رود؛ و سوم، شباهت‌های غیرمستقیم ناشی از الگوهای مشترک مصرف در اصناف مختلف در فضای اقلیدسی </w:t>
+      </w:r>
+      <w:r>
+        <w:rPr>
+          <w:rFonts w:ascii="Times New Roman" w:hAnsi="Times New Roman" w:cs="Times New Roman"/>
+        </w:rPr>
+        <w:t>RFM</w:t>
+      </w:r>
+      <w:r>
+        <w:rPr>
+          <w:rFonts w:hint="cs"/>
+          <w:rtl/>
+        </w:rPr>
+        <w:t xml:space="preserve"> منعکس نمی‌شود.</w:t>
       </w:r>
     </w:p>
     <w:p>
@@ -482,7 +508,7 @@
           <w:rFonts w:hint="cs"/>
           <w:rtl/>
         </w:rPr>
-        <w:t>یادگیری عمیق هندسی و شبکه‌های عصبی گراف (</w:t>
+        <w:t>یادگیری عمیق بر روی گراف (</w:t>
       </w:r>
       <w:r>
         <w:rPr>
@@ -495,7 +521,7 @@
           <w:rFonts w:hint="cs"/>
           <w:rtl/>
         </w:rPr>
-        <w:t xml:space="preserve">) مرزهای نوینی را در بازنمایی داده‌های رابطه‌ای غیرارقلیدسی گشوده‌اند </w:t>
+        <w:t xml:space="preserve">) امکان استخراج هم‌زمان الگوها از ویژگی‌های گره و ساختار توپولوژیک شبکه را فراهم می‌سازد </w:t>
       </w:r>
       <w:r>
         <w:rPr>
@@ -508,20 +534,20 @@
           <w:rFonts w:hint="cs"/>
           <w:rtl/>
         </w:rPr>
-        <w:t>. با این وجود، معماری‌های استاندارد گراف توجه‌محور به تنهایی قادر به حل پدیده گلوگاه جریان اطلاعات و پراکندگی افراطی در گراف‌های تراکنشی پرداخت نیستند. در این پژوهش، برای نخستین بار مفهومی نوآورانه بر پایه هندسه ریمانی گسسته و انحنای فرمن-ریچی (</w:t>
-      </w:r>
-      <w:r>
-        <w:rPr>
-          <w:rFonts w:ascii="Times New Roman" w:hAnsi="Times New Roman" w:cs="Times New Roman"/>
-        </w:rPr>
-        <w:t>Forman-Ricci Curvature</w:t>
-      </w:r>
-      <w:r>
-        <w:rPr>
-          <w:rFonts w:hint="cs"/>
-          <w:rtl/>
-        </w:rPr>
-        <w:t>) معرفی می‌شود که تغییرات موضعی هندسی در ابرگراف دوبخشی کارت-پذیرنده را اندازه گرفته و توجه چندسر شبکه عصبی را به شکل مستقیم تعدیل می‌نماید. مشارکت‌های اصلی این مقاله به شرح زیر است:</w:t>
+        <w:t xml:space="preserve">. با این وجود، در شبکه‌های تراکنشی پرداخت، انتشار یکنواخت پیام‌ها می‌تواند با پدیده تراکم اطلاعات در گره‌های پرتراکم و پل‌های گلوگاهی روبه‌رو شود. در این پژوهش، چارچوبی تحت عنوان </w:t>
+      </w:r>
+      <w:r>
+        <w:rPr>
+          <w:rFonts w:ascii="Times New Roman" w:hAnsi="Times New Roman" w:cs="Times New Roman"/>
+        </w:rPr>
+        <w:t>HG-CAN</w:t>
+      </w:r>
+      <w:r>
+        <w:rPr>
+          <w:rFonts w:hint="cs"/>
+          <w:rtl/>
+        </w:rPr>
+        <w:t xml:space="preserve"> با تکیه بر انحنای گسسته فرمن-ریچی پیشنهاد می‌شود که در آن از انحنای موضعی یال‌ها برای تنظیم ضرایب توجه در شبکه عصبی گراف استفاده می‌گردد. اهداف و مشارکت‌های این مقاله به شرح زیر است:</w:t>
       </w:r>
     </w:p>
     <w:p>
@@ -533,7 +559,7 @@
           <w:rFonts w:hint="cs"/>
           <w:rtl/>
         </w:rPr>
-        <w:t>طراحی چارچوب معماری چهارلایه جامع از دفتر کل تراکنش تا استخراج پرسوناهای هوشمند و سنجه‌های سازمانی؛</w:t>
+        <w:t>ارائه یک معماری چهارلایه برای تبدیل رکوردهای تراکنش به بازنمایی‌های برداری و خوشه‌های رفتاری قابل‌تفسیر؛</w:t>
       </w:r>
     </w:p>
     <w:p>
@@ -545,20 +571,7 @@
           <w:rFonts w:hint="cs"/>
           <w:rtl/>
         </w:rPr>
-        <w:t xml:space="preserve">ارائه روش بدیع </w:t>
-      </w:r>
-      <w:r>
-        <w:rPr>
-          <w:rFonts w:ascii="Times New Roman" w:hAnsi="Times New Roman" w:cs="Times New Roman"/>
-        </w:rPr>
-        <w:t>HG-CAN</w:t>
-      </w:r>
-      <w:r>
-        <w:rPr>
-          <w:rFonts w:hint="cs"/>
-          <w:rtl/>
-        </w:rPr>
-        <w:t xml:space="preserve"> برای تنظیم ضرایب توجه شبکه عصبی گراف با استفاده از انحنای فرمن-ریچی و شباهت توزیع اصناف؛</w:t>
+        <w:t>استفاده از انحنای گسسته فرمن-ریچی به همراه شباهت اصناف جهت تعدیل ضرایب مکانیزم توجه چندسر در خودرمزگذار گراف؛</w:t>
       </w:r>
     </w:p>
     <w:p>
@@ -570,7 +583,7 @@
           <w:rFonts w:hint="cs"/>
           <w:rtl/>
         </w:rPr>
-        <w:t>تدوین تابع زیان سه‌گانه خودنظارتی شامل بازسازی ساختار پیوند، بازسازی ویژگی‌های گره و تنظیم انحنای هندسی؛</w:t>
+        <w:t>به‌کارگیری تابع زیان سه‌گانه بدون نظارت شامل بازسازی پیوندها، بازسازی ویژگی‌های گره و تنظیم انحنا؛</w:t>
       </w:r>
     </w:p>
     <w:p>
@@ -582,7 +595,7 @@
           <w:rFonts w:hint="cs"/>
           <w:rtl/>
         </w:rPr>
-        <w:t xml:space="preserve">اعتبارسنجی تجربی گسترده در مقایسه با روش سنتی </w:t>
+        <w:t xml:space="preserve">ارزیابی تجربی و مقایسه شفاف نتایج با مدل سنتی </w:t>
       </w:r>
       <w:r>
         <w:rPr>
@@ -595,7 +608,7 @@
           <w:rFonts w:hint="cs"/>
           <w:rtl/>
         </w:rPr>
-        <w:t xml:space="preserve"> و تجزیه ماتریسی </w:t>
+        <w:t xml:space="preserve"> و خط‌مبنای تجزیه ماتریسی </w:t>
       </w:r>
       <w:r>
         <w:rPr>
@@ -608,33 +621,7 @@
           <w:rFonts w:hint="cs"/>
           <w:rtl/>
         </w:rPr>
-        <w:t xml:space="preserve"> و دستیابی به جهش چشمگیر در شاخص‌های </w:t>
-      </w:r>
-      <w:r>
-        <w:rPr>
-          <w:rFonts w:ascii="Times New Roman" w:hAnsi="Times New Roman" w:cs="Times New Roman"/>
-        </w:rPr>
-        <w:t>NMI</w:t>
-      </w:r>
-      <w:r>
-        <w:rPr>
-          <w:rFonts w:hint="cs"/>
-          <w:rtl/>
-        </w:rPr>
-        <w:t xml:space="preserve"> و </w:t>
-      </w:r>
-      <w:r>
-        <w:rPr>
-          <w:rFonts w:ascii="Times New Roman" w:hAnsi="Times New Roman" w:cs="Times New Roman"/>
-        </w:rPr>
-        <w:t>ARI</w:t>
-      </w:r>
-      <w:r>
-        <w:rPr>
-          <w:rFonts w:hint="cs"/>
-          <w:rtl/>
-        </w:rPr>
-        <w:t>.</w:t>
+        <w:t xml:space="preserve"> بر روی داده‌های شبیه‌سازی‌شده.</w:t>
       </w:r>
     </w:p>
     <w:p>
@@ -646,7 +633,7 @@
           <w:rFonts w:hint="cs"/>
           <w:rtl/>
         </w:rPr>
-        <w:t xml:space="preserve">ساختار ادامه مقاله بدین شرح است: بخش </w:t>
+        <w:t xml:space="preserve">ادامه مقاله بدین ترتیب تنظیم شده است: بخش </w:t>
       </w:r>
       <w:r>
         <w:rPr>
@@ -672,7 +659,7 @@
           <w:rFonts w:hint="cs"/>
           <w:rtl/>
         </w:rPr>
-        <w:t xml:space="preserve"> داده و صورت‌بندی مسئله را تشریح می‌نماید؛ بخش </w:t>
+        <w:t xml:space="preserve"> به توصیف داده و فرمول‌بندی مسئله اختصاص دارد؛ بخش </w:t>
       </w:r>
       <w:r>
         <w:rPr>
@@ -685,20 +672,7 @@
           <w:rFonts w:hint="cs"/>
           <w:rtl/>
         </w:rPr>
-        <w:t xml:space="preserve"> معماری پیشنهادی </w:t>
-      </w:r>
-      <w:r>
-        <w:rPr>
-          <w:rFonts w:ascii="Times New Roman" w:hAnsi="Times New Roman" w:cs="Times New Roman"/>
-        </w:rPr>
-        <w:t>HG-CAN</w:t>
-      </w:r>
-      <w:r>
-        <w:rPr>
-          <w:rFonts w:hint="cs"/>
-          <w:rtl/>
-        </w:rPr>
-        <w:t xml:space="preserve"> را ارائه می‌دهد؛ بخش </w:t>
+        <w:t xml:space="preserve"> چارچوب پیشنهادی را تشریح می‌نماید؛ بخش </w:t>
       </w:r>
       <w:r>
         <w:rPr>
@@ -711,7 +685,7 @@
           <w:rFonts w:hint="cs"/>
           <w:rtl/>
         </w:rPr>
-        <w:t xml:space="preserve"> نتایج تجربی و تحلیل پرسوناها را گزارش می‌کند و بخش </w:t>
+        <w:t xml:space="preserve"> ارزیابی تجربی و تحلیل نتایج را گزارش می‌کند و بخش </w:t>
       </w:r>
       <w:r>
         <w:rPr>
@@ -2536,7 +2510,7 @@
           <w:rFonts w:hint="cs"/>
           <w:rtl/>
         </w:rPr>
-        <w:t>مقایسه کارایی با خطوط مبنا</w:t>
+        <w:t>مقایسه با روش‌های خط‌مبنا</w:t>
       </w:r>
     </w:p>
     <w:p>
@@ -2548,7 +2522,7 @@
           <w:rFonts w:hint="cs"/>
           <w:rtl/>
         </w:rPr>
-        <w:t xml:space="preserve">کارایی روش پیشنهادی </w:t>
+        <w:t xml:space="preserve">عملکرد روش پیشنهادی </w:t>
       </w:r>
       <w:r>
         <w:rPr>
@@ -2561,7 +2535,7 @@
           <w:rFonts w:hint="cs"/>
           <w:rtl/>
         </w:rPr>
-        <w:t xml:space="preserve"> در برابر مدل متداول </w:t>
+        <w:t xml:space="preserve"> با مدل متداول </w:t>
       </w:r>
       <w:r>
         <w:rPr>
@@ -2574,7 +2548,7 @@
           <w:rFonts w:hint="cs"/>
           <w:rtl/>
         </w:rPr>
-        <w:t xml:space="preserve"> و تجزیه ماتریسی دوبخشی </w:t>
+        <w:t xml:space="preserve"> و تجزیه ماتریسی </w:t>
       </w:r>
       <w:r>
         <w:rPr>
@@ -2587,7 +2561,7 @@
           <w:rFonts w:hint="cs"/>
           <w:rtl/>
         </w:rPr>
-        <w:t xml:space="preserve"> در جدول (</w:t>
+        <w:t xml:space="preserve"> مقایسه گردید. نتایج در جدول (</w:t>
       </w:r>
       <w:r>
         <w:rPr>
@@ -2600,7 +2574,7 @@
           <w:rFonts w:hint="cs"/>
           <w:rtl/>
         </w:rPr>
-        <w:t>) مقایسه شده است.</w:t>
+        <w:t>) خلاصه شده است.</w:t>
       </w:r>
     </w:p>
     <w:p>
@@ -2625,7 +2599,7 @@
           <w:rFonts w:hint="cs"/>
           <w:rtl/>
         </w:rPr>
-        <w:t>) : مقایسه جامع عملکرد چارچوب پیشنهادی با روش‌های خط‌مبنا</w:t>
+        <w:t>) : مقایسه نتایج خوشه‌بندی روش‌ها بر روی داده‌های شبیه‌سازی‌شده</w:t>
       </w:r>
     </w:p>
     <w:tbl>
@@ -3048,7 +3022,7 @@
           <w:rFonts w:hint="cs"/>
           <w:rtl/>
         </w:rPr>
-        <w:t>همان‌گونه که در جدول (</w:t>
+        <w:t>تحلیل داده‌های جدول (</w:t>
       </w:r>
       <w:r>
         <w:rPr>
@@ -3061,7 +3035,215 @@
           <w:rFonts w:hint="cs"/>
           <w:rtl/>
         </w:rPr>
-        <w:t>) و شکل (</w:t>
+        <w:t xml:space="preserve">) نشان می‌دهد که روش سنتی </w:t>
+      </w:r>
+      <w:r>
+        <w:rPr>
+          <w:rFonts w:ascii="Times New Roman" w:hAnsi="Times New Roman" w:cs="Times New Roman"/>
+        </w:rPr>
+        <w:t>RFM</w:t>
+      </w:r>
+      <w:r>
+        <w:rPr>
+          <w:rFonts w:hint="cs"/>
+          <w:rtl/>
+        </w:rPr>
+        <w:t xml:space="preserve"> به دلیل فقدان اطلاعات رابطه‌ای اصناف، به شاخص‌های نازل </w:t>
+      </w:r>
+      <w:r>
+        <w:rPr>
+          <w:rFonts w:ascii="Times New Roman" w:hAnsi="Times New Roman" w:cs="Times New Roman"/>
+        </w:rPr>
+        <w:t>NMI</w:t>
+      </w:r>
+      <w:r>
+        <w:rPr>
+          <w:rFonts w:hint="cs"/>
+          <w:rtl/>
+        </w:rPr>
+        <w:t xml:space="preserve"> = </w:t>
+      </w:r>
+      <w:r>
+        <w:rPr>
+          <w:rFonts w:ascii="Times New Roman" w:hAnsi="Times New Roman" w:cs="Times New Roman"/>
+        </w:rPr>
+        <w:t>0.175</w:t>
+      </w:r>
+      <w:r>
+        <w:rPr>
+          <w:rFonts w:hint="cs"/>
+          <w:rtl/>
+        </w:rPr>
+        <w:t xml:space="preserve"> و </w:t>
+      </w:r>
+      <w:r>
+        <w:rPr>
+          <w:rFonts w:ascii="Times New Roman" w:hAnsi="Times New Roman" w:cs="Times New Roman"/>
+        </w:rPr>
+        <w:t>ARI</w:t>
+      </w:r>
+      <w:r>
+        <w:rPr>
+          <w:rFonts w:hint="cs"/>
+          <w:rtl/>
+        </w:rPr>
+        <w:t xml:space="preserve"> = </w:t>
+      </w:r>
+      <w:r>
+        <w:rPr>
+          <w:rFonts w:ascii="Times New Roman" w:hAnsi="Times New Roman" w:cs="Times New Roman"/>
+        </w:rPr>
+        <w:t>0.048</w:t>
+      </w:r>
+      <w:r>
+        <w:rPr>
+          <w:rFonts w:hint="cs"/>
+          <w:rtl/>
+        </w:rPr>
+        <w:t xml:space="preserve"> دست یافته است؛ روش </w:t>
+      </w:r>
+      <w:r>
+        <w:rPr>
+          <w:rFonts w:ascii="Times New Roman" w:hAnsi="Times New Roman" w:cs="Times New Roman"/>
+        </w:rPr>
+        <w:t>HG-CAN</w:t>
+      </w:r>
+      <w:r>
+        <w:rPr>
+          <w:rFonts w:hint="cs"/>
+          <w:rtl/>
+        </w:rPr>
+        <w:t xml:space="preserve"> نسبت به </w:t>
+      </w:r>
+      <w:r>
+        <w:rPr>
+          <w:rFonts w:ascii="Times New Roman" w:hAnsi="Times New Roman" w:cs="Times New Roman"/>
+        </w:rPr>
+        <w:t>RFM</w:t>
+      </w:r>
+      <w:r>
+        <w:rPr>
+          <w:rFonts w:hint="cs"/>
+          <w:rtl/>
+        </w:rPr>
+        <w:t xml:space="preserve"> بهبود چشمگیری را ثبت می‌کند. با این حال، مقایسه روش پیشنهادی با خط‌مبنای </w:t>
+      </w:r>
+      <w:r>
+        <w:rPr>
+          <w:rFonts w:ascii="Times New Roman" w:hAnsi="Times New Roman" w:cs="Times New Roman"/>
+        </w:rPr>
+        <w:t>SVD</w:t>
+      </w:r>
+      <w:r>
+        <w:rPr>
+          <w:rFonts w:hint="cs"/>
+          <w:rtl/>
+        </w:rPr>
+        <w:t xml:space="preserve"> نشان می‌دهد که هر دو روش در شاخص‌های </w:t>
+      </w:r>
+      <w:r>
+        <w:rPr>
+          <w:rFonts w:ascii="Times New Roman" w:hAnsi="Times New Roman" w:cs="Times New Roman"/>
+        </w:rPr>
+        <w:t>NMI</w:t>
+      </w:r>
+      <w:r>
+        <w:rPr>
+          <w:rFonts w:hint="cs"/>
+          <w:rtl/>
+        </w:rPr>
+        <w:t xml:space="preserve"> و </w:t>
+      </w:r>
+      <w:r>
+        <w:rPr>
+          <w:rFonts w:ascii="Times New Roman" w:hAnsi="Times New Roman" w:cs="Times New Roman"/>
+        </w:rPr>
+        <w:t>ARI</w:t>
+      </w:r>
+      <w:r>
+        <w:rPr>
+          <w:rFonts w:hint="cs"/>
+          <w:rtl/>
+        </w:rPr>
+        <w:t xml:space="preserve"> عملکردی بسیار نزدیک به هم دارند (</w:t>
+      </w:r>
+      <w:r>
+        <w:rPr>
+          <w:rFonts w:ascii="Times New Roman" w:hAnsi="Times New Roman" w:cs="Times New Roman"/>
+        </w:rPr>
+        <w:t>NMI</w:t>
+      </w:r>
+      <w:r>
+        <w:rPr>
+          <w:rFonts w:hint="cs"/>
+          <w:rtl/>
+        </w:rPr>
+        <w:t xml:space="preserve"> حدود ۰.۸۶۷ و </w:t>
+      </w:r>
+      <w:r>
+        <w:rPr>
+          <w:rFonts w:ascii="Times New Roman" w:hAnsi="Times New Roman" w:cs="Times New Roman"/>
+        </w:rPr>
+        <w:t>ARI</w:t>
+      </w:r>
+      <w:r>
+        <w:rPr>
+          <w:rFonts w:hint="cs"/>
+          <w:rtl/>
+        </w:rPr>
+        <w:t xml:space="preserve"> حدود ۰.۸۸۵). این تشابه نشان می‌دهد که بخش عمده‌ای از تفکیک‌پذیری در این مجموعه داده ناشی از اطلاعات موجود در ماتریس تعاملات دوبخشی کارت-صنف است. مزیت روش </w:t>
+      </w:r>
+      <w:r>
+        <w:rPr>
+          <w:rFonts w:ascii="Times New Roman" w:hAnsi="Times New Roman" w:cs="Times New Roman"/>
+        </w:rPr>
+        <w:t>HG-CAN</w:t>
+      </w:r>
+      <w:r>
+        <w:rPr>
+          <w:rFonts w:hint="cs"/>
+          <w:rtl/>
+        </w:rPr>
+        <w:t xml:space="preserve"> در انعطاف‌پذیری آن برای گنجاندن هم‌زمان ویژگی‌های آماری غیرخطی گره‌ها (مانند آنتروپی شانون و چولگی مبالغ) و تحلیل ساختار شبکه‌ای نهفته است، هرچند که شاخص‌های </w:t>
+      </w:r>
+      <w:r>
+        <w:rPr>
+          <w:rFonts w:ascii="Times New Roman" w:hAnsi="Times New Roman" w:cs="Times New Roman"/>
+        </w:rPr>
+        <w:t>Silhouette</w:t>
+      </w:r>
+      <w:r>
+        <w:rPr>
+          <w:rFonts w:hint="cs"/>
+          <w:rtl/>
+        </w:rPr>
+        <w:t xml:space="preserve"> و </w:t>
+      </w:r>
+      <w:r>
+        <w:rPr>
+          <w:rFonts w:ascii="Times New Roman" w:hAnsi="Times New Roman" w:cs="Times New Roman"/>
+        </w:rPr>
+        <w:t>Davies-Bouldin</w:t>
+      </w:r>
+      <w:r>
+        <w:rPr>
+          <w:rFonts w:hint="cs"/>
+          <w:rtl/>
+        </w:rPr>
+        <w:t xml:space="preserve"> برای </w:t>
+      </w:r>
+      <w:r>
+        <w:rPr>
+          <w:rFonts w:ascii="Times New Roman" w:hAnsi="Times New Roman" w:cs="Times New Roman"/>
+        </w:rPr>
+        <w:t>SVD</w:t>
+      </w:r>
+      <w:r>
+        <w:rPr>
+          <w:rFonts w:hint="cs"/>
+          <w:rtl/>
+        </w:rPr>
+        <w:t xml:space="preserve"> فشردگی هندسی بیشتری را نشان می‌دهند (شکل (</w:t>
       </w:r>
       <w:r>
         <w:rPr>
@@ -3074,189 +3256,7 @@
           <w:rFonts w:hint="cs"/>
           <w:rtl/>
         </w:rPr>
-        <w:t xml:space="preserve">) مشخص است، روش سنتی </w:t>
-      </w:r>
-      <w:r>
-        <w:rPr>
-          <w:rFonts w:ascii="Times New Roman" w:hAnsi="Times New Roman" w:cs="Times New Roman"/>
-        </w:rPr>
-        <w:t>RFM</w:t>
-      </w:r>
-      <w:r>
-        <w:rPr>
-          <w:rFonts w:hint="cs"/>
-          <w:rtl/>
-        </w:rPr>
-        <w:t xml:space="preserve"> به دلیل نادیده گرفتن ماهیت رابطه‌ای داده، نمره انطباق بسیار نازل </w:t>
-      </w:r>
-      <w:r>
-        <w:rPr>
-          <w:rFonts w:ascii="Times New Roman" w:hAnsi="Times New Roman" w:cs="Times New Roman"/>
-        </w:rPr>
-        <w:t>NMI</w:t>
-      </w:r>
-      <w:r>
-        <w:rPr>
-          <w:rFonts w:hint="cs"/>
-          <w:rtl/>
-        </w:rPr>
-        <w:t xml:space="preserve"> = </w:t>
-      </w:r>
-      <w:r>
-        <w:rPr>
-          <w:rFonts w:ascii="Times New Roman" w:hAnsi="Times New Roman" w:cs="Times New Roman"/>
-        </w:rPr>
-        <w:t>0.175</w:t>
-      </w:r>
-      <w:r>
-        <w:rPr>
-          <w:rFonts w:hint="cs"/>
-          <w:rtl/>
-        </w:rPr>
-        <w:t xml:space="preserve"> و </w:t>
-      </w:r>
-      <w:r>
-        <w:rPr>
-          <w:rFonts w:ascii="Times New Roman" w:hAnsi="Times New Roman" w:cs="Times New Roman"/>
-        </w:rPr>
-        <w:t>ARI</w:t>
-      </w:r>
-      <w:r>
-        <w:rPr>
-          <w:rFonts w:hint="cs"/>
-          <w:rtl/>
-        </w:rPr>
-        <w:t xml:space="preserve"> = </w:t>
-      </w:r>
-      <w:r>
-        <w:rPr>
-          <w:rFonts w:ascii="Times New Roman" w:hAnsi="Times New Roman" w:cs="Times New Roman"/>
-        </w:rPr>
-        <w:t>0.048</w:t>
-      </w:r>
-      <w:r>
-        <w:rPr>
-          <w:rFonts w:hint="cs"/>
-          <w:rtl/>
-        </w:rPr>
-        <w:t xml:space="preserve"> را حاصل کرده است. در مقابل، روش پیشنهادی </w:t>
-      </w:r>
-      <w:r>
-        <w:rPr>
-          <w:rFonts w:ascii="Times New Roman" w:hAnsi="Times New Roman" w:cs="Times New Roman"/>
-        </w:rPr>
-        <w:t>HG-CAN</w:t>
-      </w:r>
-      <w:r>
-        <w:rPr>
-          <w:rFonts w:hint="cs"/>
-          <w:rtl/>
-        </w:rPr>
-        <w:t xml:space="preserve"> با دستیابی به </w:t>
-      </w:r>
-      <w:r>
-        <w:rPr>
-          <w:rFonts w:ascii="Times New Roman" w:hAnsi="Times New Roman" w:cs="Times New Roman"/>
-        </w:rPr>
-        <w:t>NMI</w:t>
-      </w:r>
-      <w:r>
-        <w:rPr>
-          <w:rFonts w:hint="cs"/>
-          <w:rtl/>
-        </w:rPr>
-        <w:t xml:space="preserve"> = </w:t>
-      </w:r>
-      <w:r>
-        <w:rPr>
-          <w:rFonts w:ascii="Times New Roman" w:hAnsi="Times New Roman" w:cs="Times New Roman"/>
-        </w:rPr>
-        <w:t>0.867</w:t>
-      </w:r>
-      <w:r>
-        <w:rPr>
-          <w:rFonts w:hint="cs"/>
-          <w:rtl/>
-        </w:rPr>
-        <w:t xml:space="preserve"> و </w:t>
-      </w:r>
-      <w:r>
-        <w:rPr>
-          <w:rFonts w:ascii="Times New Roman" w:hAnsi="Times New Roman" w:cs="Times New Roman"/>
-        </w:rPr>
-        <w:t>ARI</w:t>
-      </w:r>
-      <w:r>
-        <w:rPr>
-          <w:rFonts w:hint="cs"/>
-          <w:rtl/>
-        </w:rPr>
-        <w:t xml:space="preserve"> = </w:t>
-      </w:r>
-      <w:r>
-        <w:rPr>
-          <w:rFonts w:ascii="Times New Roman" w:hAnsi="Times New Roman" w:cs="Times New Roman"/>
-        </w:rPr>
-        <w:t>0.885</w:t>
-      </w:r>
-      <w:r>
-        <w:rPr>
-          <w:rFonts w:hint="cs"/>
-          <w:rtl/>
-        </w:rPr>
-        <w:t xml:space="preserve">، جهش خارق‌العاده ۳۹۶.۷ درصدی در </w:t>
-      </w:r>
-      <w:r>
-        <w:rPr>
-          <w:rFonts w:ascii="Times New Roman" w:hAnsi="Times New Roman" w:cs="Times New Roman"/>
-        </w:rPr>
-        <w:t>NMI</w:t>
-      </w:r>
-      <w:r>
-        <w:rPr>
-          <w:rFonts w:hint="cs"/>
-          <w:rtl/>
-        </w:rPr>
-        <w:t xml:space="preserve"> و ۱۷۳۱.۶ درصدی در </w:t>
-      </w:r>
-      <w:r>
-        <w:rPr>
-          <w:rFonts w:ascii="Times New Roman" w:hAnsi="Times New Roman" w:cs="Times New Roman"/>
-        </w:rPr>
-        <w:t>ARI</w:t>
-      </w:r>
-      <w:r>
-        <w:rPr>
-          <w:rFonts w:hint="cs"/>
-          <w:rtl/>
-        </w:rPr>
-        <w:t xml:space="preserve"> را به ارمغان آورده است. اگرچه شاخص </w:t>
-      </w:r>
-      <w:r>
-        <w:rPr>
-          <w:rFonts w:ascii="Times New Roman" w:hAnsi="Times New Roman" w:cs="Times New Roman"/>
-        </w:rPr>
-        <w:t>Silhouette</w:t>
-      </w:r>
-      <w:r>
-        <w:rPr>
-          <w:rFonts w:hint="cs"/>
-          <w:rtl/>
-        </w:rPr>
-        <w:t xml:space="preserve"> روش </w:t>
-      </w:r>
-      <w:r>
-        <w:rPr>
-          <w:rFonts w:ascii="Times New Roman" w:hAnsi="Times New Roman" w:cs="Times New Roman"/>
-        </w:rPr>
-        <w:t>RFM</w:t>
-      </w:r>
-      <w:r>
-        <w:rPr>
-          <w:rFonts w:hint="cs"/>
-          <w:rtl/>
-        </w:rPr>
-        <w:t xml:space="preserve"> بالاتر است، اما این فشردگی صرفاً ناشی از ماهیت هندسی اقلیدسی اعداد است و توانایی تمایز رفتاری واقعی ندارد.</w:t>
+        <w:t>)).</w:t>
       </w:r>
     </w:p>
     <w:p>
@@ -3333,7 +3333,7 @@
           <w:rFonts w:hint="cs"/>
           <w:rtl/>
         </w:rPr>
-        <w:t>پرسوناهای سازمانی کشف‌شده</w:t>
+        <w:t>ویژگی‌های خوشه‌های کشف‌شده</w:t>
       </w:r>
     </w:p>
     <w:p>
@@ -3358,7 +3358,7 @@
           <w:rFonts w:hint="cs"/>
           <w:rtl/>
         </w:rPr>
-        <w:t>) مشخصات پنج پرسونای کشف‌شده توسط معماری پیشنهادی را همراه با صنف غالب و میانگین ارزش تراکنش گزارش می‌کند.</w:t>
+        <w:t>) مشخصات پنج خوشه استخراج‌شده را با صنف غالب و میانگین مبلغ تراکنش گزارش می‌کند.</w:t>
       </w:r>
     </w:p>
     <w:p>
@@ -3383,7 +3383,7 @@
           <w:rFonts w:hint="cs"/>
           <w:rtl/>
         </w:rPr>
-        <w:t xml:space="preserve">) : پرسوناهای استراتژیک سازمانی کشف‌شده توسط چارچوب </w:t>
+        <w:t xml:space="preserve">) : مشخصات خوشه‌های رفتاری استخراج‌شده توسط چارچوب </w:t>
       </w:r>
       <w:r>
         <w:rPr>
@@ -4198,7 +4198,7 @@
           <w:rFonts w:hint="cs"/>
           <w:rtl/>
         </w:rPr>
-        <w:t>تحلیل رفتاری نشان می‌دهد پرسونای «تجار و عمده‌فروشان آهن و مصالح صنعتی» با میانگین تراکنش ۳۶.۸ میلیون ریال بالاترین ارزش ریالی را به خود اختصاص داده است؛ این بخش هدفی بی‌نظیر برای تسهیلات سازمانی و ضمانت‌نامه‌های بانکی است. پرسونای «سرمایه‌گذاران طلا و کالای لوکس» با میانگین ۱۷.۴ میلیون ریال مخاطب اصلی خدمات صکوک و تسهیلات با پشتوانه طلاست. پرسونای «مسافران و گردشگران پریمیوم» با میانگین ۱۰.۴ میلیون ریال در آژانس‌های مسافرتی فعال بوده و پرسونای «مایحتاج روزمره و مصرف خانوار» با تکرار بالا در سوپرمارکت‌ها تمرکز دارد. شکل (</w:t>
+        <w:t>بررسی خوشه‌ها نشان می‌دهد که خوشه تجار آهن و مصالح با میانگین تراکنش ۳۶.۸ میلیون ریال بیشترین ارزش ریالی را دارد و خوشه طلا با میانگین ۱۷.۴ میلیون ریال در رتبه بعدی قرار دارد. خوشه‌های گردشگری، خدمات سلامت و خواروبار نیز بر اساس مبالغ و بسامد خرید تفکیک شده‌اند. شکل (</w:t>
       </w:r>
       <w:r>
         <w:rPr>
@@ -4211,7 +4211,7 @@
           <w:rFonts w:hint="cs"/>
           <w:rtl/>
         </w:rPr>
-        <w:t>) تفاوت چندبعدی پرسوناها را بر روی نمودار راداری مصورسازی می‌نماید.</w:t>
+        <w:t>) تفاوت ابعاد رفتاری این خوشه‌ها را در نمودار راداری مصورسازی می‌نماید.</w:t>
       </w:r>
     </w:p>
     <w:p>
@@ -4300,7 +4300,7 @@
           <w:rFonts w:hint="cs"/>
           <w:rtl/>
         </w:rPr>
-        <w:t xml:space="preserve">در این مقاله چارچوب معماری نوین </w:t>
+        <w:t xml:space="preserve">در این پژوهش چارچوب </w:t>
       </w:r>
       <w:r>
         <w:rPr>
@@ -4313,20 +4313,7 @@
           <w:rFonts w:hint="cs"/>
           <w:rtl/>
         </w:rPr>
-        <w:t xml:space="preserve"> برای تبدیل رکوردهای خام تراکنش به هوشمندی استراتژیک سازمانی ارائه گردید. نوآوری اصلی طرح، به‌کارگیری انحنای گسسته فرمن-ریچی در یک شبکه عصبی گراف توجه‌محور چندسر بود که موجب حل چالش گلوگاه‌های توپولوژیک و یادگیری بازنمایی بسیار تفکیک‌پذیر گردید. این سیستم با دستیابی به </w:t>
-      </w:r>
-      <w:r>
-        <w:rPr>
-          <w:rFonts w:ascii="Times New Roman" w:hAnsi="Times New Roman" w:cs="Times New Roman"/>
-        </w:rPr>
-        <w:t>NMI</w:t>
-      </w:r>
-      <w:r>
-        <w:rPr>
-          <w:rFonts w:hint="cs"/>
-          <w:rtl/>
-        </w:rPr>
-        <w:t xml:space="preserve"> معادل ۰.۸۶۷ عملاً خط‌مبنای سنتی </w:t>
+        <w:t xml:space="preserve"> برای استخراج بازنمایی رفتار تراکنشی از سوابق پرداخت مبتنی بر شبکه عصبی گراف و انحنای فرمن-ریچی مورد ارزیابی قرار گرفت. نتایج بر روی داده‌های شبیه‌سازی‌شده حاکی از برتری قاطع مدل‌های رابطه‌ای نسبت به مدل سنتی </w:t>
       </w:r>
       <w:r>
         <w:rPr>
@@ -4339,7 +4326,20 @@
           <w:rFonts w:hint="cs"/>
           <w:rtl/>
         </w:rPr>
-        <w:t xml:space="preserve"> را پشت سر گذاشت. توسعه آتی این پژوهش شامل استنتاج بلادرنگ جریانی و یادگیری فدرال میان‌بانکی خواهد بود.</w:t>
+        <w:t xml:space="preserve"> است. همچنین مقایسه نشان داد که عملکرد تفکیک مدل پیشنهادی با روش خطی </w:t>
+      </w:r>
+      <w:r>
+        <w:rPr>
+          <w:rFonts w:ascii="Times New Roman" w:hAnsi="Times New Roman" w:cs="Times New Roman"/>
+        </w:rPr>
+        <w:t>SVD</w:t>
+      </w:r>
+      <w:r>
+        <w:rPr>
+          <w:rFonts w:hint="cs"/>
+          <w:rtl/>
+        </w:rPr>
+        <w:t xml:space="preserve"> بر روی این داده‌ها در یک سطح قرار دارد. از محدودیت‌های این مطالعه می‌توان به اتکا به داده‌های شبیه‌سازی‌شده و عدم آزمون بر روی تنوع رفتاری داده‌های واقعی شبکه پرداخت اشاره کرد. تحقیقات آتی باید اعتبارسنجی مدل را بر روی مجموعه‌های داده واقعی و در شرایط توزیع‌های نامتعادل رفتاری دنبال نمایند.</w:t>
       </w:r>
     </w:p>
     <w:p>

</xml_diff>

<commit_message>
Clarify simulation archetypes, hyperparameter grounding, and loss functions in Persian paper
</commit_message>
<xml_diff>
--- a/FA_From_Transactional_Data_to_Organizational_Intelligence.docx
+++ b/FA_From_Transactional_Data_to_Organizational_Intelligence.docx
@@ -957,7 +957,7 @@
           <w:rFonts w:hint="cs"/>
           <w:rtl/>
         </w:rPr>
-        <w:t xml:space="preserve">دفتر کل تراکنش‌های پرداخت الکترونیک شامل دنباله‌ای از تراکنش‌های مالی به صورت </w:t>
+        <w:t xml:space="preserve">دفتر کل تراکنش‌های پرداخت به صورت دنباله‌ای از رکوردهای مالی </w:t>
       </w:r>
       <w:r>
         <w:rPr>
@@ -1009,7 +1009,7 @@
           <w:rFonts w:hint="cs"/>
           <w:rtl/>
         </w:rPr>
-        <w:t xml:space="preserve">} است که در آن هر تراکنش </w:t>
+        <w:t xml:space="preserve">} نمایش داده می‌شود که در آن هر رکورد </w:t>
       </w:r>
       <w:r>
         <w:rPr>
@@ -1022,7 +1022,7 @@
           <w:rFonts w:hint="cs"/>
           <w:rtl/>
         </w:rPr>
-        <w:t xml:space="preserve"> با پنج فیلد استاندارد مدل‌سازی می‌شود:</w:t>
+        <w:t xml:space="preserve"> شامل پنج فیلد استاندارد است:</w:t>
       </w:r>
     </w:p>
     <w:p>
@@ -1040,7 +1040,7 @@
           <w:rFonts w:hint="cs"/>
           <w:rtl/>
         </w:rPr>
-        <w:t>: شماره کارت بانکی پرداخت‌کننده به صورت توکن پوشانده‌شده (</w:t>
+        <w:t>: شناسه کارت بانکی به صورت پوشانده‌شده (</w:t>
       </w:r>
       <w:r>
         <w:rPr>
@@ -1053,7 +1053,7 @@
           <w:rFonts w:hint="cs"/>
           <w:rtl/>
         </w:rPr>
-        <w:t>)؛</w:t>
+        <w:t>) جهت رعایت الزامات حریم خصوصی؛</w:t>
       </w:r>
     </w:p>
     <w:p>
@@ -1089,7 +1089,7 @@
           <w:rFonts w:hint="cs"/>
           <w:rtl/>
         </w:rPr>
-        <w:t>: شناسه یکتای پایانه پذیرندگی یا درگاه اینترنتی فروشنده؛</w:t>
+        <w:t>: شناسه یکتای پایانه پذیرنده یا درگاه پرداخت؛</w:t>
       </w:r>
     </w:p>
     <w:p>
@@ -1107,7 +1107,7 @@
           <w:rFonts w:hint="cs"/>
           <w:rtl/>
         </w:rPr>
-        <w:t>: مهر زمانی دقیق ثبت تراکنش در سوییچ پرداخت؛</w:t>
+        <w:t>: زمان ثبت تراکنش در سوییچ؛</w:t>
       </w:r>
     </w:p>
     <w:p>
@@ -1125,7 +1125,7 @@
           <w:rFonts w:hint="cs"/>
           <w:rtl/>
         </w:rPr>
-        <w:t>: رسته فعالیت یا صنف اقتصادی پذیرنده (شامل طلافروشی، سوپرمارکت و خواروبار، آهن‌آلات و مصالح، آژانس مسافرتی، خدمات پزشکی و ...).</w:t>
+        <w:t>: نام صنف اقتصادی پذیرنده (شامل طلافروشی، سوپرمارکت، آهن‌آلات، آژانس مسافرتی، خدمات پزشکی و ...).</w:t>
       </w:r>
     </w:p>
     <w:p>
@@ -1137,20 +1137,7 @@
           <w:rFonts w:hint="cs"/>
           <w:rtl/>
         </w:rPr>
-        <w:t xml:space="preserve">مسئله کشف مشتری عبارت است از نگاشت بی‌نظارت هر کارت </w:t>
-      </w:r>
-      <w:r>
-        <w:rPr>
-          <w:rFonts w:ascii="Times New Roman" w:hAnsi="Times New Roman" w:cs="Times New Roman"/>
-        </w:rPr>
-        <w:t>pan_u</w:t>
-      </w:r>
-      <w:r>
-        <w:rPr>
-          <w:rFonts w:hint="cs"/>
-          <w:rtl/>
-        </w:rPr>
-        <w:t xml:space="preserve"> به یک بردار تعبیه پیوسته </w:t>
+        <w:t xml:space="preserve">هدف مسئله، یادگیری یک نگاشت بدون نظارت از فضای کارت‌های پرداخت به فضای بازنمایی پیوسته </w:t>
       </w:r>
       <w:r>
         <w:rPr>
@@ -1189,7 +1176,7 @@
           <w:rFonts w:hint="cs"/>
           <w:rtl/>
         </w:rPr>
-        <w:t>، به‌گونه‌ای که فاصله هندسی در فضای بازنمایی، همبستگی رفتاری و قرابت الگوی مصرف کارت‌ها را در اصناف پذیرندگی بازتاب دهد.</w:t>
+        <w:t xml:space="preserve"> است، به طوری که کارت‌های دارای الگوی تراکنشی و هم‌پذیرندگی مشابه در فضای نهفته به یکدیگر نزدیک باشند.</w:t>
       </w:r>
     </w:p>
     <w:p>
@@ -1201,7 +1188,7 @@
           <w:rFonts w:hint="cs"/>
           <w:rtl/>
         </w:rPr>
-        <w:t>داده آزمایش شبیه‌سازی‌شده</w:t>
+        <w:t>مجموعه داده شبیه‌سازی‌شده</w:t>
       </w:r>
     </w:p>
     <w:p>
@@ -1213,7 +1200,7 @@
           <w:rFonts w:hint="cs"/>
           <w:rtl/>
         </w:rPr>
-        <w:t xml:space="preserve">به دلیل الزامات صیانت از محرمانگی داده‌های بانکی، یک موتور شبیه‌سازی چندعاملی با الگوهای تجاری شبکه شتاب طراحی گردید. مجموعه داده تولیدشده شامل </w:t>
+        <w:t xml:space="preserve">به دلیل الزامات محرمانگی داده‌های بانکی، این پژوهش از یک مجموعه داده شبیه‌سازی‌شده چندعاملی بهره می‌برد. این مجموعه شامل </w:t>
       </w:r>
       <w:r>
         <w:rPr>
@@ -1239,7 +1226,7 @@
           <w:rFonts w:hint="cs"/>
           <w:rtl/>
         </w:rPr>
-        <w:t xml:space="preserve"> رکورد تراکنش، </w:t>
+        <w:t xml:space="preserve"> تراکنش، </w:t>
       </w:r>
       <w:r>
         <w:rPr>
@@ -1278,7 +1265,7 @@
           <w:rFonts w:hint="cs"/>
           <w:rtl/>
         </w:rPr>
-        <w:t xml:space="preserve"> پایانه پذیرندگی و </w:t>
+        <w:t xml:space="preserve"> پایانه پذیرنده در </w:t>
       </w:r>
       <w:r>
         <w:rPr>
@@ -1291,7 +1278,59 @@
           <w:rFonts w:hint="cs"/>
           <w:rtl/>
         </w:rPr>
-        <w:t xml:space="preserve"> صنف اقتصادی در یک بازه زمانی ۹۰ روزه است. مبالغ تراکنش بر اساس توزیع لگ‌نرمال منطبق با ماهیت اصناف شبیه‌سازی شده و برچسب‌های رفتاری پنهان صرفاً جهت ارزیابی بیرونی نگهداری شده‌اند.</w:t>
+        <w:t xml:space="preserve"> صنف اقتصادی در یک بازه زمانی ۹۰ روزه است. مبالغ تراکنش‌ها بر اساس توزیع لاگ‌نرمال با میانگین و پراکندگی وابسته به صنف نمونه‌برداری شده‌اند. در فرآیند شبیه‌سازی، کارت‌ها به ۵ دسته ترجیحی رفتاری با توزیع‌های احتمالی مشخص خرید در اصناف تخصیص یافته‌اند؛ این شناسه‌ها صرفاً به عنوان برچسب‌های مبنا (</w:t>
+      </w:r>
+      <w:r>
+        <w:rPr>
+          <w:rFonts w:ascii="Times New Roman" w:hAnsi="Times New Roman" w:cs="Times New Roman"/>
+        </w:rPr>
+        <w:t>Ground-Truth</w:t>
+      </w:r>
+      <w:r>
+        <w:rPr>
+          <w:rFonts w:hint="cs"/>
+          <w:rtl/>
+        </w:rPr>
+        <w:t xml:space="preserve">) جهت ارزیابی بیرونی با سنجه‌های </w:t>
+      </w:r>
+      <w:r>
+        <w:rPr>
+          <w:rFonts w:ascii="Times New Roman" w:hAnsi="Times New Roman" w:cs="Times New Roman"/>
+        </w:rPr>
+        <w:t>NMI</w:t>
+      </w:r>
+      <w:r>
+        <w:rPr>
+          <w:rFonts w:hint="cs"/>
+          <w:rtl/>
+        </w:rPr>
+        <w:t xml:space="preserve"> و </w:t>
+      </w:r>
+      <w:r>
+        <w:rPr>
+          <w:rFonts w:ascii="Times New Roman" w:hAnsi="Times New Roman" w:cs="Times New Roman"/>
+        </w:rPr>
+        <w:t>ARI</w:t>
+      </w:r>
+      <w:r>
+        <w:rPr>
+          <w:rFonts w:hint="cs"/>
+          <w:rtl/>
+        </w:rPr>
+        <w:t xml:space="preserve"> محفوظ مانده‌اند و مدل در فرآیند آموزش کاملاً بدون نظارت (</w:t>
+      </w:r>
+      <w:r>
+        <w:rPr>
+          <w:rFonts w:ascii="Times New Roman" w:hAnsi="Times New Roman" w:cs="Times New Roman"/>
+        </w:rPr>
+        <w:t>Unsupervised</w:t>
+      </w:r>
+      <w:r>
+        <w:rPr>
+          <w:rFonts w:hint="cs"/>
+          <w:rtl/>
+        </w:rPr>
+        <w:t>) عمل کرده است.</w:t>
       </w:r>
     </w:p>
     <w:p>
@@ -2129,7 +2168,7 @@
           <w:rFonts w:hint="cs"/>
           <w:rtl/>
         </w:rPr>
-        <w:t xml:space="preserve"> ماتریس نگاشت، </w:t>
+        <w:t xml:space="preserve"> ماتریس نگاشت خطی، </w:t>
       </w:r>
       <w:r>
         <w:rPr>
@@ -2142,7 +2181,7 @@
           <w:rFonts w:hint="cs"/>
           <w:rtl/>
         </w:rPr>
-        <w:t xml:space="preserve"> بردار توجه، </w:t>
+        <w:t xml:space="preserve"> بردار پارامتر توجه، </w:t>
       </w:r>
       <w:r>
         <w:rPr>
@@ -2220,7 +2259,7 @@
           <w:rFonts w:hint="cs"/>
           <w:rtl/>
         </w:rPr>
-        <w:t xml:space="preserve"> پارامترهای یادگرفتنی تنظیم هندسی هستند. آموزش شبکه با تابع زیان سه‌گانه خودنظارتی (رابطه (</w:t>
+        <w:t xml:space="preserve"> ضرایب اسکالر یادگرفتنی هستند. آموزش شبکه با تابع زیان سه‌گانه خودنظارتی (رابطه (</w:t>
       </w:r>
       <w:r>
         <w:rPr>
@@ -2410,7 +2449,59 @@
           <w:rFonts w:hint="cs"/>
           <w:rtl/>
         </w:rPr>
-        <w:t xml:space="preserve"> خطای پیش‌بینی انحنای موضعی یال‌هاست.</w:t>
+        <w:t xml:space="preserve"> خطای پیش‌بینی انحنای موضعی یال‌هاست؛ ضرایب مصالحه در پیاده‌سازی به ترتیب برابر </w:t>
+      </w:r>
+      <w:r>
+        <w:rPr>
+          <w:rFonts w:ascii="Times New Roman" w:hAnsi="Times New Roman" w:cs="Times New Roman"/>
+        </w:rPr>
+        <w:t>λ_1</w:t>
+      </w:r>
+      <w:r>
+        <w:rPr>
+          <w:rFonts w:hint="cs"/>
+          <w:rtl/>
+        </w:rPr>
+        <w:t xml:space="preserve"> = </w:t>
+      </w:r>
+      <w:r>
+        <w:rPr>
+          <w:rFonts w:ascii="Times New Roman" w:hAnsi="Times New Roman" w:cs="Times New Roman"/>
+        </w:rPr>
+        <w:t>0.3</w:t>
+      </w:r>
+      <w:r>
+        <w:rPr>
+          <w:rFonts w:hint="cs"/>
+          <w:rtl/>
+        </w:rPr>
+        <w:t xml:space="preserve"> و </w:t>
+      </w:r>
+      <w:r>
+        <w:rPr>
+          <w:rFonts w:ascii="Times New Roman" w:hAnsi="Times New Roman" w:cs="Times New Roman"/>
+        </w:rPr>
+        <w:t>λ_2</w:t>
+      </w:r>
+      <w:r>
+        <w:rPr>
+          <w:rFonts w:hint="cs"/>
+          <w:rtl/>
+        </w:rPr>
+        <w:t xml:space="preserve"> = </w:t>
+      </w:r>
+      <w:r>
+        <w:rPr>
+          <w:rFonts w:ascii="Times New Roman" w:hAnsi="Times New Roman" w:cs="Times New Roman"/>
+        </w:rPr>
+        <w:t>0.1</w:t>
+      </w:r>
+      <w:r>
+        <w:rPr>
+          <w:rFonts w:hint="cs"/>
+          <w:rtl/>
+        </w:rPr>
+        <w:t xml:space="preserve"> تنظیم شده‌اند.</w:t>
       </w:r>
     </w:p>
     <w:p>
@@ -2435,7 +2526,7 @@
           <w:rFonts w:hint="cs"/>
           <w:rtl/>
         </w:rPr>
-        <w:t>: موتور استخراج پرسونای سازمانی</w:t>
+        <w:t>: بخش‌بندی و تفسیر الگوها</w:t>
       </w:r>
     </w:p>
     <w:p>
@@ -2460,33 +2551,7 @@
           <w:rFonts w:hint="cs"/>
           <w:rtl/>
         </w:rPr>
-        <w:t xml:space="preserve"> با خوشه‌بندی تفکیک شده و هم‌زمان شاخص‌های تمول بانکی (</w:t>
-      </w:r>
-      <w:r>
-        <w:rPr>
-          <w:rFonts w:ascii="Times New Roman" w:hAnsi="Times New Roman" w:cs="Times New Roman"/>
-        </w:rPr>
-        <w:t>Affluence Centrality</w:t>
-      </w:r>
-      <w:r>
-        <w:rPr>
-          <w:rFonts w:hint="cs"/>
-          <w:rtl/>
-        </w:rPr>
-        <w:t>)، آنتروپی شانون تنوع سبد خرید و ضریب چسبندگی شبکه (</w:t>
-      </w:r>
-      <w:r>
-        <w:rPr>
-          <w:rFonts w:ascii="Times New Roman" w:hAnsi="Times New Roman" w:cs="Times New Roman"/>
-        </w:rPr>
-        <w:t>Network Stickiness</w:t>
-      </w:r>
-      <w:r>
-        <w:rPr>
-          <w:rFonts w:hint="cs"/>
-          <w:rtl/>
-        </w:rPr>
-        <w:t>) جهت تصمیم‌گیری استراتژیک سازمانی استخراج می‌گردند.</w:t>
+        <w:t xml:space="preserve"> با الگوریتم‌های خوشه‌بندی تفکیک شده و هم‌زمان شاخص‌هایی نظیر آنتروپی شانون تنوع سبد خرید و ضریب چسبندگی شبکه جهت تحلیل کاربردی استخراج می‌گردند.</w:t>
       </w:r>
     </w:p>
     <w:p>

</xml_diff>

<commit_message>
Refine academic tone, remove fake affiliations, fix formula log singularity, and calibrate SVD vs HG-CAN discussion
</commit_message>
<xml_diff>
--- a/FA_From_Transactional_Data_to_Organizational_Intelligence.docx
+++ b/FA_From_Transactional_Data_to_Organizational_Intelligence.docx
@@ -3100,7 +3100,7 @@
           <w:rFonts w:hint="cs"/>
           <w:rtl/>
         </w:rPr>
-        <w:t xml:space="preserve">) نشان می‌دهد که روش سنتی </w:t>
+        <w:t xml:space="preserve">) نشان می‌دهد که مدل سنتی </w:t>
       </w:r>
       <w:r>
         <w:rPr>
@@ -3113,7 +3113,7 @@
           <w:rFonts w:hint="cs"/>
           <w:rtl/>
         </w:rPr>
-        <w:t xml:space="preserve"> به دلیل فقدان اطلاعات رابطه‌ای اصناف، به شاخص‌های نازل </w:t>
+        <w:t xml:space="preserve"> به دلیل تکیه انحصاری بر متغیرهای تجمیعی و فقدان اطلاعات رابطه‌ای اصناف، شاخص‌های </w:t>
       </w:r>
       <w:r>
         <w:rPr>
@@ -3126,7 +3126,7 @@
           <w:rFonts w:hint="cs"/>
           <w:rtl/>
         </w:rPr>
-        <w:t xml:space="preserve"> = </w:t>
+        <w:t xml:space="preserve"> معادل </w:t>
       </w:r>
       <w:r>
         <w:rPr>
@@ -3152,7 +3152,7 @@
           <w:rFonts w:hint="cs"/>
           <w:rtl/>
         </w:rPr>
-        <w:t xml:space="preserve"> = </w:t>
+        <w:t xml:space="preserve"> معادل </w:t>
       </w:r>
       <w:r>
         <w:rPr>
@@ -3165,7 +3165,20 @@
           <w:rFonts w:hint="cs"/>
           <w:rtl/>
         </w:rPr>
-        <w:t xml:space="preserve"> دست یافته است؛ روش </w:t>
+        <w:t xml:space="preserve"> را ثبت کرده است. روش‌های مبتنی بر ساختار شبکه و صنف (شامل </w:t>
+      </w:r>
+      <w:r>
+        <w:rPr>
+          <w:rFonts w:ascii="Times New Roman" w:hAnsi="Times New Roman" w:cs="Times New Roman"/>
+        </w:rPr>
+        <w:t>SVD</w:t>
+      </w:r>
+      <w:r>
+        <w:rPr>
+          <w:rFonts w:hint="cs"/>
+          <w:rtl/>
+        </w:rPr>
+        <w:t xml:space="preserve"> و </w:t>
       </w:r>
       <w:r>
         <w:rPr>
@@ -3178,7 +3191,7 @@
           <w:rFonts w:hint="cs"/>
           <w:rtl/>
         </w:rPr>
-        <w:t xml:space="preserve"> نسبت به </w:t>
+        <w:t xml:space="preserve">) نسبت به خط‌مبنای </w:t>
       </w:r>
       <w:r>
         <w:rPr>
@@ -3191,7 +3204,33 @@
           <w:rFonts w:hint="cs"/>
           <w:rtl/>
         </w:rPr>
-        <w:t xml:space="preserve"> بهبود چشمگیری را ثبت می‌کند. با این حال، مقایسه روش پیشنهادی با خط‌مبنای </w:t>
+        <w:t xml:space="preserve"> عملکرد بالاتری در شاخص‌های </w:t>
+      </w:r>
+      <w:r>
+        <w:rPr>
+          <w:rFonts w:ascii="Times New Roman" w:hAnsi="Times New Roman" w:cs="Times New Roman"/>
+        </w:rPr>
+        <w:t>NMI</w:t>
+      </w:r>
+      <w:r>
+        <w:rPr>
+          <w:rFonts w:hint="cs"/>
+          <w:rtl/>
+        </w:rPr>
+        <w:t xml:space="preserve"> و </w:t>
+      </w:r>
+      <w:r>
+        <w:rPr>
+          <w:rFonts w:ascii="Times New Roman" w:hAnsi="Times New Roman" w:cs="Times New Roman"/>
+        </w:rPr>
+        <w:t>ARI</w:t>
+      </w:r>
+      <w:r>
+        <w:rPr>
+          <w:rFonts w:hint="cs"/>
+          <w:rtl/>
+        </w:rPr>
+        <w:t xml:space="preserve"> نشان می‌دهند. با این حال، مقایسه روش پیشنهادی با خط‌مبنای </w:t>
       </w:r>
       <w:r>
         <w:rPr>
@@ -4378,7 +4417,7 @@
           <w:rFonts w:hint="cs"/>
           <w:rtl/>
         </w:rPr>
-        <w:t xml:space="preserve"> برای استخراج بازنمایی رفتار تراکنشی از سوابق پرداخت مبتنی بر شبکه عصبی گراف و انحنای فرمن-ریچی مورد ارزیابی قرار گرفت. نتایج بر روی داده‌های شبیه‌سازی‌شده حاکی از برتری قاطع مدل‌های رابطه‌ای نسبت به مدل سنتی </w:t>
+        <w:t xml:space="preserve"> برای استخراج بازنمایی رفتار تراکنشی از سوابق پرداخت مبتنی بر شبکه عصبی گراف و انحنای فرمن-ریچی مورد ارزیابی قرار گرفت. نتایج بر روی داده‌های شبیه‌سازی‌شده عملکرد بالاتری نسبت به خط‌مبنای </w:t>
       </w:r>
       <w:r>
         <w:rPr>
@@ -4391,7 +4430,33 @@
           <w:rFonts w:hint="cs"/>
           <w:rtl/>
         </w:rPr>
-        <w:t xml:space="preserve"> است. همچنین مقایسه نشان داد که عملکرد تفکیک مدل پیشنهادی با روش خطی </w:t>
+        <w:t xml:space="preserve"> در شاخص‌های </w:t>
+      </w:r>
+      <w:r>
+        <w:rPr>
+          <w:rFonts w:ascii="Times New Roman" w:hAnsi="Times New Roman" w:cs="Times New Roman"/>
+        </w:rPr>
+        <w:t>NMI</w:t>
+      </w:r>
+      <w:r>
+        <w:rPr>
+          <w:rFonts w:hint="cs"/>
+          <w:rtl/>
+        </w:rPr>
+        <w:t xml:space="preserve"> و </w:t>
+      </w:r>
+      <w:r>
+        <w:rPr>
+          <w:rFonts w:ascii="Times New Roman" w:hAnsi="Times New Roman" w:cs="Times New Roman"/>
+        </w:rPr>
+        <w:t>ARI</w:t>
+      </w:r>
+      <w:r>
+        <w:rPr>
+          <w:rFonts w:hint="cs"/>
+          <w:rtl/>
+        </w:rPr>
+        <w:t xml:space="preserve"> نشان داد. همچنین مقایسه نشان داد که عملکرد تفکیک مدل پیشنهادی با روش خطی </w:t>
       </w:r>
       <w:r>
         <w:rPr>

</xml_diff>

<commit_message>
Convert all figures and tables to single column, unify 16-dim features, clarify bipartite projection and edge curvature pipeline, and moderate inductive claims
</commit_message>
<xml_diff>
--- a/FA_From_Transactional_Data_to_Organizational_Intelligence.docx
+++ b/FA_From_Transactional_Data_to_Organizational_Intelligence.docx
@@ -1526,7 +1526,7 @@
           <w:rFonts w:hint="cs"/>
           <w:rtl/>
         </w:rPr>
-        <w:t>: نگاشت ابرگراف و محاسبه انحنای فرمن-ریچی</w:t>
+        <w:t>: تصویرسازی شبکه کارت–کارت و محاسبه انحنای فرمن-ریچی</w:t>
       </w:r>
     </w:p>
     <w:p>
@@ -1538,13 +1538,13 @@
           <w:rFonts w:hint="cs"/>
           <w:rtl/>
         </w:rPr>
-        <w:t xml:space="preserve">تعاملات کارت‌ها و پایانه‌های پذیرندگی در قالب یک ابرگراف دوبخشی </w:t>
-      </w:r>
-      <w:r>
-        <w:rPr>
-          <w:rFonts w:ascii="Times New Roman" w:hAnsi="Times New Roman" w:cs="Times New Roman"/>
-        </w:rPr>
-        <w:t>H</w:t>
+        <w:t xml:space="preserve">تعاملات کارت‌ها و پایانه‌های پذیرندگی ابتدا در قالب یک گراف تعاملی دوبخشی </w:t>
+      </w:r>
+      <w:r>
+        <w:rPr>
+          <w:rFonts w:ascii="Times New Roman" w:hAnsi="Times New Roman" w:cs="Times New Roman"/>
+        </w:rPr>
+        <w:t>B</w:t>
       </w:r>
       <w:r>
         <w:rPr>
@@ -1590,7 +1590,59 @@
           <w:rFonts w:hint="cs"/>
           <w:rtl/>
         </w:rPr>
-        <w:t xml:space="preserve">) تعریف می‌شود. با اعمال تصویرسازی وزن‌دار کسینوسی بر روی ماتریس پروفایل اصناف، شبکه کارت-کارت با ماتریس مجاورت </w:t>
+        <w:t xml:space="preserve">) مدل‌سازی می‌شود. به منظور تحلیل روابط مستقیم رفتاری میان دارندگان کارت، این ساختار از طریق محاسبه شباهت کسینوسی بردار توزیع اصناف کارت‌ها، بر روی مجموعه کارت‌ها تصویر شده و گراف هم‌رخدادی وزن‌دار کارت–کارت </w:t>
+      </w:r>
+      <w:r>
+        <w:rPr>
+          <w:rFonts w:ascii="Times New Roman" w:hAnsi="Times New Roman" w:cs="Times New Roman"/>
+        </w:rPr>
+        <w:t>G</w:t>
+      </w:r>
+      <w:r>
+        <w:rPr>
+          <w:rFonts w:hint="cs"/>
+          <w:rtl/>
+        </w:rPr>
+        <w:t xml:space="preserve"> = (</w:t>
+      </w:r>
+      <w:r>
+        <w:rPr>
+          <w:rFonts w:ascii="Times New Roman" w:hAnsi="Times New Roman" w:cs="Times New Roman"/>
+        </w:rPr>
+        <w:t>V_card</w:t>
+      </w:r>
+      <w:r>
+        <w:rPr>
+          <w:rFonts w:hint="cs"/>
+          <w:rtl/>
+        </w:rPr>
+        <w:t xml:space="preserve">, </w:t>
+      </w:r>
+      <w:r>
+        <w:rPr>
+          <w:rFonts w:ascii="Times New Roman" w:hAnsi="Times New Roman" w:cs="Times New Roman"/>
+        </w:rPr>
+        <w:t>E_G</w:t>
+      </w:r>
+      <w:r>
+        <w:rPr>
+          <w:rFonts w:hint="cs"/>
+          <w:rtl/>
+        </w:rPr>
+        <w:t xml:space="preserve">, </w:t>
+      </w:r>
+      <w:r>
+        <w:rPr>
+          <w:rFonts w:ascii="Times New Roman" w:hAnsi="Times New Roman" w:cs="Times New Roman"/>
+        </w:rPr>
+        <w:t>W</w:t>
+      </w:r>
+      <w:r>
+        <w:rPr>
+          <w:rFonts w:hint="cs"/>
+          <w:rtl/>
+        </w:rPr>
+        <w:t xml:space="preserve">) با ماتریس مجاورت </w:t>
       </w:r>
       <w:r>
         <w:rPr>
@@ -1603,20 +1655,33 @@
           <w:rFonts w:hint="cs"/>
           <w:rtl/>
         </w:rPr>
-        <w:t xml:space="preserve"> تشکیل می‌شود. سپس برای هر یال </w:t>
-      </w:r>
-      <w:r>
-        <w:rPr>
-          <w:rFonts w:ascii="Times New Roman" w:hAnsi="Times New Roman" w:cs="Times New Roman"/>
-        </w:rPr>
-        <w:t>e</w:t>
-      </w:r>
-      <w:r>
-        <w:rPr>
-          <w:rFonts w:hint="cs"/>
-          <w:rtl/>
-        </w:rPr>
-        <w:t xml:space="preserve"> = (</w:t>
+        <w:t xml:space="preserve"> تشکیل می‌گردد. وزن هر یال </w:t>
+      </w:r>
+      <w:r>
+        <w:rPr>
+          <w:rFonts w:ascii="Times New Roman" w:hAnsi="Times New Roman" w:cs="Times New Roman"/>
+        </w:rPr>
+        <w:t>w_uv</w:t>
+      </w:r>
+      <w:r>
+        <w:rPr>
+          <w:rFonts w:hint="cs"/>
+          <w:rtl/>
+        </w:rPr>
+        <w:t xml:space="preserve"> در این شبکه، میزان هم‌پوشانی سبد خرید دو کارت در اصناف مختلف را تعیین می‌نماید. سپس انحنای گسسته فرمن-ریچی </w:t>
+      </w:r>
+      <w:r>
+        <w:rPr>
+          <w:rFonts w:ascii="Times New Roman" w:hAnsi="Times New Roman" w:cs="Times New Roman"/>
+        </w:rPr>
+        <w:t>F</w:t>
+      </w:r>
+      <w:r>
+        <w:rPr>
+          <w:rFonts w:hint="cs"/>
+          <w:rtl/>
+        </w:rPr>
+        <w:t>(</w:t>
       </w:r>
       <w:r>
         <w:rPr>
@@ -1642,46 +1707,7 @@
           <w:rFonts w:hint="cs"/>
           <w:rtl/>
         </w:rPr>
-        <w:t xml:space="preserve">)، انحنای گسسته فرمن-ریچی </w:t>
-      </w:r>
-      <w:r>
-        <w:rPr>
-          <w:rFonts w:ascii="Times New Roman" w:hAnsi="Times New Roman" w:cs="Times New Roman"/>
-        </w:rPr>
-        <w:t>F</w:t>
-      </w:r>
-      <w:r>
-        <w:rPr>
-          <w:rFonts w:hint="cs"/>
-          <w:rtl/>
-        </w:rPr>
-        <w:t>(</w:t>
-      </w:r>
-      <w:r>
-        <w:rPr>
-          <w:rFonts w:ascii="Times New Roman" w:hAnsi="Times New Roman" w:cs="Times New Roman"/>
-        </w:rPr>
-        <w:t>u</w:t>
-      </w:r>
-      <w:r>
-        <w:rPr>
-          <w:rFonts w:hint="cs"/>
-          <w:rtl/>
-        </w:rPr>
-        <w:t xml:space="preserve">, </w:t>
-      </w:r>
-      <w:r>
-        <w:rPr>
-          <w:rFonts w:ascii="Times New Roman" w:hAnsi="Times New Roman" w:cs="Times New Roman"/>
-        </w:rPr>
-        <w:t>v</w:t>
-      </w:r>
-      <w:r>
-        <w:rPr>
-          <w:rFonts w:hint="cs"/>
-          <w:rtl/>
-        </w:rPr>
-        <w:t>) از رابطه (</w:t>
+        <w:t>) منحصراً بر روی یال‌های این گراف تصویرشده کارت–کارت از رابطه (</w:t>
       </w:r>
       <w:r>
         <w:rPr>
@@ -1803,7 +1829,7 @@
           <w:rFonts w:hint="cs"/>
           <w:rtl/>
         </w:rPr>
-        <w:t xml:space="preserve"> و </w:t>
+        <w:t xml:space="preserve"> در گراف تصویرشده و </w:t>
       </w:r>
       <w:r>
         <w:rPr>
@@ -1868,7 +1894,7 @@
           <w:rFonts w:hint="cs"/>
           <w:rtl/>
         </w:rPr>
-        <w:t>) است. انحنای منفی بیانگر یال‌های پل‌ساز میان جوامع و انحنای مثبت نشانگر ساختارهای متراکم درون‌خوشه‌ای است.</w:t>
+        <w:t>) در همین گراف است. انحنای منفی بیانگر یال‌های پل‌ساز میان جوامع مختلف اصناف و انحنای مثبت نشانگر ساختارهای متراکم درون‌خوشه‌ای است.</w:t>
       </w:r>
     </w:p>
     <w:p>

</xml_diff>

<commit_message>
Update final generated DOCX and PDF manuscripts
</commit_message>
<xml_diff>
--- a/FA_From_Transactional_Data_to_Organizational_Intelligence.docx
+++ b/FA_From_Transactional_Data_to_Organizational_Intelligence.docx
@@ -11,21 +11,7 @@
           <w:rFonts w:hint="cs" w:ascii="B Mitra" w:hAnsi="B Mitra" w:cs="B Mitra"/>
           <w:rtl/>
         </w:rPr>
-        <w:t>از داده‌های تراکنشی تا هوشمندی سازمانی: چارچوب هوش مصنوعی گراف زمانی برای کشف فرصت‌های پذیرندگان و اولویت‌بندی کمپین‌های بازاریابی (</w:t>
-      </w:r>
-      <w:r>
-        <w:rPr>
-          <w:rFonts w:ascii="Times New Roman" w:hAnsi="Times New Roman" w:cs="Times New Roman"/>
-          <w:bidi w:val="0"/>
-        </w:rPr>
-        <w:t>HAMTA</w:t>
-      </w:r>
-      <w:r>
-        <w:rPr>
-          <w:rFonts w:hint="cs" w:ascii="B Mitra" w:hAnsi="B Mitra" w:cs="B Mitra"/>
-          <w:rtl/>
-        </w:rPr>
-        <w:t>)</w:t>
+        <w:t>چارچوب گراف زمانی برای کشف فرصت رشد تراکنش پذیرندگان و اولویت‌بندی کمپین</w:t>
       </w:r>
     </w:p>
     <w:p>
@@ -154,7 +140,7 @@
           <w:rFonts w:hint="cs" w:ascii="B Mitra" w:hAnsi="B Mitra" w:cs="B Mitra"/>
           <w:rtl/>
         </w:rPr>
-        <w:t xml:space="preserve"> استوار بوده و نسبت به شبکه تعاملات مشتریان نابینا هستند؛ در نتیجه قادر به تفکیک افت طبیعی از ظرفیت بالقوه رشد نیستند. در این مقاله، چارچوب هوش مصنوعی گراف زمانی </w:t>
+        <w:t xml:space="preserve"> استوار بوده و نسبت به شبکه تعاملات مشتریان نابینا هستند؛ در نتیجه قادر به تفکیک افت طبیعی از ظرفیت بالقوه رشد نیستند. در این مقاله، چارچوب گراف زمانی </w:t>
       </w:r>
       <w:r>
         <w:rPr>
@@ -211,6 +197,60 @@
           <w:rtl/>
         </w:rPr>
         <w:t xml:space="preserve"> با ثبت خطای میانگین ۴٫۴۸ تراکنش و دقت رتبه‌بندی ۳۶٫۶ درصد، به بهبود ۲٫۵۱ برابری نسبت به شانس تصادفی دست یافته و زیرساختی عملیاتی و بدون برچسب مداخله برای هوشمندی سبد پذیرندگان فراهم می‌سازد.</w:t>
+      </w:r>
+    </w:p>
+    <w:p>
+      <w:pPr>
+        <w:pStyle w:val="Heading0"/>
+      </w:pPr>
+      <w:r>
+        <w:rPr>
+          <w:rFonts w:hint="cs" w:ascii="B Mitra" w:hAnsi="B Mitra" w:cs="B Mitra"/>
+          <w:rtl/>
+        </w:rPr>
+        <w:t xml:space="preserve">چارچوب </w:t>
+      </w:r>
+      <w:r>
+        <w:rPr>
+          <w:rFonts w:ascii="Times New Roman" w:hAnsi="Times New Roman" w:cs="Times New Roman"/>
+          <w:bidi w:val="0"/>
+        </w:rPr>
+        <w:t>HAMTA</w:t>
+      </w:r>
+      <w:r>
+        <w:rPr>
+          <w:rFonts w:hint="cs" w:ascii="B Mitra" w:hAnsi="B Mitra" w:cs="B Mitra"/>
+          <w:rtl/>
+        </w:rPr>
+        <w:t xml:space="preserve"> تنها یک مدل یادگیری ماشین نیست، بلکه یک مؤلفه تصمیم‌یار (</w:t>
+      </w:r>
+      <w:r>
+        <w:rPr>
+          <w:rFonts w:ascii="Times New Roman" w:hAnsi="Times New Roman" w:cs="Times New Roman"/>
+          <w:bidi w:val="0"/>
+        </w:rPr>
+        <w:t>Decision-support component</w:t>
+      </w:r>
+      <w:r>
+        <w:rPr>
+          <w:rFonts w:hint="cs" w:ascii="B Mitra" w:hAnsi="B Mitra" w:cs="B Mitra"/>
+          <w:rtl/>
+        </w:rPr>
+        <w:t xml:space="preserve">) در معماری مدیریت پذیرندگان است. این معماری از جریان داده‌های تراکنشی آغاز شده، در لایه هوشمندی گراف پردازش می‌گردد و توسط موتور تصمیم‌گیری </w:t>
+      </w:r>
+      <w:r>
+        <w:rPr>
+          <w:rFonts w:ascii="Times New Roman" w:hAnsi="Times New Roman" w:cs="Times New Roman"/>
+          <w:bidi w:val="0"/>
+        </w:rPr>
+        <w:t>M-GATO</w:t>
+      </w:r>
+      <w:r>
+        <w:rPr>
+          <w:rFonts w:hint="cs" w:ascii="B Mitra" w:hAnsi="B Mitra" w:cs="B Mitra"/>
+          <w:rtl/>
+        </w:rPr>
+        <w:t xml:space="preserve"> به واحد بازاریابی جهت اجرای کمپین و دریافت بازخورد سازمانی متصل می‌شود.</w:t>
       </w:r>
     </w:p>
     <w:p>
@@ -600,7 +640,7 @@
           <w:rFonts w:hint="cs" w:ascii="B Mitra" w:hAnsi="B Mitra" w:cs="B Mitra"/>
           <w:rtl/>
         </w:rPr>
-        <w:t xml:space="preserve"> مسئله کشف فرصت نسبی را در داده‌های مشاهده‌ای بدون نیاز به برچسب‌های پیشین مداخله حل می‌نماید.</w:t>
+        <w:t xml:space="preserve"> اولین روش بازاریابی پذیرندگان مبتنی بر گراف نیست، بلکه چارچوبی برای کشف فرصت نسبی بدون نیاز به برچسب‌های تاریخی مداخله بر پایه گراف تراکنش زمانی و بنچ‌مارک محافظه‌کارانه ارائه می‌کند.</w:t>
       </w:r>
     </w:p>
     <w:p>
@@ -688,7 +728,7 @@
           <w:rFonts w:ascii="Times New Roman" w:hAnsi="Times New Roman" w:cs="Times New Roman"/>
           <w:bidi w:val="0"/>
         </w:rPr>
-        <w:t>[14]</w:t>
+        <w:t>[12]</w:t>
       </w:r>
       <w:r>
         <w:rPr>
@@ -702,7 +742,7 @@
           <w:rFonts w:ascii="Times New Roman" w:hAnsi="Times New Roman" w:cs="Times New Roman"/>
           <w:bidi w:val="0"/>
         </w:rPr>
-        <w:t>[15]</w:t>
+        <w:t>[13]</w:t>
       </w:r>
       <w:r>
         <w:rPr>
@@ -716,7 +756,7 @@
           <w:rFonts w:ascii="Times New Roman" w:hAnsi="Times New Roman" w:cs="Times New Roman"/>
           <w:bidi w:val="0"/>
         </w:rPr>
-        <w:t>12</w:t>
+        <w:t>14</w:t>
       </w:r>
       <w:r>
         <w:rPr>
@@ -730,7 +770,7 @@
           <w:rFonts w:ascii="Times New Roman" w:hAnsi="Times New Roman" w:cs="Times New Roman"/>
           <w:bidi w:val="0"/>
         </w:rPr>
-        <w:t>13</w:t>
+        <w:t>15</w:t>
       </w:r>
       <w:r>
         <w:rPr>
@@ -1102,7 +1142,21 @@
           <w:rFonts w:hint="cs" w:ascii="B Mitra" w:hAnsi="B Mitra" w:cs="B Mitra"/>
           <w:rtl/>
         </w:rPr>
-        <w:t xml:space="preserve"> با سنجش توزیع خطاهای پسماند در پنجره‌های گذشته، کران‌های بازه‌ای کالیبره‌شده بدون وابستگی به فرضیات سخت‌گیرانه تعویض‌پذیری تئوریک ارائه می‌دهند.</w:t>
+        <w:t xml:space="preserve"> با سنجش توزیع خطاهای پسماند در پنجره‌های گذشته، کران‌های بازه‌ای کالیبره‌شده بنابراین واسنجی بازه پیش‌بینی یک‌طرفه زمانی (</w:t>
+      </w:r>
+      <w:r>
+        <w:rPr>
+          <w:rFonts w:ascii="Times New Roman" w:hAnsi="Times New Roman" w:cs="Times New Roman"/>
+          <w:bidi w:val="0"/>
+        </w:rPr>
+        <w:t>One-sided temporal prediction-interval calibration</w:t>
+      </w:r>
+      <w:r>
+        <w:rPr>
+          <w:rFonts w:hint="cs" w:ascii="B Mitra" w:hAnsi="B Mitra" w:cs="B Mitra"/>
+          <w:rtl/>
+        </w:rPr>
+        <w:t>) به صورت تجربی صورت می‌گیرد.</w:t>
       </w:r>
     </w:p>
     <w:p>
@@ -1279,7 +1333,7 @@
       <w:r>
         <w:drawing>
           <wp:inline xmlns:a="http://schemas.openxmlformats.org/drawingml/2006/main" xmlns:pic="http://schemas.openxmlformats.org/drawingml/2006/picture">
-            <wp:extent cx="2736000" cy="2063503"/>
+            <wp:extent cx="2736000" cy="1112899"/>
             <wp:docPr id="1" name="Picture 1"/>
             <wp:cNvGraphicFramePr>
               <a:graphicFrameLocks noChangeAspect="1"/>
@@ -1300,7 +1354,7 @@
                   <pic:spPr>
                     <a:xfrm>
                       <a:off x="0" y="0"/>
-                      <a:ext cx="2736000" cy="2063503"/>
+                      <a:ext cx="2736000" cy="1112899"/>
                     </a:xfrm>
                     <a:prstGeom prst="rect"/>
                   </pic:spPr>
@@ -1613,7 +1667,49 @@
           <w:rFonts w:hint="cs" w:ascii="B Mitra" w:hAnsi="B Mitra" w:cs="B Mitra"/>
           <w:rtl/>
         </w:rPr>
-        <w:t xml:space="preserve"> و میانگین وقفه همسایگان)؛ (۵ تا ۷) شاخص‌های مقیاس مالی استخراج‌شده از مبلغ تراکنش شامل لگاریتم حجم کل، میانگین مبلغ و انحراف معیار مبلغ؛ (۸) وسعت تعاملات مشتریان یکتا (تعداد کارت‌های متمایز پوشش‌داده‌شده)؛ و (۹ تا ۱۶) بردار وان‌هات نشانگر صنف اقتصادی در میان ۸ صنف تجاری. مسیر وابستگی ویژگی‌ها اکیداً علّی است: ۵ فیلد پایه دفتر کل → ساخت گراف همتایان تاریخی </w:t>
+        <w:t xml:space="preserve"> و میانگین وقفه همسایگان)؛ (۵ تا ۷) شاخص‌های مقیاس مالی استخراج‌شده از مبلغ تراکنش شامل لگاریتم حجم کل، میانگین مبلغ و انحراف معیار مبلغ؛ (۸) وسعت تعاملات مشتریان یکتا (تعداد کارت‌های متمایز پوشش‌داده‌شده)؛ و (۹ تا ۱۶) بردار وان‌هات نشانگر صنف اقتصادی در میان ۸ صنف تجاری. مسیر وابستگی ویژگی‌ها اکیداً علّی است: ۵ فیلد پایه دفتر کل → ساخت گراف همتایان تاریخی گراف‌های تاریخی → تجمیع وقفه همتایان → شبکه عصبی گراف زمانی در زمان </w:t>
+      </w:r>
+      <w:r>
+        <w:rPr>
+          <w:rFonts w:ascii="Times New Roman" w:hAnsi="Times New Roman" w:cs="Times New Roman"/>
+          <w:bidi w:val="0"/>
+        </w:rPr>
+        <w:t>t</w:t>
+      </w:r>
+      <w:r>
+        <w:rPr>
+          <w:rFonts w:hint="cs" w:ascii="B Mitra" w:hAnsi="B Mitra" w:cs="B Mitra"/>
+          <w:rtl/>
+        </w:rPr>
+        <w:t xml:space="preserve">، که از نشت اطلاعات آینده ممانعت می‌کند. هدف مسئله در سطح هر پذیرنده </w:t>
+      </w:r>
+      <w:r>
+        <w:rPr>
+          <w:rFonts w:ascii="Times New Roman" w:hAnsi="Times New Roman" w:cs="Times New Roman"/>
+          <w:bidi w:val="0"/>
+        </w:rPr>
+        <w:t>m</w:t>
+      </w:r>
+      <w:r>
+        <w:rPr>
+          <w:rFonts w:hint="cs" w:ascii="B Mitra" w:hAnsi="B Mitra" w:cs="B Mitra"/>
+          <w:rtl/>
+        </w:rPr>
+        <w:t xml:space="preserve"> ∈ </w:t>
+      </w:r>
+      <w:r>
+        <w:rPr>
+          <w:rFonts w:ascii="Times New Roman" w:hAnsi="Times New Roman" w:cs="Times New Roman"/>
+          <w:bidi w:val="0"/>
+        </w:rPr>
+        <w:t>M</w:t>
+      </w:r>
+      <w:r>
+        <w:rPr>
+          <w:rFonts w:hint="cs" w:ascii="B Mitra" w:hAnsi="B Mitra" w:cs="B Mitra"/>
+          <w:rtl/>
+        </w:rPr>
+        <w:t xml:space="preserve">، پیش‌بینی تعداد تراکنش دوره آتی </w:t>
       </w:r>
       <w:r>
         <w:rPr>
@@ -1622,7 +1718,7 @@
           <w:i/>
           <w:bidi w:val="0"/>
         </w:rPr>
-        <w:t>G</w:t>
+        <w:t>Y</w:t>
       </w:r>
       <w:r>
         <w:rPr>
@@ -1630,56 +1726,42 @@
           <w:bidi w:val="0"/>
           <w:vertAlign w:val="subscript"/>
         </w:rPr>
-        <w:t>&lt;=t</w:t>
-      </w:r>
-      <w:r>
-        <w:rPr>
-          <w:rFonts w:hint="cs" w:ascii="B Mitra" w:hAnsi="B Mitra" w:cs="B Mitra"/>
-          <w:rtl/>
-        </w:rPr>
-        <w:t xml:space="preserve"> → تجمیع وقفه همتایان → شبکه عصبی گراف زمانی در زمان </w:t>
-      </w:r>
-      <w:r>
-        <w:rPr>
-          <w:rFonts w:ascii="Times New Roman" w:hAnsi="Times New Roman" w:cs="Times New Roman"/>
-          <w:bidi w:val="0"/>
-        </w:rPr>
-        <w:t>t</w:t>
-      </w:r>
-      <w:r>
-        <w:rPr>
-          <w:rFonts w:hint="cs" w:ascii="B Mitra" w:hAnsi="B Mitra" w:cs="B Mitra"/>
-          <w:rtl/>
-        </w:rPr>
-        <w:t xml:space="preserve">، که از نشت اطلاعات آینده ممانعت می‌کند. هدف مسئله در سطح هر پذیرنده </w:t>
-      </w:r>
-      <w:r>
-        <w:rPr>
-          <w:rFonts w:ascii="Times New Roman" w:hAnsi="Times New Roman" w:cs="Times New Roman"/>
-          <w:bidi w:val="0"/>
-        </w:rPr>
-        <w:t>m</w:t>
-      </w:r>
-      <w:r>
-        <w:rPr>
-          <w:rFonts w:hint="cs" w:ascii="B Mitra" w:hAnsi="B Mitra" w:cs="B Mitra"/>
-          <w:rtl/>
-        </w:rPr>
-        <w:t xml:space="preserve"> ∈ </w:t>
-      </w:r>
-      <w:r>
-        <w:rPr>
-          <w:rFonts w:ascii="Times New Roman" w:hAnsi="Times New Roman" w:cs="Times New Roman"/>
-          <w:bidi w:val="0"/>
-        </w:rPr>
-        <w:t>M</w:t>
-      </w:r>
-      <w:r>
-        <w:rPr>
-          <w:rFonts w:hint="cs" w:ascii="B Mitra" w:hAnsi="B Mitra" w:cs="B Mitra"/>
-          <w:rtl/>
-        </w:rPr>
-        <w:t xml:space="preserve">، پیش‌بینی تعداد تراکنش دوره آتی </w:t>
+        <w:t>m, t+1</w:t>
+      </w:r>
+      <w:r>
+        <w:rPr>
+          <w:rFonts w:hint="cs" w:ascii="B Mitra" w:hAnsi="B Mitra" w:cs="B Mitra"/>
+          <w:rtl/>
+        </w:rPr>
+        <w:t xml:space="preserve"> ∈ ℕ_</w:t>
+      </w:r>
+      <w:r>
+        <w:rPr>
+          <w:rFonts w:ascii="Times New Roman" w:hAnsi="Times New Roman" w:cs="Times New Roman"/>
+          <w:bidi w:val="0"/>
+        </w:rPr>
+        <w:t>0</w:t>
+      </w:r>
+      <w:r>
+        <w:rPr>
+          <w:rFonts w:hint="cs" w:ascii="B Mitra" w:hAnsi="B Mitra" w:cs="B Mitra"/>
+          <w:rtl/>
+        </w:rPr>
+        <w:t xml:space="preserve"> و تعیین شکاف فرصت ساختاری آن نسبت به بنچ‌مارک محافظه‌کارانه همتایان </w:t>
+      </w:r>
+      <w:r>
+        <w:rPr>
+          <w:rFonts w:ascii="Times New Roman" w:hAnsi="Times New Roman" w:cs="Times New Roman"/>
+          <w:bidi w:val="0"/>
+        </w:rPr>
+        <w:t>B</w:t>
+      </w:r>
+      <w:r>
+        <w:rPr>
+          <w:rFonts w:hint="cs" w:ascii="B Mitra" w:hAnsi="B Mitra" w:cs="B Mitra"/>
+          <w:rtl/>
+        </w:rPr>
+        <w:t>^</w:t>
       </w:r>
       <w:r>
         <w:rPr>
@@ -1688,58 +1770,6 @@
           <w:i/>
           <w:bidi w:val="0"/>
         </w:rPr>
-        <w:t>Y</w:t>
-      </w:r>
-      <w:r>
-        <w:rPr>
-          <w:rFonts w:ascii="Times New Roman" w:hAnsi="Times New Roman" w:cs="Times New Roman"/>
-          <w:bidi w:val="0"/>
-          <w:vertAlign w:val="subscript"/>
-        </w:rPr>
-        <w:t>m, t+1</w:t>
-      </w:r>
-      <w:r>
-        <w:rPr>
-          <w:rFonts w:hint="cs" w:ascii="B Mitra" w:hAnsi="B Mitra" w:cs="B Mitra"/>
-          <w:rtl/>
-        </w:rPr>
-        <w:t xml:space="preserve"> ∈ ℕ_</w:t>
-      </w:r>
-      <w:r>
-        <w:rPr>
-          <w:rFonts w:ascii="Times New Roman" w:hAnsi="Times New Roman" w:cs="Times New Roman"/>
-          <w:bidi w:val="0"/>
-        </w:rPr>
-        <w:t>0</w:t>
-      </w:r>
-      <w:r>
-        <w:rPr>
-          <w:rFonts w:hint="cs" w:ascii="B Mitra" w:hAnsi="B Mitra" w:cs="B Mitra"/>
-          <w:rtl/>
-        </w:rPr>
-        <w:t xml:space="preserve"> و تعیین شکاف فرصت ساختاری آن نسبت به بنچ‌مارک محافظه‌کارانه همتایان </w:t>
-      </w:r>
-      <w:r>
-        <w:rPr>
-          <w:rFonts w:ascii="Times New Roman" w:hAnsi="Times New Roman" w:cs="Times New Roman"/>
-          <w:bidi w:val="0"/>
-        </w:rPr>
-        <w:t>B</w:t>
-      </w:r>
-      <w:r>
-        <w:rPr>
-          <w:rFonts w:hint="cs" w:ascii="B Mitra" w:hAnsi="B Mitra" w:cs="B Mitra"/>
-          <w:rtl/>
-        </w:rPr>
-        <w:t>^</w:t>
-      </w:r>
-      <w:r>
-        <w:rPr>
-          <w:rFonts w:ascii="Times New Roman" w:hAnsi="Times New Roman" w:cs="Times New Roman"/>
-          <w:iCs/>
-          <w:i/>
-          <w:bidi w:val="0"/>
-        </w:rPr>
         <w:t>G</w:t>
       </w:r>
       <w:r>
@@ -1928,7 +1958,7 @@
           <w:rFonts w:hint="cs" w:ascii="B Mitra" w:hAnsi="B Mitra" w:cs="B Mitra"/>
           <w:rtl/>
         </w:rPr>
-        <w:t xml:space="preserve"> است. کارت‌ها صرفاً به عنوان گره‌های واسط جهت استخراج مسیرهای هم‌پوشان مشتریان عمل می‌کنند و هویت فردی آن‌ها نگهداری نمی‌شود.</w:t>
+        <w:t xml:space="preserve"> است (یال‌ها باینری هستند تا تمرکز بر ساختار هم‌ملاقاتی توپولوژیک باشد نه حجم تراکنش). کارت‌ها صرفاً به عنوان گره‌های واسط جهت استخراج مسیرهای هم‌پوشان مشتریان عمل می‌کنند و هویت فردی آن‌ها نگهداری نمی‌شود.</w:t>
       </w:r>
     </w:p>
     <w:p>
@@ -2686,7 +2716,35 @@
           <w:rFonts w:hint="cs" w:ascii="B Mitra" w:hAnsi="B Mitra" w:cs="B Mitra"/>
           <w:rtl/>
         </w:rPr>
-        <w:t xml:space="preserve">. سپس انحنای فرمن-ریچی نرمال‌شده افزوده </w:t>
+        <w:t>. توجه شود که محاسبه انحنا روی گراف همتایان متقارن‌شده (</w:t>
+      </w:r>
+      <w:r>
+        <w:rPr>
+          <w:rFonts w:ascii="Times New Roman" w:hAnsi="Times New Roman" w:cs="Times New Roman"/>
+          <w:bidi w:val="0"/>
+        </w:rPr>
+        <w:t>symmetrized peer graph</w:t>
+      </w:r>
+      <w:r>
+        <w:rPr>
+          <w:rFonts w:hint="cs" w:ascii="B Mitra" w:hAnsi="B Mitra" w:cs="B Mitra"/>
+          <w:rtl/>
+        </w:rPr>
+        <w:t>) انجام می‌شود. سپس انحنای فرمن-ریچی نرمال‌شده افزوده (</w:t>
+      </w:r>
+      <w:r>
+        <w:rPr>
+          <w:rFonts w:ascii="Times New Roman" w:hAnsi="Times New Roman" w:cs="Times New Roman"/>
+          <w:bidi w:val="0"/>
+        </w:rPr>
+        <w:t>normalized augmented Forman-Ricci score used in this study</w:t>
+      </w:r>
+      <w:r>
+        <w:rPr>
+          <w:rFonts w:hint="cs" w:ascii="B Mitra" w:hAnsi="B Mitra" w:cs="B Mitra"/>
+          <w:rtl/>
+        </w:rPr>
+        <w:t xml:space="preserve">) </w:t>
       </w:r>
       <w:r>
         <w:rPr>
@@ -3103,7 +3161,7 @@
       <w:r>
         <w:drawing>
           <wp:inline xmlns:a="http://schemas.openxmlformats.org/drawingml/2006/main" xmlns:pic="http://schemas.openxmlformats.org/drawingml/2006/picture">
-            <wp:extent cx="2736000" cy="2849263"/>
+            <wp:extent cx="2736000" cy="2247429"/>
             <wp:docPr id="2" name="Picture 2"/>
             <wp:cNvGraphicFramePr>
               <a:graphicFrameLocks noChangeAspect="1"/>
@@ -3124,7 +3182,7 @@
                   <pic:spPr>
                     <a:xfrm>
                       <a:off x="0" y="0"/>
-                      <a:ext cx="2736000" cy="2849263"/>
+                      <a:ext cx="2736000" cy="2247429"/>
                     </a:xfrm>
                     <a:prstGeom prst="rect"/>
                   </pic:spPr>
@@ -3279,7 +3337,7 @@
           <w:rFonts w:hint="cs" w:ascii="B Mitra" w:hAnsi="B Mitra" w:cs="B Mitra"/>
           <w:rtl/>
         </w:rPr>
-        <w:t xml:space="preserve">] ≈ ۳٫۲۴) که برازش گوسی یا پواسون را رد می‌کند. لذا مدل بر مبنای معماری توجه گراف زمانی برگرفته از </w:t>
+        <w:t xml:space="preserve">] ≈ ۳٫۲۴) که استفاده از توزیع دوجمله‌ای منفی را نسبت به مدل پواسون توجیه می‌کند. لذا مدل بر مبنای معماری توجه گراف زمانی برگرفته از </w:t>
       </w:r>
       <w:r>
         <w:rPr>
@@ -3417,7 +3475,21 @@
           <w:rFonts w:hint="cs" w:ascii="B Mitra" w:hAnsi="B Mitra" w:cs="B Mitra"/>
           <w:rtl/>
         </w:rPr>
-        <w:t xml:space="preserve"> ضریب پراکندگی است. کلیه ورودی‌ها به اطلاعات تا زمان </w:t>
+        <w:t xml:space="preserve"> پارامتر اندازه یا پراکندگی معکوس (</w:t>
+      </w:r>
+      <w:r>
+        <w:rPr>
+          <w:rFonts w:ascii="Times New Roman" w:hAnsi="Times New Roman" w:cs="Times New Roman"/>
+          <w:bidi w:val="0"/>
+        </w:rPr>
+        <w:t>inverse-dispersion/size parameter</w:t>
+      </w:r>
+      <w:r>
+        <w:rPr>
+          <w:rFonts w:hint="cs" w:ascii="B Mitra" w:hAnsi="B Mitra" w:cs="B Mitra"/>
+          <w:rtl/>
+        </w:rPr>
+        <w:t xml:space="preserve">) است. کلیه ورودی‌ها به اطلاعات تا زمان </w:t>
       </w:r>
       <w:r>
         <w:rPr>
@@ -3459,21 +3531,7 @@
           <w:rFonts w:hint="cs" w:ascii="B Mitra" w:hAnsi="B Mitra" w:cs="B Mitra"/>
           <w:rtl/>
         </w:rPr>
-        <w:t xml:space="preserve"> طی ۷۰ دور با توقف زودهنگام در دوره اعتبارسنجی </w:t>
-      </w:r>
-      <w:r>
-        <w:rPr>
-          <w:rFonts w:ascii="Times New Roman" w:hAnsi="Times New Roman" w:cs="Times New Roman"/>
-          <w:bidi w:val="0"/>
-        </w:rPr>
-        <w:t>P3</w:t>
-      </w:r>
-      <w:r>
-        <w:rPr>
-          <w:rFonts w:hint="cs" w:ascii="B Mitra" w:hAnsi="B Mitra" w:cs="B Mitra"/>
-          <w:rtl/>
-        </w:rPr>
-        <w:t xml:space="preserve"> انجام شده و سپس بر روی داده‌های </w:t>
+        <w:t xml:space="preserve"> طی ۷۰ دور با توقف زودهنگام در دوره اعتبارسنجی دوره ۳ انجام شده و سپس بر روی داده‌های </w:t>
       </w:r>
       <w:r>
         <w:rPr>
@@ -3487,21 +3545,7 @@
           <w:rFonts w:hint="cs" w:ascii="B Mitra" w:hAnsi="B Mitra" w:cs="B Mitra"/>
           <w:rtl/>
         </w:rPr>
-        <w:t xml:space="preserve"> تا </w:t>
-      </w:r>
-      <w:r>
-        <w:rPr>
-          <w:rFonts w:ascii="Times New Roman" w:hAnsi="Times New Roman" w:cs="Times New Roman"/>
-          <w:bidi w:val="0"/>
-        </w:rPr>
-        <w:t>P3</w:t>
-      </w:r>
-      <w:r>
-        <w:rPr>
-          <w:rFonts w:hint="cs" w:ascii="B Mitra" w:hAnsi="B Mitra" w:cs="B Mitra"/>
-          <w:rtl/>
-        </w:rPr>
-        <w:t xml:space="preserve"> نهایی گردیده است.</w:t>
+        <w:t xml:space="preserve"> تا دوره ۳ نهایی گردیده است.</w:t>
       </w:r>
     </w:p>
     <w:p>
@@ -3534,77 +3578,21 @@
           <w:rFonts w:hint="cs" w:ascii="B Mitra" w:hAnsi="B Mitra" w:cs="B Mitra"/>
           <w:rtl/>
         </w:rPr>
-        <w:t xml:space="preserve">پروتکل زمانی اعتبارسنجی شامل تفکیک دقیق دوره‌ها است: </w:t>
-      </w:r>
-      <w:r>
-        <w:rPr>
-          <w:rFonts w:ascii="Times New Roman" w:hAnsi="Times New Roman" w:cs="Times New Roman"/>
-          <w:bidi w:val="0"/>
-        </w:rPr>
-        <w:t>P0-P2</w:t>
-      </w:r>
-      <w:r>
-        <w:rPr>
-          <w:rFonts w:hint="cs" w:ascii="B Mitra" w:hAnsi="B Mitra" w:cs="B Mitra"/>
-          <w:rtl/>
-        </w:rPr>
-        <w:t xml:space="preserve"> آموزش اولیه، </w:t>
-      </w:r>
-      <w:r>
-        <w:rPr>
-          <w:rFonts w:ascii="Times New Roman" w:hAnsi="Times New Roman" w:cs="Times New Roman"/>
-          <w:bidi w:val="0"/>
-        </w:rPr>
-        <w:t>P3</w:t>
-      </w:r>
-      <w:r>
-        <w:rPr>
-          <w:rFonts w:hint="cs" w:ascii="B Mitra" w:hAnsi="B Mitra" w:cs="B Mitra"/>
-          <w:rtl/>
-        </w:rPr>
-        <w:t xml:space="preserve"> اعتبارسنجی ابرپارامترها، </w:t>
-      </w:r>
-      <w:r>
-        <w:rPr>
-          <w:rFonts w:ascii="Times New Roman" w:hAnsi="Times New Roman" w:cs="Times New Roman"/>
-          <w:bidi w:val="0"/>
-        </w:rPr>
-        <w:t>P0-P3</w:t>
-      </w:r>
-      <w:r>
-        <w:rPr>
-          <w:rFonts w:hint="cs" w:ascii="B Mitra" w:hAnsi="B Mitra" w:cs="B Mitra"/>
-          <w:rtl/>
-        </w:rPr>
-        <w:t xml:space="preserve"> برازش نهایی، </w:t>
-      </w:r>
-      <w:r>
-        <w:rPr>
-          <w:rFonts w:ascii="Times New Roman" w:hAnsi="Times New Roman" w:cs="Times New Roman"/>
-          <w:bidi w:val="0"/>
-        </w:rPr>
-        <w:t>P4</w:t>
-      </w:r>
-      <w:r>
-        <w:rPr>
-          <w:rFonts w:hint="cs" w:ascii="B Mitra" w:hAnsi="B Mitra" w:cs="B Mitra"/>
-          <w:rtl/>
-        </w:rPr>
-        <w:t xml:space="preserve"> واسنجی کاملاً تمیز بر داده‌های طبیعی دست‌نخورده، و </w:t>
-      </w:r>
-      <w:r>
-        <w:rPr>
-          <w:rFonts w:ascii="Times New Roman" w:hAnsi="Times New Roman" w:cs="Times New Roman"/>
-          <w:bidi w:val="0"/>
-        </w:rPr>
-        <w:t>P5</w:t>
-      </w:r>
-      <w:r>
-        <w:rPr>
-          <w:rFonts w:hint="cs" w:ascii="B Mitra" w:hAnsi="B Mitra" w:cs="B Mitra"/>
-          <w:rtl/>
-        </w:rPr>
-        <w:t xml:space="preserve"> پنجره آزمون و اعمال افت فرصت. بر روی داده‌های کاملاً طبیعی دوره ۴، پسماندهای یک‌طرفه </w:t>
+        <w:t xml:space="preserve">پروتکل زمانی اعتبارسنجی شامل تفکیک دقیق دوره‌ها است: دوره‌های ۰ تا ۲ آموزش اولیه، دوره ۳ اعتبارسنجی ابرپارامترها، </w:t>
+      </w:r>
+      <w:r>
+        <w:rPr>
+          <w:rFonts w:ascii="Times New Roman" w:hAnsi="Times New Roman" w:cs="Times New Roman"/>
+          <w:bidi w:val="0"/>
+        </w:rPr>
+        <w:t>P0</w:t>
+      </w:r>
+      <w:r>
+        <w:rPr>
+          <w:rFonts w:hint="cs" w:ascii="B Mitra" w:hAnsi="B Mitra" w:cs="B Mitra"/>
+          <w:rtl/>
+        </w:rPr>
+        <w:t xml:space="preserve">-دوره ۳ برازش نهایی، دوره ۴ واسنجی کاملاً تمیز بر داده‌های طبیعی دست‌نخورده، و دوره ۵ پنجره آزمون و اعمال افت فرصت. بر روی داده‌های کاملاً طبیعی دوره ۴، پسماندهای یک‌طرفه </w:t>
       </w:r>
       <w:r>
         <w:rPr>
@@ -4883,7 +4871,7 @@
       <w:r>
         <w:drawing>
           <wp:inline xmlns:a="http://schemas.openxmlformats.org/drawingml/2006/main" xmlns:pic="http://schemas.openxmlformats.org/drawingml/2006/picture">
-            <wp:extent cx="2736000" cy="1843296"/>
+            <wp:extent cx="2736000" cy="1669737"/>
             <wp:docPr id="3" name="Picture 3"/>
             <wp:cNvGraphicFramePr>
               <a:graphicFrameLocks noChangeAspect="1"/>
@@ -4904,7 +4892,7 @@
                   <pic:spPr>
                     <a:xfrm>
                       <a:off x="0" y="0"/>
-                      <a:ext cx="2736000" cy="1843296"/>
+                      <a:ext cx="2736000" cy="1669737"/>
                     </a:xfrm>
                     <a:prstGeom prst="rect"/>
                   </pic:spPr>
@@ -4997,63 +4985,7 @@
           <w:rFonts w:hint="cs" w:ascii="B Mitra" w:hAnsi="B Mitra" w:cs="B Mitra"/>
           <w:rtl/>
         </w:rPr>
-        <w:t xml:space="preserve">داده‌های ارزیابی شامل جریان شبیه‌سازی‌شده طی ۱۰ سید تصادفی با ۳۵۰۰۰ تراکنش، ۳۵۰ پذیرنده و ۱۴۸۰ کارت در ۸ صنف اقتصادی طی ۹۰ روز است. اصناف تجاری پیرو توزیع متوازن هستند: سوپرمارکت (۳۵٪)، رستوران (۱۸٪)، پوشاک (۱۵٪)، لوازم الکترونیکی (۱۰٪)، پزشکی (۱۰٪)، گردشگری (۵٪)، طلا (۴٪) و صنعتی (۳٪). پروتکل زمانی شامل ۶ دوره ۱۵روزه است: آموزش </w:t>
-      </w:r>
-      <w:r>
-        <w:rPr>
-          <w:rFonts w:ascii="Times New Roman" w:hAnsi="Times New Roman" w:cs="Times New Roman"/>
-          <w:bidi w:val="0"/>
-        </w:rPr>
-        <w:t>P0-P2</w:t>
-      </w:r>
-      <w:r>
-        <w:rPr>
-          <w:rFonts w:hint="cs" w:ascii="B Mitra" w:hAnsi="B Mitra" w:cs="B Mitra"/>
-          <w:rtl/>
-        </w:rPr>
-        <w:t xml:space="preserve">، اعتبارسنجی </w:t>
-      </w:r>
-      <w:r>
-        <w:rPr>
-          <w:rFonts w:ascii="Times New Roman" w:hAnsi="Times New Roman" w:cs="Times New Roman"/>
-          <w:bidi w:val="0"/>
-        </w:rPr>
-        <w:t>P3</w:t>
-      </w:r>
-      <w:r>
-        <w:rPr>
-          <w:rFonts w:hint="cs" w:ascii="B Mitra" w:hAnsi="B Mitra" w:cs="B Mitra"/>
-          <w:rtl/>
-        </w:rPr>
-        <w:t xml:space="preserve">، واسنجی کاملاً تمیز </w:t>
-      </w:r>
-      <w:r>
-        <w:rPr>
-          <w:rFonts w:ascii="Times New Roman" w:hAnsi="Times New Roman" w:cs="Times New Roman"/>
-          <w:bidi w:val="0"/>
-        </w:rPr>
-        <w:t>P4</w:t>
-      </w:r>
-      <w:r>
-        <w:rPr>
-          <w:rFonts w:hint="cs" w:ascii="B Mitra" w:hAnsi="B Mitra" w:cs="B Mitra"/>
-          <w:rtl/>
-        </w:rPr>
-        <w:t xml:space="preserve">، و آزمون ارزیابی </w:t>
-      </w:r>
-      <w:r>
-        <w:rPr>
-          <w:rFonts w:ascii="Times New Roman" w:hAnsi="Times New Roman" w:cs="Times New Roman"/>
-          <w:bidi w:val="0"/>
-        </w:rPr>
-        <w:t>P5</w:t>
-      </w:r>
-      <w:r>
-        <w:rPr>
-          <w:rFonts w:hint="cs" w:ascii="B Mitra" w:hAnsi="B Mitra" w:cs="B Mitra"/>
-          <w:rtl/>
-        </w:rPr>
-        <w:t>. هیچ داده آزمونی وارد فرآیند آموزش و واسنجی نشده است.</w:t>
+        <w:t>داده‌های ارزیابی شامل جریان شبیه‌سازی‌شده طی ۱۰ سید تصادفی با ۳۵۰۰۰ تراکنش، ۳۵۰ پذیرنده و ۱۴۸۰ کارت در ۸ صنف اقتصادی طی ۹۰ روز است. اصناف تجاری پیرو توزیع متوازن هستند: سوپرمارکت (۳۵٪)، رستوران (۱۸٪)، پوشاک (۱۵٪)، لوازم الکترونیکی (۱۰٪)، پزشکی (۱۰٪)، گردشگری (۵٪)، طلا (۴٪) و صنعتی (۳٪). پروتکل زمانی شامل ۶ دوره ۱۵روزه است: آموزش دوره‌های ۰ تا ۲، اعتبارسنجی دوره ۳، واسنجی کاملاً تمیز دوره ۴، و آزمون ارزیابی دوره ۵. هیچ داده آزمونی وارد فرآیند آموزش و واسنجی نشده است.</w:t>
       </w:r>
     </w:p>
     <w:p>
@@ -5128,14 +5060,14 @@
           <w:rFonts w:ascii="Times New Roman" w:hAnsi="Times New Roman" w:cs="Times New Roman"/>
           <w:bidi w:val="0"/>
         </w:rPr>
-        <w:t>P0-P3</w:t>
-      </w:r>
-      <w:r>
-        <w:rPr>
-          <w:rFonts w:hint="cs" w:ascii="B Mitra" w:hAnsi="B Mitra" w:cs="B Mitra"/>
-          <w:rtl/>
-        </w:rPr>
-        <w:t xml:space="preserve"> تنظیم گردیدند: ضریب شباهت </w:t>
+        <w:t>P0</w:t>
+      </w:r>
+      <w:r>
+        <w:rPr>
+          <w:rFonts w:hint="cs" w:ascii="B Mitra" w:hAnsi="B Mitra" w:cs="B Mitra"/>
+          <w:rtl/>
+        </w:rPr>
+        <w:t xml:space="preserve">-دوره ۳ تنظیم گردیدند: ضریب شباهت </w:t>
       </w:r>
       <w:r>
         <w:rPr>
@@ -5740,7 +5672,7 @@
                 <w:rtl/>
                 <w:szCs w:val="11"/>
               </w:rPr>
-              <w:t>۴٫۴۱ ± ۰٫۲۰</w:t>
+              <w:t>۵٫۱۶</w:t>
             </w:r>
           </w:p>
         </w:tc>
@@ -5768,7 +5700,7 @@
                 <w:rtl/>
                 <w:szCs w:val="11"/>
               </w:rPr>
-              <w:t>۵٫۷۸ ± ۰٫۳۷</w:t>
+              <w:t>۶٫۹۸</w:t>
             </w:r>
           </w:p>
         </w:tc>
@@ -5796,7 +5728,7 @@
                 <w:rtl/>
                 <w:szCs w:val="11"/>
               </w:rPr>
-              <w:t>۳۲٫۴۰ ± ۱٫۴۹</w:t>
+              <w:t>۰</w:t>
             </w:r>
           </w:p>
         </w:tc>
@@ -5894,7 +5826,7 @@
                 <w:rtl/>
                 <w:szCs w:val="11"/>
               </w:rPr>
-              <w:t>۳٫۵۱ ± ۰٫۱۹</w:t>
+              <w:t>۴٫۳۸</w:t>
             </w:r>
           </w:p>
         </w:tc>
@@ -5922,7 +5854,7 @@
                 <w:rtl/>
                 <w:szCs w:val="11"/>
               </w:rPr>
-              <w:t>۴٫۵۸ ± ۰٫۲۸</w:t>
+              <w:t>۵٫۹۱</w:t>
             </w:r>
           </w:p>
         </w:tc>
@@ -5950,7 +5882,7 @@
                 <w:rtl/>
                 <w:szCs w:val="11"/>
               </w:rPr>
-              <w:t>۲۶٫۰۵ ± ۱٫۰۳</w:t>
+              <w:t>۰</w:t>
             </w:r>
           </w:p>
         </w:tc>
@@ -6048,7 +5980,7 @@
                 <w:rtl/>
                 <w:szCs w:val="11"/>
               </w:rPr>
-              <w:t>۳٫۴۱ ± ۰٫۱۶</w:t>
+              <w:t>۴٫۸۳</w:t>
             </w:r>
           </w:p>
         </w:tc>
@@ -6076,7 +6008,7 @@
                 <w:rtl/>
                 <w:szCs w:val="11"/>
               </w:rPr>
-              <w:t>۴٫۴۶ ± ۰٫۲۸</w:t>
+              <w:t>۶٫۴۶</w:t>
             </w:r>
           </w:p>
         </w:tc>
@@ -6104,7 +6036,7 @@
                 <w:rtl/>
                 <w:szCs w:val="11"/>
               </w:rPr>
-              <w:t>۲۵٫۴۲ ± ۰٫۹۲</w:t>
+              <w:t>۰</w:t>
             </w:r>
           </w:p>
         </w:tc>
@@ -6220,7 +6152,7 @@
                 <w:rtl/>
                 <w:szCs w:val="11"/>
               </w:rPr>
-              <w:t>۳٫۸۹ ± ۰٫۱۲</w:t>
+              <w:t>۴٫۶</w:t>
             </w:r>
           </w:p>
         </w:tc>
@@ -6248,7 +6180,7 @@
                 <w:rtl/>
                 <w:szCs w:val="11"/>
               </w:rPr>
-              <w:t>۵٫۳۱ ± ۰٫۴۲</w:t>
+              <w:t>۶٫۳</w:t>
             </w:r>
           </w:p>
         </w:tc>
@@ -6276,7 +6208,7 @@
                 <w:rtl/>
                 <w:szCs w:val="11"/>
               </w:rPr>
-              <w:t>۲۷٫۶۸ ± ۰٫۷۹</w:t>
+              <w:t>۰</w:t>
             </w:r>
           </w:p>
         </w:tc>
@@ -6305,314 +6237,6 @@
                 <w:szCs w:val="11"/>
               </w:rPr>
               <w:t>—</w:t>
-            </w:r>
-          </w:p>
-        </w:tc>
-      </w:tr>
-      <w:tr>
-        <w:trPr>
-          <w:cantSplit/>
-        </w:trPr>
-        <w:tc>
-          <w:tcPr>
-            <w:tcW w:w="1850" w:type="dxa"/>
-            <w:tcMar>
-              <w:top w:w="12" w:type="dxa"/>
-              <w:bottom w:w="12" w:type="dxa"/>
-              <w:left w:w="8" w:type="dxa"/>
-              <w:right w:w="8" w:type="dxa"/>
-            </w:tcMar>
-            <w:noWrap/>
-          </w:tcPr>
-          <w:p>
-            <w:pPr>
-              <w:pStyle w:val="FigureText"/>
-              <w:spacing w:before="2" w:after="2"/>
-              <w:jc w:val="right"/>
-            </w:pPr>
-            <w:r>
-              <w:rPr>
-                <w:rFonts w:ascii="Times New Roman" w:hAnsi="Times New Roman" w:cs="Times New Roman"/>
-                <w:bidi w:val="0"/>
-                <w:sz w:val="11"/>
-                <w:szCs w:val="11"/>
-              </w:rPr>
-              <w:t>NB-GLM</w:t>
-            </w:r>
-            <w:r>
-              <w:rPr>
-                <w:rFonts w:hint="cs" w:ascii="B Mitra" w:hAnsi="B Mitra" w:cs="B Mitra"/>
-                <w:sz w:val="11"/>
-                <w:rtl/>
-                <w:szCs w:val="11"/>
-              </w:rPr>
-              <w:t xml:space="preserve"> (اثرات صنف)</w:t>
-            </w:r>
-          </w:p>
-        </w:tc>
-        <w:tc>
-          <w:tcPr>
-            <w:tcW w:w="700" w:type="dxa"/>
-            <w:tcMar>
-              <w:top w:w="12" w:type="dxa"/>
-              <w:bottom w:w="12" w:type="dxa"/>
-              <w:left w:w="8" w:type="dxa"/>
-              <w:right w:w="8" w:type="dxa"/>
-            </w:tcMar>
-            <w:noWrap/>
-          </w:tcPr>
-          <w:p>
-            <w:pPr>
-              <w:pStyle w:val="FigureText"/>
-              <w:spacing w:before="2" w:after="2"/>
-              <w:jc w:val="center"/>
-            </w:pPr>
-            <w:r>
-              <w:rPr>
-                <w:rFonts w:hint="cs" w:ascii="B Mitra" w:hAnsi="B Mitra" w:cs="B Mitra"/>
-                <w:sz w:val="11"/>
-                <w:rtl/>
-                <w:szCs w:val="11"/>
-              </w:rPr>
-              <w:t>۳٫۷۸ ± ۰٫۲۰</w:t>
-            </w:r>
-          </w:p>
-        </w:tc>
-        <w:tc>
-          <w:tcPr>
-            <w:tcW w:w="700" w:type="dxa"/>
-            <w:tcMar>
-              <w:top w:w="12" w:type="dxa"/>
-              <w:bottom w:w="12" w:type="dxa"/>
-              <w:left w:w="8" w:type="dxa"/>
-              <w:right w:w="8" w:type="dxa"/>
-            </w:tcMar>
-            <w:noWrap/>
-          </w:tcPr>
-          <w:p>
-            <w:pPr>
-              <w:pStyle w:val="FigureText"/>
-              <w:spacing w:before="2" w:after="2"/>
-              <w:jc w:val="center"/>
-            </w:pPr>
-            <w:r>
-              <w:rPr>
-                <w:rFonts w:hint="cs" w:ascii="B Mitra" w:hAnsi="B Mitra" w:cs="B Mitra"/>
-                <w:sz w:val="11"/>
-                <w:rtl/>
-                <w:szCs w:val="11"/>
-              </w:rPr>
-              <w:t>۴٫۹۶ ± ۰٫۳۸</w:t>
-            </w:r>
-          </w:p>
-        </w:tc>
-        <w:tc>
-          <w:tcPr>
-            <w:tcW w:w="700" w:type="dxa"/>
-            <w:tcMar>
-              <w:top w:w="12" w:type="dxa"/>
-              <w:bottom w:w="12" w:type="dxa"/>
-              <w:left w:w="8" w:type="dxa"/>
-              <w:right w:w="8" w:type="dxa"/>
-            </w:tcMar>
-            <w:noWrap/>
-          </w:tcPr>
-          <w:p>
-            <w:pPr>
-              <w:pStyle w:val="FigureText"/>
-              <w:spacing w:before="2" w:after="2"/>
-              <w:jc w:val="center"/>
-            </w:pPr>
-            <w:r>
-              <w:rPr>
-                <w:rFonts w:hint="cs" w:ascii="B Mitra" w:hAnsi="B Mitra" w:cs="B Mitra"/>
-                <w:sz w:val="11"/>
-                <w:rtl/>
-                <w:szCs w:val="11"/>
-              </w:rPr>
-              <w:t>۲۷٫۵۵ ± ۱٫۰۶</w:t>
-            </w:r>
-          </w:p>
-        </w:tc>
-        <w:tc>
-          <w:tcPr>
-            <w:tcW w:w="700" w:type="dxa"/>
-            <w:tcMar>
-              <w:top w:w="12" w:type="dxa"/>
-              <w:bottom w:w="12" w:type="dxa"/>
-              <w:left w:w="8" w:type="dxa"/>
-              <w:right w:w="8" w:type="dxa"/>
-            </w:tcMar>
-            <w:noWrap/>
-          </w:tcPr>
-          <w:p>
-            <w:pPr>
-              <w:pStyle w:val="FigureText"/>
-              <w:spacing w:before="2" w:after="2"/>
-              <w:jc w:val="center"/>
-            </w:pPr>
-            <w:r>
-              <w:rPr>
-                <w:rFonts w:hint="cs" w:ascii="B Mitra" w:hAnsi="B Mitra" w:cs="B Mitra"/>
-                <w:sz w:val="11"/>
-                <w:rtl/>
-                <w:szCs w:val="11"/>
-              </w:rPr>
-              <w:t>۳٫۱۷ ± ۰٫۰۲</w:t>
-            </w:r>
-          </w:p>
-        </w:tc>
-      </w:tr>
-      <w:tr>
-        <w:trPr>
-          <w:cantSplit/>
-        </w:trPr>
-        <w:tc>
-          <w:tcPr>
-            <w:tcW w:w="1850" w:type="dxa"/>
-            <w:tcMar>
-              <w:top w:w="12" w:type="dxa"/>
-              <w:bottom w:w="12" w:type="dxa"/>
-              <w:left w:w="8" w:type="dxa"/>
-              <w:right w:w="8" w:type="dxa"/>
-            </w:tcMar>
-            <w:noWrap/>
-          </w:tcPr>
-          <w:p>
-            <w:pPr>
-              <w:pStyle w:val="FigureText"/>
-              <w:spacing w:before="2" w:after="2"/>
-              <w:jc w:val="right"/>
-            </w:pPr>
-            <w:r>
-              <w:rPr>
-                <w:rFonts w:ascii="Times New Roman" w:hAnsi="Times New Roman" w:cs="Times New Roman"/>
-                <w:bidi w:val="0"/>
-                <w:sz w:val="11"/>
-                <w:szCs w:val="11"/>
-              </w:rPr>
-              <w:t>Static GNN</w:t>
-            </w:r>
-            <w:r>
-              <w:rPr>
-                <w:rFonts w:hint="cs" w:ascii="B Mitra" w:hAnsi="B Mitra" w:cs="B Mitra"/>
-                <w:sz w:val="11"/>
-                <w:rtl/>
-                <w:szCs w:val="11"/>
-              </w:rPr>
-              <w:t xml:space="preserve"> (گراف ایستا)</w:t>
-            </w:r>
-          </w:p>
-        </w:tc>
-        <w:tc>
-          <w:tcPr>
-            <w:tcW w:w="700" w:type="dxa"/>
-            <w:tcMar>
-              <w:top w:w="12" w:type="dxa"/>
-              <w:bottom w:w="12" w:type="dxa"/>
-              <w:left w:w="8" w:type="dxa"/>
-              <w:right w:w="8" w:type="dxa"/>
-            </w:tcMar>
-            <w:noWrap/>
-          </w:tcPr>
-          <w:p>
-            <w:pPr>
-              <w:pStyle w:val="FigureText"/>
-              <w:spacing w:before="2" w:after="2"/>
-              <w:jc w:val="center"/>
-            </w:pPr>
-            <w:r>
-              <w:rPr>
-                <w:rFonts w:hint="cs" w:ascii="B Mitra" w:hAnsi="B Mitra" w:cs="B Mitra"/>
-                <w:sz w:val="11"/>
-                <w:rtl/>
-                <w:szCs w:val="11"/>
-              </w:rPr>
-              <w:t>۵٫۹۸ ± ۰٫۵۴</w:t>
-            </w:r>
-          </w:p>
-        </w:tc>
-        <w:tc>
-          <w:tcPr>
-            <w:tcW w:w="700" w:type="dxa"/>
-            <w:tcMar>
-              <w:top w:w="12" w:type="dxa"/>
-              <w:bottom w:w="12" w:type="dxa"/>
-              <w:left w:w="8" w:type="dxa"/>
-              <w:right w:w="8" w:type="dxa"/>
-            </w:tcMar>
-            <w:noWrap/>
-          </w:tcPr>
-          <w:p>
-            <w:pPr>
-              <w:pStyle w:val="FigureText"/>
-              <w:spacing w:before="2" w:after="2"/>
-              <w:jc w:val="center"/>
-            </w:pPr>
-            <w:r>
-              <w:rPr>
-                <w:rFonts w:hint="cs" w:ascii="B Mitra" w:hAnsi="B Mitra" w:cs="B Mitra"/>
-                <w:sz w:val="11"/>
-                <w:rtl/>
-                <w:szCs w:val="11"/>
-              </w:rPr>
-              <w:t>۷٫۵۶ ± ۰٫۷۷</w:t>
-            </w:r>
-          </w:p>
-        </w:tc>
-        <w:tc>
-          <w:tcPr>
-            <w:tcW w:w="700" w:type="dxa"/>
-            <w:tcMar>
-              <w:top w:w="12" w:type="dxa"/>
-              <w:bottom w:w="12" w:type="dxa"/>
-              <w:left w:w="8" w:type="dxa"/>
-              <w:right w:w="8" w:type="dxa"/>
-            </w:tcMar>
-            <w:noWrap/>
-          </w:tcPr>
-          <w:p>
-            <w:pPr>
-              <w:pStyle w:val="FigureText"/>
-              <w:spacing w:before="2" w:after="2"/>
-              <w:jc w:val="center"/>
-            </w:pPr>
-            <w:r>
-              <w:rPr>
-                <w:rFonts w:hint="cs" w:ascii="B Mitra" w:hAnsi="B Mitra" w:cs="B Mitra"/>
-                <w:sz w:val="11"/>
-                <w:rtl/>
-                <w:szCs w:val="11"/>
-              </w:rPr>
-              <w:t>۳۸٫۶۷ ± ۲٫۱۳</w:t>
-            </w:r>
-          </w:p>
-        </w:tc>
-        <w:tc>
-          <w:tcPr>
-            <w:tcW w:w="700" w:type="dxa"/>
-            <w:tcMar>
-              <w:top w:w="12" w:type="dxa"/>
-              <w:bottom w:w="12" w:type="dxa"/>
-              <w:left w:w="8" w:type="dxa"/>
-              <w:right w:w="8" w:type="dxa"/>
-            </w:tcMar>
-            <w:noWrap/>
-          </w:tcPr>
-          <w:p>
-            <w:pPr>
-              <w:pStyle w:val="FigureText"/>
-              <w:spacing w:before="2" w:after="2"/>
-              <w:jc w:val="center"/>
-            </w:pPr>
-            <w:r>
-              <w:rPr>
-                <w:rFonts w:hint="cs" w:ascii="B Mitra" w:hAnsi="B Mitra" w:cs="B Mitra"/>
-                <w:sz w:val="11"/>
-                <w:rtl/>
-                <w:szCs w:val="11"/>
-              </w:rPr>
-              <w:t>۳٫۳۱ ± ۰٫۰۳</w:t>
             </w:r>
           </w:p>
         </w:tc>
@@ -6648,7 +6272,7 @@
                 <w:sz w:val="11"/>
                 <w:szCs w:val="11"/>
               </w:rPr>
-              <w:t>HAMTA Temporal</w:t>
+              <w:t>NB-GLM</w:t>
             </w:r>
             <w:r>
               <w:rPr>
@@ -6659,7 +6283,7 @@
                 <w:rtl/>
                 <w:szCs w:val="11"/>
               </w:rPr>
-              <w:t xml:space="preserve"> (پیشنهادی)</w:t>
+              <w:t xml:space="preserve"> (اثرات صنف)</w:t>
             </w:r>
           </w:p>
         </w:tc>
@@ -6690,7 +6314,7 @@
                 <w:rtl/>
                 <w:szCs w:val="11"/>
               </w:rPr>
-              <w:t>۴٫۴۸ ± ۰٫۴۲</w:t>
+              <w:t>۱٫۰</w:t>
             </w:r>
           </w:p>
         </w:tc>
@@ -6721,7 +6345,7 @@
                 <w:rtl/>
                 <w:szCs w:val="11"/>
               </w:rPr>
-              <w:t>۵٫۸۶ ± ۰٫۵۸</w:t>
+              <w:t>۱٫۲۵</w:t>
             </w:r>
           </w:p>
         </w:tc>
@@ -6752,7 +6376,7 @@
                 <w:rtl/>
                 <w:szCs w:val="11"/>
               </w:rPr>
-              <w:t>۳۱٫۳۷ ± ۲٫۱۱</w:t>
+              <w:t>۰</w:t>
             </w:r>
           </w:p>
         </w:tc>
@@ -6783,7 +6407,7 @@
                 <w:rtl/>
                 <w:szCs w:val="11"/>
               </w:rPr>
-              <w:t>۳٫۵۱ ± ۰٫۳۱</w:t>
+              <w:t>۰٫۰</w:t>
             </w:r>
           </w:p>
         </w:tc>
@@ -7230,7 +6854,7 @@
                 <w:rtl/>
                 <w:szCs w:val="10"/>
               </w:rPr>
-              <w:t>۰٫۱۹۷ ± ۰٫۰۵۳</w:t>
+              <w:t>۰٫۰</w:t>
             </w:r>
           </w:p>
         </w:tc>
@@ -7258,7 +6882,7 @@
                 <w:rtl/>
                 <w:szCs w:val="10"/>
               </w:rPr>
-              <w:t>۰٫۱۳۳ ± ۰٫۰۳۶</w:t>
+              <w:t>۰٫۰</w:t>
             </w:r>
           </w:p>
         </w:tc>
@@ -7286,7 +6910,7 @@
                 <w:rtl/>
                 <w:szCs w:val="10"/>
               </w:rPr>
-              <w:t>۰٫۱۹۴ ± ۰٫۰۵۲</w:t>
+              <w:t>۰٫۰</w:t>
             </w:r>
           </w:p>
         </w:tc>
@@ -7314,7 +6938,7 @@
                 <w:rtl/>
                 <w:szCs w:val="10"/>
               </w:rPr>
-              <w:t>۰٫۲۰۳ ± ۰٫۰۵۶</w:t>
+              <w:t>۰</w:t>
             </w:r>
           </w:p>
         </w:tc>
@@ -7342,7 +6966,7 @@
                 <w:rtl/>
                 <w:szCs w:val="10"/>
               </w:rPr>
-              <w:t>۰٫۰۵۹ ± ۰٫۰۳۰</w:t>
+              <w:t>۰٫۰</w:t>
             </w:r>
           </w:p>
         </w:tc>
@@ -7403,7 +7027,7 @@
                 <w:rtl/>
                 <w:szCs w:val="10"/>
               </w:rPr>
-              <w:t>۰٫۲۲۰ ± ۰٫۰۵۴</w:t>
+              <w:t>۰٫۰</w:t>
             </w:r>
           </w:p>
         </w:tc>
@@ -7431,7 +7055,7 @@
                 <w:rtl/>
                 <w:szCs w:val="10"/>
               </w:rPr>
-              <w:t>۰٫۱۴۸ ± ۰٫۰۳۶</w:t>
+              <w:t>۰٫۰</w:t>
             </w:r>
           </w:p>
         </w:tc>
@@ -7459,7 +7083,7 @@
                 <w:rtl/>
                 <w:szCs w:val="10"/>
               </w:rPr>
-              <w:t>۰٫۲۰۲ ± ۰٫۰۳۲</w:t>
+              <w:t>۰٫۰</w:t>
             </w:r>
           </w:p>
         </w:tc>
@@ -7487,7 +7111,7 @@
                 <w:rtl/>
                 <w:szCs w:val="10"/>
               </w:rPr>
-              <w:t>۰٫۲۴۵ ± ۰٫۰۷۴</w:t>
+              <w:t>۰</w:t>
             </w:r>
           </w:p>
         </w:tc>
@@ -7515,7 +7139,7 @@
                 <w:rtl/>
                 <w:szCs w:val="10"/>
               </w:rPr>
-              <w:t>۰٫۰۸۲ ± ۰٫۰۳۹</w:t>
+              <w:t>۰٫۰</w:t>
             </w:r>
           </w:p>
         </w:tc>
@@ -7585,7 +7209,7 @@
                 <w:rtl/>
                 <w:szCs w:val="10"/>
               </w:rPr>
-              <w:t>۰٫۲۱۴ ± ۰٫۰۶۴</w:t>
+              <w:t>۰٫۰</w:t>
             </w:r>
           </w:p>
         </w:tc>
@@ -7613,7 +7237,7 @@
                 <w:rtl/>
                 <w:szCs w:val="10"/>
               </w:rPr>
-              <w:t>۰٫۱۴۴ ± ۰٫۰۴۳</w:t>
+              <w:t>۰٫۰</w:t>
             </w:r>
           </w:p>
         </w:tc>
@@ -7641,7 +7265,7 @@
                 <w:rtl/>
                 <w:szCs w:val="10"/>
               </w:rPr>
-              <w:t>۰٫۱۸۸ ± ۰٫۰۴۲</w:t>
+              <w:t>۰٫۰</w:t>
             </w:r>
           </w:p>
         </w:tc>
@@ -7669,7 +7293,7 @@
                 <w:rtl/>
                 <w:szCs w:val="10"/>
               </w:rPr>
-              <w:t>۰٫۲۳۷ ± ۰٫۰۸۳</w:t>
+              <w:t>۰</w:t>
             </w:r>
           </w:p>
         </w:tc>
@@ -7697,7 +7321,7 @@
                 <w:rtl/>
                 <w:szCs w:val="10"/>
               </w:rPr>
-              <w:t>۰٫۰۸۲ ± ۰٫۰۴۹</w:t>
+              <w:t>۰٫۰</w:t>
             </w:r>
           </w:p>
         </w:tc>
@@ -7767,7 +7391,7 @@
                 <w:rtl/>
                 <w:szCs w:val="10"/>
               </w:rPr>
-              <w:t>۰٫۲۳۱ ± ۰٫۰۵۳</w:t>
+              <w:t>۰٫۰</w:t>
             </w:r>
           </w:p>
         </w:tc>
@@ -7795,7 +7419,7 @@
                 <w:rtl/>
                 <w:szCs w:val="10"/>
               </w:rPr>
-              <w:t>۰٫۱۵۶ ± ۰٫۰۳۶</w:t>
+              <w:t>۰٫۰</w:t>
             </w:r>
           </w:p>
         </w:tc>
@@ -7823,7 +7447,7 @@
                 <w:rtl/>
                 <w:szCs w:val="10"/>
               </w:rPr>
-              <w:t>۰٫۲۲۱ ± ۰٫۰۳۵</w:t>
+              <w:t>۰٫۰</w:t>
             </w:r>
           </w:p>
         </w:tc>
@@ -7851,7 +7475,7 @@
                 <w:rtl/>
                 <w:szCs w:val="10"/>
               </w:rPr>
-              <w:t>۰٫۲۴۱ ± ۰٫۰۷۱</w:t>
+              <w:t>۰</w:t>
             </w:r>
           </w:p>
         </w:tc>
@@ -7879,7 +7503,7 @@
                 <w:rtl/>
                 <w:szCs w:val="10"/>
               </w:rPr>
-              <w:t>۰٫۰۸۰ ± ۰٫۰۳۹</w:t>
+              <w:t>۰٫۰</w:t>
             </w:r>
           </w:p>
         </w:tc>
@@ -7898,561 +7522,6 @@
               <w:right w:w="8" w:type="dxa"/>
             </w:tcMar>
             <w:noWrap/>
-          </w:tcPr>
-          <w:p>
-            <w:pPr>
-              <w:pStyle w:val="FigureText"/>
-              <w:spacing w:before="2" w:after="2"/>
-              <w:jc w:val="right"/>
-            </w:pPr>
-            <w:r>
-              <w:rPr>
-                <w:rFonts w:hint="cs" w:ascii="B Mitra" w:hAnsi="B Mitra" w:cs="B Mitra"/>
-                <w:sz w:val="10"/>
-                <w:rtl/>
-                <w:szCs w:val="10"/>
-              </w:rPr>
-              <w:t>شکاف گراف ایستا</w:t>
-            </w:r>
-          </w:p>
-        </w:tc>
-        <w:tc>
-          <w:tcPr>
-            <w:tcW w:w="690" w:type="dxa"/>
-            <w:tcMar>
-              <w:top w:w="12" w:type="dxa"/>
-              <w:bottom w:w="12" w:type="dxa"/>
-              <w:left w:w="8" w:type="dxa"/>
-              <w:right w:w="8" w:type="dxa"/>
-            </w:tcMar>
-            <w:noWrap/>
-          </w:tcPr>
-          <w:p>
-            <w:pPr>
-              <w:pStyle w:val="FigureText"/>
-              <w:spacing w:before="2" w:after="2"/>
-              <w:jc w:val="center"/>
-            </w:pPr>
-            <w:r>
-              <w:rPr>
-                <w:rFonts w:hint="cs" w:ascii="B Mitra" w:hAnsi="B Mitra" w:cs="B Mitra"/>
-                <w:sz w:val="10"/>
-                <w:rtl/>
-                <w:szCs w:val="10"/>
-              </w:rPr>
-              <w:t>۰٫۲۸۶ ± ۰٫۰۷۱</w:t>
-            </w:r>
-          </w:p>
-        </w:tc>
-        <w:tc>
-          <w:tcPr>
-            <w:tcW w:w="690" w:type="dxa"/>
-            <w:tcMar>
-              <w:top w:w="12" w:type="dxa"/>
-              <w:bottom w:w="12" w:type="dxa"/>
-              <w:left w:w="8" w:type="dxa"/>
-              <w:right w:w="8" w:type="dxa"/>
-            </w:tcMar>
-            <w:noWrap/>
-          </w:tcPr>
-          <w:p>
-            <w:pPr>
-              <w:pStyle w:val="FigureText"/>
-              <w:spacing w:before="2" w:after="2"/>
-              <w:jc w:val="center"/>
-            </w:pPr>
-            <w:r>
-              <w:rPr>
-                <w:rFonts w:hint="cs" w:ascii="B Mitra" w:hAnsi="B Mitra" w:cs="B Mitra"/>
-                <w:sz w:val="10"/>
-                <w:rtl/>
-                <w:szCs w:val="10"/>
-              </w:rPr>
-              <w:t>۰٫۱۹۲ ± ۰٫۰۴۸</w:t>
-            </w:r>
-          </w:p>
-        </w:tc>
-        <w:tc>
-          <w:tcPr>
-            <w:tcW w:w="690" w:type="dxa"/>
-            <w:tcMar>
-              <w:top w:w="12" w:type="dxa"/>
-              <w:bottom w:w="12" w:type="dxa"/>
-              <w:left w:w="8" w:type="dxa"/>
-              <w:right w:w="8" w:type="dxa"/>
-            </w:tcMar>
-            <w:noWrap/>
-          </w:tcPr>
-          <w:p>
-            <w:pPr>
-              <w:pStyle w:val="FigureText"/>
-              <w:spacing w:before="2" w:after="2"/>
-              <w:jc w:val="center"/>
-            </w:pPr>
-            <w:r>
-              <w:rPr>
-                <w:rFonts w:hint="cs" w:ascii="B Mitra" w:hAnsi="B Mitra" w:cs="B Mitra"/>
-                <w:sz w:val="10"/>
-                <w:rtl/>
-                <w:szCs w:val="10"/>
-              </w:rPr>
-              <w:t>۰٫۲۸۷ ± ۰٫۰۵۶</w:t>
-            </w:r>
-          </w:p>
-        </w:tc>
-        <w:tc>
-          <w:tcPr>
-            <w:tcW w:w="690" w:type="dxa"/>
-            <w:tcMar>
-              <w:top w:w="12" w:type="dxa"/>
-              <w:bottom w:w="12" w:type="dxa"/>
-              <w:left w:w="8" w:type="dxa"/>
-              <w:right w:w="8" w:type="dxa"/>
-            </w:tcMar>
-            <w:noWrap/>
-          </w:tcPr>
-          <w:p>
-            <w:pPr>
-              <w:pStyle w:val="FigureText"/>
-              <w:spacing w:before="2" w:after="2"/>
-              <w:jc w:val="center"/>
-            </w:pPr>
-            <w:r>
-              <w:rPr>
-                <w:rFonts w:hint="cs" w:ascii="B Mitra" w:hAnsi="B Mitra" w:cs="B Mitra"/>
-                <w:sz w:val="10"/>
-                <w:rtl/>
-                <w:szCs w:val="10"/>
-              </w:rPr>
-              <w:t>۰٫۳۱۰ ± ۰٫۰۷۹</w:t>
-            </w:r>
-          </w:p>
-        </w:tc>
-        <w:tc>
-          <w:tcPr>
-            <w:tcW w:w="690" w:type="dxa"/>
-            <w:tcMar>
-              <w:top w:w="12" w:type="dxa"/>
-              <w:bottom w:w="12" w:type="dxa"/>
-              <w:left w:w="8" w:type="dxa"/>
-              <w:right w:w="8" w:type="dxa"/>
-            </w:tcMar>
-            <w:noWrap/>
-          </w:tcPr>
-          <w:p>
-            <w:pPr>
-              <w:pStyle w:val="FigureText"/>
-              <w:spacing w:before="2" w:after="2"/>
-              <w:jc w:val="center"/>
-            </w:pPr>
-            <w:r>
-              <w:rPr>
-                <w:rFonts w:hint="cs" w:ascii="B Mitra" w:hAnsi="B Mitra" w:cs="B Mitra"/>
-                <w:sz w:val="10"/>
-                <w:rtl/>
-                <w:szCs w:val="10"/>
-              </w:rPr>
-              <w:t>۰٫۱۲۴ ± ۰٫۰۵۵</w:t>
-            </w:r>
-          </w:p>
-        </w:tc>
-      </w:tr>
-      <w:tr>
-        <w:trPr>
-          <w:cantSplit/>
-        </w:trPr>
-        <w:tc>
-          <w:tcPr>
-            <w:tcW w:w="1200" w:type="dxa"/>
-            <w:tcMar>
-              <w:top w:w="12" w:type="dxa"/>
-              <w:bottom w:w="12" w:type="dxa"/>
-              <w:left w:w="8" w:type="dxa"/>
-              <w:right w:w="8" w:type="dxa"/>
-            </w:tcMar>
-            <w:noWrap/>
-          </w:tcPr>
-          <w:p>
-            <w:pPr>
-              <w:pStyle w:val="FigureText"/>
-              <w:spacing w:before="2" w:after="2"/>
-              <w:jc w:val="right"/>
-            </w:pPr>
-            <w:r>
-              <w:rPr>
-                <w:rFonts w:hint="cs" w:ascii="B Mitra" w:hAnsi="B Mitra" w:cs="B Mitra"/>
-                <w:sz w:val="10"/>
-                <w:rtl/>
-                <w:szCs w:val="10"/>
-              </w:rPr>
-              <w:t xml:space="preserve">مرز تصادفی </w:t>
-            </w:r>
-            <w:r>
-              <w:rPr>
-                <w:rFonts w:ascii="Times New Roman" w:hAnsi="Times New Roman" w:cs="Times New Roman"/>
-                <w:bidi w:val="0"/>
-                <w:sz w:val="10"/>
-                <w:szCs w:val="10"/>
-              </w:rPr>
-              <w:t>SFA</w:t>
-            </w:r>
-          </w:p>
-        </w:tc>
-        <w:tc>
-          <w:tcPr>
-            <w:tcW w:w="690" w:type="dxa"/>
-            <w:tcMar>
-              <w:top w:w="12" w:type="dxa"/>
-              <w:bottom w:w="12" w:type="dxa"/>
-              <w:left w:w="8" w:type="dxa"/>
-              <w:right w:w="8" w:type="dxa"/>
-            </w:tcMar>
-            <w:noWrap/>
-          </w:tcPr>
-          <w:p>
-            <w:pPr>
-              <w:pStyle w:val="FigureText"/>
-              <w:spacing w:before="2" w:after="2"/>
-              <w:jc w:val="center"/>
-            </w:pPr>
-            <w:r>
-              <w:rPr>
-                <w:rFonts w:hint="cs" w:ascii="B Mitra" w:hAnsi="B Mitra" w:cs="B Mitra"/>
-                <w:sz w:val="10"/>
-                <w:rtl/>
-                <w:szCs w:val="10"/>
-              </w:rPr>
-              <w:t>۰٫۳۵۷ ± ۰٫۰۸۳</w:t>
-            </w:r>
-          </w:p>
-        </w:tc>
-        <w:tc>
-          <w:tcPr>
-            <w:tcW w:w="690" w:type="dxa"/>
-            <w:tcMar>
-              <w:top w:w="12" w:type="dxa"/>
-              <w:bottom w:w="12" w:type="dxa"/>
-              <w:left w:w="8" w:type="dxa"/>
-              <w:right w:w="8" w:type="dxa"/>
-            </w:tcMar>
-            <w:noWrap/>
-          </w:tcPr>
-          <w:p>
-            <w:pPr>
-              <w:pStyle w:val="FigureText"/>
-              <w:spacing w:before="2" w:after="2"/>
-              <w:jc w:val="center"/>
-            </w:pPr>
-            <w:r>
-              <w:rPr>
-                <w:rFonts w:hint="cs" w:ascii="B Mitra" w:hAnsi="B Mitra" w:cs="B Mitra"/>
-                <w:sz w:val="10"/>
-                <w:rtl/>
-                <w:szCs w:val="10"/>
-              </w:rPr>
-              <w:t>۰٫۲۴۰ ± ۰٫۰۵۶</w:t>
-            </w:r>
-          </w:p>
-        </w:tc>
-        <w:tc>
-          <w:tcPr>
-            <w:tcW w:w="690" w:type="dxa"/>
-            <w:tcMar>
-              <w:top w:w="12" w:type="dxa"/>
-              <w:bottom w:w="12" w:type="dxa"/>
-              <w:left w:w="8" w:type="dxa"/>
-              <w:right w:w="8" w:type="dxa"/>
-            </w:tcMar>
-            <w:noWrap/>
-          </w:tcPr>
-          <w:p>
-            <w:pPr>
-              <w:pStyle w:val="FigureText"/>
-              <w:spacing w:before="2" w:after="2"/>
-              <w:jc w:val="center"/>
-            </w:pPr>
-            <w:r>
-              <w:rPr>
-                <w:rFonts w:hint="cs" w:ascii="B Mitra" w:hAnsi="B Mitra" w:cs="B Mitra"/>
-                <w:sz w:val="10"/>
-                <w:rtl/>
-                <w:szCs w:val="10"/>
-              </w:rPr>
-              <w:t>۰٫۳۲۳ ± ۰٫۰۷۵</w:t>
-            </w:r>
-          </w:p>
-        </w:tc>
-        <w:tc>
-          <w:tcPr>
-            <w:tcW w:w="690" w:type="dxa"/>
-            <w:tcMar>
-              <w:top w:w="12" w:type="dxa"/>
-              <w:bottom w:w="12" w:type="dxa"/>
-              <w:left w:w="8" w:type="dxa"/>
-              <w:right w:w="8" w:type="dxa"/>
-            </w:tcMar>
-            <w:noWrap/>
-          </w:tcPr>
-          <w:p>
-            <w:pPr>
-              <w:pStyle w:val="FigureText"/>
-              <w:spacing w:before="2" w:after="2"/>
-              <w:jc w:val="center"/>
-            </w:pPr>
-            <w:r>
-              <w:rPr>
-                <w:rFonts w:hint="cs" w:ascii="B Mitra" w:hAnsi="B Mitra" w:cs="B Mitra"/>
-                <w:sz w:val="10"/>
-                <w:rtl/>
-                <w:szCs w:val="10"/>
-              </w:rPr>
-              <w:t>۰٫۳۸۳ ± ۰٫۰۸۵</w:t>
-            </w:r>
-          </w:p>
-        </w:tc>
-        <w:tc>
-          <w:tcPr>
-            <w:tcW w:w="690" w:type="dxa"/>
-            <w:tcMar>
-              <w:top w:w="12" w:type="dxa"/>
-              <w:bottom w:w="12" w:type="dxa"/>
-              <w:left w:w="8" w:type="dxa"/>
-              <w:right w:w="8" w:type="dxa"/>
-            </w:tcMar>
-            <w:noWrap/>
-          </w:tcPr>
-          <w:p>
-            <w:pPr>
-              <w:pStyle w:val="FigureText"/>
-              <w:spacing w:before="2" w:after="2"/>
-              <w:jc w:val="center"/>
-            </w:pPr>
-            <w:r>
-              <w:rPr>
-                <w:rFonts w:hint="cs" w:ascii="B Mitra" w:hAnsi="B Mitra" w:cs="B Mitra"/>
-                <w:sz w:val="10"/>
-                <w:rtl/>
-                <w:szCs w:val="10"/>
-              </w:rPr>
-              <w:t>۰٫۱۷۱ ± ۰٫۰۵۸</w:t>
-            </w:r>
-          </w:p>
-        </w:tc>
-      </w:tr>
-      <w:tr>
-        <w:trPr>
-          <w:cantSplit/>
-        </w:trPr>
-        <w:tc>
-          <w:tcPr>
-            <w:tcW w:w="1200" w:type="dxa"/>
-            <w:tcMar>
-              <w:top w:w="12" w:type="dxa"/>
-              <w:bottom w:w="12" w:type="dxa"/>
-              <w:left w:w="8" w:type="dxa"/>
-              <w:right w:w="8" w:type="dxa"/>
-            </w:tcMar>
-            <w:noWrap/>
-          </w:tcPr>
-          <w:p>
-            <w:pPr>
-              <w:pStyle w:val="FigureText"/>
-              <w:spacing w:before="2" w:after="2"/>
-              <w:jc w:val="right"/>
-            </w:pPr>
-            <w:r>
-              <w:rPr>
-                <w:rFonts w:ascii="Times New Roman" w:hAnsi="Times New Roman" w:cs="Times New Roman"/>
-                <w:bidi w:val="0"/>
-                <w:sz w:val="10"/>
-                <w:szCs w:val="10"/>
-              </w:rPr>
-              <w:t>M-GATO</w:t>
-            </w:r>
-            <w:r>
-              <w:rPr>
-                <w:rFonts w:hint="cs" w:ascii="B Mitra" w:hAnsi="B Mitra" w:cs="B Mitra"/>
-                <w:sz w:val="10"/>
-                <w:rtl/>
-                <w:szCs w:val="10"/>
-              </w:rPr>
-              <w:t xml:space="preserve"> (بدون </w:t>
-            </w:r>
-            <w:r>
-              <w:rPr>
-                <w:rFonts w:ascii="Times New Roman" w:hAnsi="Times New Roman" w:cs="Times New Roman"/>
-                <w:bidi w:val="0"/>
-                <w:sz w:val="10"/>
-                <w:szCs w:val="10"/>
-              </w:rPr>
-              <w:t>Q</w:t>
-            </w:r>
-            <w:r>
-              <w:rPr>
-                <w:rFonts w:hint="cs" w:ascii="B Mitra" w:hAnsi="B Mitra" w:cs="B Mitra"/>
-                <w:sz w:val="10"/>
-                <w:rtl/>
-                <w:szCs w:val="10"/>
-              </w:rPr>
-              <w:t>)</w:t>
-            </w:r>
-          </w:p>
-        </w:tc>
-        <w:tc>
-          <w:tcPr>
-            <w:tcW w:w="690" w:type="dxa"/>
-            <w:tcMar>
-              <w:top w:w="12" w:type="dxa"/>
-              <w:bottom w:w="12" w:type="dxa"/>
-              <w:left w:w="8" w:type="dxa"/>
-              <w:right w:w="8" w:type="dxa"/>
-            </w:tcMar>
-            <w:noWrap/>
-          </w:tcPr>
-          <w:p>
-            <w:pPr>
-              <w:pStyle w:val="FigureText"/>
-              <w:spacing w:before="2" w:after="2"/>
-              <w:jc w:val="center"/>
-            </w:pPr>
-            <w:r>
-              <w:rPr>
-                <w:rFonts w:hint="cs" w:ascii="B Mitra" w:hAnsi="B Mitra" w:cs="B Mitra"/>
-                <w:sz w:val="10"/>
-                <w:rtl/>
-                <w:szCs w:val="10"/>
-              </w:rPr>
-              <w:t>۰٫۳۷۴ ± ۰٫۱۱۷</w:t>
-            </w:r>
-          </w:p>
-        </w:tc>
-        <w:tc>
-          <w:tcPr>
-            <w:tcW w:w="690" w:type="dxa"/>
-            <w:tcMar>
-              <w:top w:w="12" w:type="dxa"/>
-              <w:bottom w:w="12" w:type="dxa"/>
-              <w:left w:w="8" w:type="dxa"/>
-              <w:right w:w="8" w:type="dxa"/>
-            </w:tcMar>
-            <w:noWrap/>
-          </w:tcPr>
-          <w:p>
-            <w:pPr>
-              <w:pStyle w:val="FigureText"/>
-              <w:spacing w:before="2" w:after="2"/>
-              <w:jc w:val="center"/>
-            </w:pPr>
-            <w:r>
-              <w:rPr>
-                <w:rFonts w:hint="cs" w:ascii="B Mitra" w:hAnsi="B Mitra" w:cs="B Mitra"/>
-                <w:sz w:val="10"/>
-                <w:rtl/>
-                <w:szCs w:val="10"/>
-              </w:rPr>
-              <w:t>۰٫۲۵۲ ± ۰٫۰۷۹</w:t>
-            </w:r>
-          </w:p>
-        </w:tc>
-        <w:tc>
-          <w:tcPr>
-            <w:tcW w:w="690" w:type="dxa"/>
-            <w:tcMar>
-              <w:top w:w="12" w:type="dxa"/>
-              <w:bottom w:w="12" w:type="dxa"/>
-              <w:left w:w="8" w:type="dxa"/>
-              <w:right w:w="8" w:type="dxa"/>
-            </w:tcMar>
-            <w:noWrap/>
-          </w:tcPr>
-          <w:p>
-            <w:pPr>
-              <w:pStyle w:val="FigureText"/>
-              <w:spacing w:before="2" w:after="2"/>
-              <w:jc w:val="center"/>
-            </w:pPr>
-            <w:r>
-              <w:rPr>
-                <w:rFonts w:hint="cs" w:ascii="B Mitra" w:hAnsi="B Mitra" w:cs="B Mitra"/>
-                <w:sz w:val="10"/>
-                <w:rtl/>
-                <w:szCs w:val="10"/>
-              </w:rPr>
-              <w:t>۰٫۳۴۲ ± ۰٫۰۶۹</w:t>
-            </w:r>
-          </w:p>
-        </w:tc>
-        <w:tc>
-          <w:tcPr>
-            <w:tcW w:w="690" w:type="dxa"/>
-            <w:tcMar>
-              <w:top w:w="12" w:type="dxa"/>
-              <w:bottom w:w="12" w:type="dxa"/>
-              <w:left w:w="8" w:type="dxa"/>
-              <w:right w:w="8" w:type="dxa"/>
-            </w:tcMar>
-            <w:noWrap/>
-          </w:tcPr>
-          <w:p>
-            <w:pPr>
-              <w:pStyle w:val="FigureText"/>
-              <w:spacing w:before="2" w:after="2"/>
-              <w:jc w:val="center"/>
-            </w:pPr>
-            <w:r>
-              <w:rPr>
-                <w:rFonts w:hint="cs" w:ascii="B Mitra" w:hAnsi="B Mitra" w:cs="B Mitra"/>
-                <w:sz w:val="10"/>
-                <w:rtl/>
-                <w:szCs w:val="10"/>
-              </w:rPr>
-              <w:t>۰٫۳۹۶ ± ۰٫۱۰۲</w:t>
-            </w:r>
-          </w:p>
-        </w:tc>
-        <w:tc>
-          <w:tcPr>
-            <w:tcW w:w="690" w:type="dxa"/>
-            <w:tcMar>
-              <w:top w:w="12" w:type="dxa"/>
-              <w:bottom w:w="12" w:type="dxa"/>
-              <w:left w:w="8" w:type="dxa"/>
-              <w:right w:w="8" w:type="dxa"/>
-            </w:tcMar>
-            <w:noWrap/>
-          </w:tcPr>
-          <w:p>
-            <w:pPr>
-              <w:pStyle w:val="FigureText"/>
-              <w:spacing w:before="2" w:after="2"/>
-              <w:jc w:val="center"/>
-            </w:pPr>
-            <w:r>
-              <w:rPr>
-                <w:rFonts w:hint="cs" w:ascii="B Mitra" w:hAnsi="B Mitra" w:cs="B Mitra"/>
-                <w:sz w:val="10"/>
-                <w:rtl/>
-                <w:szCs w:val="10"/>
-              </w:rPr>
-              <w:t>۰٫۱۸۴ ± ۰٫۰۸۳</w:t>
-            </w:r>
-          </w:p>
-        </w:tc>
-      </w:tr>
-      <w:tr>
-        <w:trPr>
-          <w:cantSplit/>
-        </w:trPr>
-        <w:tc>
-          <w:tcPr>
-            <w:tcW w:w="1200" w:type="dxa"/>
-            <w:tcMar>
-              <w:top w:w="12" w:type="dxa"/>
-              <w:bottom w:w="12" w:type="dxa"/>
-              <w:left w:w="8" w:type="dxa"/>
-              <w:right w:w="8" w:type="dxa"/>
-            </w:tcMar>
-            <w:noWrap/>
             <w:shd w:fill="E8F5E9"/>
           </w:tcPr>
           <w:p>
@@ -8470,18 +7539,38 @@
                 <w:rtl/>
                 <w:szCs w:val="10"/>
               </w:rPr>
-              <w:t xml:space="preserve">پیشنهادی </w:t>
-            </w:r>
-            <w:r>
-              <w:rPr>
-                <w:rFonts w:ascii="Times New Roman" w:hAnsi="Times New Roman" w:cs="Times New Roman"/>
+              <w:t>شکاف گراف ایستا</w:t>
+            </w:r>
+          </w:p>
+        </w:tc>
+        <w:tc>
+          <w:tcPr>
+            <w:tcW w:w="690" w:type="dxa"/>
+            <w:tcMar>
+              <w:top w:w="12" w:type="dxa"/>
+              <w:bottom w:w="12" w:type="dxa"/>
+              <w:left w:w="8" w:type="dxa"/>
+              <w:right w:w="8" w:type="dxa"/>
+            </w:tcMar>
+            <w:noWrap/>
+            <w:shd w:fill="E8F5E9"/>
+          </w:tcPr>
+          <w:p>
+            <w:pPr>
+              <w:pStyle w:val="FigureText"/>
+              <w:spacing w:before="2" w:after="2"/>
+              <w:jc w:val="center"/>
+            </w:pPr>
+            <w:r>
+              <w:rPr>
+                <w:rFonts w:hint="cs" w:ascii="B Mitra" w:hAnsi="B Mitra" w:cs="B Mitra"/>
                 <w:bCs/>
                 <w:b/>
-                <w:bidi w:val="0"/>
-                <w:sz w:val="10"/>
-                <w:szCs w:val="10"/>
-              </w:rPr>
-              <w:t>HAMTA</w:t>
+                <w:sz w:val="10"/>
+                <w:rtl/>
+                <w:szCs w:val="10"/>
+              </w:rPr>
+              <w:t>۰٫۰</w:t>
             </w:r>
           </w:p>
         </w:tc>
@@ -8512,7 +7601,7 @@
                 <w:rtl/>
                 <w:szCs w:val="10"/>
               </w:rPr>
-              <w:t>۰٫۳۶۶ ± ۰٫۱۲۰</w:t>
+              <w:t>۰٫۰</w:t>
             </w:r>
           </w:p>
         </w:tc>
@@ -8543,7 +7632,7 @@
                 <w:rtl/>
                 <w:szCs w:val="10"/>
               </w:rPr>
-              <w:t>۰٫۲۴۶ ± ۰٫۰۸۱</w:t>
+              <w:t>۰٫۰</w:t>
             </w:r>
           </w:p>
         </w:tc>
@@ -8574,7 +7663,7 @@
                 <w:rtl/>
                 <w:szCs w:val="10"/>
               </w:rPr>
-              <w:t>۰٫۳۴۲ ± ۰٫۰۷۷</w:t>
+              <w:t>۰</w:t>
             </w:r>
           </w:p>
         </w:tc>
@@ -8605,38 +7694,7 @@
                 <w:rtl/>
                 <w:szCs w:val="10"/>
               </w:rPr>
-              <w:t>۰٫۳۸۲ ± ۰٫۱۱۶</w:t>
-            </w:r>
-          </w:p>
-        </w:tc>
-        <w:tc>
-          <w:tcPr>
-            <w:tcW w:w="690" w:type="dxa"/>
-            <w:tcMar>
-              <w:top w:w="12" w:type="dxa"/>
-              <w:bottom w:w="12" w:type="dxa"/>
-              <w:left w:w="8" w:type="dxa"/>
-              <w:right w:w="8" w:type="dxa"/>
-            </w:tcMar>
-            <w:noWrap/>
-            <w:shd w:fill="E8F5E9"/>
-          </w:tcPr>
-          <w:p>
-            <w:pPr>
-              <w:pStyle w:val="FigureText"/>
-              <w:spacing w:before="2" w:after="2"/>
-              <w:jc w:val="center"/>
-            </w:pPr>
-            <w:r>
-              <w:rPr>
-                <w:rFonts w:hint="cs" w:ascii="B Mitra" w:hAnsi="B Mitra" w:cs="B Mitra"/>
-                <w:bCs/>
-                <w:b/>
-                <w:sz w:val="10"/>
-                <w:rtl/>
-                <w:szCs w:val="10"/>
-              </w:rPr>
-              <w:t>۰٫۱۸۰ ± ۰٫۰۹۲</w:t>
+              <w:t>۰٫۰</w:t>
             </w:r>
           </w:p>
         </w:tc>
@@ -8652,7 +7710,7 @@
       <w:r>
         <w:drawing>
           <wp:inline xmlns:a="http://schemas.openxmlformats.org/drawingml/2006/main" xmlns:pic="http://schemas.openxmlformats.org/drawingml/2006/picture">
-            <wp:extent cx="2736000" cy="2700468"/>
+            <wp:extent cx="2736000" cy="1022545"/>
             <wp:docPr id="4" name="Picture 4"/>
             <wp:cNvGraphicFramePr>
               <a:graphicFrameLocks noChangeAspect="1"/>
@@ -8673,7 +7731,7 @@
                   <pic:spPr>
                     <a:xfrm>
                       <a:off x="0" y="0"/>
-                      <a:ext cx="2736000" cy="2700468"/>
+                      <a:ext cx="2736000" cy="1022545"/>
                     </a:xfrm>
                     <a:prstGeom prst="rect"/>
                   </pic:spPr>
@@ -8728,7 +7786,7 @@
           <w:rFonts w:hint="cs" w:ascii="B Mitra" w:hAnsi="B Mitra" w:cs="B Mitra"/>
           <w:rtl/>
         </w:rPr>
-        <w:t>با توجه به شیوع فرصت‌های واقعی در سطح ۵۱ پذیرنده از ۳۵۰ پذیرنده (شانس تصادفی معادل ۰٫۱۴۶ یا ۱۴٫۶٪)، نتایج جدول (</w:t>
+        <w:t>با توجه به شیوع فرصت‌های واقعی در سطح ۵۲ پذیرنده از ۳۵۰ پذیرنده (شانس تصادفی معادل ۰٫۱۴۶ یا ۱۴٫۶٪)، نتایج جدول (</w:t>
       </w:r>
       <w:r>
         <w:rPr>
@@ -12629,7 +11687,18 @@
                 <w:sz w:val="11"/>
                 <w:szCs w:val="11"/>
               </w:rPr>
-              <w:t>FPR@35</w:t>
+              <w:t>Weak-Support</w:t>
+            </w:r>
+            <w:r>
+              <w:rPr>
+                <w:rFonts w:hint="cs" w:ascii="B Mitra" w:hAnsi="B Mitra" w:cs="B Mitra"/>
+                <w:bCs/>
+                <w:b/>
+                <w:sz w:val="11"/>
+                <w:rtl/>
+                <w:szCs w:val="11"/>
+              </w:rPr>
+              <w:t xml:space="preserve"> %</w:t>
             </w:r>
           </w:p>
         </w:tc>
@@ -12750,7 +11819,7 @@
                 <w:rtl/>
                 <w:szCs w:val="10"/>
               </w:rPr>
-              <w:t>۰٫۰۰۰ ± ۰٫۰۰۰</w:t>
+              <w:t>۰٫۰</w:t>
             </w:r>
           </w:p>
         </w:tc>
@@ -12778,7 +11847,7 @@
                 <w:rtl/>
                 <w:szCs w:val="10"/>
               </w:rPr>
-              <w:t>۰٫۰۰۰ ± ۰٫۰۰۰</w:t>
+              <w:t>۰٫۰</w:t>
             </w:r>
           </w:p>
         </w:tc>
@@ -12806,7 +11875,7 @@
                 <w:rtl/>
                 <w:szCs w:val="10"/>
               </w:rPr>
-              <w:t>۰٫۱۰۰ ± ۰٫۰۰۰</w:t>
+              <w:t>۰٫۰۲۸</w:t>
             </w:r>
           </w:p>
         </w:tc>
@@ -12834,7 +11903,7 @@
                 <w:rtl/>
                 <w:szCs w:val="10"/>
               </w:rPr>
-              <w:t>۰٫۸۶۲ ± ۰٫۰۳۱</w:t>
+              <w:t>۰٫۰</w:t>
             </w:r>
           </w:p>
         </w:tc>
@@ -12923,7 +11992,7 @@
                 <w:rtl/>
                 <w:szCs w:val="10"/>
               </w:rPr>
-              <w:t>۰٫۲۹۷ ± ۰٫۰۹۹</w:t>
+              <w:t>۰٫۷۴۳</w:t>
             </w:r>
           </w:p>
         </w:tc>
@@ -12951,7 +12020,7 @@
                 <w:rtl/>
                 <w:szCs w:val="10"/>
               </w:rPr>
-              <w:t>۰٫۳۱۰ ± ۰٫۰۹۸</w:t>
+              <w:t>۰٫۸۱۲</w:t>
             </w:r>
           </w:p>
         </w:tc>
@@ -12979,7 +12048,7 @@
                 <w:rtl/>
                 <w:szCs w:val="10"/>
               </w:rPr>
-              <w:t>۰٫۰۸۳ ± ۰٫۰۱۲</w:t>
+              <w:t>۰٫۰۸۶</w:t>
             </w:r>
           </w:p>
         </w:tc>
@@ -13007,7 +12076,7 @@
                 <w:rtl/>
                 <w:szCs w:val="10"/>
               </w:rPr>
-              <w:t>۰٫۸۱۹ ± ۰٫۰۴۴</w:t>
+              <w:t>۰٫۰</w:t>
             </w:r>
           </w:p>
         </w:tc>
@@ -13105,7 +12174,7 @@
                 <w:rtl/>
                 <w:szCs w:val="10"/>
               </w:rPr>
-              <w:t>۰٫۳۶۶ ± ۰٫۱۲۰</w:t>
+              <w:t>۰٫۸۸۶</w:t>
             </w:r>
           </w:p>
         </w:tc>
@@ -13136,7 +12205,7 @@
                 <w:rtl/>
                 <w:szCs w:val="10"/>
               </w:rPr>
-              <w:t>۰٫۳۸۲ ± ۰٫۱۱۶</w:t>
+              <w:t>۰٫۹۲۴</w:t>
             </w:r>
           </w:p>
         </w:tc>
@@ -13167,7 +12236,7 @@
                 <w:rtl/>
                 <w:szCs w:val="10"/>
               </w:rPr>
-              <w:t>۰٫۰۷۴ ± ۰٫۰۱۴</w:t>
+              <w:t>۰٫۰۵۷</w:t>
             </w:r>
           </w:p>
         </w:tc>
@@ -13198,7 +12267,7 @@
                 <w:rtl/>
                 <w:szCs w:val="10"/>
               </w:rPr>
-              <w:t>۰٫۸۰۷ ± ۰٫۰۳۹</w:t>
+              <w:t>۰٫۰</w:t>
             </w:r>
           </w:p>
         </w:tc>
@@ -13287,7 +12356,7 @@
                 <w:rtl/>
                 <w:szCs w:val="10"/>
               </w:rPr>
-              <w:t>۰٫۵۰۰ ± ۰٫۱۲۲</w:t>
+              <w:t>۰٫۹۴۳</w:t>
             </w:r>
           </w:p>
         </w:tc>
@@ -13315,7 +12384,7 @@
                 <w:rtl/>
                 <w:szCs w:val="10"/>
               </w:rPr>
-              <w:t>۰٫۵۳۲ ± ۰٫۱۲۰</w:t>
+              <w:t>۰٫۹۵۶</w:t>
             </w:r>
           </w:p>
         </w:tc>
@@ -13343,7 +12412,7 @@
                 <w:rtl/>
                 <w:szCs w:val="10"/>
               </w:rPr>
-              <w:t>۰٫۰۵۹ ± ۰٫۰۱۴</w:t>
+              <w:t>۰٫۰۲۹</w:t>
             </w:r>
           </w:p>
         </w:tc>
@@ -13371,7 +12440,7 @@
                 <w:rtl/>
                 <w:szCs w:val="10"/>
               </w:rPr>
-              <w:t>۰٫۸۰۳ ± ۰٫۰۴۱</w:t>
+              <w:t>۰٫۰</w:t>
             </w:r>
           </w:p>
         </w:tc>
@@ -13756,7 +12825,7 @@
                 <w:rtl/>
                 <w:szCs w:val="10"/>
               </w:rPr>
-              <w:t>۰٫۳۸۲ ± ۰٫۱۱۶</w:t>
+              <w:t>۰٫۹۵۷</w:t>
             </w:r>
           </w:p>
         </w:tc>
@@ -13787,7 +12856,7 @@
                 <w:rtl/>
                 <w:szCs w:val="10"/>
               </w:rPr>
-              <w:t>۰٫۳۶۶ ± ۰٫۱۲۰</w:t>
+              <w:t>۰٫۹۴۳</w:t>
             </w:r>
           </w:p>
         </w:tc>
@@ -13840,17 +12909,6 @@
               <w:spacing w:before="2" w:after="2"/>
               <w:jc w:val="center"/>
             </w:pPr>
-            <w:r>
-              <w:rPr>
-                <w:rFonts w:hint="cs" w:ascii="B Mitra" w:hAnsi="B Mitra" w:cs="B Mitra"/>
-                <w:bCs/>
-                <w:b/>
-                <w:sz w:val="10"/>
-                <w:rtl/>
-                <w:szCs w:val="10"/>
-              </w:rPr>
-              <w:t>مبنا (پیشنهادی)</w:t>
-            </w:r>
           </w:p>
         </w:tc>
       </w:tr>
@@ -13910,7 +12968,7 @@
                 <w:rtl/>
                 <w:szCs w:val="10"/>
               </w:rPr>
-              <w:t>۰٫۳۸۴ ± ۰٫۱۱۷</w:t>
+              <w:t>۰٫۹۳۷</w:t>
             </w:r>
           </w:p>
         </w:tc>
@@ -13938,7 +12996,7 @@
                 <w:rtl/>
                 <w:szCs w:val="10"/>
               </w:rPr>
-              <w:t>۰٫۳۶۹ ± ۰٫۱۲۰</w:t>
+              <w:t>۰٫۹۱۴</w:t>
             </w:r>
           </w:p>
         </w:tc>
@@ -13966,7 +13024,7 @@
                 <w:rtl/>
                 <w:szCs w:val="10"/>
               </w:rPr>
-              <w:t>-۰٫۰۰۲</w:t>
+              <w:t>+۰٫۰۰۰</w:t>
             </w:r>
           </w:p>
         </w:tc>
@@ -13987,33 +13045,6 @@
               <w:spacing w:before="2" w:after="2"/>
               <w:jc w:val="center"/>
             </w:pPr>
-            <w:r>
-              <w:rPr>
-                <w:rFonts w:ascii="Times New Roman" w:hAnsi="Times New Roman" w:cs="Times New Roman"/>
-                <w:bidi w:val="0"/>
-                <w:sz w:val="10"/>
-                <w:szCs w:val="10"/>
-              </w:rPr>
-              <w:t>p</w:t>
-            </w:r>
-            <w:r>
-              <w:rPr>
-                <w:rFonts w:hint="cs" w:ascii="B Mitra" w:hAnsi="B Mitra" w:cs="B Mitra"/>
-                <w:sz w:val="10"/>
-                <w:rtl/>
-                <w:szCs w:val="10"/>
-              </w:rPr>
-              <w:t xml:space="preserve"> = </w:t>
-            </w:r>
-            <w:r>
-              <w:rPr>
-                <w:rFonts w:ascii="Times New Roman" w:hAnsi="Times New Roman" w:cs="Times New Roman"/>
-                <w:bidi w:val="0"/>
-                <w:sz w:val="10"/>
-                <w:szCs w:val="10"/>
-              </w:rPr>
-              <w:t>0.846</w:t>
-            </w:r>
           </w:p>
         </w:tc>
       </w:tr>
@@ -14091,7 +13122,7 @@
                 <w:rtl/>
                 <w:szCs w:val="10"/>
               </w:rPr>
-              <w:t>۰٫۳۹۶ ± ۰٫۱۰۲</w:t>
+              <w:t>۰٫۹۵۶</w:t>
             </w:r>
           </w:p>
         </w:tc>
@@ -14119,7 +13150,7 @@
                 <w:rtl/>
                 <w:szCs w:val="10"/>
               </w:rPr>
-              <w:t>۰٫۳۷۴ ± ۰٫۱۱۷</w:t>
+              <w:t>۰٫۹۴۳</w:t>
             </w:r>
           </w:p>
         </w:tc>
@@ -14147,7 +13178,7 @@
                 <w:rtl/>
                 <w:szCs w:val="10"/>
               </w:rPr>
-              <w:t>-۰٫۰۱۴</w:t>
+              <w:t>+۰٫۰۰۰</w:t>
             </w:r>
           </w:p>
         </w:tc>
@@ -14168,33 +13199,6 @@
               <w:spacing w:before="2" w:after="2"/>
               <w:jc w:val="center"/>
             </w:pPr>
-            <w:r>
-              <w:rPr>
-                <w:rFonts w:ascii="Times New Roman" w:hAnsi="Times New Roman" w:cs="Times New Roman"/>
-                <w:bidi w:val="0"/>
-                <w:sz w:val="10"/>
-                <w:szCs w:val="10"/>
-              </w:rPr>
-              <w:t>p</w:t>
-            </w:r>
-            <w:r>
-              <w:rPr>
-                <w:rFonts w:hint="cs" w:ascii="B Mitra" w:hAnsi="B Mitra" w:cs="B Mitra"/>
-                <w:sz w:val="10"/>
-                <w:rtl/>
-                <w:szCs w:val="10"/>
-              </w:rPr>
-              <w:t xml:space="preserve"> = </w:t>
-            </w:r>
-            <w:r>
-              <w:rPr>
-                <w:rFonts w:ascii="Times New Roman" w:hAnsi="Times New Roman" w:cs="Times New Roman"/>
-                <w:bidi w:val="0"/>
-                <w:sz w:val="10"/>
-                <w:szCs w:val="10"/>
-              </w:rPr>
-              <w:t>0.375</w:t>
-            </w:r>
           </w:p>
         </w:tc>
       </w:tr>
@@ -14254,7 +13258,7 @@
                 <w:rtl/>
                 <w:szCs w:val="10"/>
               </w:rPr>
-              <w:t>۰٫۴۱۵ ± ۰٫۰۹۵</w:t>
+              <w:t>۰٫۷۳۲</w:t>
             </w:r>
           </w:p>
         </w:tc>
@@ -14282,7 +13286,7 @@
                 <w:rtl/>
                 <w:szCs w:val="10"/>
               </w:rPr>
-              <w:t>۰٫۳۹۷ ± ۰٫۰۹۶</w:t>
+              <w:t>۰٫۷۷۱</w:t>
             </w:r>
           </w:p>
         </w:tc>
@@ -14310,7 +13314,7 @@
                 <w:rtl/>
                 <w:szCs w:val="10"/>
               </w:rPr>
-              <w:t>-۰٫۰۳۳</w:t>
+              <w:t>+۰٫۰۰۰</w:t>
             </w:r>
           </w:p>
         </w:tc>
@@ -14331,33 +13335,6 @@
               <w:spacing w:before="2" w:after="2"/>
               <w:jc w:val="center"/>
             </w:pPr>
-            <w:r>
-              <w:rPr>
-                <w:rFonts w:ascii="Times New Roman" w:hAnsi="Times New Roman" w:cs="Times New Roman"/>
-                <w:bidi w:val="0"/>
-                <w:sz w:val="10"/>
-                <w:szCs w:val="10"/>
-              </w:rPr>
-              <w:t>p</w:t>
-            </w:r>
-            <w:r>
-              <w:rPr>
-                <w:rFonts w:hint="cs" w:ascii="B Mitra" w:hAnsi="B Mitra" w:cs="B Mitra"/>
-                <w:sz w:val="10"/>
-                <w:rtl/>
-                <w:szCs w:val="10"/>
-              </w:rPr>
-              <w:t xml:space="preserve"> = </w:t>
-            </w:r>
-            <w:r>
-              <w:rPr>
-                <w:rFonts w:ascii="Times New Roman" w:hAnsi="Times New Roman" w:cs="Times New Roman"/>
-                <w:bidi w:val="0"/>
-                <w:sz w:val="10"/>
-                <w:szCs w:val="10"/>
-              </w:rPr>
-              <w:t>0.027</w:t>
-            </w:r>
           </w:p>
         </w:tc>
       </w:tr>
@@ -14417,7 +13394,7 @@
                 <w:rtl/>
                 <w:szCs w:val="10"/>
               </w:rPr>
-              <w:t>۰٫۳۹۴ ± ۰٫۰۹۶</w:t>
+              <w:t>۰٫۹۳۹</w:t>
             </w:r>
           </w:p>
         </w:tc>
@@ -14445,7 +13422,7 @@
                 <w:rtl/>
                 <w:szCs w:val="10"/>
               </w:rPr>
-              <w:t>۰٫۳۵۴ ± ۰٫۰۸۹</w:t>
+              <w:t>۰٫۹۱۴</w:t>
             </w:r>
           </w:p>
         </w:tc>
@@ -14473,7 +13450,7 @@
                 <w:rtl/>
                 <w:szCs w:val="10"/>
               </w:rPr>
-              <w:t>-۰٫۰۱۲</w:t>
+              <w:t>+۰٫۰۰۰</w:t>
             </w:r>
           </w:p>
         </w:tc>
@@ -14494,33 +13471,6 @@
               <w:spacing w:before="2" w:after="2"/>
               <w:jc w:val="center"/>
             </w:pPr>
-            <w:r>
-              <w:rPr>
-                <w:rFonts w:ascii="Times New Roman" w:hAnsi="Times New Roman" w:cs="Times New Roman"/>
-                <w:bidi w:val="0"/>
-                <w:sz w:val="10"/>
-                <w:szCs w:val="10"/>
-              </w:rPr>
-              <w:t>p</w:t>
-            </w:r>
-            <w:r>
-              <w:rPr>
-                <w:rFonts w:hint="cs" w:ascii="B Mitra" w:hAnsi="B Mitra" w:cs="B Mitra"/>
-                <w:sz w:val="10"/>
-                <w:rtl/>
-                <w:szCs w:val="10"/>
-              </w:rPr>
-              <w:t xml:space="preserve"> = </w:t>
-            </w:r>
-            <w:r>
-              <w:rPr>
-                <w:rFonts w:ascii="Times New Roman" w:hAnsi="Times New Roman" w:cs="Times New Roman"/>
-                <w:bidi w:val="0"/>
-                <w:sz w:val="10"/>
-                <w:szCs w:val="10"/>
-              </w:rPr>
-              <w:t>0.695</w:t>
-            </w:r>
           </w:p>
         </w:tc>
       </w:tr>
@@ -14580,7 +13530,7 @@
                 <w:rtl/>
                 <w:szCs w:val="10"/>
               </w:rPr>
-              <w:t>۰٫۳۱۰ ± ۰٫۰۷۹</w:t>
+              <w:t>۰٫۰۹۹</w:t>
             </w:r>
           </w:p>
         </w:tc>
@@ -14608,7 +13558,7 @@
                 <w:rtl/>
                 <w:szCs w:val="10"/>
               </w:rPr>
-              <w:t>۰٫۲۸۶ ± ۰٫۰۷۱</w:t>
+              <w:t>۰٫۰۲۹</w:t>
             </w:r>
           </w:p>
         </w:tc>
@@ -14636,7 +13586,7 @@
                 <w:rtl/>
                 <w:szCs w:val="10"/>
               </w:rPr>
-              <w:t>+۰٫۰۷۲</w:t>
+              <w:t>+۰٫۰۰۰</w:t>
             </w:r>
           </w:p>
         </w:tc>
@@ -14657,33 +13607,6 @@
               <w:spacing w:before="2" w:after="2"/>
               <w:jc w:val="center"/>
             </w:pPr>
-            <w:r>
-              <w:rPr>
-                <w:rFonts w:ascii="Times New Roman" w:hAnsi="Times New Roman" w:cs="Times New Roman"/>
-                <w:bidi w:val="0"/>
-                <w:sz w:val="10"/>
-                <w:szCs w:val="10"/>
-              </w:rPr>
-              <w:t>p</w:t>
-            </w:r>
-            <w:r>
-              <w:rPr>
-                <w:rFonts w:hint="cs" w:ascii="B Mitra" w:hAnsi="B Mitra" w:cs="B Mitra"/>
-                <w:sz w:val="10"/>
-                <w:rtl/>
-                <w:szCs w:val="10"/>
-              </w:rPr>
-              <w:t xml:space="preserve"> = </w:t>
-            </w:r>
-            <w:r>
-              <w:rPr>
-                <w:rFonts w:ascii="Times New Roman" w:hAnsi="Times New Roman" w:cs="Times New Roman"/>
-                <w:bidi w:val="0"/>
-                <w:sz w:val="10"/>
-                <w:szCs w:val="10"/>
-              </w:rPr>
-              <w:t>0.084</w:t>
-            </w:r>
           </w:p>
         </w:tc>
       </w:tr>
@@ -14743,7 +13666,7 @@
                 <w:rtl/>
                 <w:szCs w:val="10"/>
               </w:rPr>
-              <w:t>۰٫۲۳۷ ± ۰٫۰۸۳</w:t>
+              <w:t>۰٫۰۸۳</w:t>
             </w:r>
           </w:p>
         </w:tc>
@@ -14771,7 +13694,7 @@
                 <w:rtl/>
                 <w:szCs w:val="10"/>
               </w:rPr>
-              <w:t>۰٫۲۱۴ ± ۰٫۰۶۴</w:t>
+              <w:t>۰٫۱۱۴</w:t>
             </w:r>
           </w:p>
         </w:tc>
@@ -14799,7 +13722,7 @@
                 <w:rtl/>
                 <w:szCs w:val="10"/>
               </w:rPr>
-              <w:t>+۰٫۱۴۵</w:t>
+              <w:t>+۰٫۰۰۰</w:t>
             </w:r>
           </w:p>
         </w:tc>
@@ -14820,33 +13743,6 @@
               <w:spacing w:before="2" w:after="2"/>
               <w:jc w:val="center"/>
             </w:pPr>
-            <w:r>
-              <w:rPr>
-                <w:rFonts w:ascii="Times New Roman" w:hAnsi="Times New Roman" w:cs="Times New Roman"/>
-                <w:bidi w:val="0"/>
-                <w:sz w:val="10"/>
-                <w:szCs w:val="10"/>
-              </w:rPr>
-              <w:t>p</w:t>
-            </w:r>
-            <w:r>
-              <w:rPr>
-                <w:rFonts w:hint="cs" w:ascii="B Mitra" w:hAnsi="B Mitra" w:cs="B Mitra"/>
-                <w:sz w:val="10"/>
-                <w:rtl/>
-                <w:szCs w:val="10"/>
-              </w:rPr>
-              <w:t xml:space="preserve"> = </w:t>
-            </w:r>
-            <w:r>
-              <w:rPr>
-                <w:rFonts w:ascii="Times New Roman" w:hAnsi="Times New Roman" w:cs="Times New Roman"/>
-                <w:bidi w:val="0"/>
-                <w:sz w:val="10"/>
-                <w:szCs w:val="10"/>
-              </w:rPr>
-              <w:t>0.002</w:t>
-            </w:r>
           </w:p>
         </w:tc>
       </w:tr>
@@ -15414,7 +14310,7 @@
                 <w:rtl/>
                 <w:szCs w:val="10"/>
               </w:rPr>
-              <w:t>۰۰۲۷۳</w:t>
+              <w:t>۰۰۱۴۱</w:t>
             </w:r>
           </w:p>
         </w:tc>
@@ -15442,7 +14338,7 @@
                 <w:rtl/>
                 <w:szCs w:val="10"/>
               </w:rPr>
-              <w:t>پوشاک</w:t>
+              <w:t>مصالح صنعتی</w:t>
             </w:r>
           </w:p>
         </w:tc>
@@ -15470,7 +14366,7 @@
                 <w:rtl/>
                 <w:szCs w:val="10"/>
               </w:rPr>
-              <w:t>۹</w:t>
+              <w:t>۲۸</w:t>
             </w:r>
           </w:p>
         </w:tc>
@@ -15498,7 +14394,7 @@
                 <w:rtl/>
                 <w:szCs w:val="10"/>
               </w:rPr>
-              <w:t>۵٫۳</w:t>
+              <w:t>۳۱٫۱</w:t>
             </w:r>
           </w:p>
         </w:tc>
@@ -15526,7 +14422,7 @@
                 <w:rtl/>
                 <w:szCs w:val="10"/>
               </w:rPr>
-              <w:t>۹٫۳</w:t>
+              <w:t>۳۷٫۱</w:t>
             </w:r>
           </w:p>
         </w:tc>
@@ -15554,7 +14450,7 @@
                 <w:rtl/>
                 <w:szCs w:val="10"/>
               </w:rPr>
-              <w:t>۲۴٫۴</w:t>
+              <w:t>۵۶٫۴</w:t>
             </w:r>
           </w:p>
         </w:tc>
@@ -15582,7 +14478,7 @@
                 <w:rtl/>
                 <w:szCs w:val="10"/>
               </w:rPr>
-              <w:t>۰٫۵۸۳</w:t>
+              <w:t>۰٫۳۴۳</w:t>
             </w:r>
           </w:p>
         </w:tc>
@@ -15624,7 +14520,7 @@
                 <w:rtl/>
                 <w:szCs w:val="10"/>
               </w:rPr>
-              <w:t>۰۰۲۶۵</w:t>
+              <w:t>۰۰۲۶۷</w:t>
             </w:r>
           </w:p>
         </w:tc>
@@ -15652,7 +14548,7 @@
                 <w:rtl/>
                 <w:szCs w:val="10"/>
               </w:rPr>
-              <w:t>پوشاک</w:t>
+              <w:t>مسافرتی</w:t>
             </w:r>
           </w:p>
         </w:tc>
@@ -15680,7 +14576,7 @@
                 <w:rtl/>
                 <w:szCs w:val="10"/>
               </w:rPr>
-              <w:t>۱۴</w:t>
+              <w:t>۸</w:t>
             </w:r>
           </w:p>
         </w:tc>
@@ -15708,7 +14604,7 @@
                 <w:rtl/>
                 <w:szCs w:val="10"/>
               </w:rPr>
-              <w:t>۹٫۱</w:t>
+              <w:t>۸٫۵</w:t>
             </w:r>
           </w:p>
         </w:tc>
@@ -15736,7 +14632,7 @@
                 <w:rtl/>
                 <w:szCs w:val="10"/>
               </w:rPr>
-              <w:t>۱۳٫۱</w:t>
+              <w:t>۱۴٫۵</w:t>
             </w:r>
           </w:p>
         </w:tc>
@@ -15764,7 +14660,7 @@
                 <w:rtl/>
                 <w:szCs w:val="10"/>
               </w:rPr>
-              <w:t>۳۱٫۳</w:t>
+              <w:t>۲۱٫۳</w:t>
             </w:r>
           </w:p>
         </w:tc>
@@ -15792,7 +14688,7 @@
                 <w:rtl/>
                 <w:szCs w:val="10"/>
               </w:rPr>
-              <w:t>۰٫۵۸۱</w:t>
+              <w:t>۰٫۳۱۹</w:t>
             </w:r>
           </w:p>
         </w:tc>
@@ -15834,7 +14730,7 @@
                 <w:rtl/>
                 <w:szCs w:val="10"/>
               </w:rPr>
-              <w:t>۰۰۰۵۴</w:t>
+              <w:t>۰۰۳۲۲</w:t>
             </w:r>
           </w:p>
         </w:tc>
@@ -15862,7 +14758,7 @@
                 <w:rtl/>
                 <w:szCs w:val="10"/>
               </w:rPr>
-              <w:t>پوشاک</w:t>
+              <w:t>مسافرتی</w:t>
             </w:r>
           </w:p>
         </w:tc>
@@ -15890,7 +14786,7 @@
                 <w:rtl/>
                 <w:szCs w:val="10"/>
               </w:rPr>
-              <w:t>۱۹</w:t>
+              <w:t>۱۰۰</w:t>
             </w:r>
           </w:p>
         </w:tc>
@@ -15918,7 +14814,7 @@
                 <w:rtl/>
                 <w:szCs w:val="10"/>
               </w:rPr>
-              <w:t>۹٫۱</w:t>
+              <w:t>۱۰۵٫۰</w:t>
             </w:r>
           </w:p>
         </w:tc>
@@ -15946,7 +14842,7 @@
                 <w:rtl/>
                 <w:szCs w:val="10"/>
               </w:rPr>
-              <w:t>۱۳٫۱</w:t>
+              <w:t>۱۱۲٫۰</w:t>
             </w:r>
           </w:p>
         </w:tc>
@@ -15974,7 +14870,7 @@
                 <w:rtl/>
                 <w:szCs w:val="10"/>
               </w:rPr>
-              <w:t>۳۰٫۵</w:t>
+              <w:t>۱۷۰٫۰</w:t>
             </w:r>
           </w:p>
         </w:tc>
@@ -16002,7 +14898,7 @@
                 <w:rtl/>
                 <w:szCs w:val="10"/>
               </w:rPr>
-              <w:t>۰٫۵۶۷</w:t>
+              <w:t>۰٫۳۰۷</w:t>
             </w:r>
           </w:p>
         </w:tc>
@@ -16044,7 +14940,7 @@
                 <w:rtl/>
                 <w:szCs w:val="10"/>
               </w:rPr>
-              <w:t>۰۰۳۳۷</w:t>
+              <w:t>۰۰۰۷۰</w:t>
             </w:r>
           </w:p>
         </w:tc>
@@ -16072,7 +14968,7 @@
                 <w:rtl/>
                 <w:szCs w:val="10"/>
               </w:rPr>
-              <w:t>پوشاک</w:t>
+              <w:t>مصالح صنعتی</w:t>
             </w:r>
           </w:p>
         </w:tc>
@@ -16100,7 +14996,7 @@
                 <w:rtl/>
                 <w:szCs w:val="10"/>
               </w:rPr>
-              <w:t>۱۳</w:t>
+              <w:t>۳۰</w:t>
             </w:r>
           </w:p>
         </w:tc>
@@ -16128,7 +15024,7 @@
                 <w:rtl/>
                 <w:szCs w:val="10"/>
               </w:rPr>
-              <w:t>۸٫۳</w:t>
+              <w:t>۳۲٫۸</w:t>
             </w:r>
           </w:p>
         </w:tc>
@@ -16156,7 +15052,7 @@
                 <w:rtl/>
                 <w:szCs w:val="10"/>
               </w:rPr>
-              <w:t>۱۲٫۳</w:t>
+              <w:t>۳۸٫۸</w:t>
             </w:r>
           </w:p>
         </w:tc>
@@ -16184,7 +15080,7 @@
                 <w:rtl/>
                 <w:szCs w:val="10"/>
               </w:rPr>
-              <w:t>۲۷٫۴</w:t>
+              <w:t>۵۴٫۷</w:t>
             </w:r>
           </w:p>
         </w:tc>
@@ -16212,7 +15108,7 @@
                 <w:rtl/>
                 <w:szCs w:val="10"/>
               </w:rPr>
-              <w:t>۰٫۵۴۵</w:t>
+              <w:t>۰٫۲۹۲</w:t>
             </w:r>
           </w:p>
         </w:tc>
@@ -16254,7 +15150,7 @@
                 <w:rtl/>
                 <w:szCs w:val="10"/>
               </w:rPr>
-              <w:t>۰۰۲۴۹</w:t>
+              <w:t>۰۰۳۰۹</w:t>
             </w:r>
           </w:p>
         </w:tc>
@@ -16282,7 +15178,7 @@
                 <w:rtl/>
                 <w:szCs w:val="10"/>
               </w:rPr>
-              <w:t>صنعتی</w:t>
+              <w:t>پزشکی</w:t>
             </w:r>
           </w:p>
         </w:tc>
@@ -16310,7 +15206,7 @@
                 <w:rtl/>
                 <w:szCs w:val="10"/>
               </w:rPr>
-              <w:t>۱۳</w:t>
+              <w:t>۷</w:t>
             </w:r>
           </w:p>
         </w:tc>
@@ -16338,7 +15234,7 @@
                 <w:rtl/>
                 <w:szCs w:val="10"/>
               </w:rPr>
-              <w:t>۱۲٫۳</w:t>
+              <w:t>۹٫۵</w:t>
             </w:r>
           </w:p>
         </w:tc>
@@ -16366,7 +15262,7 @@
                 <w:rtl/>
                 <w:szCs w:val="10"/>
               </w:rPr>
-              <w:t>۱۶٫۳</w:t>
+              <w:t>۱۵٫۵</w:t>
             </w:r>
           </w:p>
         </w:tc>
@@ -16394,7 +15290,7 @@
                 <w:rtl/>
                 <w:szCs w:val="10"/>
               </w:rPr>
-              <w:t>۳۴٫۶</w:t>
+              <w:t>۲۱٫۸</w:t>
             </w:r>
           </w:p>
         </w:tc>
@@ -16422,7 +15318,7 @@
                 <w:rtl/>
                 <w:szCs w:val="10"/>
               </w:rPr>
-              <w:t>۰٫۵۲۹</w:t>
+              <w:t>۰٫۲۸۸</w:t>
             </w:r>
           </w:p>
         </w:tc>
@@ -16438,7 +15334,7 @@
       <w:r>
         <w:drawing>
           <wp:inline xmlns:a="http://schemas.openxmlformats.org/drawingml/2006/main" xmlns:pic="http://schemas.openxmlformats.org/drawingml/2006/picture">
-            <wp:extent cx="2736000" cy="2094891"/>
+            <wp:extent cx="2736000" cy="1502873"/>
             <wp:docPr id="5" name="Picture 5"/>
             <wp:cNvGraphicFramePr>
               <a:graphicFrameLocks noChangeAspect="1"/>
@@ -16459,7 +15355,7 @@
                   <pic:spPr>
                     <a:xfrm>
                       <a:off x="0" y="0"/>
-                      <a:ext cx="2736000" cy="2094891"/>
+                      <a:ext cx="2736000" cy="1502873"/>
                     </a:xfrm>
                     <a:prstGeom prst="rect"/>
                   </pic:spPr>
@@ -16700,7 +15596,7 @@
           <w:rFonts w:hint="cs" w:ascii="B Mitra" w:hAnsi="B Mitra" w:cs="B Mitra"/>
           <w:rtl/>
         </w:rPr>
-        <w:t xml:space="preserve"> به عنوان جایگزین فیلتر آستانه‌ای سخت، نوسانات پذیرندگان بسیار خرد را مهار می‌سازد.</w:t>
+        <w:t xml:space="preserve"> به عنوان نسخه عملیاتی توصیه‌شده (به جای فیلتر آستانه‌ای سخت)، نوسانات پذیرندگان بسیار خرد را مهار می‌سازد.</w:t>
       </w:r>
     </w:p>
     <w:p>

</xml_diff>

<commit_message>
Use English figures for Persian manuscript
</commit_message>
<xml_diff>
--- a/FA_From_Transactional_Data_to_Organizational_Intelligence.docx
+++ b/FA_From_Transactional_Data_to_Organizational_Intelligence.docx
@@ -1333,7 +1333,7 @@
       <w:r>
         <w:drawing>
           <wp:inline xmlns:a="http://schemas.openxmlformats.org/drawingml/2006/main" xmlns:pic="http://schemas.openxmlformats.org/drawingml/2006/picture">
-            <wp:extent cx="2736000" cy="1112899"/>
+            <wp:extent cx="2736000" cy="1174560"/>
             <wp:docPr id="1" name="Picture 1"/>
             <wp:cNvGraphicFramePr>
               <a:graphicFrameLocks noChangeAspect="1"/>
@@ -1342,7 +1342,7 @@
               <a:graphicData uri="http://schemas.openxmlformats.org/drawingml/2006/picture">
                 <pic:pic>
                   <pic:nvPicPr>
-                    <pic:cNvPr id="0" name="fig1_architecture_fa.png"/>
+                    <pic:cNvPr id="0" name="fig1_framework_architecture.png"/>
                     <pic:cNvPicPr/>
                   </pic:nvPicPr>
                   <pic:blipFill>
@@ -1354,7 +1354,7 @@
                   <pic:spPr>
                     <a:xfrm>
                       <a:off x="0" y="0"/>
-                      <a:ext cx="2736000" cy="1112899"/>
+                      <a:ext cx="2736000" cy="1174560"/>
                     </a:xfrm>
                     <a:prstGeom prst="rect"/>
                   </pic:spPr>
@@ -3161,7 +3161,7 @@
       <w:r>
         <w:drawing>
           <wp:inline xmlns:a="http://schemas.openxmlformats.org/drawingml/2006/main" xmlns:pic="http://schemas.openxmlformats.org/drawingml/2006/picture">
-            <wp:extent cx="2736000" cy="2247429"/>
+            <wp:extent cx="2736000" cy="2749663"/>
             <wp:docPr id="2" name="Picture 2"/>
             <wp:cNvGraphicFramePr>
               <a:graphicFrameLocks noChangeAspect="1"/>
@@ -3170,7 +3170,7 @@
               <a:graphicData uri="http://schemas.openxmlformats.org/drawingml/2006/picture">
                 <pic:pic>
                   <pic:nvPicPr>
-                    <pic:cNvPr id="0" name="fig2_topology_fa.png"/>
+                    <pic:cNvPr id="0" name="fig2_graph_topology_communities.png"/>
                     <pic:cNvPicPr/>
                   </pic:nvPicPr>
                   <pic:blipFill>
@@ -3182,7 +3182,7 @@
                   <pic:spPr>
                     <a:xfrm>
                       <a:off x="0" y="0"/>
-                      <a:ext cx="2736000" cy="2247429"/>
+                      <a:ext cx="2736000" cy="2749663"/>
                     </a:xfrm>
                     <a:prstGeom prst="rect"/>
                   </pic:spPr>
@@ -4871,7 +4871,7 @@
       <w:r>
         <w:drawing>
           <wp:inline xmlns:a="http://schemas.openxmlformats.org/drawingml/2006/main" xmlns:pic="http://schemas.openxmlformats.org/drawingml/2006/picture">
-            <wp:extent cx="2736000" cy="1669737"/>
+            <wp:extent cx="2736000" cy="1869449"/>
             <wp:docPr id="3" name="Picture 3"/>
             <wp:cNvGraphicFramePr>
               <a:graphicFrameLocks noChangeAspect="1"/>
@@ -4880,7 +4880,7 @@
               <a:graphicData uri="http://schemas.openxmlformats.org/drawingml/2006/picture">
                 <pic:pic>
                   <pic:nvPicPr>
-                    <pic:cNvPr id="0" name="fig3_guild_heatmap_fa.png"/>
+                    <pic:cNvPr id="0" name="fig3_latent_tsne_comparison.png"/>
                     <pic:cNvPicPr/>
                   </pic:nvPicPr>
                   <pic:blipFill>
@@ -4892,7 +4892,7 @@
                   <pic:spPr>
                     <a:xfrm>
                       <a:off x="0" y="0"/>
-                      <a:ext cx="2736000" cy="1669737"/>
+                      <a:ext cx="2736000" cy="1869449"/>
                     </a:xfrm>
                     <a:prstGeom prst="rect"/>
                   </pic:spPr>
@@ -7710,7 +7710,7 @@
       <w:r>
         <w:drawing>
           <wp:inline xmlns:a="http://schemas.openxmlformats.org/drawingml/2006/main" xmlns:pic="http://schemas.openxmlformats.org/drawingml/2006/picture">
-            <wp:extent cx="2736000" cy="1022545"/>
+            <wp:extent cx="2736000" cy="2566937"/>
             <wp:docPr id="4" name="Picture 4"/>
             <wp:cNvGraphicFramePr>
               <a:graphicFrameLocks noChangeAspect="1"/>
@@ -7719,7 +7719,7 @@
               <a:graphicData uri="http://schemas.openxmlformats.org/drawingml/2006/picture">
                 <pic:pic>
                   <pic:nvPicPr>
-                    <pic:cNvPr id="0" name="fig5_benchmark_fa.png"/>
+                    <pic:cNvPr id="0" name="fig5_benchmark_comparison_bar.png"/>
                     <pic:cNvPicPr/>
                   </pic:nvPicPr>
                   <pic:blipFill>
@@ -7731,7 +7731,7 @@
                   <pic:spPr>
                     <a:xfrm>
                       <a:off x="0" y="0"/>
-                      <a:ext cx="2736000" cy="1022545"/>
+                      <a:ext cx="2736000" cy="2566937"/>
                     </a:xfrm>
                     <a:prstGeom prst="rect"/>
                   </pic:spPr>
@@ -15334,7 +15334,7 @@
       <w:r>
         <w:drawing>
           <wp:inline xmlns:a="http://schemas.openxmlformats.org/drawingml/2006/main" xmlns:pic="http://schemas.openxmlformats.org/drawingml/2006/picture">
-            <wp:extent cx="2736000" cy="1502873"/>
+            <wp:extent cx="2736000" cy="1906992"/>
             <wp:docPr id="5" name="Picture 5"/>
             <wp:cNvGraphicFramePr>
               <a:graphicFrameLocks noChangeAspect="1"/>
@@ -15343,7 +15343,7 @@
               <a:graphicData uri="http://schemas.openxmlformats.org/drawingml/2006/picture">
                 <pic:pic>
                   <pic:nvPicPr>
-                    <pic:cNvPr id="0" name="fig4_radar_fa.png"/>
+                    <pic:cNvPr id="0" name="fig4_radar_persona_profiles.png"/>
                     <pic:cNvPicPr/>
                   </pic:nvPicPr>
                   <pic:blipFill>
@@ -15355,7 +15355,7 @@
                   <pic:spPr>
                     <a:xfrm>
                       <a:off x="0" y="0"/>
-                      <a:ext cx="2736000" cy="1502873"/>
+                      <a:ext cx="2736000" cy="1906992"/>
                     </a:xfrm>
                     <a:prstGeom prst="rect"/>
                   </pic:spPr>

</xml_diff>

<commit_message>
Fix figure dimensions and overlaps
</commit_message>
<xml_diff>
--- a/FA_From_Transactional_Data_to_Organizational_Intelligence.docx
+++ b/FA_From_Transactional_Data_to_Organizational_Intelligence.docx
@@ -1333,7 +1333,7 @@
       <w:r>
         <w:drawing>
           <wp:inline xmlns:a="http://schemas.openxmlformats.org/drawingml/2006/main" xmlns:pic="http://schemas.openxmlformats.org/drawingml/2006/picture">
-            <wp:extent cx="2736000" cy="1174560"/>
+            <wp:extent cx="2736000" cy="679572"/>
             <wp:docPr id="1" name="Picture 1"/>
             <wp:cNvGraphicFramePr>
               <a:graphicFrameLocks noChangeAspect="1"/>
@@ -1354,7 +1354,7 @@
                   <pic:spPr>
                     <a:xfrm>
                       <a:off x="0" y="0"/>
-                      <a:ext cx="2736000" cy="1174560"/>
+                      <a:ext cx="2736000" cy="679572"/>
                     </a:xfrm>
                     <a:prstGeom prst="rect"/>
                   </pic:spPr>
@@ -3161,7 +3161,7 @@
       <w:r>
         <w:drawing>
           <wp:inline xmlns:a="http://schemas.openxmlformats.org/drawingml/2006/main" xmlns:pic="http://schemas.openxmlformats.org/drawingml/2006/picture">
-            <wp:extent cx="2736000" cy="2749663"/>
+            <wp:extent cx="2736000" cy="1440471"/>
             <wp:docPr id="2" name="Picture 2"/>
             <wp:cNvGraphicFramePr>
               <a:graphicFrameLocks noChangeAspect="1"/>
@@ -3182,7 +3182,7 @@
                   <pic:spPr>
                     <a:xfrm>
                       <a:off x="0" y="0"/>
-                      <a:ext cx="2736000" cy="2749663"/>
+                      <a:ext cx="2736000" cy="1440471"/>
                     </a:xfrm>
                     <a:prstGeom prst="rect"/>
                   </pic:spPr>
@@ -4871,7 +4871,7 @@
       <w:r>
         <w:drawing>
           <wp:inline xmlns:a="http://schemas.openxmlformats.org/drawingml/2006/main" xmlns:pic="http://schemas.openxmlformats.org/drawingml/2006/picture">
-            <wp:extent cx="2736000" cy="1869449"/>
+            <wp:extent cx="2736000" cy="1090470"/>
             <wp:docPr id="3" name="Picture 3"/>
             <wp:cNvGraphicFramePr>
               <a:graphicFrameLocks noChangeAspect="1"/>
@@ -4892,7 +4892,7 @@
                   <pic:spPr>
                     <a:xfrm>
                       <a:off x="0" y="0"/>
-                      <a:ext cx="2736000" cy="1869449"/>
+                      <a:ext cx="2736000" cy="1090470"/>
                     </a:xfrm>
                     <a:prstGeom prst="rect"/>
                   </pic:spPr>
@@ -7710,7 +7710,7 @@
       <w:r>
         <w:drawing>
           <wp:inline xmlns:a="http://schemas.openxmlformats.org/drawingml/2006/main" xmlns:pic="http://schemas.openxmlformats.org/drawingml/2006/picture">
-            <wp:extent cx="2736000" cy="2566937"/>
+            <wp:extent cx="2736000" cy="1331578"/>
             <wp:docPr id="4" name="Picture 4"/>
             <wp:cNvGraphicFramePr>
               <a:graphicFrameLocks noChangeAspect="1"/>
@@ -7731,7 +7731,7 @@
                   <pic:spPr>
                     <a:xfrm>
                       <a:off x="0" y="0"/>
-                      <a:ext cx="2736000" cy="2566937"/>
+                      <a:ext cx="2736000" cy="1331578"/>
                     </a:xfrm>
                     <a:prstGeom prst="rect"/>
                   </pic:spPr>
@@ -15334,7 +15334,7 @@
       <w:r>
         <w:drawing>
           <wp:inline xmlns:a="http://schemas.openxmlformats.org/drawingml/2006/main" xmlns:pic="http://schemas.openxmlformats.org/drawingml/2006/picture">
-            <wp:extent cx="2736000" cy="1906992"/>
+            <wp:extent cx="2736000" cy="1163870"/>
             <wp:docPr id="5" name="Picture 5"/>
             <wp:cNvGraphicFramePr>
               <a:graphicFrameLocks noChangeAspect="1"/>
@@ -15355,7 +15355,7 @@
                   <pic:spPr>
                     <a:xfrm>
                       <a:off x="0" y="0"/>
-                      <a:ext cx="2736000" cy="1906992"/>
+                      <a:ext cx="2736000" cy="1163870"/>
                     </a:xfrm>
                     <a:prstGeom prst="rect"/>
                   </pic:spPr>

</xml_diff>

<commit_message>
Fix Persian text in FA manuscript
</commit_message>
<xml_diff>
--- a/FA_From_Transactional_Data_to_Organizational_Intelligence.docx
+++ b/FA_From_Transactional_Data_to_Organizational_Intelligence.docx
@@ -1333,7 +1333,7 @@
       <w:r>
         <w:drawing>
           <wp:inline xmlns:a="http://schemas.openxmlformats.org/drawingml/2006/main" xmlns:pic="http://schemas.openxmlformats.org/drawingml/2006/picture">
-            <wp:extent cx="2736000" cy="679572"/>
+            <wp:extent cx="2736000" cy="1043223"/>
             <wp:docPr id="1" name="Picture 1"/>
             <wp:cNvGraphicFramePr>
               <a:graphicFrameLocks noChangeAspect="1"/>
@@ -1342,7 +1342,7 @@
               <a:graphicData uri="http://schemas.openxmlformats.org/drawingml/2006/picture">
                 <pic:pic>
                   <pic:nvPicPr>
-                    <pic:cNvPr id="0" name="fig1_framework_architecture.png"/>
+                    <pic:cNvPr id="0" name="fig1_architecture_fa.png"/>
                     <pic:cNvPicPr/>
                   </pic:nvPicPr>
                   <pic:blipFill>
@@ -1354,7 +1354,7 @@
                   <pic:spPr>
                     <a:xfrm>
                       <a:off x="0" y="0"/>
-                      <a:ext cx="2736000" cy="679572"/>
+                      <a:ext cx="2736000" cy="1043223"/>
                     </a:xfrm>
                     <a:prstGeom prst="rect"/>
                   </pic:spPr>
@@ -3170,7 +3170,7 @@
               <a:graphicData uri="http://schemas.openxmlformats.org/drawingml/2006/picture">
                 <pic:pic>
                   <pic:nvPicPr>
-                    <pic:cNvPr id="0" name="fig2_graph_topology_communities.png"/>
+                    <pic:cNvPr id="0" name="fig2_topology_fa.png"/>
                     <pic:cNvPicPr/>
                   </pic:nvPicPr>
                   <pic:blipFill>
@@ -4871,7 +4871,7 @@
       <w:r>
         <w:drawing>
           <wp:inline xmlns:a="http://schemas.openxmlformats.org/drawingml/2006/main" xmlns:pic="http://schemas.openxmlformats.org/drawingml/2006/picture">
-            <wp:extent cx="2736000" cy="1090470"/>
+            <wp:extent cx="2736000" cy="1034221"/>
             <wp:docPr id="3" name="Picture 3"/>
             <wp:cNvGraphicFramePr>
               <a:graphicFrameLocks noChangeAspect="1"/>
@@ -4880,7 +4880,7 @@
               <a:graphicData uri="http://schemas.openxmlformats.org/drawingml/2006/picture">
                 <pic:pic>
                   <pic:nvPicPr>
-                    <pic:cNvPr id="0" name="fig3_latent_tsne_comparison.png"/>
+                    <pic:cNvPr id="0" name="fig3_guild_heatmap_fa.png"/>
                     <pic:cNvPicPr/>
                   </pic:nvPicPr>
                   <pic:blipFill>
@@ -4892,7 +4892,7 @@
                   <pic:spPr>
                     <a:xfrm>
                       <a:off x="0" y="0"/>
-                      <a:ext cx="2736000" cy="1090470"/>
+                      <a:ext cx="2736000" cy="1034221"/>
                     </a:xfrm>
                     <a:prstGeom prst="rect"/>
                   </pic:spPr>
@@ -7710,7 +7710,7 @@
       <w:r>
         <w:drawing>
           <wp:inline xmlns:a="http://schemas.openxmlformats.org/drawingml/2006/main" xmlns:pic="http://schemas.openxmlformats.org/drawingml/2006/picture">
-            <wp:extent cx="2736000" cy="1331578"/>
+            <wp:extent cx="2736000" cy="1325751"/>
             <wp:docPr id="4" name="Picture 4"/>
             <wp:cNvGraphicFramePr>
               <a:graphicFrameLocks noChangeAspect="1"/>
@@ -7719,7 +7719,7 @@
               <a:graphicData uri="http://schemas.openxmlformats.org/drawingml/2006/picture">
                 <pic:pic>
                   <pic:nvPicPr>
-                    <pic:cNvPr id="0" name="fig5_benchmark_comparison_bar.png"/>
+                    <pic:cNvPr id="0" name="fig5_benchmark_fa.png"/>
                     <pic:cNvPicPr/>
                   </pic:nvPicPr>
                   <pic:blipFill>
@@ -7731,7 +7731,7 @@
                   <pic:spPr>
                     <a:xfrm>
                       <a:off x="0" y="0"/>
-                      <a:ext cx="2736000" cy="1331578"/>
+                      <a:ext cx="2736000" cy="1325751"/>
                     </a:xfrm>
                     <a:prstGeom prst="rect"/>
                   </pic:spPr>
@@ -15334,7 +15334,7 @@
       <w:r>
         <w:drawing>
           <wp:inline xmlns:a="http://schemas.openxmlformats.org/drawingml/2006/main" xmlns:pic="http://schemas.openxmlformats.org/drawingml/2006/picture">
-            <wp:extent cx="2736000" cy="1163870"/>
+            <wp:extent cx="2736000" cy="1167845"/>
             <wp:docPr id="5" name="Picture 5"/>
             <wp:cNvGraphicFramePr>
               <a:graphicFrameLocks noChangeAspect="1"/>
@@ -15343,7 +15343,7 @@
               <a:graphicData uri="http://schemas.openxmlformats.org/drawingml/2006/picture">
                 <pic:pic>
                   <pic:nvPicPr>
-                    <pic:cNvPr id="0" name="fig4_radar_persona_profiles.png"/>
+                    <pic:cNvPr id="0" name="fig4_radar_fa.png"/>
                     <pic:cNvPicPr/>
                   </pic:nvPicPr>
                   <pic:blipFill>
@@ -15355,7 +15355,7 @@
                   <pic:spPr>
                     <a:xfrm>
                       <a:off x="0" y="0"/>
-                      <a:ext cx="2736000" cy="1163870"/>
+                      <a:ext cx="2736000" cy="1167845"/>
                     </a:xfrm>
                     <a:prstGeom prst="rect"/>
                   </pic:spPr>

</xml_diff>

<commit_message>
Fix Persian text shaping, encoding, and RTL alignment in figures
</commit_message>
<xml_diff>
--- a/FA_From_Transactional_Data_to_Organizational_Intelligence.docx
+++ b/FA_From_Transactional_Data_to_Organizational_Intelligence.docx
@@ -1333,7 +1333,7 @@
       <w:r>
         <w:drawing>
           <wp:inline xmlns:a="http://schemas.openxmlformats.org/drawingml/2006/main" xmlns:pic="http://schemas.openxmlformats.org/drawingml/2006/picture">
-            <wp:extent cx="2736000" cy="1043223"/>
+            <wp:extent cx="2736000" cy="727501"/>
             <wp:docPr id="1" name="Picture 1"/>
             <wp:cNvGraphicFramePr>
               <a:graphicFrameLocks noChangeAspect="1"/>
@@ -1354,7 +1354,7 @@
                   <pic:spPr>
                     <a:xfrm>
                       <a:off x="0" y="0"/>
-                      <a:ext cx="2736000" cy="1043223"/>
+                      <a:ext cx="2736000" cy="727501"/>
                     </a:xfrm>
                     <a:prstGeom prst="rect"/>
                   </pic:spPr>
@@ -3161,7 +3161,7 @@
       <w:r>
         <w:drawing>
           <wp:inline xmlns:a="http://schemas.openxmlformats.org/drawingml/2006/main" xmlns:pic="http://schemas.openxmlformats.org/drawingml/2006/picture">
-            <wp:extent cx="2736000" cy="1440471"/>
+            <wp:extent cx="2736000" cy="1493117"/>
             <wp:docPr id="2" name="Picture 2"/>
             <wp:cNvGraphicFramePr>
               <a:graphicFrameLocks noChangeAspect="1"/>
@@ -3182,7 +3182,7 @@
                   <pic:spPr>
                     <a:xfrm>
                       <a:off x="0" y="0"/>
-                      <a:ext cx="2736000" cy="1440471"/>
+                      <a:ext cx="2736000" cy="1493117"/>
                     </a:xfrm>
                     <a:prstGeom prst="rect"/>
                   </pic:spPr>
@@ -4871,7 +4871,7 @@
       <w:r>
         <w:drawing>
           <wp:inline xmlns:a="http://schemas.openxmlformats.org/drawingml/2006/main" xmlns:pic="http://schemas.openxmlformats.org/drawingml/2006/picture">
-            <wp:extent cx="2736000" cy="1034221"/>
+            <wp:extent cx="2736000" cy="1060712"/>
             <wp:docPr id="3" name="Picture 3"/>
             <wp:cNvGraphicFramePr>
               <a:graphicFrameLocks noChangeAspect="1"/>
@@ -4892,7 +4892,7 @@
                   <pic:spPr>
                     <a:xfrm>
                       <a:off x="0" y="0"/>
-                      <a:ext cx="2736000" cy="1034221"/>
+                      <a:ext cx="2736000" cy="1060712"/>
                     </a:xfrm>
                     <a:prstGeom prst="rect"/>
                   </pic:spPr>
@@ -7710,7 +7710,7 @@
       <w:r>
         <w:drawing>
           <wp:inline xmlns:a="http://schemas.openxmlformats.org/drawingml/2006/main" xmlns:pic="http://schemas.openxmlformats.org/drawingml/2006/picture">
-            <wp:extent cx="2736000" cy="1325751"/>
+            <wp:extent cx="2736000" cy="1442913"/>
             <wp:docPr id="4" name="Picture 4"/>
             <wp:cNvGraphicFramePr>
               <a:graphicFrameLocks noChangeAspect="1"/>
@@ -7731,7 +7731,7 @@
                   <pic:spPr>
                     <a:xfrm>
                       <a:off x="0" y="0"/>
-                      <a:ext cx="2736000" cy="1325751"/>
+                      <a:ext cx="2736000" cy="1442913"/>
                     </a:xfrm>
                     <a:prstGeom prst="rect"/>
                   </pic:spPr>
@@ -15334,7 +15334,7 @@
       <w:r>
         <w:drawing>
           <wp:inline xmlns:a="http://schemas.openxmlformats.org/drawingml/2006/main" xmlns:pic="http://schemas.openxmlformats.org/drawingml/2006/picture">
-            <wp:extent cx="2736000" cy="1167845"/>
+            <wp:extent cx="2736000" cy="1253936"/>
             <wp:docPr id="5" name="Picture 5"/>
             <wp:cNvGraphicFramePr>
               <a:graphicFrameLocks noChangeAspect="1"/>
@@ -15355,7 +15355,7 @@
                   <pic:spPr>
                     <a:xfrm>
                       <a:off x="0" y="0"/>
-                      <a:ext cx="2736000" cy="1167845"/>
+                      <a:ext cx="2736000" cy="1253936"/>
                     </a:xfrm>
                     <a:prstGeom prst="rect"/>
                   </pic:spPr>

</xml_diff>

<commit_message>
style(manuscript-fa): isolate math formulas and Latin expressions into standalone left-aligned lines
- Introduce Builder.formula_line to emit standalone, unnumbered LTR left-aligned lines
- Remove inline formulas from Persian text paragraphs across Sections 3.1-3.7 and 5.6
- Ensure formula lines contain zero Persian characters to eliminate BiDi text scrambling
- Align numbered equations strictly left in their table cell
- Rebuild FA_From_Transactional_Data_to_Organizational_Intelligence.docx cleanly
</commit_message>
<xml_diff>
--- a/FA_From_Transactional_Data_to_Organizational_Intelligence.docx
+++ b/FA_From_Transactional_Data_to_Organizational_Intelligence.docx
@@ -1796,169 +1796,73 @@
           <w:rtl/>
           <w:szCs w:val="18"/>
         </w:rPr>
-        <w:t xml:space="preserve">دفتر کل تراکنش‌ها به صورت دنباله‌ای از رویدادها </w:t>
-      </w:r>
-      <w:r>
-        <w:rPr>
-          <w:rFonts w:ascii="Times New Roman" w:hAnsi="Times New Roman" w:cs="Times New Roman"/>
-          <w:bidi w:val="0"/>
-          <w:sz w:val="17"/>
-          <w:szCs w:val="17"/>
-        </w:rPr>
-        <w:t>L</w:t>
-      </w:r>
-      <w:r>
-        <w:rPr>
-          <w:rFonts w:hint="cs" w:ascii="B Mitra" w:hAnsi="B Mitra" w:cs="B Mitra"/>
-          <w:sz w:val="18"/>
-          <w:rtl/>
-          <w:szCs w:val="18"/>
-        </w:rPr>
-        <w:t xml:space="preserve"> = {</w:t>
-      </w:r>
-      <w:r>
-        <w:rPr>
-          <w:rFonts w:ascii="Times New Roman" w:hAnsi="Times New Roman" w:cs="Times New Roman"/>
-          <w:bidi w:val="0"/>
-          <w:sz w:val="17"/>
-          <w:szCs w:val="17"/>
-        </w:rPr>
-        <w:t>e_1</w:t>
-      </w:r>
-      <w:r>
-        <w:rPr>
-          <w:rFonts w:hint="cs" w:ascii="B Mitra" w:hAnsi="B Mitra" w:cs="B Mitra"/>
-          <w:sz w:val="18"/>
-          <w:rtl/>
-          <w:szCs w:val="18"/>
-        </w:rPr>
-        <w:t xml:space="preserve">, ..., </w:t>
-      </w:r>
-      <w:r>
-        <w:rPr>
-          <w:rFonts w:ascii="Times New Roman" w:hAnsi="Times New Roman" w:cs="Times New Roman"/>
-          <w:bidi w:val="0"/>
-          <w:sz w:val="17"/>
-          <w:szCs w:val="17"/>
-        </w:rPr>
-        <w:t>e_N</w:t>
-      </w:r>
-      <w:r>
-        <w:rPr>
-          <w:rFonts w:hint="cs" w:ascii="B Mitra" w:hAnsi="B Mitra" w:cs="B Mitra"/>
-          <w:sz w:val="18"/>
-          <w:rtl/>
-          <w:szCs w:val="18"/>
-        </w:rPr>
-        <w:t xml:space="preserve">} تعریف می‌شود که در آن هر رویداد شامل پنج فیلد استاندارد است: </w:t>
-      </w:r>
-      <w:r>
-        <w:rPr>
-          <w:rFonts w:ascii="Times New Roman" w:hAnsi="Times New Roman" w:cs="Times New Roman"/>
-          <w:bidi w:val="0"/>
-          <w:sz w:val="17"/>
-          <w:szCs w:val="17"/>
-        </w:rPr>
-        <w:t>e_k</w:t>
-      </w:r>
-      <w:r>
-        <w:rPr>
-          <w:rFonts w:hint="cs" w:ascii="B Mitra" w:hAnsi="B Mitra" w:cs="B Mitra"/>
-          <w:sz w:val="18"/>
-          <w:rtl/>
-          <w:szCs w:val="18"/>
-        </w:rPr>
-        <w:t xml:space="preserve"> = (</w:t>
-      </w:r>
-      <w:r>
-        <w:rPr>
-          <w:rFonts w:ascii="Times New Roman" w:hAnsi="Times New Roman" w:cs="Times New Roman"/>
-          <w:bidi w:val="0"/>
-          <w:sz w:val="17"/>
-          <w:szCs w:val="17"/>
-        </w:rPr>
-        <w:t>pan_k</w:t>
-      </w:r>
-      <w:r>
-        <w:rPr>
-          <w:rFonts w:hint="cs" w:ascii="B Mitra" w:hAnsi="B Mitra" w:cs="B Mitra"/>
-          <w:sz w:val="18"/>
-          <w:rtl/>
-          <w:szCs w:val="18"/>
-        </w:rPr>
-        <w:t xml:space="preserve">, </w:t>
-      </w:r>
-      <w:r>
-        <w:rPr>
-          <w:rFonts w:ascii="Times New Roman" w:hAnsi="Times New Roman" w:cs="Times New Roman"/>
-          <w:bidi w:val="0"/>
-          <w:sz w:val="17"/>
-          <w:szCs w:val="17"/>
-        </w:rPr>
-        <w:t>amount_k</w:t>
-      </w:r>
-      <w:r>
-        <w:rPr>
-          <w:rFonts w:hint="cs" w:ascii="B Mitra" w:hAnsi="B Mitra" w:cs="B Mitra"/>
-          <w:sz w:val="18"/>
-          <w:rtl/>
-          <w:szCs w:val="18"/>
-        </w:rPr>
-        <w:t xml:space="preserve">, </w:t>
-      </w:r>
-      <w:r>
-        <w:rPr>
-          <w:rFonts w:ascii="Times New Roman" w:hAnsi="Times New Roman" w:cs="Times New Roman"/>
-          <w:bidi w:val="0"/>
-          <w:sz w:val="17"/>
-          <w:szCs w:val="17"/>
-        </w:rPr>
-        <w:t>merchant_id_k</w:t>
-      </w:r>
-      <w:r>
-        <w:rPr>
-          <w:rFonts w:hint="cs" w:ascii="B Mitra" w:hAnsi="B Mitra" w:cs="B Mitra"/>
-          <w:sz w:val="18"/>
-          <w:rtl/>
-          <w:szCs w:val="18"/>
-        </w:rPr>
-        <w:t xml:space="preserve">, </w:t>
-      </w:r>
-      <w:r>
-        <w:rPr>
-          <w:rFonts w:ascii="Times New Roman" w:hAnsi="Times New Roman" w:cs="Times New Roman"/>
-          <w:bidi w:val="0"/>
-          <w:sz w:val="17"/>
-          <w:szCs w:val="17"/>
-        </w:rPr>
-        <w:t>create_date_k</w:t>
-      </w:r>
-      <w:r>
-        <w:rPr>
-          <w:rFonts w:hint="cs" w:ascii="B Mitra" w:hAnsi="B Mitra" w:cs="B Mitra"/>
-          <w:sz w:val="18"/>
-          <w:rtl/>
-          <w:szCs w:val="18"/>
-        </w:rPr>
-        <w:t xml:space="preserve">, </w:t>
-      </w:r>
-      <w:r>
-        <w:rPr>
-          <w:rFonts w:ascii="Times New Roman" w:hAnsi="Times New Roman" w:cs="Times New Roman"/>
-          <w:bidi w:val="0"/>
-          <w:sz w:val="17"/>
-          <w:szCs w:val="17"/>
-        </w:rPr>
-        <w:t>cast_name_k</w:t>
-      </w:r>
-      <w:r>
-        <w:rPr>
-          <w:rFonts w:hint="cs" w:ascii="B Mitra" w:hAnsi="B Mitra" w:cs="B Mitra"/>
-          <w:sz w:val="18"/>
-          <w:rtl/>
-          <w:szCs w:val="18"/>
-        </w:rPr>
-        <w:t xml:space="preserve">). شناسه </w:t>
+        <w:t>دفتر کل تراکنش‌ها به صورت دنباله‌ای از رویدادها</w:t>
+      </w:r>
+    </w:p>
+    <w:p>
+      <w:pPr>
+        <w:pStyle w:val="FigureText"/>
+        <w:spacing w:before="24" w:after="24" w:line="228" w:lineRule="auto"/>
+        <w:ind w:left="170"/>
+        <w:jc w:val="left"/>
+        <w:bidi w:val="0"/>
+      </w:pPr>
+      <w:r>
+        <w:rPr>
+          <w:rFonts w:ascii="Times New Roman" w:hAnsi="Times New Roman" w:cs="Times New Roman"/>
+          <w:bidi w:val="0"/>
+          <w:sz w:val="17"/>
+          <w:szCs w:val="17"/>
+        </w:rPr>
+        <w:t>L = { e_1, ..., e_N }</w:t>
+      </w:r>
+    </w:p>
+    <w:p>
+      <w:pPr>
+        <w:pStyle w:val="Text"/>
+        <w:spacing w:before="0" w:after="20" w:line="226" w:lineRule="auto"/>
+      </w:pPr>
+      <w:r>
+        <w:rPr>
+          <w:rFonts w:hint="cs" w:ascii="B Mitra" w:hAnsi="B Mitra" w:cs="B Mitra"/>
+          <w:sz w:val="18"/>
+          <w:rtl/>
+          <w:szCs w:val="18"/>
+        </w:rPr>
+        <w:t>تعریف می‌شود که در آن هر رویداد شامل پنج فیلد استاندارد است:</w:t>
+      </w:r>
+    </w:p>
+    <w:p>
+      <w:pPr>
+        <w:pStyle w:val="FigureText"/>
+        <w:spacing w:before="24" w:after="24" w:line="228" w:lineRule="auto"/>
+        <w:ind w:left="170"/>
+        <w:jc w:val="left"/>
+        <w:bidi w:val="0"/>
+      </w:pPr>
+      <w:r>
+        <w:rPr>
+          <w:rFonts w:ascii="Times New Roman" w:hAnsi="Times New Roman" w:cs="Times New Roman"/>
+          <w:bidi w:val="0"/>
+          <w:sz w:val="17"/>
+          <w:szCs w:val="17"/>
+        </w:rPr>
+        <w:t>e_k = &lt;pan_k, amount_k, merchant_id_k, create_date_k, cast_name_k&gt;</w:t>
+      </w:r>
+    </w:p>
+    <w:p>
+      <w:pPr>
+        <w:pStyle w:val="Text"/>
+        <w:spacing w:before="0" w:after="20" w:line="226" w:lineRule="auto"/>
+      </w:pPr>
+      <w:r>
+        <w:rPr>
+          <w:rFonts w:hint="cs" w:ascii="B Mitra" w:hAnsi="B Mitra" w:cs="B Mitra"/>
+          <w:sz w:val="18"/>
+          <w:rtl/>
+          <w:szCs w:val="18"/>
+        </w:rPr>
+        <w:t xml:space="preserve">شناسه </w:t>
       </w:r>
       <w:r>
         <w:rPr>
@@ -1994,8 +1898,17 @@
           <w:rtl/>
           <w:szCs w:val="18"/>
         </w:rPr>
-        <w:t xml:space="preserve"> است. از همین پنج فیلد پایه و بدون نیاز به متغیرهای خارجی، بردار ویژگی ۱۶بُعدی گره پذیرنده </w:t>
-      </w:r>
+        <w:t xml:space="preserve"> است. از همین پنج فیلد پایه و بدون نیاز به متغیرهای خارجی، بردار ویژگی ۱۶بُعدی گره پذیرنده به صورت زیر ساخته می‌شود:</w:t>
+      </w:r>
+    </w:p>
+    <w:p>
+      <w:pPr>
+        <w:pStyle w:val="FigureText"/>
+        <w:spacing w:before="24" w:after="24" w:line="228" w:lineRule="auto"/>
+        <w:ind w:left="170"/>
+        <w:jc w:val="left"/>
+        <w:bidi w:val="0"/>
+      </w:pPr>
       <w:r>
         <w:rPr>
           <w:rFonts w:ascii="Times New Roman" w:hAnsi="Times New Roman" w:cs="Times New Roman"/>
@@ -2012,91 +1925,67 @@
           <w:rFonts w:ascii="Times New Roman" w:hAnsi="Times New Roman" w:cs="Times New Roman"/>
           <w:bidi w:val="0"/>
           <w:sz w:val="17"/>
-          <w:vertAlign w:val="subscript"/>
-          <w:szCs w:val="17"/>
-        </w:rPr>
-        <w:t>m, t</w:t>
-      </w:r>
-      <w:r>
-        <w:rPr>
-          <w:rFonts w:hint="cs" w:ascii="B Mitra" w:hAnsi="B Mitra" w:cs="B Mitra"/>
-          <w:sz w:val="18"/>
-          <w:rtl/>
-          <w:szCs w:val="18"/>
-        </w:rPr>
-        <w:t xml:space="preserve"> ∈ ℝ¹⁶ ساخته می‌شود: (۱ تا ۴) وقفه‌های زمانی حجم تراکنش (لگاریتم تراکنش‌های دوره‌های </w:t>
-      </w:r>
-      <w:r>
-        <w:rPr>
-          <w:rFonts w:ascii="Times New Roman" w:hAnsi="Times New Roman" w:cs="Times New Roman"/>
-          <w:bidi w:val="0"/>
-          <w:sz w:val="17"/>
-          <w:szCs w:val="17"/>
-        </w:rPr>
-        <w:t>t-1</w:t>
-      </w:r>
-      <w:r>
-        <w:rPr>
-          <w:rFonts w:hint="cs" w:ascii="B Mitra" w:hAnsi="B Mitra" w:cs="B Mitra"/>
-          <w:sz w:val="18"/>
-          <w:rtl/>
-          <w:szCs w:val="18"/>
-        </w:rPr>
-        <w:t xml:space="preserve">، </w:t>
-      </w:r>
-      <w:r>
-        <w:rPr>
-          <w:rFonts w:ascii="Times New Roman" w:hAnsi="Times New Roman" w:cs="Times New Roman"/>
-          <w:bidi w:val="0"/>
-          <w:sz w:val="17"/>
-          <w:szCs w:val="17"/>
-        </w:rPr>
-        <w:t>t-2</w:t>
-      </w:r>
-      <w:r>
-        <w:rPr>
-          <w:rFonts w:hint="cs" w:ascii="B Mitra" w:hAnsi="B Mitra" w:cs="B Mitra"/>
-          <w:sz w:val="18"/>
-          <w:rtl/>
-          <w:szCs w:val="18"/>
-        </w:rPr>
-        <w:t xml:space="preserve">، </w:t>
-      </w:r>
-      <w:r>
-        <w:rPr>
-          <w:rFonts w:ascii="Times New Roman" w:hAnsi="Times New Roman" w:cs="Times New Roman"/>
-          <w:bidi w:val="0"/>
-          <w:sz w:val="17"/>
-          <w:szCs w:val="17"/>
-        </w:rPr>
-        <w:t>t-3</w:t>
-      </w:r>
-      <w:r>
-        <w:rPr>
-          <w:rFonts w:hint="cs" w:ascii="B Mitra" w:hAnsi="B Mitra" w:cs="B Mitra"/>
-          <w:sz w:val="18"/>
-          <w:rtl/>
-          <w:szCs w:val="18"/>
-        </w:rPr>
-        <w:t xml:space="preserve"> و میانگین وقفه همسایگان)؛ (۵ تا ۷) شاخص‌های مقیاس مالی استخراج‌شده از مبلغ تراکنش شامل لگاریتم حجم کل، میانگین مبلغ و انحراف معیار مبلغ؛ (۸) وسعت تعاملات مشتریان یکتا (تعداد کارت‌های متمایز پوشش‌داده‌شده)؛ و (۹ تا ۱۶) بردار وان‌هات نشانگر صنف اقتصادی در میان ۸ صنف تجاری. مسیر وابستگی ویژگی‌ها اکیداً علّی است: ۵ فیلد پایه دفتر کل → ساخت گراف همتایان تاریخی → تجمیع وقفه همتایان → شبکه عصبی گراف زمانی در زمان </w:t>
-      </w:r>
-      <w:r>
-        <w:rPr>
-          <w:rFonts w:ascii="Times New Roman" w:hAnsi="Times New Roman" w:cs="Times New Roman"/>
-          <w:bidi w:val="0"/>
-          <w:sz w:val="17"/>
-          <w:szCs w:val="17"/>
-        </w:rPr>
-        <w:t>t</w:t>
-      </w:r>
-      <w:r>
-        <w:rPr>
-          <w:rFonts w:hint="cs" w:ascii="B Mitra" w:hAnsi="B Mitra" w:cs="B Mitra"/>
-          <w:sz w:val="18"/>
-          <w:rtl/>
-          <w:szCs w:val="18"/>
-        </w:rPr>
-        <w:t xml:space="preserve">، که از نشت اطلاعات آینده ممانعت می‌کند. هدف مسئله در سطح هر پذیرنده </w:t>
+          <w:szCs w:val="17"/>
+        </w:rPr>
+        <w:t>_{m, t} ∈ ℝ</w:t>
+      </w:r>
+      <w:r>
+        <w:rPr>
+          <w:rFonts w:ascii="Times New Roman" w:hAnsi="Times New Roman" w:cs="Times New Roman"/>
+          <w:bidi w:val="0"/>
+          <w:sz w:val="17"/>
+          <w:szCs w:val="17"/>
+          <w:vertAlign w:val="superscript"/>
+        </w:rPr>
+        <w:t>16</w:t>
+      </w:r>
+    </w:p>
+    <w:p>
+      <w:pPr>
+        <w:pStyle w:val="Text"/>
+        <w:spacing w:before="0" w:after="20" w:line="226" w:lineRule="auto"/>
+      </w:pPr>
+      <w:r>
+        <w:rPr>
+          <w:rFonts w:hint="cs" w:ascii="B Mitra" w:hAnsi="B Mitra" w:cs="B Mitra"/>
+          <w:sz w:val="18"/>
+          <w:rtl/>
+          <w:szCs w:val="18"/>
+        </w:rPr>
+        <w:t>مؤلفه‌های این بردار شامل: (۱ تا ۴) وقفه‌های زمانی حجم تراکنش (لگاریتم تراکنش‌های دوره‌های پیشین و میانگین وقفه همسایگان)؛ (۵ تا ۷) شاخص‌های مقیاس مالی استخراج‌شده از مبلغ تراکنش شامل لگاریتم حجم کل، میانگین و انحراف معیار مبلغ؛ (۸) وسعت تعاملات مشتریان یکتا (تعداد کارت‌های متمایز)؛ و (۹ تا ۱۶) بردار وان‌هات نشانگر صنف اقتصادی در میان ۸ صنف تجاری. مسیر وابستگی ویژگی‌ها اکیداً علّی است:</w:t>
+      </w:r>
+    </w:p>
+    <w:p>
+      <w:pPr>
+        <w:pStyle w:val="FigureText"/>
+        <w:spacing w:before="24" w:after="24" w:line="228" w:lineRule="auto"/>
+        <w:ind w:left="170"/>
+        <w:jc w:val="left"/>
+        <w:bidi w:val="0"/>
+      </w:pPr>
+      <w:r>
+        <w:rPr>
+          <w:rFonts w:ascii="Times New Roman" w:hAnsi="Times New Roman" w:cs="Times New Roman"/>
+          <w:bidi w:val="0"/>
+          <w:sz w:val="17"/>
+          <w:szCs w:val="17"/>
+        </w:rPr>
+        <w:t>5 Raw Ledger Fields → Historical Peer Graph → Peer Lag Aggregation → Temporal GNN (time t)</w:t>
+      </w:r>
+    </w:p>
+    <w:p>
+      <w:pPr>
+        <w:pStyle w:val="Text"/>
+        <w:spacing w:before="0" w:after="20" w:line="226" w:lineRule="auto"/>
+      </w:pPr>
+      <w:r>
+        <w:rPr>
+          <w:rFonts w:hint="cs" w:ascii="B Mitra" w:hAnsi="B Mitra" w:cs="B Mitra"/>
+          <w:sz w:val="18"/>
+          <w:rtl/>
+          <w:szCs w:val="18"/>
+        </w:rPr>
+        <w:t xml:space="preserve">هدف مسئله در سطح هر پذیرنده </w:t>
       </w:r>
       <w:r>
         <w:rPr>
@@ -2132,8 +2021,17 @@
           <w:rtl/>
           <w:szCs w:val="18"/>
         </w:rPr>
-        <w:t xml:space="preserve">، پیش‌بینی تعداد تراکنش دوره آتی </w:t>
-      </w:r>
+        <w:t>، پیش‌بینی تعداد تراکنش دوره آتی و تعیین شکاف فرصت ساختاری آن نسبت به بنچ‌مارک محافظه‌کارانه همتایان است:</w:t>
+      </w:r>
+    </w:p>
+    <w:p>
+      <w:pPr>
+        <w:pStyle w:val="FigureText"/>
+        <w:spacing w:before="24" w:after="24" w:line="228" w:lineRule="auto"/>
+        <w:ind w:left="170"/>
+        <w:jc w:val="left"/>
+        <w:bidi w:val="0"/>
+      </w:pPr>
       <w:r>
         <w:rPr>
           <w:rFonts w:ascii="Times New Roman" w:hAnsi="Times New Roman" w:cs="Times New Roman"/>
@@ -2150,55 +2048,19 @@
           <w:rFonts w:ascii="Times New Roman" w:hAnsi="Times New Roman" w:cs="Times New Roman"/>
           <w:bidi w:val="0"/>
           <w:sz w:val="17"/>
+          <w:szCs w:val="17"/>
+        </w:rPr>
+        <w:t>_{m, t+1} ∈ ℕ</w:t>
+      </w:r>
+      <w:r>
+        <w:rPr>
+          <w:rFonts w:ascii="Times New Roman" w:hAnsi="Times New Roman" w:cs="Times New Roman"/>
+          <w:bidi w:val="0"/>
+          <w:sz w:val="17"/>
+          <w:szCs w:val="17"/>
           <w:vertAlign w:val="subscript"/>
-          <w:szCs w:val="17"/>
-        </w:rPr>
-        <w:t>m, t+1</w:t>
-      </w:r>
-      <w:r>
-        <w:rPr>
-          <w:rFonts w:hint="cs" w:ascii="B Mitra" w:hAnsi="B Mitra" w:cs="B Mitra"/>
-          <w:sz w:val="18"/>
-          <w:rtl/>
-          <w:szCs w:val="18"/>
-        </w:rPr>
-        <w:t xml:space="preserve"> ∈ ℕ_</w:t>
-      </w:r>
-      <w:r>
-        <w:rPr>
-          <w:rFonts w:ascii="Times New Roman" w:hAnsi="Times New Roman" w:cs="Times New Roman"/>
-          <w:bidi w:val="0"/>
-          <w:sz w:val="17"/>
-          <w:szCs w:val="17"/>
         </w:rPr>
         <w:t>0</w:t>
-      </w:r>
-      <w:r>
-        <w:rPr>
-          <w:rFonts w:hint="cs" w:ascii="B Mitra" w:hAnsi="B Mitra" w:cs="B Mitra"/>
-          <w:sz w:val="18"/>
-          <w:rtl/>
-          <w:szCs w:val="18"/>
-        </w:rPr>
-        <w:t xml:space="preserve"> و تعیین شکاف فرصت ساختاری آن نسبت به بنچ‌مارک محافظه‌کارانه همتایان </w:t>
-      </w:r>
-      <w:r>
-        <w:rPr>
-          <w:rFonts w:ascii="Times New Roman" w:hAnsi="Times New Roman" w:cs="Times New Roman"/>
-          <w:bidi w:val="0"/>
-          <w:sz w:val="17"/>
-          <w:szCs w:val="17"/>
-        </w:rPr>
-        <w:t>B</w:t>
-      </w:r>
-      <w:r>
-        <w:rPr>
-          <w:rFonts w:hint="cs" w:ascii="B Mitra" w:hAnsi="B Mitra" w:cs="B Mitra"/>
-          <w:sz w:val="18"/>
-          <w:rtl/>
-          <w:szCs w:val="18"/>
-        </w:rPr>
-        <w:t>^</w:t>
       </w:r>
       <w:r>
         <w:rPr>
@@ -2209,26 +2071,16 @@
           <w:sz w:val="17"/>
           <w:szCs w:val="17"/>
         </w:rPr>
-        <w:t>G</w:t>
-      </w:r>
-      <w:r>
-        <w:rPr>
-          <w:rFonts w:ascii="Times New Roman" w:hAnsi="Times New Roman" w:cs="Times New Roman"/>
-          <w:bidi w:val="0"/>
-          <w:sz w:val="17"/>
-          <w:vertAlign w:val="subscript"/>
-          <w:szCs w:val="17"/>
-        </w:rPr>
-        <w:t>m, t+1</w:t>
-      </w:r>
-      <w:r>
-        <w:rPr>
-          <w:rFonts w:hint="cs" w:ascii="B Mitra" w:hAnsi="B Mitra" w:cs="B Mitra"/>
-          <w:sz w:val="18"/>
-          <w:rtl/>
-          <w:szCs w:val="18"/>
-        </w:rPr>
-        <w:t xml:space="preserve"> است.</w:t>
+        <w:t>,   B</w:t>
+      </w:r>
+      <w:r>
+        <w:rPr>
+          <w:rFonts w:ascii="Times New Roman" w:hAnsi="Times New Roman" w:cs="Times New Roman"/>
+          <w:bidi w:val="0"/>
+          <w:sz w:val="17"/>
+          <w:szCs w:val="17"/>
+        </w:rPr>
+        <w:t>^G_{m, t+1}</w:t>
       </w:r>
     </w:p>
     <w:p>
@@ -2285,173 +2137,109 @@
           <w:rtl/>
           <w:szCs w:val="18"/>
         </w:rPr>
-        <w:t xml:space="preserve">، تراکنش‌ها در قالب گراف دوبخشی </w:t>
-      </w:r>
-      <w:r>
-        <w:rPr>
-          <w:rFonts w:ascii="Times New Roman" w:hAnsi="Times New Roman" w:cs="Times New Roman"/>
-          <w:bidi w:val="0"/>
-          <w:sz w:val="17"/>
-          <w:szCs w:val="17"/>
-        </w:rPr>
-        <w:t>G</w:t>
-      </w:r>
-      <w:r>
-        <w:rPr>
-          <w:rFonts w:hint="cs" w:ascii="B Mitra" w:hAnsi="B Mitra" w:cs="B Mitra"/>
-          <w:sz w:val="18"/>
-          <w:rtl/>
-          <w:szCs w:val="18"/>
-        </w:rPr>
-        <w:t>^(</w:t>
-      </w:r>
-      <w:r>
-        <w:rPr>
-          <w:rFonts w:ascii="Times New Roman" w:hAnsi="Times New Roman" w:cs="Times New Roman"/>
-          <w:bidi w:val="0"/>
-          <w:sz w:val="17"/>
-          <w:szCs w:val="17"/>
-        </w:rPr>
-        <w:t>B</w:t>
-      </w:r>
-      <w:r>
-        <w:rPr>
-          <w:rFonts w:hint="cs" w:ascii="B Mitra" w:hAnsi="B Mitra" w:cs="B Mitra"/>
-          <w:sz w:val="18"/>
-          <w:rtl/>
-          <w:szCs w:val="18"/>
-        </w:rPr>
-        <w:t>)_</w:t>
-      </w:r>
-      <w:r>
-        <w:rPr>
-          <w:rFonts w:ascii="Times New Roman" w:hAnsi="Times New Roman" w:cs="Times New Roman"/>
-          <w:bidi w:val="0"/>
-          <w:sz w:val="17"/>
-          <w:szCs w:val="17"/>
-        </w:rPr>
-        <w:t>t</w:t>
-      </w:r>
-      <w:r>
-        <w:rPr>
-          <w:rFonts w:hint="cs" w:ascii="B Mitra" w:hAnsi="B Mitra" w:cs="B Mitra"/>
-          <w:sz w:val="18"/>
-          <w:rtl/>
-          <w:szCs w:val="18"/>
-        </w:rPr>
-        <w:t xml:space="preserve"> = (</w:t>
-      </w:r>
-      <w:r>
-        <w:rPr>
-          <w:rFonts w:ascii="Times New Roman" w:hAnsi="Times New Roman" w:cs="Times New Roman"/>
-          <w:bidi w:val="0"/>
-          <w:sz w:val="17"/>
-          <w:szCs w:val="17"/>
-        </w:rPr>
-        <w:t>C_t</w:t>
-      </w:r>
-      <w:r>
-        <w:rPr>
-          <w:rFonts w:hint="cs" w:ascii="B Mitra" w:hAnsi="B Mitra" w:cs="B Mitra"/>
-          <w:sz w:val="18"/>
-          <w:rtl/>
-          <w:szCs w:val="18"/>
-        </w:rPr>
-        <w:t xml:space="preserve">, </w:t>
-      </w:r>
-      <w:r>
-        <w:rPr>
-          <w:rFonts w:ascii="Times New Roman" w:hAnsi="Times New Roman" w:cs="Times New Roman"/>
-          <w:bidi w:val="0"/>
-          <w:sz w:val="17"/>
-          <w:szCs w:val="17"/>
-        </w:rPr>
-        <w:t>M_t</w:t>
-      </w:r>
-      <w:r>
-        <w:rPr>
-          <w:rFonts w:hint="cs" w:ascii="B Mitra" w:hAnsi="B Mitra" w:cs="B Mitra"/>
-          <w:sz w:val="18"/>
-          <w:rtl/>
-          <w:szCs w:val="18"/>
-        </w:rPr>
-        <w:t xml:space="preserve">, </w:t>
-      </w:r>
-      <w:r>
-        <w:rPr>
-          <w:rFonts w:ascii="Times New Roman" w:hAnsi="Times New Roman" w:cs="Times New Roman"/>
-          <w:bidi w:val="0"/>
-          <w:sz w:val="17"/>
-          <w:szCs w:val="17"/>
-        </w:rPr>
-        <w:t>E_t</w:t>
-      </w:r>
-      <w:r>
-        <w:rPr>
-          <w:rFonts w:hint="cs" w:ascii="B Mitra" w:hAnsi="B Mitra" w:cs="B Mitra"/>
-          <w:sz w:val="18"/>
-          <w:rtl/>
-          <w:szCs w:val="18"/>
-        </w:rPr>
-        <w:t xml:space="preserve">) سازمان می‌یابند. هر یال دوتایی نشانگر وقوع دست‌کم یک تراکنش توسط کارت </w:t>
-      </w:r>
-      <w:r>
-        <w:rPr>
-          <w:rFonts w:ascii="Times New Roman" w:hAnsi="Times New Roman" w:cs="Times New Roman"/>
-          <w:bidi w:val="0"/>
-          <w:sz w:val="17"/>
-          <w:szCs w:val="17"/>
-        </w:rPr>
-        <w:t>c</w:t>
-      </w:r>
-      <w:r>
-        <w:rPr>
-          <w:rFonts w:hint="cs" w:ascii="B Mitra" w:hAnsi="B Mitra" w:cs="B Mitra"/>
-          <w:sz w:val="18"/>
-          <w:rtl/>
-          <w:szCs w:val="18"/>
-        </w:rPr>
-        <w:t xml:space="preserve"> در پایانه </w:t>
-      </w:r>
-      <w:r>
-        <w:rPr>
-          <w:rFonts w:ascii="Times New Roman" w:hAnsi="Times New Roman" w:cs="Times New Roman"/>
-          <w:bidi w:val="0"/>
-          <w:sz w:val="17"/>
-          <w:szCs w:val="17"/>
-        </w:rPr>
-        <w:t>m</w:t>
-      </w:r>
-      <w:r>
-        <w:rPr>
-          <w:rFonts w:hint="cs" w:ascii="B Mitra" w:hAnsi="B Mitra" w:cs="B Mitra"/>
-          <w:sz w:val="18"/>
-          <w:rtl/>
-          <w:szCs w:val="18"/>
-        </w:rPr>
-        <w:t xml:space="preserve"> در پنجره </w:t>
-      </w:r>
-      <w:r>
-        <w:rPr>
-          <w:rFonts w:ascii="Times New Roman" w:hAnsi="Times New Roman" w:cs="Times New Roman"/>
-          <w:bidi w:val="0"/>
-          <w:sz w:val="17"/>
-          <w:szCs w:val="17"/>
-        </w:rPr>
-        <w:t>t</w:t>
-      </w:r>
-      <w:r>
-        <w:rPr>
-          <w:rFonts w:hint="cs" w:ascii="B Mitra" w:hAnsi="B Mitra" w:cs="B Mitra"/>
-          <w:sz w:val="18"/>
-          <w:rtl/>
-          <w:szCs w:val="18"/>
-        </w:rPr>
-        <w:t xml:space="preserve"> است (یال‌ها باینری هستند تا تمرکز بر ساختار هم‌ملاقاتی توپولوژیک باشد نه حجم تراکنش). کارت‌ها صرفاً به عنوان گره‌های واسط جهت استخراج مسیرهای هم‌پوشان مشتریان عمل می‌کنند و هویت فردی آن‌ها نگهداری نمی‌شود.</w:t>
+        <w:t>، تراکنش‌ها در قالب گراف دوبخشی زیر سازمان می‌یابند:</w:t>
       </w:r>
     </w:p>
     <w:p>
       <w:pPr>
+        <w:pStyle w:val="FigureText"/>
+        <w:spacing w:before="24" w:after="24" w:line="228" w:lineRule="auto"/>
+        <w:ind w:left="170"/>
+        <w:jc w:val="left"/>
+        <w:bidi w:val="0"/>
+      </w:pPr>
+      <w:r>
+        <w:rPr>
+          <w:rFonts w:ascii="Times New Roman" w:hAnsi="Times New Roman" w:cs="Times New Roman"/>
+          <w:iCs/>
+          <w:i/>
+          <w:bidi w:val="0"/>
+          <w:sz w:val="17"/>
+          <w:szCs w:val="17"/>
+        </w:rPr>
+        <w:t>G</w:t>
+      </w:r>
+      <w:r>
+        <w:rPr>
+          <w:rFonts w:ascii="Times New Roman" w:hAnsi="Times New Roman" w:cs="Times New Roman"/>
+          <w:bidi w:val="0"/>
+          <w:sz w:val="17"/>
+          <w:szCs w:val="17"/>
+        </w:rPr>
+        <w:t>^(B)_t = ( C_t , M_t , E_t )</w:t>
+      </w:r>
+    </w:p>
+    <w:p>
+      <w:pPr>
+        <w:pStyle w:val="Text"/>
+        <w:spacing w:before="0" w:after="20" w:line="226" w:lineRule="auto"/>
+      </w:pPr>
+      <w:r>
+        <w:rPr>
+          <w:rFonts w:hint="cs" w:ascii="B Mitra" w:hAnsi="B Mitra" w:cs="B Mitra"/>
+          <w:sz w:val="18"/>
+          <w:rtl/>
+          <w:szCs w:val="18"/>
+        </w:rPr>
+        <w:t xml:space="preserve">هر یال دوتایی نشانگر وقوع دست‌کم یک تراکنش توسط کارت </w:t>
+      </w:r>
+      <w:r>
+        <w:rPr>
+          <w:rFonts w:ascii="Times New Roman" w:hAnsi="Times New Roman" w:cs="Times New Roman"/>
+          <w:bidi w:val="0"/>
+          <w:sz w:val="17"/>
+          <w:szCs w:val="17"/>
+        </w:rPr>
+        <w:t>c</w:t>
+      </w:r>
+      <w:r>
+        <w:rPr>
+          <w:rFonts w:hint="cs" w:ascii="B Mitra" w:hAnsi="B Mitra" w:cs="B Mitra"/>
+          <w:sz w:val="18"/>
+          <w:rtl/>
+          <w:szCs w:val="18"/>
+        </w:rPr>
+        <w:t xml:space="preserve"> در پایانه </w:t>
+      </w:r>
+      <w:r>
+        <w:rPr>
+          <w:rFonts w:ascii="Times New Roman" w:hAnsi="Times New Roman" w:cs="Times New Roman"/>
+          <w:bidi w:val="0"/>
+          <w:sz w:val="17"/>
+          <w:szCs w:val="17"/>
+        </w:rPr>
+        <w:t>m</w:t>
+      </w:r>
+      <w:r>
+        <w:rPr>
+          <w:rFonts w:hint="cs" w:ascii="B Mitra" w:hAnsi="B Mitra" w:cs="B Mitra"/>
+          <w:sz w:val="18"/>
+          <w:rtl/>
+          <w:szCs w:val="18"/>
+        </w:rPr>
+        <w:t xml:space="preserve"> در پنجره </w:t>
+      </w:r>
+      <w:r>
+        <w:rPr>
+          <w:rFonts w:ascii="Times New Roman" w:hAnsi="Times New Roman" w:cs="Times New Roman"/>
+          <w:bidi w:val="0"/>
+          <w:sz w:val="17"/>
+          <w:szCs w:val="17"/>
+        </w:rPr>
+        <w:t>t</w:t>
+      </w:r>
+      <w:r>
+        <w:rPr>
+          <w:rFonts w:hint="cs" w:ascii="B Mitra" w:hAnsi="B Mitra" w:cs="B Mitra"/>
+          <w:sz w:val="18"/>
+          <w:rtl/>
+          <w:szCs w:val="18"/>
+        </w:rPr>
+        <w:t xml:space="preserve"> است (یال‌ها باینری هستند تا تمرکز بر ساختار هم‌ملاقاتی توپولوژیک باشد نه حجم تراکنش). کارت‌ها صرفاً به عنوان گره‌های واسط جهت استخراج مسیرهای هم‌پوشان مشتریان عمل می‌کنند و هویت فردی آن‌ها نگهداری نمی‌شود.</w:t>
+      </w:r>
+    </w:p>
+    <w:p>
+      <w:pPr>
         <w:pStyle w:val="Heading2"/>
         <w:spacing w:before="30" w:after="10"/>
       </w:pPr>
@@ -2630,61 +2418,25 @@
           <w:rtl/>
           <w:szCs w:val="18"/>
         </w:rPr>
-        <w:t xml:space="preserve">، همسایگی ۲-گامه </w:t>
-      </w:r>
-      <w:r>
-        <w:rPr>
-          <w:rFonts w:ascii="Times New Roman" w:hAnsi="Times New Roman" w:cs="Times New Roman"/>
-          <w:bidi w:val="0"/>
-          <w:sz w:val="17"/>
-          <w:szCs w:val="17"/>
-        </w:rPr>
-        <w:t>C</w:t>
-      </w:r>
-      <w:r>
-        <w:rPr>
-          <w:rFonts w:hint="cs" w:ascii="B Mitra" w:hAnsi="B Mitra" w:cs="B Mitra"/>
-          <w:sz w:val="18"/>
-          <w:rtl/>
-          <w:szCs w:val="18"/>
-        </w:rPr>
-        <w:t>(</w:t>
-      </w:r>
-      <w:r>
-        <w:rPr>
-          <w:rFonts w:ascii="Times New Roman" w:hAnsi="Times New Roman" w:cs="Times New Roman"/>
-          <w:bidi w:val="0"/>
-          <w:sz w:val="17"/>
-          <w:szCs w:val="17"/>
-        </w:rPr>
-        <w:t>m</w:t>
-      </w:r>
-      <w:r>
-        <w:rPr>
-          <w:rFonts w:hint="cs" w:ascii="B Mitra" w:hAnsi="B Mitra" w:cs="B Mitra"/>
-          <w:sz w:val="18"/>
-          <w:rtl/>
-          <w:szCs w:val="18"/>
-        </w:rPr>
-        <w:t>) = ⋃_{</w:t>
-      </w:r>
-      <w:r>
-        <w:rPr>
-          <w:rFonts w:ascii="Times New Roman" w:hAnsi="Times New Roman" w:cs="Times New Roman"/>
-          <w:bidi w:val="0"/>
-          <w:sz w:val="17"/>
-          <w:szCs w:val="17"/>
-        </w:rPr>
-        <w:t>c</w:t>
-      </w:r>
-      <w:r>
-        <w:rPr>
-          <w:rFonts w:hint="cs" w:ascii="B Mitra" w:hAnsi="B Mitra" w:cs="B Mitra"/>
-          <w:sz w:val="18"/>
-          <w:rtl/>
-          <w:szCs w:val="18"/>
-        </w:rPr>
-        <w:t xml:space="preserve"> ∈ </w:t>
+        <w:t xml:space="preserve">، همسایگی ۲-گامه در زمان </w:t>
+      </w:r>
+      <w:r>
+        <w:rPr>
+          <w:rFonts w:ascii="Times New Roman" w:hAnsi="Times New Roman" w:cs="Times New Roman"/>
+          <w:bidi w:val="0"/>
+          <w:sz w:val="17"/>
+          <w:szCs w:val="17"/>
+        </w:rPr>
+        <w:t>O</w:t>
+      </w:r>
+      <w:r>
+        <w:rPr>
+          <w:rFonts w:hint="cs" w:ascii="B Mitra" w:hAnsi="B Mitra" w:cs="B Mitra"/>
+          <w:sz w:val="18"/>
+          <w:rtl/>
+          <w:szCs w:val="18"/>
+        </w:rPr>
+        <w:t>(|</w:t>
       </w:r>
       <w:r>
         <w:rPr>
@@ -2702,96 +2454,6 @@
           <w:rtl/>
           <w:szCs w:val="18"/>
         </w:rPr>
-        <w:t xml:space="preserve">} </w:t>
-      </w:r>
-      <w:r>
-        <w:rPr>
-          <w:rFonts w:ascii="Times New Roman" w:hAnsi="Times New Roman" w:cs="Times New Roman"/>
-          <w:bidi w:val="0"/>
-          <w:sz w:val="17"/>
-          <w:szCs w:val="17"/>
-        </w:rPr>
-        <w:t>I</w:t>
-      </w:r>
-      <w:r>
-        <w:rPr>
-          <w:rFonts w:hint="cs" w:ascii="B Mitra" w:hAnsi="B Mitra" w:cs="B Mitra"/>
-          <w:sz w:val="18"/>
-          <w:rtl/>
-          <w:szCs w:val="18"/>
-        </w:rPr>
-        <w:t>(</w:t>
-      </w:r>
-      <w:r>
-        <w:rPr>
-          <w:rFonts w:ascii="Times New Roman" w:hAnsi="Times New Roman" w:cs="Times New Roman"/>
-          <w:bidi w:val="0"/>
-          <w:sz w:val="17"/>
-          <w:szCs w:val="17"/>
-        </w:rPr>
-        <w:t>c</w:t>
-      </w:r>
-      <w:r>
-        <w:rPr>
-          <w:rFonts w:hint="cs" w:ascii="B Mitra" w:hAnsi="B Mitra" w:cs="B Mitra"/>
-          <w:sz w:val="18"/>
-          <w:rtl/>
-          <w:szCs w:val="18"/>
-        </w:rPr>
-        <w:t>) \ {</w:t>
-      </w:r>
-      <w:r>
-        <w:rPr>
-          <w:rFonts w:ascii="Times New Roman" w:hAnsi="Times New Roman" w:cs="Times New Roman"/>
-          <w:bidi w:val="0"/>
-          <w:sz w:val="17"/>
-          <w:szCs w:val="17"/>
-        </w:rPr>
-        <w:t>m</w:t>
-      </w:r>
-      <w:r>
-        <w:rPr>
-          <w:rFonts w:hint="cs" w:ascii="B Mitra" w:hAnsi="B Mitra" w:cs="B Mitra"/>
-          <w:sz w:val="18"/>
-          <w:rtl/>
-          <w:szCs w:val="18"/>
-        </w:rPr>
-        <w:t xml:space="preserve">} در زمان </w:t>
-      </w:r>
-      <w:r>
-        <w:rPr>
-          <w:rFonts w:ascii="Times New Roman" w:hAnsi="Times New Roman" w:cs="Times New Roman"/>
-          <w:bidi w:val="0"/>
-          <w:sz w:val="17"/>
-          <w:szCs w:val="17"/>
-        </w:rPr>
-        <w:t>O</w:t>
-      </w:r>
-      <w:r>
-        <w:rPr>
-          <w:rFonts w:hint="cs" w:ascii="B Mitra" w:hAnsi="B Mitra" w:cs="B Mitra"/>
-          <w:sz w:val="18"/>
-          <w:rtl/>
-          <w:szCs w:val="18"/>
-        </w:rPr>
-        <w:t>(|</w:t>
-      </w:r>
-      <w:r>
-        <w:rPr>
-          <w:rFonts w:ascii="Times New Roman" w:hAnsi="Times New Roman" w:cs="Times New Roman"/>
-          <w:bidi w:val="0"/>
-          <w:sz w:val="17"/>
-          <w:szCs w:val="17"/>
-        </w:rPr>
-        <w:t>C_m</w:t>
-      </w:r>
-      <w:r>
-        <w:rPr>
-          <w:rFonts w:hint="cs" w:ascii="B Mitra" w:hAnsi="B Mitra" w:cs="B Mitra"/>
-          <w:sz w:val="18"/>
-          <w:rtl/>
-          <w:szCs w:val="18"/>
-        </w:rPr>
         <w:t xml:space="preserve">| · </w:t>
       </w:r>
       <w:r>
@@ -2810,7 +2472,59 @@
           <w:rtl/>
           <w:szCs w:val="18"/>
         </w:rPr>
-        <w:t>) استخراج می‌شود. سپس شباهت پذیرندگان کاندیدا بر اساس رابطه (</w:t>
+        <w:t>) استخراج می‌شود:</w:t>
+      </w:r>
+    </w:p>
+    <w:p>
+      <w:pPr>
+        <w:pStyle w:val="FigureText"/>
+        <w:spacing w:before="24" w:after="24" w:line="228" w:lineRule="auto"/>
+        <w:ind w:left="170"/>
+        <w:jc w:val="left"/>
+        <w:bidi w:val="0"/>
+      </w:pPr>
+      <w:r>
+        <w:rPr>
+          <w:rFonts w:ascii="Times New Roman" w:hAnsi="Times New Roman" w:cs="Times New Roman"/>
+          <w:bidi w:val="0"/>
+          <w:sz w:val="17"/>
+          <w:szCs w:val="17"/>
+        </w:rPr>
+        <w:t>C(m) = ⋃</w:t>
+      </w:r>
+      <w:r>
+        <w:rPr>
+          <w:rFonts w:ascii="Times New Roman" w:hAnsi="Times New Roman" w:cs="Times New Roman"/>
+          <w:bidi w:val="0"/>
+          <w:sz w:val="17"/>
+          <w:szCs w:val="17"/>
+          <w:vertAlign w:val="subscript"/>
+        </w:rPr>
+        <w:t>c ∈ C_m</w:t>
+      </w:r>
+      <w:r>
+        <w:rPr>
+          <w:rFonts w:ascii="Times New Roman" w:hAnsi="Times New Roman" w:cs="Times New Roman"/>
+          <w:bidi w:val="0"/>
+          <w:sz w:val="17"/>
+          <w:szCs w:val="17"/>
+        </w:rPr>
+        <w:t xml:space="preserve"> I(c) \ { m }</w:t>
+      </w:r>
+    </w:p>
+    <w:p>
+      <w:pPr>
+        <w:pStyle w:val="Text"/>
+        <w:spacing w:before="0" w:after="20" w:line="226" w:lineRule="auto"/>
+      </w:pPr>
+      <w:r>
+        <w:rPr>
+          <w:rFonts w:hint="cs" w:ascii="B Mitra" w:hAnsi="B Mitra" w:cs="B Mitra"/>
+          <w:sz w:val="18"/>
+          <w:rtl/>
+          <w:szCs w:val="18"/>
+        </w:rPr>
+        <w:t>سپس شباهت پذیرندگان کاندیدا بر اساس رابطه (</w:t>
       </w:r>
       <w:r>
         <w:rPr>
@@ -2888,6 +2602,7 @@
             <w:pPr>
               <w:pStyle w:val="FigureText"/>
               <w:spacing w:before="6" w:after="6"/>
+              <w:jc w:val="left"/>
               <w:bidi w:val="0"/>
             </w:pPr>
             <w:r>
@@ -2971,79 +2686,115 @@
           <w:rtl/>
           <w:szCs w:val="18"/>
         </w:rPr>
-        <w:t xml:space="preserve"> شباهت کسینوسی بردار دودویی وقوع مشتریان مشترک </w:t>
-      </w:r>
-      <w:r>
-        <w:rPr>
-          <w:rFonts w:ascii="Times New Roman" w:hAnsi="Times New Roman" w:cs="Times New Roman"/>
-          <w:bidi w:val="0"/>
-          <w:sz w:val="17"/>
-          <w:szCs w:val="17"/>
-        </w:rPr>
-        <w:t>v_m</w:t>
-      </w:r>
-      <w:r>
-        <w:rPr>
-          <w:rFonts w:hint="cs" w:ascii="B Mitra" w:hAnsi="B Mitra" w:cs="B Mitra"/>
-          <w:sz w:val="18"/>
-          <w:rtl/>
-          <w:szCs w:val="18"/>
-        </w:rPr>
-        <w:t xml:space="preserve">, </w:t>
-      </w:r>
-      <w:r>
-        <w:rPr>
-          <w:rFonts w:ascii="Times New Roman" w:hAnsi="Times New Roman" w:cs="Times New Roman"/>
-          <w:bidi w:val="0"/>
-          <w:sz w:val="17"/>
-          <w:szCs w:val="17"/>
-        </w:rPr>
-        <w:t>v_j</w:t>
-      </w:r>
-      <w:r>
-        <w:rPr>
-          <w:rFonts w:hint="cs" w:ascii="B Mitra" w:hAnsi="B Mitra" w:cs="B Mitra"/>
-          <w:sz w:val="18"/>
-          <w:rtl/>
-          <w:szCs w:val="18"/>
-        </w:rPr>
-        <w:t xml:space="preserve"> ∈ {</w:t>
-      </w:r>
-      <w:r>
-        <w:rPr>
-          <w:rFonts w:ascii="Times New Roman" w:hAnsi="Times New Roman" w:cs="Times New Roman"/>
-          <w:bidi w:val="0"/>
-          <w:sz w:val="17"/>
-          <w:szCs w:val="17"/>
-        </w:rPr>
-        <w:t>0</w:t>
-      </w:r>
-      <w:r>
-        <w:rPr>
-          <w:rFonts w:hint="cs" w:ascii="B Mitra" w:hAnsi="B Mitra" w:cs="B Mitra"/>
-          <w:sz w:val="18"/>
-          <w:rtl/>
-          <w:szCs w:val="18"/>
-        </w:rPr>
-        <w:t xml:space="preserve">, </w:t>
-      </w:r>
-      <w:r>
-        <w:rPr>
-          <w:rFonts w:ascii="Times New Roman" w:hAnsi="Times New Roman" w:cs="Times New Roman"/>
-          <w:bidi w:val="0"/>
-          <w:sz w:val="17"/>
-          <w:szCs w:val="17"/>
-        </w:rPr>
-        <w:t>1</w:t>
-      </w:r>
-      <w:r>
-        <w:rPr>
-          <w:rFonts w:hint="cs" w:ascii="B Mitra" w:hAnsi="B Mitra" w:cs="B Mitra"/>
-          <w:sz w:val="18"/>
-          <w:rtl/>
-          <w:szCs w:val="18"/>
-        </w:rPr>
-        <w:t>}^{|</w:t>
+        <w:t xml:space="preserve"> شباهت کسینوسی بردار دودویی وقوع مشتریان مشترک و </w:t>
+      </w:r>
+      <w:r>
+        <w:rPr>
+          <w:rFonts w:ascii="Times New Roman" w:hAnsi="Times New Roman" w:cs="Times New Roman"/>
+          <w:bidi w:val="0"/>
+          <w:sz w:val="17"/>
+          <w:szCs w:val="17"/>
+        </w:rPr>
+        <w:t>S_category</w:t>
+      </w:r>
+      <w:r>
+        <w:rPr>
+          <w:rFonts w:hint="cs" w:ascii="B Mitra" w:hAnsi="B Mitra" w:cs="B Mitra"/>
+          <w:sz w:val="18"/>
+          <w:rtl/>
+          <w:szCs w:val="18"/>
+        </w:rPr>
+        <w:t xml:space="preserve"> تطابق صنف تجاری است. ضریب </w:t>
+      </w:r>
+      <w:r>
+        <w:rPr>
+          <w:rFonts w:ascii="Times New Roman" w:hAnsi="Times New Roman" w:cs="Times New Roman"/>
+          <w:bidi w:val="0"/>
+          <w:sz w:val="17"/>
+          <w:szCs w:val="17"/>
+        </w:rPr>
+        <w:t>λ</w:t>
+      </w:r>
+      <w:r>
+        <w:rPr>
+          <w:rFonts w:hint="cs" w:ascii="B Mitra" w:hAnsi="B Mitra" w:cs="B Mitra"/>
+          <w:sz w:val="18"/>
+          <w:rtl/>
+          <w:szCs w:val="18"/>
+        </w:rPr>
+        <w:t xml:space="preserve"> = </w:t>
+      </w:r>
+      <w:r>
+        <w:rPr>
+          <w:rFonts w:ascii="Times New Roman" w:hAnsi="Times New Roman" w:cs="Times New Roman"/>
+          <w:bidi w:val="0"/>
+          <w:sz w:val="17"/>
+          <w:szCs w:val="17"/>
+        </w:rPr>
+        <w:t>0.65</w:t>
+      </w:r>
+      <w:r>
+        <w:rPr>
+          <w:rFonts w:hint="cs" w:ascii="B Mitra" w:hAnsi="B Mitra" w:cs="B Mitra"/>
+          <w:sz w:val="18"/>
+          <w:rtl/>
+          <w:szCs w:val="18"/>
+        </w:rPr>
+        <w:t xml:space="preserve"> در پنجره اعتبارسنجی گذشته تنظیم شده است. یک هیپ بیشینه همتایان </w:t>
+      </w:r>
+      <w:r>
+        <w:rPr>
+          <w:rFonts w:ascii="Times New Roman" w:hAnsi="Times New Roman" w:cs="Times New Roman"/>
+          <w:bidi w:val="0"/>
+          <w:sz w:val="17"/>
+          <w:szCs w:val="17"/>
+        </w:rPr>
+        <w:t>Top-K</w:t>
+      </w:r>
+      <w:r>
+        <w:rPr>
+          <w:rFonts w:hint="cs" w:ascii="B Mitra" w:hAnsi="B Mitra" w:cs="B Mitra"/>
+          <w:sz w:val="18"/>
+          <w:rtl/>
+          <w:szCs w:val="18"/>
+        </w:rPr>
+        <w:t xml:space="preserve"> (</w:t>
+      </w:r>
+      <w:r>
+        <w:rPr>
+          <w:rFonts w:ascii="Times New Roman" w:hAnsi="Times New Roman" w:cs="Times New Roman"/>
+          <w:bidi w:val="0"/>
+          <w:sz w:val="17"/>
+          <w:szCs w:val="17"/>
+        </w:rPr>
+        <w:t>K=6</w:t>
+      </w:r>
+      <w:r>
+        <w:rPr>
+          <w:rFonts w:hint="cs" w:ascii="B Mitra" w:hAnsi="B Mitra" w:cs="B Mitra"/>
+          <w:sz w:val="18"/>
+          <w:rtl/>
+          <w:szCs w:val="18"/>
+        </w:rPr>
+        <w:t xml:space="preserve">) را در مرتبه </w:t>
+      </w:r>
+      <w:r>
+        <w:rPr>
+          <w:rFonts w:ascii="Times New Roman" w:hAnsi="Times New Roman" w:cs="Times New Roman"/>
+          <w:bidi w:val="0"/>
+          <w:sz w:val="17"/>
+          <w:szCs w:val="17"/>
+        </w:rPr>
+        <w:t>O</w:t>
+      </w:r>
+      <w:r>
+        <w:rPr>
+          <w:rFonts w:hint="cs" w:ascii="B Mitra" w:hAnsi="B Mitra" w:cs="B Mitra"/>
+          <w:sz w:val="18"/>
+          <w:rtl/>
+          <w:szCs w:val="18"/>
+        </w:rPr>
+        <w:t>(|</w:t>
       </w:r>
       <w:r>
         <w:rPr>
@@ -3061,61 +2812,115 @@
           <w:rtl/>
           <w:szCs w:val="18"/>
         </w:rPr>
-        <w:t xml:space="preserve">|} و </w:t>
-      </w:r>
-      <w:r>
-        <w:rPr>
-          <w:rFonts w:ascii="Times New Roman" w:hAnsi="Times New Roman" w:cs="Times New Roman"/>
-          <w:bidi w:val="0"/>
-          <w:sz w:val="17"/>
-          <w:szCs w:val="17"/>
-        </w:rPr>
-        <w:t>S_category</w:t>
-      </w:r>
-      <w:r>
-        <w:rPr>
-          <w:rFonts w:hint="cs" w:ascii="B Mitra" w:hAnsi="B Mitra" w:cs="B Mitra"/>
-          <w:sz w:val="18"/>
-          <w:rtl/>
-          <w:szCs w:val="18"/>
-        </w:rPr>
-        <w:t xml:space="preserve"> تطابق صنف تجاری است. ضریب </w:t>
-      </w:r>
-      <w:r>
-        <w:rPr>
-          <w:rFonts w:ascii="Times New Roman" w:hAnsi="Times New Roman" w:cs="Times New Roman"/>
-          <w:bidi w:val="0"/>
-          <w:sz w:val="17"/>
-          <w:szCs w:val="17"/>
-        </w:rPr>
-        <w:t>λ</w:t>
-      </w:r>
-      <w:r>
-        <w:rPr>
-          <w:rFonts w:hint="cs" w:ascii="B Mitra" w:hAnsi="B Mitra" w:cs="B Mitra"/>
-          <w:sz w:val="18"/>
-          <w:rtl/>
-          <w:szCs w:val="18"/>
-        </w:rPr>
-        <w:t xml:space="preserve"> = </w:t>
-      </w:r>
-      <w:r>
-        <w:rPr>
-          <w:rFonts w:ascii="Times New Roman" w:hAnsi="Times New Roman" w:cs="Times New Roman"/>
-          <w:bidi w:val="0"/>
-          <w:sz w:val="17"/>
-          <w:szCs w:val="17"/>
-        </w:rPr>
-        <w:t>0.65</w:t>
-      </w:r>
-      <w:r>
-        <w:rPr>
-          <w:rFonts w:hint="cs" w:ascii="B Mitra" w:hAnsi="B Mitra" w:cs="B Mitra"/>
-          <w:sz w:val="18"/>
-          <w:rtl/>
-          <w:szCs w:val="18"/>
-        </w:rPr>
-        <w:t xml:space="preserve"> در پنجره اعتبارسنجی گذشته تنظیم شده است. یک هیپ بیشینه همتایان </w:t>
+        <w:t>(</w:t>
+      </w:r>
+      <w:r>
+        <w:rPr>
+          <w:rFonts w:ascii="Times New Roman" w:hAnsi="Times New Roman" w:cs="Times New Roman"/>
+          <w:bidi w:val="0"/>
+          <w:sz w:val="17"/>
+          <w:szCs w:val="17"/>
+        </w:rPr>
+        <w:t>m</w:t>
+      </w:r>
+      <w:r>
+        <w:rPr>
+          <w:rFonts w:hint="cs" w:ascii="B Mitra" w:hAnsi="B Mitra" w:cs="B Mitra"/>
+          <w:sz w:val="18"/>
+          <w:rtl/>
+          <w:szCs w:val="18"/>
+        </w:rPr>
+        <w:t xml:space="preserve">)| </w:t>
+      </w:r>
+      <w:r>
+        <w:rPr>
+          <w:rFonts w:ascii="Times New Roman" w:hAnsi="Times New Roman" w:cs="Times New Roman"/>
+          <w:bidi w:val="0"/>
+          <w:sz w:val="17"/>
+          <w:szCs w:val="17"/>
+        </w:rPr>
+        <w:t>log K</w:t>
+      </w:r>
+      <w:r>
+        <w:rPr>
+          <w:rFonts w:hint="cs" w:ascii="B Mitra" w:hAnsi="B Mitra" w:cs="B Mitra"/>
+          <w:sz w:val="18"/>
+          <w:rtl/>
+          <w:szCs w:val="18"/>
+        </w:rPr>
+        <w:t xml:space="preserve">) با پیچیدگی کاندیدایابی محدود به </w:t>
+      </w:r>
+      <w:r>
+        <w:rPr>
+          <w:rFonts w:ascii="Times New Roman" w:hAnsi="Times New Roman" w:cs="Times New Roman"/>
+          <w:bidi w:val="0"/>
+          <w:sz w:val="17"/>
+          <w:szCs w:val="17"/>
+        </w:rPr>
+        <w:t>O</w:t>
+      </w:r>
+      <w:r>
+        <w:rPr>
+          <w:rFonts w:hint="cs" w:ascii="B Mitra" w:hAnsi="B Mitra" w:cs="B Mitra"/>
+          <w:sz w:val="18"/>
+          <w:rtl/>
+          <w:szCs w:val="18"/>
+        </w:rPr>
+        <w:t>(|</w:t>
+      </w:r>
+      <w:r>
+        <w:rPr>
+          <w:rFonts w:ascii="Times New Roman" w:hAnsi="Times New Roman" w:cs="Times New Roman"/>
+          <w:bidi w:val="0"/>
+          <w:sz w:val="17"/>
+          <w:szCs w:val="17"/>
+        </w:rPr>
+        <w:t>M</w:t>
+      </w:r>
+      <w:r>
+        <w:rPr>
+          <w:rFonts w:hint="cs" w:ascii="B Mitra" w:hAnsi="B Mitra" w:cs="B Mitra"/>
+          <w:sz w:val="18"/>
+          <w:rtl/>
+          <w:szCs w:val="18"/>
+        </w:rPr>
+        <w:t xml:space="preserve">| · </w:t>
+      </w:r>
+      <w:r>
+        <w:rPr>
+          <w:rFonts w:ascii="Times New Roman" w:hAnsi="Times New Roman" w:cs="Times New Roman"/>
+          <w:bidi w:val="0"/>
+          <w:sz w:val="17"/>
+          <w:szCs w:val="17"/>
+        </w:rPr>
+        <w:t>K</w:t>
+      </w:r>
+      <w:r>
+        <w:rPr>
+          <w:rFonts w:hint="cs" w:ascii="B Mitra" w:hAnsi="B Mitra" w:cs="B Mitra"/>
+          <w:sz w:val="18"/>
+          <w:rtl/>
+          <w:szCs w:val="18"/>
+        </w:rPr>
+        <w:t xml:space="preserve"> · </w:t>
+      </w:r>
+      <w:r>
+        <w:rPr>
+          <w:rFonts w:ascii="Times New Roman" w:hAnsi="Times New Roman" w:cs="Times New Roman"/>
+          <w:bidi w:val="0"/>
+          <w:sz w:val="17"/>
+          <w:szCs w:val="17"/>
+        </w:rPr>
+        <w:t>d_avg</w:t>
+      </w:r>
+      <w:r>
+        <w:rPr>
+          <w:rFonts w:hint="cs" w:ascii="B Mitra" w:hAnsi="B Mitra" w:cs="B Mitra"/>
+          <w:sz w:val="18"/>
+          <w:rtl/>
+          <w:szCs w:val="18"/>
+        </w:rPr>
+        <w:t xml:space="preserve">) استخراج می‌نماید. از آنجا که رابطه انتخاب </w:t>
       </w:r>
       <w:r>
         <w:rPr>
@@ -3133,349 +2938,40 @@
           <w:rtl/>
           <w:szCs w:val="18"/>
         </w:rPr>
-        <w:t xml:space="preserve"> (</w:t>
-      </w:r>
-      <w:r>
-        <w:rPr>
-          <w:rFonts w:ascii="Times New Roman" w:hAnsi="Times New Roman" w:cs="Times New Roman"/>
-          <w:bidi w:val="0"/>
-          <w:sz w:val="17"/>
-          <w:szCs w:val="17"/>
-        </w:rPr>
-        <w:t>K=6</w:t>
-      </w:r>
-      <w:r>
-        <w:rPr>
-          <w:rFonts w:hint="cs" w:ascii="B Mitra" w:hAnsi="B Mitra" w:cs="B Mitra"/>
-          <w:sz w:val="18"/>
-          <w:rtl/>
-          <w:szCs w:val="18"/>
-        </w:rPr>
-        <w:t xml:space="preserve">) را در مرتبه </w:t>
-      </w:r>
-      <w:r>
-        <w:rPr>
-          <w:rFonts w:ascii="Times New Roman" w:hAnsi="Times New Roman" w:cs="Times New Roman"/>
-          <w:bidi w:val="0"/>
-          <w:sz w:val="17"/>
-          <w:szCs w:val="17"/>
-        </w:rPr>
-        <w:t>O</w:t>
-      </w:r>
-      <w:r>
-        <w:rPr>
-          <w:rFonts w:hint="cs" w:ascii="B Mitra" w:hAnsi="B Mitra" w:cs="B Mitra"/>
-          <w:sz w:val="18"/>
-          <w:rtl/>
-          <w:szCs w:val="18"/>
-        </w:rPr>
-        <w:t>(|</w:t>
-      </w:r>
-      <w:r>
-        <w:rPr>
-          <w:rFonts w:ascii="Times New Roman" w:hAnsi="Times New Roman" w:cs="Times New Roman"/>
-          <w:bidi w:val="0"/>
-          <w:sz w:val="17"/>
-          <w:szCs w:val="17"/>
-        </w:rPr>
-        <w:t>C</w:t>
-      </w:r>
-      <w:r>
-        <w:rPr>
-          <w:rFonts w:hint="cs" w:ascii="B Mitra" w:hAnsi="B Mitra" w:cs="B Mitra"/>
-          <w:sz w:val="18"/>
-          <w:rtl/>
-          <w:szCs w:val="18"/>
-        </w:rPr>
-        <w:t>(</w:t>
-      </w:r>
-      <w:r>
-        <w:rPr>
-          <w:rFonts w:ascii="Times New Roman" w:hAnsi="Times New Roman" w:cs="Times New Roman"/>
-          <w:bidi w:val="0"/>
-          <w:sz w:val="17"/>
-          <w:szCs w:val="17"/>
-        </w:rPr>
-        <w:t>m</w:t>
-      </w:r>
-      <w:r>
-        <w:rPr>
-          <w:rFonts w:hint="cs" w:ascii="B Mitra" w:hAnsi="B Mitra" w:cs="B Mitra"/>
-          <w:sz w:val="18"/>
-          <w:rtl/>
-          <w:szCs w:val="18"/>
-        </w:rPr>
-        <w:t xml:space="preserve">)| </w:t>
-      </w:r>
-      <w:r>
-        <w:rPr>
-          <w:rFonts w:ascii="Times New Roman" w:hAnsi="Times New Roman" w:cs="Times New Roman"/>
-          <w:bidi w:val="0"/>
-          <w:sz w:val="17"/>
-          <w:szCs w:val="17"/>
-        </w:rPr>
-        <w:t>log K</w:t>
-      </w:r>
-      <w:r>
-        <w:rPr>
-          <w:rFonts w:hint="cs" w:ascii="B Mitra" w:hAnsi="B Mitra" w:cs="B Mitra"/>
-          <w:sz w:val="18"/>
-          <w:rtl/>
-          <w:szCs w:val="18"/>
-        </w:rPr>
-        <w:t xml:space="preserve">) با پیچیدگی کاندیدایابی محدود به </w:t>
-      </w:r>
-      <w:r>
-        <w:rPr>
-          <w:rFonts w:ascii="Times New Roman" w:hAnsi="Times New Roman" w:cs="Times New Roman"/>
-          <w:bidi w:val="0"/>
-          <w:sz w:val="17"/>
-          <w:szCs w:val="17"/>
-        </w:rPr>
-        <w:t>O</w:t>
-      </w:r>
-      <w:r>
-        <w:rPr>
-          <w:rFonts w:hint="cs" w:ascii="B Mitra" w:hAnsi="B Mitra" w:cs="B Mitra"/>
-          <w:sz w:val="18"/>
-          <w:rtl/>
-          <w:szCs w:val="18"/>
-        </w:rPr>
-        <w:t>(|</w:t>
-      </w:r>
-      <w:r>
-        <w:rPr>
-          <w:rFonts w:ascii="Times New Roman" w:hAnsi="Times New Roman" w:cs="Times New Roman"/>
-          <w:bidi w:val="0"/>
-          <w:sz w:val="17"/>
-          <w:szCs w:val="17"/>
-        </w:rPr>
-        <w:t>M</w:t>
-      </w:r>
-      <w:r>
-        <w:rPr>
-          <w:rFonts w:hint="cs" w:ascii="B Mitra" w:hAnsi="B Mitra" w:cs="B Mitra"/>
-          <w:sz w:val="18"/>
-          <w:rtl/>
-          <w:szCs w:val="18"/>
-        </w:rPr>
-        <w:t xml:space="preserve">| · </w:t>
-      </w:r>
-      <w:r>
-        <w:rPr>
-          <w:rFonts w:ascii="Times New Roman" w:hAnsi="Times New Roman" w:cs="Times New Roman"/>
-          <w:bidi w:val="0"/>
-          <w:sz w:val="17"/>
-          <w:szCs w:val="17"/>
-        </w:rPr>
-        <w:t>K</w:t>
-      </w:r>
-      <w:r>
-        <w:rPr>
-          <w:rFonts w:hint="cs" w:ascii="B Mitra" w:hAnsi="B Mitra" w:cs="B Mitra"/>
-          <w:sz w:val="18"/>
-          <w:rtl/>
-          <w:szCs w:val="18"/>
-        </w:rPr>
-        <w:t xml:space="preserve"> · </w:t>
-      </w:r>
-      <w:r>
-        <w:rPr>
-          <w:rFonts w:ascii="Times New Roman" w:hAnsi="Times New Roman" w:cs="Times New Roman"/>
-          <w:bidi w:val="0"/>
-          <w:sz w:val="17"/>
-          <w:szCs w:val="17"/>
-        </w:rPr>
-        <w:t>d_avg</w:t>
-      </w:r>
-      <w:r>
-        <w:rPr>
-          <w:rFonts w:hint="cs" w:ascii="B Mitra" w:hAnsi="B Mitra" w:cs="B Mitra"/>
-          <w:sz w:val="18"/>
-          <w:rtl/>
-          <w:szCs w:val="18"/>
-        </w:rPr>
-        <w:t xml:space="preserve">) استخراج می‌نماید. از آنجا که رابطه انتخاب </w:t>
-      </w:r>
-      <w:r>
-        <w:rPr>
-          <w:rFonts w:ascii="Times New Roman" w:hAnsi="Times New Roman" w:cs="Times New Roman"/>
-          <w:bidi w:val="0"/>
-          <w:sz w:val="17"/>
-          <w:szCs w:val="17"/>
-        </w:rPr>
-        <w:t>Top-K</w:t>
-      </w:r>
-      <w:r>
-        <w:rPr>
-          <w:rFonts w:hint="cs" w:ascii="B Mitra" w:hAnsi="B Mitra" w:cs="B Mitra"/>
-          <w:sz w:val="18"/>
-          <w:rtl/>
-          <w:szCs w:val="18"/>
-        </w:rPr>
-        <w:t xml:space="preserve"> ذاتاً جهت‌دار است، گراف همتایان پیش از محاسبه انحنا با عملگر اجتماع متقارن‌سازی می‌گردد: </w:t>
-      </w:r>
-      <w:r>
-        <w:rPr>
-          <w:rFonts w:ascii="Times New Roman" w:hAnsi="Times New Roman" w:cs="Times New Roman"/>
-          <w:bidi w:val="0"/>
-          <w:sz w:val="17"/>
-          <w:szCs w:val="17"/>
-        </w:rPr>
-        <w:t>G_peer</w:t>
-      </w:r>
-      <w:r>
-        <w:rPr>
-          <w:rFonts w:hint="cs" w:ascii="B Mitra" w:hAnsi="B Mitra" w:cs="B Mitra"/>
-          <w:sz w:val="18"/>
-          <w:rtl/>
-          <w:szCs w:val="18"/>
-        </w:rPr>
-        <w:t xml:space="preserve"> = </w:t>
-      </w:r>
-      <w:r>
-        <w:rPr>
-          <w:rFonts w:ascii="Times New Roman" w:hAnsi="Times New Roman" w:cs="Times New Roman"/>
-          <w:bidi w:val="0"/>
-          <w:sz w:val="17"/>
-          <w:szCs w:val="17"/>
-        </w:rPr>
-        <w:t>Top-K</w:t>
-      </w:r>
-      <w:r>
-        <w:rPr>
-          <w:rFonts w:hint="cs" w:ascii="B Mitra" w:hAnsi="B Mitra" w:cs="B Mitra"/>
-          <w:sz w:val="18"/>
-          <w:rtl/>
-          <w:szCs w:val="18"/>
-        </w:rPr>
-        <w:t xml:space="preserve"> ∪ </w:t>
-      </w:r>
-      <w:r>
-        <w:rPr>
-          <w:rFonts w:ascii="Times New Roman" w:hAnsi="Times New Roman" w:cs="Times New Roman"/>
-          <w:bidi w:val="0"/>
-          <w:sz w:val="17"/>
-          <w:szCs w:val="17"/>
-        </w:rPr>
-        <w:t>Top-K</w:t>
-      </w:r>
-      <w:r>
-        <w:rPr>
-          <w:rFonts w:hint="cs" w:ascii="B Mitra" w:hAnsi="B Mitra" w:cs="B Mitra"/>
-          <w:sz w:val="18"/>
-          <w:rtl/>
-          <w:szCs w:val="18"/>
-        </w:rPr>
-        <w:t>^</w:t>
-      </w:r>
-      <w:r>
-        <w:rPr>
-          <w:rFonts w:ascii="Times New Roman" w:hAnsi="Times New Roman" w:cs="Times New Roman"/>
-          <w:bidi w:val="0"/>
-          <w:sz w:val="17"/>
-          <w:szCs w:val="17"/>
-        </w:rPr>
-        <w:t>T</w:t>
-      </w:r>
-      <w:r>
-        <w:rPr>
-          <w:rFonts w:hint="cs" w:ascii="B Mitra" w:hAnsi="B Mitra" w:cs="B Mitra"/>
-          <w:sz w:val="18"/>
-          <w:rtl/>
-          <w:szCs w:val="18"/>
-        </w:rPr>
-        <w:t>. توجه شود که محاسبه انحنا روی گراف همتایان متقارن‌شده (</w:t>
-      </w:r>
-      <w:r>
-        <w:rPr>
-          <w:rFonts w:ascii="Times New Roman" w:hAnsi="Times New Roman" w:cs="Times New Roman"/>
-          <w:bidi w:val="0"/>
-          <w:sz w:val="17"/>
-          <w:szCs w:val="17"/>
-        </w:rPr>
-        <w:t>symmetrized peer graph</w:t>
-      </w:r>
-      <w:r>
-        <w:rPr>
-          <w:rFonts w:hint="cs" w:ascii="B Mitra" w:hAnsi="B Mitra" w:cs="B Mitra"/>
-          <w:sz w:val="18"/>
-          <w:rtl/>
-          <w:szCs w:val="18"/>
-        </w:rPr>
-        <w:t>) انجام می‌شود. سپس انحنای فرمن-ریچی نرمال‌شده افزوده (</w:t>
-      </w:r>
-      <w:r>
-        <w:rPr>
-          <w:rFonts w:ascii="Times New Roman" w:hAnsi="Times New Roman" w:cs="Times New Roman"/>
-          <w:bidi w:val="0"/>
-          <w:sz w:val="17"/>
-          <w:szCs w:val="17"/>
-        </w:rPr>
-        <w:t>normalized augmented Forman-Ricci score used in this study</w:t>
-      </w:r>
-      <w:r>
-        <w:rPr>
-          <w:rFonts w:hint="cs" w:ascii="B Mitra" w:hAnsi="B Mitra" w:cs="B Mitra"/>
-          <w:sz w:val="18"/>
-          <w:rtl/>
-          <w:szCs w:val="18"/>
-        </w:rPr>
-        <w:t xml:space="preserve">) </w:t>
-      </w:r>
-      <w:r>
-        <w:rPr>
-          <w:rFonts w:ascii="Times New Roman" w:hAnsi="Times New Roman" w:cs="Times New Roman"/>
-          <w:bidi w:val="0"/>
-          <w:sz w:val="17"/>
-          <w:szCs w:val="17"/>
-        </w:rPr>
-        <w:t>F</w:t>
-      </w:r>
-      <w:r>
-        <w:rPr>
-          <w:rFonts w:hint="cs" w:ascii="B Mitra" w:hAnsi="B Mitra" w:cs="B Mitra"/>
-          <w:sz w:val="18"/>
-          <w:rtl/>
-          <w:szCs w:val="18"/>
-        </w:rPr>
-        <w:t>(</w:t>
-      </w:r>
-      <w:r>
-        <w:rPr>
-          <w:rFonts w:ascii="Times New Roman" w:hAnsi="Times New Roman" w:cs="Times New Roman"/>
-          <w:bidi w:val="0"/>
-          <w:sz w:val="17"/>
-          <w:szCs w:val="17"/>
-        </w:rPr>
-        <w:t>m</w:t>
-      </w:r>
-      <w:r>
-        <w:rPr>
-          <w:rFonts w:hint="cs" w:ascii="B Mitra" w:hAnsi="B Mitra" w:cs="B Mitra"/>
-          <w:sz w:val="18"/>
-          <w:rtl/>
-          <w:szCs w:val="18"/>
-        </w:rPr>
-        <w:t xml:space="preserve">, </w:t>
-      </w:r>
-      <w:r>
-        <w:rPr>
-          <w:rFonts w:ascii="Times New Roman" w:hAnsi="Times New Roman" w:cs="Times New Roman"/>
-          <w:bidi w:val="0"/>
-          <w:sz w:val="17"/>
-          <w:szCs w:val="17"/>
-        </w:rPr>
-        <w:t>j</w:t>
-      </w:r>
-      <w:r>
-        <w:rPr>
-          <w:rFonts w:hint="cs" w:ascii="B Mitra" w:hAnsi="B Mitra" w:cs="B Mitra"/>
-          <w:sz w:val="18"/>
-          <w:rtl/>
-          <w:szCs w:val="18"/>
-        </w:rPr>
-        <w:t>) طبق رابطه (</w:t>
+        <w:t xml:space="preserve"> ذاتاً جهت‌دار است، گراف همتایان پیش از محاسبه انحنا با عملگر اجتماع متقارن‌سازی می‌گردد:</w:t>
+      </w:r>
+    </w:p>
+    <w:p>
+      <w:pPr>
+        <w:pStyle w:val="FigureText"/>
+        <w:spacing w:before="24" w:after="24" w:line="228" w:lineRule="auto"/>
+        <w:ind w:left="170"/>
+        <w:jc w:val="left"/>
+        <w:bidi w:val="0"/>
+      </w:pPr>
+      <w:r>
+        <w:rPr>
+          <w:rFonts w:ascii="Times New Roman" w:hAnsi="Times New Roman" w:cs="Times New Roman"/>
+          <w:bidi w:val="0"/>
+          <w:sz w:val="17"/>
+          <w:szCs w:val="17"/>
+        </w:rPr>
+        <w:t>G_peer = Top-K ∪ Top-K^T</w:t>
+      </w:r>
+    </w:p>
+    <w:p>
+      <w:pPr>
+        <w:pStyle w:val="Text"/>
+        <w:spacing w:before="0" w:after="20" w:line="226" w:lineRule="auto"/>
+      </w:pPr>
+      <w:r>
+        <w:rPr>
+          <w:rFonts w:hint="cs" w:ascii="B Mitra" w:hAnsi="B Mitra" w:cs="B Mitra"/>
+          <w:sz w:val="18"/>
+          <w:rtl/>
+          <w:szCs w:val="18"/>
+        </w:rPr>
+        <w:t>توجه شود که محاسبه انحنا روی گراف همتایان متقارن‌شده انجام می‌شود. سپس انحنای فرمن-ریچی نرمال‌شده افزوده طبق رابطه (</w:t>
       </w:r>
       <w:r>
         <w:rPr>
@@ -3589,6 +3085,7 @@
             <w:pPr>
               <w:pStyle w:val="FigureText"/>
               <w:spacing w:before="6" w:after="6"/>
+              <w:jc w:val="left"/>
               <w:bidi w:val="0"/>
             </w:pPr>
             <w:r>
@@ -3784,6 +3281,7 @@
             <w:pPr>
               <w:pStyle w:val="FigureText"/>
               <w:spacing w:before="6" w:after="6"/>
+              <w:jc w:val="left"/>
               <w:bidi w:val="0"/>
             </w:pPr>
             <w:r>
@@ -4030,7 +3528,7 @@
           <w:rtl/>
           <w:szCs w:val="18"/>
         </w:rPr>
-        <w:t xml:space="preserve"> است. داده‌های تراکنشی بیش‌پراکندگی شدید نشان می‌دهند (نسبت واریانس به میانگین تجربی </w:t>
+        <w:t xml:space="preserve"> است. داده‌های تراکنشی بیش‌پراکندگی شدید نشان می‌دهند (</w:t>
       </w:r>
       <w:r>
         <w:rPr>
@@ -4102,7 +3600,25 @@
           <w:rtl/>
           <w:szCs w:val="18"/>
         </w:rPr>
-        <w:t xml:space="preserve">] ≈ ۳٫۲۴) که استفاده از توزیع دوجمله‌ای منفی را نسبت به مدل پواسون توجیه می‌کند. لذا مدل بر مبنای معماری توجه گراف زمانی برگرفته از </w:t>
+        <w:t xml:space="preserve">] ≈ </w:t>
+      </w:r>
+      <w:r>
+        <w:rPr>
+          <w:rFonts w:ascii="Times New Roman" w:hAnsi="Times New Roman" w:cs="Times New Roman"/>
+          <w:bidi w:val="0"/>
+          <w:sz w:val="17"/>
+          <w:szCs w:val="17"/>
+        </w:rPr>
+        <w:t>3.24</w:t>
+      </w:r>
+      <w:r>
+        <w:rPr>
+          <w:rFonts w:hint="cs" w:ascii="B Mitra" w:hAnsi="B Mitra" w:cs="B Mitra"/>
+          <w:sz w:val="18"/>
+          <w:rtl/>
+          <w:szCs w:val="18"/>
+        </w:rPr>
+        <w:t xml:space="preserve">) که استفاده از توزیع دوجمله‌ای منفی را نسبت به مدل پواسون توجیه می‌کند. لذا مدل بر مبنای معماری توجه گراف زمانی برگرفته از </w:t>
       </w:r>
       <w:r>
         <w:rPr>
@@ -4180,6 +3696,7 @@
             <w:pPr>
               <w:pStyle w:val="FigureText"/>
               <w:spacing w:before="6" w:after="6"/>
+              <w:jc w:val="left"/>
               <w:bidi w:val="0"/>
             </w:pPr>
             <w:r>
@@ -4401,115 +3918,7 @@
           <w:rtl/>
           <w:szCs w:val="18"/>
         </w:rPr>
-        <w:t xml:space="preserve">-دوره ۳ برازش نهایی، دوره ۴ واسنجی کاملاً تمیز بر داده‌های طبیعی دست‌نخورده، و دوره ۵ پنجره آزمون و اعمال افت فرصت. بر روی داده‌های کاملاً طبیعی دوره ۴، پسماندهای یک‌طرفه </w:t>
-      </w:r>
-      <w:r>
-        <w:rPr>
-          <w:rFonts w:ascii="Times New Roman" w:hAnsi="Times New Roman" w:cs="Times New Roman"/>
-          <w:bidi w:val="0"/>
-          <w:sz w:val="17"/>
-          <w:szCs w:val="17"/>
-        </w:rPr>
-        <w:t>R_m</w:t>
-      </w:r>
-      <w:r>
-        <w:rPr>
-          <w:rFonts w:hint="cs" w:ascii="B Mitra" w:hAnsi="B Mitra" w:cs="B Mitra"/>
-          <w:sz w:val="18"/>
-          <w:rtl/>
-          <w:szCs w:val="18"/>
-        </w:rPr>
-        <w:t xml:space="preserve"> = </w:t>
-      </w:r>
-      <w:r>
-        <w:rPr>
-          <w:rFonts w:ascii="Times New Roman" w:hAnsi="Times New Roman" w:cs="Times New Roman"/>
-          <w:bidi w:val="0"/>
-          <w:sz w:val="17"/>
-          <w:szCs w:val="17"/>
-        </w:rPr>
-        <w:t>max</w:t>
-      </w:r>
-      <w:r>
-        <w:rPr>
-          <w:rFonts w:hint="cs" w:ascii="B Mitra" w:hAnsi="B Mitra" w:cs="B Mitra"/>
-          <w:sz w:val="18"/>
-          <w:rtl/>
-          <w:szCs w:val="18"/>
-        </w:rPr>
-        <w:t>(</w:t>
-      </w:r>
-      <w:r>
-        <w:rPr>
-          <w:rFonts w:ascii="Times New Roman" w:hAnsi="Times New Roman" w:cs="Times New Roman"/>
-          <w:bidi w:val="0"/>
-          <w:sz w:val="17"/>
-          <w:szCs w:val="17"/>
-        </w:rPr>
-        <w:t>0</w:t>
-      </w:r>
-      <w:r>
-        <w:rPr>
-          <w:rFonts w:hint="cs" w:ascii="B Mitra" w:hAnsi="B Mitra" w:cs="B Mitra"/>
-          <w:sz w:val="18"/>
-          <w:rtl/>
-          <w:szCs w:val="18"/>
-        </w:rPr>
-        <w:t xml:space="preserve">, </w:t>
-      </w:r>
-      <w:r>
-        <w:rPr>
-          <w:rFonts w:ascii="Times New Roman" w:hAnsi="Times New Roman" w:cs="Times New Roman"/>
-          <w:bidi w:val="0"/>
-          <w:sz w:val="17"/>
-          <w:szCs w:val="17"/>
-        </w:rPr>
-        <w:t>Y_m</w:t>
-      </w:r>
-      <w:r>
-        <w:rPr>
-          <w:rFonts w:hint="cs" w:ascii="B Mitra" w:hAnsi="B Mitra" w:cs="B Mitra"/>
-          <w:sz w:val="18"/>
-          <w:rtl/>
-          <w:szCs w:val="18"/>
-        </w:rPr>
-        <w:t xml:space="preserve"> - </w:t>
-      </w:r>
-      <w:r>
-        <w:rPr>
-          <w:rFonts w:ascii="Times New Roman" w:hAnsi="Times New Roman" w:cs="Times New Roman"/>
-          <w:bidi w:val="0"/>
-          <w:sz w:val="17"/>
-          <w:szCs w:val="17"/>
-        </w:rPr>
-        <w:t>μ</w:t>
-      </w:r>
-      <w:r>
-        <w:rPr>
-          <w:rFonts w:hint="cs" w:ascii="B Mitra" w:hAnsi="B Mitra" w:cs="B Mitra"/>
-          <w:sz w:val="18"/>
-          <w:rtl/>
-          <w:szCs w:val="18"/>
-        </w:rPr>
-        <w:t>̂_</w:t>
-      </w:r>
-      <w:r>
-        <w:rPr>
-          <w:rFonts w:ascii="Times New Roman" w:hAnsi="Times New Roman" w:cs="Times New Roman"/>
-          <w:bidi w:val="0"/>
-          <w:sz w:val="17"/>
-          <w:szCs w:val="17"/>
-        </w:rPr>
-        <w:t>m</w:t>
-      </w:r>
-      <w:r>
-        <w:rPr>
-          <w:rFonts w:hint="cs" w:ascii="B Mitra" w:hAnsi="B Mitra" w:cs="B Mitra"/>
-          <w:sz w:val="18"/>
-          <w:rtl/>
-          <w:szCs w:val="18"/>
-        </w:rPr>
-        <w:t xml:space="preserve">) نوسانات مثبت طبیعی را می‌سنجند </w:t>
+        <w:t xml:space="preserve">-دوره ۳ برازش نهایی، دوره ۴ واسنجی کاملاً تمیز بر داده‌های طبیعی دست‌نخورده، و دوره ۵ پنجره آزمون و اعمال افت فرصت. بر روی داده‌های کاملاً طبیعی دوره ۴، پسماندهای یک‌طرفه نوسانات مثبت طبیعی را می‌سنجند </w:t>
       </w:r>
       <w:r>
         <w:rPr>
@@ -4527,7 +3936,51 @@
           <w:rtl/>
           <w:szCs w:val="18"/>
         </w:rPr>
-        <w:t xml:space="preserve">. با در نظر گرفتن سطح خطای اسمی </w:t>
+        <w:t>:</w:t>
+      </w:r>
+    </w:p>
+    <w:p>
+      <w:pPr>
+        <w:pStyle w:val="FigureText"/>
+        <w:spacing w:before="24" w:after="24" w:line="228" w:lineRule="auto"/>
+        <w:ind w:left="170"/>
+        <w:jc w:val="left"/>
+        <w:bidi w:val="0"/>
+      </w:pPr>
+      <w:r>
+        <w:rPr>
+          <w:rFonts w:ascii="Times New Roman" w:hAnsi="Times New Roman" w:cs="Times New Roman"/>
+          <w:iCs/>
+          <w:i/>
+          <w:bidi w:val="0"/>
+          <w:sz w:val="17"/>
+          <w:szCs w:val="17"/>
+        </w:rPr>
+        <w:t>R</w:t>
+      </w:r>
+      <w:r>
+        <w:rPr>
+          <w:rFonts w:ascii="Times New Roman" w:hAnsi="Times New Roman" w:cs="Times New Roman"/>
+          <w:bidi w:val="0"/>
+          <w:sz w:val="17"/>
+          <w:szCs w:val="17"/>
+        </w:rPr>
+        <w:t>_m = max( 0 , Y_m - μ̂_m )</w:t>
+      </w:r>
+    </w:p>
+    <w:p>
+      <w:pPr>
+        <w:pStyle w:val="Text"/>
+        <w:spacing w:before="0" w:after="20" w:line="226" w:lineRule="auto"/>
+      </w:pPr>
+      <w:r>
+        <w:rPr>
+          <w:rFonts w:hint="cs" w:ascii="B Mitra" w:hAnsi="B Mitra" w:cs="B Mitra"/>
+          <w:sz w:val="18"/>
+          <w:rtl/>
+          <w:szCs w:val="18"/>
+        </w:rPr>
+        <w:t xml:space="preserve">با در نظر گرفتن سطح خطای اسمی </w:t>
       </w:r>
       <w:r>
         <w:rPr>
@@ -4545,25 +3998,54 @@
           <w:rtl/>
           <w:szCs w:val="18"/>
         </w:rPr>
-        <w:t xml:space="preserve"> = ۰٫۱۵، صدک </w:t>
-      </w:r>
-      <w:r>
-        <w:rPr>
-          <w:rFonts w:ascii="Times New Roman" w:hAnsi="Times New Roman" w:cs="Times New Roman"/>
-          <w:bidi w:val="0"/>
-          <w:sz w:val="17"/>
-          <w:szCs w:val="17"/>
-        </w:rPr>
-        <w:t>q_0.85</w:t>
-      </w:r>
-      <w:r>
-        <w:rPr>
-          <w:rFonts w:hint="cs" w:ascii="B Mitra" w:hAnsi="B Mitra" w:cs="B Mitra"/>
-          <w:sz w:val="18"/>
-          <w:rtl/>
-          <w:szCs w:val="18"/>
-        </w:rPr>
-        <w:t xml:space="preserve"> استخراج شده و کران بالای طبیعی عملکرد پیش‌بینی تعیین می‌شود:</w:t>
+        <w:t xml:space="preserve"> = ۰٫۱۵، صدک واسنجی‌شده استخراج شده و کران بالای طبیعی عملکرد پیش‌بینی مطابق رابطه (</w:t>
+      </w:r>
+      <w:r>
+        <w:rPr>
+          <w:rFonts w:ascii="Times New Roman" w:hAnsi="Times New Roman" w:cs="Times New Roman"/>
+          <w:bidi w:val="0"/>
+          <w:sz w:val="17"/>
+          <w:szCs w:val="17"/>
+        </w:rPr>
+        <w:t>5</w:t>
+      </w:r>
+      <w:r>
+        <w:rPr>
+          <w:rFonts w:hint="cs" w:ascii="B Mitra" w:hAnsi="B Mitra" w:cs="B Mitra"/>
+          <w:sz w:val="18"/>
+          <w:rtl/>
+          <w:szCs w:val="18"/>
+        </w:rPr>
+        <w:t>) تعیین می‌شود:</w:t>
+      </w:r>
+    </w:p>
+    <w:p>
+      <w:pPr>
+        <w:pStyle w:val="FigureText"/>
+        <w:spacing w:before="24" w:after="24" w:line="228" w:lineRule="auto"/>
+        <w:ind w:left="170"/>
+        <w:jc w:val="left"/>
+        <w:bidi w:val="0"/>
+      </w:pPr>
+      <w:r>
+        <w:rPr>
+          <w:rFonts w:ascii="Times New Roman" w:hAnsi="Times New Roman" w:cs="Times New Roman"/>
+          <w:iCs/>
+          <w:i/>
+          <w:bidi w:val="0"/>
+          <w:sz w:val="17"/>
+          <w:szCs w:val="17"/>
+        </w:rPr>
+        <w:t>q</w:t>
+      </w:r>
+      <w:r>
+        <w:rPr>
+          <w:rFonts w:ascii="Times New Roman" w:hAnsi="Times New Roman" w:cs="Times New Roman"/>
+          <w:bidi w:val="0"/>
+          <w:sz w:val="17"/>
+          <w:szCs w:val="17"/>
+        </w:rPr>
+        <w:t>_{0.85} = Quantile_{0.85}( { R_m } )</w:t>
       </w:r>
     </w:p>
     <w:tbl>
@@ -4623,6 +4105,7 @@
             <w:pPr>
               <w:pStyle w:val="FigureText"/>
               <w:spacing w:before="6" w:after="6"/>
+              <w:jc w:val="left"/>
               <w:bidi w:val="0"/>
             </w:pPr>
             <w:r>
@@ -4754,16 +4237,16 @@
           <w:rtl/>
           <w:szCs w:val="18"/>
         </w:rPr>
-        <w:t>برای جلوگیری از خوش‌بینی مفرط، بنچ‌مارک همتایان بر پایه کران پایین پیش‌بینی همتایان (</w:t>
-      </w:r>
-      <w:r>
-        <w:rPr>
-          <w:rFonts w:ascii="Times New Roman" w:hAnsi="Times New Roman" w:cs="Times New Roman"/>
-          <w:bidi w:val="0"/>
-          <w:sz w:val="17"/>
-          <w:szCs w:val="17"/>
-        </w:rPr>
-        <w:t>L_j</w:t>
+        <w:t xml:space="preserve">برای جلوگیری از خوش‌بینی مفرط، بنچ‌مارک همتایان بر پایه کران پایین پیش‌بینی همتایان با مقدار واسنجی‌شده یکسان </w:t>
+      </w:r>
+      <w:r>
+        <w:rPr>
+          <w:rFonts w:ascii="Times New Roman" w:hAnsi="Times New Roman" w:cs="Times New Roman"/>
+          <w:bidi w:val="0"/>
+          <w:sz w:val="17"/>
+          <w:szCs w:val="17"/>
+        </w:rPr>
+        <w:t>q_j</w:t>
       </w:r>
       <w:r>
         <w:rPr>
@@ -4781,114 +4264,6 @@
           <w:sz w:val="17"/>
           <w:szCs w:val="17"/>
         </w:rPr>
-        <w:t>max</w:t>
-      </w:r>
-      <w:r>
-        <w:rPr>
-          <w:rFonts w:hint="cs" w:ascii="B Mitra" w:hAnsi="B Mitra" w:cs="B Mitra"/>
-          <w:sz w:val="18"/>
-          <w:rtl/>
-          <w:szCs w:val="18"/>
-        </w:rPr>
-        <w:t>(</w:t>
-      </w:r>
-      <w:r>
-        <w:rPr>
-          <w:rFonts w:ascii="Times New Roman" w:hAnsi="Times New Roman" w:cs="Times New Roman"/>
-          <w:bidi w:val="0"/>
-          <w:sz w:val="17"/>
-          <w:szCs w:val="17"/>
-        </w:rPr>
-        <w:t>0</w:t>
-      </w:r>
-      <w:r>
-        <w:rPr>
-          <w:rFonts w:hint="cs" w:ascii="B Mitra" w:hAnsi="B Mitra" w:cs="B Mitra"/>
-          <w:sz w:val="18"/>
-          <w:rtl/>
-          <w:szCs w:val="18"/>
-        </w:rPr>
-        <w:t xml:space="preserve">, </w:t>
-      </w:r>
-      <w:r>
-        <w:rPr>
-          <w:rFonts w:ascii="Times New Roman" w:hAnsi="Times New Roman" w:cs="Times New Roman"/>
-          <w:bidi w:val="0"/>
-          <w:sz w:val="17"/>
-          <w:szCs w:val="17"/>
-        </w:rPr>
-        <w:t>μ</w:t>
-      </w:r>
-      <w:r>
-        <w:rPr>
-          <w:rFonts w:hint="cs" w:ascii="B Mitra" w:hAnsi="B Mitra" w:cs="B Mitra"/>
-          <w:sz w:val="18"/>
-          <w:rtl/>
-          <w:szCs w:val="18"/>
-        </w:rPr>
-        <w:t>̂_</w:t>
-      </w:r>
-      <w:r>
-        <w:rPr>
-          <w:rFonts w:ascii="Times New Roman" w:hAnsi="Times New Roman" w:cs="Times New Roman"/>
-          <w:bidi w:val="0"/>
-          <w:sz w:val="17"/>
-          <w:szCs w:val="17"/>
-        </w:rPr>
-        <w:t>j</w:t>
-      </w:r>
-      <w:r>
-        <w:rPr>
-          <w:rFonts w:hint="cs" w:ascii="B Mitra" w:hAnsi="B Mitra" w:cs="B Mitra"/>
-          <w:sz w:val="18"/>
-          <w:rtl/>
-          <w:szCs w:val="18"/>
-        </w:rPr>
-        <w:t xml:space="preserve"> - </w:t>
-      </w:r>
-      <w:r>
-        <w:rPr>
-          <w:rFonts w:ascii="Times New Roman" w:hAnsi="Times New Roman" w:cs="Times New Roman"/>
-          <w:bidi w:val="0"/>
-          <w:sz w:val="17"/>
-          <w:szCs w:val="17"/>
-        </w:rPr>
-        <w:t>q_j</w:t>
-      </w:r>
-      <w:r>
-        <w:rPr>
-          <w:rFonts w:hint="cs" w:ascii="B Mitra" w:hAnsi="B Mitra" w:cs="B Mitra"/>
-          <w:sz w:val="18"/>
-          <w:rtl/>
-          <w:szCs w:val="18"/>
-        </w:rPr>
-        <w:t xml:space="preserve">)) با مقدار واسنجی‌شده یکسان </w:t>
-      </w:r>
-      <w:r>
-        <w:rPr>
-          <w:rFonts w:ascii="Times New Roman" w:hAnsi="Times New Roman" w:cs="Times New Roman"/>
-          <w:bidi w:val="0"/>
-          <w:sz w:val="17"/>
-          <w:szCs w:val="17"/>
-        </w:rPr>
-        <w:t>q_j</w:t>
-      </w:r>
-      <w:r>
-        <w:rPr>
-          <w:rFonts w:hint="cs" w:ascii="B Mitra" w:hAnsi="B Mitra" w:cs="B Mitra"/>
-          <w:sz w:val="18"/>
-          <w:rtl/>
-          <w:szCs w:val="18"/>
-        </w:rPr>
-        <w:t xml:space="preserve"> = </w:t>
-      </w:r>
-      <w:r>
-        <w:rPr>
-          <w:rFonts w:ascii="Times New Roman" w:hAnsi="Times New Roman" w:cs="Times New Roman"/>
-          <w:bidi w:val="0"/>
-          <w:sz w:val="17"/>
-          <w:szCs w:val="17"/>
-        </w:rPr>
         <w:t>q_0.85</w:t>
       </w:r>
       <w:r>
@@ -4899,6 +4274,68 @@
           <w:szCs w:val="18"/>
         </w:rPr>
         <w:t xml:space="preserve"> تعریف می‌گردد:</w:t>
+      </w:r>
+    </w:p>
+    <w:p>
+      <w:pPr>
+        <w:pStyle w:val="FigureText"/>
+        <w:spacing w:before="24" w:after="24" w:line="228" w:lineRule="auto"/>
+        <w:ind w:left="170"/>
+        <w:jc w:val="left"/>
+        <w:bidi w:val="0"/>
+      </w:pPr>
+      <w:r>
+        <w:rPr>
+          <w:rFonts w:ascii="Times New Roman" w:hAnsi="Times New Roman" w:cs="Times New Roman"/>
+          <w:iCs/>
+          <w:i/>
+          <w:bidi w:val="0"/>
+          <w:sz w:val="17"/>
+          <w:szCs w:val="17"/>
+        </w:rPr>
+        <w:t>L</w:t>
+      </w:r>
+      <w:r>
+        <w:rPr>
+          <w:rFonts w:ascii="Times New Roman" w:hAnsi="Times New Roman" w:cs="Times New Roman"/>
+          <w:bidi w:val="0"/>
+          <w:sz w:val="17"/>
+          <w:szCs w:val="17"/>
+        </w:rPr>
+        <w:t>_j = max( 0 , μ̂_j - q_j )</w:t>
+      </w:r>
+    </w:p>
+    <w:p>
+      <w:pPr>
+        <w:pStyle w:val="Text"/>
+        <w:spacing w:before="0" w:after="20" w:line="226" w:lineRule="auto"/>
+      </w:pPr>
+      <w:r>
+        <w:rPr>
+          <w:rFonts w:hint="cs" w:ascii="B Mitra" w:hAnsi="B Mitra" w:cs="B Mitra"/>
+          <w:sz w:val="18"/>
+          <w:rtl/>
+          <w:szCs w:val="18"/>
+        </w:rPr>
+        <w:t>سپس بنچ‌مارک محافظه‌کارانه همتایان مطابق رابطه (</w:t>
+      </w:r>
+      <w:r>
+        <w:rPr>
+          <w:rFonts w:ascii="Times New Roman" w:hAnsi="Times New Roman" w:cs="Times New Roman"/>
+          <w:bidi w:val="0"/>
+          <w:sz w:val="17"/>
+          <w:szCs w:val="17"/>
+        </w:rPr>
+        <w:t>6</w:t>
+      </w:r>
+      <w:r>
+        <w:rPr>
+          <w:rFonts w:hint="cs" w:ascii="B Mitra" w:hAnsi="B Mitra" w:cs="B Mitra"/>
+          <w:sz w:val="18"/>
+          <w:rtl/>
+          <w:szCs w:val="18"/>
+        </w:rPr>
+        <w:t>) فرمول‌بندی می‌شود:</w:t>
       </w:r>
     </w:p>
     <w:tbl>
@@ -4958,6 +4395,7 @@
             <w:pPr>
               <w:pStyle w:val="FigureText"/>
               <w:spacing w:before="6" w:after="6"/>
+              <w:jc w:val="left"/>
               <w:bidi w:val="0"/>
             </w:pPr>
             <w:r>
@@ -5211,6 +4649,7 @@
             <w:pPr>
               <w:pStyle w:val="FigureText"/>
               <w:spacing w:before="6" w:after="6"/>
+              <w:jc w:val="left"/>
               <w:bidi w:val="0"/>
             </w:pPr>
             <w:r>
@@ -5294,6 +4733,7 @@
             <w:pPr>
               <w:pStyle w:val="FigureText"/>
               <w:spacing w:before="6" w:after="6"/>
+              <w:jc w:val="left"/>
               <w:bidi w:val="0"/>
             </w:pPr>
             <w:r>
@@ -5875,61 +5315,7 @@
           <w:rtl/>
           <w:szCs w:val="18"/>
         </w:rPr>
-        <w:t xml:space="preserve"> = ۰٫۹۰ است. بنابراین شکاف کران-پیش‌بینی همتایان معادل </w:t>
-      </w:r>
-      <w:r>
-        <w:rPr>
-          <w:rFonts w:ascii="Times New Roman" w:hAnsi="Times New Roman" w:cs="Times New Roman"/>
-          <w:bidi w:val="0"/>
-          <w:sz w:val="17"/>
-          <w:szCs w:val="17"/>
-        </w:rPr>
-        <w:t>B</w:t>
-      </w:r>
-      <w:r>
-        <w:rPr>
-          <w:rFonts w:hint="cs" w:ascii="B Mitra" w:hAnsi="B Mitra" w:cs="B Mitra"/>
-          <w:sz w:val="18"/>
-          <w:rtl/>
-          <w:szCs w:val="18"/>
-        </w:rPr>
-        <w:t>^</w:t>
-      </w:r>
-      <w:r>
-        <w:rPr>
-          <w:rFonts w:ascii="Times New Roman" w:hAnsi="Times New Roman" w:cs="Times New Roman"/>
-          <w:bidi w:val="0"/>
-          <w:sz w:val="17"/>
-          <w:szCs w:val="17"/>
-        </w:rPr>
-        <w:t>G</w:t>
-      </w:r>
-      <w:r>
-        <w:rPr>
-          <w:rFonts w:hint="cs" w:ascii="B Mitra" w:hAnsi="B Mitra" w:cs="B Mitra"/>
-          <w:sz w:val="18"/>
-          <w:rtl/>
-          <w:szCs w:val="18"/>
-        </w:rPr>
-        <w:t xml:space="preserve"> - </w:t>
-      </w:r>
-      <w:r>
-        <w:rPr>
-          <w:rFonts w:ascii="Times New Roman" w:hAnsi="Times New Roman" w:cs="Times New Roman"/>
-          <w:bidi w:val="0"/>
-          <w:sz w:val="17"/>
-          <w:szCs w:val="17"/>
-        </w:rPr>
-        <w:t>U</w:t>
-      </w:r>
-      <w:r>
-        <w:rPr>
-          <w:rFonts w:hint="cs" w:ascii="B Mitra" w:hAnsi="B Mitra" w:cs="B Mitra"/>
-          <w:sz w:val="18"/>
-          <w:rtl/>
-          <w:szCs w:val="18"/>
-        </w:rPr>
-        <w:t xml:space="preserve"> = ۱۷۰٫۰ - ۱۱۲٫۰ = ۵۸٫۰ (شکاف نسبی ۰٫۳۴۱۲) بوده و امتیاز </w:t>
+        <w:t xml:space="preserve"> = ۰٫۹۰ است. بنابراین شکاف کران-پیش‌بینی همتایان و امتیاز </w:t>
       </w:r>
       <w:r>
         <w:rPr>
@@ -5947,7 +5333,58 @@
           <w:rtl/>
           <w:szCs w:val="18"/>
         </w:rPr>
-        <w:t xml:space="preserve"> برابر ۰٫۳۰۷ = ۰٫۳۴۱۲ × ۰٫۹۰ محاسبه می‌شود. تفسیر دقیق: این پذیرنده واجد ۵۸ تراکنش شکاف کران-پیش‌بینی نسبت به سقف طبیعی خود تا بنچ‌مارک همتایان است (در حالی که تفاوت با عملکرد فعلی ۷۰ تراکنش است).</w:t>
+        <w:t xml:space="preserve"> به صورت زیر محاسبه می‌شوند:</w:t>
+      </w:r>
+    </w:p>
+    <w:p>
+      <w:pPr>
+        <w:pStyle w:val="FigureText"/>
+        <w:spacing w:before="24" w:after="24" w:line="228" w:lineRule="auto"/>
+        <w:ind w:left="170"/>
+        <w:jc w:val="left"/>
+        <w:bidi w:val="0"/>
+      </w:pPr>
+      <w:r>
+        <w:rPr>
+          <w:rFonts w:ascii="Times New Roman" w:hAnsi="Times New Roman" w:cs="Times New Roman"/>
+          <w:bidi w:val="0"/>
+          <w:sz w:val="17"/>
+          <w:szCs w:val="17"/>
+        </w:rPr>
+        <w:t>B^G - U = 170.0 - 112.0 = 58.0   (Relative Gap = 0.3412)</w:t>
+      </w:r>
+    </w:p>
+    <w:p>
+      <w:pPr>
+        <w:pStyle w:val="FigureText"/>
+        <w:spacing w:before="24" w:after="24" w:line="228" w:lineRule="auto"/>
+        <w:ind w:left="170"/>
+        <w:jc w:val="left"/>
+        <w:bidi w:val="0"/>
+      </w:pPr>
+      <w:r>
+        <w:rPr>
+          <w:rFonts w:ascii="Times New Roman" w:hAnsi="Times New Roman" w:cs="Times New Roman"/>
+          <w:bidi w:val="0"/>
+          <w:sz w:val="17"/>
+          <w:szCs w:val="17"/>
+        </w:rPr>
+        <w:t>M-GATO = 0.3412 × 0.90 = 0.307</w:t>
+      </w:r>
+    </w:p>
+    <w:p>
+      <w:pPr>
+        <w:pStyle w:val="Text"/>
+        <w:spacing w:before="0" w:after="20" w:line="226" w:lineRule="auto"/>
+      </w:pPr>
+      <w:r>
+        <w:rPr>
+          <w:rFonts w:hint="cs" w:ascii="B Mitra" w:hAnsi="B Mitra" w:cs="B Mitra"/>
+          <w:sz w:val="18"/>
+          <w:rtl/>
+          <w:szCs w:val="18"/>
+        </w:rPr>
+        <w:t>تفسیر دقیق: این پذیرنده واجد ۵۸ تراکنش شکاف کران-پیش‌بینی نسبت به سقف طبیعی خود تا بنچ‌مارک همتایان است (در حالی که تفاوت با عملکرد فعلی ۷۰ تراکنش است).</w:t>
       </w:r>
     </w:p>
     <w:p>
@@ -16939,16 +16376,16 @@
           <w:rtl/>
           <w:szCs w:val="18"/>
         </w:rPr>
-        <w:t xml:space="preserve"> را در ۰٫۳۲۷ ± ۰٫۰۷۷ تثبیت می‌نماید. همچنین ضریب پیوسته اتکای فعالیت </w:t>
-      </w:r>
-      <w:r>
-        <w:rPr>
-          <w:rFonts w:ascii="Times New Roman" w:hAnsi="Times New Roman" w:cs="Times New Roman"/>
-          <w:bidi w:val="0"/>
-          <w:sz w:val="17"/>
-          <w:szCs w:val="17"/>
-        </w:rPr>
-        <w:t>Q_total</w:t>
+        <w:t xml:space="preserve"> را در ۰٫۳۲۷ ± ۰٫۰۷۷ تثبیت می‌نماید. همچنین ضریب پیوسته اتکای فعالیت با </w:t>
+      </w:r>
+      <w:r>
+        <w:rPr>
+          <w:rFonts w:ascii="Times New Roman" w:hAnsi="Times New Roman" w:cs="Times New Roman"/>
+          <w:bidi w:val="0"/>
+          <w:sz w:val="17"/>
+          <w:szCs w:val="17"/>
+        </w:rPr>
+        <w:t>τ_a</w:t>
       </w:r>
       <w:r>
         <w:rPr>
@@ -16966,114 +16403,6 @@
           <w:sz w:val="17"/>
           <w:szCs w:val="17"/>
         </w:rPr>
-        <w:t>Q_graph</w:t>
-      </w:r>
-      <w:r>
-        <w:rPr>
-          <w:rFonts w:hint="cs" w:ascii="B Mitra" w:hAnsi="B Mitra" w:cs="B Mitra"/>
-          <w:sz w:val="18"/>
-          <w:rtl/>
-          <w:szCs w:val="18"/>
-        </w:rPr>
-        <w:t xml:space="preserve"> · (</w:t>
-      </w:r>
-      <w:r>
-        <w:rPr>
-          <w:rFonts w:ascii="Times New Roman" w:hAnsi="Times New Roman" w:cs="Times New Roman"/>
-          <w:bidi w:val="0"/>
-          <w:sz w:val="17"/>
-          <w:szCs w:val="17"/>
-        </w:rPr>
-        <w:t>1</w:t>
-      </w:r>
-      <w:r>
-        <w:rPr>
-          <w:rFonts w:hint="cs" w:ascii="B Mitra" w:hAnsi="B Mitra" w:cs="B Mitra"/>
-          <w:sz w:val="18"/>
-          <w:rtl/>
-          <w:szCs w:val="18"/>
-        </w:rPr>
-        <w:t xml:space="preserve"> - </w:t>
-      </w:r>
-      <w:r>
-        <w:rPr>
-          <w:rFonts w:ascii="Times New Roman" w:hAnsi="Times New Roman" w:cs="Times New Roman"/>
-          <w:bidi w:val="0"/>
-          <w:sz w:val="17"/>
-          <w:szCs w:val="17"/>
-        </w:rPr>
-        <w:t>exp</w:t>
-      </w:r>
-      <w:r>
-        <w:rPr>
-          <w:rFonts w:hint="cs" w:ascii="B Mitra" w:hAnsi="B Mitra" w:cs="B Mitra"/>
-          <w:sz w:val="18"/>
-          <w:rtl/>
-          <w:szCs w:val="18"/>
-        </w:rPr>
-        <w:t>(-</w:t>
-      </w:r>
-      <w:r>
-        <w:rPr>
-          <w:rFonts w:ascii="Times New Roman" w:hAnsi="Times New Roman" w:cs="Times New Roman"/>
-          <w:bidi w:val="0"/>
-          <w:sz w:val="17"/>
-          <w:szCs w:val="17"/>
-        </w:rPr>
-        <w:t>Y_m</w:t>
-      </w:r>
-      <w:r>
-        <w:rPr>
-          <w:rFonts w:hint="cs" w:ascii="B Mitra" w:hAnsi="B Mitra" w:cs="B Mitra"/>
-          <w:sz w:val="18"/>
-          <w:rtl/>
-          <w:szCs w:val="18"/>
-        </w:rPr>
-        <w:t xml:space="preserve"> / </w:t>
-      </w:r>
-      <w:r>
-        <w:rPr>
-          <w:rFonts w:ascii="Times New Roman" w:hAnsi="Times New Roman" w:cs="Times New Roman"/>
-          <w:bidi w:val="0"/>
-          <w:sz w:val="17"/>
-          <w:szCs w:val="17"/>
-        </w:rPr>
-        <w:t>τ_a</w:t>
-      </w:r>
-      <w:r>
-        <w:rPr>
-          <w:rFonts w:hint="cs" w:ascii="B Mitra" w:hAnsi="B Mitra" w:cs="B Mitra"/>
-          <w:sz w:val="18"/>
-          <w:rtl/>
-          <w:szCs w:val="18"/>
-        </w:rPr>
-        <w:t xml:space="preserve">)) با </w:t>
-      </w:r>
-      <w:r>
-        <w:rPr>
-          <w:rFonts w:ascii="Times New Roman" w:hAnsi="Times New Roman" w:cs="Times New Roman"/>
-          <w:bidi w:val="0"/>
-          <w:sz w:val="17"/>
-          <w:szCs w:val="17"/>
-        </w:rPr>
-        <w:t>τ_a</w:t>
-      </w:r>
-      <w:r>
-        <w:rPr>
-          <w:rFonts w:hint="cs" w:ascii="B Mitra" w:hAnsi="B Mitra" w:cs="B Mitra"/>
-          <w:sz w:val="18"/>
-          <w:rtl/>
-          <w:szCs w:val="18"/>
-        </w:rPr>
-        <w:t xml:space="preserve"> = </w:t>
-      </w:r>
-      <w:r>
-        <w:rPr>
-          <w:rFonts w:ascii="Times New Roman" w:hAnsi="Times New Roman" w:cs="Times New Roman"/>
-          <w:bidi w:val="0"/>
-          <w:sz w:val="17"/>
-          <w:szCs w:val="17"/>
-        </w:rPr>
         <w:t>15</w:t>
       </w:r>
       <w:r>
@@ -17083,7 +16412,25 @@
           <w:rtl/>
           <w:szCs w:val="18"/>
         </w:rPr>
-        <w:t xml:space="preserve"> به عنوان نسخه عملیاتی توصیه‌شده (به جای فیلتر آستانه‌ای سخت)، نوسانات پذیرندگان بسیار خرد را مهار می‌سازد.</w:t>
+        <w:t xml:space="preserve"> به عنوان نسخه عملیاتی توصیه‌شده (به جای فیلتر آستانه‌ای سخت)، نوسانات پذیرندگان بسیار خرد را مهار می‌سازد:</w:t>
+      </w:r>
+    </w:p>
+    <w:p>
+      <w:pPr>
+        <w:pStyle w:val="FigureText"/>
+        <w:spacing w:before="24" w:after="24" w:line="228" w:lineRule="auto"/>
+        <w:ind w:left="170"/>
+        <w:jc w:val="left"/>
+        <w:bidi w:val="0"/>
+      </w:pPr>
+      <w:r>
+        <w:rPr>
+          <w:rFonts w:ascii="Times New Roman" w:hAnsi="Times New Roman" w:cs="Times New Roman"/>
+          <w:bidi w:val="0"/>
+          <w:sz w:val="17"/>
+          <w:szCs w:val="17"/>
+        </w:rPr>
+        <w:t>Q_total = Q_graph · ( 1 - exp( -Y_m / τ_a ) )</w:t>
       </w:r>
     </w:p>
     <w:p>

</xml_diff>

<commit_message>
fix(manuscript-fa): enforce strict LTR direction for all inline math equalities and parameter assignments
- Enhance regex tokenizer to capture math expressions with operators (=, <, >, >=, etc.) as unified Latin tokens
- Wrap all Latin runs with Unicode Left-to-Right Mark (LRM \u200E) to prevent BiDi inversion (e.g. 0.25=η -> η = 0.25)
- Standardize all inline parameters (λ = 0.65, η = 0.25, K = 10, p = 0.015, TP = 0, Coverage = 86.2 ± 3.1%) to Latin format
- Recompile FA_From_Transactional_Data_to_Organizational_Intelligence.docx
</commit_message>
<xml_diff>
--- a/FA_From_Transactional_Data_to_Organizational_Intelligence.docx
+++ b/FA_From_Transactional_Data_to_Organizational_Intelligence.docx
@@ -157,7 +157,7 @@
           <w:sz w:val="17"/>
           <w:szCs w:val="17"/>
         </w:rPr>
-        <w:t>RFM</w:t>
+        <w:t>‎RFM‎</w:t>
       </w:r>
       <w:r>
         <w:rPr>
@@ -175,7 +175,7 @@
           <w:sz w:val="17"/>
           <w:szCs w:val="17"/>
         </w:rPr>
-        <w:t>HAMTA</w:t>
+        <w:t>‎HAMTA‎</w:t>
       </w:r>
       <w:r>
         <w:rPr>
@@ -193,7 +193,7 @@
           <w:sz w:val="17"/>
           <w:szCs w:val="17"/>
         </w:rPr>
-        <w:t>HAMTA</w:t>
+        <w:t>‎HAMTA‎</w:t>
       </w:r>
       <w:r>
         <w:rPr>
@@ -211,7 +211,7 @@
           <w:sz w:val="17"/>
           <w:szCs w:val="17"/>
         </w:rPr>
-        <w:t>M-GATO</w:t>
+        <w:t>‎M-GATO‎</w:t>
       </w:r>
       <w:r>
         <w:rPr>
@@ -229,7 +229,7 @@
           <w:sz w:val="17"/>
           <w:szCs w:val="17"/>
         </w:rPr>
-        <w:t>HAMTA</w:t>
+        <w:t>‎HAMTA‎</w:t>
       </w:r>
       <w:r>
         <w:rPr>
@@ -262,7 +262,7 @@
           <w:sz w:val="17"/>
           <w:szCs w:val="17"/>
         </w:rPr>
-        <w:t>HAMTA</w:t>
+        <w:t>‎HAMTA‎</w:t>
       </w:r>
       <w:r>
         <w:rPr>
@@ -280,7 +280,7 @@
           <w:sz w:val="17"/>
           <w:szCs w:val="17"/>
         </w:rPr>
-        <w:t>Decision-support component</w:t>
+        <w:t>‎Decision-support component‎</w:t>
       </w:r>
       <w:r>
         <w:rPr>
@@ -298,7 +298,7 @@
           <w:sz w:val="17"/>
           <w:szCs w:val="17"/>
         </w:rPr>
-        <w:t>M-GATO</w:t>
+        <w:t>‎M-GATO‎</w:t>
       </w:r>
       <w:r>
         <w:rPr>
@@ -379,7 +379,7 @@
           <w:sz w:val="20"/>
           <w:szCs w:val="20"/>
         </w:rPr>
-        <w:t>1</w:t>
+        <w:t>‎1‎</w:t>
       </w:r>
       <w:r>
         <w:rPr>
@@ -412,7 +412,7 @@
           <w:sz w:val="17"/>
           <w:szCs w:val="17"/>
         </w:rPr>
-        <w:t>PSP</w:t>
+        <w:t>‎PSP‎</w:t>
       </w:r>
       <w:r>
         <w:rPr>
@@ -430,43 +430,25 @@
           <w:sz w:val="17"/>
           <w:szCs w:val="17"/>
         </w:rPr>
-        <w:t>1</w:t>
-      </w:r>
-      <w:r>
-        <w:rPr>
-          <w:rFonts w:hint="cs" w:ascii="B Mitra" w:hAnsi="B Mitra" w:cs="B Mitra"/>
-          <w:sz w:val="18"/>
-          <w:rtl/>
-          <w:szCs w:val="18"/>
-        </w:rPr>
-        <w:t xml:space="preserve">, </w:t>
-      </w:r>
-      <w:r>
-        <w:rPr>
-          <w:rFonts w:ascii="Times New Roman" w:hAnsi="Times New Roman" w:cs="Times New Roman"/>
-          <w:bidi w:val="0"/>
-          <w:sz w:val="17"/>
-          <w:szCs w:val="17"/>
-        </w:rPr>
-        <w:t>2</w:t>
-      </w:r>
-      <w:r>
-        <w:rPr>
-          <w:rFonts w:hint="cs" w:ascii="B Mitra" w:hAnsi="B Mitra" w:cs="B Mitra"/>
-          <w:sz w:val="18"/>
-          <w:rtl/>
-          <w:szCs w:val="18"/>
-        </w:rPr>
-        <w:t xml:space="preserve">]. در سامانه‌های سنتی مدیریت پذیرندگان، اولویت‌بندی بازاریابی عموماً بر اساس شاخص‌های گذشته‌نگر جدولی نظیر ارزش ناخالص تسویه یا مدل‌های </w:t>
-      </w:r>
-      <w:r>
-        <w:rPr>
-          <w:rFonts w:ascii="Times New Roman" w:hAnsi="Times New Roman" w:cs="Times New Roman"/>
-          <w:bidi w:val="0"/>
-          <w:sz w:val="17"/>
-          <w:szCs w:val="17"/>
-        </w:rPr>
-        <w:t>RFM</w:t>
+        <w:t>‎1, 2]‎</w:t>
+      </w:r>
+      <w:r>
+        <w:rPr>
+          <w:rFonts w:hint="cs" w:ascii="B Mitra" w:hAnsi="B Mitra" w:cs="B Mitra"/>
+          <w:sz w:val="18"/>
+          <w:rtl/>
+          <w:szCs w:val="18"/>
+        </w:rPr>
+        <w:t xml:space="preserve">. در سامانه‌های سنتی مدیریت پذیرندگان، اولویت‌بندی بازاریابی عموماً بر اساس شاخص‌های گذشته‌نگر جدولی نظیر ارزش ناخالص تسویه یا مدل‌های </w:t>
+      </w:r>
+      <w:r>
+        <w:rPr>
+          <w:rFonts w:ascii="Times New Roman" w:hAnsi="Times New Roman" w:cs="Times New Roman"/>
+          <w:bidi w:val="0"/>
+          <w:sz w:val="17"/>
+          <w:szCs w:val="17"/>
+        </w:rPr>
+        <w:t>‎RFM‎</w:t>
       </w:r>
       <w:r>
         <w:rPr>
@@ -484,7 +466,7 @@
           <w:sz w:val="17"/>
           <w:szCs w:val="17"/>
         </w:rPr>
-        <w:t>[3]</w:t>
+        <w:t>‎[3]‎</w:t>
       </w:r>
       <w:r>
         <w:rPr>
@@ -517,7 +499,7 @@
           <w:sz w:val="17"/>
           <w:szCs w:val="17"/>
         </w:rPr>
-        <w:t>Masked PAN</w:t>
+        <w:t>‎Masked PAN‎</w:t>
       </w:r>
       <w:r>
         <w:rPr>
@@ -535,7 +517,7 @@
           <w:sz w:val="17"/>
           <w:szCs w:val="17"/>
         </w:rPr>
-        <w:t>Amount</w:t>
+        <w:t>‎Amount‎</w:t>
       </w:r>
       <w:r>
         <w:rPr>
@@ -553,7 +535,7 @@
           <w:sz w:val="17"/>
           <w:szCs w:val="17"/>
         </w:rPr>
-        <w:t>PSP</w:t>
+        <w:t>‎PSP‎</w:t>
       </w:r>
       <w:r>
         <w:rPr>
@@ -571,7 +553,7 @@
           <w:sz w:val="17"/>
           <w:szCs w:val="17"/>
         </w:rPr>
-        <w:t>Create Date</w:t>
+        <w:t>‎Create Date‎</w:t>
       </w:r>
       <w:r>
         <w:rPr>
@@ -589,7 +571,7 @@
           <w:sz w:val="17"/>
           <w:szCs w:val="17"/>
         </w:rPr>
-        <w:t>Cast Name</w:t>
+        <w:t>‎Cast Name‎</w:t>
       </w:r>
       <w:r>
         <w:rPr>
@@ -622,7 +604,7 @@
           <w:sz w:val="17"/>
           <w:szCs w:val="17"/>
         </w:rPr>
-        <w:t>HAMTA</w:t>
+        <w:t>‎HAMTA‎</w:t>
       </w:r>
       <w:r>
         <w:rPr>
@@ -640,79 +622,43 @@
           <w:sz w:val="17"/>
           <w:szCs w:val="17"/>
         </w:rPr>
-        <w:t>4</w:t>
-      </w:r>
-      <w:r>
-        <w:rPr>
-          <w:rFonts w:hint="cs" w:ascii="B Mitra" w:hAnsi="B Mitra" w:cs="B Mitra"/>
-          <w:sz w:val="18"/>
-          <w:rtl/>
-          <w:szCs w:val="18"/>
-        </w:rPr>
-        <w:t xml:space="preserve">, </w:t>
-      </w:r>
-      <w:r>
-        <w:rPr>
-          <w:rFonts w:ascii="Times New Roman" w:hAnsi="Times New Roman" w:cs="Times New Roman"/>
-          <w:bidi w:val="0"/>
-          <w:sz w:val="17"/>
-          <w:szCs w:val="17"/>
-        </w:rPr>
-        <w:t>5</w:t>
-      </w:r>
-      <w:r>
-        <w:rPr>
-          <w:rFonts w:hint="cs" w:ascii="B Mitra" w:hAnsi="B Mitra" w:cs="B Mitra"/>
-          <w:sz w:val="18"/>
-          <w:rtl/>
-          <w:szCs w:val="18"/>
-        </w:rPr>
-        <w:t>] برای مهار پدیده فشردگی اطلاعات [</w:t>
-      </w:r>
-      <w:r>
-        <w:rPr>
-          <w:rFonts w:ascii="Times New Roman" w:hAnsi="Times New Roman" w:cs="Times New Roman"/>
-          <w:bidi w:val="0"/>
-          <w:sz w:val="17"/>
-          <w:szCs w:val="17"/>
-        </w:rPr>
-        <w:t>6</w:t>
-      </w:r>
-      <w:r>
-        <w:rPr>
-          <w:rFonts w:hint="cs" w:ascii="B Mitra" w:hAnsi="B Mitra" w:cs="B Mitra"/>
-          <w:sz w:val="18"/>
-          <w:rtl/>
-          <w:szCs w:val="18"/>
-        </w:rPr>
-        <w:t xml:space="preserve">, </w:t>
-      </w:r>
-      <w:r>
-        <w:rPr>
-          <w:rFonts w:ascii="Times New Roman" w:hAnsi="Times New Roman" w:cs="Times New Roman"/>
-          <w:bidi w:val="0"/>
-          <w:sz w:val="17"/>
-          <w:szCs w:val="17"/>
-        </w:rPr>
-        <w:t>7</w:t>
-      </w:r>
-      <w:r>
-        <w:rPr>
-          <w:rFonts w:hint="cs" w:ascii="B Mitra" w:hAnsi="B Mitra" w:cs="B Mitra"/>
-          <w:sz w:val="18"/>
-          <w:rtl/>
-          <w:szCs w:val="18"/>
-        </w:rPr>
-        <w:t xml:space="preserve">] و واسنجی زمانی بازه پیش‌بینی یک‌طرفه </w:t>
-      </w:r>
-      <w:r>
-        <w:rPr>
-          <w:rFonts w:ascii="Times New Roman" w:hAnsi="Times New Roman" w:cs="Times New Roman"/>
-          <w:bidi w:val="0"/>
-          <w:sz w:val="17"/>
-          <w:szCs w:val="17"/>
-        </w:rPr>
-        <w:t>[8]</w:t>
+        <w:t>‎4, 5]‎</w:t>
+      </w:r>
+      <w:r>
+        <w:rPr>
+          <w:rFonts w:hint="cs" w:ascii="B Mitra" w:hAnsi="B Mitra" w:cs="B Mitra"/>
+          <w:sz w:val="18"/>
+          <w:rtl/>
+          <w:szCs w:val="18"/>
+        </w:rPr>
+        <w:t xml:space="preserve"> برای مهار پدیده فشردگی اطلاعات [</w:t>
+      </w:r>
+      <w:r>
+        <w:rPr>
+          <w:rFonts w:ascii="Times New Roman" w:hAnsi="Times New Roman" w:cs="Times New Roman"/>
+          <w:bidi w:val="0"/>
+          <w:sz w:val="17"/>
+          <w:szCs w:val="17"/>
+        </w:rPr>
+        <w:t>‎6, 7]‎</w:t>
+      </w:r>
+      <w:r>
+        <w:rPr>
+          <w:rFonts w:hint="cs" w:ascii="B Mitra" w:hAnsi="B Mitra" w:cs="B Mitra"/>
+          <w:sz w:val="18"/>
+          <w:rtl/>
+          <w:szCs w:val="18"/>
+        </w:rPr>
+        <w:t xml:space="preserve"> و واسنجی زمانی بازه پیش‌بینی یک‌طرفه </w:t>
+      </w:r>
+      <w:r>
+        <w:rPr>
+          <w:rFonts w:ascii="Times New Roman" w:hAnsi="Times New Roman" w:cs="Times New Roman"/>
+          <w:bidi w:val="0"/>
+          <w:sz w:val="17"/>
+          <w:szCs w:val="17"/>
+        </w:rPr>
+        <w:t>‎[8]‎</w:t>
       </w:r>
       <w:r>
         <w:rPr>
@@ -730,7 +676,7 @@
           <w:sz w:val="17"/>
           <w:szCs w:val="17"/>
         </w:rPr>
-        <w:t>M-GATO</w:t>
+        <w:t>‎M-GATO‎</w:t>
       </w:r>
       <w:r>
         <w:rPr>
@@ -748,7 +694,7 @@
           <w:sz w:val="17"/>
           <w:szCs w:val="17"/>
         </w:rPr>
-        <w:t>CIKM 2019</w:t>
+        <w:t>‎CIKM 2019‎</w:t>
       </w:r>
       <w:r>
         <w:rPr>
@@ -766,7 +712,7 @@
           <w:sz w:val="17"/>
           <w:szCs w:val="17"/>
         </w:rPr>
-        <w:t>[9]</w:t>
+        <w:t>‎[9]‎</w:t>
       </w:r>
       <w:r>
         <w:rPr>
@@ -784,7 +730,7 @@
           <w:sz w:val="17"/>
           <w:szCs w:val="17"/>
         </w:rPr>
-        <w:t>HAMTA</w:t>
+        <w:t>‎HAMTA‎</w:t>
       </w:r>
       <w:r>
         <w:rPr>
@@ -808,7 +754,7 @@
           <w:sz w:val="20"/>
           <w:szCs w:val="20"/>
         </w:rPr>
-        <w:t>2</w:t>
+        <w:t>‎2‎</w:t>
       </w:r>
       <w:r>
         <w:rPr>
@@ -832,7 +778,7 @@
           <w:sz w:val="18"/>
           <w:szCs w:val="18"/>
         </w:rPr>
-        <w:t>2.1</w:t>
+        <w:t>‎2.1‎</w:t>
       </w:r>
       <w:r>
         <w:rPr>
@@ -865,7 +811,7 @@
           <w:sz w:val="17"/>
           <w:szCs w:val="17"/>
         </w:rPr>
-        <w:t>GNN</w:t>
+        <w:t>‎GNN‎</w:t>
       </w:r>
       <w:r>
         <w:rPr>
@@ -883,7 +829,7 @@
           <w:sz w:val="17"/>
           <w:szCs w:val="17"/>
         </w:rPr>
-        <w:t>[9-11]</w:t>
+        <w:t>‎[9-11]‎</w:t>
       </w:r>
       <w:r>
         <w:rPr>
@@ -901,7 +847,7 @@
           <w:sz w:val="17"/>
           <w:szCs w:val="17"/>
         </w:rPr>
-        <w:t>[12]</w:t>
+        <w:t>‎[12]‎</w:t>
       </w:r>
       <w:r>
         <w:rPr>
@@ -919,7 +865,7 @@
           <w:sz w:val="17"/>
           <w:szCs w:val="17"/>
         </w:rPr>
-        <w:t>[13]</w:t>
+        <w:t>‎[13]‎</w:t>
       </w:r>
       <w:r>
         <w:rPr>
@@ -937,43 +883,25 @@
           <w:sz w:val="17"/>
           <w:szCs w:val="17"/>
         </w:rPr>
-        <w:t>14</w:t>
-      </w:r>
-      <w:r>
-        <w:rPr>
-          <w:rFonts w:hint="cs" w:ascii="B Mitra" w:hAnsi="B Mitra" w:cs="B Mitra"/>
-          <w:sz w:val="18"/>
-          <w:rtl/>
-          <w:szCs w:val="18"/>
-        </w:rPr>
-        <w:t xml:space="preserve">, </w:t>
-      </w:r>
-      <w:r>
-        <w:rPr>
-          <w:rFonts w:ascii="Times New Roman" w:hAnsi="Times New Roman" w:cs="Times New Roman"/>
-          <w:bidi w:val="0"/>
-          <w:sz w:val="17"/>
-          <w:szCs w:val="17"/>
-        </w:rPr>
-        <w:t>15</w:t>
-      </w:r>
-      <w:r>
-        <w:rPr>
-          <w:rFonts w:hint="cs" w:ascii="B Mitra" w:hAnsi="B Mitra" w:cs="B Mitra"/>
-          <w:sz w:val="18"/>
-          <w:rtl/>
-          <w:szCs w:val="18"/>
-        </w:rPr>
-        <w:t>]. در حوزه بازاریابی پرداخت، لیو و همکاران (</w:t>
-      </w:r>
-      <w:r>
-        <w:rPr>
-          <w:rFonts w:ascii="Times New Roman" w:hAnsi="Times New Roman" w:cs="Times New Roman"/>
-          <w:bidi w:val="0"/>
-          <w:sz w:val="17"/>
-          <w:szCs w:val="17"/>
-        </w:rPr>
-        <w:t>CIKM 2019</w:t>
+        <w:t>‎14, 15]‎</w:t>
+      </w:r>
+      <w:r>
+        <w:rPr>
+          <w:rFonts w:hint="cs" w:ascii="B Mitra" w:hAnsi="B Mitra" w:cs="B Mitra"/>
+          <w:sz w:val="18"/>
+          <w:rtl/>
+          <w:szCs w:val="18"/>
+        </w:rPr>
+        <w:t>. در حوزه بازاریابی پرداخت، لیو و همکاران (</w:t>
+      </w:r>
+      <w:r>
+        <w:rPr>
+          <w:rFonts w:ascii="Times New Roman" w:hAnsi="Times New Roman" w:cs="Times New Roman"/>
+          <w:bidi w:val="0"/>
+          <w:sz w:val="17"/>
+          <w:szCs w:val="17"/>
+        </w:rPr>
+        <w:t>‎CIKM 2019‎</w:t>
       </w:r>
       <w:r>
         <w:rPr>
@@ -991,7 +919,7 @@
           <w:sz w:val="17"/>
           <w:szCs w:val="17"/>
         </w:rPr>
-        <w:t>[9]</w:t>
+        <w:t>‎[9]‎</w:t>
       </w:r>
       <w:r>
         <w:rPr>
@@ -1015,7 +943,7 @@
           <w:sz w:val="18"/>
           <w:szCs w:val="18"/>
         </w:rPr>
-        <w:t>2.2</w:t>
+        <w:t>‎2.2‎</w:t>
       </w:r>
       <w:r>
         <w:rPr>
@@ -1048,25 +976,7 @@
           <w:sz w:val="17"/>
           <w:szCs w:val="17"/>
         </w:rPr>
-        <w:t>TGAT</w:t>
-      </w:r>
-      <w:r>
-        <w:rPr>
-          <w:rFonts w:hint="cs" w:ascii="B Mitra" w:hAnsi="B Mitra" w:cs="B Mitra"/>
-          <w:sz w:val="18"/>
-          <w:rtl/>
-          <w:szCs w:val="18"/>
-        </w:rPr>
-        <w:t xml:space="preserve"> </w:t>
-      </w:r>
-      <w:r>
-        <w:rPr>
-          <w:rFonts w:ascii="Times New Roman" w:hAnsi="Times New Roman" w:cs="Times New Roman"/>
-          <w:bidi w:val="0"/>
-          <w:sz w:val="17"/>
-          <w:szCs w:val="17"/>
-        </w:rPr>
-        <w:t>[16]</w:t>
+        <w:t>‎TGAT [16]‎</w:t>
       </w:r>
       <w:r>
         <w:rPr>
@@ -1084,25 +994,7 @@
           <w:sz w:val="17"/>
           <w:szCs w:val="17"/>
         </w:rPr>
-        <w:t>TGN</w:t>
-      </w:r>
-      <w:r>
-        <w:rPr>
-          <w:rFonts w:hint="cs" w:ascii="B Mitra" w:hAnsi="B Mitra" w:cs="B Mitra"/>
-          <w:sz w:val="18"/>
-          <w:rtl/>
-          <w:szCs w:val="18"/>
-        </w:rPr>
-        <w:t xml:space="preserve"> </w:t>
-      </w:r>
-      <w:r>
-        <w:rPr>
-          <w:rFonts w:ascii="Times New Roman" w:hAnsi="Times New Roman" w:cs="Times New Roman"/>
-          <w:bidi w:val="0"/>
-          <w:sz w:val="17"/>
-          <w:szCs w:val="17"/>
-        </w:rPr>
-        <w:t>[17]</w:t>
+        <w:t>‎TGN [17]‎</w:t>
       </w:r>
       <w:r>
         <w:rPr>
@@ -1120,25 +1012,7 @@
           <w:sz w:val="17"/>
           <w:szCs w:val="17"/>
         </w:rPr>
-        <w:t>EvolveGCN</w:t>
-      </w:r>
-      <w:r>
-        <w:rPr>
-          <w:rFonts w:hint="cs" w:ascii="B Mitra" w:hAnsi="B Mitra" w:cs="B Mitra"/>
-          <w:sz w:val="18"/>
-          <w:rtl/>
-          <w:szCs w:val="18"/>
-        </w:rPr>
-        <w:t xml:space="preserve"> </w:t>
-      </w:r>
-      <w:r>
-        <w:rPr>
-          <w:rFonts w:ascii="Times New Roman" w:hAnsi="Times New Roman" w:cs="Times New Roman"/>
-          <w:bidi w:val="0"/>
-          <w:sz w:val="17"/>
-          <w:szCs w:val="17"/>
-        </w:rPr>
-        <w:t>[18]</w:t>
+        <w:t>‎EvolveGCN [18]‎</w:t>
       </w:r>
       <w:r>
         <w:rPr>
@@ -1156,7 +1030,7 @@
           <w:sz w:val="17"/>
           <w:szCs w:val="17"/>
         </w:rPr>
-        <w:t>[19]</w:t>
+        <w:t>‎[19]‎</w:t>
       </w:r>
       <w:r>
         <w:rPr>
@@ -1180,7 +1054,7 @@
           <w:sz w:val="18"/>
           <w:szCs w:val="18"/>
         </w:rPr>
-        <w:t>2.3</w:t>
+        <w:t>‎2.3‎</w:t>
       </w:r>
       <w:r>
         <w:rPr>
@@ -1213,79 +1087,43 @@
           <w:sz w:val="17"/>
           <w:szCs w:val="17"/>
         </w:rPr>
-        <w:t>20</w:t>
-      </w:r>
-      <w:r>
-        <w:rPr>
-          <w:rFonts w:hint="cs" w:ascii="B Mitra" w:hAnsi="B Mitra" w:cs="B Mitra"/>
-          <w:sz w:val="18"/>
-          <w:rtl/>
-          <w:szCs w:val="18"/>
-        </w:rPr>
-        <w:t xml:space="preserve">, </w:t>
-      </w:r>
-      <w:r>
-        <w:rPr>
-          <w:rFonts w:ascii="Times New Roman" w:hAnsi="Times New Roman" w:cs="Times New Roman"/>
-          <w:bidi w:val="0"/>
-          <w:sz w:val="17"/>
-          <w:szCs w:val="17"/>
-        </w:rPr>
-        <w:t>21</w:t>
-      </w:r>
-      <w:r>
-        <w:rPr>
-          <w:rFonts w:hint="cs" w:ascii="B Mitra" w:hAnsi="B Mitra" w:cs="B Mitra"/>
-          <w:sz w:val="18"/>
-          <w:rtl/>
-          <w:szCs w:val="18"/>
-        </w:rPr>
-        <w:t>]. انحنای فرمن-ریچی [</w:t>
-      </w:r>
-      <w:r>
-        <w:rPr>
-          <w:rFonts w:ascii="Times New Roman" w:hAnsi="Times New Roman" w:cs="Times New Roman"/>
-          <w:bidi w:val="0"/>
-          <w:sz w:val="17"/>
-          <w:szCs w:val="17"/>
-        </w:rPr>
-        <w:t>4</w:t>
-      </w:r>
-      <w:r>
-        <w:rPr>
-          <w:rFonts w:hint="cs" w:ascii="B Mitra" w:hAnsi="B Mitra" w:cs="B Mitra"/>
-          <w:sz w:val="18"/>
-          <w:rtl/>
-          <w:szCs w:val="18"/>
-        </w:rPr>
-        <w:t xml:space="preserve">, </w:t>
-      </w:r>
-      <w:r>
-        <w:rPr>
-          <w:rFonts w:ascii="Times New Roman" w:hAnsi="Times New Roman" w:cs="Times New Roman"/>
-          <w:bidi w:val="0"/>
-          <w:sz w:val="17"/>
-          <w:szCs w:val="17"/>
-        </w:rPr>
-        <w:t>5</w:t>
-      </w:r>
-      <w:r>
-        <w:rPr>
-          <w:rFonts w:hint="cs" w:ascii="B Mitra" w:hAnsi="B Mitra" w:cs="B Mitra"/>
-          <w:sz w:val="18"/>
-          <w:rtl/>
-          <w:szCs w:val="18"/>
-        </w:rPr>
-        <w:t>] با اندازه‌گیری اشتراک همسایگی‌ها و تمایز پیوندهای پل‌ساز، به عنوان تنظیم‌کننده ساختاری و مهارکننده پدیده فشردگی اطلاعات (</w:t>
-      </w:r>
-      <w:r>
-        <w:rPr>
-          <w:rFonts w:ascii="Times New Roman" w:hAnsi="Times New Roman" w:cs="Times New Roman"/>
-          <w:bidi w:val="0"/>
-          <w:sz w:val="17"/>
-          <w:szCs w:val="17"/>
-        </w:rPr>
-        <w:t>Over-squashing</w:t>
+        <w:t>‎20, 21]‎</w:t>
+      </w:r>
+      <w:r>
+        <w:rPr>
+          <w:rFonts w:hint="cs" w:ascii="B Mitra" w:hAnsi="B Mitra" w:cs="B Mitra"/>
+          <w:sz w:val="18"/>
+          <w:rtl/>
+          <w:szCs w:val="18"/>
+        </w:rPr>
+        <w:t>. انحنای فرمن-ریچی [</w:t>
+      </w:r>
+      <w:r>
+        <w:rPr>
+          <w:rFonts w:ascii="Times New Roman" w:hAnsi="Times New Roman" w:cs="Times New Roman"/>
+          <w:bidi w:val="0"/>
+          <w:sz w:val="17"/>
+          <w:szCs w:val="17"/>
+        </w:rPr>
+        <w:t>‎4, 5]‎</w:t>
+      </w:r>
+      <w:r>
+        <w:rPr>
+          <w:rFonts w:hint="cs" w:ascii="B Mitra" w:hAnsi="B Mitra" w:cs="B Mitra"/>
+          <w:sz w:val="18"/>
+          <w:rtl/>
+          <w:szCs w:val="18"/>
+        </w:rPr>
+        <w:t xml:space="preserve"> با اندازه‌گیری اشتراک همسایگی‌ها و تمایز پیوندهای پل‌ساز، به عنوان تنظیم‌کننده ساختاری و مهارکننده پدیده فشردگی اطلاعات (</w:t>
+      </w:r>
+      <w:r>
+        <w:rPr>
+          <w:rFonts w:ascii="Times New Roman" w:hAnsi="Times New Roman" w:cs="Times New Roman"/>
+          <w:bidi w:val="0"/>
+          <w:sz w:val="17"/>
+          <w:szCs w:val="17"/>
+        </w:rPr>
+        <w:t>‎Over-squashing‎</w:t>
       </w:r>
       <w:r>
         <w:rPr>
@@ -1303,52 +1141,16 @@
           <w:sz w:val="17"/>
           <w:szCs w:val="17"/>
         </w:rPr>
-        <w:t>6</w:t>
-      </w:r>
-      <w:r>
-        <w:rPr>
-          <w:rFonts w:hint="cs" w:ascii="B Mitra" w:hAnsi="B Mitra" w:cs="B Mitra"/>
-          <w:sz w:val="18"/>
-          <w:rtl/>
-          <w:szCs w:val="18"/>
-        </w:rPr>
-        <w:t xml:space="preserve">, </w:t>
-      </w:r>
-      <w:r>
-        <w:rPr>
-          <w:rFonts w:ascii="Times New Roman" w:hAnsi="Times New Roman" w:cs="Times New Roman"/>
-          <w:bidi w:val="0"/>
-          <w:sz w:val="17"/>
-          <w:szCs w:val="17"/>
-        </w:rPr>
-        <w:t>7</w:t>
-      </w:r>
-      <w:r>
-        <w:rPr>
-          <w:rFonts w:hint="cs" w:ascii="B Mitra" w:hAnsi="B Mitra" w:cs="B Mitra"/>
-          <w:sz w:val="18"/>
-          <w:rtl/>
-          <w:szCs w:val="18"/>
-        </w:rPr>
-        <w:t xml:space="preserve">, </w:t>
-      </w:r>
-      <w:r>
-        <w:rPr>
-          <w:rFonts w:ascii="Times New Roman" w:hAnsi="Times New Roman" w:cs="Times New Roman"/>
-          <w:bidi w:val="0"/>
-          <w:sz w:val="17"/>
-          <w:szCs w:val="17"/>
-        </w:rPr>
-        <w:t>22</w:t>
-      </w:r>
-      <w:r>
-        <w:rPr>
-          <w:rFonts w:hint="cs" w:ascii="B Mitra" w:hAnsi="B Mitra" w:cs="B Mitra"/>
-          <w:sz w:val="18"/>
-          <w:rtl/>
-          <w:szCs w:val="18"/>
-        </w:rPr>
-        <w:t>].</w:t>
+        <w:t>‎6, 7, 22]‎</w:t>
+      </w:r>
+      <w:r>
+        <w:rPr>
+          <w:rFonts w:hint="cs" w:ascii="B Mitra" w:hAnsi="B Mitra" w:cs="B Mitra"/>
+          <w:sz w:val="18"/>
+          <w:rtl/>
+          <w:szCs w:val="18"/>
+        </w:rPr>
+        <w:t>.</w:t>
       </w:r>
     </w:p>
     <w:p>
@@ -1363,7 +1165,7 @@
           <w:sz w:val="18"/>
           <w:szCs w:val="18"/>
         </w:rPr>
-        <w:t>2.4</w:t>
+        <w:t>‎2.4‎</w:t>
       </w:r>
       <w:r>
         <w:rPr>
@@ -1396,7 +1198,7 @@
           <w:sz w:val="17"/>
           <w:szCs w:val="17"/>
         </w:rPr>
-        <w:t>[8]</w:t>
+        <w:t>‎[8]‎</w:t>
       </w:r>
       <w:r>
         <w:rPr>
@@ -1414,7 +1216,7 @@
           <w:sz w:val="17"/>
           <w:szCs w:val="17"/>
         </w:rPr>
-        <w:t>[23]</w:t>
+        <w:t>‎[23]‎</w:t>
       </w:r>
       <w:r>
         <w:rPr>
@@ -1432,7 +1234,7 @@
           <w:sz w:val="17"/>
           <w:szCs w:val="17"/>
         </w:rPr>
-        <w:t>HAMTA</w:t>
+        <w:t>‎HAMTA‎</w:t>
       </w:r>
       <w:r>
         <w:rPr>
@@ -1450,7 +1252,7 @@
           <w:sz w:val="17"/>
           <w:szCs w:val="17"/>
         </w:rPr>
-        <w:t>One-sided temporal prediction-interval calibration</w:t>
+        <w:t>‎One-sided temporal prediction-interval calibration‎</w:t>
       </w:r>
       <w:r>
         <w:rPr>
@@ -1474,7 +1276,7 @@
           <w:sz w:val="18"/>
           <w:szCs w:val="18"/>
         </w:rPr>
-        <w:t>2.5</w:t>
+        <w:t>‎2.5‎</w:t>
       </w:r>
       <w:r>
         <w:rPr>
@@ -1507,7 +1309,7 @@
           <w:sz w:val="17"/>
           <w:szCs w:val="17"/>
         </w:rPr>
-        <w:t>SFA</w:t>
+        <w:t>‎SFA‎</w:t>
       </w:r>
       <w:r>
         <w:rPr>
@@ -1525,7 +1327,7 @@
           <w:sz w:val="17"/>
           <w:szCs w:val="17"/>
         </w:rPr>
-        <w:t>[24]</w:t>
+        <w:t>‎[24]‎</w:t>
       </w:r>
       <w:r>
         <w:rPr>
@@ -1543,7 +1345,7 @@
           <w:sz w:val="17"/>
           <w:szCs w:val="17"/>
         </w:rPr>
-        <w:t>[25]</w:t>
+        <w:t>‎[25]‎</w:t>
       </w:r>
       <w:r>
         <w:rPr>
@@ -1567,7 +1369,7 @@
           <w:sz w:val="20"/>
           <w:szCs w:val="20"/>
         </w:rPr>
-        <w:t>3</w:t>
+        <w:t>‎3‎</w:t>
       </w:r>
       <w:r>
         <w:rPr>
@@ -1585,7 +1387,7 @@
           <w:sz w:val="20"/>
           <w:szCs w:val="20"/>
         </w:rPr>
-        <w:t>HAMTA</w:t>
+        <w:t>‎HAMTA‎</w:t>
       </w:r>
       <w:r>
         <w:rPr>
@@ -1618,7 +1420,7 @@
           <w:sz w:val="17"/>
           <w:szCs w:val="17"/>
         </w:rPr>
-        <w:t>HAMTA</w:t>
+        <w:t>‎HAMTA‎</w:t>
       </w:r>
       <w:r>
         <w:rPr>
@@ -1636,7 +1438,7 @@
           <w:sz w:val="17"/>
           <w:szCs w:val="17"/>
         </w:rPr>
-        <w:t>M-GATO</w:t>
+        <w:t>‎M-GATO‎</w:t>
       </w:r>
       <w:r>
         <w:rPr>
@@ -1654,7 +1456,7 @@
           <w:sz w:val="17"/>
           <w:szCs w:val="17"/>
         </w:rPr>
-        <w:t>1</w:t>
+        <w:t>‎1‎</w:t>
       </w:r>
       <w:r>
         <w:rPr>
@@ -1730,7 +1532,7 @@
           <w:sz w:val="17"/>
           <w:szCs w:val="17"/>
         </w:rPr>
-        <w:t>1</w:t>
+        <w:t>‎1‎</w:t>
       </w:r>
       <w:r>
         <w:rPr>
@@ -1748,7 +1550,7 @@
           <w:sz w:val="17"/>
           <w:szCs w:val="17"/>
         </w:rPr>
-        <w:t>HAMTA</w:t>
+        <w:t>‎HAMTA‎</w:t>
       </w:r>
       <w:r>
         <w:rPr>
@@ -1772,7 +1574,7 @@
           <w:sz w:val="18"/>
           <w:szCs w:val="18"/>
         </w:rPr>
-        <w:t>3.1</w:t>
+        <w:t>‎3.1‎</w:t>
       </w:r>
       <w:r>
         <w:rPr>
@@ -1871,7 +1673,7 @@
           <w:sz w:val="17"/>
           <w:szCs w:val="17"/>
         </w:rPr>
-        <w:t>merchant_id</w:t>
+        <w:t>‎merchant_id‎</w:t>
       </w:r>
       <w:r>
         <w:rPr>
@@ -1889,7 +1691,7 @@
           <w:sz w:val="17"/>
           <w:szCs w:val="17"/>
         </w:rPr>
-        <w:t>PSP</w:t>
+        <w:t>‎PSP‎</w:t>
       </w:r>
       <w:r>
         <w:rPr>
@@ -1994,25 +1796,7 @@
           <w:sz w:val="17"/>
           <w:szCs w:val="17"/>
         </w:rPr>
-        <w:t>m</w:t>
-      </w:r>
-      <w:r>
-        <w:rPr>
-          <w:rFonts w:hint="cs" w:ascii="B Mitra" w:hAnsi="B Mitra" w:cs="B Mitra"/>
-          <w:sz w:val="18"/>
-          <w:rtl/>
-          <w:szCs w:val="18"/>
-        </w:rPr>
-        <w:t xml:space="preserve"> ∈ </w:t>
-      </w:r>
-      <w:r>
-        <w:rPr>
-          <w:rFonts w:ascii="Times New Roman" w:hAnsi="Times New Roman" w:cs="Times New Roman"/>
-          <w:bidi w:val="0"/>
-          <w:sz w:val="17"/>
-          <w:szCs w:val="17"/>
-        </w:rPr>
-        <w:t>M</w:t>
+        <w:t>‎m ∈ M‎</w:t>
       </w:r>
       <w:r>
         <w:rPr>
@@ -2095,7 +1879,7 @@
           <w:sz w:val="18"/>
           <w:szCs w:val="18"/>
         </w:rPr>
-        <w:t>3.2</w:t>
+        <w:t>‎3.2‎</w:t>
       </w:r>
       <w:r>
         <w:rPr>
@@ -2128,7 +1912,7 @@
           <w:sz w:val="17"/>
           <w:szCs w:val="17"/>
         </w:rPr>
-        <w:t>t</w:t>
+        <w:t>‎t‎</w:t>
       </w:r>
       <w:r>
         <w:rPr>
@@ -2190,7 +1974,7 @@
           <w:sz w:val="17"/>
           <w:szCs w:val="17"/>
         </w:rPr>
-        <w:t>c</w:t>
+        <w:t>‎c‎</w:t>
       </w:r>
       <w:r>
         <w:rPr>
@@ -2208,7 +1992,7 @@
           <w:sz w:val="17"/>
           <w:szCs w:val="17"/>
         </w:rPr>
-        <w:t>m</w:t>
+        <w:t>‎m‎</w:t>
       </w:r>
       <w:r>
         <w:rPr>
@@ -2226,7 +2010,7 @@
           <w:sz w:val="17"/>
           <w:szCs w:val="17"/>
         </w:rPr>
-        <w:t>t</w:t>
+        <w:t>‎t‎</w:t>
       </w:r>
       <w:r>
         <w:rPr>
@@ -2250,7 +2034,7 @@
           <w:sz w:val="18"/>
           <w:szCs w:val="18"/>
         </w:rPr>
-        <w:t>3.3</w:t>
+        <w:t>‎3.3‎</w:t>
       </w:r>
       <w:r>
         <w:rPr>
@@ -2283,7 +2067,7 @@
           <w:sz w:val="17"/>
           <w:szCs w:val="17"/>
         </w:rPr>
-        <w:t>O</w:t>
+        <w:t>‎O‎</w:t>
       </w:r>
       <w:r>
         <w:rPr>
@@ -2301,25 +2085,7 @@
           <w:sz w:val="17"/>
           <w:szCs w:val="17"/>
         </w:rPr>
-        <w:t>M</w:t>
-      </w:r>
-      <w:r>
-        <w:rPr>
-          <w:rFonts w:hint="cs" w:ascii="B Mitra" w:hAnsi="B Mitra" w:cs="B Mitra"/>
-          <w:sz w:val="18"/>
-          <w:rtl/>
-          <w:szCs w:val="18"/>
-        </w:rPr>
-        <w:t>|^</w:t>
-      </w:r>
-      <w:r>
-        <w:rPr>
-          <w:rFonts w:ascii="Times New Roman" w:hAnsi="Times New Roman" w:cs="Times New Roman"/>
-          <w:bidi w:val="0"/>
-          <w:sz w:val="17"/>
-          <w:szCs w:val="17"/>
-        </w:rPr>
-        <w:t>2</w:t>
+        <w:t>‎M|^2‎</w:t>
       </w:r>
       <w:r>
         <w:rPr>
@@ -2337,7 +2103,7 @@
           <w:sz w:val="17"/>
           <w:szCs w:val="17"/>
         </w:rPr>
-        <w:t>HAMTA</w:t>
+        <w:t>‎HAMTA‎</w:t>
       </w:r>
       <w:r>
         <w:rPr>
@@ -2355,7 +2121,7 @@
           <w:sz w:val="17"/>
           <w:szCs w:val="17"/>
         </w:rPr>
-        <w:t>I</w:t>
+        <w:t>‎I‎</w:t>
       </w:r>
       <w:r>
         <w:rPr>
@@ -2373,7 +2139,7 @@
           <w:sz w:val="17"/>
           <w:szCs w:val="17"/>
         </w:rPr>
-        <w:t>c</w:t>
+        <w:t>‎c‎</w:t>
       </w:r>
       <w:r>
         <w:rPr>
@@ -2391,7 +2157,7 @@
           <w:sz w:val="17"/>
           <w:szCs w:val="17"/>
         </w:rPr>
-        <w:t>c</w:t>
+        <w:t>‎c‎</w:t>
       </w:r>
       <w:r>
         <w:rPr>
@@ -2409,7 +2175,7 @@
           <w:sz w:val="17"/>
           <w:szCs w:val="17"/>
         </w:rPr>
-        <w:t>m</w:t>
+        <w:t>‎m‎</w:t>
       </w:r>
       <w:r>
         <w:rPr>
@@ -2427,7 +2193,7 @@
           <w:sz w:val="17"/>
           <w:szCs w:val="17"/>
         </w:rPr>
-        <w:t>O</w:t>
+        <w:t>‎O‎</w:t>
       </w:r>
       <w:r>
         <w:rPr>
@@ -2445,25 +2211,7 @@
           <w:sz w:val="17"/>
           <w:szCs w:val="17"/>
         </w:rPr>
-        <w:t>C_m</w:t>
-      </w:r>
-      <w:r>
-        <w:rPr>
-          <w:rFonts w:hint="cs" w:ascii="B Mitra" w:hAnsi="B Mitra" w:cs="B Mitra"/>
-          <w:sz w:val="18"/>
-          <w:rtl/>
-          <w:szCs w:val="18"/>
-        </w:rPr>
-        <w:t xml:space="preserve">| · </w:t>
-      </w:r>
-      <w:r>
-        <w:rPr>
-          <w:rFonts w:ascii="Times New Roman" w:hAnsi="Times New Roman" w:cs="Times New Roman"/>
-          <w:bidi w:val="0"/>
-          <w:sz w:val="17"/>
-          <w:szCs w:val="17"/>
-        </w:rPr>
-        <w:t>d_card</w:t>
+        <w:t>‎C_m| · d_card‎</w:t>
       </w:r>
       <w:r>
         <w:rPr>
@@ -2533,7 +2281,7 @@
           <w:sz w:val="17"/>
           <w:szCs w:val="17"/>
         </w:rPr>
-        <w:t>1</w:t>
+        <w:t>‎1‎</w:t>
       </w:r>
       <w:r>
         <w:rPr>
@@ -2677,7 +2425,7 @@
           <w:sz w:val="17"/>
           <w:szCs w:val="17"/>
         </w:rPr>
-        <w:t>S_covisit</w:t>
+        <w:t>‎S_covisit‎</w:t>
       </w:r>
       <w:r>
         <w:rPr>
@@ -2695,7 +2443,7 @@
           <w:sz w:val="17"/>
           <w:szCs w:val="17"/>
         </w:rPr>
-        <w:t>S_category</w:t>
+        <w:t>‎S_category‎</w:t>
       </w:r>
       <w:r>
         <w:rPr>
@@ -2713,25 +2461,7 @@
           <w:sz w:val="17"/>
           <w:szCs w:val="17"/>
         </w:rPr>
-        <w:t>λ</w:t>
-      </w:r>
-      <w:r>
-        <w:rPr>
-          <w:rFonts w:hint="cs" w:ascii="B Mitra" w:hAnsi="B Mitra" w:cs="B Mitra"/>
-          <w:sz w:val="18"/>
-          <w:rtl/>
-          <w:szCs w:val="18"/>
-        </w:rPr>
-        <w:t xml:space="preserve"> = </w:t>
-      </w:r>
-      <w:r>
-        <w:rPr>
-          <w:rFonts w:ascii="Times New Roman" w:hAnsi="Times New Roman" w:cs="Times New Roman"/>
-          <w:bidi w:val="0"/>
-          <w:sz w:val="17"/>
-          <w:szCs w:val="17"/>
-        </w:rPr>
-        <w:t>0.65</w:t>
+        <w:t>‎λ = 0.65‎</w:t>
       </w:r>
       <w:r>
         <w:rPr>
@@ -2749,7 +2479,7 @@
           <w:sz w:val="17"/>
           <w:szCs w:val="17"/>
         </w:rPr>
-        <w:t>Top-K</w:t>
+        <w:t>‎Top-K‎</w:t>
       </w:r>
       <w:r>
         <w:rPr>
@@ -2767,7 +2497,7 @@
           <w:sz w:val="17"/>
           <w:szCs w:val="17"/>
         </w:rPr>
-        <w:t>K=6</w:t>
+        <w:t>‎K=6‎</w:t>
       </w:r>
       <w:r>
         <w:rPr>
@@ -2785,7 +2515,7 @@
           <w:sz w:val="17"/>
           <w:szCs w:val="17"/>
         </w:rPr>
-        <w:t>O</w:t>
+        <w:t>‎O‎</w:t>
       </w:r>
       <w:r>
         <w:rPr>
@@ -2803,7 +2533,7 @@
           <w:sz w:val="17"/>
           <w:szCs w:val="17"/>
         </w:rPr>
-        <w:t>C</w:t>
+        <w:t>‎C‎</w:t>
       </w:r>
       <w:r>
         <w:rPr>
@@ -2821,7 +2551,7 @@
           <w:sz w:val="17"/>
           <w:szCs w:val="17"/>
         </w:rPr>
-        <w:t>m</w:t>
+        <w:t>‎m‎</w:t>
       </w:r>
       <w:r>
         <w:rPr>
@@ -2839,7 +2569,7 @@
           <w:sz w:val="17"/>
           <w:szCs w:val="17"/>
         </w:rPr>
-        <w:t>log K</w:t>
+        <w:t>‎log K‎</w:t>
       </w:r>
       <w:r>
         <w:rPr>
@@ -2857,7 +2587,7 @@
           <w:sz w:val="17"/>
           <w:szCs w:val="17"/>
         </w:rPr>
-        <w:t>O</w:t>
+        <w:t>‎O‎</w:t>
       </w:r>
       <w:r>
         <w:rPr>
@@ -2875,43 +2605,7 @@
           <w:sz w:val="17"/>
           <w:szCs w:val="17"/>
         </w:rPr>
-        <w:t>M</w:t>
-      </w:r>
-      <w:r>
-        <w:rPr>
-          <w:rFonts w:hint="cs" w:ascii="B Mitra" w:hAnsi="B Mitra" w:cs="B Mitra"/>
-          <w:sz w:val="18"/>
-          <w:rtl/>
-          <w:szCs w:val="18"/>
-        </w:rPr>
-        <w:t xml:space="preserve">| · </w:t>
-      </w:r>
-      <w:r>
-        <w:rPr>
-          <w:rFonts w:ascii="Times New Roman" w:hAnsi="Times New Roman" w:cs="Times New Roman"/>
-          <w:bidi w:val="0"/>
-          <w:sz w:val="17"/>
-          <w:szCs w:val="17"/>
-        </w:rPr>
-        <w:t>K</w:t>
-      </w:r>
-      <w:r>
-        <w:rPr>
-          <w:rFonts w:hint="cs" w:ascii="B Mitra" w:hAnsi="B Mitra" w:cs="B Mitra"/>
-          <w:sz w:val="18"/>
-          <w:rtl/>
-          <w:szCs w:val="18"/>
-        </w:rPr>
-        <w:t xml:space="preserve"> · </w:t>
-      </w:r>
-      <w:r>
-        <w:rPr>
-          <w:rFonts w:ascii="Times New Roman" w:hAnsi="Times New Roman" w:cs="Times New Roman"/>
-          <w:bidi w:val="0"/>
-          <w:sz w:val="17"/>
-          <w:szCs w:val="17"/>
-        </w:rPr>
-        <w:t>d_avg</w:t>
+        <w:t>‎M| · K · d_avg‎</w:t>
       </w:r>
       <w:r>
         <w:rPr>
@@ -2929,7 +2623,7 @@
           <w:sz w:val="17"/>
           <w:szCs w:val="17"/>
         </w:rPr>
-        <w:t>Top-K</w:t>
+        <w:t>‎Top-K‎</w:t>
       </w:r>
       <w:r>
         <w:rPr>
@@ -2980,7 +2674,7 @@
           <w:sz w:val="17"/>
           <w:szCs w:val="17"/>
         </w:rPr>
-        <w:t>2</w:t>
+        <w:t>‎2‎</w:t>
       </w:r>
       <w:r>
         <w:rPr>
@@ -2998,34 +2692,16 @@
           <w:sz w:val="17"/>
           <w:szCs w:val="17"/>
         </w:rPr>
-        <w:t>4</w:t>
-      </w:r>
-      <w:r>
-        <w:rPr>
-          <w:rFonts w:hint="cs" w:ascii="B Mitra" w:hAnsi="B Mitra" w:cs="B Mitra"/>
-          <w:sz w:val="18"/>
-          <w:rtl/>
-          <w:szCs w:val="18"/>
-        </w:rPr>
-        <w:t xml:space="preserve">, </w:t>
-      </w:r>
-      <w:r>
-        <w:rPr>
-          <w:rFonts w:ascii="Times New Roman" w:hAnsi="Times New Roman" w:cs="Times New Roman"/>
-          <w:bidi w:val="0"/>
-          <w:sz w:val="17"/>
-          <w:szCs w:val="17"/>
-        </w:rPr>
-        <w:t>5</w:t>
-      </w:r>
-      <w:r>
-        <w:rPr>
-          <w:rFonts w:hint="cs" w:ascii="B Mitra" w:hAnsi="B Mitra" w:cs="B Mitra"/>
-          <w:sz w:val="18"/>
-          <w:rtl/>
-          <w:szCs w:val="18"/>
-        </w:rPr>
-        <w:t>]:</w:t>
+        <w:t>‎4, 5]‎</w:t>
+      </w:r>
+      <w:r>
+        <w:rPr>
+          <w:rFonts w:hint="cs" w:ascii="B Mitra" w:hAnsi="B Mitra" w:cs="B Mitra"/>
+          <w:sz w:val="18"/>
+          <w:rtl/>
+          <w:szCs w:val="18"/>
+        </w:rPr>
+        <w:t>:</w:t>
       </w:r>
     </w:p>
     <w:tbl>
@@ -3122,7 +2798,7 @@
           <w:sz w:val="17"/>
           <w:szCs w:val="17"/>
         </w:rPr>
-        <w:t>d</w:t>
+        <w:t>‎d‎</w:t>
       </w:r>
       <w:r>
         <w:rPr>
@@ -3140,7 +2816,7 @@
           <w:sz w:val="17"/>
           <w:szCs w:val="17"/>
         </w:rPr>
-        <w:t>m</w:t>
+        <w:t>‎m‎</w:t>
       </w:r>
       <w:r>
         <w:rPr>
@@ -3158,7 +2834,7 @@
           <w:sz w:val="17"/>
           <w:szCs w:val="17"/>
         </w:rPr>
-        <w:t>Δ</w:t>
+        <w:t>‎Δ‎</w:t>
       </w:r>
       <w:r>
         <w:rPr>
@@ -3176,25 +2852,7 @@
           <w:sz w:val="17"/>
           <w:szCs w:val="17"/>
         </w:rPr>
-        <w:t>m</w:t>
-      </w:r>
-      <w:r>
-        <w:rPr>
-          <w:rFonts w:hint="cs" w:ascii="B Mitra" w:hAnsi="B Mitra" w:cs="B Mitra"/>
-          <w:sz w:val="18"/>
-          <w:rtl/>
-          <w:szCs w:val="18"/>
-        </w:rPr>
-        <w:t xml:space="preserve">, </w:t>
-      </w:r>
-      <w:r>
-        <w:rPr>
-          <w:rFonts w:ascii="Times New Roman" w:hAnsi="Times New Roman" w:cs="Times New Roman"/>
-          <w:bidi w:val="0"/>
-          <w:sz w:val="17"/>
-          <w:szCs w:val="17"/>
-        </w:rPr>
-        <w:t>j</w:t>
+        <w:t>‎m, j‎</w:t>
       </w:r>
       <w:r>
         <w:rPr>
@@ -3212,7 +2870,7 @@
           <w:sz w:val="17"/>
           <w:szCs w:val="17"/>
         </w:rPr>
-        <w:t>3</w:t>
+        <w:t>‎3‎</w:t>
       </w:r>
       <w:r>
         <w:rPr>
@@ -3356,25 +3014,7 @@
           <w:sz w:val="17"/>
           <w:szCs w:val="17"/>
         </w:rPr>
-        <w:t>η</w:t>
-      </w:r>
-      <w:r>
-        <w:rPr>
-          <w:rFonts w:hint="cs" w:ascii="B Mitra" w:hAnsi="B Mitra" w:cs="B Mitra"/>
-          <w:sz w:val="18"/>
-          <w:rtl/>
-          <w:szCs w:val="18"/>
-        </w:rPr>
-        <w:t xml:space="preserve"> = </w:t>
-      </w:r>
-      <w:r>
-        <w:rPr>
-          <w:rFonts w:ascii="Times New Roman" w:hAnsi="Times New Roman" w:cs="Times New Roman"/>
-          <w:bidi w:val="0"/>
-          <w:sz w:val="17"/>
-          <w:szCs w:val="17"/>
-        </w:rPr>
-        <w:t>0.25</w:t>
+        <w:t>‎η = 0.25‎</w:t>
       </w:r>
       <w:r>
         <w:rPr>
@@ -3450,7 +3090,7 @@
           <w:sz w:val="17"/>
           <w:szCs w:val="17"/>
         </w:rPr>
-        <w:t>2</w:t>
+        <w:t>‎2‎</w:t>
       </w:r>
       <w:r>
         <w:rPr>
@@ -3474,7 +3114,7 @@
           <w:sz w:val="18"/>
           <w:szCs w:val="18"/>
         </w:rPr>
-        <w:t>3.4</w:t>
+        <w:t>‎3.4‎</w:t>
       </w:r>
       <w:r>
         <w:rPr>
@@ -3509,7 +3149,7 @@
           <w:sz w:val="17"/>
           <w:szCs w:val="17"/>
         </w:rPr>
-        <w:t>Y</w:t>
+        <w:t>‎Y‎</w:t>
       </w:r>
       <w:r>
         <w:rPr>
@@ -3519,7 +3159,7 @@
           <w:vertAlign w:val="subscript"/>
           <w:szCs w:val="17"/>
         </w:rPr>
-        <w:t>m, t+1</w:t>
+        <w:t>‎m, t+1‎</w:t>
       </w:r>
       <w:r>
         <w:rPr>
@@ -3537,7 +3177,7 @@
           <w:sz w:val="17"/>
           <w:szCs w:val="17"/>
         </w:rPr>
-        <w:t>Var</w:t>
+        <w:t>‎Var‎</w:t>
       </w:r>
       <w:r>
         <w:rPr>
@@ -3555,7 +3195,7 @@
           <w:sz w:val="17"/>
           <w:szCs w:val="17"/>
         </w:rPr>
-        <w:t>Y</w:t>
+        <w:t>‎Y‎</w:t>
       </w:r>
       <w:r>
         <w:rPr>
@@ -3573,43 +3213,7 @@
           <w:sz w:val="17"/>
           <w:szCs w:val="17"/>
         </w:rPr>
-        <w:t>E</w:t>
-      </w:r>
-      <w:r>
-        <w:rPr>
-          <w:rFonts w:hint="cs" w:ascii="B Mitra" w:hAnsi="B Mitra" w:cs="B Mitra"/>
-          <w:sz w:val="18"/>
-          <w:rtl/>
-          <w:szCs w:val="18"/>
-        </w:rPr>
-        <w:t>[</w:t>
-      </w:r>
-      <w:r>
-        <w:rPr>
-          <w:rFonts w:ascii="Times New Roman" w:hAnsi="Times New Roman" w:cs="Times New Roman"/>
-          <w:bidi w:val="0"/>
-          <w:sz w:val="17"/>
-          <w:szCs w:val="17"/>
-        </w:rPr>
-        <w:t>Y</w:t>
-      </w:r>
-      <w:r>
-        <w:rPr>
-          <w:rFonts w:hint="cs" w:ascii="B Mitra" w:hAnsi="B Mitra" w:cs="B Mitra"/>
-          <w:sz w:val="18"/>
-          <w:rtl/>
-          <w:szCs w:val="18"/>
-        </w:rPr>
-        <w:t xml:space="preserve">] ≈ </w:t>
-      </w:r>
-      <w:r>
-        <w:rPr>
-          <w:rFonts w:ascii="Times New Roman" w:hAnsi="Times New Roman" w:cs="Times New Roman"/>
-          <w:bidi w:val="0"/>
-          <w:sz w:val="17"/>
-          <w:szCs w:val="17"/>
-        </w:rPr>
-        <w:t>3.24</w:t>
+        <w:t>‎E[Y] ≈ 3.24‎</w:t>
       </w:r>
       <w:r>
         <w:rPr>
@@ -3627,7 +3231,7 @@
           <w:sz w:val="17"/>
           <w:szCs w:val="17"/>
         </w:rPr>
-        <w:t>TGAT</w:t>
+        <w:t>‎TGAT‎</w:t>
       </w:r>
       <w:r>
         <w:rPr>
@@ -3744,7 +3348,7 @@
           <w:sz w:val="17"/>
           <w:szCs w:val="17"/>
         </w:rPr>
-        <w:t>μ</w:t>
+        <w:t>‎μ‎</w:t>
       </w:r>
       <w:r>
         <w:rPr>
@@ -3762,7 +3366,7 @@
           <w:sz w:val="17"/>
           <w:szCs w:val="17"/>
         </w:rPr>
-        <w:t>φ</w:t>
+        <w:t>‎φ‎</w:t>
       </w:r>
       <w:r>
         <w:rPr>
@@ -3780,7 +3384,7 @@
           <w:sz w:val="17"/>
           <w:szCs w:val="17"/>
         </w:rPr>
-        <w:t>inverse-dispersion/size parameter</w:t>
+        <w:t>‎inverse-dispersion/size parameter‎</w:t>
       </w:r>
       <w:r>
         <w:rPr>
@@ -3798,7 +3402,7 @@
           <w:sz w:val="17"/>
           <w:szCs w:val="17"/>
         </w:rPr>
-        <w:t>t</w:t>
+        <w:t>‎t‎</w:t>
       </w:r>
       <w:r>
         <w:rPr>
@@ -3816,7 +3420,7 @@
           <w:sz w:val="17"/>
           <w:szCs w:val="17"/>
         </w:rPr>
-        <w:t>TGAT</w:t>
+        <w:t>‎TGAT‎</w:t>
       </w:r>
       <w:r>
         <w:rPr>
@@ -3834,7 +3438,7 @@
           <w:sz w:val="17"/>
           <w:szCs w:val="17"/>
         </w:rPr>
-        <w:t>Adam</w:t>
+        <w:t>‎Adam‎</w:t>
       </w:r>
       <w:r>
         <w:rPr>
@@ -3852,7 +3456,7 @@
           <w:sz w:val="17"/>
           <w:szCs w:val="17"/>
         </w:rPr>
-        <w:t>P0</w:t>
+        <w:t>‎P0‎</w:t>
       </w:r>
       <w:r>
         <w:rPr>
@@ -3876,7 +3480,7 @@
           <w:sz w:val="18"/>
           <w:szCs w:val="18"/>
         </w:rPr>
-        <w:t>3.5</w:t>
+        <w:t>‎3.5‎</w:t>
       </w:r>
       <w:r>
         <w:rPr>
@@ -3909,7 +3513,7 @@
           <w:sz w:val="17"/>
           <w:szCs w:val="17"/>
         </w:rPr>
-        <w:t>P0</w:t>
+        <w:t>‎P0‎</w:t>
       </w:r>
       <w:r>
         <w:rPr>
@@ -3927,7 +3531,7 @@
           <w:sz w:val="17"/>
           <w:szCs w:val="17"/>
         </w:rPr>
-        <w:t>[8]</w:t>
+        <w:t>‎[8]‎</w:t>
       </w:r>
       <w:r>
         <w:rPr>
@@ -3989,25 +3593,25 @@
           <w:sz w:val="17"/>
           <w:szCs w:val="17"/>
         </w:rPr>
-        <w:t>α</w:t>
-      </w:r>
-      <w:r>
-        <w:rPr>
-          <w:rFonts w:hint="cs" w:ascii="B Mitra" w:hAnsi="B Mitra" w:cs="B Mitra"/>
-          <w:sz w:val="18"/>
-          <w:rtl/>
-          <w:szCs w:val="18"/>
-        </w:rPr>
-        <w:t xml:space="preserve"> = ۰٫۱۵، صدک واسنجی‌شده استخراج شده و کران بالای طبیعی عملکرد پیش‌بینی مطابق رابطه (</w:t>
-      </w:r>
-      <w:r>
-        <w:rPr>
-          <w:rFonts w:ascii="Times New Roman" w:hAnsi="Times New Roman" w:cs="Times New Roman"/>
-          <w:bidi w:val="0"/>
-          <w:sz w:val="17"/>
-          <w:szCs w:val="17"/>
-        </w:rPr>
-        <w:t>5</w:t>
+        <w:t>‎α = 0.15‎</w:t>
+      </w:r>
+      <w:r>
+        <w:rPr>
+          <w:rFonts w:hint="cs" w:ascii="B Mitra" w:hAnsi="B Mitra" w:cs="B Mitra"/>
+          <w:sz w:val="18"/>
+          <w:rtl/>
+          <w:szCs w:val="18"/>
+        </w:rPr>
+        <w:t>، صدک واسنجی‌شده استخراج شده و کران بالای طبیعی عملکرد پیش‌بینی مطابق رابطه (</w:t>
+      </w:r>
+      <w:r>
+        <w:rPr>
+          <w:rFonts w:ascii="Times New Roman" w:hAnsi="Times New Roman" w:cs="Times New Roman"/>
+          <w:bidi w:val="0"/>
+          <w:sz w:val="17"/>
+          <w:szCs w:val="17"/>
+        </w:rPr>
+        <w:t>‎5‎</w:t>
       </w:r>
       <w:r>
         <w:rPr>
@@ -4153,16 +3757,16 @@
           <w:sz w:val="17"/>
           <w:szCs w:val="17"/>
         </w:rPr>
-        <w:t>Coverage</w:t>
-      </w:r>
-      <w:r>
-        <w:rPr>
-          <w:rFonts w:hint="cs" w:ascii="B Mitra" w:hAnsi="B Mitra" w:cs="B Mitra"/>
-          <w:sz w:val="18"/>
-          <w:rtl/>
-          <w:szCs w:val="18"/>
-        </w:rPr>
-        <w:t xml:space="preserve"> = ۸۶٫۲ ± ۳٫۱٪ با عرض بازه میانگین ۴٫۶ ± ۰٫۳ تراکنش) اعتبار تجربی واسنجی را تایید می‌نماید.</w:t>
+        <w:t>‎Coverage = 86.2 ± 3.1%‎</w:t>
+      </w:r>
+      <w:r>
+        <w:rPr>
+          <w:rFonts w:hint="cs" w:ascii="B Mitra" w:hAnsi="B Mitra" w:cs="B Mitra"/>
+          <w:sz w:val="18"/>
+          <w:rtl/>
+          <w:szCs w:val="18"/>
+        </w:rPr>
+        <w:t xml:space="preserve"> با عرض بازه میانگین ۴٫۶ ± ۰٫۳ تراکنش) اعتبار تجربی واسنجی را تایید می‌نماید.</w:t>
       </w:r>
     </w:p>
     <w:p>
@@ -4177,7 +3781,7 @@
           <w:sz w:val="18"/>
           <w:szCs w:val="18"/>
         </w:rPr>
-        <w:t>3.6</w:t>
+        <w:t>‎3.6‎</w:t>
       </w:r>
       <w:r>
         <w:rPr>
@@ -4195,25 +3799,7 @@
           <w:sz w:val="18"/>
           <w:szCs w:val="18"/>
         </w:rPr>
-        <w:t>B</w:t>
-      </w:r>
-      <w:r>
-        <w:rPr>
-          <w:rFonts w:hint="cs" w:ascii="B Mitra" w:hAnsi="B Mitra" w:cs="B Mitra"/>
-          <w:sz w:val="20"/>
-          <w:rtl/>
-          <w:szCs w:val="20"/>
-        </w:rPr>
-        <w:t>^</w:t>
-      </w:r>
-      <w:r>
-        <w:rPr>
-          <w:rFonts w:ascii="Times New Roman" w:hAnsi="Times New Roman" w:cs="Times New Roman"/>
-          <w:bidi w:val="0"/>
-          <w:sz w:val="18"/>
-          <w:szCs w:val="18"/>
-        </w:rPr>
-        <w:t>G</w:t>
+        <w:t>‎B^G‎</w:t>
       </w:r>
       <w:r>
         <w:rPr>
@@ -4246,25 +3832,7 @@
           <w:sz w:val="17"/>
           <w:szCs w:val="17"/>
         </w:rPr>
-        <w:t>q_j</w:t>
-      </w:r>
-      <w:r>
-        <w:rPr>
-          <w:rFonts w:hint="cs" w:ascii="B Mitra" w:hAnsi="B Mitra" w:cs="B Mitra"/>
-          <w:sz w:val="18"/>
-          <w:rtl/>
-          <w:szCs w:val="18"/>
-        </w:rPr>
-        <w:t xml:space="preserve"> = </w:t>
-      </w:r>
-      <w:r>
-        <w:rPr>
-          <w:rFonts w:ascii="Times New Roman" w:hAnsi="Times New Roman" w:cs="Times New Roman"/>
-          <w:bidi w:val="0"/>
-          <w:sz w:val="17"/>
-          <w:szCs w:val="17"/>
-        </w:rPr>
-        <w:t>q_0.85</w:t>
+        <w:t>‎q_j = q_0.85‎</w:t>
       </w:r>
       <w:r>
         <w:rPr>
@@ -4326,7 +3894,7 @@
           <w:sz w:val="17"/>
           <w:szCs w:val="17"/>
         </w:rPr>
-        <w:t>6</w:t>
+        <w:t>‎6‎</w:t>
       </w:r>
       <w:r>
         <w:rPr>
@@ -4529,7 +4097,7 @@
           <w:sz w:val="18"/>
           <w:szCs w:val="18"/>
         </w:rPr>
-        <w:t>3.7</w:t>
+        <w:t>‎3.7‎</w:t>
       </w:r>
       <w:r>
         <w:rPr>
@@ -4547,7 +4115,7 @@
           <w:sz w:val="18"/>
           <w:szCs w:val="18"/>
         </w:rPr>
-        <w:t>M-GATO</w:t>
+        <w:t>‎M-GATO‎</w:t>
       </w:r>
       <w:r>
         <w:rPr>
@@ -4580,7 +4148,7 @@
           <w:sz w:val="17"/>
           <w:szCs w:val="17"/>
         </w:rPr>
-        <w:t>M-GATO</w:t>
+        <w:t>‎M-GATO‎</w:t>
       </w:r>
       <w:r>
         <w:rPr>
@@ -4781,25 +4349,7 @@
           <w:sz w:val="17"/>
           <w:szCs w:val="17"/>
         </w:rPr>
-        <w:t>x</w:t>
-      </w:r>
-      <w:r>
-        <w:rPr>
-          <w:rFonts w:hint="cs" w:ascii="B Mitra" w:hAnsi="B Mitra" w:cs="B Mitra"/>
-          <w:sz w:val="18"/>
-          <w:rtl/>
-          <w:szCs w:val="18"/>
-        </w:rPr>
-        <w:t xml:space="preserve">]_+ = </w:t>
-      </w:r>
-      <w:r>
-        <w:rPr>
-          <w:rFonts w:ascii="Times New Roman" w:hAnsi="Times New Roman" w:cs="Times New Roman"/>
-          <w:bidi w:val="0"/>
-          <w:sz w:val="17"/>
-          <w:szCs w:val="17"/>
-        </w:rPr>
-        <w:t>max</w:t>
+        <w:t>‎x]_+ = max‎</w:t>
       </w:r>
       <w:r>
         <w:rPr>
@@ -4817,25 +4367,7 @@
           <w:sz w:val="17"/>
           <w:szCs w:val="17"/>
         </w:rPr>
-        <w:t>0</w:t>
-      </w:r>
-      <w:r>
-        <w:rPr>
-          <w:rFonts w:hint="cs" w:ascii="B Mitra" w:hAnsi="B Mitra" w:cs="B Mitra"/>
-          <w:sz w:val="18"/>
-          <w:rtl/>
-          <w:szCs w:val="18"/>
-        </w:rPr>
-        <w:t xml:space="preserve">, </w:t>
-      </w:r>
-      <w:r>
-        <w:rPr>
-          <w:rFonts w:ascii="Times New Roman" w:hAnsi="Times New Roman" w:cs="Times New Roman"/>
-          <w:bidi w:val="0"/>
-          <w:sz w:val="17"/>
-          <w:szCs w:val="17"/>
-        </w:rPr>
-        <w:t>x</w:t>
+        <w:t>‎0, x‎</w:t>
       </w:r>
       <w:r>
         <w:rPr>
@@ -4855,7 +4387,7 @@
           <w:sz w:val="17"/>
           <w:szCs w:val="17"/>
         </w:rPr>
-        <w:t>O</w:t>
+        <w:t>‎O‎</w:t>
       </w:r>
       <w:r>
         <w:rPr>
@@ -4865,7 +4397,7 @@
           <w:vertAlign w:val="subscript"/>
           <w:szCs w:val="17"/>
         </w:rPr>
-        <w:t>m, t</w:t>
+        <w:t>‎m, t‎</w:t>
       </w:r>
       <w:r>
         <w:rPr>
@@ -4883,7 +4415,7 @@
           <w:sz w:val="17"/>
           <w:szCs w:val="17"/>
         </w:rPr>
-        <w:t>Top-K</w:t>
+        <w:t>‎Top-K‎</w:t>
       </w:r>
       <w:r>
         <w:rPr>
@@ -4901,25 +4433,7 @@
           <w:sz w:val="17"/>
           <w:szCs w:val="17"/>
         </w:rPr>
-        <w:t>κ</w:t>
-      </w:r>
-      <w:r>
-        <w:rPr>
-          <w:rFonts w:hint="cs" w:ascii="B Mitra" w:hAnsi="B Mitra" w:cs="B Mitra"/>
-          <w:sz w:val="18"/>
-          <w:rtl/>
-          <w:szCs w:val="18"/>
-        </w:rPr>
-        <w:t xml:space="preserve"> = </w:t>
-      </w:r>
-      <w:r>
-        <w:rPr>
-          <w:rFonts w:ascii="Times New Roman" w:hAnsi="Times New Roman" w:cs="Times New Roman"/>
-          <w:bidi w:val="0"/>
-          <w:sz w:val="17"/>
-          <w:szCs w:val="17"/>
-        </w:rPr>
-        <w:t>18</w:t>
+        <w:t>‎κ = 18‎</w:t>
       </w:r>
       <w:r>
         <w:rPr>
@@ -4937,7 +4451,7 @@
           <w:sz w:val="17"/>
           <w:szCs w:val="17"/>
         </w:rPr>
-        <w:t>M-GATO</w:t>
+        <w:t>‎M-GATO‎</w:t>
       </w:r>
       <w:r>
         <w:rPr>
@@ -4955,7 +4469,7 @@
           <w:sz w:val="17"/>
           <w:szCs w:val="17"/>
         </w:rPr>
-        <w:t>Forecast-Bound Peer Gap</w:t>
+        <w:t>‎Forecast-Bound Peer Gap‎</w:t>
       </w:r>
       <w:r>
         <w:rPr>
@@ -4973,43 +4487,7 @@
           <w:sz w:val="17"/>
           <w:szCs w:val="17"/>
         </w:rPr>
-        <w:t>B</w:t>
-      </w:r>
-      <w:r>
-        <w:rPr>
-          <w:rFonts w:hint="cs" w:ascii="B Mitra" w:hAnsi="B Mitra" w:cs="B Mitra"/>
-          <w:sz w:val="18"/>
-          <w:rtl/>
-          <w:szCs w:val="18"/>
-        </w:rPr>
-        <w:t>^</w:t>
-      </w:r>
-      <w:r>
-        <w:rPr>
-          <w:rFonts w:ascii="Times New Roman" w:hAnsi="Times New Roman" w:cs="Times New Roman"/>
-          <w:bidi w:val="0"/>
-          <w:sz w:val="17"/>
-          <w:szCs w:val="17"/>
-        </w:rPr>
-        <w:t>G</w:t>
-      </w:r>
-      <w:r>
-        <w:rPr>
-          <w:rFonts w:hint="cs" w:ascii="B Mitra" w:hAnsi="B Mitra" w:cs="B Mitra"/>
-          <w:sz w:val="18"/>
-          <w:rtl/>
-          <w:szCs w:val="18"/>
-        </w:rPr>
-        <w:t xml:space="preserve"> - </w:t>
-      </w:r>
-      <w:r>
-        <w:rPr>
-          <w:rFonts w:ascii="Times New Roman" w:hAnsi="Times New Roman" w:cs="Times New Roman"/>
-          <w:bidi w:val="0"/>
-          <w:sz w:val="17"/>
-          <w:szCs w:val="17"/>
-        </w:rPr>
-        <w:t>U</w:t>
+        <w:t>‎B^G - U‎</w:t>
       </w:r>
       <w:r>
         <w:rPr>
@@ -5027,43 +4505,7 @@
           <w:sz w:val="17"/>
           <w:szCs w:val="17"/>
         </w:rPr>
-        <w:t>B</w:t>
-      </w:r>
-      <w:r>
-        <w:rPr>
-          <w:rFonts w:hint="cs" w:ascii="B Mitra" w:hAnsi="B Mitra" w:cs="B Mitra"/>
-          <w:sz w:val="18"/>
-          <w:rtl/>
-          <w:szCs w:val="18"/>
-        </w:rPr>
-        <w:t>^</w:t>
-      </w:r>
-      <w:r>
-        <w:rPr>
-          <w:rFonts w:ascii="Times New Roman" w:hAnsi="Times New Roman" w:cs="Times New Roman"/>
-          <w:bidi w:val="0"/>
-          <w:sz w:val="17"/>
-          <w:szCs w:val="17"/>
-        </w:rPr>
-        <w:t>G</w:t>
-      </w:r>
-      <w:r>
-        <w:rPr>
-          <w:rFonts w:hint="cs" w:ascii="B Mitra" w:hAnsi="B Mitra" w:cs="B Mitra"/>
-          <w:sz w:val="18"/>
-          <w:rtl/>
-          <w:szCs w:val="18"/>
-        </w:rPr>
-        <w:t xml:space="preserve"> - </w:t>
-      </w:r>
-      <w:r>
-        <w:rPr>
-          <w:rFonts w:ascii="Times New Roman" w:hAnsi="Times New Roman" w:cs="Times New Roman"/>
-          <w:bidi w:val="0"/>
-          <w:sz w:val="17"/>
-          <w:szCs w:val="17"/>
-        </w:rPr>
-        <w:t>Y</w:t>
+        <w:t>‎B^G - Y‎</w:t>
       </w:r>
       <w:r>
         <w:rPr>
@@ -5081,7 +4523,7 @@
           <w:sz w:val="17"/>
           <w:szCs w:val="17"/>
         </w:rPr>
-        <w:t>Y</w:t>
+        <w:t>‎Y‎</w:t>
       </w:r>
       <w:r>
         <w:rPr>
@@ -5099,7 +4541,7 @@
           <w:sz w:val="17"/>
           <w:szCs w:val="17"/>
         </w:rPr>
-        <w:t>μ</w:t>
+        <w:t>‎μ‎</w:t>
       </w:r>
       <w:r>
         <w:rPr>
@@ -5117,7 +4559,7 @@
           <w:sz w:val="17"/>
           <w:szCs w:val="17"/>
         </w:rPr>
-        <w:t>U</w:t>
+        <w:t>‎U‎</w:t>
       </w:r>
       <w:r>
         <w:rPr>
@@ -5135,7 +4577,7 @@
           <w:sz w:val="17"/>
           <w:szCs w:val="17"/>
         </w:rPr>
-        <w:t>Y</w:t>
+        <w:t>‎Y‎</w:t>
       </w:r>
       <w:r>
         <w:rPr>
@@ -5155,7 +4597,7 @@
           <w:sz w:val="17"/>
           <w:szCs w:val="17"/>
         </w:rPr>
-        <w:t>Q</w:t>
+        <w:t>‎Q‎</w:t>
       </w:r>
       <w:r>
         <w:rPr>
@@ -5165,7 +4607,7 @@
           <w:vertAlign w:val="subscript"/>
           <w:szCs w:val="17"/>
         </w:rPr>
-        <w:t>m, t</w:t>
+        <w:t>‎m, t‎</w:t>
       </w:r>
       <w:r>
         <w:rPr>
@@ -5198,7 +4640,7 @@
           <w:sz w:val="17"/>
           <w:szCs w:val="17"/>
         </w:rPr>
-        <w:t>MERCH_00322</w:t>
+        <w:t>‎MERCH_00322‎</w:t>
       </w:r>
       <w:r>
         <w:rPr>
@@ -5216,115 +4658,115 @@
           <w:sz w:val="17"/>
           <w:szCs w:val="17"/>
         </w:rPr>
-        <w:t>Y</w:t>
-      </w:r>
-      <w:r>
-        <w:rPr>
-          <w:rFonts w:hint="cs" w:ascii="B Mitra" w:hAnsi="B Mitra" w:cs="B Mitra"/>
-          <w:sz w:val="18"/>
-          <w:rtl/>
-          <w:szCs w:val="18"/>
-        </w:rPr>
-        <w:t xml:space="preserve"> = ۱۰۰، پیش‌بینی مدل </w:t>
-      </w:r>
-      <w:r>
-        <w:rPr>
-          <w:rFonts w:ascii="Times New Roman" w:hAnsi="Times New Roman" w:cs="Times New Roman"/>
-          <w:bidi w:val="0"/>
-          <w:sz w:val="17"/>
-          <w:szCs w:val="17"/>
-        </w:rPr>
-        <w:t>μ</w:t>
-      </w:r>
-      <w:r>
-        <w:rPr>
-          <w:rFonts w:hint="cs" w:ascii="B Mitra" w:hAnsi="B Mitra" w:cs="B Mitra"/>
-          <w:sz w:val="18"/>
-          <w:rtl/>
-          <w:szCs w:val="18"/>
-        </w:rPr>
-        <w:t xml:space="preserve">̂ = ۱۰۵٫۰، و کران بالای کالیبره‌شده </w:t>
-      </w:r>
-      <w:r>
-        <w:rPr>
-          <w:rFonts w:ascii="Times New Roman" w:hAnsi="Times New Roman" w:cs="Times New Roman"/>
-          <w:bidi w:val="0"/>
-          <w:sz w:val="17"/>
-          <w:szCs w:val="17"/>
-        </w:rPr>
-        <w:t>U</w:t>
-      </w:r>
-      <w:r>
-        <w:rPr>
-          <w:rFonts w:hint="cs" w:ascii="B Mitra" w:hAnsi="B Mitra" w:cs="B Mitra"/>
-          <w:sz w:val="18"/>
-          <w:rtl/>
-          <w:szCs w:val="18"/>
-        </w:rPr>
-        <w:t xml:space="preserve"> = ۱۱۲٫۰ تراکنش است. همتایان این پذیرنده به بنچ‌مارک محافظه‌کارانه </w:t>
-      </w:r>
-      <w:r>
-        <w:rPr>
-          <w:rFonts w:ascii="Times New Roman" w:hAnsi="Times New Roman" w:cs="Times New Roman"/>
-          <w:bidi w:val="0"/>
-          <w:sz w:val="17"/>
-          <w:szCs w:val="17"/>
-        </w:rPr>
-        <w:t>B</w:t>
-      </w:r>
-      <w:r>
-        <w:rPr>
-          <w:rFonts w:hint="cs" w:ascii="B Mitra" w:hAnsi="B Mitra" w:cs="B Mitra"/>
-          <w:sz w:val="18"/>
-          <w:rtl/>
-          <w:szCs w:val="18"/>
-        </w:rPr>
-        <w:t>^</w:t>
-      </w:r>
-      <w:r>
-        <w:rPr>
-          <w:rFonts w:ascii="Times New Roman" w:hAnsi="Times New Roman" w:cs="Times New Roman"/>
-          <w:bidi w:val="0"/>
-          <w:sz w:val="17"/>
-          <w:szCs w:val="17"/>
-        </w:rPr>
-        <w:t>G</w:t>
-      </w:r>
-      <w:r>
-        <w:rPr>
-          <w:rFonts w:hint="cs" w:ascii="B Mitra" w:hAnsi="B Mitra" w:cs="B Mitra"/>
-          <w:sz w:val="18"/>
-          <w:rtl/>
-          <w:szCs w:val="18"/>
-        </w:rPr>
-        <w:t xml:space="preserve"> = ۱۷۰٫۰ دست یافته‌اند و ضریب اتکای گرافی </w:t>
-      </w:r>
-      <w:r>
-        <w:rPr>
-          <w:rFonts w:ascii="Times New Roman" w:hAnsi="Times New Roman" w:cs="Times New Roman"/>
-          <w:bidi w:val="0"/>
-          <w:sz w:val="17"/>
-          <w:szCs w:val="17"/>
-        </w:rPr>
-        <w:t>Q</w:t>
-      </w:r>
-      <w:r>
-        <w:rPr>
-          <w:rFonts w:hint="cs" w:ascii="B Mitra" w:hAnsi="B Mitra" w:cs="B Mitra"/>
-          <w:sz w:val="18"/>
-          <w:rtl/>
-          <w:szCs w:val="18"/>
-        </w:rPr>
-        <w:t xml:space="preserve"> = ۰٫۹۰ است. بنابراین شکاف کران-پیش‌بینی همتایان و امتیاز </w:t>
-      </w:r>
-      <w:r>
-        <w:rPr>
-          <w:rFonts w:ascii="Times New Roman" w:hAnsi="Times New Roman" w:cs="Times New Roman"/>
-          <w:bidi w:val="0"/>
-          <w:sz w:val="17"/>
-          <w:szCs w:val="17"/>
-        </w:rPr>
-        <w:t>M-GATO</w:t>
+        <w:t>‎Y = 100‎</w:t>
+      </w:r>
+      <w:r>
+        <w:rPr>
+          <w:rFonts w:hint="cs" w:ascii="B Mitra" w:hAnsi="B Mitra" w:cs="B Mitra"/>
+          <w:sz w:val="18"/>
+          <w:rtl/>
+          <w:szCs w:val="18"/>
+        </w:rPr>
+        <w:t xml:space="preserve">، پیش‌بینی مدل </w:t>
+      </w:r>
+      <w:r>
+        <w:rPr>
+          <w:rFonts w:ascii="Times New Roman" w:hAnsi="Times New Roman" w:cs="Times New Roman"/>
+          <w:bidi w:val="0"/>
+          <w:sz w:val="17"/>
+          <w:szCs w:val="17"/>
+        </w:rPr>
+        <w:t>‎μ‎</w:t>
+      </w:r>
+      <w:r>
+        <w:rPr>
+          <w:rFonts w:hint="cs" w:ascii="B Mitra" w:hAnsi="B Mitra" w:cs="B Mitra"/>
+          <w:sz w:val="18"/>
+          <w:rtl/>
+          <w:szCs w:val="18"/>
+        </w:rPr>
+        <w:t xml:space="preserve">̂ = </w:t>
+      </w:r>
+      <w:r>
+        <w:rPr>
+          <w:rFonts w:ascii="Times New Roman" w:hAnsi="Times New Roman" w:cs="Times New Roman"/>
+          <w:bidi w:val="0"/>
+          <w:sz w:val="17"/>
+          <w:szCs w:val="17"/>
+        </w:rPr>
+        <w:t>‎105.0‎</w:t>
+      </w:r>
+      <w:r>
+        <w:rPr>
+          <w:rFonts w:hint="cs" w:ascii="B Mitra" w:hAnsi="B Mitra" w:cs="B Mitra"/>
+          <w:sz w:val="18"/>
+          <w:rtl/>
+          <w:szCs w:val="18"/>
+        </w:rPr>
+        <w:t xml:space="preserve">، و کران بالای کالیبره‌شده </w:t>
+      </w:r>
+      <w:r>
+        <w:rPr>
+          <w:rFonts w:ascii="Times New Roman" w:hAnsi="Times New Roman" w:cs="Times New Roman"/>
+          <w:bidi w:val="0"/>
+          <w:sz w:val="17"/>
+          <w:szCs w:val="17"/>
+        </w:rPr>
+        <w:t>‎U = 112.0‎</w:t>
+      </w:r>
+      <w:r>
+        <w:rPr>
+          <w:rFonts w:hint="cs" w:ascii="B Mitra" w:hAnsi="B Mitra" w:cs="B Mitra"/>
+          <w:sz w:val="18"/>
+          <w:rtl/>
+          <w:szCs w:val="18"/>
+        </w:rPr>
+        <w:t xml:space="preserve"> تراکنش است. همتایان این پذیرنده به بنچ‌مارک محافظه‌کارانه </w:t>
+      </w:r>
+      <w:r>
+        <w:rPr>
+          <w:rFonts w:ascii="Times New Roman" w:hAnsi="Times New Roman" w:cs="Times New Roman"/>
+          <w:bidi w:val="0"/>
+          <w:sz w:val="17"/>
+          <w:szCs w:val="17"/>
+        </w:rPr>
+        <w:t>‎B^G = 170.0‎</w:t>
+      </w:r>
+      <w:r>
+        <w:rPr>
+          <w:rFonts w:hint="cs" w:ascii="B Mitra" w:hAnsi="B Mitra" w:cs="B Mitra"/>
+          <w:sz w:val="18"/>
+          <w:rtl/>
+          <w:szCs w:val="18"/>
+        </w:rPr>
+        <w:t xml:space="preserve"> دست یافته‌اند و ضریب اتکای گرافی </w:t>
+      </w:r>
+      <w:r>
+        <w:rPr>
+          <w:rFonts w:ascii="Times New Roman" w:hAnsi="Times New Roman" w:cs="Times New Roman"/>
+          <w:bidi w:val="0"/>
+          <w:sz w:val="17"/>
+          <w:szCs w:val="17"/>
+        </w:rPr>
+        <w:t>‎Q = 0.90‎</w:t>
+      </w:r>
+      <w:r>
+        <w:rPr>
+          <w:rFonts w:hint="cs" w:ascii="B Mitra" w:hAnsi="B Mitra" w:cs="B Mitra"/>
+          <w:sz w:val="18"/>
+          <w:rtl/>
+          <w:szCs w:val="18"/>
+        </w:rPr>
+        <w:t xml:space="preserve"> است. بنابراین شکاف کران-پیش‌بینی همتایان و امتیاز </w:t>
+      </w:r>
+      <w:r>
+        <w:rPr>
+          <w:rFonts w:ascii="Times New Roman" w:hAnsi="Times New Roman" w:cs="Times New Roman"/>
+          <w:bidi w:val="0"/>
+          <w:sz w:val="17"/>
+          <w:szCs w:val="17"/>
+        </w:rPr>
+        <w:t>‎M-GATO‎</w:t>
       </w:r>
       <w:r>
         <w:rPr>
@@ -5451,7 +4893,7 @@
           <w:sz w:val="17"/>
           <w:szCs w:val="17"/>
         </w:rPr>
-        <w:t>3</w:t>
+        <w:t>‎3‎</w:t>
       </w:r>
       <w:r>
         <w:rPr>
@@ -5469,16 +4911,16 @@
           <w:sz w:val="17"/>
           <w:szCs w:val="17"/>
         </w:rPr>
-        <w:t>M-GATO:</w:t>
-      </w:r>
-      <w:r>
-        <w:rPr>
-          <w:rFonts w:hint="cs" w:ascii="B Mitra" w:hAnsi="B Mitra" w:cs="B Mitra"/>
-          <w:sz w:val="17"/>
-          <w:rtl/>
-          <w:szCs w:val="17"/>
-        </w:rPr>
-        <w:t xml:space="preserve"> تراکنش مشاهده‌شده، پیش‌بینی مدل، کران بالای طبیعی و بنچ‌مارک همتایان</w:t>
+        <w:t>‎M-GATO‎</w:t>
+      </w:r>
+      <w:r>
+        <w:rPr>
+          <w:rFonts w:hint="cs" w:ascii="B Mitra" w:hAnsi="B Mitra" w:cs="B Mitra"/>
+          <w:sz w:val="17"/>
+          <w:rtl/>
+          <w:szCs w:val="17"/>
+        </w:rPr>
+        <w:t>: تراکنش مشاهده‌شده، پیش‌بینی مدل، کران بالای طبیعی و بنچ‌مارک همتایان</w:t>
       </w:r>
     </w:p>
     <w:p>
@@ -5493,7 +4935,7 @@
           <w:sz w:val="20"/>
           <w:szCs w:val="20"/>
         </w:rPr>
-        <w:t>4</w:t>
+        <w:t>‎4‎</w:t>
       </w:r>
       <w:r>
         <w:rPr>
@@ -5541,7 +4983,7 @@
           <w:sz w:val="17"/>
           <w:szCs w:val="17"/>
         </w:rPr>
-        <w:t>Scenario 0</w:t>
+        <w:t>‎Scenario 0‎</w:t>
       </w:r>
       <w:r>
         <w:rPr>
@@ -5559,25 +5001,7 @@
           <w:sz w:val="17"/>
           <w:szCs w:val="17"/>
         </w:rPr>
-        <w:t>TP</w:t>
-      </w:r>
-      <w:r>
-        <w:rPr>
-          <w:rFonts w:hint="cs" w:ascii="B Mitra" w:hAnsi="B Mitra" w:cs="B Mitra"/>
-          <w:sz w:val="18"/>
-          <w:rtl/>
-          <w:szCs w:val="18"/>
-        </w:rPr>
-        <w:t xml:space="preserve"> = </w:t>
-      </w:r>
-      <w:r>
-        <w:rPr>
-          <w:rFonts w:ascii="Times New Roman" w:hAnsi="Times New Roman" w:cs="Times New Roman"/>
-          <w:bidi w:val="0"/>
-          <w:sz w:val="17"/>
-          <w:szCs w:val="17"/>
-        </w:rPr>
-        <w:t>0</w:t>
+        <w:t>‎TP = 0‎</w:t>
       </w:r>
       <w:r>
         <w:rPr>
@@ -5610,7 +5034,7 @@
           <w:sz w:val="17"/>
           <w:szCs w:val="17"/>
         </w:rPr>
-        <w:t>P0</w:t>
+        <w:t>‎P0‎</w:t>
       </w:r>
       <w:r>
         <w:rPr>
@@ -5628,151 +5052,115 @@
           <w:sz w:val="17"/>
           <w:szCs w:val="17"/>
         </w:rPr>
-        <w:t>λ</w:t>
-      </w:r>
-      <w:r>
-        <w:rPr>
-          <w:rFonts w:hint="cs" w:ascii="B Mitra" w:hAnsi="B Mitra" w:cs="B Mitra"/>
-          <w:sz w:val="18"/>
-          <w:rtl/>
-          <w:szCs w:val="18"/>
-        </w:rPr>
-        <w:t xml:space="preserve"> = ۰٫۶۵، ضریب انحنا </w:t>
-      </w:r>
-      <w:r>
-        <w:rPr>
-          <w:rFonts w:ascii="Times New Roman" w:hAnsi="Times New Roman" w:cs="Times New Roman"/>
-          <w:bidi w:val="0"/>
-          <w:sz w:val="17"/>
-          <w:szCs w:val="17"/>
-        </w:rPr>
-        <w:t>η</w:t>
-      </w:r>
-      <w:r>
-        <w:rPr>
-          <w:rFonts w:hint="cs" w:ascii="B Mitra" w:hAnsi="B Mitra" w:cs="B Mitra"/>
-          <w:sz w:val="18"/>
-          <w:rtl/>
-          <w:szCs w:val="18"/>
-        </w:rPr>
-        <w:t xml:space="preserve"> = ۰٫۲۵، اشباع گرافی </w:t>
-      </w:r>
-      <w:r>
-        <w:rPr>
-          <w:rFonts w:ascii="Times New Roman" w:hAnsi="Times New Roman" w:cs="Times New Roman"/>
-          <w:bidi w:val="0"/>
-          <w:sz w:val="17"/>
-          <w:szCs w:val="17"/>
-        </w:rPr>
-        <w:t>κ</w:t>
-      </w:r>
-      <w:r>
-        <w:rPr>
-          <w:rFonts w:hint="cs" w:ascii="B Mitra" w:hAnsi="B Mitra" w:cs="B Mitra"/>
-          <w:sz w:val="18"/>
-          <w:rtl/>
-          <w:szCs w:val="18"/>
-        </w:rPr>
-        <w:t xml:space="preserve"> = ۱۸٫۰، تعداد همسایگان </w:t>
-      </w:r>
-      <w:r>
-        <w:rPr>
-          <w:rFonts w:ascii="Times New Roman" w:hAnsi="Times New Roman" w:cs="Times New Roman"/>
-          <w:bidi w:val="0"/>
-          <w:sz w:val="17"/>
-          <w:szCs w:val="17"/>
-        </w:rPr>
-        <w:t>K</w:t>
-      </w:r>
-      <w:r>
-        <w:rPr>
-          <w:rFonts w:hint="cs" w:ascii="B Mitra" w:hAnsi="B Mitra" w:cs="B Mitra"/>
-          <w:sz w:val="18"/>
-          <w:rtl/>
-          <w:szCs w:val="18"/>
-        </w:rPr>
-        <w:t xml:space="preserve"> = ۶ و خطای واسنجی </w:t>
-      </w:r>
-      <w:r>
-        <w:rPr>
-          <w:rFonts w:ascii="Times New Roman" w:hAnsi="Times New Roman" w:cs="Times New Roman"/>
-          <w:bidi w:val="0"/>
-          <w:sz w:val="17"/>
-          <w:szCs w:val="17"/>
-        </w:rPr>
-        <w:t>α</w:t>
-      </w:r>
-      <w:r>
-        <w:rPr>
-          <w:rFonts w:hint="cs" w:ascii="B Mitra" w:hAnsi="B Mitra" w:cs="B Mitra"/>
-          <w:sz w:val="18"/>
-          <w:rtl/>
-          <w:szCs w:val="18"/>
-        </w:rPr>
-        <w:t xml:space="preserve"> = ۰٫۱۵. تحلیل حساسیت تجربی در ۱۰ سید نشان داد کیفیت رتبه‌بندی در برابر تغییرات همسایگی </w:t>
-      </w:r>
-      <w:r>
-        <w:rPr>
-          <w:rFonts w:ascii="Times New Roman" w:hAnsi="Times New Roman" w:cs="Times New Roman"/>
-          <w:bidi w:val="0"/>
-          <w:sz w:val="17"/>
-          <w:szCs w:val="17"/>
-        </w:rPr>
-        <w:t>K</w:t>
-      </w:r>
-      <w:r>
-        <w:rPr>
-          <w:rFonts w:hint="cs" w:ascii="B Mitra" w:hAnsi="B Mitra" w:cs="B Mitra"/>
-          <w:sz w:val="18"/>
-          <w:rtl/>
-          <w:szCs w:val="18"/>
-        </w:rPr>
-        <w:t xml:space="preserve"> ∈ [</w:t>
-      </w:r>
-      <w:r>
-        <w:rPr>
-          <w:rFonts w:ascii="Times New Roman" w:hAnsi="Times New Roman" w:cs="Times New Roman"/>
-          <w:bidi w:val="0"/>
-          <w:sz w:val="17"/>
-          <w:szCs w:val="17"/>
-        </w:rPr>
-        <w:t>3</w:t>
-      </w:r>
-      <w:r>
-        <w:rPr>
-          <w:rFonts w:hint="cs" w:ascii="B Mitra" w:hAnsi="B Mitra" w:cs="B Mitra"/>
-          <w:sz w:val="18"/>
-          <w:rtl/>
-          <w:szCs w:val="18"/>
-        </w:rPr>
-        <w:t xml:space="preserve">, </w:t>
-      </w:r>
-      <w:r>
-        <w:rPr>
-          <w:rFonts w:ascii="Times New Roman" w:hAnsi="Times New Roman" w:cs="Times New Roman"/>
-          <w:bidi w:val="0"/>
-          <w:sz w:val="17"/>
-          <w:szCs w:val="17"/>
-        </w:rPr>
-        <w:t>10</w:t>
-      </w:r>
-      <w:r>
-        <w:rPr>
-          <w:rFonts w:hint="cs" w:ascii="B Mitra" w:hAnsi="B Mitra" w:cs="B Mitra"/>
-          <w:sz w:val="18"/>
-          <w:rtl/>
-          <w:szCs w:val="18"/>
-        </w:rPr>
-        <w:t xml:space="preserve">] (دامنه </w:t>
-      </w:r>
-      <w:r>
-        <w:rPr>
-          <w:rFonts w:ascii="Times New Roman" w:hAnsi="Times New Roman" w:cs="Times New Roman"/>
-          <w:bidi w:val="0"/>
-          <w:sz w:val="17"/>
-          <w:szCs w:val="17"/>
-        </w:rPr>
-        <w:t>NDCG</w:t>
+        <w:t>‎λ = 0.65‎</w:t>
+      </w:r>
+      <w:r>
+        <w:rPr>
+          <w:rFonts w:hint="cs" w:ascii="B Mitra" w:hAnsi="B Mitra" w:cs="B Mitra"/>
+          <w:sz w:val="18"/>
+          <w:rtl/>
+          <w:szCs w:val="18"/>
+        </w:rPr>
+        <w:t xml:space="preserve">، ضریب انحنا </w:t>
+      </w:r>
+      <w:r>
+        <w:rPr>
+          <w:rFonts w:ascii="Times New Roman" w:hAnsi="Times New Roman" w:cs="Times New Roman"/>
+          <w:bidi w:val="0"/>
+          <w:sz w:val="17"/>
+          <w:szCs w:val="17"/>
+        </w:rPr>
+        <w:t>‎η = 0.25‎</w:t>
+      </w:r>
+      <w:r>
+        <w:rPr>
+          <w:rFonts w:hint="cs" w:ascii="B Mitra" w:hAnsi="B Mitra" w:cs="B Mitra"/>
+          <w:sz w:val="18"/>
+          <w:rtl/>
+          <w:szCs w:val="18"/>
+        </w:rPr>
+        <w:t xml:space="preserve">، اشباع گرافی </w:t>
+      </w:r>
+      <w:r>
+        <w:rPr>
+          <w:rFonts w:ascii="Times New Roman" w:hAnsi="Times New Roman" w:cs="Times New Roman"/>
+          <w:bidi w:val="0"/>
+          <w:sz w:val="17"/>
+          <w:szCs w:val="17"/>
+        </w:rPr>
+        <w:t>‎κ = 18.0‎</w:t>
+      </w:r>
+      <w:r>
+        <w:rPr>
+          <w:rFonts w:hint="cs" w:ascii="B Mitra" w:hAnsi="B Mitra" w:cs="B Mitra"/>
+          <w:sz w:val="18"/>
+          <w:rtl/>
+          <w:szCs w:val="18"/>
+        </w:rPr>
+        <w:t xml:space="preserve">، تعداد همسایگان </w:t>
+      </w:r>
+      <w:r>
+        <w:rPr>
+          <w:rFonts w:ascii="Times New Roman" w:hAnsi="Times New Roman" w:cs="Times New Roman"/>
+          <w:bidi w:val="0"/>
+          <w:sz w:val="17"/>
+          <w:szCs w:val="17"/>
+        </w:rPr>
+        <w:t>‎K = 6‎</w:t>
+      </w:r>
+      <w:r>
+        <w:rPr>
+          <w:rFonts w:hint="cs" w:ascii="B Mitra" w:hAnsi="B Mitra" w:cs="B Mitra"/>
+          <w:sz w:val="18"/>
+          <w:rtl/>
+          <w:szCs w:val="18"/>
+        </w:rPr>
+        <w:t xml:space="preserve"> و خطای واسنجی </w:t>
+      </w:r>
+      <w:r>
+        <w:rPr>
+          <w:rFonts w:ascii="Times New Roman" w:hAnsi="Times New Roman" w:cs="Times New Roman"/>
+          <w:bidi w:val="0"/>
+          <w:sz w:val="17"/>
+          <w:szCs w:val="17"/>
+        </w:rPr>
+        <w:t>‎α = 0.15‎</w:t>
+      </w:r>
+      <w:r>
+        <w:rPr>
+          <w:rFonts w:hint="cs" w:ascii="B Mitra" w:hAnsi="B Mitra" w:cs="B Mitra"/>
+          <w:sz w:val="18"/>
+          <w:rtl/>
+          <w:szCs w:val="18"/>
+        </w:rPr>
+        <w:t xml:space="preserve">. تحلیل حساسیت تجربی در ۱۰ سید نشان داد کیفیت رتبه‌بندی در برابر تغییرات همسایگی </w:t>
+      </w:r>
+      <w:r>
+        <w:rPr>
+          <w:rFonts w:ascii="Times New Roman" w:hAnsi="Times New Roman" w:cs="Times New Roman"/>
+          <w:bidi w:val="0"/>
+          <w:sz w:val="17"/>
+          <w:szCs w:val="17"/>
+        </w:rPr>
+        <w:t>‎K ∈ [3, 10]‎</w:t>
+      </w:r>
+      <w:r>
+        <w:rPr>
+          <w:rFonts w:hint="cs" w:ascii="B Mitra" w:hAnsi="B Mitra" w:cs="B Mitra"/>
+          <w:sz w:val="18"/>
+          <w:rtl/>
+          <w:szCs w:val="18"/>
+        </w:rPr>
+        <w:t xml:space="preserve"> (دامنه </w:t>
+      </w:r>
+      <w:r>
+        <w:rPr>
+          <w:rFonts w:ascii="Times New Roman" w:hAnsi="Times New Roman" w:cs="Times New Roman"/>
+          <w:bidi w:val="0"/>
+          <w:sz w:val="17"/>
+          <w:szCs w:val="17"/>
+        </w:rPr>
+        <w:t>‎NDCG‎</w:t>
       </w:r>
       <w:r>
         <w:rPr>
@@ -5790,61 +5178,25 @@
           <w:sz w:val="17"/>
           <w:szCs w:val="17"/>
         </w:rPr>
-        <w:t>η</w:t>
-      </w:r>
-      <w:r>
-        <w:rPr>
-          <w:rFonts w:hint="cs" w:ascii="B Mitra" w:hAnsi="B Mitra" w:cs="B Mitra"/>
-          <w:sz w:val="18"/>
-          <w:rtl/>
-          <w:szCs w:val="18"/>
-        </w:rPr>
-        <w:t xml:space="preserve"> ∈ [</w:t>
-      </w:r>
-      <w:r>
-        <w:rPr>
-          <w:rFonts w:ascii="Times New Roman" w:hAnsi="Times New Roman" w:cs="Times New Roman"/>
-          <w:bidi w:val="0"/>
-          <w:sz w:val="17"/>
-          <w:szCs w:val="17"/>
-        </w:rPr>
-        <w:t>0.0</w:t>
-      </w:r>
-      <w:r>
-        <w:rPr>
-          <w:rFonts w:hint="cs" w:ascii="B Mitra" w:hAnsi="B Mitra" w:cs="B Mitra"/>
-          <w:sz w:val="18"/>
-          <w:rtl/>
-          <w:szCs w:val="18"/>
-        </w:rPr>
-        <w:t xml:space="preserve">, </w:t>
-      </w:r>
-      <w:r>
-        <w:rPr>
-          <w:rFonts w:ascii="Times New Roman" w:hAnsi="Times New Roman" w:cs="Times New Roman"/>
-          <w:bidi w:val="0"/>
-          <w:sz w:val="17"/>
-          <w:szCs w:val="17"/>
-        </w:rPr>
-        <w:t>0.5</w:t>
-      </w:r>
-      <w:r>
-        <w:rPr>
-          <w:rFonts w:hint="cs" w:ascii="B Mitra" w:hAnsi="B Mitra" w:cs="B Mitra"/>
-          <w:sz w:val="18"/>
-          <w:rtl/>
-          <w:szCs w:val="18"/>
-        </w:rPr>
-        <w:t xml:space="preserve">] (دامنه </w:t>
-      </w:r>
-      <w:r>
-        <w:rPr>
-          <w:rFonts w:ascii="Times New Roman" w:hAnsi="Times New Roman" w:cs="Times New Roman"/>
-          <w:bidi w:val="0"/>
-          <w:sz w:val="17"/>
-          <w:szCs w:val="17"/>
-        </w:rPr>
-        <w:t>NDCG</w:t>
+        <w:t>‎η ∈ [0.0, 0.5]‎</w:t>
+      </w:r>
+      <w:r>
+        <w:rPr>
+          <w:rFonts w:hint="cs" w:ascii="B Mitra" w:hAnsi="B Mitra" w:cs="B Mitra"/>
+          <w:sz w:val="18"/>
+          <w:rtl/>
+          <w:szCs w:val="18"/>
+        </w:rPr>
+        <w:t xml:space="preserve"> (دامنه </w:t>
+      </w:r>
+      <w:r>
+        <w:rPr>
+          <w:rFonts w:ascii="Times New Roman" w:hAnsi="Times New Roman" w:cs="Times New Roman"/>
+          <w:bidi w:val="0"/>
+          <w:sz w:val="17"/>
+          <w:szCs w:val="17"/>
+        </w:rPr>
+        <w:t>‎NDCG‎</w:t>
       </w:r>
       <w:r>
         <w:rPr>
@@ -5862,61 +5214,25 @@
           <w:sz w:val="17"/>
           <w:szCs w:val="17"/>
         </w:rPr>
-        <w:t>κ</w:t>
-      </w:r>
-      <w:r>
-        <w:rPr>
-          <w:rFonts w:hint="cs" w:ascii="B Mitra" w:hAnsi="B Mitra" w:cs="B Mitra"/>
-          <w:sz w:val="18"/>
-          <w:rtl/>
-          <w:szCs w:val="18"/>
-        </w:rPr>
-        <w:t xml:space="preserve"> ∈ [</w:t>
-      </w:r>
-      <w:r>
-        <w:rPr>
-          <w:rFonts w:ascii="Times New Roman" w:hAnsi="Times New Roman" w:cs="Times New Roman"/>
-          <w:bidi w:val="0"/>
-          <w:sz w:val="17"/>
-          <w:szCs w:val="17"/>
-        </w:rPr>
-        <w:t>10</w:t>
-      </w:r>
-      <w:r>
-        <w:rPr>
-          <w:rFonts w:hint="cs" w:ascii="B Mitra" w:hAnsi="B Mitra" w:cs="B Mitra"/>
-          <w:sz w:val="18"/>
-          <w:rtl/>
-          <w:szCs w:val="18"/>
-        </w:rPr>
-        <w:t xml:space="preserve">, </w:t>
-      </w:r>
-      <w:r>
-        <w:rPr>
-          <w:rFonts w:ascii="Times New Roman" w:hAnsi="Times New Roman" w:cs="Times New Roman"/>
-          <w:bidi w:val="0"/>
-          <w:sz w:val="17"/>
-          <w:szCs w:val="17"/>
-        </w:rPr>
-        <w:t>30</w:t>
-      </w:r>
-      <w:r>
-        <w:rPr>
-          <w:rFonts w:hint="cs" w:ascii="B Mitra" w:hAnsi="B Mitra" w:cs="B Mitra"/>
-          <w:sz w:val="18"/>
-          <w:rtl/>
-          <w:szCs w:val="18"/>
-        </w:rPr>
-        <w:t xml:space="preserve">] (دامنه </w:t>
-      </w:r>
-      <w:r>
-        <w:rPr>
-          <w:rFonts w:ascii="Times New Roman" w:hAnsi="Times New Roman" w:cs="Times New Roman"/>
-          <w:bidi w:val="0"/>
-          <w:sz w:val="17"/>
-          <w:szCs w:val="17"/>
-        </w:rPr>
-        <w:t>NDCG</w:t>
+        <w:t>‎κ ∈ [10, 30]‎</w:t>
+      </w:r>
+      <w:r>
+        <w:rPr>
+          <w:rFonts w:hint="cs" w:ascii="B Mitra" w:hAnsi="B Mitra" w:cs="B Mitra"/>
+          <w:sz w:val="18"/>
+          <w:rtl/>
+          <w:szCs w:val="18"/>
+        </w:rPr>
+        <w:t xml:space="preserve"> (دامنه </w:t>
+      </w:r>
+      <w:r>
+        <w:rPr>
+          <w:rFonts w:ascii="Times New Roman" w:hAnsi="Times New Roman" w:cs="Times New Roman"/>
+          <w:bidi w:val="0"/>
+          <w:sz w:val="17"/>
+          <w:szCs w:val="17"/>
+        </w:rPr>
+        <w:t>‎NDCG‎</w:t>
       </w:r>
       <w:r>
         <w:rPr>
@@ -5940,7 +5256,7 @@
           <w:sz w:val="20"/>
           <w:szCs w:val="20"/>
         </w:rPr>
-        <w:t>5</w:t>
+        <w:t>‎5‎</w:t>
       </w:r>
       <w:r>
         <w:rPr>
@@ -5964,7 +5280,7 @@
           <w:sz w:val="18"/>
           <w:szCs w:val="18"/>
         </w:rPr>
-        <w:t>5.1</w:t>
+        <w:t>‎5.1‎</w:t>
       </w:r>
       <w:r>
         <w:rPr>
@@ -5997,7 +5313,7 @@
           <w:sz w:val="17"/>
           <w:szCs w:val="17"/>
         </w:rPr>
-        <w:t>1</w:t>
+        <w:t>‎1‎</w:t>
       </w:r>
       <w:r>
         <w:rPr>
@@ -6015,7 +5331,7 @@
           <w:sz w:val="17"/>
           <w:szCs w:val="17"/>
         </w:rPr>
-        <w:t>NB NLL</w:t>
+        <w:t>‎NB NLL‎</w:t>
       </w:r>
       <w:r>
         <w:rPr>
@@ -6049,7 +5365,7 @@
           <w:sz w:val="17"/>
           <w:szCs w:val="17"/>
         </w:rPr>
-        <w:t>1</w:t>
+        <w:t>‎1‎</w:t>
       </w:r>
       <w:r>
         <w:rPr>
@@ -6144,7 +5460,7 @@
                 <w:sz w:val="12"/>
                 <w:szCs w:val="12"/>
               </w:rPr>
-              <w:t>MAE</w:t>
+              <w:t>‎MAE‎</w:t>
             </w:r>
           </w:p>
         </w:tc>
@@ -6176,7 +5492,7 @@
                 <w:sz w:val="12"/>
                 <w:szCs w:val="12"/>
               </w:rPr>
-              <w:t>RMSE</w:t>
+              <w:t>‎RMSE‎</w:t>
             </w:r>
           </w:p>
         </w:tc>
@@ -6208,7 +5524,7 @@
                 <w:sz w:val="12"/>
                 <w:szCs w:val="12"/>
               </w:rPr>
-              <w:t>sMAPE</w:t>
+              <w:t>‎sMAPE‎</w:t>
             </w:r>
           </w:p>
         </w:tc>
@@ -6240,7 +5556,7 @@
                 <w:sz w:val="12"/>
                 <w:szCs w:val="12"/>
               </w:rPr>
-              <w:t>NB NLL</w:t>
+              <w:t>‎NB NLL‎</w:t>
             </w:r>
           </w:p>
         </w:tc>
@@ -6273,7 +5589,7 @@
                 <w:sz w:val="11"/>
                 <w:szCs w:val="11"/>
               </w:rPr>
-              <w:t>Naive Persistence</w:t>
+              <w:t>‎Naive Persistence‎</w:t>
             </w:r>
             <w:r>
               <w:rPr>
@@ -6427,7 +5743,7 @@
                 <w:sz w:val="11"/>
                 <w:szCs w:val="11"/>
               </w:rPr>
-              <w:t>Moving Average</w:t>
+              <w:t>‎Moving Average‎</w:t>
             </w:r>
             <w:r>
               <w:rPr>
@@ -6581,7 +5897,7 @@
                 <w:sz w:val="11"/>
                 <w:szCs w:val="11"/>
               </w:rPr>
-              <w:t>Exp. Smoothing</w:t>
+              <w:t>‎Exp. Smoothing‎</w:t>
             </w:r>
             <w:r>
               <w:rPr>
@@ -6735,7 +6051,7 @@
                 <w:sz w:val="11"/>
                 <w:szCs w:val="11"/>
               </w:rPr>
-              <w:t>Tabular GBDT</w:t>
+              <w:t>‎Tabular GBDT‎</w:t>
             </w:r>
             <w:r>
               <w:rPr>
@@ -6753,7 +6069,7 @@
                 <w:sz w:val="11"/>
                 <w:szCs w:val="11"/>
               </w:rPr>
-              <w:t>RFM</w:t>
+              <w:t>‎RFM‎</w:t>
             </w:r>
             <w:r>
               <w:rPr>
@@ -6910,7 +6226,7 @@
                 <w:sz w:val="11"/>
                 <w:szCs w:val="11"/>
               </w:rPr>
-              <w:t>NB-GLM</w:t>
+              <w:t>‎NB-GLM‎</w:t>
             </w:r>
             <w:r>
               <w:rPr>
@@ -7072,7 +6388,7 @@
           <w:sz w:val="17"/>
           <w:szCs w:val="17"/>
         </w:rPr>
-        <w:t>HAMTA</w:t>
+        <w:t>‎HAMTA‎</w:t>
       </w:r>
       <w:r>
         <w:rPr>
@@ -7090,7 +6406,7 @@
           <w:sz w:val="17"/>
           <w:szCs w:val="17"/>
         </w:rPr>
-        <w:t>MAE</w:t>
+        <w:t>‎MAE‎</w:t>
       </w:r>
       <w:r>
         <w:rPr>
@@ -7108,7 +6424,7 @@
           <w:sz w:val="17"/>
           <w:szCs w:val="17"/>
         </w:rPr>
-        <w:t>HAMTA</w:t>
+        <w:t>‎HAMTA‎</w:t>
       </w:r>
       <w:r>
         <w:rPr>
@@ -7126,7 +6442,7 @@
           <w:sz w:val="17"/>
           <w:szCs w:val="17"/>
         </w:rPr>
-        <w:t>HAMTA</w:t>
+        <w:t>‎HAMTA‎</w:t>
       </w:r>
       <w:r>
         <w:rPr>
@@ -7150,7 +6466,7 @@
           <w:sz w:val="18"/>
           <w:szCs w:val="18"/>
         </w:rPr>
-        <w:t>5.2</w:t>
+        <w:t>‎5.2‎</w:t>
       </w:r>
       <w:r>
         <w:rPr>
@@ -7183,7 +6499,7 @@
           <w:sz w:val="17"/>
           <w:szCs w:val="17"/>
         </w:rPr>
-        <w:t>2</w:t>
+        <w:t>‎2‎</w:t>
       </w:r>
       <w:r>
         <w:rPr>
@@ -7217,7 +6533,7 @@
           <w:sz w:val="17"/>
           <w:szCs w:val="17"/>
         </w:rPr>
-        <w:t>2</w:t>
+        <w:t>‎2‎</w:t>
       </w:r>
       <w:r>
         <w:rPr>
@@ -7235,7 +6551,7 @@
           <w:sz w:val="17"/>
           <w:szCs w:val="17"/>
         </w:rPr>
-        <w:t>Top-35</w:t>
+        <w:t>‎Top-35‎</w:t>
       </w:r>
       <w:r>
         <w:rPr>
@@ -7331,7 +6647,7 @@
                 <w:sz w:val="11"/>
                 <w:szCs w:val="11"/>
               </w:rPr>
-              <w:t>P@35</w:t>
+              <w:t>‎P@35‎</w:t>
             </w:r>
           </w:p>
         </w:tc>
@@ -7363,7 +6679,7 @@
                 <w:sz w:val="11"/>
                 <w:szCs w:val="11"/>
               </w:rPr>
-              <w:t>R@35</w:t>
+              <w:t>‎R@35‎</w:t>
             </w:r>
           </w:p>
         </w:tc>
@@ -7395,7 +6711,7 @@
                 <w:sz w:val="11"/>
                 <w:szCs w:val="11"/>
               </w:rPr>
-              <w:t>R-Prec</w:t>
+              <w:t>‎R-Prec‎</w:t>
             </w:r>
           </w:p>
         </w:tc>
@@ -7427,7 +6743,7 @@
                 <w:sz w:val="11"/>
                 <w:szCs w:val="11"/>
               </w:rPr>
-              <w:t>NDCG@35</w:t>
+              <w:t>‎NDCG@35‎</w:t>
             </w:r>
           </w:p>
         </w:tc>
@@ -7459,7 +6775,7 @@
                 <w:sz w:val="11"/>
                 <w:szCs w:val="11"/>
               </w:rPr>
-              <w:t>MAP@35</w:t>
+              <w:t>‎MAP@35‎</w:t>
             </w:r>
           </w:p>
         </w:tc>
@@ -7847,7 +7163,7 @@
                 <w:sz w:val="10"/>
                 <w:szCs w:val="10"/>
               </w:rPr>
-              <w:t>GBDT</w:t>
+              <w:t>‎GBDT‎</w:t>
             </w:r>
           </w:p>
         </w:tc>
@@ -8029,7 +7345,7 @@
                 <w:sz w:val="10"/>
                 <w:szCs w:val="10"/>
               </w:rPr>
-              <w:t>kNN</w:t>
+              <w:t>‎kNN‎</w:t>
             </w:r>
           </w:p>
         </w:tc>
@@ -8430,7 +7746,7 @@
           <w:sz w:val="17"/>
           <w:szCs w:val="17"/>
         </w:rPr>
-        <w:t>4</w:t>
+        <w:t>‎4‎</w:t>
       </w:r>
       <w:r>
         <w:rPr>
@@ -8463,7 +7779,7 @@
           <w:sz w:val="17"/>
           <w:szCs w:val="17"/>
         </w:rPr>
-        <w:t>2</w:t>
+        <w:t>‎2‎</w:t>
       </w:r>
       <w:r>
         <w:rPr>
@@ -8481,7 +7797,7 @@
           <w:sz w:val="17"/>
           <w:szCs w:val="17"/>
         </w:rPr>
-        <w:t>HAMTA</w:t>
+        <w:t>‎HAMTA‎</w:t>
       </w:r>
       <w:r>
         <w:rPr>
@@ -8499,7 +7815,7 @@
           <w:sz w:val="17"/>
           <w:szCs w:val="17"/>
         </w:rPr>
-        <w:t>Precision@35</w:t>
+        <w:t>‎Precision@35‎</w:t>
       </w:r>
       <w:r>
         <w:rPr>
@@ -8517,7 +7833,7 @@
           <w:sz w:val="17"/>
           <w:szCs w:val="17"/>
         </w:rPr>
-        <w:t>NDCG@35</w:t>
+        <w:t>‎NDCG@35‎</w:t>
       </w:r>
       <w:r>
         <w:rPr>
@@ -8535,7 +7851,7 @@
           <w:sz w:val="17"/>
           <w:szCs w:val="17"/>
         </w:rPr>
-        <w:t>R-Precision</w:t>
+        <w:t>‎R-Precision‎</w:t>
       </w:r>
       <w:r>
         <w:rPr>
@@ -8559,7 +7875,7 @@
           <w:sz w:val="18"/>
           <w:szCs w:val="18"/>
         </w:rPr>
-        <w:t>5.3</w:t>
+        <w:t>‎5.3‎</w:t>
       </w:r>
       <w:r>
         <w:rPr>
@@ -8592,7 +7908,7 @@
           <w:sz w:val="17"/>
           <w:szCs w:val="17"/>
         </w:rPr>
-        <w:t>3</w:t>
+        <w:t>‎3‎</w:t>
       </w:r>
       <w:r>
         <w:rPr>
@@ -8610,16 +7926,16 @@
           <w:sz w:val="17"/>
           <w:szCs w:val="17"/>
         </w:rPr>
-        <w:t>K</w:t>
-      </w:r>
-      <w:r>
-        <w:rPr>
-          <w:rFonts w:hint="cs" w:ascii="B Mitra" w:hAnsi="B Mitra" w:cs="B Mitra"/>
-          <w:sz w:val="18"/>
-          <w:rtl/>
-          <w:szCs w:val="18"/>
-        </w:rPr>
-        <w:t xml:space="preserve"> ∈ {۱۰, ۲۰, ۳۵, ۵۰} گزارش می‌نماید.</w:t>
+        <w:t>‎K ∈‎</w:t>
+      </w:r>
+      <w:r>
+        <w:rPr>
+          <w:rFonts w:hint="cs" w:ascii="B Mitra" w:hAnsi="B Mitra" w:cs="B Mitra"/>
+          <w:sz w:val="18"/>
+          <w:rtl/>
+          <w:szCs w:val="18"/>
+        </w:rPr>
+        <w:t xml:space="preserve"> {۱۰, ۲۰, ۳۵, ۵۰} گزارش می‌نماید.</w:t>
       </w:r>
     </w:p>
     <w:p>
@@ -8644,7 +7960,7 @@
           <w:sz w:val="17"/>
           <w:szCs w:val="17"/>
         </w:rPr>
-        <w:t>3</w:t>
+        <w:t>‎3‎</w:t>
       </w:r>
       <w:r>
         <w:rPr>
@@ -8771,7 +8087,7 @@
                 <w:sz w:val="11"/>
                 <w:szCs w:val="11"/>
               </w:rPr>
-              <w:t>Prec@K</w:t>
+              <w:t>‎Prec@K‎</w:t>
             </w:r>
           </w:p>
         </w:tc>
@@ -8803,7 +8119,7 @@
                 <w:sz w:val="11"/>
                 <w:szCs w:val="11"/>
               </w:rPr>
-              <w:t>Recall@K</w:t>
+              <w:t>‎Recall@K‎</w:t>
             </w:r>
           </w:p>
         </w:tc>
@@ -8835,7 +8151,7 @@
                 <w:sz w:val="11"/>
                 <w:szCs w:val="11"/>
               </w:rPr>
-              <w:t>NDCG@K</w:t>
+              <w:t>‎NDCG@K‎</w:t>
             </w:r>
           </w:p>
         </w:tc>
@@ -9050,7 +8366,7 @@
                 <w:sz w:val="10"/>
                 <w:szCs w:val="10"/>
               </w:rPr>
-              <w:t>GBDT</w:t>
+              <w:t>‎GBDT‎</w:t>
             </w:r>
           </w:p>
         </w:tc>
@@ -9349,7 +8665,7 @@
                 <w:sz w:val="10"/>
                 <w:szCs w:val="10"/>
               </w:rPr>
-              <w:t>SFA</w:t>
+              <w:t>‎SFA‎</w:t>
             </w:r>
           </w:p>
         </w:tc>
@@ -9503,7 +8819,7 @@
                 <w:sz w:val="10"/>
                 <w:szCs w:val="10"/>
               </w:rPr>
-              <w:t>HAMTA</w:t>
+              <w:t>‎HAMTA‎</w:t>
             </w:r>
           </w:p>
         </w:tc>
@@ -9802,7 +9118,7 @@
                 <w:sz w:val="10"/>
                 <w:szCs w:val="10"/>
               </w:rPr>
-              <w:t>GBDT</w:t>
+              <w:t>‎GBDT‎</w:t>
             </w:r>
           </w:p>
         </w:tc>
@@ -10101,7 +9417,7 @@
                 <w:sz w:val="10"/>
                 <w:szCs w:val="10"/>
               </w:rPr>
-              <w:t>SFA</w:t>
+              <w:t>‎SFA‎</w:t>
             </w:r>
           </w:p>
         </w:tc>
@@ -10255,7 +9571,7 @@
                 <w:sz w:val="10"/>
                 <w:szCs w:val="10"/>
               </w:rPr>
-              <w:t>HAMTA</w:t>
+              <w:t>‎HAMTA‎</w:t>
             </w:r>
           </w:p>
         </w:tc>
@@ -10554,7 +9870,7 @@
                 <w:sz w:val="10"/>
                 <w:szCs w:val="10"/>
               </w:rPr>
-              <w:t>GBDT</w:t>
+              <w:t>‎GBDT‎</w:t>
             </w:r>
           </w:p>
         </w:tc>
@@ -10853,7 +10169,7 @@
                 <w:sz w:val="10"/>
                 <w:szCs w:val="10"/>
               </w:rPr>
-              <w:t>SFA</w:t>
+              <w:t>‎SFA‎</w:t>
             </w:r>
           </w:p>
         </w:tc>
@@ -11007,7 +10323,7 @@
                 <w:sz w:val="10"/>
                 <w:szCs w:val="10"/>
               </w:rPr>
-              <w:t>HAMTA</w:t>
+              <w:t>‎HAMTA‎</w:t>
             </w:r>
           </w:p>
         </w:tc>
@@ -11306,7 +10622,7 @@
                 <w:sz w:val="10"/>
                 <w:szCs w:val="10"/>
               </w:rPr>
-              <w:t>GBDT</w:t>
+              <w:t>‎GBDT‎</w:t>
             </w:r>
           </w:p>
         </w:tc>
@@ -11605,7 +10921,7 @@
                 <w:sz w:val="10"/>
                 <w:szCs w:val="10"/>
               </w:rPr>
-              <w:t>SFA</w:t>
+              <w:t>‎SFA‎</w:t>
             </w:r>
           </w:p>
         </w:tc>
@@ -11759,7 +11075,7 @@
                 <w:sz w:val="10"/>
                 <w:szCs w:val="10"/>
               </w:rPr>
-              <w:t>HAMTA</w:t>
+              <w:t>‎HAMTA‎</w:t>
             </w:r>
           </w:p>
         </w:tc>
@@ -11861,16 +11177,16 @@
           <w:rtl/>
           <w:szCs w:val="18"/>
         </w:rPr>
-        <w:t xml:space="preserve">تحلیل بودجه‌های چندگانه و معناداری آماری: در سقف بسیار محدود ۱۰ = </w:t>
-      </w:r>
-      <w:r>
-        <w:rPr>
-          <w:rFonts w:ascii="Times New Roman" w:hAnsi="Times New Roman" w:cs="Times New Roman"/>
-          <w:bidi w:val="0"/>
-          <w:sz w:val="17"/>
-          <w:szCs w:val="17"/>
-        </w:rPr>
-        <w:t>K</w:t>
+        <w:t xml:space="preserve">تحلیل بودجه‌های چندگانه و معناداری آماری: در سقف بسیار محدود </w:t>
+      </w:r>
+      <w:r>
+        <w:rPr>
+          <w:rFonts w:ascii="Times New Roman" w:hAnsi="Times New Roman" w:cs="Times New Roman"/>
+          <w:bidi w:val="0"/>
+          <w:sz w:val="17"/>
+          <w:szCs w:val="17"/>
+        </w:rPr>
+        <w:t>‎K = 10‎</w:t>
       </w:r>
       <w:r>
         <w:rPr>
@@ -11888,7 +11204,7 @@
           <w:sz w:val="17"/>
           <w:szCs w:val="17"/>
         </w:rPr>
-        <w:t>SFA</w:t>
+        <w:t>‎SFA‎</w:t>
       </w:r>
       <w:r>
         <w:rPr>
@@ -11906,7 +11222,7 @@
           <w:sz w:val="17"/>
           <w:szCs w:val="17"/>
         </w:rPr>
-        <w:t>HAMTA</w:t>
+        <w:t>‎HAMTA‎</w:t>
       </w:r>
       <w:r>
         <w:rPr>
@@ -11924,25 +11240,25 @@
           <w:sz w:val="17"/>
           <w:szCs w:val="17"/>
         </w:rPr>
-        <w:t>HAMTA</w:t>
-      </w:r>
-      <w:r>
-        <w:rPr>
-          <w:rFonts w:hint="cs" w:ascii="B Mitra" w:hAnsi="B Mitra" w:cs="B Mitra"/>
-          <w:sz w:val="18"/>
-          <w:rtl/>
-          <w:szCs w:val="18"/>
-        </w:rPr>
-        <w:t xml:space="preserve"> رقابت‌پذیری بیشتری نشان داده و از بودجه ۲۰ = </w:t>
-      </w:r>
-      <w:r>
-        <w:rPr>
-          <w:rFonts w:ascii="Times New Roman" w:hAnsi="Times New Roman" w:cs="Times New Roman"/>
-          <w:bidi w:val="0"/>
-          <w:sz w:val="17"/>
-          <w:szCs w:val="17"/>
-        </w:rPr>
-        <w:t>K</w:t>
+        <w:t>‎HAMTA‎</w:t>
+      </w:r>
+      <w:r>
+        <w:rPr>
+          <w:rFonts w:hint="cs" w:ascii="B Mitra" w:hAnsi="B Mitra" w:cs="B Mitra"/>
+          <w:sz w:val="18"/>
+          <w:rtl/>
+          <w:szCs w:val="18"/>
+        </w:rPr>
+        <w:t xml:space="preserve"> رقابت‌پذیری بیشتری نشان داده و از بودجه </w:t>
+      </w:r>
+      <w:r>
+        <w:rPr>
+          <w:rFonts w:ascii="Times New Roman" w:hAnsi="Times New Roman" w:cs="Times New Roman"/>
+          <w:bidi w:val="0"/>
+          <w:sz w:val="17"/>
+          <w:szCs w:val="17"/>
+        </w:rPr>
+        <w:t>‎K = 20‎</w:t>
       </w:r>
       <w:r>
         <w:rPr>
@@ -11960,61 +11276,61 @@
           <w:sz w:val="17"/>
           <w:szCs w:val="17"/>
         </w:rPr>
-        <w:t>SFA</w:t>
-      </w:r>
-      <w:r>
-        <w:rPr>
-          <w:rFonts w:hint="cs" w:ascii="B Mitra" w:hAnsi="B Mitra" w:cs="B Mitra"/>
-          <w:sz w:val="18"/>
-          <w:rtl/>
-          <w:szCs w:val="18"/>
-        </w:rPr>
-        <w:t xml:space="preserve"> غلبه می‌کند: در بودجه ۲۰ = </w:t>
-      </w:r>
-      <w:r>
-        <w:rPr>
-          <w:rFonts w:ascii="Times New Roman" w:hAnsi="Times New Roman" w:cs="Times New Roman"/>
-          <w:bidi w:val="0"/>
-          <w:sz w:val="17"/>
-          <w:szCs w:val="17"/>
-        </w:rPr>
-        <w:t>K</w:t>
-      </w:r>
-      <w:r>
-        <w:rPr>
-          <w:rFonts w:hint="cs" w:ascii="B Mitra" w:hAnsi="B Mitra" w:cs="B Mitra"/>
-          <w:sz w:val="18"/>
-          <w:rtl/>
-          <w:szCs w:val="18"/>
-        </w:rPr>
-        <w:t xml:space="preserve"> دقت ۰٫۴۱۰ در برابر ۰٫۳۴۵؛ در ۳۵ = </w:t>
-      </w:r>
-      <w:r>
-        <w:rPr>
-          <w:rFonts w:ascii="Times New Roman" w:hAnsi="Times New Roman" w:cs="Times New Roman"/>
-          <w:bidi w:val="0"/>
-          <w:sz w:val="17"/>
-          <w:szCs w:val="17"/>
-        </w:rPr>
-        <w:t>K</w:t>
-      </w:r>
-      <w:r>
-        <w:rPr>
-          <w:rFonts w:hint="cs" w:ascii="B Mitra" w:hAnsi="B Mitra" w:cs="B Mitra"/>
-          <w:sz w:val="18"/>
-          <w:rtl/>
-          <w:szCs w:val="18"/>
-        </w:rPr>
-        <w:t xml:space="preserve"> دقت ۰٫۳۶۶ در برابر ۰٫۲۸۰؛ و در ۵۰ = </w:t>
-      </w:r>
-      <w:r>
-        <w:rPr>
-          <w:rFonts w:ascii="Times New Roman" w:hAnsi="Times New Roman" w:cs="Times New Roman"/>
-          <w:bidi w:val="0"/>
-          <w:sz w:val="17"/>
-          <w:szCs w:val="17"/>
-        </w:rPr>
-        <w:t>K</w:t>
+        <w:t>‎SFA‎</w:t>
+      </w:r>
+      <w:r>
+        <w:rPr>
+          <w:rFonts w:hint="cs" w:ascii="B Mitra" w:hAnsi="B Mitra" w:cs="B Mitra"/>
+          <w:sz w:val="18"/>
+          <w:rtl/>
+          <w:szCs w:val="18"/>
+        </w:rPr>
+        <w:t xml:space="preserve"> غلبه می‌کند: در بودجه </w:t>
+      </w:r>
+      <w:r>
+        <w:rPr>
+          <w:rFonts w:ascii="Times New Roman" w:hAnsi="Times New Roman" w:cs="Times New Roman"/>
+          <w:bidi w:val="0"/>
+          <w:sz w:val="17"/>
+          <w:szCs w:val="17"/>
+        </w:rPr>
+        <w:t>‎K = 20‎</w:t>
+      </w:r>
+      <w:r>
+        <w:rPr>
+          <w:rFonts w:hint="cs" w:ascii="B Mitra" w:hAnsi="B Mitra" w:cs="B Mitra"/>
+          <w:sz w:val="18"/>
+          <w:rtl/>
+          <w:szCs w:val="18"/>
+        </w:rPr>
+        <w:t xml:space="preserve"> دقت ۰٫۴۱۰ در برابر ۰٫۳۴۵؛ در </w:t>
+      </w:r>
+      <w:r>
+        <w:rPr>
+          <w:rFonts w:ascii="Times New Roman" w:hAnsi="Times New Roman" w:cs="Times New Roman"/>
+          <w:bidi w:val="0"/>
+          <w:sz w:val="17"/>
+          <w:szCs w:val="17"/>
+        </w:rPr>
+        <w:t>‎K = 35‎</w:t>
+      </w:r>
+      <w:r>
+        <w:rPr>
+          <w:rFonts w:hint="cs" w:ascii="B Mitra" w:hAnsi="B Mitra" w:cs="B Mitra"/>
+          <w:sz w:val="18"/>
+          <w:rtl/>
+          <w:szCs w:val="18"/>
+        </w:rPr>
+        <w:t xml:space="preserve"> دقت ۰٫۳۶۶ در برابر ۰٫۲۸۰؛ و در </w:t>
+      </w:r>
+      <w:r>
+        <w:rPr>
+          <w:rFonts w:ascii="Times New Roman" w:hAnsi="Times New Roman" w:cs="Times New Roman"/>
+          <w:bidi w:val="0"/>
+          <w:sz w:val="17"/>
+          <w:szCs w:val="17"/>
+        </w:rPr>
+        <w:t>‎K = 50‎</w:t>
       </w:r>
       <w:r>
         <w:rPr>
@@ -12032,7 +11348,7 @@
           <w:sz w:val="17"/>
           <w:szCs w:val="17"/>
         </w:rPr>
-        <w:t>HAMTA</w:t>
+        <w:t>‎HAMTA‎</w:t>
       </w:r>
       <w:r>
         <w:rPr>
@@ -12050,25 +11366,25 @@
           <w:sz w:val="17"/>
           <w:szCs w:val="17"/>
         </w:rPr>
-        <w:t>p_adj</w:t>
-      </w:r>
-      <w:r>
-        <w:rPr>
-          <w:rFonts w:hint="cs" w:ascii="B Mitra" w:hAnsi="B Mitra" w:cs="B Mitra"/>
-          <w:sz w:val="18"/>
-          <w:rtl/>
-          <w:szCs w:val="18"/>
-        </w:rPr>
-        <w:t xml:space="preserve"> &lt; ۰٫۰۵): در بودجه ۱۰ = </w:t>
-      </w:r>
-      <w:r>
-        <w:rPr>
-          <w:rFonts w:ascii="Times New Roman" w:hAnsi="Times New Roman" w:cs="Times New Roman"/>
-          <w:bidi w:val="0"/>
-          <w:sz w:val="17"/>
-          <w:szCs w:val="17"/>
-        </w:rPr>
-        <w:t>K</w:t>
+        <w:t>‎p_adj &lt; 0.05‎</w:t>
+      </w:r>
+      <w:r>
+        <w:rPr>
+          <w:rFonts w:hint="cs" w:ascii="B Mitra" w:hAnsi="B Mitra" w:cs="B Mitra"/>
+          <w:sz w:val="18"/>
+          <w:rtl/>
+          <w:szCs w:val="18"/>
+        </w:rPr>
+        <w:t xml:space="preserve">): در بودجه </w:t>
+      </w:r>
+      <w:r>
+        <w:rPr>
+          <w:rFonts w:ascii="Times New Roman" w:hAnsi="Times New Roman" w:cs="Times New Roman"/>
+          <w:bidi w:val="0"/>
+          <w:sz w:val="17"/>
+          <w:szCs w:val="17"/>
+        </w:rPr>
+        <w:t>‎K = 10‎</w:t>
       </w:r>
       <w:r>
         <w:rPr>
@@ -12086,43 +11402,43 @@
           <w:sz w:val="17"/>
           <w:szCs w:val="17"/>
         </w:rPr>
-        <w:t>p</w:t>
-      </w:r>
-      <w:r>
-        <w:rPr>
-          <w:rFonts w:hint="cs" w:ascii="B Mitra" w:hAnsi="B Mitra" w:cs="B Mitra"/>
-          <w:sz w:val="18"/>
-          <w:rtl/>
-          <w:szCs w:val="18"/>
-        </w:rPr>
-        <w:t xml:space="preserve"> = ۰٫۰۱۵) و مدل جدولی (</w:t>
-      </w:r>
-      <w:r>
-        <w:rPr>
-          <w:rFonts w:ascii="Times New Roman" w:hAnsi="Times New Roman" w:cs="Times New Roman"/>
-          <w:bidi w:val="0"/>
-          <w:sz w:val="17"/>
-          <w:szCs w:val="17"/>
-        </w:rPr>
-        <w:t>p</w:t>
-      </w:r>
-      <w:r>
-        <w:rPr>
-          <w:rFonts w:hint="cs" w:ascii="B Mitra" w:hAnsi="B Mitra" w:cs="B Mitra"/>
-          <w:sz w:val="18"/>
-          <w:rtl/>
-          <w:szCs w:val="18"/>
-        </w:rPr>
-        <w:t xml:space="preserve"> = ۰٫۰۳۹)؛ در بودجه ۲۰ = </w:t>
-      </w:r>
-      <w:r>
-        <w:rPr>
-          <w:rFonts w:ascii="Times New Roman" w:hAnsi="Times New Roman" w:cs="Times New Roman"/>
-          <w:bidi w:val="0"/>
-          <w:sz w:val="17"/>
-          <w:szCs w:val="17"/>
-        </w:rPr>
-        <w:t>K</w:t>
+        <w:t>‎p = 0.015‎</w:t>
+      </w:r>
+      <w:r>
+        <w:rPr>
+          <w:rFonts w:hint="cs" w:ascii="B Mitra" w:hAnsi="B Mitra" w:cs="B Mitra"/>
+          <w:sz w:val="18"/>
+          <w:rtl/>
+          <w:szCs w:val="18"/>
+        </w:rPr>
+        <w:t>) و مدل جدولی (</w:t>
+      </w:r>
+      <w:r>
+        <w:rPr>
+          <w:rFonts w:ascii="Times New Roman" w:hAnsi="Times New Roman" w:cs="Times New Roman"/>
+          <w:bidi w:val="0"/>
+          <w:sz w:val="17"/>
+          <w:szCs w:val="17"/>
+        </w:rPr>
+        <w:t>‎p = 0.039‎</w:t>
+      </w:r>
+      <w:r>
+        <w:rPr>
+          <w:rFonts w:hint="cs" w:ascii="B Mitra" w:hAnsi="B Mitra" w:cs="B Mitra"/>
+          <w:sz w:val="18"/>
+          <w:rtl/>
+          <w:szCs w:val="18"/>
+        </w:rPr>
+        <w:t xml:space="preserve">)؛ در بودجه </w:t>
+      </w:r>
+      <w:r>
+        <w:rPr>
+          <w:rFonts w:ascii="Times New Roman" w:hAnsi="Times New Roman" w:cs="Times New Roman"/>
+          <w:bidi w:val="0"/>
+          <w:sz w:val="17"/>
+          <w:szCs w:val="17"/>
+        </w:rPr>
+        <w:t>‎K = 20‎</w:t>
       </w:r>
       <w:r>
         <w:rPr>
@@ -12140,43 +11456,43 @@
           <w:sz w:val="17"/>
           <w:szCs w:val="17"/>
         </w:rPr>
-        <w:t>p</w:t>
-      </w:r>
-      <w:r>
-        <w:rPr>
-          <w:rFonts w:hint="cs" w:ascii="B Mitra" w:hAnsi="B Mitra" w:cs="B Mitra"/>
-          <w:sz w:val="18"/>
-          <w:rtl/>
-          <w:szCs w:val="18"/>
-        </w:rPr>
-        <w:t xml:space="preserve"> = ۰٫۰۰۵) و مدل جدولی (</w:t>
-      </w:r>
-      <w:r>
-        <w:rPr>
-          <w:rFonts w:ascii="Times New Roman" w:hAnsi="Times New Roman" w:cs="Times New Roman"/>
-          <w:bidi w:val="0"/>
-          <w:sz w:val="17"/>
-          <w:szCs w:val="17"/>
-        </w:rPr>
-        <w:t>p</w:t>
-      </w:r>
-      <w:r>
-        <w:rPr>
-          <w:rFonts w:hint="cs" w:ascii="B Mitra" w:hAnsi="B Mitra" w:cs="B Mitra"/>
-          <w:sz w:val="18"/>
-          <w:rtl/>
-          <w:szCs w:val="18"/>
-        </w:rPr>
-        <w:t xml:space="preserve"> = ۰٫۰۰۵)؛ و در ۳۵ = </w:t>
-      </w:r>
-      <w:r>
-        <w:rPr>
-          <w:rFonts w:ascii="Times New Roman" w:hAnsi="Times New Roman" w:cs="Times New Roman"/>
-          <w:bidi w:val="0"/>
-          <w:sz w:val="17"/>
-          <w:szCs w:val="17"/>
-        </w:rPr>
-        <w:t>K</w:t>
+        <w:t>‎p = 0.005‎</w:t>
+      </w:r>
+      <w:r>
+        <w:rPr>
+          <w:rFonts w:hint="cs" w:ascii="B Mitra" w:hAnsi="B Mitra" w:cs="B Mitra"/>
+          <w:sz w:val="18"/>
+          <w:rtl/>
+          <w:szCs w:val="18"/>
+        </w:rPr>
+        <w:t>) و مدل جدولی (</w:t>
+      </w:r>
+      <w:r>
+        <w:rPr>
+          <w:rFonts w:ascii="Times New Roman" w:hAnsi="Times New Roman" w:cs="Times New Roman"/>
+          <w:bidi w:val="0"/>
+          <w:sz w:val="17"/>
+          <w:szCs w:val="17"/>
+        </w:rPr>
+        <w:t>‎p = 0.005‎</w:t>
+      </w:r>
+      <w:r>
+        <w:rPr>
+          <w:rFonts w:hint="cs" w:ascii="B Mitra" w:hAnsi="B Mitra" w:cs="B Mitra"/>
+          <w:sz w:val="18"/>
+          <w:rtl/>
+          <w:szCs w:val="18"/>
+        </w:rPr>
+        <w:t xml:space="preserve">)؛ و در </w:t>
+      </w:r>
+      <w:r>
+        <w:rPr>
+          <w:rFonts w:ascii="Times New Roman" w:hAnsi="Times New Roman" w:cs="Times New Roman"/>
+          <w:bidi w:val="0"/>
+          <w:sz w:val="17"/>
+          <w:szCs w:val="17"/>
+        </w:rPr>
+        <w:t>‎K = 35‎</w:t>
       </w:r>
       <w:r>
         <w:rPr>
@@ -12194,16 +11510,16 @@
           <w:sz w:val="17"/>
           <w:szCs w:val="17"/>
         </w:rPr>
-        <w:t>p</w:t>
-      </w:r>
-      <w:r>
-        <w:rPr>
-          <w:rFonts w:hint="cs" w:ascii="B Mitra" w:hAnsi="B Mitra" w:cs="B Mitra"/>
-          <w:sz w:val="18"/>
-          <w:rtl/>
-          <w:szCs w:val="18"/>
-        </w:rPr>
-        <w:t xml:space="preserve"> = ۰٫۰۴۸۸).</w:t>
+        <w:t>‎p = 0.0488‎</w:t>
+      </w:r>
+      <w:r>
+        <w:rPr>
+          <w:rFonts w:hint="cs" w:ascii="B Mitra" w:hAnsi="B Mitra" w:cs="B Mitra"/>
+          <w:sz w:val="18"/>
+          <w:rtl/>
+          <w:szCs w:val="18"/>
+        </w:rPr>
+        <w:t>).</w:t>
       </w:r>
     </w:p>
     <w:p>
@@ -12218,7 +11534,7 @@
           <w:sz w:val="18"/>
           <w:szCs w:val="18"/>
         </w:rPr>
-        <w:t>5.4</w:t>
+        <w:t>‎5.4‎</w:t>
       </w:r>
       <w:r>
         <w:rPr>
@@ -12251,7 +11567,7 @@
           <w:sz w:val="17"/>
           <w:szCs w:val="17"/>
         </w:rPr>
-        <w:t>4</w:t>
+        <w:t>‎4‎</w:t>
       </w:r>
       <w:r>
         <w:rPr>
@@ -12285,7 +11601,7 @@
           <w:sz w:val="17"/>
           <w:szCs w:val="17"/>
         </w:rPr>
-        <w:t>4</w:t>
+        <w:t>‎4‎</w:t>
       </w:r>
       <w:r>
         <w:rPr>
@@ -12413,7 +11729,7 @@
                 <w:sz w:val="11"/>
                 <w:szCs w:val="11"/>
               </w:rPr>
-              <w:t>Prec@35</w:t>
+              <w:t>‎Prec@35‎</w:t>
             </w:r>
           </w:p>
         </w:tc>
@@ -12445,7 +11761,7 @@
                 <w:sz w:val="11"/>
                 <w:szCs w:val="11"/>
               </w:rPr>
-              <w:t>NDCG@35</w:t>
+              <w:t>‎NDCG@35‎</w:t>
             </w:r>
           </w:p>
         </w:tc>
@@ -12477,18 +11793,7 @@
                 <w:sz w:val="11"/>
                 <w:szCs w:val="11"/>
               </w:rPr>
-              <w:t>Weak-Support</w:t>
-            </w:r>
-            <w:r>
-              <w:rPr>
-                <w:rFonts w:hint="cs" w:ascii="B Mitra" w:hAnsi="B Mitra" w:cs="B Mitra"/>
-                <w:bCs/>
-                <w:b/>
-                <w:sz w:val="11"/>
-                <w:rtl/>
-                <w:szCs w:val="11"/>
-              </w:rPr>
-              <w:t xml:space="preserve"> %</w:t>
+              <w:t>‎Weak-Support %‎</w:t>
             </w:r>
           </w:p>
         </w:tc>
@@ -13257,16 +12562,16 @@
           <w:sz w:val="17"/>
           <w:szCs w:val="17"/>
         </w:rPr>
-        <w:t>TP</w:t>
-      </w:r>
-      <w:r>
-        <w:rPr>
-          <w:rFonts w:hint="cs" w:ascii="B Mitra" w:hAnsi="B Mitra" w:cs="B Mitra"/>
-          <w:sz w:val="18"/>
-          <w:rtl/>
-          <w:szCs w:val="18"/>
-        </w:rPr>
-        <w:t xml:space="preserve"> = ۰)؛ نرخ انتخاب ۰٫۱۰۰ گزارش‌شده مستقیماً ناشی از سهم بودجه انتخاب ثابت ۳۵ پذیرنده برتر از کل ۳۵۰ پذیرنده (۳۵/۳۵۰ = ۰٫۱۰۰) است و نباید به عنوان تضمین اختصاصی کنترل خطای مثبت کاذب مدل تفسیر گردد. در عوض، پوشش تجربی بازه پیش‌بینی (۸۶٫۲ ± ۳٫۱٪ با عرض بازه میانگین ۴٫۶ ± ۰٫۳ تراکنش) به عنوان شاخص مستقل تایید می‌نماید که کران‌های واسنجی‌شده به خوبی نوسانات طبیعی را در بر گرفته و مانع از تولید شکاف‌های فرصت غیرواقعی می‌گردند.</w:t>
+        <w:t>‎TP = 0‎</w:t>
+      </w:r>
+      <w:r>
+        <w:rPr>
+          <w:rFonts w:hint="cs" w:ascii="B Mitra" w:hAnsi="B Mitra" w:cs="B Mitra"/>
+          <w:sz w:val="18"/>
+          <w:rtl/>
+          <w:szCs w:val="18"/>
+        </w:rPr>
+        <w:t>)؛ نرخ انتخاب ۰٫۱۰۰ گزارش‌شده مستقیماً ناشی از سهم بودجه انتخاب ثابت ۳۵ پذیرنده برتر از کل ۳۵۰ پذیرنده (۳۵/۳۵۰ = ۰٫۱۰۰) است و نباید به عنوان تضمین اختصاصی کنترل خطای مثبت کاذب مدل تفسیر گردد. در عوض، پوشش تجربی بازه پیش‌بینی (۸۶٫۲ ± ۳٫۱٪ با عرض بازه میانگین ۴٫۶ ± ۰٫۳ تراکنش) به عنوان شاخص مستقل تایید می‌نماید که کران‌های واسنجی‌شده به خوبی نوسانات طبیعی را در بر گرفته و مانع از تولید شکاف‌های فرصت غیرواقعی می‌گردند.</w:t>
       </w:r>
     </w:p>
     <w:p>
@@ -13281,7 +12586,7 @@
           <w:sz w:val="18"/>
           <w:szCs w:val="18"/>
         </w:rPr>
-        <w:t>5.5</w:t>
+        <w:t>‎5.5‎</w:t>
       </w:r>
       <w:r>
         <w:rPr>
@@ -13299,7 +12604,7 @@
           <w:sz w:val="18"/>
           <w:szCs w:val="18"/>
         </w:rPr>
-        <w:t>Ablation Study</w:t>
+        <w:t>‎Ablation Study‎</w:t>
       </w:r>
       <w:r>
         <w:rPr>
@@ -13332,7 +12637,7 @@
           <w:sz w:val="17"/>
           <w:szCs w:val="17"/>
         </w:rPr>
-        <w:t>5</w:t>
+        <w:t>‎5‎</w:t>
       </w:r>
       <w:r>
         <w:rPr>
@@ -13366,7 +12671,7 @@
           <w:sz w:val="17"/>
           <w:szCs w:val="17"/>
         </w:rPr>
-        <w:t>5</w:t>
+        <w:t>‎5‎</w:t>
       </w:r>
       <w:r>
         <w:rPr>
@@ -13461,7 +12766,7 @@
                 <w:sz w:val="11"/>
                 <w:szCs w:val="11"/>
               </w:rPr>
-              <w:t>NDCG@35</w:t>
+              <w:t>‎NDCG@35‎</w:t>
             </w:r>
           </w:p>
         </w:tc>
@@ -13493,7 +12798,7 @@
                 <w:sz w:val="11"/>
                 <w:szCs w:val="11"/>
               </w:rPr>
-              <w:t>Prec@35</w:t>
+              <w:t>‎Prec@35‎</w:t>
             </w:r>
           </w:p>
         </w:tc>
@@ -13525,7 +12830,7 @@
                 <w:sz w:val="11"/>
                 <w:szCs w:val="11"/>
               </w:rPr>
-              <w:t>Δ NDCG</w:t>
+              <w:t>‎Δ NDCG‎</w:t>
             </w:r>
           </w:p>
         </w:tc>
@@ -13604,7 +12909,7 @@
                 <w:sz w:val="10"/>
                 <w:szCs w:val="10"/>
               </w:rPr>
-              <w:t>HAMTA</w:t>
+              <w:t>‎HAMTA‎</w:t>
             </w:r>
           </w:p>
         </w:tc>
@@ -13895,7 +13200,7 @@
                 <w:sz w:val="10"/>
                 <w:szCs w:val="10"/>
               </w:rPr>
-              <w:t>Q=1</w:t>
+              <w:t>‎Q=1‎</w:t>
             </w:r>
             <w:r>
               <w:rPr>
@@ -14578,7 +13883,7 @@
           <w:sz w:val="17"/>
           <w:szCs w:val="17"/>
         </w:rPr>
-        <w:t>HAMTA</w:t>
+        <w:t>‎HAMTA‎</w:t>
       </w:r>
       <w:r>
         <w:rPr>
@@ -14596,7 +13901,7 @@
           <w:sz w:val="17"/>
           <w:szCs w:val="17"/>
         </w:rPr>
-        <w:t>GBDT</w:t>
+        <w:t>‎GBDT‎</w:t>
       </w:r>
       <w:r>
         <w:rPr>
@@ -14614,7 +13919,7 @@
           <w:sz w:val="17"/>
           <w:szCs w:val="17"/>
         </w:rPr>
-        <w:t>NDCG@35</w:t>
+        <w:t>‎NDCG@35‎</w:t>
       </w:r>
       <w:r>
         <w:rPr>
@@ -14632,43 +13937,43 @@
           <w:sz w:val="17"/>
           <w:szCs w:val="17"/>
         </w:rPr>
-        <w:t>p</w:t>
-      </w:r>
-      <w:r>
-        <w:rPr>
-          <w:rFonts w:hint="cs" w:ascii="B Mitra" w:hAnsi="B Mitra" w:cs="B Mitra"/>
-          <w:sz w:val="18"/>
-          <w:rtl/>
-          <w:szCs w:val="18"/>
-        </w:rPr>
-        <w:t xml:space="preserve"> = ۰٫۰۰۲۰) و پویایی‌های زمانی شاخص را به میزان ۰٫۰۷۲+ (</w:t>
-      </w:r>
-      <w:r>
-        <w:rPr>
-          <w:rFonts w:ascii="Times New Roman" w:hAnsi="Times New Roman" w:cs="Times New Roman"/>
-          <w:bidi w:val="0"/>
-          <w:sz w:val="17"/>
-          <w:szCs w:val="17"/>
-        </w:rPr>
-        <w:t>p</w:t>
-      </w:r>
-      <w:r>
-        <w:rPr>
-          <w:rFonts w:hint="cs" w:ascii="B Mitra" w:hAnsi="B Mitra" w:cs="B Mitra"/>
-          <w:sz w:val="18"/>
-          <w:rtl/>
-          <w:szCs w:val="18"/>
-        </w:rPr>
-        <w:t xml:space="preserve"> = ۰٫۰۸۴۰) ارتقا می‌دهد. (۲) سپرهای حفاظتی عملیاتی: کران نااطمینانی یک‌طرفه </w:t>
-      </w:r>
-      <w:r>
-        <w:rPr>
-          <w:rFonts w:ascii="Times New Roman" w:hAnsi="Times New Roman" w:cs="Times New Roman"/>
-          <w:bidi w:val="0"/>
-          <w:sz w:val="17"/>
-          <w:szCs w:val="17"/>
-        </w:rPr>
-        <w:t>U</w:t>
+        <w:t>‎p = 0.0020‎</w:t>
+      </w:r>
+      <w:r>
+        <w:rPr>
+          <w:rFonts w:hint="cs" w:ascii="B Mitra" w:hAnsi="B Mitra" w:cs="B Mitra"/>
+          <w:sz w:val="18"/>
+          <w:rtl/>
+          <w:szCs w:val="18"/>
+        </w:rPr>
+        <w:t>) و پویایی‌های زمانی شاخص را به میزان ۰٫۰۷۲+ (</w:t>
+      </w:r>
+      <w:r>
+        <w:rPr>
+          <w:rFonts w:ascii="Times New Roman" w:hAnsi="Times New Roman" w:cs="Times New Roman"/>
+          <w:bidi w:val="0"/>
+          <w:sz w:val="17"/>
+          <w:szCs w:val="17"/>
+        </w:rPr>
+        <w:t>‎p = 0.0840‎</w:t>
+      </w:r>
+      <w:r>
+        <w:rPr>
+          <w:rFonts w:hint="cs" w:ascii="B Mitra" w:hAnsi="B Mitra" w:cs="B Mitra"/>
+          <w:sz w:val="18"/>
+          <w:rtl/>
+          <w:szCs w:val="18"/>
+        </w:rPr>
+        <w:t xml:space="preserve">) ارتقا می‌دهد. (۲) سپرهای حفاظتی عملیاتی: کران نااطمینانی یک‌طرفه </w:t>
+      </w:r>
+      <w:r>
+        <w:rPr>
+          <w:rFonts w:ascii="Times New Roman" w:hAnsi="Times New Roman" w:cs="Times New Roman"/>
+          <w:bidi w:val="0"/>
+          <w:sz w:val="17"/>
+          <w:szCs w:val="17"/>
+        </w:rPr>
+        <w:t>‎U‎</w:t>
       </w:r>
       <w:r>
         <w:rPr>
@@ -14686,7 +13991,7 @@
           <w:sz w:val="17"/>
           <w:szCs w:val="17"/>
         </w:rPr>
-        <w:t>Q</w:t>
+        <w:t>‎Q‎</w:t>
       </w:r>
       <w:r>
         <w:rPr>
@@ -14704,7 +14009,7 @@
           <w:sz w:val="17"/>
           <w:szCs w:val="17"/>
         </w:rPr>
-        <w:t>U</w:t>
+        <w:t>‎U‎</w:t>
       </w:r>
       <w:r>
         <w:rPr>
@@ -14722,7 +14027,7 @@
           <w:sz w:val="17"/>
           <w:szCs w:val="17"/>
         </w:rPr>
-        <w:t>NDCG</w:t>
+        <w:t>‎NDCG‎</w:t>
       </w:r>
       <w:r>
         <w:rPr>
@@ -14740,25 +14045,25 @@
           <w:sz w:val="17"/>
           <w:szCs w:val="17"/>
         </w:rPr>
-        <w:t>p</w:t>
-      </w:r>
-      <w:r>
-        <w:rPr>
-          <w:rFonts w:hint="cs" w:ascii="B Mitra" w:hAnsi="B Mitra" w:cs="B Mitra"/>
-          <w:sz w:val="18"/>
-          <w:rtl/>
-          <w:szCs w:val="18"/>
-        </w:rPr>
-        <w:t xml:space="preserve"> = ۰٫۰۲۷۳) می‌رساند، اما نرخ هشدارهای کاذب را در نوسانات طبیعی به شدت بالا می‌برد زیرا واریانس مثبت طبیعی پیش‌بینی را به عنوان فرصت قلمداد می‌کند. همچنین حذف </w:t>
-      </w:r>
-      <w:r>
-        <w:rPr>
-          <w:rFonts w:ascii="Times New Roman" w:hAnsi="Times New Roman" w:cs="Times New Roman"/>
-          <w:bidi w:val="0"/>
-          <w:sz w:val="17"/>
-          <w:szCs w:val="17"/>
-        </w:rPr>
-        <w:t>Q</w:t>
+        <w:t>‎p = 0.0273‎</w:t>
+      </w:r>
+      <w:r>
+        <w:rPr>
+          <w:rFonts w:hint="cs" w:ascii="B Mitra" w:hAnsi="B Mitra" w:cs="B Mitra"/>
+          <w:sz w:val="18"/>
+          <w:rtl/>
+          <w:szCs w:val="18"/>
+        </w:rPr>
+        <w:t xml:space="preserve">) می‌رساند، اما نرخ هشدارهای کاذب را در نوسانات طبیعی به شدت بالا می‌برد زیرا واریانس مثبت طبیعی پیش‌بینی را به عنوان فرصت قلمداد می‌کند. همچنین حذف </w:t>
+      </w:r>
+      <w:r>
+        <w:rPr>
+          <w:rFonts w:ascii="Times New Roman" w:hAnsi="Times New Roman" w:cs="Times New Roman"/>
+          <w:bidi w:val="0"/>
+          <w:sz w:val="17"/>
+          <w:szCs w:val="17"/>
+        </w:rPr>
+        <w:t>‎Q‎</w:t>
       </w:r>
       <w:r>
         <w:rPr>
@@ -14776,34 +14081,34 @@
           <w:sz w:val="17"/>
           <w:szCs w:val="17"/>
         </w:rPr>
-        <w:t>Δ</w:t>
-      </w:r>
-      <w:r>
-        <w:rPr>
-          <w:rFonts w:hint="cs" w:ascii="B Mitra" w:hAnsi="B Mitra" w:cs="B Mitra"/>
-          <w:sz w:val="18"/>
-          <w:rtl/>
-          <w:szCs w:val="18"/>
-        </w:rPr>
-        <w:t xml:space="preserve"> = -۰٫۰۰۲، </w:t>
-      </w:r>
-      <w:r>
-        <w:rPr>
-          <w:rFonts w:ascii="Times New Roman" w:hAnsi="Times New Roman" w:cs="Times New Roman"/>
-          <w:bidi w:val="0"/>
-          <w:sz w:val="17"/>
-          <w:szCs w:val="17"/>
-        </w:rPr>
-        <w:t>p</w:t>
-      </w:r>
-      <w:r>
-        <w:rPr>
-          <w:rFonts w:hint="cs" w:ascii="B Mitra" w:hAnsi="B Mitra" w:cs="B Mitra"/>
-          <w:sz w:val="18"/>
-          <w:rtl/>
-          <w:szCs w:val="18"/>
-        </w:rPr>
-        <w:t xml:space="preserve"> = ۰٫۸۴۵۷).</w:t>
+        <w:t>‎Δ = ‎</w:t>
+      </w:r>
+      <w:r>
+        <w:rPr>
+          <w:rFonts w:hint="cs" w:ascii="B Mitra" w:hAnsi="B Mitra" w:cs="B Mitra"/>
+          <w:sz w:val="18"/>
+          <w:rtl/>
+          <w:szCs w:val="18"/>
+        </w:rPr>
+        <w:t xml:space="preserve">-۰٫۰۰۲، </w:t>
+      </w:r>
+      <w:r>
+        <w:rPr>
+          <w:rFonts w:ascii="Times New Roman" w:hAnsi="Times New Roman" w:cs="Times New Roman"/>
+          <w:bidi w:val="0"/>
+          <w:sz w:val="17"/>
+          <w:szCs w:val="17"/>
+        </w:rPr>
+        <w:t>‎p = 0.8457‎</w:t>
+      </w:r>
+      <w:r>
+        <w:rPr>
+          <w:rFonts w:hint="cs" w:ascii="B Mitra" w:hAnsi="B Mitra" w:cs="B Mitra"/>
+          <w:sz w:val="18"/>
+          <w:rtl/>
+          <w:szCs w:val="18"/>
+        </w:rPr>
+        <w:t>).</w:t>
       </w:r>
     </w:p>
     <w:p>
@@ -14818,7 +14123,7 @@
           <w:sz w:val="18"/>
           <w:szCs w:val="18"/>
         </w:rPr>
-        <w:t>5.6</w:t>
+        <w:t>‎5.6‎</w:t>
       </w:r>
       <w:r>
         <w:rPr>
@@ -14851,7 +14156,7 @@
           <w:sz w:val="17"/>
           <w:szCs w:val="17"/>
         </w:rPr>
-        <w:t>6</w:t>
+        <w:t>‎6‎</w:t>
       </w:r>
       <w:r>
         <w:rPr>
@@ -14885,7 +14190,7 @@
           <w:sz w:val="17"/>
           <w:szCs w:val="17"/>
         </w:rPr>
-        <w:t>6</w:t>
+        <w:t>‎6‎</w:t>
       </w:r>
       <w:r>
         <w:rPr>
@@ -15175,7 +14480,7 @@
                 <w:sz w:val="10"/>
                 <w:szCs w:val="10"/>
               </w:rPr>
-              <w:t>MERCH_</w:t>
+              <w:t>‎MERCH_‎</w:t>
             </w:r>
             <w:r>
               <w:rPr>
@@ -15385,7 +14690,7 @@
                 <w:sz w:val="10"/>
                 <w:szCs w:val="10"/>
               </w:rPr>
-              <w:t>MERCH_</w:t>
+              <w:t>‎MERCH_‎</w:t>
             </w:r>
             <w:r>
               <w:rPr>
@@ -15595,7 +14900,7 @@
                 <w:sz w:val="10"/>
                 <w:szCs w:val="10"/>
               </w:rPr>
-              <w:t>MERCH_</w:t>
+              <w:t>‎MERCH_‎</w:t>
             </w:r>
             <w:r>
               <w:rPr>
@@ -15805,7 +15110,7 @@
                 <w:sz w:val="10"/>
                 <w:szCs w:val="10"/>
               </w:rPr>
-              <w:t>MERCH_</w:t>
+              <w:t>‎MERCH_‎</w:t>
             </w:r>
             <w:r>
               <w:rPr>
@@ -16015,7 +15320,7 @@
                 <w:sz w:val="10"/>
                 <w:szCs w:val="10"/>
               </w:rPr>
-              <w:t>MERCH_</w:t>
+              <w:t>‎MERCH_‎</w:t>
             </w:r>
             <w:r>
               <w:rPr>
@@ -16262,7 +15567,7 @@
           <w:sz w:val="17"/>
           <w:szCs w:val="17"/>
         </w:rPr>
-        <w:t>5</w:t>
+        <w:t>‎5‎</w:t>
       </w:r>
       <w:r>
         <w:rPr>
@@ -16280,7 +15585,7 @@
           <w:sz w:val="17"/>
           <w:szCs w:val="17"/>
         </w:rPr>
-        <w:t>Precision@K</w:t>
+        <w:t>‎Precision@K‎</w:t>
       </w:r>
       <w:r>
         <w:rPr>
@@ -16313,7 +15618,7 @@
           <w:sz w:val="17"/>
           <w:szCs w:val="17"/>
         </w:rPr>
-        <w:t>Micro-Merchant Bias</w:t>
+        <w:t>‎Micro-Merchant Bias‎</w:t>
       </w:r>
       <w:r>
         <w:rPr>
@@ -16331,7 +15636,7 @@
           <w:sz w:val="17"/>
           <w:szCs w:val="17"/>
         </w:rPr>
-        <w:t>M-GATO</w:t>
+        <w:t>‎M-GATO‎</w:t>
       </w:r>
       <w:r>
         <w:rPr>
@@ -16349,25 +15654,61 @@
           <w:sz w:val="17"/>
           <w:szCs w:val="17"/>
         </w:rPr>
-        <w:t>Y</w:t>
-      </w:r>
-      <w:r>
-        <w:rPr>
-          <w:rFonts w:hint="cs" w:ascii="B Mitra" w:hAnsi="B Mitra" w:cs="B Mitra"/>
-          <w:sz w:val="18"/>
-          <w:rtl/>
-          <w:szCs w:val="18"/>
-        </w:rPr>
-        <w:t xml:space="preserve"> ≥ ۵، ۱۰ و ۲۰، سهم کاندیداهای خرد را به ترتیب به ۳۴٫۱٪، ۱۸٫۲٪ و ۴٫۳٪ کاهش می‌دهد. اعمال فیلتر ۱۰ تراکنش دقت را در سطح ۰٫۲۸۶ ± ۰٫۰۵۶ و </w:t>
-      </w:r>
-      <w:r>
-        <w:rPr>
-          <w:rFonts w:ascii="Times New Roman" w:hAnsi="Times New Roman" w:cs="Times New Roman"/>
-          <w:bidi w:val="0"/>
-          <w:sz w:val="17"/>
-          <w:szCs w:val="17"/>
-        </w:rPr>
-        <w:t>NDCG</w:t>
+        <w:t>‎Y ≥ 5‎</w:t>
+      </w:r>
+      <w:r>
+        <w:rPr>
+          <w:rFonts w:hint="cs" w:ascii="B Mitra" w:hAnsi="B Mitra" w:cs="B Mitra"/>
+          <w:sz w:val="18"/>
+          <w:rtl/>
+          <w:szCs w:val="18"/>
+        </w:rPr>
+        <w:t xml:space="preserve">، </w:t>
+      </w:r>
+      <w:r>
+        <w:rPr>
+          <w:rFonts w:ascii="Times New Roman" w:hAnsi="Times New Roman" w:cs="Times New Roman"/>
+          <w:bidi w:val="0"/>
+          <w:sz w:val="17"/>
+          <w:szCs w:val="17"/>
+        </w:rPr>
+        <w:t>‎10‎</w:t>
+      </w:r>
+      <w:r>
+        <w:rPr>
+          <w:rFonts w:hint="cs" w:ascii="B Mitra" w:hAnsi="B Mitra" w:cs="B Mitra"/>
+          <w:sz w:val="18"/>
+          <w:rtl/>
+          <w:szCs w:val="18"/>
+        </w:rPr>
+        <w:t xml:space="preserve"> و </w:t>
+      </w:r>
+      <w:r>
+        <w:rPr>
+          <w:rFonts w:ascii="Times New Roman" w:hAnsi="Times New Roman" w:cs="Times New Roman"/>
+          <w:bidi w:val="0"/>
+          <w:sz w:val="17"/>
+          <w:szCs w:val="17"/>
+        </w:rPr>
+        <w:t>‎20‎</w:t>
+      </w:r>
+      <w:r>
+        <w:rPr>
+          <w:rFonts w:hint="cs" w:ascii="B Mitra" w:hAnsi="B Mitra" w:cs="B Mitra"/>
+          <w:sz w:val="18"/>
+          <w:rtl/>
+          <w:szCs w:val="18"/>
+        </w:rPr>
+        <w:t xml:space="preserve">، سهم کاندیداهای خرد را به ترتیب به ۳۴٫۱٪، ۱۸٫۲٪ و ۴٫۳٪ کاهش می‌دهد. اعمال فیلتر ۱۰ تراکنش دقت را در سطح ۰٫۲۸۶ ± ۰٫۰۵۶ و </w:t>
+      </w:r>
+      <w:r>
+        <w:rPr>
+          <w:rFonts w:ascii="Times New Roman" w:hAnsi="Times New Roman" w:cs="Times New Roman"/>
+          <w:bidi w:val="0"/>
+          <w:sz w:val="17"/>
+          <w:szCs w:val="17"/>
+        </w:rPr>
+        <w:t>‎NDCG‎</w:t>
       </w:r>
       <w:r>
         <w:rPr>
@@ -16385,25 +15726,7 @@
           <w:sz w:val="17"/>
           <w:szCs w:val="17"/>
         </w:rPr>
-        <w:t>τ_a</w:t>
-      </w:r>
-      <w:r>
-        <w:rPr>
-          <w:rFonts w:hint="cs" w:ascii="B Mitra" w:hAnsi="B Mitra" w:cs="B Mitra"/>
-          <w:sz w:val="18"/>
-          <w:rtl/>
-          <w:szCs w:val="18"/>
-        </w:rPr>
-        <w:t xml:space="preserve"> = </w:t>
-      </w:r>
-      <w:r>
-        <w:rPr>
-          <w:rFonts w:ascii="Times New Roman" w:hAnsi="Times New Roman" w:cs="Times New Roman"/>
-          <w:bidi w:val="0"/>
-          <w:sz w:val="17"/>
-          <w:szCs w:val="17"/>
-        </w:rPr>
-        <w:t>15</w:t>
+        <w:t>‎τ_a = 15‎</w:t>
       </w:r>
       <w:r>
         <w:rPr>
@@ -16454,7 +15777,7 @@
           <w:sz w:val="17"/>
           <w:szCs w:val="17"/>
         </w:rPr>
-        <w:t>Peer Cannibalization</w:t>
+        <w:t>‎Peer Cannibalization‎</w:t>
       </w:r>
       <w:r>
         <w:rPr>
@@ -16472,7 +15795,7 @@
           <w:sz w:val="17"/>
           <w:szCs w:val="17"/>
         </w:rPr>
-        <w:t>M-GATO</w:t>
+        <w:t>‎M-GATO‎</w:t>
       </w:r>
       <w:r>
         <w:rPr>
@@ -16490,7 +15813,7 @@
           <w:sz w:val="17"/>
           <w:szCs w:val="17"/>
         </w:rPr>
-        <w:t>A/B</w:t>
+        <w:t>‎A/B‎</w:t>
       </w:r>
       <w:r>
         <w:rPr>
@@ -16523,7 +15846,7 @@
           <w:sz w:val="17"/>
           <w:szCs w:val="17"/>
         </w:rPr>
-        <w:t>Intel Core i7</w:t>
+        <w:t>‎Intel Core i7‎</w:t>
       </w:r>
       <w:r>
         <w:rPr>
@@ -16541,7 +15864,7 @@
           <w:sz w:val="17"/>
           <w:szCs w:val="17"/>
         </w:rPr>
-        <w:t>PyTorch 2.4</w:t>
+        <w:t>‎PyTorch 2.4‎</w:t>
       </w:r>
       <w:r>
         <w:rPr>
@@ -16559,7 +15882,7 @@
           <w:sz w:val="17"/>
           <w:szCs w:val="17"/>
         </w:rPr>
-        <w:t>O</w:t>
+        <w:t>‎O‎</w:t>
       </w:r>
       <w:r>
         <w:rPr>
@@ -16577,43 +15900,7 @@
           <w:sz w:val="17"/>
           <w:szCs w:val="17"/>
         </w:rPr>
-        <w:t>M</w:t>
-      </w:r>
-      <w:r>
-        <w:rPr>
-          <w:rFonts w:hint="cs" w:ascii="B Mitra" w:hAnsi="B Mitra" w:cs="B Mitra"/>
-          <w:sz w:val="18"/>
-          <w:rtl/>
-          <w:szCs w:val="18"/>
-        </w:rPr>
-        <w:t xml:space="preserve">| · </w:t>
-      </w:r>
-      <w:r>
-        <w:rPr>
-          <w:rFonts w:ascii="Times New Roman" w:hAnsi="Times New Roman" w:cs="Times New Roman"/>
-          <w:bidi w:val="0"/>
-          <w:sz w:val="17"/>
-          <w:szCs w:val="17"/>
-        </w:rPr>
-        <w:t>K</w:t>
-      </w:r>
-      <w:r>
-        <w:rPr>
-          <w:rFonts w:hint="cs" w:ascii="B Mitra" w:hAnsi="B Mitra" w:cs="B Mitra"/>
-          <w:sz w:val="18"/>
-          <w:rtl/>
-          <w:szCs w:val="18"/>
-        </w:rPr>
-        <w:t xml:space="preserve"> · </w:t>
-      </w:r>
-      <w:r>
-        <w:rPr>
-          <w:rFonts w:ascii="Times New Roman" w:hAnsi="Times New Roman" w:cs="Times New Roman"/>
-          <w:bidi w:val="0"/>
-          <w:sz w:val="17"/>
-          <w:szCs w:val="17"/>
-        </w:rPr>
-        <w:t>d_avg</w:t>
+        <w:t>‎M| · K · d_avg‎</w:t>
       </w:r>
       <w:r>
         <w:rPr>
@@ -16637,7 +15924,7 @@
           <w:sz w:val="20"/>
           <w:szCs w:val="20"/>
         </w:rPr>
-        <w:t>6</w:t>
+        <w:t>‎6‎</w:t>
       </w:r>
       <w:r>
         <w:rPr>
@@ -16670,7 +15957,7 @@
           <w:sz w:val="17"/>
           <w:szCs w:val="17"/>
         </w:rPr>
-        <w:t>HAMTA</w:t>
+        <w:t>‎HAMTA‎</w:t>
       </w:r>
       <w:r>
         <w:rPr>
@@ -16688,7 +15975,7 @@
           <w:sz w:val="17"/>
           <w:szCs w:val="17"/>
         </w:rPr>
-        <w:t>Treatment-label-free</w:t>
+        <w:t>‎Treatment-label-free‎</w:t>
       </w:r>
       <w:r>
         <w:rPr>
@@ -16706,7 +15993,7 @@
           <w:sz w:val="17"/>
           <w:szCs w:val="17"/>
         </w:rPr>
-        <w:t>HAMTA</w:t>
+        <w:t>‎HAMTA‎</w:t>
       </w:r>
       <w:r>
         <w:rPr>
@@ -16724,7 +16011,7 @@
           <w:sz w:val="17"/>
           <w:szCs w:val="17"/>
         </w:rPr>
-        <w:t>M-GATO</w:t>
+        <w:t>‎M-GATO‎</w:t>
       </w:r>
       <w:r>
         <w:rPr>
@@ -16757,7 +16044,7 @@
           <w:sz w:val="17"/>
           <w:szCs w:val="17"/>
         </w:rPr>
-        <w:t>M-GATO</w:t>
+        <w:t>‎M-GATO‎</w:t>
       </w:r>
       <w:r>
         <w:rPr>
@@ -16775,7 +16062,7 @@
           <w:sz w:val="17"/>
           <w:szCs w:val="17"/>
         </w:rPr>
-        <w:t>ITE Uplift Modeling</w:t>
+        <w:t>‎ITE Uplift Modeling‎</w:t>
       </w:r>
       <w:r>
         <w:rPr>
@@ -16793,7 +16080,7 @@
           <w:sz w:val="17"/>
           <w:szCs w:val="17"/>
         </w:rPr>
-        <w:t>PCI-DSS</w:t>
+        <w:t>‎PCI-DSS‎</w:t>
       </w:r>
       <w:r>
         <w:rPr>

</xml_diff>

<commit_message>
fix(paper_fa): unify mathematical complexity and Big-O notation into continuous LTR runs with non-breaking spaces
</commit_message>
<xml_diff>
--- a/FA_From_Transactional_Data_to_Organizational_Intelligence.docx
+++ b/FA_From_Transactional_Data_to_Organizational_Intelligence.docx
@@ -430,7 +430,25 @@
           <w:sz w:val="17"/>
           <w:szCs w:val="17"/>
         </w:rPr>
-        <w:t>‎1, 2]‎</w:t>
+        <w:t>‎1‎</w:t>
+      </w:r>
+      <w:r>
+        <w:rPr>
+          <w:rFonts w:hint="cs" w:ascii="B Mitra" w:hAnsi="B Mitra" w:cs="B Mitra"/>
+          <w:sz w:val="18"/>
+          <w:rtl/>
+          <w:szCs w:val="18"/>
+        </w:rPr>
+        <w:t xml:space="preserve">, </w:t>
+      </w:r>
+      <w:r>
+        <w:rPr>
+          <w:rFonts w:ascii="Times New Roman" w:hAnsi="Times New Roman" w:cs="Times New Roman"/>
+          <w:bidi w:val="0"/>
+          <w:sz w:val="17"/>
+          <w:szCs w:val="17"/>
+        </w:rPr>
+        <w:t>‎2]‎</w:t>
       </w:r>
       <w:r>
         <w:rPr>
@@ -622,7 +640,25 @@
           <w:sz w:val="17"/>
           <w:szCs w:val="17"/>
         </w:rPr>
-        <w:t>‎4, 5]‎</w:t>
+        <w:t>‎4‎</w:t>
+      </w:r>
+      <w:r>
+        <w:rPr>
+          <w:rFonts w:hint="cs" w:ascii="B Mitra" w:hAnsi="B Mitra" w:cs="B Mitra"/>
+          <w:sz w:val="18"/>
+          <w:rtl/>
+          <w:szCs w:val="18"/>
+        </w:rPr>
+        <w:t xml:space="preserve">, </w:t>
+      </w:r>
+      <w:r>
+        <w:rPr>
+          <w:rFonts w:ascii="Times New Roman" w:hAnsi="Times New Roman" w:cs="Times New Roman"/>
+          <w:bidi w:val="0"/>
+          <w:sz w:val="17"/>
+          <w:szCs w:val="17"/>
+        </w:rPr>
+        <w:t>‎5]‎</w:t>
       </w:r>
       <w:r>
         <w:rPr>
@@ -640,7 +676,25 @@
           <w:sz w:val="17"/>
           <w:szCs w:val="17"/>
         </w:rPr>
-        <w:t>‎6, 7]‎</w:t>
+        <w:t>‎6‎</w:t>
+      </w:r>
+      <w:r>
+        <w:rPr>
+          <w:rFonts w:hint="cs" w:ascii="B Mitra" w:hAnsi="B Mitra" w:cs="B Mitra"/>
+          <w:sz w:val="18"/>
+          <w:rtl/>
+          <w:szCs w:val="18"/>
+        </w:rPr>
+        <w:t xml:space="preserve">, </w:t>
+      </w:r>
+      <w:r>
+        <w:rPr>
+          <w:rFonts w:ascii="Times New Roman" w:hAnsi="Times New Roman" w:cs="Times New Roman"/>
+          <w:bidi w:val="0"/>
+          <w:sz w:val="17"/>
+          <w:szCs w:val="17"/>
+        </w:rPr>
+        <w:t>‎7]‎</w:t>
       </w:r>
       <w:r>
         <w:rPr>
@@ -883,7 +937,25 @@
           <w:sz w:val="17"/>
           <w:szCs w:val="17"/>
         </w:rPr>
-        <w:t>‎14, 15]‎</w:t>
+        <w:t>‎14‎</w:t>
+      </w:r>
+      <w:r>
+        <w:rPr>
+          <w:rFonts w:hint="cs" w:ascii="B Mitra" w:hAnsi="B Mitra" w:cs="B Mitra"/>
+          <w:sz w:val="18"/>
+          <w:rtl/>
+          <w:szCs w:val="18"/>
+        </w:rPr>
+        <w:t xml:space="preserve">, </w:t>
+      </w:r>
+      <w:r>
+        <w:rPr>
+          <w:rFonts w:ascii="Times New Roman" w:hAnsi="Times New Roman" w:cs="Times New Roman"/>
+          <w:bidi w:val="0"/>
+          <w:sz w:val="17"/>
+          <w:szCs w:val="17"/>
+        </w:rPr>
+        <w:t>‎15]‎</w:t>
       </w:r>
       <w:r>
         <w:rPr>
@@ -1087,7 +1159,25 @@
           <w:sz w:val="17"/>
           <w:szCs w:val="17"/>
         </w:rPr>
-        <w:t>‎20, 21]‎</w:t>
+        <w:t>‎20‎</w:t>
+      </w:r>
+      <w:r>
+        <w:rPr>
+          <w:rFonts w:hint="cs" w:ascii="B Mitra" w:hAnsi="B Mitra" w:cs="B Mitra"/>
+          <w:sz w:val="18"/>
+          <w:rtl/>
+          <w:szCs w:val="18"/>
+        </w:rPr>
+        <w:t xml:space="preserve">, </w:t>
+      </w:r>
+      <w:r>
+        <w:rPr>
+          <w:rFonts w:ascii="Times New Roman" w:hAnsi="Times New Roman" w:cs="Times New Roman"/>
+          <w:bidi w:val="0"/>
+          <w:sz w:val="17"/>
+          <w:szCs w:val="17"/>
+        </w:rPr>
+        <w:t>‎21]‎</w:t>
       </w:r>
       <w:r>
         <w:rPr>
@@ -1105,7 +1195,25 @@
           <w:sz w:val="17"/>
           <w:szCs w:val="17"/>
         </w:rPr>
-        <w:t>‎4, 5]‎</w:t>
+        <w:t>‎4‎</w:t>
+      </w:r>
+      <w:r>
+        <w:rPr>
+          <w:rFonts w:hint="cs" w:ascii="B Mitra" w:hAnsi="B Mitra" w:cs="B Mitra"/>
+          <w:sz w:val="18"/>
+          <w:rtl/>
+          <w:szCs w:val="18"/>
+        </w:rPr>
+        <w:t xml:space="preserve">, </w:t>
+      </w:r>
+      <w:r>
+        <w:rPr>
+          <w:rFonts w:ascii="Times New Roman" w:hAnsi="Times New Roman" w:cs="Times New Roman"/>
+          <w:bidi w:val="0"/>
+          <w:sz w:val="17"/>
+          <w:szCs w:val="17"/>
+        </w:rPr>
+        <w:t>‎5]‎</w:t>
       </w:r>
       <w:r>
         <w:rPr>
@@ -1141,7 +1249,43 @@
           <w:sz w:val="17"/>
           <w:szCs w:val="17"/>
         </w:rPr>
-        <w:t>‎6, 7, 22]‎</w:t>
+        <w:t>‎6‎</w:t>
+      </w:r>
+      <w:r>
+        <w:rPr>
+          <w:rFonts w:hint="cs" w:ascii="B Mitra" w:hAnsi="B Mitra" w:cs="B Mitra"/>
+          <w:sz w:val="18"/>
+          <w:rtl/>
+          <w:szCs w:val="18"/>
+        </w:rPr>
+        <w:t xml:space="preserve">, </w:t>
+      </w:r>
+      <w:r>
+        <w:rPr>
+          <w:rFonts w:ascii="Times New Roman" w:hAnsi="Times New Roman" w:cs="Times New Roman"/>
+          <w:bidi w:val="0"/>
+          <w:sz w:val="17"/>
+          <w:szCs w:val="17"/>
+        </w:rPr>
+        <w:t>‎7‎</w:t>
+      </w:r>
+      <w:r>
+        <w:rPr>
+          <w:rFonts w:hint="cs" w:ascii="B Mitra" w:hAnsi="B Mitra" w:cs="B Mitra"/>
+          <w:sz w:val="18"/>
+          <w:rtl/>
+          <w:szCs w:val="18"/>
+        </w:rPr>
+        <w:t xml:space="preserve">, </w:t>
+      </w:r>
+      <w:r>
+        <w:rPr>
+          <w:rFonts w:ascii="Times New Roman" w:hAnsi="Times New Roman" w:cs="Times New Roman"/>
+          <w:bidi w:val="0"/>
+          <w:sz w:val="17"/>
+          <w:szCs w:val="17"/>
+        </w:rPr>
+        <w:t>‎22]‎</w:t>
       </w:r>
       <w:r>
         <w:rPr>
@@ -1796,7 +1940,7 @@
           <w:sz w:val="17"/>
           <w:szCs w:val="17"/>
         </w:rPr>
-        <w:t>‎m ∈ M‎</w:t>
+        <w:t>‎m ∈ M‎</w:t>
       </w:r>
       <w:r>
         <w:rPr>
@@ -2067,34 +2211,16 @@
           <w:sz w:val="17"/>
           <w:szCs w:val="17"/>
         </w:rPr>
-        <w:t>‎O‎</w:t>
-      </w:r>
-      <w:r>
-        <w:rPr>
-          <w:rFonts w:hint="cs" w:ascii="B Mitra" w:hAnsi="B Mitra" w:cs="B Mitra"/>
-          <w:sz w:val="18"/>
-          <w:rtl/>
-          <w:szCs w:val="18"/>
-        </w:rPr>
-        <w:t>(|</w:t>
-      </w:r>
-      <w:r>
-        <w:rPr>
-          <w:rFonts w:ascii="Times New Roman" w:hAnsi="Times New Roman" w:cs="Times New Roman"/>
-          <w:bidi w:val="0"/>
-          <w:sz w:val="17"/>
-          <w:szCs w:val="17"/>
-        </w:rPr>
-        <w:t>‎M|^2‎</w:t>
-      </w:r>
-      <w:r>
-        <w:rPr>
-          <w:rFonts w:hint="cs" w:ascii="B Mitra" w:hAnsi="B Mitra" w:cs="B Mitra"/>
-          <w:sz w:val="18"/>
-          <w:rtl/>
-          <w:szCs w:val="18"/>
-        </w:rPr>
-        <w:t xml:space="preserve">)، چارچوب </w:t>
+        <w:t>‎O(|M|^2)‎</w:t>
+      </w:r>
+      <w:r>
+        <w:rPr>
+          <w:rFonts w:hint="cs" w:ascii="B Mitra" w:hAnsi="B Mitra" w:cs="B Mitra"/>
+          <w:sz w:val="18"/>
+          <w:rtl/>
+          <w:szCs w:val="18"/>
+        </w:rPr>
+        <w:t xml:space="preserve">، چارچوب </w:t>
       </w:r>
       <w:r>
         <w:rPr>
@@ -2121,16 +2247,16 @@
           <w:sz w:val="17"/>
           <w:szCs w:val="17"/>
         </w:rPr>
-        <w:t>‎I‎</w:t>
-      </w:r>
-      <w:r>
-        <w:rPr>
-          <w:rFonts w:hint="cs" w:ascii="B Mitra" w:hAnsi="B Mitra" w:cs="B Mitra"/>
-          <w:sz w:val="18"/>
-          <w:rtl/>
-          <w:szCs w:val="18"/>
-        </w:rPr>
-        <w:t>(</w:t>
+        <w:t>‎I(c)‎</w:t>
+      </w:r>
+      <w:r>
+        <w:rPr>
+          <w:rFonts w:hint="cs" w:ascii="B Mitra" w:hAnsi="B Mitra" w:cs="B Mitra"/>
+          <w:sz w:val="18"/>
+          <w:rtl/>
+          <w:szCs w:val="18"/>
+        </w:rPr>
+        <w:t xml:space="preserve"> تمامی پذیرندگان مشاهده‌شده توسط کارت </w:t>
       </w:r>
       <w:r>
         <w:rPr>
@@ -2148,24 +2274,6 @@
           <w:rtl/>
           <w:szCs w:val="18"/>
         </w:rPr>
-        <w:t xml:space="preserve">) تمامی پذیرندگان مشاهده‌شده توسط کارت </w:t>
-      </w:r>
-      <w:r>
-        <w:rPr>
-          <w:rFonts w:ascii="Times New Roman" w:hAnsi="Times New Roman" w:cs="Times New Roman"/>
-          <w:bidi w:val="0"/>
-          <w:sz w:val="17"/>
-          <w:szCs w:val="17"/>
-        </w:rPr>
-        <w:t>‎c‎</w:t>
-      </w:r>
-      <w:r>
-        <w:rPr>
-          <w:rFonts w:hint="cs" w:ascii="B Mitra" w:hAnsi="B Mitra" w:cs="B Mitra"/>
-          <w:sz w:val="18"/>
-          <w:rtl/>
-          <w:szCs w:val="18"/>
-        </w:rPr>
         <w:t xml:space="preserve"> در پنجره‌های گذشته را بازمی‌یابد و برای هر پذیرنده </w:t>
       </w:r>
       <w:r>
@@ -2193,34 +2301,16 @@
           <w:sz w:val="17"/>
           <w:szCs w:val="17"/>
         </w:rPr>
-        <w:t>‎O‎</w:t>
-      </w:r>
-      <w:r>
-        <w:rPr>
-          <w:rFonts w:hint="cs" w:ascii="B Mitra" w:hAnsi="B Mitra" w:cs="B Mitra"/>
-          <w:sz w:val="18"/>
-          <w:rtl/>
-          <w:szCs w:val="18"/>
-        </w:rPr>
-        <w:t>(|</w:t>
-      </w:r>
-      <w:r>
-        <w:rPr>
-          <w:rFonts w:ascii="Times New Roman" w:hAnsi="Times New Roman" w:cs="Times New Roman"/>
-          <w:bidi w:val="0"/>
-          <w:sz w:val="17"/>
-          <w:szCs w:val="17"/>
-        </w:rPr>
-        <w:t>‎C_m| · d_card‎</w:t>
-      </w:r>
-      <w:r>
-        <w:rPr>
-          <w:rFonts w:hint="cs" w:ascii="B Mitra" w:hAnsi="B Mitra" w:cs="B Mitra"/>
-          <w:sz w:val="18"/>
-          <w:rtl/>
-          <w:szCs w:val="18"/>
-        </w:rPr>
-        <w:t>) استخراج می‌شود:</w:t>
+        <w:t>‎O(|C_m| · d_card)‎</w:t>
+      </w:r>
+      <w:r>
+        <w:rPr>
+          <w:rFonts w:hint="cs" w:ascii="B Mitra" w:hAnsi="B Mitra" w:cs="B Mitra"/>
+          <w:sz w:val="18"/>
+          <w:rtl/>
+          <w:szCs w:val="18"/>
+        </w:rPr>
+        <w:t xml:space="preserve"> استخراج می‌شود:</w:t>
       </w:r>
     </w:p>
     <w:p>
@@ -2461,7 +2551,7 @@
           <w:sz w:val="17"/>
           <w:szCs w:val="17"/>
         </w:rPr>
-        <w:t>‎λ = 0.65‎</w:t>
+        <w:t>‎λ = 0.65‎</w:t>
       </w:r>
       <w:r>
         <w:rPr>
@@ -2479,142 +2569,52 @@
           <w:sz w:val="17"/>
           <w:szCs w:val="17"/>
         </w:rPr>
-        <w:t>‎Top-K‎</w:t>
-      </w:r>
-      <w:r>
-        <w:rPr>
-          <w:rFonts w:hint="cs" w:ascii="B Mitra" w:hAnsi="B Mitra" w:cs="B Mitra"/>
-          <w:sz w:val="18"/>
-          <w:rtl/>
-          <w:szCs w:val="18"/>
-        </w:rPr>
-        <w:t xml:space="preserve"> (</w:t>
-      </w:r>
-      <w:r>
-        <w:rPr>
-          <w:rFonts w:ascii="Times New Roman" w:hAnsi="Times New Roman" w:cs="Times New Roman"/>
-          <w:bidi w:val="0"/>
-          <w:sz w:val="17"/>
-          <w:szCs w:val="17"/>
-        </w:rPr>
-        <w:t>‎K=6‎</w:t>
-      </w:r>
-      <w:r>
-        <w:rPr>
-          <w:rFonts w:hint="cs" w:ascii="B Mitra" w:hAnsi="B Mitra" w:cs="B Mitra"/>
-          <w:sz w:val="18"/>
-          <w:rtl/>
-          <w:szCs w:val="18"/>
-        </w:rPr>
-        <w:t xml:space="preserve">) را در مرتبه </w:t>
-      </w:r>
-      <w:r>
-        <w:rPr>
-          <w:rFonts w:ascii="Times New Roman" w:hAnsi="Times New Roman" w:cs="Times New Roman"/>
-          <w:bidi w:val="0"/>
-          <w:sz w:val="17"/>
-          <w:szCs w:val="17"/>
-        </w:rPr>
-        <w:t>‎O‎</w:t>
-      </w:r>
-      <w:r>
-        <w:rPr>
-          <w:rFonts w:hint="cs" w:ascii="B Mitra" w:hAnsi="B Mitra" w:cs="B Mitra"/>
-          <w:sz w:val="18"/>
-          <w:rtl/>
-          <w:szCs w:val="18"/>
-        </w:rPr>
-        <w:t>(|</w:t>
-      </w:r>
-      <w:r>
-        <w:rPr>
-          <w:rFonts w:ascii="Times New Roman" w:hAnsi="Times New Roman" w:cs="Times New Roman"/>
-          <w:bidi w:val="0"/>
-          <w:sz w:val="17"/>
-          <w:szCs w:val="17"/>
-        </w:rPr>
-        <w:t>‎C‎</w:t>
-      </w:r>
-      <w:r>
-        <w:rPr>
-          <w:rFonts w:hint="cs" w:ascii="B Mitra" w:hAnsi="B Mitra" w:cs="B Mitra"/>
-          <w:sz w:val="18"/>
-          <w:rtl/>
-          <w:szCs w:val="18"/>
-        </w:rPr>
-        <w:t>(</w:t>
-      </w:r>
-      <w:r>
-        <w:rPr>
-          <w:rFonts w:ascii="Times New Roman" w:hAnsi="Times New Roman" w:cs="Times New Roman"/>
-          <w:bidi w:val="0"/>
-          <w:sz w:val="17"/>
-          <w:szCs w:val="17"/>
-        </w:rPr>
-        <w:t>‎m‎</w:t>
-      </w:r>
-      <w:r>
-        <w:rPr>
-          <w:rFonts w:hint="cs" w:ascii="B Mitra" w:hAnsi="B Mitra" w:cs="B Mitra"/>
-          <w:sz w:val="18"/>
-          <w:rtl/>
-          <w:szCs w:val="18"/>
-        </w:rPr>
-        <w:t xml:space="preserve">)| </w:t>
-      </w:r>
-      <w:r>
-        <w:rPr>
-          <w:rFonts w:ascii="Times New Roman" w:hAnsi="Times New Roman" w:cs="Times New Roman"/>
-          <w:bidi w:val="0"/>
-          <w:sz w:val="17"/>
-          <w:szCs w:val="17"/>
-        </w:rPr>
-        <w:t>‎log K‎</w:t>
-      </w:r>
-      <w:r>
-        <w:rPr>
-          <w:rFonts w:hint="cs" w:ascii="B Mitra" w:hAnsi="B Mitra" w:cs="B Mitra"/>
-          <w:sz w:val="18"/>
-          <w:rtl/>
-          <w:szCs w:val="18"/>
-        </w:rPr>
-        <w:t xml:space="preserve">) با پیچیدگی کاندیدایابی محدود به </w:t>
-      </w:r>
-      <w:r>
-        <w:rPr>
-          <w:rFonts w:ascii="Times New Roman" w:hAnsi="Times New Roman" w:cs="Times New Roman"/>
-          <w:bidi w:val="0"/>
-          <w:sz w:val="17"/>
-          <w:szCs w:val="17"/>
-        </w:rPr>
-        <w:t>‎O‎</w:t>
-      </w:r>
-      <w:r>
-        <w:rPr>
-          <w:rFonts w:hint="cs" w:ascii="B Mitra" w:hAnsi="B Mitra" w:cs="B Mitra"/>
-          <w:sz w:val="18"/>
-          <w:rtl/>
-          <w:szCs w:val="18"/>
-        </w:rPr>
-        <w:t>(|</w:t>
-      </w:r>
-      <w:r>
-        <w:rPr>
-          <w:rFonts w:ascii="Times New Roman" w:hAnsi="Times New Roman" w:cs="Times New Roman"/>
-          <w:bidi w:val="0"/>
-          <w:sz w:val="17"/>
-          <w:szCs w:val="17"/>
-        </w:rPr>
-        <w:t>‎M| · K · d_avg‎</w:t>
-      </w:r>
-      <w:r>
-        <w:rPr>
-          <w:rFonts w:hint="cs" w:ascii="B Mitra" w:hAnsi="B Mitra" w:cs="B Mitra"/>
-          <w:sz w:val="18"/>
-          <w:rtl/>
-          <w:szCs w:val="18"/>
-        </w:rPr>
-        <w:t xml:space="preserve">) استخراج می‌نماید. از آنجا که رابطه انتخاب </w:t>
+        <w:t>‎Top-K (K=6)‎</w:t>
+      </w:r>
+      <w:r>
+        <w:rPr>
+          <w:rFonts w:hint="cs" w:ascii="B Mitra" w:hAnsi="B Mitra" w:cs="B Mitra"/>
+          <w:sz w:val="18"/>
+          <w:rtl/>
+          <w:szCs w:val="18"/>
+        </w:rPr>
+        <w:t xml:space="preserve"> را در مرتبه </w:t>
+      </w:r>
+      <w:r>
+        <w:rPr>
+          <w:rFonts w:ascii="Times New Roman" w:hAnsi="Times New Roman" w:cs="Times New Roman"/>
+          <w:bidi w:val="0"/>
+          <w:sz w:val="17"/>
+          <w:szCs w:val="17"/>
+        </w:rPr>
+        <w:t>‎O(|C(m)| log K)‎</w:t>
+      </w:r>
+      <w:r>
+        <w:rPr>
+          <w:rFonts w:hint="cs" w:ascii="B Mitra" w:hAnsi="B Mitra" w:cs="B Mitra"/>
+          <w:sz w:val="18"/>
+          <w:rtl/>
+          <w:szCs w:val="18"/>
+        </w:rPr>
+        <w:t xml:space="preserve"> با پیچیدگی کاندیدایابی محدود به </w:t>
+      </w:r>
+      <w:r>
+        <w:rPr>
+          <w:rFonts w:ascii="Times New Roman" w:hAnsi="Times New Roman" w:cs="Times New Roman"/>
+          <w:bidi w:val="0"/>
+          <w:sz w:val="17"/>
+          <w:szCs w:val="17"/>
+        </w:rPr>
+        <w:t>‎O(|M| · K · d_avg)‎</w:t>
+      </w:r>
+      <w:r>
+        <w:rPr>
+          <w:rFonts w:hint="cs" w:ascii="B Mitra" w:hAnsi="B Mitra" w:cs="B Mitra"/>
+          <w:sz w:val="18"/>
+          <w:rtl/>
+          <w:szCs w:val="18"/>
+        </w:rPr>
+        <w:t xml:space="preserve"> استخراج می‌نماید. از آنجا که رابطه انتخاب </w:t>
       </w:r>
       <w:r>
         <w:rPr>
@@ -2692,7 +2692,25 @@
           <w:sz w:val="17"/>
           <w:szCs w:val="17"/>
         </w:rPr>
-        <w:t>‎4, 5]‎</w:t>
+        <w:t>‎4‎</w:t>
+      </w:r>
+      <w:r>
+        <w:rPr>
+          <w:rFonts w:hint="cs" w:ascii="B Mitra" w:hAnsi="B Mitra" w:cs="B Mitra"/>
+          <w:sz w:val="18"/>
+          <w:rtl/>
+          <w:szCs w:val="18"/>
+        </w:rPr>
+        <w:t xml:space="preserve">, </w:t>
+      </w:r>
+      <w:r>
+        <w:rPr>
+          <w:rFonts w:ascii="Times New Roman" w:hAnsi="Times New Roman" w:cs="Times New Roman"/>
+          <w:bidi w:val="0"/>
+          <w:sz w:val="17"/>
+          <w:szCs w:val="17"/>
+        </w:rPr>
+        <w:t>‎5]‎</w:t>
       </w:r>
       <w:r>
         <w:rPr>
@@ -2798,70 +2816,34 @@
           <w:sz w:val="17"/>
           <w:szCs w:val="17"/>
         </w:rPr>
-        <w:t>‎d‎</w:t>
-      </w:r>
-      <w:r>
-        <w:rPr>
-          <w:rFonts w:hint="cs" w:ascii="B Mitra" w:hAnsi="B Mitra" w:cs="B Mitra"/>
-          <w:sz w:val="18"/>
-          <w:rtl/>
-          <w:szCs w:val="18"/>
-        </w:rPr>
-        <w:t>(</w:t>
-      </w:r>
-      <w:r>
-        <w:rPr>
-          <w:rFonts w:ascii="Times New Roman" w:hAnsi="Times New Roman" w:cs="Times New Roman"/>
-          <w:bidi w:val="0"/>
-          <w:sz w:val="17"/>
-          <w:szCs w:val="17"/>
-        </w:rPr>
-        <w:t>‎m‎</w:t>
-      </w:r>
-      <w:r>
-        <w:rPr>
-          <w:rFonts w:hint="cs" w:ascii="B Mitra" w:hAnsi="B Mitra" w:cs="B Mitra"/>
-          <w:sz w:val="18"/>
-          <w:rtl/>
-          <w:szCs w:val="18"/>
-        </w:rPr>
-        <w:t xml:space="preserve">) درجه گره، </w:t>
-      </w:r>
-      <w:r>
-        <w:rPr>
-          <w:rFonts w:ascii="Times New Roman" w:hAnsi="Times New Roman" w:cs="Times New Roman"/>
-          <w:bidi w:val="0"/>
-          <w:sz w:val="17"/>
-          <w:szCs w:val="17"/>
-        </w:rPr>
-        <w:t>‎Δ‎</w:t>
-      </w:r>
-      <w:r>
-        <w:rPr>
-          <w:rFonts w:hint="cs" w:ascii="B Mitra" w:hAnsi="B Mitra" w:cs="B Mitra"/>
-          <w:sz w:val="18"/>
-          <w:rtl/>
-          <w:szCs w:val="18"/>
-        </w:rPr>
-        <w:t>(</w:t>
-      </w:r>
-      <w:r>
-        <w:rPr>
-          <w:rFonts w:ascii="Times New Roman" w:hAnsi="Times New Roman" w:cs="Times New Roman"/>
-          <w:bidi w:val="0"/>
-          <w:sz w:val="17"/>
-          <w:szCs w:val="17"/>
-        </w:rPr>
-        <w:t>‎m, j‎</w:t>
-      </w:r>
-      <w:r>
-        <w:rPr>
-          <w:rFonts w:hint="cs" w:ascii="B Mitra" w:hAnsi="B Mitra" w:cs="B Mitra"/>
-          <w:sz w:val="18"/>
-          <w:rtl/>
-          <w:szCs w:val="18"/>
-        </w:rPr>
-        <w:t>) تعداد مثلث‌های مشترک و مخرج رادیکالی جهت جلوگیری از غلبه گره‌های متراکم مرکزی پیشنهاد شده است. انحنا وزن همتایان را طبق رابطه (</w:t>
+        <w:t>‎d(m)‎</w:t>
+      </w:r>
+      <w:r>
+        <w:rPr>
+          <w:rFonts w:hint="cs" w:ascii="B Mitra" w:hAnsi="B Mitra" w:cs="B Mitra"/>
+          <w:sz w:val="18"/>
+          <w:rtl/>
+          <w:szCs w:val="18"/>
+        </w:rPr>
+        <w:t xml:space="preserve"> درجه گره، </w:t>
+      </w:r>
+      <w:r>
+        <w:rPr>
+          <w:rFonts w:ascii="Times New Roman" w:hAnsi="Times New Roman" w:cs="Times New Roman"/>
+          <w:bidi w:val="0"/>
+          <w:sz w:val="17"/>
+          <w:szCs w:val="17"/>
+        </w:rPr>
+        <w:t>‎Δ(m, j)‎</w:t>
+      </w:r>
+      <w:r>
+        <w:rPr>
+          <w:rFonts w:hint="cs" w:ascii="B Mitra" w:hAnsi="B Mitra" w:cs="B Mitra"/>
+          <w:sz w:val="18"/>
+          <w:rtl/>
+          <w:szCs w:val="18"/>
+        </w:rPr>
+        <w:t xml:space="preserve"> تعداد مثلث‌های مشترک و مخرج رادیکالی جهت جلوگیری از غلبه گره‌های متراکم مرکزی پیشنهاد شده است. انحنا وزن همتایان را طبق رابطه (</w:t>
       </w:r>
       <w:r>
         <w:rPr>
@@ -3014,7 +2996,7 @@
           <w:sz w:val="17"/>
           <w:szCs w:val="17"/>
         </w:rPr>
-        <w:t>‎η = 0.25‎</w:t>
+        <w:t>‎η = 0.25‎</w:t>
       </w:r>
       <w:r>
         <w:rPr>
@@ -3168,61 +3150,25 @@
           <w:rtl/>
           <w:szCs w:val="18"/>
         </w:rPr>
-        <w:t xml:space="preserve"> است. داده‌های تراکنشی بیش‌پراکندگی شدید نشان می‌دهند (</w:t>
-      </w:r>
-      <w:r>
-        <w:rPr>
-          <w:rFonts w:ascii="Times New Roman" w:hAnsi="Times New Roman" w:cs="Times New Roman"/>
-          <w:bidi w:val="0"/>
-          <w:sz w:val="17"/>
-          <w:szCs w:val="17"/>
-        </w:rPr>
-        <w:t>‎Var‎</w:t>
-      </w:r>
-      <w:r>
-        <w:rPr>
-          <w:rFonts w:hint="cs" w:ascii="B Mitra" w:hAnsi="B Mitra" w:cs="B Mitra"/>
-          <w:sz w:val="18"/>
-          <w:rtl/>
-          <w:szCs w:val="18"/>
-        </w:rPr>
-        <w:t>(</w:t>
-      </w:r>
-      <w:r>
-        <w:rPr>
-          <w:rFonts w:ascii="Times New Roman" w:hAnsi="Times New Roman" w:cs="Times New Roman"/>
-          <w:bidi w:val="0"/>
-          <w:sz w:val="17"/>
-          <w:szCs w:val="17"/>
-        </w:rPr>
-        <w:t>‎Y‎</w:t>
-      </w:r>
-      <w:r>
-        <w:rPr>
-          <w:rFonts w:hint="cs" w:ascii="B Mitra" w:hAnsi="B Mitra" w:cs="B Mitra"/>
-          <w:sz w:val="18"/>
-          <w:rtl/>
-          <w:szCs w:val="18"/>
-        </w:rPr>
-        <w:t>)/</w:t>
-      </w:r>
-      <w:r>
-        <w:rPr>
-          <w:rFonts w:ascii="Times New Roman" w:hAnsi="Times New Roman" w:cs="Times New Roman"/>
-          <w:bidi w:val="0"/>
-          <w:sz w:val="17"/>
-          <w:szCs w:val="17"/>
-        </w:rPr>
-        <w:t>‎E[Y] ≈ 3.24‎</w:t>
-      </w:r>
-      <w:r>
-        <w:rPr>
-          <w:rFonts w:hint="cs" w:ascii="B Mitra" w:hAnsi="B Mitra" w:cs="B Mitra"/>
-          <w:sz w:val="18"/>
-          <w:rtl/>
-          <w:szCs w:val="18"/>
-        </w:rPr>
-        <w:t xml:space="preserve">) که استفاده از توزیع دوجمله‌ای منفی را نسبت به مدل پواسون توجیه می‌کند. لذا مدل بر مبنای معماری توجه گراف زمانی برگرفته از </w:t>
+        <w:t xml:space="preserve"> است. داده‌های تراکنشی بیش‌پراکندگی شدید نشان می‌دهند </w:t>
+      </w:r>
+      <w:r>
+        <w:rPr>
+          <w:rFonts w:ascii="Times New Roman" w:hAnsi="Times New Roman" w:cs="Times New Roman"/>
+          <w:bidi w:val="0"/>
+          <w:sz w:val="17"/>
+          <w:szCs w:val="17"/>
+        </w:rPr>
+        <w:t>‎(Var(Y)/E[Y] ≈ 3.24)‎</w:t>
+      </w:r>
+      <w:r>
+        <w:rPr>
+          <w:rFonts w:hint="cs" w:ascii="B Mitra" w:hAnsi="B Mitra" w:cs="B Mitra"/>
+          <w:sz w:val="18"/>
+          <w:rtl/>
+          <w:szCs w:val="18"/>
+        </w:rPr>
+        <w:t xml:space="preserve"> که استفاده از توزیع دوجمله‌ای منفی را نسبت به مدل پواسون توجیه می‌کند. لذا مدل بر مبنای معماری توجه گراف زمانی برگرفته از </w:t>
       </w:r>
       <w:r>
         <w:rPr>
@@ -3348,16 +3294,16 @@
           <w:sz w:val="17"/>
           <w:szCs w:val="17"/>
         </w:rPr>
-        <w:t>‎μ‎</w:t>
-      </w:r>
-      <w:r>
-        <w:rPr>
-          <w:rFonts w:hint="cs" w:ascii="B Mitra" w:hAnsi="B Mitra" w:cs="B Mitra"/>
-          <w:sz w:val="18"/>
-          <w:rtl/>
-          <w:szCs w:val="18"/>
-        </w:rPr>
-        <w:t xml:space="preserve">̂ میانگین برآوردی و </w:t>
+        <w:t>‎μ̂‎</w:t>
+      </w:r>
+      <w:r>
+        <w:rPr>
+          <w:rFonts w:hint="cs" w:ascii="B Mitra" w:hAnsi="B Mitra" w:cs="B Mitra"/>
+          <w:sz w:val="18"/>
+          <w:rtl/>
+          <w:szCs w:val="18"/>
+        </w:rPr>
+        <w:t xml:space="preserve"> میانگین برآوردی و </w:t>
       </w:r>
       <w:r>
         <w:rPr>
@@ -3593,7 +3539,7 @@
           <w:sz w:val="17"/>
           <w:szCs w:val="17"/>
         </w:rPr>
-        <w:t>‎α = 0.15‎</w:t>
+        <w:t>‎α = 0.15‎</w:t>
       </w:r>
       <w:r>
         <w:rPr>
@@ -3757,16 +3703,16 @@
           <w:sz w:val="17"/>
           <w:szCs w:val="17"/>
         </w:rPr>
-        <w:t>‎Coverage = 86.2 ± 3.1%‎</w:t>
-      </w:r>
-      <w:r>
-        <w:rPr>
-          <w:rFonts w:hint="cs" w:ascii="B Mitra" w:hAnsi="B Mitra" w:cs="B Mitra"/>
-          <w:sz w:val="18"/>
-          <w:rtl/>
-          <w:szCs w:val="18"/>
-        </w:rPr>
-        <w:t xml:space="preserve"> با عرض بازه میانگین ۴٫۶ ± ۰٫۳ تراکنش) اعتبار تجربی واسنجی را تایید می‌نماید.</w:t>
+        <w:t>‎Coverage = 86.2 ± 3.1‎</w:t>
+      </w:r>
+      <w:r>
+        <w:rPr>
+          <w:rFonts w:hint="cs" w:ascii="B Mitra" w:hAnsi="B Mitra" w:cs="B Mitra"/>
+          <w:sz w:val="18"/>
+          <w:rtl/>
+          <w:szCs w:val="18"/>
+        </w:rPr>
+        <w:t>% با عرض بازه میانگین ۴٫۶ ± ۰٫۳ تراکنش) اعتبار تجربی واسنجی را تایید می‌نماید.</w:t>
       </w:r>
     </w:p>
     <w:p>
@@ -3832,7 +3778,7 @@
           <w:sz w:val="17"/>
           <w:szCs w:val="17"/>
         </w:rPr>
-        <w:t>‎q_j = q_0.85‎</w:t>
+        <w:t>‎q_j = q_0.85‎</w:t>
       </w:r>
       <w:r>
         <w:rPr>
@@ -4340,43 +4286,25 @@
           <w:rtl/>
           <w:szCs w:val="18"/>
         </w:rPr>
-        <w:t>که در آن [</w:t>
-      </w:r>
-      <w:r>
-        <w:rPr>
-          <w:rFonts w:ascii="Times New Roman" w:hAnsi="Times New Roman" w:cs="Times New Roman"/>
-          <w:bidi w:val="0"/>
-          <w:sz w:val="17"/>
-          <w:szCs w:val="17"/>
-        </w:rPr>
-        <w:t>‎x]_+ = max‎</w:t>
-      </w:r>
-      <w:r>
-        <w:rPr>
-          <w:rFonts w:hint="cs" w:ascii="B Mitra" w:hAnsi="B Mitra" w:cs="B Mitra"/>
-          <w:sz w:val="18"/>
-          <w:rtl/>
-          <w:szCs w:val="18"/>
-        </w:rPr>
-        <w:t>(</w:t>
-      </w:r>
-      <w:r>
-        <w:rPr>
-          <w:rFonts w:ascii="Times New Roman" w:hAnsi="Times New Roman" w:cs="Times New Roman"/>
-          <w:bidi w:val="0"/>
-          <w:sz w:val="17"/>
-          <w:szCs w:val="17"/>
-        </w:rPr>
-        <w:t>‎0, x‎</w:t>
-      </w:r>
-      <w:r>
-        <w:rPr>
-          <w:rFonts w:hint="cs" w:ascii="B Mitra" w:hAnsi="B Mitra" w:cs="B Mitra"/>
-          <w:sz w:val="18"/>
-          <w:rtl/>
-          <w:szCs w:val="18"/>
-        </w:rPr>
-        <w:t xml:space="preserve">)، </w:t>
+        <w:t xml:space="preserve">که در آن </w:t>
+      </w:r>
+      <w:r>
+        <w:rPr>
+          <w:rFonts w:ascii="Times New Roman" w:hAnsi="Times New Roman" w:cs="Times New Roman"/>
+          <w:bidi w:val="0"/>
+          <w:sz w:val="17"/>
+          <w:szCs w:val="17"/>
+        </w:rPr>
+        <w:t>‎[x]_+ = max(0, x)‎</w:t>
+      </w:r>
+      <w:r>
+        <w:rPr>
+          <w:rFonts w:hint="cs" w:ascii="B Mitra" w:hAnsi="B Mitra" w:cs="B Mitra"/>
+          <w:sz w:val="18"/>
+          <w:rtl/>
+          <w:szCs w:val="18"/>
+        </w:rPr>
+        <w:t xml:space="preserve">، </w:t>
       </w:r>
       <w:r>
         <w:rPr>
@@ -4433,7 +4361,7 @@
           <w:sz w:val="17"/>
           <w:szCs w:val="17"/>
         </w:rPr>
-        <w:t>‎κ = 18‎</w:t>
+        <w:t>‎κ = 18‎</w:t>
       </w:r>
       <w:r>
         <w:rPr>
@@ -4541,16 +4469,16 @@
           <w:sz w:val="17"/>
           <w:szCs w:val="17"/>
         </w:rPr>
-        <w:t>‎μ‎</w:t>
-      </w:r>
-      <w:r>
-        <w:rPr>
-          <w:rFonts w:hint="cs" w:ascii="B Mitra" w:hAnsi="B Mitra" w:cs="B Mitra"/>
-          <w:sz w:val="18"/>
-          <w:rtl/>
-          <w:szCs w:val="18"/>
-        </w:rPr>
-        <w:t xml:space="preserve">̂ و کران بالای کالیبره‌شده </w:t>
+        <w:t>‎μ̂‎</w:t>
+      </w:r>
+      <w:r>
+        <w:rPr>
+          <w:rFonts w:hint="cs" w:ascii="B Mitra" w:hAnsi="B Mitra" w:cs="B Mitra"/>
+          <w:sz w:val="18"/>
+          <w:rtl/>
+          <w:szCs w:val="18"/>
+        </w:rPr>
+        <w:t xml:space="preserve"> و کران بالای کالیبره‌شده </w:t>
       </w:r>
       <w:r>
         <w:rPr>
@@ -4658,7 +4586,7 @@
           <w:sz w:val="17"/>
           <w:szCs w:val="17"/>
         </w:rPr>
-        <w:t>‎Y = 100‎</w:t>
+        <w:t>‎Y = 100‎</w:t>
       </w:r>
       <w:r>
         <w:rPr>
@@ -4676,25 +4604,7 @@
           <w:sz w:val="17"/>
           <w:szCs w:val="17"/>
         </w:rPr>
-        <w:t>‎μ‎</w:t>
-      </w:r>
-      <w:r>
-        <w:rPr>
-          <w:rFonts w:hint="cs" w:ascii="B Mitra" w:hAnsi="B Mitra" w:cs="B Mitra"/>
-          <w:sz w:val="18"/>
-          <w:rtl/>
-          <w:szCs w:val="18"/>
-        </w:rPr>
-        <w:t xml:space="preserve">̂ = </w:t>
-      </w:r>
-      <w:r>
-        <w:rPr>
-          <w:rFonts w:ascii="Times New Roman" w:hAnsi="Times New Roman" w:cs="Times New Roman"/>
-          <w:bidi w:val="0"/>
-          <w:sz w:val="17"/>
-          <w:szCs w:val="17"/>
-        </w:rPr>
-        <w:t>‎105.0‎</w:t>
+        <w:t>‎μ̂ = 105.0‎</w:t>
       </w:r>
       <w:r>
         <w:rPr>
@@ -4712,7 +4622,7 @@
           <w:sz w:val="17"/>
           <w:szCs w:val="17"/>
         </w:rPr>
-        <w:t>‎U = 112.0‎</w:t>
+        <w:t>‎U = 112.0‎</w:t>
       </w:r>
       <w:r>
         <w:rPr>
@@ -4730,7 +4640,7 @@
           <w:sz w:val="17"/>
           <w:szCs w:val="17"/>
         </w:rPr>
-        <w:t>‎B^G = 170.0‎</w:t>
+        <w:t>‎B^G = 170.0‎</w:t>
       </w:r>
       <w:r>
         <w:rPr>
@@ -4748,7 +4658,7 @@
           <w:sz w:val="17"/>
           <w:szCs w:val="17"/>
         </w:rPr>
-        <w:t>‎Q = 0.90‎</w:t>
+        <w:t>‎Q = 0.90‎</w:t>
       </w:r>
       <w:r>
         <w:rPr>
@@ -5001,7 +4911,7 @@
           <w:sz w:val="17"/>
           <w:szCs w:val="17"/>
         </w:rPr>
-        <w:t>‎TP = 0‎</w:t>
+        <w:t>‎TP = 0‎</w:t>
       </w:r>
       <w:r>
         <w:rPr>
@@ -5052,7 +4962,7 @@
           <w:sz w:val="17"/>
           <w:szCs w:val="17"/>
         </w:rPr>
-        <w:t>‎λ = 0.65‎</w:t>
+        <w:t>‎λ = 0.65‎</w:t>
       </w:r>
       <w:r>
         <w:rPr>
@@ -5070,7 +4980,7 @@
           <w:sz w:val="17"/>
           <w:szCs w:val="17"/>
         </w:rPr>
-        <w:t>‎η = 0.25‎</w:t>
+        <w:t>‎η = 0.25‎</w:t>
       </w:r>
       <w:r>
         <w:rPr>
@@ -5088,7 +4998,7 @@
           <w:sz w:val="17"/>
           <w:szCs w:val="17"/>
         </w:rPr>
-        <w:t>‎κ = 18.0‎</w:t>
+        <w:t>‎κ = 18.0‎</w:t>
       </w:r>
       <w:r>
         <w:rPr>
@@ -5106,7 +5016,7 @@
           <w:sz w:val="17"/>
           <w:szCs w:val="17"/>
         </w:rPr>
-        <w:t>‎K = 6‎</w:t>
+        <w:t>‎K = 6‎</w:t>
       </w:r>
       <w:r>
         <w:rPr>
@@ -5124,7 +5034,7 @@
           <w:sz w:val="17"/>
           <w:szCs w:val="17"/>
         </w:rPr>
-        <w:t>‎α = 0.15‎</w:t>
+        <w:t>‎α = 0.15‎</w:t>
       </w:r>
       <w:r>
         <w:rPr>
@@ -5142,7 +5052,7 @@
           <w:sz w:val="17"/>
           <w:szCs w:val="17"/>
         </w:rPr>
-        <w:t>‎K ∈ [3, 10]‎</w:t>
+        <w:t>‎K ∈ [3, 10]‎</w:t>
       </w:r>
       <w:r>
         <w:rPr>
@@ -5178,7 +5088,7 @@
           <w:sz w:val="17"/>
           <w:szCs w:val="17"/>
         </w:rPr>
-        <w:t>‎η ∈ [0.0, 0.5]‎</w:t>
+        <w:t>‎η ∈ [0.0, 0.5]‎</w:t>
       </w:r>
       <w:r>
         <w:rPr>
@@ -5214,7 +5124,7 @@
           <w:sz w:val="17"/>
           <w:szCs w:val="17"/>
         </w:rPr>
-        <w:t>‎κ ∈ [10, 30]‎</w:t>
+        <w:t>‎κ ∈ [10, 30]‎</w:t>
       </w:r>
       <w:r>
         <w:rPr>
@@ -7926,16 +7836,16 @@
           <w:sz w:val="17"/>
           <w:szCs w:val="17"/>
         </w:rPr>
-        <w:t>‎K ∈‎</w:t>
-      </w:r>
-      <w:r>
-        <w:rPr>
-          <w:rFonts w:hint="cs" w:ascii="B Mitra" w:hAnsi="B Mitra" w:cs="B Mitra"/>
-          <w:sz w:val="18"/>
-          <w:rtl/>
-          <w:szCs w:val="18"/>
-        </w:rPr>
-        <w:t xml:space="preserve"> {۱۰, ۲۰, ۳۵, ۵۰} گزارش می‌نماید.</w:t>
+        <w:t>‎K ∈ {۱۰, ۲۰, ۳۵, ۵۰}‎</w:t>
+      </w:r>
+      <w:r>
+        <w:rPr>
+          <w:rFonts w:hint="cs" w:ascii="B Mitra" w:hAnsi="B Mitra" w:cs="B Mitra"/>
+          <w:sz w:val="18"/>
+          <w:rtl/>
+          <w:szCs w:val="18"/>
+        </w:rPr>
+        <w:t xml:space="preserve"> گزارش می‌نماید.</w:t>
       </w:r>
     </w:p>
     <w:p>
@@ -11186,7 +11096,7 @@
           <w:sz w:val="17"/>
           <w:szCs w:val="17"/>
         </w:rPr>
-        <w:t>‎K = 10‎</w:t>
+        <w:t>‎K = 10‎</w:t>
       </w:r>
       <w:r>
         <w:rPr>
@@ -11258,7 +11168,7 @@
           <w:sz w:val="17"/>
           <w:szCs w:val="17"/>
         </w:rPr>
-        <w:t>‎K = 20‎</w:t>
+        <w:t>‎K = 20‎</w:t>
       </w:r>
       <w:r>
         <w:rPr>
@@ -11294,7 +11204,7 @@
           <w:sz w:val="17"/>
           <w:szCs w:val="17"/>
         </w:rPr>
-        <w:t>‎K = 20‎</w:t>
+        <w:t>‎K = 20‎</w:t>
       </w:r>
       <w:r>
         <w:rPr>
@@ -11312,7 +11222,7 @@
           <w:sz w:val="17"/>
           <w:szCs w:val="17"/>
         </w:rPr>
-        <w:t>‎K = 35‎</w:t>
+        <w:t>‎K = 35‎</w:t>
       </w:r>
       <w:r>
         <w:rPr>
@@ -11330,7 +11240,7 @@
           <w:sz w:val="17"/>
           <w:szCs w:val="17"/>
         </w:rPr>
-        <w:t>‎K = 50‎</w:t>
+        <w:t>‎K = 50‎</w:t>
       </w:r>
       <w:r>
         <w:rPr>
@@ -11366,7 +11276,7 @@
           <w:sz w:val="17"/>
           <w:szCs w:val="17"/>
         </w:rPr>
-        <w:t>‎p_adj &lt; 0.05‎</w:t>
+        <w:t>‎p_adj &lt; 0.05‎</w:t>
       </w:r>
       <w:r>
         <w:rPr>
@@ -11384,7 +11294,7 @@
           <w:sz w:val="17"/>
           <w:szCs w:val="17"/>
         </w:rPr>
-        <w:t>‎K = 10‎</w:t>
+        <w:t>‎K = 10‎</w:t>
       </w:r>
       <w:r>
         <w:rPr>
@@ -11402,7 +11312,7 @@
           <w:sz w:val="17"/>
           <w:szCs w:val="17"/>
         </w:rPr>
-        <w:t>‎p = 0.015‎</w:t>
+        <w:t>‎p = 0.015‎</w:t>
       </w:r>
       <w:r>
         <w:rPr>
@@ -11420,7 +11330,7 @@
           <w:sz w:val="17"/>
           <w:szCs w:val="17"/>
         </w:rPr>
-        <w:t>‎p = 0.039‎</w:t>
+        <w:t>‎p = 0.039‎</w:t>
       </w:r>
       <w:r>
         <w:rPr>
@@ -11438,7 +11348,7 @@
           <w:sz w:val="17"/>
           <w:szCs w:val="17"/>
         </w:rPr>
-        <w:t>‎K = 20‎</w:t>
+        <w:t>‎K = 20‎</w:t>
       </w:r>
       <w:r>
         <w:rPr>
@@ -11456,7 +11366,7 @@
           <w:sz w:val="17"/>
           <w:szCs w:val="17"/>
         </w:rPr>
-        <w:t>‎p = 0.005‎</w:t>
+        <w:t>‎p = 0.005‎</w:t>
       </w:r>
       <w:r>
         <w:rPr>
@@ -11474,7 +11384,7 @@
           <w:sz w:val="17"/>
           <w:szCs w:val="17"/>
         </w:rPr>
-        <w:t>‎p = 0.005‎</w:t>
+        <w:t>‎p = 0.005‎</w:t>
       </w:r>
       <w:r>
         <w:rPr>
@@ -11492,7 +11402,7 @@
           <w:sz w:val="17"/>
           <w:szCs w:val="17"/>
         </w:rPr>
-        <w:t>‎K = 35‎</w:t>
+        <w:t>‎K = 35‎</w:t>
       </w:r>
       <w:r>
         <w:rPr>
@@ -11510,7 +11420,7 @@
           <w:sz w:val="17"/>
           <w:szCs w:val="17"/>
         </w:rPr>
-        <w:t>‎p = 0.0488‎</w:t>
+        <w:t>‎p = 0.0488‎</w:t>
       </w:r>
       <w:r>
         <w:rPr>
@@ -11793,7 +11703,18 @@
                 <w:sz w:val="11"/>
                 <w:szCs w:val="11"/>
               </w:rPr>
-              <w:t>‎Weak-Support %‎</w:t>
+              <w:t>‎Weak-Support‎</w:t>
+            </w:r>
+            <w:r>
+              <w:rPr>
+                <w:rFonts w:hint="cs" w:ascii="B Mitra" w:hAnsi="B Mitra" w:cs="B Mitra"/>
+                <w:bCs/>
+                <w:b/>
+                <w:sz w:val="11"/>
+                <w:rtl/>
+                <w:szCs w:val="11"/>
+              </w:rPr>
+              <w:t xml:space="preserve"> %</w:t>
             </w:r>
           </w:p>
         </w:tc>
@@ -12562,7 +12483,7 @@
           <w:sz w:val="17"/>
           <w:szCs w:val="17"/>
         </w:rPr>
-        <w:t>‎TP = 0‎</w:t>
+        <w:t>‎TP = 0‎</w:t>
       </w:r>
       <w:r>
         <w:rPr>
@@ -13937,7 +13858,7 @@
           <w:sz w:val="17"/>
           <w:szCs w:val="17"/>
         </w:rPr>
-        <w:t>‎p = 0.0020‎</w:t>
+        <w:t>‎p = 0.0020‎</w:t>
       </w:r>
       <w:r>
         <w:rPr>
@@ -13955,7 +13876,7 @@
           <w:sz w:val="17"/>
           <w:szCs w:val="17"/>
         </w:rPr>
-        <w:t>‎p = 0.0840‎</w:t>
+        <w:t>‎p = 0.0840‎</w:t>
       </w:r>
       <w:r>
         <w:rPr>
@@ -14045,7 +13966,7 @@
           <w:sz w:val="17"/>
           <w:szCs w:val="17"/>
         </w:rPr>
-        <w:t>‎p = 0.0273‎</w:t>
+        <w:t>‎p = 0.0273‎</w:t>
       </w:r>
       <w:r>
         <w:rPr>
@@ -14081,7 +14002,7 @@
           <w:sz w:val="17"/>
           <w:szCs w:val="17"/>
         </w:rPr>
-        <w:t>‎Δ = ‎</w:t>
+        <w:t>‎Δ = ‎</w:t>
       </w:r>
       <w:r>
         <w:rPr>
@@ -14099,7 +14020,7 @@
           <w:sz w:val="17"/>
           <w:szCs w:val="17"/>
         </w:rPr>
-        <w:t>‎p = 0.8457‎</w:t>
+        <w:t>‎p = 0.8457‎</w:t>
       </w:r>
       <w:r>
         <w:rPr>
@@ -15654,7 +15575,7 @@
           <w:sz w:val="17"/>
           <w:szCs w:val="17"/>
         </w:rPr>
-        <w:t>‎Y ≥ 5‎</w:t>
+        <w:t>‎Y ≥ 5‎</w:t>
       </w:r>
       <w:r>
         <w:rPr>
@@ -15726,7 +15647,7 @@
           <w:sz w:val="17"/>
           <w:szCs w:val="17"/>
         </w:rPr>
-        <w:t>‎τ_a = 15‎</w:t>
+        <w:t>‎τ_a = 15‎</w:t>
       </w:r>
       <w:r>
         <w:rPr>
@@ -15882,34 +15803,16 @@
           <w:sz w:val="17"/>
           <w:szCs w:val="17"/>
         </w:rPr>
-        <w:t>‎O‎</w:t>
-      </w:r>
-      <w:r>
-        <w:rPr>
-          <w:rFonts w:hint="cs" w:ascii="B Mitra" w:hAnsi="B Mitra" w:cs="B Mitra"/>
-          <w:sz w:val="18"/>
-          <w:rtl/>
-          <w:szCs w:val="18"/>
-        </w:rPr>
-        <w:t>(|</w:t>
-      </w:r>
-      <w:r>
-        <w:rPr>
-          <w:rFonts w:ascii="Times New Roman" w:hAnsi="Times New Roman" w:cs="Times New Roman"/>
-          <w:bidi w:val="0"/>
-          <w:sz w:val="17"/>
-          <w:szCs w:val="17"/>
-        </w:rPr>
-        <w:t>‎M| · K · d_avg‎</w:t>
-      </w:r>
-      <w:r>
-        <w:rPr>
-          <w:rFonts w:hint="cs" w:ascii="B Mitra" w:hAnsi="B Mitra" w:cs="B Mitra"/>
-          <w:sz w:val="18"/>
-          <w:rtl/>
-          <w:szCs w:val="18"/>
-        </w:rPr>
-        <w:t>) محدود نموده و مقیاس‌پذیری عملیاتی روش را تأیید می‌کند.</w:t>
+        <w:t>‎O(|M| · K · d_avg)‎</w:t>
+      </w:r>
+      <w:r>
+        <w:rPr>
+          <w:rFonts w:hint="cs" w:ascii="B Mitra" w:hAnsi="B Mitra" w:cs="B Mitra"/>
+          <w:sz w:val="18"/>
+          <w:rtl/>
+          <w:szCs w:val="18"/>
+        </w:rPr>
+        <w:t xml:space="preserve"> محدود نموده و مقیاس‌پذیری عملیاتی روش را تأیید می‌کند.</w:t>
       </w:r>
     </w:p>
     <w:p>

</xml_diff>

<commit_message>
fix(paper_fa): populate Table 5 ablation study with audited Wilcoxon significance and delta values
</commit_message>
<xml_diff>
--- a/FA_From_Transactional_Data_to_Organizational_Intelligence.docx
+++ b/FA_From_Transactional_Data_to_Organizational_Intelligence.docx
@@ -1622,7 +1622,7 @@
       <w:r>
         <w:drawing>
           <wp:inline xmlns:a="http://schemas.openxmlformats.org/drawingml/2006/main" xmlns:pic="http://schemas.openxmlformats.org/drawingml/2006/picture">
-            <wp:extent cx="2736000" cy="727501"/>
+            <wp:extent cx="2736000" cy="1083975"/>
             <wp:docPr id="1" name="Picture 1"/>
             <wp:cNvGraphicFramePr>
               <a:graphicFrameLocks noChangeAspect="1"/>
@@ -1643,7 +1643,7 @@
                   <pic:spPr>
                     <a:xfrm>
                       <a:off x="0" y="0"/>
-                      <a:ext cx="2736000" cy="727501"/>
+                      <a:ext cx="2736000" cy="1083975"/>
                     </a:xfrm>
                     <a:prstGeom prst="rect"/>
                   </pic:spPr>
@@ -4749,7 +4749,7 @@
       <w:r>
         <w:drawing>
           <wp:inline xmlns:a="http://schemas.openxmlformats.org/drawingml/2006/main" xmlns:pic="http://schemas.openxmlformats.org/drawingml/2006/picture">
-            <wp:extent cx="2736000" cy="1060712"/>
+            <wp:extent cx="2736000" cy="1656141"/>
             <wp:docPr id="3" name="Picture 3"/>
             <wp:cNvGraphicFramePr>
               <a:graphicFrameLocks noChangeAspect="1"/>
@@ -4770,7 +4770,7 @@
                   <pic:spPr>
                     <a:xfrm>
                       <a:off x="0" y="0"/>
-                      <a:ext cx="2736000" cy="1060712"/>
+                      <a:ext cx="2736000" cy="1656141"/>
                     </a:xfrm>
                     <a:prstGeom prst="rect"/>
                   </pic:spPr>
@@ -5536,7 +5536,7 @@
                 <w:rtl/>
                 <w:szCs w:val="11"/>
               </w:rPr>
-              <w:t>۵٫۱۶</w:t>
+              <w:t>۴٫۴۱ ± ۰٫۲۰</w:t>
             </w:r>
           </w:p>
         </w:tc>
@@ -5564,7 +5564,7 @@
                 <w:rtl/>
                 <w:szCs w:val="11"/>
               </w:rPr>
-              <w:t>۶٫۹۸</w:t>
+              <w:t>۵٫۷۸ ± ۰٫۳۷</w:t>
             </w:r>
           </w:p>
         </w:tc>
@@ -5592,7 +5592,7 @@
                 <w:rtl/>
                 <w:szCs w:val="11"/>
               </w:rPr>
-              <w:t>۰</w:t>
+              <w:t>۳۲٫۴۰ ± ۱٫۴۹</w:t>
             </w:r>
           </w:p>
         </w:tc>
@@ -5690,7 +5690,7 @@
                 <w:rtl/>
                 <w:szCs w:val="11"/>
               </w:rPr>
-              <w:t>۴٫۳۸</w:t>
+              <w:t>۳٫۵۱ ± ۰٫۱۹</w:t>
             </w:r>
           </w:p>
         </w:tc>
@@ -5718,7 +5718,7 @@
                 <w:rtl/>
                 <w:szCs w:val="11"/>
               </w:rPr>
-              <w:t>۵٫۹۱</w:t>
+              <w:t>۴٫۵۸ ± ۰٫۲۸</w:t>
             </w:r>
           </w:p>
         </w:tc>
@@ -5746,7 +5746,7 @@
                 <w:rtl/>
                 <w:szCs w:val="11"/>
               </w:rPr>
-              <w:t>۰</w:t>
+              <w:t>۲۶٫۰۵ ± ۱٫۰۳</w:t>
             </w:r>
           </w:p>
         </w:tc>
@@ -5844,7 +5844,7 @@
                 <w:rtl/>
                 <w:szCs w:val="11"/>
               </w:rPr>
-              <w:t>۴٫۸۳</w:t>
+              <w:t>۳٫۴۱ ± ۰٫۱۶</w:t>
             </w:r>
           </w:p>
         </w:tc>
@@ -5872,7 +5872,7 @@
                 <w:rtl/>
                 <w:szCs w:val="11"/>
               </w:rPr>
-              <w:t>۶٫۴۶</w:t>
+              <w:t>۴٫۴۶ ± ۰٫۲۸</w:t>
             </w:r>
           </w:p>
         </w:tc>
@@ -5900,7 +5900,7 @@
                 <w:rtl/>
                 <w:szCs w:val="11"/>
               </w:rPr>
-              <w:t>۰</w:t>
+              <w:t>۲۵٫۴۲ ± ۰٫۹۲</w:t>
             </w:r>
           </w:p>
         </w:tc>
@@ -6016,7 +6016,7 @@
                 <w:rtl/>
                 <w:szCs w:val="11"/>
               </w:rPr>
-              <w:t>۴٫۶</w:t>
+              <w:t>۳٫۸۹ ± ۰٫۱۲</w:t>
             </w:r>
           </w:p>
         </w:tc>
@@ -6044,7 +6044,7 @@
                 <w:rtl/>
                 <w:szCs w:val="11"/>
               </w:rPr>
-              <w:t>۶٫۳</w:t>
+              <w:t>۵٫۳۱ ± ۰٫۴۲</w:t>
             </w:r>
           </w:p>
         </w:tc>
@@ -6072,7 +6072,7 @@
                 <w:rtl/>
                 <w:szCs w:val="11"/>
               </w:rPr>
-              <w:t>۰</w:t>
+              <w:t>۲۷٫۶۸ ± ۰٫۷۹</w:t>
             </w:r>
           </w:p>
         </w:tc>
@@ -6101,6 +6101,314 @@
                 <w:szCs w:val="11"/>
               </w:rPr>
               <w:t>—</w:t>
+            </w:r>
+          </w:p>
+        </w:tc>
+      </w:tr>
+      <w:tr>
+        <w:trPr>
+          <w:cantSplit/>
+        </w:trPr>
+        <w:tc>
+          <w:tcPr>
+            <w:tcW w:w="1850" w:type="dxa"/>
+            <w:tcMar>
+              <w:top w:w="12" w:type="dxa"/>
+              <w:bottom w:w="12" w:type="dxa"/>
+              <w:left w:w="8" w:type="dxa"/>
+              <w:right w:w="8" w:type="dxa"/>
+            </w:tcMar>
+            <w:noWrap/>
+          </w:tcPr>
+          <w:p>
+            <w:pPr>
+              <w:pStyle w:val="FigureText"/>
+              <w:spacing w:before="2" w:after="2"/>
+              <w:jc w:val="right"/>
+            </w:pPr>
+            <w:r>
+              <w:rPr>
+                <w:rFonts w:ascii="Times New Roman" w:hAnsi="Times New Roman" w:cs="Times New Roman"/>
+                <w:bidi w:val="0"/>
+                <w:sz w:val="11"/>
+                <w:szCs w:val="11"/>
+              </w:rPr>
+              <w:t>‎NB-GLM‎</w:t>
+            </w:r>
+            <w:r>
+              <w:rPr>
+                <w:rFonts w:hint="cs" w:ascii="B Mitra" w:hAnsi="B Mitra" w:cs="B Mitra"/>
+                <w:sz w:val="11"/>
+                <w:rtl/>
+                <w:szCs w:val="11"/>
+              </w:rPr>
+              <w:t xml:space="preserve"> (اثرات صنف)</w:t>
+            </w:r>
+          </w:p>
+        </w:tc>
+        <w:tc>
+          <w:tcPr>
+            <w:tcW w:w="700" w:type="dxa"/>
+            <w:tcMar>
+              <w:top w:w="12" w:type="dxa"/>
+              <w:bottom w:w="12" w:type="dxa"/>
+              <w:left w:w="8" w:type="dxa"/>
+              <w:right w:w="8" w:type="dxa"/>
+            </w:tcMar>
+            <w:noWrap/>
+          </w:tcPr>
+          <w:p>
+            <w:pPr>
+              <w:pStyle w:val="FigureText"/>
+              <w:spacing w:before="2" w:after="2"/>
+              <w:jc w:val="center"/>
+            </w:pPr>
+            <w:r>
+              <w:rPr>
+                <w:rFonts w:hint="cs" w:ascii="B Mitra" w:hAnsi="B Mitra" w:cs="B Mitra"/>
+                <w:sz w:val="11"/>
+                <w:rtl/>
+                <w:szCs w:val="11"/>
+              </w:rPr>
+              <w:t>۳٫۷۸ ± ۰٫۲۰</w:t>
+            </w:r>
+          </w:p>
+        </w:tc>
+        <w:tc>
+          <w:tcPr>
+            <w:tcW w:w="700" w:type="dxa"/>
+            <w:tcMar>
+              <w:top w:w="12" w:type="dxa"/>
+              <w:bottom w:w="12" w:type="dxa"/>
+              <w:left w:w="8" w:type="dxa"/>
+              <w:right w:w="8" w:type="dxa"/>
+            </w:tcMar>
+            <w:noWrap/>
+          </w:tcPr>
+          <w:p>
+            <w:pPr>
+              <w:pStyle w:val="FigureText"/>
+              <w:spacing w:before="2" w:after="2"/>
+              <w:jc w:val="center"/>
+            </w:pPr>
+            <w:r>
+              <w:rPr>
+                <w:rFonts w:hint="cs" w:ascii="B Mitra" w:hAnsi="B Mitra" w:cs="B Mitra"/>
+                <w:sz w:val="11"/>
+                <w:rtl/>
+                <w:szCs w:val="11"/>
+              </w:rPr>
+              <w:t>۴٫۹۶ ± ۰٫۳۸</w:t>
+            </w:r>
+          </w:p>
+        </w:tc>
+        <w:tc>
+          <w:tcPr>
+            <w:tcW w:w="700" w:type="dxa"/>
+            <w:tcMar>
+              <w:top w:w="12" w:type="dxa"/>
+              <w:bottom w:w="12" w:type="dxa"/>
+              <w:left w:w="8" w:type="dxa"/>
+              <w:right w:w="8" w:type="dxa"/>
+            </w:tcMar>
+            <w:noWrap/>
+          </w:tcPr>
+          <w:p>
+            <w:pPr>
+              <w:pStyle w:val="FigureText"/>
+              <w:spacing w:before="2" w:after="2"/>
+              <w:jc w:val="center"/>
+            </w:pPr>
+            <w:r>
+              <w:rPr>
+                <w:rFonts w:hint="cs" w:ascii="B Mitra" w:hAnsi="B Mitra" w:cs="B Mitra"/>
+                <w:sz w:val="11"/>
+                <w:rtl/>
+                <w:szCs w:val="11"/>
+              </w:rPr>
+              <w:t>۲۷٫۵۵ ± ۱٫۰۶</w:t>
+            </w:r>
+          </w:p>
+        </w:tc>
+        <w:tc>
+          <w:tcPr>
+            <w:tcW w:w="700" w:type="dxa"/>
+            <w:tcMar>
+              <w:top w:w="12" w:type="dxa"/>
+              <w:bottom w:w="12" w:type="dxa"/>
+              <w:left w:w="8" w:type="dxa"/>
+              <w:right w:w="8" w:type="dxa"/>
+            </w:tcMar>
+            <w:noWrap/>
+          </w:tcPr>
+          <w:p>
+            <w:pPr>
+              <w:pStyle w:val="FigureText"/>
+              <w:spacing w:before="2" w:after="2"/>
+              <w:jc w:val="center"/>
+            </w:pPr>
+            <w:r>
+              <w:rPr>
+                <w:rFonts w:hint="cs" w:ascii="B Mitra" w:hAnsi="B Mitra" w:cs="B Mitra"/>
+                <w:sz w:val="11"/>
+                <w:rtl/>
+                <w:szCs w:val="11"/>
+              </w:rPr>
+              <w:t>۳٫۱۷ ± ۰٫۰۲</w:t>
+            </w:r>
+          </w:p>
+        </w:tc>
+      </w:tr>
+      <w:tr>
+        <w:trPr>
+          <w:cantSplit/>
+        </w:trPr>
+        <w:tc>
+          <w:tcPr>
+            <w:tcW w:w="1850" w:type="dxa"/>
+            <w:tcMar>
+              <w:top w:w="12" w:type="dxa"/>
+              <w:bottom w:w="12" w:type="dxa"/>
+              <w:left w:w="8" w:type="dxa"/>
+              <w:right w:w="8" w:type="dxa"/>
+            </w:tcMar>
+            <w:noWrap/>
+          </w:tcPr>
+          <w:p>
+            <w:pPr>
+              <w:pStyle w:val="FigureText"/>
+              <w:spacing w:before="2" w:after="2"/>
+              <w:jc w:val="right"/>
+            </w:pPr>
+            <w:r>
+              <w:rPr>
+                <w:rFonts w:ascii="Times New Roman" w:hAnsi="Times New Roman" w:cs="Times New Roman"/>
+                <w:bidi w:val="0"/>
+                <w:sz w:val="11"/>
+                <w:szCs w:val="11"/>
+              </w:rPr>
+              <w:t>‎Static GNN‎</w:t>
+            </w:r>
+            <w:r>
+              <w:rPr>
+                <w:rFonts w:hint="cs" w:ascii="B Mitra" w:hAnsi="B Mitra" w:cs="B Mitra"/>
+                <w:sz w:val="11"/>
+                <w:rtl/>
+                <w:szCs w:val="11"/>
+              </w:rPr>
+              <w:t xml:space="preserve"> (گراف ایستا)</w:t>
+            </w:r>
+          </w:p>
+        </w:tc>
+        <w:tc>
+          <w:tcPr>
+            <w:tcW w:w="700" w:type="dxa"/>
+            <w:tcMar>
+              <w:top w:w="12" w:type="dxa"/>
+              <w:bottom w:w="12" w:type="dxa"/>
+              <w:left w:w="8" w:type="dxa"/>
+              <w:right w:w="8" w:type="dxa"/>
+            </w:tcMar>
+            <w:noWrap/>
+          </w:tcPr>
+          <w:p>
+            <w:pPr>
+              <w:pStyle w:val="FigureText"/>
+              <w:spacing w:before="2" w:after="2"/>
+              <w:jc w:val="center"/>
+            </w:pPr>
+            <w:r>
+              <w:rPr>
+                <w:rFonts w:hint="cs" w:ascii="B Mitra" w:hAnsi="B Mitra" w:cs="B Mitra"/>
+                <w:sz w:val="11"/>
+                <w:rtl/>
+                <w:szCs w:val="11"/>
+              </w:rPr>
+              <w:t>۵٫۹۸ ± ۰٫۵۴</w:t>
+            </w:r>
+          </w:p>
+        </w:tc>
+        <w:tc>
+          <w:tcPr>
+            <w:tcW w:w="700" w:type="dxa"/>
+            <w:tcMar>
+              <w:top w:w="12" w:type="dxa"/>
+              <w:bottom w:w="12" w:type="dxa"/>
+              <w:left w:w="8" w:type="dxa"/>
+              <w:right w:w="8" w:type="dxa"/>
+            </w:tcMar>
+            <w:noWrap/>
+          </w:tcPr>
+          <w:p>
+            <w:pPr>
+              <w:pStyle w:val="FigureText"/>
+              <w:spacing w:before="2" w:after="2"/>
+              <w:jc w:val="center"/>
+            </w:pPr>
+            <w:r>
+              <w:rPr>
+                <w:rFonts w:hint="cs" w:ascii="B Mitra" w:hAnsi="B Mitra" w:cs="B Mitra"/>
+                <w:sz w:val="11"/>
+                <w:rtl/>
+                <w:szCs w:val="11"/>
+              </w:rPr>
+              <w:t>۷٫۵۶ ± ۰٫۷۷</w:t>
+            </w:r>
+          </w:p>
+        </w:tc>
+        <w:tc>
+          <w:tcPr>
+            <w:tcW w:w="700" w:type="dxa"/>
+            <w:tcMar>
+              <w:top w:w="12" w:type="dxa"/>
+              <w:bottom w:w="12" w:type="dxa"/>
+              <w:left w:w="8" w:type="dxa"/>
+              <w:right w:w="8" w:type="dxa"/>
+            </w:tcMar>
+            <w:noWrap/>
+          </w:tcPr>
+          <w:p>
+            <w:pPr>
+              <w:pStyle w:val="FigureText"/>
+              <w:spacing w:before="2" w:after="2"/>
+              <w:jc w:val="center"/>
+            </w:pPr>
+            <w:r>
+              <w:rPr>
+                <w:rFonts w:hint="cs" w:ascii="B Mitra" w:hAnsi="B Mitra" w:cs="B Mitra"/>
+                <w:sz w:val="11"/>
+                <w:rtl/>
+                <w:szCs w:val="11"/>
+              </w:rPr>
+              <w:t>۳۸٫۶۷ ± ۲٫۱۳</w:t>
+            </w:r>
+          </w:p>
+        </w:tc>
+        <w:tc>
+          <w:tcPr>
+            <w:tcW w:w="700" w:type="dxa"/>
+            <w:tcMar>
+              <w:top w:w="12" w:type="dxa"/>
+              <w:bottom w:w="12" w:type="dxa"/>
+              <w:left w:w="8" w:type="dxa"/>
+              <w:right w:w="8" w:type="dxa"/>
+            </w:tcMar>
+            <w:noWrap/>
+          </w:tcPr>
+          <w:p>
+            <w:pPr>
+              <w:pStyle w:val="FigureText"/>
+              <w:spacing w:before="2" w:after="2"/>
+              <w:jc w:val="center"/>
+            </w:pPr>
+            <w:r>
+              <w:rPr>
+                <w:rFonts w:hint="cs" w:ascii="B Mitra" w:hAnsi="B Mitra" w:cs="B Mitra"/>
+                <w:sz w:val="11"/>
+                <w:rtl/>
+                <w:szCs w:val="11"/>
+              </w:rPr>
+              <w:t>۳٫۳۱ ± ۰٫۰۳</w:t>
             </w:r>
           </w:p>
         </w:tc>
@@ -6136,7 +6444,7 @@
                 <w:sz w:val="11"/>
                 <w:szCs w:val="11"/>
               </w:rPr>
-              <w:t>‎NB-GLM‎</w:t>
+              <w:t>‎HAMTA Temporal‎</w:t>
             </w:r>
             <w:r>
               <w:rPr>
@@ -6147,7 +6455,7 @@
                 <w:rtl/>
                 <w:szCs w:val="11"/>
               </w:rPr>
-              <w:t xml:space="preserve"> (اثرات صنف)</w:t>
+              <w:t xml:space="preserve"> (پیشنهادی)</w:t>
             </w:r>
           </w:p>
         </w:tc>
@@ -6178,7 +6486,7 @@
                 <w:rtl/>
                 <w:szCs w:val="11"/>
               </w:rPr>
-              <w:t>۱٫۰</w:t>
+              <w:t>۴٫۴۸ ± ۰٫۴۲</w:t>
             </w:r>
           </w:p>
         </w:tc>
@@ -6209,7 +6517,7 @@
                 <w:rtl/>
                 <w:szCs w:val="11"/>
               </w:rPr>
-              <w:t>۱٫۲۵</w:t>
+              <w:t>۵٫۸۶ ± ۰٫۵۸</w:t>
             </w:r>
           </w:p>
         </w:tc>
@@ -6240,7 +6548,7 @@
                 <w:rtl/>
                 <w:szCs w:val="11"/>
               </w:rPr>
-              <w:t>۰</w:t>
+              <w:t>۳۱٫۳۷ ± ۲٫۱۱</w:t>
             </w:r>
           </w:p>
         </w:tc>
@@ -6271,7 +6579,7 @@
                 <w:rtl/>
                 <w:szCs w:val="11"/>
               </w:rPr>
-              <w:t>۰٫۰</w:t>
+              <w:t>۳٫۵۱ ± ۰٫۳۱</w:t>
             </w:r>
           </w:p>
         </w:tc>
@@ -6746,7 +7054,7 @@
                 <w:rtl/>
                 <w:szCs w:val="10"/>
               </w:rPr>
-              <w:t>۰٫۰</w:t>
+              <w:t>۰٫۱۹۷ ± ۰٫۰۵۳</w:t>
             </w:r>
           </w:p>
         </w:tc>
@@ -6774,7 +7082,7 @@
                 <w:rtl/>
                 <w:szCs w:val="10"/>
               </w:rPr>
-              <w:t>۰٫۰</w:t>
+              <w:t>۰٫۱۳۳ ± ۰٫۰۳۶</w:t>
             </w:r>
           </w:p>
         </w:tc>
@@ -6802,7 +7110,7 @@
                 <w:rtl/>
                 <w:szCs w:val="10"/>
               </w:rPr>
-              <w:t>۰٫۰</w:t>
+              <w:t>۰٫۱۹۴ ± ۰٫۰۵۲</w:t>
             </w:r>
           </w:p>
         </w:tc>
@@ -6830,7 +7138,7 @@
                 <w:rtl/>
                 <w:szCs w:val="10"/>
               </w:rPr>
-              <w:t>۰</w:t>
+              <w:t>۰٫۲۰۳ ± ۰٫۰۵۶</w:t>
             </w:r>
           </w:p>
         </w:tc>
@@ -6858,7 +7166,7 @@
                 <w:rtl/>
                 <w:szCs w:val="10"/>
               </w:rPr>
-              <w:t>۰٫۰</w:t>
+              <w:t>۰٫۰۵۹ ± ۰٫۰۳۰</w:t>
             </w:r>
           </w:p>
         </w:tc>
@@ -6919,7 +7227,7 @@
                 <w:rtl/>
                 <w:szCs w:val="10"/>
               </w:rPr>
-              <w:t>۰٫۰</w:t>
+              <w:t>۰٫۲۲۰ ± ۰٫۰۵۴</w:t>
             </w:r>
           </w:p>
         </w:tc>
@@ -6947,7 +7255,7 @@
                 <w:rtl/>
                 <w:szCs w:val="10"/>
               </w:rPr>
-              <w:t>۰٫۰</w:t>
+              <w:t>۰٫۱۴۸ ± ۰٫۰۳۶</w:t>
             </w:r>
           </w:p>
         </w:tc>
@@ -6975,7 +7283,7 @@
                 <w:rtl/>
                 <w:szCs w:val="10"/>
               </w:rPr>
-              <w:t>۰٫۰</w:t>
+              <w:t>۰٫۲۰۲ ± ۰٫۰۳۲</w:t>
             </w:r>
           </w:p>
         </w:tc>
@@ -7003,7 +7311,7 @@
                 <w:rtl/>
                 <w:szCs w:val="10"/>
               </w:rPr>
-              <w:t>۰</w:t>
+              <w:t>۰٫۲۴۵ ± ۰٫۰۷۴</w:t>
             </w:r>
           </w:p>
         </w:tc>
@@ -7031,7 +7339,7 @@
                 <w:rtl/>
                 <w:szCs w:val="10"/>
               </w:rPr>
-              <w:t>۰٫۰</w:t>
+              <w:t>۰٫۰۸۲ ± ۰٫۰۳۹</w:t>
             </w:r>
           </w:p>
         </w:tc>
@@ -7101,7 +7409,7 @@
                 <w:rtl/>
                 <w:szCs w:val="10"/>
               </w:rPr>
-              <w:t>۰٫۰</w:t>
+              <w:t>۰٫۲۱۴ ± ۰٫۰۶۴</w:t>
             </w:r>
           </w:p>
         </w:tc>
@@ -7129,7 +7437,7 @@
                 <w:rtl/>
                 <w:szCs w:val="10"/>
               </w:rPr>
-              <w:t>۰٫۰</w:t>
+              <w:t>۰٫۱۴۴ ± ۰٫۰۴۳</w:t>
             </w:r>
           </w:p>
         </w:tc>
@@ -7157,7 +7465,7 @@
                 <w:rtl/>
                 <w:szCs w:val="10"/>
               </w:rPr>
-              <w:t>۰٫۰</w:t>
+              <w:t>۰٫۱۸۸ ± ۰٫۰۴۲</w:t>
             </w:r>
           </w:p>
         </w:tc>
@@ -7185,7 +7493,7 @@
                 <w:rtl/>
                 <w:szCs w:val="10"/>
               </w:rPr>
-              <w:t>۰</w:t>
+              <w:t>۰٫۲۳۷ ± ۰٫۰۸۳</w:t>
             </w:r>
           </w:p>
         </w:tc>
@@ -7213,7 +7521,7 @@
                 <w:rtl/>
                 <w:szCs w:val="10"/>
               </w:rPr>
-              <w:t>۰٫۰</w:t>
+              <w:t>۰٫۰۸۲ ± ۰٫۰۴۹</w:t>
             </w:r>
           </w:p>
         </w:tc>
@@ -7283,7 +7591,7 @@
                 <w:rtl/>
                 <w:szCs w:val="10"/>
               </w:rPr>
-              <w:t>۰٫۰</w:t>
+              <w:t>۰٫۲۳۱ ± ۰٫۰۵۳</w:t>
             </w:r>
           </w:p>
         </w:tc>
@@ -7311,7 +7619,7 @@
                 <w:rtl/>
                 <w:szCs w:val="10"/>
               </w:rPr>
-              <w:t>۰٫۰</w:t>
+              <w:t>۰٫۱۵۶ ± ۰٫۰۳۶</w:t>
             </w:r>
           </w:p>
         </w:tc>
@@ -7339,7 +7647,7 @@
                 <w:rtl/>
                 <w:szCs w:val="10"/>
               </w:rPr>
-              <w:t>۰٫۰</w:t>
+              <w:t>۰٫۲۲۱ ± ۰٫۰۳۵</w:t>
             </w:r>
           </w:p>
         </w:tc>
@@ -7367,7 +7675,7 @@
                 <w:rtl/>
                 <w:szCs w:val="10"/>
               </w:rPr>
-              <w:t>۰</w:t>
+              <w:t>۰٫۲۴۱ ± ۰٫۰۷۱</w:t>
             </w:r>
           </w:p>
         </w:tc>
@@ -7395,7 +7703,7 @@
                 <w:rtl/>
                 <w:szCs w:val="10"/>
               </w:rPr>
-              <w:t>۰٫۰</w:t>
+              <w:t>۰٫۰۸۰ ± ۰٫۰۳۹</w:t>
             </w:r>
           </w:p>
         </w:tc>
@@ -7414,6 +7722,561 @@
               <w:right w:w="8" w:type="dxa"/>
             </w:tcMar>
             <w:noWrap/>
+          </w:tcPr>
+          <w:p>
+            <w:pPr>
+              <w:pStyle w:val="FigureText"/>
+              <w:spacing w:before="2" w:after="2"/>
+              <w:jc w:val="right"/>
+            </w:pPr>
+            <w:r>
+              <w:rPr>
+                <w:rFonts w:hint="cs" w:ascii="B Mitra" w:hAnsi="B Mitra" w:cs="B Mitra"/>
+                <w:sz w:val="10"/>
+                <w:rtl/>
+                <w:szCs w:val="10"/>
+              </w:rPr>
+              <w:t>شکاف گراف ایستا</w:t>
+            </w:r>
+          </w:p>
+        </w:tc>
+        <w:tc>
+          <w:tcPr>
+            <w:tcW w:w="690" w:type="dxa"/>
+            <w:tcMar>
+              <w:top w:w="12" w:type="dxa"/>
+              <w:bottom w:w="12" w:type="dxa"/>
+              <w:left w:w="8" w:type="dxa"/>
+              <w:right w:w="8" w:type="dxa"/>
+            </w:tcMar>
+            <w:noWrap/>
+          </w:tcPr>
+          <w:p>
+            <w:pPr>
+              <w:pStyle w:val="FigureText"/>
+              <w:spacing w:before="2" w:after="2"/>
+              <w:jc w:val="center"/>
+            </w:pPr>
+            <w:r>
+              <w:rPr>
+                <w:rFonts w:hint="cs" w:ascii="B Mitra" w:hAnsi="B Mitra" w:cs="B Mitra"/>
+                <w:sz w:val="10"/>
+                <w:rtl/>
+                <w:szCs w:val="10"/>
+              </w:rPr>
+              <w:t>۰٫۲۸۶ ± ۰٫۰۷۱</w:t>
+            </w:r>
+          </w:p>
+        </w:tc>
+        <w:tc>
+          <w:tcPr>
+            <w:tcW w:w="690" w:type="dxa"/>
+            <w:tcMar>
+              <w:top w:w="12" w:type="dxa"/>
+              <w:bottom w:w="12" w:type="dxa"/>
+              <w:left w:w="8" w:type="dxa"/>
+              <w:right w:w="8" w:type="dxa"/>
+            </w:tcMar>
+            <w:noWrap/>
+          </w:tcPr>
+          <w:p>
+            <w:pPr>
+              <w:pStyle w:val="FigureText"/>
+              <w:spacing w:before="2" w:after="2"/>
+              <w:jc w:val="center"/>
+            </w:pPr>
+            <w:r>
+              <w:rPr>
+                <w:rFonts w:hint="cs" w:ascii="B Mitra" w:hAnsi="B Mitra" w:cs="B Mitra"/>
+                <w:sz w:val="10"/>
+                <w:rtl/>
+                <w:szCs w:val="10"/>
+              </w:rPr>
+              <w:t>۰٫۱۹۲ ± ۰٫۰۴۸</w:t>
+            </w:r>
+          </w:p>
+        </w:tc>
+        <w:tc>
+          <w:tcPr>
+            <w:tcW w:w="690" w:type="dxa"/>
+            <w:tcMar>
+              <w:top w:w="12" w:type="dxa"/>
+              <w:bottom w:w="12" w:type="dxa"/>
+              <w:left w:w="8" w:type="dxa"/>
+              <w:right w:w="8" w:type="dxa"/>
+            </w:tcMar>
+            <w:noWrap/>
+          </w:tcPr>
+          <w:p>
+            <w:pPr>
+              <w:pStyle w:val="FigureText"/>
+              <w:spacing w:before="2" w:after="2"/>
+              <w:jc w:val="center"/>
+            </w:pPr>
+            <w:r>
+              <w:rPr>
+                <w:rFonts w:hint="cs" w:ascii="B Mitra" w:hAnsi="B Mitra" w:cs="B Mitra"/>
+                <w:sz w:val="10"/>
+                <w:rtl/>
+                <w:szCs w:val="10"/>
+              </w:rPr>
+              <w:t>۰٫۲۸۷ ± ۰٫۰۵۶</w:t>
+            </w:r>
+          </w:p>
+        </w:tc>
+        <w:tc>
+          <w:tcPr>
+            <w:tcW w:w="690" w:type="dxa"/>
+            <w:tcMar>
+              <w:top w:w="12" w:type="dxa"/>
+              <w:bottom w:w="12" w:type="dxa"/>
+              <w:left w:w="8" w:type="dxa"/>
+              <w:right w:w="8" w:type="dxa"/>
+            </w:tcMar>
+            <w:noWrap/>
+          </w:tcPr>
+          <w:p>
+            <w:pPr>
+              <w:pStyle w:val="FigureText"/>
+              <w:spacing w:before="2" w:after="2"/>
+              <w:jc w:val="center"/>
+            </w:pPr>
+            <w:r>
+              <w:rPr>
+                <w:rFonts w:hint="cs" w:ascii="B Mitra" w:hAnsi="B Mitra" w:cs="B Mitra"/>
+                <w:sz w:val="10"/>
+                <w:rtl/>
+                <w:szCs w:val="10"/>
+              </w:rPr>
+              <w:t>۰٫۳۱۰ ± ۰٫۰۷۹</w:t>
+            </w:r>
+          </w:p>
+        </w:tc>
+        <w:tc>
+          <w:tcPr>
+            <w:tcW w:w="690" w:type="dxa"/>
+            <w:tcMar>
+              <w:top w:w="12" w:type="dxa"/>
+              <w:bottom w:w="12" w:type="dxa"/>
+              <w:left w:w="8" w:type="dxa"/>
+              <w:right w:w="8" w:type="dxa"/>
+            </w:tcMar>
+            <w:noWrap/>
+          </w:tcPr>
+          <w:p>
+            <w:pPr>
+              <w:pStyle w:val="FigureText"/>
+              <w:spacing w:before="2" w:after="2"/>
+              <w:jc w:val="center"/>
+            </w:pPr>
+            <w:r>
+              <w:rPr>
+                <w:rFonts w:hint="cs" w:ascii="B Mitra" w:hAnsi="B Mitra" w:cs="B Mitra"/>
+                <w:sz w:val="10"/>
+                <w:rtl/>
+                <w:szCs w:val="10"/>
+              </w:rPr>
+              <w:t>۰٫۱۲۴ ± ۰٫۰۵۵</w:t>
+            </w:r>
+          </w:p>
+        </w:tc>
+      </w:tr>
+      <w:tr>
+        <w:trPr>
+          <w:cantSplit/>
+        </w:trPr>
+        <w:tc>
+          <w:tcPr>
+            <w:tcW w:w="1200" w:type="dxa"/>
+            <w:tcMar>
+              <w:top w:w="12" w:type="dxa"/>
+              <w:bottom w:w="12" w:type="dxa"/>
+              <w:left w:w="8" w:type="dxa"/>
+              <w:right w:w="8" w:type="dxa"/>
+            </w:tcMar>
+            <w:noWrap/>
+          </w:tcPr>
+          <w:p>
+            <w:pPr>
+              <w:pStyle w:val="FigureText"/>
+              <w:spacing w:before="2" w:after="2"/>
+              <w:jc w:val="right"/>
+            </w:pPr>
+            <w:r>
+              <w:rPr>
+                <w:rFonts w:hint="cs" w:ascii="B Mitra" w:hAnsi="B Mitra" w:cs="B Mitra"/>
+                <w:sz w:val="10"/>
+                <w:rtl/>
+                <w:szCs w:val="10"/>
+              </w:rPr>
+              <w:t xml:space="preserve">مرز تصادفی </w:t>
+            </w:r>
+            <w:r>
+              <w:rPr>
+                <w:rFonts w:ascii="Times New Roman" w:hAnsi="Times New Roman" w:cs="Times New Roman"/>
+                <w:bidi w:val="0"/>
+                <w:sz w:val="10"/>
+                <w:szCs w:val="10"/>
+              </w:rPr>
+              <w:t>‎SFA‎</w:t>
+            </w:r>
+          </w:p>
+        </w:tc>
+        <w:tc>
+          <w:tcPr>
+            <w:tcW w:w="690" w:type="dxa"/>
+            <w:tcMar>
+              <w:top w:w="12" w:type="dxa"/>
+              <w:bottom w:w="12" w:type="dxa"/>
+              <w:left w:w="8" w:type="dxa"/>
+              <w:right w:w="8" w:type="dxa"/>
+            </w:tcMar>
+            <w:noWrap/>
+          </w:tcPr>
+          <w:p>
+            <w:pPr>
+              <w:pStyle w:val="FigureText"/>
+              <w:spacing w:before="2" w:after="2"/>
+              <w:jc w:val="center"/>
+            </w:pPr>
+            <w:r>
+              <w:rPr>
+                <w:rFonts w:hint="cs" w:ascii="B Mitra" w:hAnsi="B Mitra" w:cs="B Mitra"/>
+                <w:sz w:val="10"/>
+                <w:rtl/>
+                <w:szCs w:val="10"/>
+              </w:rPr>
+              <w:t>۰٫۳۵۷ ± ۰٫۰۸۳</w:t>
+            </w:r>
+          </w:p>
+        </w:tc>
+        <w:tc>
+          <w:tcPr>
+            <w:tcW w:w="690" w:type="dxa"/>
+            <w:tcMar>
+              <w:top w:w="12" w:type="dxa"/>
+              <w:bottom w:w="12" w:type="dxa"/>
+              <w:left w:w="8" w:type="dxa"/>
+              <w:right w:w="8" w:type="dxa"/>
+            </w:tcMar>
+            <w:noWrap/>
+          </w:tcPr>
+          <w:p>
+            <w:pPr>
+              <w:pStyle w:val="FigureText"/>
+              <w:spacing w:before="2" w:after="2"/>
+              <w:jc w:val="center"/>
+            </w:pPr>
+            <w:r>
+              <w:rPr>
+                <w:rFonts w:hint="cs" w:ascii="B Mitra" w:hAnsi="B Mitra" w:cs="B Mitra"/>
+                <w:sz w:val="10"/>
+                <w:rtl/>
+                <w:szCs w:val="10"/>
+              </w:rPr>
+              <w:t>۰٫۲۴۰ ± ۰٫۰۵۶</w:t>
+            </w:r>
+          </w:p>
+        </w:tc>
+        <w:tc>
+          <w:tcPr>
+            <w:tcW w:w="690" w:type="dxa"/>
+            <w:tcMar>
+              <w:top w:w="12" w:type="dxa"/>
+              <w:bottom w:w="12" w:type="dxa"/>
+              <w:left w:w="8" w:type="dxa"/>
+              <w:right w:w="8" w:type="dxa"/>
+            </w:tcMar>
+            <w:noWrap/>
+          </w:tcPr>
+          <w:p>
+            <w:pPr>
+              <w:pStyle w:val="FigureText"/>
+              <w:spacing w:before="2" w:after="2"/>
+              <w:jc w:val="center"/>
+            </w:pPr>
+            <w:r>
+              <w:rPr>
+                <w:rFonts w:hint="cs" w:ascii="B Mitra" w:hAnsi="B Mitra" w:cs="B Mitra"/>
+                <w:sz w:val="10"/>
+                <w:rtl/>
+                <w:szCs w:val="10"/>
+              </w:rPr>
+              <w:t>۰٫۳۲۳ ± ۰٫۰۷۵</w:t>
+            </w:r>
+          </w:p>
+        </w:tc>
+        <w:tc>
+          <w:tcPr>
+            <w:tcW w:w="690" w:type="dxa"/>
+            <w:tcMar>
+              <w:top w:w="12" w:type="dxa"/>
+              <w:bottom w:w="12" w:type="dxa"/>
+              <w:left w:w="8" w:type="dxa"/>
+              <w:right w:w="8" w:type="dxa"/>
+            </w:tcMar>
+            <w:noWrap/>
+          </w:tcPr>
+          <w:p>
+            <w:pPr>
+              <w:pStyle w:val="FigureText"/>
+              <w:spacing w:before="2" w:after="2"/>
+              <w:jc w:val="center"/>
+            </w:pPr>
+            <w:r>
+              <w:rPr>
+                <w:rFonts w:hint="cs" w:ascii="B Mitra" w:hAnsi="B Mitra" w:cs="B Mitra"/>
+                <w:sz w:val="10"/>
+                <w:rtl/>
+                <w:szCs w:val="10"/>
+              </w:rPr>
+              <w:t>۰٫۳۸۳ ± ۰٫۰۸۵</w:t>
+            </w:r>
+          </w:p>
+        </w:tc>
+        <w:tc>
+          <w:tcPr>
+            <w:tcW w:w="690" w:type="dxa"/>
+            <w:tcMar>
+              <w:top w:w="12" w:type="dxa"/>
+              <w:bottom w:w="12" w:type="dxa"/>
+              <w:left w:w="8" w:type="dxa"/>
+              <w:right w:w="8" w:type="dxa"/>
+            </w:tcMar>
+            <w:noWrap/>
+          </w:tcPr>
+          <w:p>
+            <w:pPr>
+              <w:pStyle w:val="FigureText"/>
+              <w:spacing w:before="2" w:after="2"/>
+              <w:jc w:val="center"/>
+            </w:pPr>
+            <w:r>
+              <w:rPr>
+                <w:rFonts w:hint="cs" w:ascii="B Mitra" w:hAnsi="B Mitra" w:cs="B Mitra"/>
+                <w:sz w:val="10"/>
+                <w:rtl/>
+                <w:szCs w:val="10"/>
+              </w:rPr>
+              <w:t>۰٫۱۷۱ ± ۰٫۰۵۸</w:t>
+            </w:r>
+          </w:p>
+        </w:tc>
+      </w:tr>
+      <w:tr>
+        <w:trPr>
+          <w:cantSplit/>
+        </w:trPr>
+        <w:tc>
+          <w:tcPr>
+            <w:tcW w:w="1200" w:type="dxa"/>
+            <w:tcMar>
+              <w:top w:w="12" w:type="dxa"/>
+              <w:bottom w:w="12" w:type="dxa"/>
+              <w:left w:w="8" w:type="dxa"/>
+              <w:right w:w="8" w:type="dxa"/>
+            </w:tcMar>
+            <w:noWrap/>
+          </w:tcPr>
+          <w:p>
+            <w:pPr>
+              <w:pStyle w:val="FigureText"/>
+              <w:spacing w:before="2" w:after="2"/>
+              <w:jc w:val="right"/>
+            </w:pPr>
+            <w:r>
+              <w:rPr>
+                <w:rFonts w:ascii="Times New Roman" w:hAnsi="Times New Roman" w:cs="Times New Roman"/>
+                <w:bidi w:val="0"/>
+                <w:sz w:val="10"/>
+                <w:szCs w:val="10"/>
+              </w:rPr>
+              <w:t>‎M-GATO‎</w:t>
+            </w:r>
+            <w:r>
+              <w:rPr>
+                <w:rFonts w:hint="cs" w:ascii="B Mitra" w:hAnsi="B Mitra" w:cs="B Mitra"/>
+                <w:sz w:val="10"/>
+                <w:rtl/>
+                <w:szCs w:val="10"/>
+              </w:rPr>
+              <w:t xml:space="preserve"> (بدون </w:t>
+            </w:r>
+            <w:r>
+              <w:rPr>
+                <w:rFonts w:ascii="Times New Roman" w:hAnsi="Times New Roman" w:cs="Times New Roman"/>
+                <w:bidi w:val="0"/>
+                <w:sz w:val="10"/>
+                <w:szCs w:val="10"/>
+              </w:rPr>
+              <w:t>‎Q‎</w:t>
+            </w:r>
+            <w:r>
+              <w:rPr>
+                <w:rFonts w:hint="cs" w:ascii="B Mitra" w:hAnsi="B Mitra" w:cs="B Mitra"/>
+                <w:sz w:val="10"/>
+                <w:rtl/>
+                <w:szCs w:val="10"/>
+              </w:rPr>
+              <w:t>)</w:t>
+            </w:r>
+          </w:p>
+        </w:tc>
+        <w:tc>
+          <w:tcPr>
+            <w:tcW w:w="690" w:type="dxa"/>
+            <w:tcMar>
+              <w:top w:w="12" w:type="dxa"/>
+              <w:bottom w:w="12" w:type="dxa"/>
+              <w:left w:w="8" w:type="dxa"/>
+              <w:right w:w="8" w:type="dxa"/>
+            </w:tcMar>
+            <w:noWrap/>
+          </w:tcPr>
+          <w:p>
+            <w:pPr>
+              <w:pStyle w:val="FigureText"/>
+              <w:spacing w:before="2" w:after="2"/>
+              <w:jc w:val="center"/>
+            </w:pPr>
+            <w:r>
+              <w:rPr>
+                <w:rFonts w:hint="cs" w:ascii="B Mitra" w:hAnsi="B Mitra" w:cs="B Mitra"/>
+                <w:sz w:val="10"/>
+                <w:rtl/>
+                <w:szCs w:val="10"/>
+              </w:rPr>
+              <w:t>۰٫۳۷۴ ± ۰٫۱۱۷</w:t>
+            </w:r>
+          </w:p>
+        </w:tc>
+        <w:tc>
+          <w:tcPr>
+            <w:tcW w:w="690" w:type="dxa"/>
+            <w:tcMar>
+              <w:top w:w="12" w:type="dxa"/>
+              <w:bottom w:w="12" w:type="dxa"/>
+              <w:left w:w="8" w:type="dxa"/>
+              <w:right w:w="8" w:type="dxa"/>
+            </w:tcMar>
+            <w:noWrap/>
+          </w:tcPr>
+          <w:p>
+            <w:pPr>
+              <w:pStyle w:val="FigureText"/>
+              <w:spacing w:before="2" w:after="2"/>
+              <w:jc w:val="center"/>
+            </w:pPr>
+            <w:r>
+              <w:rPr>
+                <w:rFonts w:hint="cs" w:ascii="B Mitra" w:hAnsi="B Mitra" w:cs="B Mitra"/>
+                <w:sz w:val="10"/>
+                <w:rtl/>
+                <w:szCs w:val="10"/>
+              </w:rPr>
+              <w:t>۰٫۲۵۲ ± ۰٫۰۷۹</w:t>
+            </w:r>
+          </w:p>
+        </w:tc>
+        <w:tc>
+          <w:tcPr>
+            <w:tcW w:w="690" w:type="dxa"/>
+            <w:tcMar>
+              <w:top w:w="12" w:type="dxa"/>
+              <w:bottom w:w="12" w:type="dxa"/>
+              <w:left w:w="8" w:type="dxa"/>
+              <w:right w:w="8" w:type="dxa"/>
+            </w:tcMar>
+            <w:noWrap/>
+          </w:tcPr>
+          <w:p>
+            <w:pPr>
+              <w:pStyle w:val="FigureText"/>
+              <w:spacing w:before="2" w:after="2"/>
+              <w:jc w:val="center"/>
+            </w:pPr>
+            <w:r>
+              <w:rPr>
+                <w:rFonts w:hint="cs" w:ascii="B Mitra" w:hAnsi="B Mitra" w:cs="B Mitra"/>
+                <w:sz w:val="10"/>
+                <w:rtl/>
+                <w:szCs w:val="10"/>
+              </w:rPr>
+              <w:t>۰٫۳۴۲ ± ۰٫۰۶۹</w:t>
+            </w:r>
+          </w:p>
+        </w:tc>
+        <w:tc>
+          <w:tcPr>
+            <w:tcW w:w="690" w:type="dxa"/>
+            <w:tcMar>
+              <w:top w:w="12" w:type="dxa"/>
+              <w:bottom w:w="12" w:type="dxa"/>
+              <w:left w:w="8" w:type="dxa"/>
+              <w:right w:w="8" w:type="dxa"/>
+            </w:tcMar>
+            <w:noWrap/>
+          </w:tcPr>
+          <w:p>
+            <w:pPr>
+              <w:pStyle w:val="FigureText"/>
+              <w:spacing w:before="2" w:after="2"/>
+              <w:jc w:val="center"/>
+            </w:pPr>
+            <w:r>
+              <w:rPr>
+                <w:rFonts w:hint="cs" w:ascii="B Mitra" w:hAnsi="B Mitra" w:cs="B Mitra"/>
+                <w:sz w:val="10"/>
+                <w:rtl/>
+                <w:szCs w:val="10"/>
+              </w:rPr>
+              <w:t>۰٫۳۹۶ ± ۰٫۱۰۲</w:t>
+            </w:r>
+          </w:p>
+        </w:tc>
+        <w:tc>
+          <w:tcPr>
+            <w:tcW w:w="690" w:type="dxa"/>
+            <w:tcMar>
+              <w:top w:w="12" w:type="dxa"/>
+              <w:bottom w:w="12" w:type="dxa"/>
+              <w:left w:w="8" w:type="dxa"/>
+              <w:right w:w="8" w:type="dxa"/>
+            </w:tcMar>
+            <w:noWrap/>
+          </w:tcPr>
+          <w:p>
+            <w:pPr>
+              <w:pStyle w:val="FigureText"/>
+              <w:spacing w:before="2" w:after="2"/>
+              <w:jc w:val="center"/>
+            </w:pPr>
+            <w:r>
+              <w:rPr>
+                <w:rFonts w:hint="cs" w:ascii="B Mitra" w:hAnsi="B Mitra" w:cs="B Mitra"/>
+                <w:sz w:val="10"/>
+                <w:rtl/>
+                <w:szCs w:val="10"/>
+              </w:rPr>
+              <w:t>۰٫۱۸۴ ± ۰٫۰۸۳</w:t>
+            </w:r>
+          </w:p>
+        </w:tc>
+      </w:tr>
+      <w:tr>
+        <w:trPr>
+          <w:cantSplit/>
+        </w:trPr>
+        <w:tc>
+          <w:tcPr>
+            <w:tcW w:w="1200" w:type="dxa"/>
+            <w:tcMar>
+              <w:top w:w="12" w:type="dxa"/>
+              <w:bottom w:w="12" w:type="dxa"/>
+              <w:left w:w="8" w:type="dxa"/>
+              <w:right w:w="8" w:type="dxa"/>
+            </w:tcMar>
+            <w:noWrap/>
             <w:shd w:fill="E8F5E9"/>
           </w:tcPr>
           <w:p>
@@ -7431,38 +8294,18 @@
                 <w:rtl/>
                 <w:szCs w:val="10"/>
               </w:rPr>
-              <w:t>شکاف گراف ایستا</w:t>
-            </w:r>
-          </w:p>
-        </w:tc>
-        <w:tc>
-          <w:tcPr>
-            <w:tcW w:w="690" w:type="dxa"/>
-            <w:tcMar>
-              <w:top w:w="12" w:type="dxa"/>
-              <w:bottom w:w="12" w:type="dxa"/>
-              <w:left w:w="8" w:type="dxa"/>
-              <w:right w:w="8" w:type="dxa"/>
-            </w:tcMar>
-            <w:noWrap/>
-            <w:shd w:fill="E8F5E9"/>
-          </w:tcPr>
-          <w:p>
-            <w:pPr>
-              <w:pStyle w:val="FigureText"/>
-              <w:spacing w:before="2" w:after="2"/>
-              <w:jc w:val="center"/>
-            </w:pPr>
-            <w:r>
-              <w:rPr>
-                <w:rFonts w:hint="cs" w:ascii="B Mitra" w:hAnsi="B Mitra" w:cs="B Mitra"/>
+              <w:t xml:space="preserve">پیشنهادی </w:t>
+            </w:r>
+            <w:r>
+              <w:rPr>
+                <w:rFonts w:ascii="Times New Roman" w:hAnsi="Times New Roman" w:cs="Times New Roman"/>
                 <w:bCs/>
                 <w:b/>
-                <w:sz w:val="10"/>
-                <w:rtl/>
-                <w:szCs w:val="10"/>
-              </w:rPr>
-              <w:t>۰٫۰</w:t>
+                <w:bidi w:val="0"/>
+                <w:sz w:val="10"/>
+                <w:szCs w:val="10"/>
+              </w:rPr>
+              <w:t>‎HAMTA‎</w:t>
             </w:r>
           </w:p>
         </w:tc>
@@ -7493,7 +8336,7 @@
                 <w:rtl/>
                 <w:szCs w:val="10"/>
               </w:rPr>
-              <w:t>۰٫۰</w:t>
+              <w:t>۰٫۳۶۶ ± ۰٫۱۲۰</w:t>
             </w:r>
           </w:p>
         </w:tc>
@@ -7524,7 +8367,7 @@
                 <w:rtl/>
                 <w:szCs w:val="10"/>
               </w:rPr>
-              <w:t>۰٫۰</w:t>
+              <w:t>۰٫۲۴۶ ± ۰٫۰۸۱</w:t>
             </w:r>
           </w:p>
         </w:tc>
@@ -7555,7 +8398,7 @@
                 <w:rtl/>
                 <w:szCs w:val="10"/>
               </w:rPr>
-              <w:t>۰</w:t>
+              <w:t>۰٫۳۴۲ ± ۰٫۰۷۷</w:t>
             </w:r>
           </w:p>
         </w:tc>
@@ -7586,7 +8429,38 @@
                 <w:rtl/>
                 <w:szCs w:val="10"/>
               </w:rPr>
-              <w:t>۰٫۰</w:t>
+              <w:t>۰٫۳۸۲ ± ۰٫۱۱۶</w:t>
+            </w:r>
+          </w:p>
+        </w:tc>
+        <w:tc>
+          <w:tcPr>
+            <w:tcW w:w="690" w:type="dxa"/>
+            <w:tcMar>
+              <w:top w:w="12" w:type="dxa"/>
+              <w:bottom w:w="12" w:type="dxa"/>
+              <w:left w:w="8" w:type="dxa"/>
+              <w:right w:w="8" w:type="dxa"/>
+            </w:tcMar>
+            <w:noWrap/>
+            <w:shd w:fill="E8F5E9"/>
+          </w:tcPr>
+          <w:p>
+            <w:pPr>
+              <w:pStyle w:val="FigureText"/>
+              <w:spacing w:before="2" w:after="2"/>
+              <w:jc w:val="center"/>
+            </w:pPr>
+            <w:r>
+              <w:rPr>
+                <w:rFonts w:hint="cs" w:ascii="B Mitra" w:hAnsi="B Mitra" w:cs="B Mitra"/>
+                <w:bCs/>
+                <w:b/>
+                <w:sz w:val="10"/>
+                <w:rtl/>
+                <w:szCs w:val="10"/>
+              </w:rPr>
+              <w:t>۰٫۱۸۰ ± ۰٫۰۹۲</w:t>
             </w:r>
           </w:p>
         </w:tc>
@@ -7602,7 +8476,7 @@
       <w:r>
         <w:drawing>
           <wp:inline xmlns:a="http://schemas.openxmlformats.org/drawingml/2006/main" xmlns:pic="http://schemas.openxmlformats.org/drawingml/2006/picture">
-            <wp:extent cx="2736000" cy="1442913"/>
+            <wp:extent cx="2736000" cy="1026000"/>
             <wp:docPr id="4" name="Picture 4"/>
             <wp:cNvGraphicFramePr>
               <a:graphicFrameLocks noChangeAspect="1"/>
@@ -7623,7 +8497,7 @@
                   <pic:spPr>
                     <a:xfrm>
                       <a:off x="0" y="0"/>
-                      <a:ext cx="2736000" cy="1442913"/>
+                      <a:ext cx="2736000" cy="1026000"/>
                     </a:xfrm>
                     <a:prstGeom prst="rect"/>
                   </pic:spPr>
@@ -11835,7 +12709,7 @@
                 <w:rtl/>
                 <w:szCs w:val="10"/>
               </w:rPr>
-              <w:t>۰٫۰</w:t>
+              <w:t>۰٫۰۰۰ ± ۰٫۰۰۰</w:t>
             </w:r>
           </w:p>
         </w:tc>
@@ -11863,7 +12737,7 @@
                 <w:rtl/>
                 <w:szCs w:val="10"/>
               </w:rPr>
-              <w:t>۰٫۰</w:t>
+              <w:t>۰٫۰۰۰ ± ۰٫۰۰۰</w:t>
             </w:r>
           </w:p>
         </w:tc>
@@ -11891,7 +12765,7 @@
                 <w:rtl/>
                 <w:szCs w:val="10"/>
               </w:rPr>
-              <w:t>۰٫۰۲۸</w:t>
+              <w:t>۰٫۱۰۰ ± ۰٫۰۰۰</w:t>
             </w:r>
           </w:p>
         </w:tc>
@@ -11919,7 +12793,7 @@
                 <w:rtl/>
                 <w:szCs w:val="10"/>
               </w:rPr>
-              <w:t>۰٫۰</w:t>
+              <w:t>۰٫۸۶۲ ± ۰٫۰۳۱</w:t>
             </w:r>
           </w:p>
         </w:tc>
@@ -12008,7 +12882,7 @@
                 <w:rtl/>
                 <w:szCs w:val="10"/>
               </w:rPr>
-              <w:t>۰٫۷۴۳</w:t>
+              <w:t>۰٫۲۹۷ ± ۰٫۰۹۹</w:t>
             </w:r>
           </w:p>
         </w:tc>
@@ -12036,7 +12910,7 @@
                 <w:rtl/>
                 <w:szCs w:val="10"/>
               </w:rPr>
-              <w:t>۰٫۸۱۲</w:t>
+              <w:t>۰٫۳۱۰ ± ۰٫۰۹۸</w:t>
             </w:r>
           </w:p>
         </w:tc>
@@ -12064,7 +12938,7 @@
                 <w:rtl/>
                 <w:szCs w:val="10"/>
               </w:rPr>
-              <w:t>۰٫۰۸۶</w:t>
+              <w:t>۰٫۰۸۳ ± ۰٫۰۱۲</w:t>
             </w:r>
           </w:p>
         </w:tc>
@@ -12092,7 +12966,7 @@
                 <w:rtl/>
                 <w:szCs w:val="10"/>
               </w:rPr>
-              <w:t>۰٫۰</w:t>
+              <w:t>۰٫۸۱۹ ± ۰٫۰۴۴</w:t>
             </w:r>
           </w:p>
         </w:tc>
@@ -12190,7 +13064,7 @@
                 <w:rtl/>
                 <w:szCs w:val="10"/>
               </w:rPr>
-              <w:t>۰٫۸۸۶</w:t>
+              <w:t>۰٫۳۶۶ ± ۰٫۱۲۰</w:t>
             </w:r>
           </w:p>
         </w:tc>
@@ -12221,7 +13095,7 @@
                 <w:rtl/>
                 <w:szCs w:val="10"/>
               </w:rPr>
-              <w:t>۰٫۹۲۴</w:t>
+              <w:t>۰٫۳۸۲ ± ۰٫۱۱۶</w:t>
             </w:r>
           </w:p>
         </w:tc>
@@ -12252,7 +13126,7 @@
                 <w:rtl/>
                 <w:szCs w:val="10"/>
               </w:rPr>
-              <w:t>۰٫۰۵۷</w:t>
+              <w:t>۰٫۰۷۴ ± ۰٫۰۱۴</w:t>
             </w:r>
           </w:p>
         </w:tc>
@@ -12283,7 +13157,7 @@
                 <w:rtl/>
                 <w:szCs w:val="10"/>
               </w:rPr>
-              <w:t>۰٫۰</w:t>
+              <w:t>۰٫۸۰۷ ± ۰٫۰۳۹</w:t>
             </w:r>
           </w:p>
         </w:tc>
@@ -12372,7 +13246,7 @@
                 <w:rtl/>
                 <w:szCs w:val="10"/>
               </w:rPr>
-              <w:t>۰٫۹۴۳</w:t>
+              <w:t>۰٫۵۰۰ ± ۰٫۱۲۲</w:t>
             </w:r>
           </w:p>
         </w:tc>
@@ -12400,7 +13274,7 @@
                 <w:rtl/>
                 <w:szCs w:val="10"/>
               </w:rPr>
-              <w:t>۰٫۹۵۶</w:t>
+              <w:t>۰٫۵۳۲ ± ۰٫۱۲۰</w:t>
             </w:r>
           </w:p>
         </w:tc>
@@ -12428,7 +13302,7 @@
                 <w:rtl/>
                 <w:szCs w:val="10"/>
               </w:rPr>
-              <w:t>۰٫۰۲۹</w:t>
+              <w:t>۰٫۰۵۹ ± ۰٫۰۱۴</w:t>
             </w:r>
           </w:p>
         </w:tc>
@@ -12456,7 +13330,7 @@
                 <w:rtl/>
                 <w:szCs w:val="10"/>
               </w:rPr>
-              <w:t>۰٫۰</w:t>
+              <w:t>۰٫۸۰۳ ± ۰٫۰۴۱</w:t>
             </w:r>
           </w:p>
         </w:tc>
@@ -12617,11 +13491,11 @@
         </w:tblBorders>
       </w:tblPr>
       <w:tblGrid>
-        <w:gridCol w:w="1650"/>
+        <w:gridCol w:w="1550"/>
         <w:gridCol w:w="750"/>
         <w:gridCol w:w="750"/>
         <w:gridCol w:w="750"/>
-        <w:gridCol w:w="750"/>
+        <w:gridCol w:w="850"/>
       </w:tblGrid>
       <w:tr>
         <w:trPr>
@@ -12629,7 +13503,7 @@
         </w:trPr>
         <w:tc>
           <w:tcPr>
-            <w:tcW w:w="1650" w:type="dxa"/>
+            <w:tcW w:w="1550" w:type="dxa"/>
             <w:tcMar>
               <w:top w:w="12" w:type="dxa"/>
               <w:bottom w:w="12" w:type="dxa"/>
@@ -12757,7 +13631,7 @@
         </w:tc>
         <w:tc>
           <w:tcPr>
-            <w:tcW w:w="750" w:type="dxa"/>
+            <w:tcW w:w="850" w:type="dxa"/>
             <w:tcMar>
               <w:top w:w="12" w:type="dxa"/>
               <w:bottom w:w="12" w:type="dxa"/>
@@ -12794,7 +13668,7 @@
         </w:trPr>
         <w:tc>
           <w:tcPr>
-            <w:tcW w:w="1650" w:type="dxa"/>
+            <w:tcW w:w="1550" w:type="dxa"/>
             <w:tcMar>
               <w:top w:w="12" w:type="dxa"/>
               <w:bottom w:w="12" w:type="dxa"/>
@@ -12861,7 +13735,7 @@
                 <w:rtl/>
                 <w:szCs w:val="10"/>
               </w:rPr>
-              <w:t>۰٫۹۵۷</w:t>
+              <w:t>۰٫۳۸۲</w:t>
             </w:r>
           </w:p>
         </w:tc>
@@ -12892,7 +13766,7 @@
                 <w:rtl/>
                 <w:szCs w:val="10"/>
               </w:rPr>
-              <w:t>۰٫۹۴۳</w:t>
+              <w:t>۰٫۳۶۶</w:t>
             </w:r>
           </w:p>
         </w:tc>
@@ -12923,13 +13797,13 @@
                 <w:rtl/>
                 <w:szCs w:val="10"/>
               </w:rPr>
-              <w:t>+۰٫۰۰۰</w:t>
-            </w:r>
-          </w:p>
-        </w:tc>
-        <w:tc>
-          <w:tcPr>
-            <w:tcW w:w="750" w:type="dxa"/>
+              <w:t>—</w:t>
+            </w:r>
+          </w:p>
+        </w:tc>
+        <w:tc>
+          <w:tcPr>
+            <w:tcW w:w="850" w:type="dxa"/>
             <w:tcMar>
               <w:top w:w="12" w:type="dxa"/>
               <w:bottom w:w="12" w:type="dxa"/>
@@ -12945,6 +13819,17 @@
               <w:spacing w:before="2" w:after="2"/>
               <w:jc w:val="center"/>
             </w:pPr>
+            <w:r>
+              <w:rPr>
+                <w:rFonts w:hint="cs" w:ascii="B Mitra" w:hAnsi="B Mitra" w:cs="B Mitra"/>
+                <w:bCs/>
+                <w:b/>
+                <w:sz w:val="10"/>
+                <w:rtl/>
+                <w:szCs w:val="10"/>
+              </w:rPr>
+              <w:t>مبنا (پیشنهادی)</w:t>
+            </w:r>
           </w:p>
         </w:tc>
       </w:tr>
@@ -12954,7 +13839,7 @@
         </w:trPr>
         <w:tc>
           <w:tcPr>
-            <w:tcW w:w="1650" w:type="dxa"/>
+            <w:tcW w:w="1550" w:type="dxa"/>
             <w:tcMar>
               <w:top w:w="12" w:type="dxa"/>
               <w:bottom w:w="12" w:type="dxa"/>
@@ -13004,7 +13889,7 @@
                 <w:rtl/>
                 <w:szCs w:val="10"/>
               </w:rPr>
-              <w:t>۰٫۹۳۷</w:t>
+              <w:t>۰٫۳۸۴</w:t>
             </w:r>
           </w:p>
         </w:tc>
@@ -13032,7 +13917,7 @@
                 <w:rtl/>
                 <w:szCs w:val="10"/>
               </w:rPr>
-              <w:t>۰٫۹۱۴</w:t>
+              <w:t>۰٫۳۶۹</w:t>
             </w:r>
           </w:p>
         </w:tc>
@@ -13060,27 +13945,36 @@
                 <w:rtl/>
                 <w:szCs w:val="10"/>
               </w:rPr>
-              <w:t>+۰٫۰۰۰</w:t>
-            </w:r>
-          </w:p>
-        </w:tc>
-        <w:tc>
-          <w:tcPr>
-            <w:tcW w:w="750" w:type="dxa"/>
-            <w:tcMar>
-              <w:top w:w="12" w:type="dxa"/>
-              <w:bottom w:w="12" w:type="dxa"/>
-              <w:left w:w="8" w:type="dxa"/>
-              <w:right w:w="8" w:type="dxa"/>
-            </w:tcMar>
-            <w:noWrap/>
-          </w:tcPr>
-          <w:p>
-            <w:pPr>
-              <w:pStyle w:val="FigureText"/>
-              <w:spacing w:before="2" w:after="2"/>
-              <w:jc w:val="center"/>
-            </w:pPr>
+              <w:t>-۰٫۰۰۲</w:t>
+            </w:r>
+          </w:p>
+        </w:tc>
+        <w:tc>
+          <w:tcPr>
+            <w:tcW w:w="850" w:type="dxa"/>
+            <w:tcMar>
+              <w:top w:w="12" w:type="dxa"/>
+              <w:bottom w:w="12" w:type="dxa"/>
+              <w:left w:w="8" w:type="dxa"/>
+              <w:right w:w="8" w:type="dxa"/>
+            </w:tcMar>
+            <w:noWrap/>
+          </w:tcPr>
+          <w:p>
+            <w:pPr>
+              <w:pStyle w:val="FigureText"/>
+              <w:spacing w:before="2" w:after="2"/>
+              <w:jc w:val="center"/>
+            </w:pPr>
+            <w:r>
+              <w:rPr>
+                <w:rFonts w:ascii="Times New Roman" w:hAnsi="Times New Roman" w:cs="Times New Roman"/>
+                <w:bidi w:val="0"/>
+                <w:sz w:val="10"/>
+                <w:szCs w:val="10"/>
+              </w:rPr>
+              <w:t>‎p = 0.846‎</w:t>
+            </w:r>
           </w:p>
         </w:tc>
       </w:tr>
@@ -13090,7 +13984,7 @@
         </w:trPr>
         <w:tc>
           <w:tcPr>
-            <w:tcW w:w="1650" w:type="dxa"/>
+            <w:tcW w:w="1550" w:type="dxa"/>
             <w:tcMar>
               <w:top w:w="12" w:type="dxa"/>
               <w:bottom w:w="12" w:type="dxa"/>
@@ -13158,7 +14052,7 @@
                 <w:rtl/>
                 <w:szCs w:val="10"/>
               </w:rPr>
-              <w:t>۰٫۹۵۶</w:t>
+              <w:t>۰٫۳۹۶</w:t>
             </w:r>
           </w:p>
         </w:tc>
@@ -13186,7 +14080,7 @@
                 <w:rtl/>
                 <w:szCs w:val="10"/>
               </w:rPr>
-              <w:t>۰٫۹۴۳</w:t>
+              <w:t>۰٫۳۷۴</w:t>
             </w:r>
           </w:p>
         </w:tc>
@@ -13214,27 +14108,36 @@
                 <w:rtl/>
                 <w:szCs w:val="10"/>
               </w:rPr>
-              <w:t>+۰٫۰۰۰</w:t>
-            </w:r>
-          </w:p>
-        </w:tc>
-        <w:tc>
-          <w:tcPr>
-            <w:tcW w:w="750" w:type="dxa"/>
-            <w:tcMar>
-              <w:top w:w="12" w:type="dxa"/>
-              <w:bottom w:w="12" w:type="dxa"/>
-              <w:left w:w="8" w:type="dxa"/>
-              <w:right w:w="8" w:type="dxa"/>
-            </w:tcMar>
-            <w:noWrap/>
-          </w:tcPr>
-          <w:p>
-            <w:pPr>
-              <w:pStyle w:val="FigureText"/>
-              <w:spacing w:before="2" w:after="2"/>
-              <w:jc w:val="center"/>
-            </w:pPr>
+              <w:t>-۰٫۰۱۴</w:t>
+            </w:r>
+          </w:p>
+        </w:tc>
+        <w:tc>
+          <w:tcPr>
+            <w:tcW w:w="850" w:type="dxa"/>
+            <w:tcMar>
+              <w:top w:w="12" w:type="dxa"/>
+              <w:bottom w:w="12" w:type="dxa"/>
+              <w:left w:w="8" w:type="dxa"/>
+              <w:right w:w="8" w:type="dxa"/>
+            </w:tcMar>
+            <w:noWrap/>
+          </w:tcPr>
+          <w:p>
+            <w:pPr>
+              <w:pStyle w:val="FigureText"/>
+              <w:spacing w:before="2" w:after="2"/>
+              <w:jc w:val="center"/>
+            </w:pPr>
+            <w:r>
+              <w:rPr>
+                <w:rFonts w:ascii="Times New Roman" w:hAnsi="Times New Roman" w:cs="Times New Roman"/>
+                <w:bidi w:val="0"/>
+                <w:sz w:val="10"/>
+                <w:szCs w:val="10"/>
+              </w:rPr>
+              <w:t>‎p = 0.375‎</w:t>
+            </w:r>
           </w:p>
         </w:tc>
       </w:tr>
@@ -13244,7 +14147,7 @@
         </w:trPr>
         <w:tc>
           <w:tcPr>
-            <w:tcW w:w="1650" w:type="dxa"/>
+            <w:tcW w:w="1550" w:type="dxa"/>
             <w:tcMar>
               <w:top w:w="12" w:type="dxa"/>
               <w:bottom w:w="12" w:type="dxa"/>
@@ -13294,7 +14197,7 @@
                 <w:rtl/>
                 <w:szCs w:val="10"/>
               </w:rPr>
-              <w:t>۰٫۷۳۲</w:t>
+              <w:t>۰٫۴۱۵</w:t>
             </w:r>
           </w:p>
         </w:tc>
@@ -13322,7 +14225,7 @@
                 <w:rtl/>
                 <w:szCs w:val="10"/>
               </w:rPr>
-              <w:t>۰٫۷۷۱</w:t>
+              <w:t>۰٫۳۹۷</w:t>
             </w:r>
           </w:p>
         </w:tc>
@@ -13350,27 +14253,36 @@
                 <w:rtl/>
                 <w:szCs w:val="10"/>
               </w:rPr>
-              <w:t>+۰٫۰۰۰</w:t>
-            </w:r>
-          </w:p>
-        </w:tc>
-        <w:tc>
-          <w:tcPr>
-            <w:tcW w:w="750" w:type="dxa"/>
-            <w:tcMar>
-              <w:top w:w="12" w:type="dxa"/>
-              <w:bottom w:w="12" w:type="dxa"/>
-              <w:left w:w="8" w:type="dxa"/>
-              <w:right w:w="8" w:type="dxa"/>
-            </w:tcMar>
-            <w:noWrap/>
-          </w:tcPr>
-          <w:p>
-            <w:pPr>
-              <w:pStyle w:val="FigureText"/>
-              <w:spacing w:before="2" w:after="2"/>
-              <w:jc w:val="center"/>
-            </w:pPr>
+              <w:t>-۰٫۰۳۳</w:t>
+            </w:r>
+          </w:p>
+        </w:tc>
+        <w:tc>
+          <w:tcPr>
+            <w:tcW w:w="850" w:type="dxa"/>
+            <w:tcMar>
+              <w:top w:w="12" w:type="dxa"/>
+              <w:bottom w:w="12" w:type="dxa"/>
+              <w:left w:w="8" w:type="dxa"/>
+              <w:right w:w="8" w:type="dxa"/>
+            </w:tcMar>
+            <w:noWrap/>
+          </w:tcPr>
+          <w:p>
+            <w:pPr>
+              <w:pStyle w:val="FigureText"/>
+              <w:spacing w:before="2" w:after="2"/>
+              <w:jc w:val="center"/>
+            </w:pPr>
+            <w:r>
+              <w:rPr>
+                <w:rFonts w:ascii="Times New Roman" w:hAnsi="Times New Roman" w:cs="Times New Roman"/>
+                <w:bidi w:val="0"/>
+                <w:sz w:val="10"/>
+                <w:szCs w:val="10"/>
+              </w:rPr>
+              <w:t>‎p = 0.027‎</w:t>
+            </w:r>
           </w:p>
         </w:tc>
       </w:tr>
@@ -13380,7 +14292,7 @@
         </w:trPr>
         <w:tc>
           <w:tcPr>
-            <w:tcW w:w="1650" w:type="dxa"/>
+            <w:tcW w:w="1550" w:type="dxa"/>
             <w:tcMar>
               <w:top w:w="12" w:type="dxa"/>
               <w:bottom w:w="12" w:type="dxa"/>
@@ -13430,7 +14342,7 @@
                 <w:rtl/>
                 <w:szCs w:val="10"/>
               </w:rPr>
-              <w:t>۰٫۹۳۹</w:t>
+              <w:t>۰٫۳۹۴</w:t>
             </w:r>
           </w:p>
         </w:tc>
@@ -13458,7 +14370,7 @@
                 <w:rtl/>
                 <w:szCs w:val="10"/>
               </w:rPr>
-              <w:t>۰٫۹۱۴</w:t>
+              <w:t>۰٫۳۵۴</w:t>
             </w:r>
           </w:p>
         </w:tc>
@@ -13486,27 +14398,36 @@
                 <w:rtl/>
                 <w:szCs w:val="10"/>
               </w:rPr>
-              <w:t>+۰٫۰۰۰</w:t>
-            </w:r>
-          </w:p>
-        </w:tc>
-        <w:tc>
-          <w:tcPr>
-            <w:tcW w:w="750" w:type="dxa"/>
-            <w:tcMar>
-              <w:top w:w="12" w:type="dxa"/>
-              <w:bottom w:w="12" w:type="dxa"/>
-              <w:left w:w="8" w:type="dxa"/>
-              <w:right w:w="8" w:type="dxa"/>
-            </w:tcMar>
-            <w:noWrap/>
-          </w:tcPr>
-          <w:p>
-            <w:pPr>
-              <w:pStyle w:val="FigureText"/>
-              <w:spacing w:before="2" w:after="2"/>
-              <w:jc w:val="center"/>
-            </w:pPr>
+              <w:t>-۰٫۰۱۲</w:t>
+            </w:r>
+          </w:p>
+        </w:tc>
+        <w:tc>
+          <w:tcPr>
+            <w:tcW w:w="850" w:type="dxa"/>
+            <w:tcMar>
+              <w:top w:w="12" w:type="dxa"/>
+              <w:bottom w:w="12" w:type="dxa"/>
+              <w:left w:w="8" w:type="dxa"/>
+              <w:right w:w="8" w:type="dxa"/>
+            </w:tcMar>
+            <w:noWrap/>
+          </w:tcPr>
+          <w:p>
+            <w:pPr>
+              <w:pStyle w:val="FigureText"/>
+              <w:spacing w:before="2" w:after="2"/>
+              <w:jc w:val="center"/>
+            </w:pPr>
+            <w:r>
+              <w:rPr>
+                <w:rFonts w:ascii="Times New Roman" w:hAnsi="Times New Roman" w:cs="Times New Roman"/>
+                <w:bidi w:val="0"/>
+                <w:sz w:val="10"/>
+                <w:szCs w:val="10"/>
+              </w:rPr>
+              <w:t>‎p = 0.695‎</w:t>
+            </w:r>
           </w:p>
         </w:tc>
       </w:tr>
@@ -13516,7 +14437,7 @@
         </w:trPr>
         <w:tc>
           <w:tcPr>
-            <w:tcW w:w="1650" w:type="dxa"/>
+            <w:tcW w:w="1550" w:type="dxa"/>
             <w:tcMar>
               <w:top w:w="12" w:type="dxa"/>
               <w:bottom w:w="12" w:type="dxa"/>
@@ -13566,7 +14487,7 @@
                 <w:rtl/>
                 <w:szCs w:val="10"/>
               </w:rPr>
-              <w:t>۰٫۰۹۹</w:t>
+              <w:t>۰٫۳۱۰</w:t>
             </w:r>
           </w:p>
         </w:tc>
@@ -13594,7 +14515,7 @@
                 <w:rtl/>
                 <w:szCs w:val="10"/>
               </w:rPr>
-              <w:t>۰٫۰۲۹</w:t>
+              <w:t>۰٫۲۸۶</w:t>
             </w:r>
           </w:p>
         </w:tc>
@@ -13622,27 +14543,36 @@
                 <w:rtl/>
                 <w:szCs w:val="10"/>
               </w:rPr>
-              <w:t>+۰٫۰۰۰</w:t>
-            </w:r>
-          </w:p>
-        </w:tc>
-        <w:tc>
-          <w:tcPr>
-            <w:tcW w:w="750" w:type="dxa"/>
-            <w:tcMar>
-              <w:top w:w="12" w:type="dxa"/>
-              <w:bottom w:w="12" w:type="dxa"/>
-              <w:left w:w="8" w:type="dxa"/>
-              <w:right w:w="8" w:type="dxa"/>
-            </w:tcMar>
-            <w:noWrap/>
-          </w:tcPr>
-          <w:p>
-            <w:pPr>
-              <w:pStyle w:val="FigureText"/>
-              <w:spacing w:before="2" w:after="2"/>
-              <w:jc w:val="center"/>
-            </w:pPr>
+              <w:t>+۰٫۰۷۲</w:t>
+            </w:r>
+          </w:p>
+        </w:tc>
+        <w:tc>
+          <w:tcPr>
+            <w:tcW w:w="850" w:type="dxa"/>
+            <w:tcMar>
+              <w:top w:w="12" w:type="dxa"/>
+              <w:bottom w:w="12" w:type="dxa"/>
+              <w:left w:w="8" w:type="dxa"/>
+              <w:right w:w="8" w:type="dxa"/>
+            </w:tcMar>
+            <w:noWrap/>
+          </w:tcPr>
+          <w:p>
+            <w:pPr>
+              <w:pStyle w:val="FigureText"/>
+              <w:spacing w:before="2" w:after="2"/>
+              <w:jc w:val="center"/>
+            </w:pPr>
+            <w:r>
+              <w:rPr>
+                <w:rFonts w:ascii="Times New Roman" w:hAnsi="Times New Roman" w:cs="Times New Roman"/>
+                <w:bidi w:val="0"/>
+                <w:sz w:val="10"/>
+                <w:szCs w:val="10"/>
+              </w:rPr>
+              <w:t>‎p = 0.084‎</w:t>
+            </w:r>
           </w:p>
         </w:tc>
       </w:tr>
@@ -13652,7 +14582,7 @@
         </w:trPr>
         <w:tc>
           <w:tcPr>
-            <w:tcW w:w="1650" w:type="dxa"/>
+            <w:tcW w:w="1550" w:type="dxa"/>
             <w:tcMar>
               <w:top w:w="12" w:type="dxa"/>
               <w:bottom w:w="12" w:type="dxa"/>
@@ -13702,7 +14632,7 @@
                 <w:rtl/>
                 <w:szCs w:val="10"/>
               </w:rPr>
-              <w:t>۰٫۰۸۳</w:t>
+              <w:t>۰٫۲۳۷</w:t>
             </w:r>
           </w:p>
         </w:tc>
@@ -13730,7 +14660,7 @@
                 <w:rtl/>
                 <w:szCs w:val="10"/>
               </w:rPr>
-              <w:t>۰٫۱۱۴</w:t>
+              <w:t>۰٫۲۱۴</w:t>
             </w:r>
           </w:p>
         </w:tc>
@@ -13758,27 +14688,36 @@
                 <w:rtl/>
                 <w:szCs w:val="10"/>
               </w:rPr>
-              <w:t>+۰٫۰۰۰</w:t>
-            </w:r>
-          </w:p>
-        </w:tc>
-        <w:tc>
-          <w:tcPr>
-            <w:tcW w:w="750" w:type="dxa"/>
-            <w:tcMar>
-              <w:top w:w="12" w:type="dxa"/>
-              <w:bottom w:w="12" w:type="dxa"/>
-              <w:left w:w="8" w:type="dxa"/>
-              <w:right w:w="8" w:type="dxa"/>
-            </w:tcMar>
-            <w:noWrap/>
-          </w:tcPr>
-          <w:p>
-            <w:pPr>
-              <w:pStyle w:val="FigureText"/>
-              <w:spacing w:before="2" w:after="2"/>
-              <w:jc w:val="center"/>
-            </w:pPr>
+              <w:t>+۰٫۱۴۵</w:t>
+            </w:r>
+          </w:p>
+        </w:tc>
+        <w:tc>
+          <w:tcPr>
+            <w:tcW w:w="850" w:type="dxa"/>
+            <w:tcMar>
+              <w:top w:w="12" w:type="dxa"/>
+              <w:bottom w:w="12" w:type="dxa"/>
+              <w:left w:w="8" w:type="dxa"/>
+              <w:right w:w="8" w:type="dxa"/>
+            </w:tcMar>
+            <w:noWrap/>
+          </w:tcPr>
+          <w:p>
+            <w:pPr>
+              <w:pStyle w:val="FigureText"/>
+              <w:spacing w:before="2" w:after="2"/>
+              <w:jc w:val="center"/>
+            </w:pPr>
+            <w:r>
+              <w:rPr>
+                <w:rFonts w:ascii="Times New Roman" w:hAnsi="Times New Roman" w:cs="Times New Roman"/>
+                <w:bidi w:val="0"/>
+                <w:sz w:val="10"/>
+                <w:szCs w:val="10"/>
+              </w:rPr>
+              <w:t>‎p = 0.002‎</w:t>
+            </w:r>
           </w:p>
         </w:tc>
       </w:tr>
@@ -14578,7 +15517,7 @@
                 <w:rtl/>
                 <w:szCs w:val="10"/>
               </w:rPr>
-              <w:t>۰٫۳۴۳</w:t>
+              <w:t>۰٫۳۰۱</w:t>
             </w:r>
           </w:p>
         </w:tc>
@@ -14788,7 +15727,7 @@
                 <w:rtl/>
                 <w:szCs w:val="10"/>
               </w:rPr>
-              <w:t>۰٫۳۱۹</w:t>
+              <w:t>۰٫۲۶۲</w:t>
             </w:r>
           </w:p>
         </w:tc>
@@ -15208,7 +16147,7 @@
                 <w:rtl/>
                 <w:szCs w:val="10"/>
               </w:rPr>
-              <w:t>۰٫۲۹۲</w:t>
+              <w:t>۰٫۲۴۷</w:t>
             </w:r>
           </w:p>
         </w:tc>
@@ -15418,7 +16357,7 @@
                 <w:rtl/>
                 <w:szCs w:val="10"/>
               </w:rPr>
-              <w:t>۰٫۲۸۸</w:t>
+              <w:t>۰٫۲۲۸</w:t>
             </w:r>
           </w:p>
         </w:tc>

</xml_diff>

<commit_message>
fix(manuscript): address 14 reviewer critiques across English and Persian papers
- Synchronized Tables I-V directly from audited 10-seed experiment CSVs
- Included HAMTA in Table I (MAE 4.48) and Table II (P@35 0.366, Recall 0.686, NDCG 0.669)
- Resolved target count ambiguity strictly to 51 targets (51/350 = 14.6%, lift 2.51x)
- Formalized asymmetric one-sided prediction bounds (R+ and R-) for heteroscedastic upper and lower bounds
- Replaced Conformal Prediction claims with One-Sided Temporal Prediction-Interval Calibration
- Softened campaign opportunity claims from causal uplift to peer-relative underperformance screening
- Acknowledged synthetic stream limitations and framed curvature as inductive regularizer
- Clarified intermediate nature of forecasting accuracy and reported honest multi-budget results (SFA at K=10, HAMTA at K>=20)
- Fixed duplicate reference numbering [14]/[15] (GbRPR 2025) and updated Word and PDF exports
</commit_message>
<xml_diff>
--- a/FA_From_Transactional_Data_to_Organizational_Intelligence.docx
+++ b/FA_From_Transactional_Data_to_Organizational_Intelligence.docx
@@ -3468,7 +3468,7 @@
           <w:rtl/>
           <w:szCs w:val="18"/>
         </w:rPr>
-        <w:t xml:space="preserve">-دوره ۳ برازش نهایی، دوره ۴ واسنجی کاملاً تمیز بر داده‌های طبیعی دست‌نخورده، و دوره ۵ پنجره آزمون و اعمال افت فرصت. بر روی داده‌های کاملاً طبیعی دوره ۴، پسماندهای یک‌طرفه نوسانات مثبت طبیعی را می‌سنجند </w:t>
+        <w:t xml:space="preserve">-دوره ۳ برازش نهایی، دوره ۴ واسنجی کاملاً تمیز بر داده‌های طبیعی دست‌نخورده، و دوره ۵ پنجره آزمون و اعمال افت فرصت. جهت تطبیق دقیق با چولگی و ناهم‌واریانسی داده‌های شمارشی با توزیع بیش‌پراکنده، صدک‌های دم یک‌طرفه به صورت نامتقارن برای سقف طبیعی و کف محافظه‌کارانه همتایان واسنجی می‌شوند. پسماندهای یک‌طرفه صعودی نوسانات مثبت طبیعی را می‌سنجند </w:t>
       </w:r>
       <w:r>
         <w:rPr>
@@ -3515,7 +3515,7 @@
           <w:sz w:val="17"/>
           <w:szCs w:val="17"/>
         </w:rPr>
-        <w:t>_m = max( 0 , Y_m - μ̂_m )</w:t>
+        <w:t>_m^+ = max( 0 , Y_m - μ̂_m )</w:t>
       </w:r>
     </w:p>
     <w:p>
@@ -3548,7 +3548,7 @@
           <w:rtl/>
           <w:szCs w:val="18"/>
         </w:rPr>
-        <w:t>، صدک واسنجی‌شده استخراج شده و کران بالای طبیعی عملکرد پیش‌بینی مطابق رابطه (</w:t>
+        <w:t xml:space="preserve"> (پوشش هدف ۸۵٪ کران بالا)، صدک واسنجی‌شده صعودی استخراج شده و کران بالای طبیعی عملکرد پیش‌بینی مطابق رابطه (</w:t>
       </w:r>
       <w:r>
         <w:rPr>
@@ -3595,7 +3595,7 @@
           <w:sz w:val="17"/>
           <w:szCs w:val="17"/>
         </w:rPr>
-        <w:t>_{0.85} = Quantile_{0.85}( { R_m } )</w:t>
+        <w:t>_{0.85}^+ = Quantile_{0.85}( { R_m^+ } )</w:t>
       </w:r>
     </w:p>
     <w:tbl>
@@ -3676,7 +3676,7 @@
                 <w:sz w:val="17"/>
                 <w:szCs w:val="17"/>
               </w:rPr>
-              <w:t>_{m, t+1} = μ̂_{m, t+1} + q_{0.85}</w:t>
+              <w:t>_{m, t+1} = μ̂_{m, t+1} + q_{0.85}^+</w:t>
             </w:r>
           </w:p>
         </w:tc>
@@ -3769,25 +3769,145 @@
           <w:rtl/>
           <w:szCs w:val="18"/>
         </w:rPr>
-        <w:t xml:space="preserve">برای جلوگیری از خوش‌بینی مفرط، بنچ‌مارک همتایان بر پایه کران پایین پیش‌بینی همتایان با مقدار واسنجی‌شده یکسان </w:t>
-      </w:r>
-      <w:r>
-        <w:rPr>
-          <w:rFonts w:ascii="Times New Roman" w:hAnsi="Times New Roman" w:cs="Times New Roman"/>
-          <w:bidi w:val="0"/>
-          <w:sz w:val="17"/>
-          <w:szCs w:val="17"/>
-        </w:rPr>
-        <w:t>‎q_j = q_0.85‎</w:t>
-      </w:r>
-      <w:r>
-        <w:rPr>
-          <w:rFonts w:hint="cs" w:ascii="B Mitra" w:hAnsi="B Mitra" w:cs="B Mitra"/>
-          <w:sz w:val="18"/>
-          <w:rtl/>
-          <w:szCs w:val="18"/>
-        </w:rPr>
-        <w:t xml:space="preserve"> تعریف می‌گردد:</w:t>
+        <w:t xml:space="preserve">برای جلوگیری از خوش‌بینی مفرط، بنچ‌مارک همتایان بر پایه کران پایین پیش‌بینی همتایان تعریف می‌گردد. به طور متقارن، پسماندهای یک‌طرفه نزولی </w:t>
+      </w:r>
+      <w:r>
+        <w:rPr>
+          <w:rFonts w:ascii="Times New Roman" w:hAnsi="Times New Roman" w:cs="Times New Roman"/>
+          <w:bidi w:val="0"/>
+          <w:sz w:val="17"/>
+          <w:szCs w:val="17"/>
+        </w:rPr>
+        <w:t>‎R_j^- = max‎</w:t>
+      </w:r>
+      <w:r>
+        <w:rPr>
+          <w:rFonts w:hint="cs" w:ascii="B Mitra" w:hAnsi="B Mitra" w:cs="B Mitra"/>
+          <w:sz w:val="18"/>
+          <w:rtl/>
+          <w:szCs w:val="18"/>
+        </w:rPr>
+        <w:t>(</w:t>
+      </w:r>
+      <w:r>
+        <w:rPr>
+          <w:rFonts w:ascii="Times New Roman" w:hAnsi="Times New Roman" w:cs="Times New Roman"/>
+          <w:bidi w:val="0"/>
+          <w:sz w:val="17"/>
+          <w:szCs w:val="17"/>
+        </w:rPr>
+        <w:t>‎0‎</w:t>
+      </w:r>
+      <w:r>
+        <w:rPr>
+          <w:rFonts w:hint="cs" w:ascii="B Mitra" w:hAnsi="B Mitra" w:cs="B Mitra"/>
+          <w:sz w:val="18"/>
+          <w:rtl/>
+          <w:szCs w:val="18"/>
+        </w:rPr>
+        <w:t xml:space="preserve">, </w:t>
+      </w:r>
+      <w:r>
+        <w:rPr>
+          <w:rFonts w:ascii="Times New Roman" w:hAnsi="Times New Roman" w:cs="Times New Roman"/>
+          <w:bidi w:val="0"/>
+          <w:sz w:val="17"/>
+          <w:szCs w:val="17"/>
+        </w:rPr>
+        <w:t>‎μ̂_j - Y_j‎</w:t>
+      </w:r>
+      <w:r>
+        <w:rPr>
+          <w:rFonts w:hint="cs" w:ascii="B Mitra" w:hAnsi="B Mitra" w:cs="B Mitra"/>
+          <w:sz w:val="18"/>
+          <w:rtl/>
+          <w:szCs w:val="18"/>
+        </w:rPr>
+        <w:t xml:space="preserve">) صدک مستقل دم پایین </w:t>
+      </w:r>
+      <w:r>
+        <w:rPr>
+          <w:rFonts w:ascii="Times New Roman" w:hAnsi="Times New Roman" w:cs="Times New Roman"/>
+          <w:iCs/>
+          <w:i/>
+          <w:bidi w:val="0"/>
+          <w:sz w:val="17"/>
+          <w:szCs w:val="17"/>
+        </w:rPr>
+        <w:t>‎q‎</w:t>
+      </w:r>
+      <w:r>
+        <w:rPr>
+          <w:rFonts w:ascii="Times New Roman" w:hAnsi="Times New Roman" w:cs="Times New Roman"/>
+          <w:bidi w:val="0"/>
+          <w:sz w:val="17"/>
+          <w:vertAlign w:val="subscript"/>
+          <w:szCs w:val="17"/>
+        </w:rPr>
+        <w:t>‎0.85‎</w:t>
+      </w:r>
+      <w:r>
+        <w:rPr>
+          <w:rFonts w:hint="cs" w:ascii="B Mitra" w:hAnsi="B Mitra" w:cs="B Mitra"/>
+          <w:sz w:val="18"/>
+          <w:rtl/>
+          <w:szCs w:val="18"/>
+        </w:rPr>
+        <w:t xml:space="preserve">^- = </w:t>
+      </w:r>
+      <w:r>
+        <w:rPr>
+          <w:rFonts w:ascii="Times New Roman" w:hAnsi="Times New Roman" w:cs="Times New Roman"/>
+          <w:bidi w:val="0"/>
+          <w:sz w:val="17"/>
+          <w:szCs w:val="17"/>
+        </w:rPr>
+        <w:t>‎Quantile_‎</w:t>
+      </w:r>
+      <w:r>
+        <w:rPr>
+          <w:rFonts w:hint="cs" w:ascii="B Mitra" w:hAnsi="B Mitra" w:cs="B Mitra"/>
+          <w:sz w:val="18"/>
+          <w:rtl/>
+          <w:szCs w:val="18"/>
+        </w:rPr>
+        <w:t>{</w:t>
+      </w:r>
+      <w:r>
+        <w:rPr>
+          <w:rFonts w:ascii="Times New Roman" w:hAnsi="Times New Roman" w:cs="Times New Roman"/>
+          <w:bidi w:val="0"/>
+          <w:sz w:val="17"/>
+          <w:szCs w:val="17"/>
+        </w:rPr>
+        <w:t>‎0.85‎</w:t>
+      </w:r>
+      <w:r>
+        <w:rPr>
+          <w:rFonts w:hint="cs" w:ascii="B Mitra" w:hAnsi="B Mitra" w:cs="B Mitra"/>
+          <w:sz w:val="18"/>
+          <w:rtl/>
+          <w:szCs w:val="18"/>
+        </w:rPr>
+        <w:t>}({</w:t>
+      </w:r>
+      <w:r>
+        <w:rPr>
+          <w:rFonts w:ascii="Times New Roman" w:hAnsi="Times New Roman" w:cs="Times New Roman"/>
+          <w:bidi w:val="0"/>
+          <w:sz w:val="17"/>
+          <w:szCs w:val="17"/>
+        </w:rPr>
+        <w:t>‎R_j^‎</w:t>
+      </w:r>
+      <w:r>
+        <w:rPr>
+          <w:rFonts w:hint="cs" w:ascii="B Mitra" w:hAnsi="B Mitra" w:cs="B Mitra"/>
+          <w:sz w:val="18"/>
+          <w:rtl/>
+          <w:szCs w:val="18"/>
+        </w:rPr>
+        <w:t>-}) را تعیین نموده و کران پایین محافظه‌کارانه همتا را به دست می‌دهند:</w:t>
       </w:r>
     </w:p>
     <w:p>
@@ -3816,7 +3936,7 @@
           <w:sz w:val="17"/>
           <w:szCs w:val="17"/>
         </w:rPr>
-        <w:t>_j = max( 0 , μ̂_j - q_j )</w:t>
+        <w:t>_j = max( 0 , μ̂_j - q_{0.85}^- )</w:t>
       </w:r>
     </w:p>
     <w:p>

</xml_diff>

<commit_message>
fix(figures): fix RTL typography and character shaping in Persian publication figures
- Removed bidi.get_display and arabic_reshaper calls that caused disjointed and reversed Persian characters
- Configured native HarfBuzz OpenType layout with Tahoma font across all figures
- Fixed layout in Fig 3 (M-GATO walkthrough) with non-overlapping callout box and clean 2-line category labels
- Fixed multi-stage cards in Fig 1 architecture diagram to prevent text overflow
- Updated Fig 4 and Fig 5 baseline references to 51 targets (0.146 random chance) and updated Persian labels
- Re-exported FA and EN papers to .docx, .doc, and .pdf
</commit_message>
<xml_diff>
--- a/FA_From_Transactional_Data_to_Organizational_Intelligence.docx
+++ b/FA_From_Transactional_Data_to_Organizational_Intelligence.docx
@@ -1622,7 +1622,7 @@
       <w:r>
         <w:drawing>
           <wp:inline xmlns:a="http://schemas.openxmlformats.org/drawingml/2006/main" xmlns:pic="http://schemas.openxmlformats.org/drawingml/2006/picture">
-            <wp:extent cx="2736000" cy="1083975"/>
+            <wp:extent cx="2736000" cy="1122406"/>
             <wp:docPr id="1" name="Picture 1"/>
             <wp:cNvGraphicFramePr>
               <a:graphicFrameLocks noChangeAspect="1"/>
@@ -1643,7 +1643,7 @@
                   <pic:spPr>
                     <a:xfrm>
                       <a:off x="0" y="0"/>
-                      <a:ext cx="2736000" cy="1083975"/>
+                      <a:ext cx="2736000" cy="1122406"/>
                     </a:xfrm>
                     <a:prstGeom prst="rect"/>
                   </pic:spPr>
@@ -4869,7 +4869,7 @@
       <w:r>
         <w:drawing>
           <wp:inline xmlns:a="http://schemas.openxmlformats.org/drawingml/2006/main" xmlns:pic="http://schemas.openxmlformats.org/drawingml/2006/picture">
-            <wp:extent cx="2736000" cy="1656141"/>
+            <wp:extent cx="2736000" cy="1597755"/>
             <wp:docPr id="3" name="Picture 3"/>
             <wp:cNvGraphicFramePr>
               <a:graphicFrameLocks noChangeAspect="1"/>
@@ -4890,7 +4890,7 @@
                   <pic:spPr>
                     <a:xfrm>
                       <a:off x="0" y="0"/>
-                      <a:ext cx="2736000" cy="1656141"/>
+                      <a:ext cx="2736000" cy="1597755"/>
                     </a:xfrm>
                     <a:prstGeom prst="rect"/>
                   </pic:spPr>
@@ -8596,7 +8596,7 @@
       <w:r>
         <w:drawing>
           <wp:inline xmlns:a="http://schemas.openxmlformats.org/drawingml/2006/main" xmlns:pic="http://schemas.openxmlformats.org/drawingml/2006/picture">
-            <wp:extent cx="2736000" cy="1026000"/>
+            <wp:extent cx="2736000" cy="1078615"/>
             <wp:docPr id="4" name="Picture 4"/>
             <wp:cNvGraphicFramePr>
               <a:graphicFrameLocks noChangeAspect="1"/>
@@ -8617,7 +8617,7 @@
                   <pic:spPr>
                     <a:xfrm>
                       <a:off x="0" y="0"/>
-                      <a:ext cx="2736000" cy="1026000"/>
+                      <a:ext cx="2736000" cy="1078615"/>
                     </a:xfrm>
                     <a:prstGeom prst="rect"/>
                   </pic:spPr>
@@ -16493,7 +16493,7 @@
       <w:r>
         <w:drawing>
           <wp:inline xmlns:a="http://schemas.openxmlformats.org/drawingml/2006/main" xmlns:pic="http://schemas.openxmlformats.org/drawingml/2006/picture">
-            <wp:extent cx="2736000" cy="1253936"/>
+            <wp:extent cx="2736000" cy="1316089"/>
             <wp:docPr id="5" name="Picture 5"/>
             <wp:cNvGraphicFramePr>
               <a:graphicFrameLocks noChangeAspect="1"/>
@@ -16514,7 +16514,7 @@
                   <pic:spPr>
                     <a:xfrm>
                       <a:off x="0" y="0"/>
-                      <a:ext cx="2736000" cy="1253936"/>
+                      <a:ext cx="2736000" cy="1316089"/>
                     </a:xfrm>
                     <a:prstGeom prst="rect"/>
                   </pic:spPr>

</xml_diff>

<commit_message>
fix(methodology): clarify persistent structural underperformance onset across Periods 4-5 and formalize recovery protocols
</commit_message>
<xml_diff>
--- a/FA_From_Transactional_Data_to_Organizational_Intelligence.docx
+++ b/FA_From_Transactional_Data_to_Organizational_Intelligence.docx
@@ -5004,7 +5004,61 @@
           <w:rtl/>
           <w:szCs w:val="18"/>
         </w:rPr>
-        <w:t>فرمول‌بندی برچسب فرصت: برچسب فرصت منحصراً به صورت بازیابی ریاضی اهداف افت ساختاری مصنوعی تعریف می‌شود. تعداد ۵۱ پذیرنده از ۳۵۰ پذیرنده (۱۴٫۶٪) با نمونه‌گیری طبقه‌بندی‌شده در تمامی اصناف به عنوان هدف تعیین شدند. هم‌پوشانی هدف-همتا پایین بوده و به طور میانگین تنها ۱۱٫۸٪ از همتایان یک هدف، خودشان هدف هستند. سناریوها شامل الف (افت ۱۸٪)، ب (افت ۳۲٪) و ج (افت ۴۸٪) هستند. در سناریوی شاهد منفی (</w:t>
+        <w:t>فرمول‌بندی برچسب فرصت: برچسب فرصت منحصراً به صورت بازیابی ریاضی اهداف افت ساختاری مصنوعی تعریف می‌شود. یک پذیرنده دارای برچسب فرصت (</w:t>
+      </w:r>
+      <w:r>
+        <w:rPr>
+          <w:rFonts w:ascii="Times New Roman" w:hAnsi="Times New Roman" w:cs="Times New Roman"/>
+          <w:bidi w:val="0"/>
+          <w:sz w:val="17"/>
+          <w:szCs w:val="17"/>
+        </w:rPr>
+        <w:t>‎Opportunity(m)‎</w:t>
+      </w:r>
+      <w:r>
+        <w:rPr>
+          <w:rFonts w:hint="cs" w:ascii="B Mitra" w:hAnsi="B Mitra" w:cs="B Mitra"/>
+          <w:sz w:val="18"/>
+          <w:rtl/>
+          <w:szCs w:val="18"/>
+        </w:rPr>
+        <w:t xml:space="preserve"> = </w:t>
+      </w:r>
+      <w:r>
+        <w:rPr>
+          <w:rFonts w:ascii="Times New Roman" w:hAnsi="Times New Roman" w:cs="Times New Roman"/>
+          <w:bidi w:val="0"/>
+          <w:sz w:val="17"/>
+          <w:szCs w:val="17"/>
+        </w:rPr>
+        <w:t>‎1‎</w:t>
+      </w:r>
+      <w:r>
+        <w:rPr>
+          <w:rFonts w:hint="cs" w:ascii="B Mitra" w:hAnsi="B Mitra" w:cs="B Mitra"/>
+          <w:sz w:val="18"/>
+          <w:rtl/>
+          <w:szCs w:val="18"/>
+        </w:rPr>
+        <w:t xml:space="preserve">) است اگر و تنها اگر افت ساختاری برون‌زای </w:t>
+      </w:r>
+      <w:r>
+        <w:rPr>
+          <w:rFonts w:ascii="Times New Roman" w:hAnsi="Times New Roman" w:cs="Times New Roman"/>
+          <w:bidi w:val="0"/>
+          <w:sz w:val="17"/>
+          <w:szCs w:val="17"/>
+        </w:rPr>
+        <w:t>‎d &gt; 0‎</w:t>
+      </w:r>
+      <w:r>
+        <w:rPr>
+          <w:rFonts w:hint="cs" w:ascii="B Mitra" w:hAnsi="B Mitra" w:cs="B Mitra"/>
+          <w:sz w:val="18"/>
+          <w:rtl/>
+          <w:szCs w:val="18"/>
+        </w:rPr>
+        <w:t xml:space="preserve"> در نرخ تولید تراکنش آن از دوره پایش ۴ آغاز شده و در دوره آزمون ۵ تداوم یافته باشد. دقیقاً تعداد ۵۱ پذیرنده از ۳۵۰ پذیرنده (۱۴٫۶٪) با نمونه‌گیری طبقه‌بندی‌شده از میان کاندیداهای دارای بنچ‌مارک فعال همتایان در تمامی اصناف به عنوان هدف تعیین شدند. هم‌پوشانی هدف-همتا پایین بوده و به طور میانگین تنها ۱۱٫۸٪ از همتایان یک هدف، خودشان هدف هستند. سناریوها شامل الف (افت ۱۸٪ با نویز ۳٫۰)، ب (افت ۳۲٪ با نویز ۱٫۸) و ج (افت ۴۸٪ با نویز ۰٫۹) هستند. در سناریوی شاهد منفی (</w:t>
       </w:r>
       <w:r>
         <w:rPr>
@@ -5022,7 +5076,7 @@
           <w:rtl/>
           <w:szCs w:val="18"/>
         </w:rPr>
-        <w:t>)، مقدار افت صفر بوده تا وضعیت عدم وجود مثبت واقعی (</w:t>
+        <w:t>)، مقدار افت برای تمامی پذیرندگان صفر بوده تا وضعیت عدم وجود مثبت واقعی (</w:t>
       </w:r>
       <w:r>
         <w:rPr>
@@ -5040,7 +5094,7 @@
           <w:rtl/>
           <w:szCs w:val="18"/>
         </w:rPr>
-        <w:t>) جهت ارزیابی هشدار کاذب بررسی شود.</w:t>
+        <w:t>) جهت ارزیابی نرخ هشدار کاذب بررسی شود.</w:t>
       </w:r>
     </w:p>
     <w:p>
@@ -8737,6 +8791,24 @@
           <w:sz w:val="17"/>
           <w:szCs w:val="17"/>
         </w:rPr>
+        <w:t>‎Recall@35‎</w:t>
+      </w:r>
+      <w:r>
+        <w:rPr>
+          <w:rFonts w:hint="cs" w:ascii="B Mitra" w:hAnsi="B Mitra" w:cs="B Mitra"/>
+          <w:sz w:val="18"/>
+          <w:rtl/>
+          <w:szCs w:val="18"/>
+        </w:rPr>
+        <w:t xml:space="preserve"> معادل ۰٫۲۴۶ ± ۰٫۰۸۱ (با سقف نظری ۰٫۶۸۶ برای ۳۵ جایگاه از ۵۱ هدف)، </w:t>
+      </w:r>
+      <w:r>
+        <w:rPr>
+          <w:rFonts w:ascii="Times New Roman" w:hAnsi="Times New Roman" w:cs="Times New Roman"/>
+          <w:bidi w:val="0"/>
+          <w:sz w:val="17"/>
+          <w:szCs w:val="17"/>
+        </w:rPr>
         <w:t>‎NDCG@35‎</w:t>
       </w:r>
       <w:r>
@@ -12225,7 +12297,7 @@
           <w:rtl/>
           <w:szCs w:val="18"/>
         </w:rPr>
-        <w:t xml:space="preserve"> دقت ۰٫۳۶۶ در برابر ۰٫۲۸۰؛ و در </w:t>
+        <w:t xml:space="preserve"> دقت ۰٫۳۶۶ در برابر ۰٫۳۵۷؛ و در </w:t>
       </w:r>
       <w:r>
         <w:rPr>
@@ -12243,7 +12315,7 @@
           <w:rtl/>
           <w:szCs w:val="18"/>
         </w:rPr>
-        <w:t xml:space="preserve"> دقت ۰٫۳۲۰ در برابر ۰٫۲۳۰. تحت تصحیح هولم-بونفرونی برای مقایسه‌های چندگانه، برتری‌های </w:t>
+        <w:t xml:space="preserve"> دقت ۰٫۳۴۰ در برابر ۰٫۳۲۲. تحت تصحیح هولم-بونفرونی برای مقایسه‌های چندگانه، برتری‌های </w:t>
       </w:r>
       <w:r>
         <w:rPr>
@@ -16748,7 +16820,61 @@
           <w:rtl/>
           <w:szCs w:val="18"/>
         </w:rPr>
-        <w:t>تهدیدات اعتبار تجربی: (۱) سلامت پروتکل ارزیابی: طراحی پروتکل مانع از دسترسی مستقیم به مشاهدات دوره آزمون در برازش مدل، تنظیم همتایان و واسنجی بازه پیش‌بینی می‌شود. (۲) اثر هم‌نوع‌خواری تجاری (</w:t>
+        <w:t xml:space="preserve">تهدیدات اعتبار تجربی: (۱) سلامت پروتکل ارزیابی و تمایز پروتکل‌ها: چارچوب </w:t>
+      </w:r>
+      <w:r>
+        <w:rPr>
+          <w:rFonts w:ascii="Times New Roman" w:hAnsi="Times New Roman" w:cs="Times New Roman"/>
+          <w:bidi w:val="0"/>
+          <w:sz w:val="17"/>
+          <w:szCs w:val="17"/>
+        </w:rPr>
+        <w:t>‎HAMTA‎</w:t>
+      </w:r>
+      <w:r>
+        <w:rPr>
+          <w:rFonts w:hint="cs" w:ascii="B Mitra" w:hAnsi="B Mitra" w:cs="B Mitra"/>
+          <w:sz w:val="18"/>
+          <w:rtl/>
+          <w:szCs w:val="18"/>
+        </w:rPr>
+        <w:t xml:space="preserve"> بر مبنای «پروتکل الف: بازیابی و اولویت‌بندی افت ساختاری مستمر» (</w:t>
+      </w:r>
+      <w:r>
+        <w:rPr>
+          <w:rFonts w:ascii="Times New Roman" w:hAnsi="Times New Roman" w:cs="Times New Roman"/>
+          <w:bidi w:val="0"/>
+          <w:sz w:val="17"/>
+          <w:szCs w:val="17"/>
+        </w:rPr>
+        <w:t>‎Persistent Underperformance Recovery‎</w:t>
+      </w:r>
+      <w:r>
+        <w:rPr>
+          <w:rFonts w:hint="cs" w:ascii="B Mitra" w:hAnsi="B Mitra" w:cs="B Mitra"/>
+          <w:sz w:val="18"/>
+          <w:rtl/>
+          <w:szCs w:val="18"/>
+        </w:rPr>
+        <w:t>) عمل می‌کند که در آن واگرایی نزولی در دوره پایش (دوره ۴) آشکار شده و در پنجره تصمیم‌گیری کمپین (دوره ۵) استمرار می‌یابد. طراحی پروتکل مانع از دسترسی به اطلاعات دوره آزمون ۵ در زمان پیش‌بینی و رتبه‌بندی می‌شود. در نقطه مقابل، در «پروتکل ب: پیش‌بینی شوک‌های ناگهانی پیشینی» (</w:t>
+      </w:r>
+      <w:r>
+        <w:rPr>
+          <w:rFonts w:ascii="Times New Roman" w:hAnsi="Times New Roman" w:cs="Times New Roman"/>
+          <w:bidi w:val="0"/>
+          <w:sz w:val="17"/>
+          <w:szCs w:val="17"/>
+        </w:rPr>
+        <w:t>‎Pure Ex-Ante Shocks‎</w:t>
+      </w:r>
+      <w:r>
+        <w:rPr>
+          <w:rFonts w:hint="cs" w:ascii="B Mitra" w:hAnsi="B Mitra" w:cs="B Mitra"/>
+          <w:sz w:val="18"/>
+          <w:rtl/>
+          <w:szCs w:val="18"/>
+        </w:rPr>
+        <w:t>) که افت به صورت تصادفی صرفاً در دوره ۵ بدون هیچ نشانه قبلی رخ دهد، هیچ مدلی بدون ویژگی‌های پیش‌نگر قادر به تشخیص برتر از شانس تصادفی (۱۴٫۶٪) نخواهد بود. (۲) اثر هم‌نوع‌خواری تجاری (</w:t>
       </w:r>
       <w:r>
         <w:rPr>

</xml_diff>

<commit_message>
fix(manuscript): reconcile 52-target ground truth, resolve citation bracket bidi rendering, and align bibliography with publisher records
</commit_message>
<xml_diff>
--- a/FA_From_Transactional_Data_to_Organizational_Intelligence.docx
+++ b/FA_From_Transactional_Data_to_Organizational_Intelligence.docx
@@ -85,6 +85,7 @@
           <w:rFonts w:ascii="Times New Roman" w:hAnsi="Times New Roman" w:cs="Times New Roman"/>
           <w:bidi w:val="0"/>
           <w:sz w:val="17"/>
+          <w:rtl w:val="0"/>
           <w:szCs w:val="17"/>
         </w:rPr>
         <w:t>saeed.aliakbari@rayamate.ir</w:t>
@@ -116,6 +117,7 @@
           <w:rFonts w:ascii="Times New Roman" w:hAnsi="Times New Roman" w:cs="Times New Roman"/>
           <w:bidi w:val="0"/>
           <w:sz w:val="17"/>
+          <w:rtl w:val="0"/>
           <w:szCs w:val="17"/>
         </w:rPr>
         <w:t>saeed.shahsavan@rayamate.ir</w:t>
@@ -155,6 +157,7 @@
           <w:rFonts w:ascii="Times New Roman" w:hAnsi="Times New Roman" w:cs="Times New Roman"/>
           <w:bidi w:val="0"/>
           <w:sz w:val="17"/>
+          <w:rtl w:val="0"/>
           <w:szCs w:val="17"/>
         </w:rPr>
         <w:t>‎RFM‎</w:t>
@@ -173,6 +176,7 @@
           <w:rFonts w:ascii="Times New Roman" w:hAnsi="Times New Roman" w:cs="Times New Roman"/>
           <w:bidi w:val="0"/>
           <w:sz w:val="17"/>
+          <w:rtl w:val="0"/>
           <w:szCs w:val="17"/>
         </w:rPr>
         <w:t>‎HAMTA‎</w:t>
@@ -191,6 +195,7 @@
           <w:rFonts w:ascii="Times New Roman" w:hAnsi="Times New Roman" w:cs="Times New Roman"/>
           <w:bidi w:val="0"/>
           <w:sz w:val="17"/>
+          <w:rtl w:val="0"/>
           <w:szCs w:val="17"/>
         </w:rPr>
         <w:t>‎HAMTA‎</w:t>
@@ -209,6 +214,7 @@
           <w:rFonts w:ascii="Times New Roman" w:hAnsi="Times New Roman" w:cs="Times New Roman"/>
           <w:bidi w:val="0"/>
           <w:sz w:val="17"/>
+          <w:rtl w:val="0"/>
           <w:szCs w:val="17"/>
         </w:rPr>
         <w:t>‎M-GATO‎</w:t>
@@ -227,6 +233,7 @@
           <w:rFonts w:ascii="Times New Roman" w:hAnsi="Times New Roman" w:cs="Times New Roman"/>
           <w:bidi w:val="0"/>
           <w:sz w:val="17"/>
+          <w:rtl w:val="0"/>
           <w:szCs w:val="17"/>
         </w:rPr>
         <w:t>‎HAMTA‎</w:t>
@@ -238,7 +245,7 @@
           <w:rtl/>
           <w:szCs w:val="18"/>
         </w:rPr>
-        <w:t xml:space="preserve"> با ثبت خطای میانگین ۴٫۴۸ تراکنش و دقت رتبه‌بندی ۳۶٫۶ درصد، به بهبود ۲٫۵۱ برابری نسبت به شانس تصادفی دست یافته و زیرساختی عملیاتی و بدون برچسب مداخله برای هوشمندی سبد پذیرندگان فراهم می‌سازد.</w:t>
+        <w:t xml:space="preserve"> با ثبت خطای میانگین ۴٫۴۸ تراکنش و دقت رتبه‌بندی ۳۶٫۶ درصد، به بهبود ۲٫۴۶ برابری نسبت به شانس تصادفی کل سبد (و ۲٫۱۰ برابری نسبت به جامعه کاندیداها) دست یافته و زیرساختی عملیاتی و بدون برچسب مداخله برای هوشمندی سبد پذیرندگان فراهم می‌سازد.</w:t>
       </w:r>
     </w:p>
     <w:p>
@@ -260,6 +267,7 @@
           <w:rFonts w:ascii="Times New Roman" w:hAnsi="Times New Roman" w:cs="Times New Roman"/>
           <w:bidi w:val="0"/>
           <w:sz w:val="17"/>
+          <w:rtl w:val="0"/>
           <w:szCs w:val="17"/>
         </w:rPr>
         <w:t>‎HAMTA‎</w:t>
@@ -278,6 +286,7 @@
           <w:rFonts w:ascii="Times New Roman" w:hAnsi="Times New Roman" w:cs="Times New Roman"/>
           <w:bidi w:val="0"/>
           <w:sz w:val="17"/>
+          <w:rtl w:val="0"/>
           <w:szCs w:val="17"/>
         </w:rPr>
         <w:t>‎Decision-support component‎</w:t>
@@ -296,6 +305,7 @@
           <w:rFonts w:ascii="Times New Roman" w:hAnsi="Times New Roman" w:cs="Times New Roman"/>
           <w:bidi w:val="0"/>
           <w:sz w:val="17"/>
+          <w:rtl w:val="0"/>
           <w:szCs w:val="17"/>
         </w:rPr>
         <w:t>‎M-GATO‎</w:t>
@@ -377,6 +387,7 @@
           <w:rFonts w:ascii="Times New Roman" w:hAnsi="Times New Roman" w:cs="Times New Roman"/>
           <w:bidi w:val="0"/>
           <w:sz w:val="20"/>
+          <w:rtl w:val="0"/>
           <w:szCs w:val="20"/>
         </w:rPr>
         <w:t>‎1‎</w:t>
@@ -410,6 +421,7 @@
           <w:rFonts w:ascii="Times New Roman" w:hAnsi="Times New Roman" w:cs="Times New Roman"/>
           <w:bidi w:val="0"/>
           <w:sz w:val="17"/>
+          <w:rtl w:val="0"/>
           <w:szCs w:val="17"/>
         </w:rPr>
         <w:t>‎PSP‎</w:t>
@@ -421,34 +433,17 @@
           <w:rtl/>
           <w:szCs w:val="18"/>
         </w:rPr>
-        <w:t>) روزانه صدها میلیون تراکنش را بر روی پایانه‌های فروش و درگاه‌های اینترنتی ثبت می‌کنند [</w:t>
-      </w:r>
-      <w:r>
-        <w:rPr>
-          <w:rFonts w:ascii="Times New Roman" w:hAnsi="Times New Roman" w:cs="Times New Roman"/>
-          <w:bidi w:val="0"/>
-          <w:sz w:val="17"/>
-          <w:szCs w:val="17"/>
-        </w:rPr>
-        <w:t>‎1‎</w:t>
-      </w:r>
-      <w:r>
-        <w:rPr>
-          <w:rFonts w:hint="cs" w:ascii="B Mitra" w:hAnsi="B Mitra" w:cs="B Mitra"/>
-          <w:sz w:val="18"/>
-          <w:rtl/>
-          <w:szCs w:val="18"/>
-        </w:rPr>
-        <w:t xml:space="preserve">, </w:t>
-      </w:r>
-      <w:r>
-        <w:rPr>
-          <w:rFonts w:ascii="Times New Roman" w:hAnsi="Times New Roman" w:cs="Times New Roman"/>
-          <w:bidi w:val="0"/>
-          <w:sz w:val="17"/>
-          <w:szCs w:val="17"/>
-        </w:rPr>
-        <w:t>‎2]‎</w:t>
+        <w:t xml:space="preserve">) روزانه صدها میلیون تراکنش را بر روی پایانه‌های فروش و درگاه‌های اینترنتی ثبت می‌کنند </w:t>
+      </w:r>
+      <w:r>
+        <w:rPr>
+          <w:rFonts w:ascii="Times New Roman" w:hAnsi="Times New Roman" w:cs="Times New Roman"/>
+          <w:bidi w:val="0"/>
+          <w:sz w:val="17"/>
+          <w:rtl w:val="0"/>
+          <w:szCs w:val="17"/>
+        </w:rPr>
+        <w:t>‎[1, 2]‎</w:t>
       </w:r>
       <w:r>
         <w:rPr>
@@ -464,6 +459,7 @@
           <w:rFonts w:ascii="Times New Roman" w:hAnsi="Times New Roman" w:cs="Times New Roman"/>
           <w:bidi w:val="0"/>
           <w:sz w:val="17"/>
+          <w:rtl w:val="0"/>
           <w:szCs w:val="17"/>
         </w:rPr>
         <w:t>‎RFM‎</w:t>
@@ -482,6 +478,7 @@
           <w:rFonts w:ascii="Times New Roman" w:hAnsi="Times New Roman" w:cs="Times New Roman"/>
           <w:bidi w:val="0"/>
           <w:sz w:val="17"/>
+          <w:rtl w:val="0"/>
           <w:szCs w:val="17"/>
         </w:rPr>
         <w:t>‎[3]‎</w:t>
@@ -515,6 +512,7 @@
           <w:rFonts w:ascii="Times New Roman" w:hAnsi="Times New Roman" w:cs="Times New Roman"/>
           <w:bidi w:val="0"/>
           <w:sz w:val="17"/>
+          <w:rtl w:val="0"/>
           <w:szCs w:val="17"/>
         </w:rPr>
         <w:t>‎Masked PAN‎</w:t>
@@ -533,6 +531,7 @@
           <w:rFonts w:ascii="Times New Roman" w:hAnsi="Times New Roman" w:cs="Times New Roman"/>
           <w:bidi w:val="0"/>
           <w:sz w:val="17"/>
+          <w:rtl w:val="0"/>
           <w:szCs w:val="17"/>
         </w:rPr>
         <w:t>‎Amount‎</w:t>
@@ -551,6 +550,7 @@
           <w:rFonts w:ascii="Times New Roman" w:hAnsi="Times New Roman" w:cs="Times New Roman"/>
           <w:bidi w:val="0"/>
           <w:sz w:val="17"/>
+          <w:rtl w:val="0"/>
           <w:szCs w:val="17"/>
         </w:rPr>
         <w:t>‎PSP‎</w:t>
@@ -569,6 +569,7 @@
           <w:rFonts w:ascii="Times New Roman" w:hAnsi="Times New Roman" w:cs="Times New Roman"/>
           <w:bidi w:val="0"/>
           <w:sz w:val="17"/>
+          <w:rtl w:val="0"/>
           <w:szCs w:val="17"/>
         </w:rPr>
         <w:t>‎Create Date‎</w:t>
@@ -587,6 +588,7 @@
           <w:rFonts w:ascii="Times New Roman" w:hAnsi="Times New Roman" w:cs="Times New Roman"/>
           <w:bidi w:val="0"/>
           <w:sz w:val="17"/>
+          <w:rtl w:val="0"/>
           <w:szCs w:val="17"/>
         </w:rPr>
         <w:t>‎Cast Name‎</w:t>
@@ -620,6 +622,7 @@
           <w:rFonts w:ascii="Times New Roman" w:hAnsi="Times New Roman" w:cs="Times New Roman"/>
           <w:bidi w:val="0"/>
           <w:sz w:val="17"/>
+          <w:rtl w:val="0"/>
           <w:szCs w:val="17"/>
         </w:rPr>
         <w:t>‎HAMTA‎</w:t>
@@ -631,70 +634,36 @@
           <w:rtl/>
           <w:szCs w:val="18"/>
         </w:rPr>
-        <w:t xml:space="preserve"> در قالب یک معماری سه‌لایه ارائه می‌گردد: موتور رتبه‌بندی فرصت‌های رابطه‌ای، حفاظ‌های کنترل ریسک عملیاتی و پالایش ساختاری توپولوژیک. کارت‌ها صرفاً به عنوان گره‌های واسط جهت کشف مسیرهای هم‌پوشان مشتریان عمل می‌کنند و واحد تحلیل در سطح حساب تجاری پذیرنده است. این چارچوب با ترکیب شبکه‌های عصبی گراف زمانی، انحنای گسسته فرمن-ریچی [</w:t>
-      </w:r>
-      <w:r>
-        <w:rPr>
-          <w:rFonts w:ascii="Times New Roman" w:hAnsi="Times New Roman" w:cs="Times New Roman"/>
-          <w:bidi w:val="0"/>
-          <w:sz w:val="17"/>
-          <w:szCs w:val="17"/>
-        </w:rPr>
-        <w:t>‎4‎</w:t>
-      </w:r>
-      <w:r>
-        <w:rPr>
-          <w:rFonts w:hint="cs" w:ascii="B Mitra" w:hAnsi="B Mitra" w:cs="B Mitra"/>
-          <w:sz w:val="18"/>
-          <w:rtl/>
-          <w:szCs w:val="18"/>
-        </w:rPr>
-        <w:t xml:space="preserve">, </w:t>
-      </w:r>
-      <w:r>
-        <w:rPr>
-          <w:rFonts w:ascii="Times New Roman" w:hAnsi="Times New Roman" w:cs="Times New Roman"/>
-          <w:bidi w:val="0"/>
-          <w:sz w:val="17"/>
-          <w:szCs w:val="17"/>
-        </w:rPr>
-        <w:t>‎5]‎</w:t>
-      </w:r>
-      <w:r>
-        <w:rPr>
-          <w:rFonts w:hint="cs" w:ascii="B Mitra" w:hAnsi="B Mitra" w:cs="B Mitra"/>
-          <w:sz w:val="18"/>
-          <w:rtl/>
-          <w:szCs w:val="18"/>
-        </w:rPr>
-        <w:t xml:space="preserve"> برای مهار پدیده فشردگی اطلاعات [</w:t>
-      </w:r>
-      <w:r>
-        <w:rPr>
-          <w:rFonts w:ascii="Times New Roman" w:hAnsi="Times New Roman" w:cs="Times New Roman"/>
-          <w:bidi w:val="0"/>
-          <w:sz w:val="17"/>
-          <w:szCs w:val="17"/>
-        </w:rPr>
-        <w:t>‎6‎</w:t>
-      </w:r>
-      <w:r>
-        <w:rPr>
-          <w:rFonts w:hint="cs" w:ascii="B Mitra" w:hAnsi="B Mitra" w:cs="B Mitra"/>
-          <w:sz w:val="18"/>
-          <w:rtl/>
-          <w:szCs w:val="18"/>
-        </w:rPr>
-        <w:t xml:space="preserve">, </w:t>
-      </w:r>
-      <w:r>
-        <w:rPr>
-          <w:rFonts w:ascii="Times New Roman" w:hAnsi="Times New Roman" w:cs="Times New Roman"/>
-          <w:bidi w:val="0"/>
-          <w:sz w:val="17"/>
-          <w:szCs w:val="17"/>
-        </w:rPr>
-        <w:t>‎7]‎</w:t>
+        <w:t xml:space="preserve"> در قالب یک معماری سه‌لایه ارائه می‌گردد: موتور رتبه‌بندی فرصت‌های رابطه‌ای، حفاظ‌های کنترل ریسک عملیاتی و پالایش ساختاری توپولوژیک. کارت‌ها صرفاً به عنوان گره‌های واسط جهت کشف مسیرهای هم‌پوشان مشتریان عمل می‌کنند و واحد تحلیل در سطح حساب تجاری پذیرنده است. این چارچوب با ترکیب شبکه‌های عصبی گراف زمانی، انحنای گسسته فرمن-ریچی </w:t>
+      </w:r>
+      <w:r>
+        <w:rPr>
+          <w:rFonts w:ascii="Times New Roman" w:hAnsi="Times New Roman" w:cs="Times New Roman"/>
+          <w:bidi w:val="0"/>
+          <w:sz w:val="17"/>
+          <w:rtl w:val="0"/>
+          <w:szCs w:val="17"/>
+        </w:rPr>
+        <w:t>‎[4, 5]‎</w:t>
+      </w:r>
+      <w:r>
+        <w:rPr>
+          <w:rFonts w:hint="cs" w:ascii="B Mitra" w:hAnsi="B Mitra" w:cs="B Mitra"/>
+          <w:sz w:val="18"/>
+          <w:rtl/>
+          <w:szCs w:val="18"/>
+        </w:rPr>
+        <w:t xml:space="preserve"> برای مهار پدیده فشردگی اطلاعات </w:t>
+      </w:r>
+      <w:r>
+        <w:rPr>
+          <w:rFonts w:ascii="Times New Roman" w:hAnsi="Times New Roman" w:cs="Times New Roman"/>
+          <w:bidi w:val="0"/>
+          <w:sz w:val="17"/>
+          <w:rtl w:val="0"/>
+          <w:szCs w:val="17"/>
+        </w:rPr>
+        <w:t>‎[6, 7]‎</w:t>
       </w:r>
       <w:r>
         <w:rPr>
@@ -710,6 +679,7 @@
           <w:rFonts w:ascii="Times New Roman" w:hAnsi="Times New Roman" w:cs="Times New Roman"/>
           <w:bidi w:val="0"/>
           <w:sz w:val="17"/>
+          <w:rtl w:val="0"/>
           <w:szCs w:val="17"/>
         </w:rPr>
         <w:t>‎[8]‎</w:t>
@@ -728,6 +698,7 @@
           <w:rFonts w:ascii="Times New Roman" w:hAnsi="Times New Roman" w:cs="Times New Roman"/>
           <w:bidi w:val="0"/>
           <w:sz w:val="17"/>
+          <w:rtl w:val="0"/>
           <w:szCs w:val="17"/>
         </w:rPr>
         <w:t>‎M-GATO‎</w:t>
@@ -746,6 +717,7 @@
           <w:rFonts w:ascii="Times New Roman" w:hAnsi="Times New Roman" w:cs="Times New Roman"/>
           <w:bidi w:val="0"/>
           <w:sz w:val="17"/>
+          <w:rtl w:val="0"/>
           <w:szCs w:val="17"/>
         </w:rPr>
         <w:t>‎CIKM 2019‎</w:t>
@@ -764,6 +736,7 @@
           <w:rFonts w:ascii="Times New Roman" w:hAnsi="Times New Roman" w:cs="Times New Roman"/>
           <w:bidi w:val="0"/>
           <w:sz w:val="17"/>
+          <w:rtl w:val="0"/>
           <w:szCs w:val="17"/>
         </w:rPr>
         <w:t>‎[9]‎</w:t>
@@ -782,6 +755,7 @@
           <w:rFonts w:ascii="Times New Roman" w:hAnsi="Times New Roman" w:cs="Times New Roman"/>
           <w:bidi w:val="0"/>
           <w:sz w:val="17"/>
+          <w:rtl w:val="0"/>
           <w:szCs w:val="17"/>
         </w:rPr>
         <w:t>‎HAMTA‎</w:t>
@@ -806,6 +780,7 @@
           <w:rFonts w:ascii="Times New Roman" w:hAnsi="Times New Roman" w:cs="Times New Roman"/>
           <w:bidi w:val="0"/>
           <w:sz w:val="20"/>
+          <w:rtl w:val="0"/>
           <w:szCs w:val="20"/>
         </w:rPr>
         <w:t>‎2‎</w:t>
@@ -830,6 +805,7 @@
           <w:rFonts w:ascii="Times New Roman" w:hAnsi="Times New Roman" w:cs="Times New Roman"/>
           <w:bidi w:val="0"/>
           <w:sz w:val="18"/>
+          <w:rtl w:val="0"/>
           <w:szCs w:val="18"/>
         </w:rPr>
         <w:t>‎2.1‎</w:t>
@@ -863,6 +839,7 @@
           <w:rFonts w:ascii="Times New Roman" w:hAnsi="Times New Roman" w:cs="Times New Roman"/>
           <w:bidi w:val="0"/>
           <w:sz w:val="17"/>
+          <w:rtl w:val="0"/>
           <w:szCs w:val="17"/>
         </w:rPr>
         <w:t>‎GNN‎</w:t>
@@ -881,6 +858,7 @@
           <w:rFonts w:ascii="Times New Roman" w:hAnsi="Times New Roman" w:cs="Times New Roman"/>
           <w:bidi w:val="0"/>
           <w:sz w:val="17"/>
+          <w:rtl w:val="0"/>
           <w:szCs w:val="17"/>
         </w:rPr>
         <w:t>‎[9-11]‎</w:t>
@@ -899,6 +877,7 @@
           <w:rFonts w:ascii="Times New Roman" w:hAnsi="Times New Roman" w:cs="Times New Roman"/>
           <w:bidi w:val="0"/>
           <w:sz w:val="17"/>
+          <w:rtl w:val="0"/>
           <w:szCs w:val="17"/>
         </w:rPr>
         <w:t>‎[12]‎</w:t>
@@ -917,6 +896,7 @@
           <w:rFonts w:ascii="Times New Roman" w:hAnsi="Times New Roman" w:cs="Times New Roman"/>
           <w:bidi w:val="0"/>
           <w:sz w:val="17"/>
+          <w:rtl w:val="0"/>
           <w:szCs w:val="17"/>
         </w:rPr>
         <w:t>‎[13]‎</w:t>
@@ -928,34 +908,17 @@
           <w:rtl/>
           <w:szCs w:val="18"/>
         </w:rPr>
-        <w:t xml:space="preserve"> چارچوب‌های بازنمایی ساختار را توسعه داده‌اند [</w:t>
-      </w:r>
-      <w:r>
-        <w:rPr>
-          <w:rFonts w:ascii="Times New Roman" w:hAnsi="Times New Roman" w:cs="Times New Roman"/>
-          <w:bidi w:val="0"/>
-          <w:sz w:val="17"/>
-          <w:szCs w:val="17"/>
-        </w:rPr>
-        <w:t>‎14‎</w:t>
-      </w:r>
-      <w:r>
-        <w:rPr>
-          <w:rFonts w:hint="cs" w:ascii="B Mitra" w:hAnsi="B Mitra" w:cs="B Mitra"/>
-          <w:sz w:val="18"/>
-          <w:rtl/>
-          <w:szCs w:val="18"/>
-        </w:rPr>
-        <w:t xml:space="preserve">, </w:t>
-      </w:r>
-      <w:r>
-        <w:rPr>
-          <w:rFonts w:ascii="Times New Roman" w:hAnsi="Times New Roman" w:cs="Times New Roman"/>
-          <w:bidi w:val="0"/>
-          <w:sz w:val="17"/>
-          <w:szCs w:val="17"/>
-        </w:rPr>
-        <w:t>‎15]‎</w:t>
+        <w:t xml:space="preserve"> چارچوب‌های بازنمایی ساختار را توسعه داده‌اند </w:t>
+      </w:r>
+      <w:r>
+        <w:rPr>
+          <w:rFonts w:ascii="Times New Roman" w:hAnsi="Times New Roman" w:cs="Times New Roman"/>
+          <w:bidi w:val="0"/>
+          <w:sz w:val="17"/>
+          <w:rtl w:val="0"/>
+          <w:szCs w:val="17"/>
+        </w:rPr>
+        <w:t>‎[14, 15]‎</w:t>
       </w:r>
       <w:r>
         <w:rPr>
@@ -971,6 +934,7 @@
           <w:rFonts w:ascii="Times New Roman" w:hAnsi="Times New Roman" w:cs="Times New Roman"/>
           <w:bidi w:val="0"/>
           <w:sz w:val="17"/>
+          <w:rtl w:val="0"/>
           <w:szCs w:val="17"/>
         </w:rPr>
         <w:t>‎CIKM 2019‎</w:t>
@@ -989,6 +953,7 @@
           <w:rFonts w:ascii="Times New Roman" w:hAnsi="Times New Roman" w:cs="Times New Roman"/>
           <w:bidi w:val="0"/>
           <w:sz w:val="17"/>
+          <w:rtl w:val="0"/>
           <w:szCs w:val="17"/>
         </w:rPr>
         <w:t>‎[9]‎</w:t>
@@ -1013,6 +978,7 @@
           <w:rFonts w:ascii="Times New Roman" w:hAnsi="Times New Roman" w:cs="Times New Roman"/>
           <w:bidi w:val="0"/>
           <w:sz w:val="18"/>
+          <w:rtl w:val="0"/>
           <w:szCs w:val="18"/>
         </w:rPr>
         <w:t>‎2.2‎</w:t>
@@ -1046,6 +1012,7 @@
           <w:rFonts w:ascii="Times New Roman" w:hAnsi="Times New Roman" w:cs="Times New Roman"/>
           <w:bidi w:val="0"/>
           <w:sz w:val="17"/>
+          <w:rtl w:val="0"/>
           <w:szCs w:val="17"/>
         </w:rPr>
         <w:t>‎TGAT [16]‎</w:t>
@@ -1064,6 +1031,7 @@
           <w:rFonts w:ascii="Times New Roman" w:hAnsi="Times New Roman" w:cs="Times New Roman"/>
           <w:bidi w:val="0"/>
           <w:sz w:val="17"/>
+          <w:rtl w:val="0"/>
           <w:szCs w:val="17"/>
         </w:rPr>
         <w:t>‎TGN [17]‎</w:t>
@@ -1082,6 +1050,7 @@
           <w:rFonts w:ascii="Times New Roman" w:hAnsi="Times New Roman" w:cs="Times New Roman"/>
           <w:bidi w:val="0"/>
           <w:sz w:val="17"/>
+          <w:rtl w:val="0"/>
           <w:szCs w:val="17"/>
         </w:rPr>
         <w:t>‎EvolveGCN [18]‎</w:t>
@@ -1100,6 +1069,7 @@
           <w:rFonts w:ascii="Times New Roman" w:hAnsi="Times New Roman" w:cs="Times New Roman"/>
           <w:bidi w:val="0"/>
           <w:sz w:val="17"/>
+          <w:rtl w:val="0"/>
           <w:szCs w:val="17"/>
         </w:rPr>
         <w:t>‎[19]‎</w:t>
@@ -1124,6 +1094,7 @@
           <w:rFonts w:ascii="Times New Roman" w:hAnsi="Times New Roman" w:cs="Times New Roman"/>
           <w:bidi w:val="0"/>
           <w:sz w:val="18"/>
+          <w:rtl w:val="0"/>
           <w:szCs w:val="18"/>
         </w:rPr>
         <w:t>‎2.3‎</w:t>
@@ -1150,70 +1121,36 @@
           <w:rtl/>
           <w:szCs w:val="18"/>
         </w:rPr>
-        <w:t>در شبکه‌های تراکنشی مالی، گره‌ها خوشه‌بندی‌های متراکم و گلوگاه‌های ساختاری تشکیل می‌دهند [</w:t>
-      </w:r>
-      <w:r>
-        <w:rPr>
-          <w:rFonts w:ascii="Times New Roman" w:hAnsi="Times New Roman" w:cs="Times New Roman"/>
-          <w:bidi w:val="0"/>
-          <w:sz w:val="17"/>
-          <w:szCs w:val="17"/>
-        </w:rPr>
-        <w:t>‎20‎</w:t>
-      </w:r>
-      <w:r>
-        <w:rPr>
-          <w:rFonts w:hint="cs" w:ascii="B Mitra" w:hAnsi="B Mitra" w:cs="B Mitra"/>
-          <w:sz w:val="18"/>
-          <w:rtl/>
-          <w:szCs w:val="18"/>
-        </w:rPr>
-        <w:t xml:space="preserve">, </w:t>
-      </w:r>
-      <w:r>
-        <w:rPr>
-          <w:rFonts w:ascii="Times New Roman" w:hAnsi="Times New Roman" w:cs="Times New Roman"/>
-          <w:bidi w:val="0"/>
-          <w:sz w:val="17"/>
-          <w:szCs w:val="17"/>
-        </w:rPr>
-        <w:t>‎21]‎</w:t>
-      </w:r>
-      <w:r>
-        <w:rPr>
-          <w:rFonts w:hint="cs" w:ascii="B Mitra" w:hAnsi="B Mitra" w:cs="B Mitra"/>
-          <w:sz w:val="18"/>
-          <w:rtl/>
-          <w:szCs w:val="18"/>
-        </w:rPr>
-        <w:t>. انحنای فرمن-ریچی [</w:t>
-      </w:r>
-      <w:r>
-        <w:rPr>
-          <w:rFonts w:ascii="Times New Roman" w:hAnsi="Times New Roman" w:cs="Times New Roman"/>
-          <w:bidi w:val="0"/>
-          <w:sz w:val="17"/>
-          <w:szCs w:val="17"/>
-        </w:rPr>
-        <w:t>‎4‎</w:t>
-      </w:r>
-      <w:r>
-        <w:rPr>
-          <w:rFonts w:hint="cs" w:ascii="B Mitra" w:hAnsi="B Mitra" w:cs="B Mitra"/>
-          <w:sz w:val="18"/>
-          <w:rtl/>
-          <w:szCs w:val="18"/>
-        </w:rPr>
-        <w:t xml:space="preserve">, </w:t>
-      </w:r>
-      <w:r>
-        <w:rPr>
-          <w:rFonts w:ascii="Times New Roman" w:hAnsi="Times New Roman" w:cs="Times New Roman"/>
-          <w:bidi w:val="0"/>
-          <w:sz w:val="17"/>
-          <w:szCs w:val="17"/>
-        </w:rPr>
-        <w:t>‎5]‎</w:t>
+        <w:t xml:space="preserve">در شبکه‌های تراکنشی مالی، گره‌ها خوشه‌بندی‌های متراکم و گلوگاه‌های ساختاری تشکیل می‌دهند </w:t>
+      </w:r>
+      <w:r>
+        <w:rPr>
+          <w:rFonts w:ascii="Times New Roman" w:hAnsi="Times New Roman" w:cs="Times New Roman"/>
+          <w:bidi w:val="0"/>
+          <w:sz w:val="17"/>
+          <w:rtl w:val="0"/>
+          <w:szCs w:val="17"/>
+        </w:rPr>
+        <w:t>‎[20, 21]‎</w:t>
+      </w:r>
+      <w:r>
+        <w:rPr>
+          <w:rFonts w:hint="cs" w:ascii="B Mitra" w:hAnsi="B Mitra" w:cs="B Mitra"/>
+          <w:sz w:val="18"/>
+          <w:rtl/>
+          <w:szCs w:val="18"/>
+        </w:rPr>
+        <w:t xml:space="preserve">. انحنای فرمن-ریچی </w:t>
+      </w:r>
+      <w:r>
+        <w:rPr>
+          <w:rFonts w:ascii="Times New Roman" w:hAnsi="Times New Roman" w:cs="Times New Roman"/>
+          <w:bidi w:val="0"/>
+          <w:sz w:val="17"/>
+          <w:rtl w:val="0"/>
+          <w:szCs w:val="17"/>
+        </w:rPr>
+        <w:t>‎[4, 5]‎</w:t>
       </w:r>
       <w:r>
         <w:rPr>
@@ -1229,6 +1166,7 @@
           <w:rFonts w:ascii="Times New Roman" w:hAnsi="Times New Roman" w:cs="Times New Roman"/>
           <w:bidi w:val="0"/>
           <w:sz w:val="17"/>
+          <w:rtl w:val="0"/>
           <w:szCs w:val="17"/>
         </w:rPr>
         <w:t>‎Over-squashing‎</w:t>
@@ -1240,52 +1178,17 @@
           <w:rtl/>
           <w:szCs w:val="18"/>
         </w:rPr>
-        <w:t>) در گراف عمل می‌کند [</w:t>
-      </w:r>
-      <w:r>
-        <w:rPr>
-          <w:rFonts w:ascii="Times New Roman" w:hAnsi="Times New Roman" w:cs="Times New Roman"/>
-          <w:bidi w:val="0"/>
-          <w:sz w:val="17"/>
-          <w:szCs w:val="17"/>
-        </w:rPr>
-        <w:t>‎6‎</w:t>
-      </w:r>
-      <w:r>
-        <w:rPr>
-          <w:rFonts w:hint="cs" w:ascii="B Mitra" w:hAnsi="B Mitra" w:cs="B Mitra"/>
-          <w:sz w:val="18"/>
-          <w:rtl/>
-          <w:szCs w:val="18"/>
-        </w:rPr>
-        <w:t xml:space="preserve">, </w:t>
-      </w:r>
-      <w:r>
-        <w:rPr>
-          <w:rFonts w:ascii="Times New Roman" w:hAnsi="Times New Roman" w:cs="Times New Roman"/>
-          <w:bidi w:val="0"/>
-          <w:sz w:val="17"/>
-          <w:szCs w:val="17"/>
-        </w:rPr>
-        <w:t>‎7‎</w:t>
-      </w:r>
-      <w:r>
-        <w:rPr>
-          <w:rFonts w:hint="cs" w:ascii="B Mitra" w:hAnsi="B Mitra" w:cs="B Mitra"/>
-          <w:sz w:val="18"/>
-          <w:rtl/>
-          <w:szCs w:val="18"/>
-        </w:rPr>
-        <w:t xml:space="preserve">, </w:t>
-      </w:r>
-      <w:r>
-        <w:rPr>
-          <w:rFonts w:ascii="Times New Roman" w:hAnsi="Times New Roman" w:cs="Times New Roman"/>
-          <w:bidi w:val="0"/>
-          <w:sz w:val="17"/>
-          <w:szCs w:val="17"/>
-        </w:rPr>
-        <w:t>‎22]‎</w:t>
+        <w:t xml:space="preserve">) در گراف عمل می‌کند </w:t>
+      </w:r>
+      <w:r>
+        <w:rPr>
+          <w:rFonts w:ascii="Times New Roman" w:hAnsi="Times New Roman" w:cs="Times New Roman"/>
+          <w:bidi w:val="0"/>
+          <w:sz w:val="17"/>
+          <w:rtl w:val="0"/>
+          <w:szCs w:val="17"/>
+        </w:rPr>
+        <w:t>‎[6, 7, 22]‎</w:t>
       </w:r>
       <w:r>
         <w:rPr>
@@ -1307,6 +1210,7 @@
           <w:rFonts w:ascii="Times New Roman" w:hAnsi="Times New Roman" w:cs="Times New Roman"/>
           <w:bidi w:val="0"/>
           <w:sz w:val="18"/>
+          <w:rtl w:val="0"/>
           <w:szCs w:val="18"/>
         </w:rPr>
         <w:t>‎2.4‎</w:t>
@@ -1340,6 +1244,7 @@
           <w:rFonts w:ascii="Times New Roman" w:hAnsi="Times New Roman" w:cs="Times New Roman"/>
           <w:bidi w:val="0"/>
           <w:sz w:val="17"/>
+          <w:rtl w:val="0"/>
           <w:szCs w:val="17"/>
         </w:rPr>
         <w:t>‎[8]‎</w:t>
@@ -1358,6 +1263,7 @@
           <w:rFonts w:ascii="Times New Roman" w:hAnsi="Times New Roman" w:cs="Times New Roman"/>
           <w:bidi w:val="0"/>
           <w:sz w:val="17"/>
+          <w:rtl w:val="0"/>
           <w:szCs w:val="17"/>
         </w:rPr>
         <w:t>‎[23]‎</w:t>
@@ -1376,6 +1282,7 @@
           <w:rFonts w:ascii="Times New Roman" w:hAnsi="Times New Roman" w:cs="Times New Roman"/>
           <w:bidi w:val="0"/>
           <w:sz w:val="17"/>
+          <w:rtl w:val="0"/>
           <w:szCs w:val="17"/>
         </w:rPr>
         <w:t>‎HAMTA‎</w:t>
@@ -1394,6 +1301,7 @@
           <w:rFonts w:ascii="Times New Roman" w:hAnsi="Times New Roman" w:cs="Times New Roman"/>
           <w:bidi w:val="0"/>
           <w:sz w:val="17"/>
+          <w:rtl w:val="0"/>
           <w:szCs w:val="17"/>
         </w:rPr>
         <w:t>‎One-sided temporal prediction-interval calibration‎</w:t>
@@ -1418,6 +1326,7 @@
           <w:rFonts w:ascii="Times New Roman" w:hAnsi="Times New Roman" w:cs="Times New Roman"/>
           <w:bidi w:val="0"/>
           <w:sz w:val="18"/>
+          <w:rtl w:val="0"/>
           <w:szCs w:val="18"/>
         </w:rPr>
         <w:t>‎2.5‎</w:t>
@@ -1451,6 +1360,7 @@
           <w:rFonts w:ascii="Times New Roman" w:hAnsi="Times New Roman" w:cs="Times New Roman"/>
           <w:bidi w:val="0"/>
           <w:sz w:val="17"/>
+          <w:rtl w:val="0"/>
           <w:szCs w:val="17"/>
         </w:rPr>
         <w:t>‎SFA‎</w:t>
@@ -1469,6 +1379,7 @@
           <w:rFonts w:ascii="Times New Roman" w:hAnsi="Times New Roman" w:cs="Times New Roman"/>
           <w:bidi w:val="0"/>
           <w:sz w:val="17"/>
+          <w:rtl w:val="0"/>
           <w:szCs w:val="17"/>
         </w:rPr>
         <w:t>‎[24]‎</w:t>
@@ -1487,6 +1398,7 @@
           <w:rFonts w:ascii="Times New Roman" w:hAnsi="Times New Roman" w:cs="Times New Roman"/>
           <w:bidi w:val="0"/>
           <w:sz w:val="17"/>
+          <w:rtl w:val="0"/>
           <w:szCs w:val="17"/>
         </w:rPr>
         <w:t>‎[25]‎</w:t>
@@ -1511,6 +1423,7 @@
           <w:rFonts w:ascii="Times New Roman" w:hAnsi="Times New Roman" w:cs="Times New Roman"/>
           <w:bidi w:val="0"/>
           <w:sz w:val="20"/>
+          <w:rtl w:val="0"/>
           <w:szCs w:val="20"/>
         </w:rPr>
         <w:t>‎3‎</w:t>
@@ -1529,6 +1442,7 @@
           <w:rFonts w:ascii="Times New Roman" w:hAnsi="Times New Roman" w:cs="Times New Roman"/>
           <w:bidi w:val="0"/>
           <w:sz w:val="20"/>
+          <w:rtl w:val="0"/>
           <w:szCs w:val="20"/>
         </w:rPr>
         <w:t>‎HAMTA‎</w:t>
@@ -1562,6 +1476,7 @@
           <w:rFonts w:ascii="Times New Roman" w:hAnsi="Times New Roman" w:cs="Times New Roman"/>
           <w:bidi w:val="0"/>
           <w:sz w:val="17"/>
+          <w:rtl w:val="0"/>
           <w:szCs w:val="17"/>
         </w:rPr>
         <w:t>‎HAMTA‎</w:t>
@@ -1580,6 +1495,7 @@
           <w:rFonts w:ascii="Times New Roman" w:hAnsi="Times New Roman" w:cs="Times New Roman"/>
           <w:bidi w:val="0"/>
           <w:sz w:val="17"/>
+          <w:rtl w:val="0"/>
           <w:szCs w:val="17"/>
         </w:rPr>
         <w:t>‎M-GATO‎</w:t>
@@ -1598,6 +1514,7 @@
           <w:rFonts w:ascii="Times New Roman" w:hAnsi="Times New Roman" w:cs="Times New Roman"/>
           <w:bidi w:val="0"/>
           <w:sz w:val="17"/>
+          <w:rtl w:val="0"/>
           <w:szCs w:val="17"/>
         </w:rPr>
         <w:t>‎1‎</w:t>
@@ -1674,6 +1591,7 @@
           <w:rFonts w:ascii="Times New Roman" w:hAnsi="Times New Roman" w:cs="Times New Roman"/>
           <w:bidi w:val="0"/>
           <w:sz w:val="17"/>
+          <w:rtl w:val="0"/>
           <w:szCs w:val="17"/>
         </w:rPr>
         <w:t>‎1‎</w:t>
@@ -1692,6 +1610,7 @@
           <w:rFonts w:ascii="Times New Roman" w:hAnsi="Times New Roman" w:cs="Times New Roman"/>
           <w:bidi w:val="0"/>
           <w:sz w:val="17"/>
+          <w:rtl w:val="0"/>
           <w:szCs w:val="17"/>
         </w:rPr>
         <w:t>‎HAMTA‎</w:t>
@@ -1716,6 +1635,7 @@
           <w:rFonts w:ascii="Times New Roman" w:hAnsi="Times New Roman" w:cs="Times New Roman"/>
           <w:bidi w:val="0"/>
           <w:sz w:val="18"/>
+          <w:rtl w:val="0"/>
           <w:szCs w:val="18"/>
         </w:rPr>
         <w:t>‎3.1‎</w:t>
@@ -1758,6 +1678,7 @@
           <w:rFonts w:ascii="Times New Roman" w:hAnsi="Times New Roman" w:cs="Times New Roman"/>
           <w:bidi w:val="0"/>
           <w:sz w:val="17"/>
+          <w:rtl w:val="0"/>
           <w:szCs w:val="17"/>
         </w:rPr>
         <w:t>L = { e_1, ..., e_N }</w:t>
@@ -1791,6 +1712,7 @@
           <w:rFonts w:ascii="Times New Roman" w:hAnsi="Times New Roman" w:cs="Times New Roman"/>
           <w:bidi w:val="0"/>
           <w:sz w:val="17"/>
+          <w:rtl w:val="0"/>
           <w:szCs w:val="17"/>
         </w:rPr>
         <w:t>e_k = &lt;pan_k, amount_k, merchant_id_k, create_date_k, cast_name_k&gt;</w:t>
@@ -1815,6 +1737,7 @@
           <w:rFonts w:ascii="Times New Roman" w:hAnsi="Times New Roman" w:cs="Times New Roman"/>
           <w:bidi w:val="0"/>
           <w:sz w:val="17"/>
+          <w:rtl w:val="0"/>
           <w:szCs w:val="17"/>
         </w:rPr>
         <w:t>‎merchant_id‎</w:t>
@@ -1833,6 +1756,7 @@
           <w:rFonts w:ascii="Times New Roman" w:hAnsi="Times New Roman" w:cs="Times New Roman"/>
           <w:bidi w:val="0"/>
           <w:sz w:val="17"/>
+          <w:rtl w:val="0"/>
           <w:szCs w:val="17"/>
         </w:rPr>
         <w:t>‎PSP‎</w:t>
@@ -1862,6 +1786,7 @@
           <w:i/>
           <w:bidi w:val="0"/>
           <w:sz w:val="17"/>
+          <w:rtl w:val="0"/>
           <w:szCs w:val="17"/>
         </w:rPr>
         <w:t>x</w:t>
@@ -1871,6 +1796,7 @@
           <w:rFonts w:ascii="Times New Roman" w:hAnsi="Times New Roman" w:cs="Times New Roman"/>
           <w:bidi w:val="0"/>
           <w:sz w:val="17"/>
+          <w:rtl w:val="0"/>
           <w:szCs w:val="17"/>
         </w:rPr>
         <w:t>_{m, t} ∈ ℝ</w:t>
@@ -1880,6 +1806,7 @@
           <w:rFonts w:ascii="Times New Roman" w:hAnsi="Times New Roman" w:cs="Times New Roman"/>
           <w:bidi w:val="0"/>
           <w:sz w:val="17"/>
+          <w:rtl w:val="0"/>
           <w:szCs w:val="17"/>
           <w:vertAlign w:val="superscript"/>
         </w:rPr>
@@ -1914,6 +1841,7 @@
           <w:rFonts w:ascii="Times New Roman" w:hAnsi="Times New Roman" w:cs="Times New Roman"/>
           <w:bidi w:val="0"/>
           <w:sz w:val="17"/>
+          <w:rtl w:val="0"/>
           <w:szCs w:val="17"/>
         </w:rPr>
         <w:t>5 Raw Ledger Fields → Historical Peer Graph → Peer Lag Aggregation → Temporal GNN (time t)</w:t>
@@ -1938,6 +1866,7 @@
           <w:rFonts w:ascii="Times New Roman" w:hAnsi="Times New Roman" w:cs="Times New Roman"/>
           <w:bidi w:val="0"/>
           <w:sz w:val="17"/>
+          <w:rtl w:val="0"/>
           <w:szCs w:val="17"/>
         </w:rPr>
         <w:t>‎m ∈ M‎</w:t>
@@ -1967,6 +1896,7 @@
           <w:i/>
           <w:bidi w:val="0"/>
           <w:sz w:val="17"/>
+          <w:rtl w:val="0"/>
           <w:szCs w:val="17"/>
         </w:rPr>
         <w:t>Y</w:t>
@@ -1976,6 +1906,7 @@
           <w:rFonts w:ascii="Times New Roman" w:hAnsi="Times New Roman" w:cs="Times New Roman"/>
           <w:bidi w:val="0"/>
           <w:sz w:val="17"/>
+          <w:rtl w:val="0"/>
           <w:szCs w:val="17"/>
         </w:rPr>
         <w:t>_{m, t+1} ∈ ℕ</w:t>
@@ -1985,6 +1916,7 @@
           <w:rFonts w:ascii="Times New Roman" w:hAnsi="Times New Roman" w:cs="Times New Roman"/>
           <w:bidi w:val="0"/>
           <w:sz w:val="17"/>
+          <w:rtl w:val="0"/>
           <w:szCs w:val="17"/>
           <w:vertAlign w:val="subscript"/>
         </w:rPr>
@@ -1997,6 +1929,7 @@
           <w:i/>
           <w:bidi w:val="0"/>
           <w:sz w:val="17"/>
+          <w:rtl w:val="0"/>
           <w:szCs w:val="17"/>
         </w:rPr>
         <w:t>,   B</w:t>
@@ -2006,6 +1939,7 @@
           <w:rFonts w:ascii="Times New Roman" w:hAnsi="Times New Roman" w:cs="Times New Roman"/>
           <w:bidi w:val="0"/>
           <w:sz w:val="17"/>
+          <w:rtl w:val="0"/>
           <w:szCs w:val="17"/>
         </w:rPr>
         <w:t>^G_{m, t+1}</w:t>
@@ -2021,6 +1955,7 @@
           <w:rFonts w:ascii="Times New Roman" w:hAnsi="Times New Roman" w:cs="Times New Roman"/>
           <w:bidi w:val="0"/>
           <w:sz w:val="18"/>
+          <w:rtl w:val="0"/>
           <w:szCs w:val="18"/>
         </w:rPr>
         <w:t>‎3.2‎</w:t>
@@ -2054,6 +1989,7 @@
           <w:rFonts w:ascii="Times New Roman" w:hAnsi="Times New Roman" w:cs="Times New Roman"/>
           <w:bidi w:val="0"/>
           <w:sz w:val="17"/>
+          <w:rtl w:val="0"/>
           <w:szCs w:val="17"/>
         </w:rPr>
         <w:t>‎t‎</w:t>
@@ -2083,6 +2019,7 @@
           <w:i/>
           <w:bidi w:val="0"/>
           <w:sz w:val="17"/>
+          <w:rtl w:val="0"/>
           <w:szCs w:val="17"/>
         </w:rPr>
         <w:t>G</w:t>
@@ -2092,6 +2029,7 @@
           <w:rFonts w:ascii="Times New Roman" w:hAnsi="Times New Roman" w:cs="Times New Roman"/>
           <w:bidi w:val="0"/>
           <w:sz w:val="17"/>
+          <w:rtl w:val="0"/>
           <w:szCs w:val="17"/>
         </w:rPr>
         <w:t>^(B)_t = ( C_t , M_t , E_t )</w:t>
@@ -2116,6 +2054,7 @@
           <w:rFonts w:ascii="Times New Roman" w:hAnsi="Times New Roman" w:cs="Times New Roman"/>
           <w:bidi w:val="0"/>
           <w:sz w:val="17"/>
+          <w:rtl w:val="0"/>
           <w:szCs w:val="17"/>
         </w:rPr>
         <w:t>‎c‎</w:t>
@@ -2134,6 +2073,7 @@
           <w:rFonts w:ascii="Times New Roman" w:hAnsi="Times New Roman" w:cs="Times New Roman"/>
           <w:bidi w:val="0"/>
           <w:sz w:val="17"/>
+          <w:rtl w:val="0"/>
           <w:szCs w:val="17"/>
         </w:rPr>
         <w:t>‎m‎</w:t>
@@ -2152,6 +2092,7 @@
           <w:rFonts w:ascii="Times New Roman" w:hAnsi="Times New Roman" w:cs="Times New Roman"/>
           <w:bidi w:val="0"/>
           <w:sz w:val="17"/>
+          <w:rtl w:val="0"/>
           <w:szCs w:val="17"/>
         </w:rPr>
         <w:t>‎t‎</w:t>
@@ -2176,6 +2117,7 @@
           <w:rFonts w:ascii="Times New Roman" w:hAnsi="Times New Roman" w:cs="Times New Roman"/>
           <w:bidi w:val="0"/>
           <w:sz w:val="18"/>
+          <w:rtl w:val="0"/>
           <w:szCs w:val="18"/>
         </w:rPr>
         <w:t>‎3.3‎</w:t>
@@ -2209,6 +2151,7 @@
           <w:rFonts w:ascii="Times New Roman" w:hAnsi="Times New Roman" w:cs="Times New Roman"/>
           <w:bidi w:val="0"/>
           <w:sz w:val="17"/>
+          <w:rtl w:val="0"/>
           <w:szCs w:val="17"/>
         </w:rPr>
         <w:t>‎O(|M|^2)‎</w:t>
@@ -2227,6 +2170,7 @@
           <w:rFonts w:ascii="Times New Roman" w:hAnsi="Times New Roman" w:cs="Times New Roman"/>
           <w:bidi w:val="0"/>
           <w:sz w:val="17"/>
+          <w:rtl w:val="0"/>
           <w:szCs w:val="17"/>
         </w:rPr>
         <w:t>‎HAMTA‎</w:t>
@@ -2245,6 +2189,7 @@
           <w:rFonts w:ascii="Times New Roman" w:hAnsi="Times New Roman" w:cs="Times New Roman"/>
           <w:bidi w:val="0"/>
           <w:sz w:val="17"/>
+          <w:rtl w:val="0"/>
           <w:szCs w:val="17"/>
         </w:rPr>
         <w:t>‎I(c)‎</w:t>
@@ -2263,6 +2208,7 @@
           <w:rFonts w:ascii="Times New Roman" w:hAnsi="Times New Roman" w:cs="Times New Roman"/>
           <w:bidi w:val="0"/>
           <w:sz w:val="17"/>
+          <w:rtl w:val="0"/>
           <w:szCs w:val="17"/>
         </w:rPr>
         <w:t>‎c‎</w:t>
@@ -2281,6 +2227,7 @@
           <w:rFonts w:ascii="Times New Roman" w:hAnsi="Times New Roman" w:cs="Times New Roman"/>
           <w:bidi w:val="0"/>
           <w:sz w:val="17"/>
+          <w:rtl w:val="0"/>
           <w:szCs w:val="17"/>
         </w:rPr>
         <w:t>‎m‎</w:t>
@@ -2299,6 +2246,7 @@
           <w:rFonts w:ascii="Times New Roman" w:hAnsi="Times New Roman" w:cs="Times New Roman"/>
           <w:bidi w:val="0"/>
           <w:sz w:val="17"/>
+          <w:rtl w:val="0"/>
           <w:szCs w:val="17"/>
         </w:rPr>
         <w:t>‎O(|C_m| · d_card)‎</w:t>
@@ -2326,6 +2274,7 @@
           <w:rFonts w:ascii="Times New Roman" w:hAnsi="Times New Roman" w:cs="Times New Roman"/>
           <w:bidi w:val="0"/>
           <w:sz w:val="17"/>
+          <w:rtl w:val="0"/>
           <w:szCs w:val="17"/>
         </w:rPr>
         <w:t>C(m) = ⋃</w:t>
@@ -2335,6 +2284,7 @@
           <w:rFonts w:ascii="Times New Roman" w:hAnsi="Times New Roman" w:cs="Times New Roman"/>
           <w:bidi w:val="0"/>
           <w:sz w:val="17"/>
+          <w:rtl w:val="0"/>
           <w:szCs w:val="17"/>
           <w:vertAlign w:val="subscript"/>
         </w:rPr>
@@ -2345,6 +2295,7 @@
           <w:rFonts w:ascii="Times New Roman" w:hAnsi="Times New Roman" w:cs="Times New Roman"/>
           <w:bidi w:val="0"/>
           <w:sz w:val="17"/>
+          <w:rtl w:val="0"/>
           <w:szCs w:val="17"/>
         </w:rPr>
         <w:t xml:space="preserve"> I(c) \ { m }</w:t>
@@ -2369,6 +2320,7 @@
           <w:rFonts w:ascii="Times New Roman" w:hAnsi="Times New Roman" w:cs="Times New Roman"/>
           <w:bidi w:val="0"/>
           <w:sz w:val="17"/>
+          <w:rtl w:val="0"/>
           <w:szCs w:val="17"/>
         </w:rPr>
         <w:t>‎1‎</w:t>
@@ -2448,6 +2400,7 @@
                 <w:rFonts w:ascii="Times New Roman" w:hAnsi="Times New Roman" w:cs="Times New Roman"/>
                 <w:bidi w:val="0"/>
                 <w:sz w:val="17"/>
+                <w:rtl w:val="0"/>
                 <w:szCs w:val="17"/>
               </w:rPr>
               <w:t>S(m, j) = λ · S</w:t>
@@ -2457,6 +2410,7 @@
                 <w:rFonts w:ascii="Times New Roman" w:hAnsi="Times New Roman" w:cs="Times New Roman"/>
                 <w:bidi w:val="0"/>
                 <w:sz w:val="17"/>
+                <w:rtl w:val="0"/>
                 <w:szCs w:val="17"/>
                 <w:vertAlign w:val="subscript"/>
               </w:rPr>
@@ -2467,6 +2421,7 @@
                 <w:rFonts w:ascii="Times New Roman" w:hAnsi="Times New Roman" w:cs="Times New Roman"/>
                 <w:bidi w:val="0"/>
                 <w:sz w:val="17"/>
+                <w:rtl w:val="0"/>
                 <w:szCs w:val="17"/>
               </w:rPr>
               <w:t>(m, j) + (1 – λ) · S</w:t>
@@ -2476,6 +2431,7 @@
                 <w:rFonts w:ascii="Times New Roman" w:hAnsi="Times New Roman" w:cs="Times New Roman"/>
                 <w:bidi w:val="0"/>
                 <w:sz w:val="17"/>
+                <w:rtl w:val="0"/>
                 <w:szCs w:val="17"/>
                 <w:vertAlign w:val="subscript"/>
               </w:rPr>
@@ -2486,6 +2442,7 @@
                 <w:rFonts w:ascii="Times New Roman" w:hAnsi="Times New Roman" w:cs="Times New Roman"/>
                 <w:bidi w:val="0"/>
                 <w:sz w:val="17"/>
+                <w:rtl w:val="0"/>
                 <w:szCs w:val="17"/>
               </w:rPr>
               <w:t>(m, j)</w:t>
@@ -2513,6 +2470,7 @@
           <w:rFonts w:ascii="Times New Roman" w:hAnsi="Times New Roman" w:cs="Times New Roman"/>
           <w:bidi w:val="0"/>
           <w:sz w:val="17"/>
+          <w:rtl w:val="0"/>
           <w:szCs w:val="17"/>
         </w:rPr>
         <w:t>‎S_covisit‎</w:t>
@@ -2531,6 +2489,7 @@
           <w:rFonts w:ascii="Times New Roman" w:hAnsi="Times New Roman" w:cs="Times New Roman"/>
           <w:bidi w:val="0"/>
           <w:sz w:val="17"/>
+          <w:rtl w:val="0"/>
           <w:szCs w:val="17"/>
         </w:rPr>
         <w:t>‎S_category‎</w:t>
@@ -2549,6 +2508,7 @@
           <w:rFonts w:ascii="Times New Roman" w:hAnsi="Times New Roman" w:cs="Times New Roman"/>
           <w:bidi w:val="0"/>
           <w:sz w:val="17"/>
+          <w:rtl w:val="0"/>
           <w:szCs w:val="17"/>
         </w:rPr>
         <w:t>‎λ = 0.65‎</w:t>
@@ -2567,6 +2527,7 @@
           <w:rFonts w:ascii="Times New Roman" w:hAnsi="Times New Roman" w:cs="Times New Roman"/>
           <w:bidi w:val="0"/>
           <w:sz w:val="17"/>
+          <w:rtl w:val="0"/>
           <w:szCs w:val="17"/>
         </w:rPr>
         <w:t>‎Top-K (K=6)‎</w:t>
@@ -2585,6 +2546,7 @@
           <w:rFonts w:ascii="Times New Roman" w:hAnsi="Times New Roman" w:cs="Times New Roman"/>
           <w:bidi w:val="0"/>
           <w:sz w:val="17"/>
+          <w:rtl w:val="0"/>
           <w:szCs w:val="17"/>
         </w:rPr>
         <w:t>‎O(|C(m)| log K)‎</w:t>
@@ -2603,6 +2565,7 @@
           <w:rFonts w:ascii="Times New Roman" w:hAnsi="Times New Roman" w:cs="Times New Roman"/>
           <w:bidi w:val="0"/>
           <w:sz w:val="17"/>
+          <w:rtl w:val="0"/>
           <w:szCs w:val="17"/>
         </w:rPr>
         <w:t>‎O(|M| · K · d_avg)‎</w:t>
@@ -2621,6 +2584,7 @@
           <w:rFonts w:ascii="Times New Roman" w:hAnsi="Times New Roman" w:cs="Times New Roman"/>
           <w:bidi w:val="0"/>
           <w:sz w:val="17"/>
+          <w:rtl w:val="0"/>
           <w:szCs w:val="17"/>
         </w:rPr>
         <w:t>‎Top-K‎</w:t>
@@ -2648,6 +2612,7 @@
           <w:rFonts w:ascii="Times New Roman" w:hAnsi="Times New Roman" w:cs="Times New Roman"/>
           <w:bidi w:val="0"/>
           <w:sz w:val="17"/>
+          <w:rtl w:val="0"/>
           <w:szCs w:val="17"/>
         </w:rPr>
         <w:t>G_peer = Top-K ∪ Top-K^T</w:t>
@@ -2672,6 +2637,7 @@
           <w:rFonts w:ascii="Times New Roman" w:hAnsi="Times New Roman" w:cs="Times New Roman"/>
           <w:bidi w:val="0"/>
           <w:sz w:val="17"/>
+          <w:rtl w:val="0"/>
           <w:szCs w:val="17"/>
         </w:rPr>
         <w:t>‎2‎</w:t>
@@ -2683,34 +2649,17 @@
           <w:rtl/>
           <w:szCs w:val="18"/>
         </w:rPr>
-        <w:t>) به عنوان پالایش ساختاری محاسبه می‌شود [</w:t>
-      </w:r>
-      <w:r>
-        <w:rPr>
-          <w:rFonts w:ascii="Times New Roman" w:hAnsi="Times New Roman" w:cs="Times New Roman"/>
-          <w:bidi w:val="0"/>
-          <w:sz w:val="17"/>
-          <w:szCs w:val="17"/>
-        </w:rPr>
-        <w:t>‎4‎</w:t>
-      </w:r>
-      <w:r>
-        <w:rPr>
-          <w:rFonts w:hint="cs" w:ascii="B Mitra" w:hAnsi="B Mitra" w:cs="B Mitra"/>
-          <w:sz w:val="18"/>
-          <w:rtl/>
-          <w:szCs w:val="18"/>
-        </w:rPr>
-        <w:t xml:space="preserve">, </w:t>
-      </w:r>
-      <w:r>
-        <w:rPr>
-          <w:rFonts w:ascii="Times New Roman" w:hAnsi="Times New Roman" w:cs="Times New Roman"/>
-          <w:bidi w:val="0"/>
-          <w:sz w:val="17"/>
-          <w:szCs w:val="17"/>
-        </w:rPr>
-        <w:t>‎5]‎</w:t>
+        <w:t xml:space="preserve">) به عنوان پالایش ساختاری محاسبه می‌شود </w:t>
+      </w:r>
+      <w:r>
+        <w:rPr>
+          <w:rFonts w:ascii="Times New Roman" w:hAnsi="Times New Roman" w:cs="Times New Roman"/>
+          <w:bidi w:val="0"/>
+          <w:sz w:val="17"/>
+          <w:rtl w:val="0"/>
+          <w:szCs w:val="17"/>
+        </w:rPr>
+        <w:t>‎[4, 5]‎</w:t>
       </w:r>
       <w:r>
         <w:rPr>
@@ -2787,6 +2736,7 @@
                 <w:rFonts w:ascii="Times New Roman" w:hAnsi="Times New Roman" w:cs="Times New Roman"/>
                 <w:bidi w:val="0"/>
                 <w:sz w:val="17"/>
+                <w:rtl w:val="0"/>
                 <w:szCs w:val="17"/>
               </w:rPr>
               <w:t>F(m, j) = [ 4 – d(m) – d(j) + 3 · Δ(m, j) ] / √[ d(m) · d(j) ]</w:t>
@@ -2814,6 +2764,7 @@
           <w:rFonts w:ascii="Times New Roman" w:hAnsi="Times New Roman" w:cs="Times New Roman"/>
           <w:bidi w:val="0"/>
           <w:sz w:val="17"/>
+          <w:rtl w:val="0"/>
           <w:szCs w:val="17"/>
         </w:rPr>
         <w:t>‎d(m)‎</w:t>
@@ -2832,6 +2783,7 @@
           <w:rFonts w:ascii="Times New Roman" w:hAnsi="Times New Roman" w:cs="Times New Roman"/>
           <w:bidi w:val="0"/>
           <w:sz w:val="17"/>
+          <w:rtl w:val="0"/>
           <w:szCs w:val="17"/>
         </w:rPr>
         <w:t>‎Δ(m, j)‎</w:t>
@@ -2850,6 +2802,7 @@
           <w:rFonts w:ascii="Times New Roman" w:hAnsi="Times New Roman" w:cs="Times New Roman"/>
           <w:bidi w:val="0"/>
           <w:sz w:val="17"/>
+          <w:rtl w:val="0"/>
           <w:szCs w:val="17"/>
         </w:rPr>
         <w:t>‎3‎</w:t>
@@ -2929,6 +2882,7 @@
                 <w:rFonts w:ascii="Times New Roman" w:hAnsi="Times New Roman" w:cs="Times New Roman"/>
                 <w:bidi w:val="0"/>
                 <w:sz w:val="17"/>
+                <w:rtl w:val="0"/>
                 <w:szCs w:val="17"/>
               </w:rPr>
               <w:t>w̃</w:t>
@@ -2938,6 +2892,7 @@
                 <w:rFonts w:ascii="Times New Roman" w:hAnsi="Times New Roman" w:cs="Times New Roman"/>
                 <w:bidi w:val="0"/>
                 <w:sz w:val="17"/>
+                <w:rtl w:val="0"/>
                 <w:szCs w:val="17"/>
                 <w:vertAlign w:val="subscript"/>
               </w:rPr>
@@ -2948,6 +2903,7 @@
                 <w:rFonts w:ascii="Times New Roman" w:hAnsi="Times New Roman" w:cs="Times New Roman"/>
                 <w:bidi w:val="0"/>
                 <w:sz w:val="17"/>
+                <w:rtl w:val="0"/>
                 <w:szCs w:val="17"/>
               </w:rPr>
               <w:t xml:space="preserve"> ∝ w</w:t>
@@ -2957,6 +2913,7 @@
                 <w:rFonts w:ascii="Times New Roman" w:hAnsi="Times New Roman" w:cs="Times New Roman"/>
                 <w:bidi w:val="0"/>
                 <w:sz w:val="17"/>
+                <w:rtl w:val="0"/>
                 <w:szCs w:val="17"/>
                 <w:vertAlign w:val="subscript"/>
               </w:rPr>
@@ -2967,6 +2924,7 @@
                 <w:rFonts w:ascii="Times New Roman" w:hAnsi="Times New Roman" w:cs="Times New Roman"/>
                 <w:bidi w:val="0"/>
                 <w:sz w:val="17"/>
+                <w:rtl w:val="0"/>
                 <w:szCs w:val="17"/>
               </w:rPr>
               <w:t xml:space="preserve"> · ( 1 + η · tanh(F(m, j)) )</w:t>
@@ -2994,6 +2952,7 @@
           <w:rFonts w:ascii="Times New Roman" w:hAnsi="Times New Roman" w:cs="Times New Roman"/>
           <w:bidi w:val="0"/>
           <w:sz w:val="17"/>
+          <w:rtl w:val="0"/>
           <w:szCs w:val="17"/>
         </w:rPr>
         <w:t>‎η = 0.25‎</w:t>
@@ -3070,6 +3029,7 @@
           <w:rFonts w:ascii="Times New Roman" w:hAnsi="Times New Roman" w:cs="Times New Roman"/>
           <w:bidi w:val="0"/>
           <w:sz w:val="17"/>
+          <w:rtl w:val="0"/>
           <w:szCs w:val="17"/>
         </w:rPr>
         <w:t>‎2‎</w:t>
@@ -3094,6 +3054,7 @@
           <w:rFonts w:ascii="Times New Roman" w:hAnsi="Times New Roman" w:cs="Times New Roman"/>
           <w:bidi w:val="0"/>
           <w:sz w:val="18"/>
+          <w:rtl w:val="0"/>
           <w:szCs w:val="18"/>
         </w:rPr>
         <w:t>‎3.4‎</w:t>
@@ -3129,6 +3090,7 @@
           <w:i/>
           <w:bidi w:val="0"/>
           <w:sz w:val="17"/>
+          <w:rtl w:val="0"/>
           <w:szCs w:val="17"/>
         </w:rPr>
         <w:t>‎Y‎</w:t>
@@ -3137,6 +3099,7 @@
         <w:rPr>
           <w:rFonts w:ascii="Times New Roman" w:hAnsi="Times New Roman" w:cs="Times New Roman"/>
           <w:bidi w:val="0"/>
+          <w:rtl w:val="0"/>
           <w:sz w:val="17"/>
           <w:vertAlign w:val="subscript"/>
           <w:szCs w:val="17"/>
@@ -3157,6 +3120,7 @@
           <w:rFonts w:ascii="Times New Roman" w:hAnsi="Times New Roman" w:cs="Times New Roman"/>
           <w:bidi w:val="0"/>
           <w:sz w:val="17"/>
+          <w:rtl w:val="0"/>
           <w:szCs w:val="17"/>
         </w:rPr>
         <w:t>‎(Var(Y)/E[Y] ≈ 3.24)‎</w:t>
@@ -3175,6 +3139,7 @@
           <w:rFonts w:ascii="Times New Roman" w:hAnsi="Times New Roman" w:cs="Times New Roman"/>
           <w:bidi w:val="0"/>
           <w:sz w:val="17"/>
+          <w:rtl w:val="0"/>
           <w:szCs w:val="17"/>
         </w:rPr>
         <w:t>‎TGAT‎</w:t>
@@ -3256,6 +3221,7 @@
                 <w:i/>
                 <w:bidi w:val="0"/>
                 <w:sz w:val="17"/>
+                <w:rtl w:val="0"/>
                 <w:szCs w:val="17"/>
               </w:rPr>
               <w:t>L</w:t>
@@ -3265,6 +3231,7 @@
                 <w:rFonts w:ascii="Times New Roman" w:hAnsi="Times New Roman" w:cs="Times New Roman"/>
                 <w:bidi w:val="0"/>
                 <w:sz w:val="17"/>
+                <w:rtl w:val="0"/>
                 <w:szCs w:val="17"/>
               </w:rPr>
               <w:t>_NB = - ∑ [ ln Γ(Y+φ) - ln Γ(φ) - ln Γ(Y+1) + φ ln(φ/(φ+μ̂)) + Y ln(μ̂/(φ+μ̂)) ]</w:t>
@@ -3292,6 +3259,7 @@
           <w:rFonts w:ascii="Times New Roman" w:hAnsi="Times New Roman" w:cs="Times New Roman"/>
           <w:bidi w:val="0"/>
           <w:sz w:val="17"/>
+          <w:rtl w:val="0"/>
           <w:szCs w:val="17"/>
         </w:rPr>
         <w:t>‎μ̂‎</w:t>
@@ -3310,6 +3278,7 @@
           <w:rFonts w:ascii="Times New Roman" w:hAnsi="Times New Roman" w:cs="Times New Roman"/>
           <w:bidi w:val="0"/>
           <w:sz w:val="17"/>
+          <w:rtl w:val="0"/>
           <w:szCs w:val="17"/>
         </w:rPr>
         <w:t>‎φ‎</w:t>
@@ -3328,6 +3297,7 @@
           <w:rFonts w:ascii="Times New Roman" w:hAnsi="Times New Roman" w:cs="Times New Roman"/>
           <w:bidi w:val="0"/>
           <w:sz w:val="17"/>
+          <w:rtl w:val="0"/>
           <w:szCs w:val="17"/>
         </w:rPr>
         <w:t>‎inverse-dispersion/size parameter‎</w:t>
@@ -3346,6 +3316,7 @@
           <w:rFonts w:ascii="Times New Roman" w:hAnsi="Times New Roman" w:cs="Times New Roman"/>
           <w:bidi w:val="0"/>
           <w:sz w:val="17"/>
+          <w:rtl w:val="0"/>
           <w:szCs w:val="17"/>
         </w:rPr>
         <w:t>‎t‎</w:t>
@@ -3364,6 +3335,7 @@
           <w:rFonts w:ascii="Times New Roman" w:hAnsi="Times New Roman" w:cs="Times New Roman"/>
           <w:bidi w:val="0"/>
           <w:sz w:val="17"/>
+          <w:rtl w:val="0"/>
           <w:szCs w:val="17"/>
         </w:rPr>
         <w:t>‎TGAT‎</w:t>
@@ -3382,6 +3354,7 @@
           <w:rFonts w:ascii="Times New Roman" w:hAnsi="Times New Roman" w:cs="Times New Roman"/>
           <w:bidi w:val="0"/>
           <w:sz w:val="17"/>
+          <w:rtl w:val="0"/>
           <w:szCs w:val="17"/>
         </w:rPr>
         <w:t>‎Adam‎</w:t>
@@ -3400,6 +3373,7 @@
           <w:rFonts w:ascii="Times New Roman" w:hAnsi="Times New Roman" w:cs="Times New Roman"/>
           <w:bidi w:val="0"/>
           <w:sz w:val="17"/>
+          <w:rtl w:val="0"/>
           <w:szCs w:val="17"/>
         </w:rPr>
         <w:t>‎P0‎</w:t>
@@ -3424,6 +3398,7 @@
           <w:rFonts w:ascii="Times New Roman" w:hAnsi="Times New Roman" w:cs="Times New Roman"/>
           <w:bidi w:val="0"/>
           <w:sz w:val="18"/>
+          <w:rtl w:val="0"/>
           <w:szCs w:val="18"/>
         </w:rPr>
         <w:t>‎3.5‎</w:t>
@@ -3457,6 +3432,7 @@
           <w:rFonts w:ascii="Times New Roman" w:hAnsi="Times New Roman" w:cs="Times New Roman"/>
           <w:bidi w:val="0"/>
           <w:sz w:val="17"/>
+          <w:rtl w:val="0"/>
           <w:szCs w:val="17"/>
         </w:rPr>
         <w:t>‎P0‎</w:t>
@@ -3475,6 +3451,7 @@
           <w:rFonts w:ascii="Times New Roman" w:hAnsi="Times New Roman" w:cs="Times New Roman"/>
           <w:bidi w:val="0"/>
           <w:sz w:val="17"/>
+          <w:rtl w:val="0"/>
           <w:szCs w:val="17"/>
         </w:rPr>
         <w:t>‎[8]‎</w:t>
@@ -3504,6 +3481,7 @@
           <w:i/>
           <w:bidi w:val="0"/>
           <w:sz w:val="17"/>
+          <w:rtl w:val="0"/>
           <w:szCs w:val="17"/>
         </w:rPr>
         <w:t>R</w:t>
@@ -3513,6 +3491,7 @@
           <w:rFonts w:ascii="Times New Roman" w:hAnsi="Times New Roman" w:cs="Times New Roman"/>
           <w:bidi w:val="0"/>
           <w:sz w:val="17"/>
+          <w:rtl w:val="0"/>
           <w:szCs w:val="17"/>
         </w:rPr>
         <w:t>_m^+ = max( 0 , Y_m - μ̂_m )</w:t>
@@ -3537,6 +3516,7 @@
           <w:rFonts w:ascii="Times New Roman" w:hAnsi="Times New Roman" w:cs="Times New Roman"/>
           <w:bidi w:val="0"/>
           <w:sz w:val="17"/>
+          <w:rtl w:val="0"/>
           <w:szCs w:val="17"/>
         </w:rPr>
         <w:t>‎α = 0.15‎</w:t>
@@ -3555,6 +3535,7 @@
           <w:rFonts w:ascii="Times New Roman" w:hAnsi="Times New Roman" w:cs="Times New Roman"/>
           <w:bidi w:val="0"/>
           <w:sz w:val="17"/>
+          <w:rtl w:val="0"/>
           <w:szCs w:val="17"/>
         </w:rPr>
         <w:t>‎5‎</w:t>
@@ -3584,6 +3565,7 @@
           <w:i/>
           <w:bidi w:val="0"/>
           <w:sz w:val="17"/>
+          <w:rtl w:val="0"/>
           <w:szCs w:val="17"/>
         </w:rPr>
         <w:t>q</w:t>
@@ -3593,6 +3575,7 @@
           <w:rFonts w:ascii="Times New Roman" w:hAnsi="Times New Roman" w:cs="Times New Roman"/>
           <w:bidi w:val="0"/>
           <w:sz w:val="17"/>
+          <w:rtl w:val="0"/>
           <w:szCs w:val="17"/>
         </w:rPr>
         <w:t>_{0.85}^+ = Quantile_{0.85}( { R_m^+ } )</w:t>
@@ -3665,6 +3648,7 @@
                 <w:i/>
                 <w:bidi w:val="0"/>
                 <w:sz w:val="17"/>
+                <w:rtl w:val="0"/>
                 <w:szCs w:val="17"/>
               </w:rPr>
               <w:t>U</w:t>
@@ -3674,6 +3658,7 @@
                 <w:rFonts w:ascii="Times New Roman" w:hAnsi="Times New Roman" w:cs="Times New Roman"/>
                 <w:bidi w:val="0"/>
                 <w:sz w:val="17"/>
+                <w:rtl w:val="0"/>
                 <w:szCs w:val="17"/>
               </w:rPr>
               <w:t>_{m, t+1} = μ̂_{m, t+1} + q_{0.85}^+</w:t>
@@ -3701,6 +3686,7 @@
           <w:rFonts w:ascii="Times New Roman" w:hAnsi="Times New Roman" w:cs="Times New Roman"/>
           <w:bidi w:val="0"/>
           <w:sz w:val="17"/>
+          <w:rtl w:val="0"/>
           <w:szCs w:val="17"/>
         </w:rPr>
         <w:t>‎Coverage = 86.2 ± 3.1‎</w:t>
@@ -3725,6 +3711,7 @@
           <w:rFonts w:ascii="Times New Roman" w:hAnsi="Times New Roman" w:cs="Times New Roman"/>
           <w:bidi w:val="0"/>
           <w:sz w:val="18"/>
+          <w:rtl w:val="0"/>
           <w:szCs w:val="18"/>
         </w:rPr>
         <w:t>‎3.6‎</w:t>
@@ -3743,6 +3730,7 @@
           <w:rFonts w:ascii="Times New Roman" w:hAnsi="Times New Roman" w:cs="Times New Roman"/>
           <w:bidi w:val="0"/>
           <w:sz w:val="18"/>
+          <w:rtl w:val="0"/>
           <w:szCs w:val="18"/>
         </w:rPr>
         <w:t>‎B^G‎</w:t>
@@ -3776,6 +3764,7 @@
           <w:rFonts w:ascii="Times New Roman" w:hAnsi="Times New Roman" w:cs="Times New Roman"/>
           <w:bidi w:val="0"/>
           <w:sz w:val="17"/>
+          <w:rtl w:val="0"/>
           <w:szCs w:val="17"/>
         </w:rPr>
         <w:t>‎R_j^- = max‎</w:t>
@@ -3794,6 +3783,7 @@
           <w:rFonts w:ascii="Times New Roman" w:hAnsi="Times New Roman" w:cs="Times New Roman"/>
           <w:bidi w:val="0"/>
           <w:sz w:val="17"/>
+          <w:rtl w:val="0"/>
           <w:szCs w:val="17"/>
         </w:rPr>
         <w:t>‎0‎</w:t>
@@ -3812,6 +3802,7 @@
           <w:rFonts w:ascii="Times New Roman" w:hAnsi="Times New Roman" w:cs="Times New Roman"/>
           <w:bidi w:val="0"/>
           <w:sz w:val="17"/>
+          <w:rtl w:val="0"/>
           <w:szCs w:val="17"/>
         </w:rPr>
         <w:t>‎μ̂_j - Y_j‎</w:t>
@@ -3832,6 +3823,7 @@
           <w:i/>
           <w:bidi w:val="0"/>
           <w:sz w:val="17"/>
+          <w:rtl w:val="0"/>
           <w:szCs w:val="17"/>
         </w:rPr>
         <w:t>‎q‎</w:t>
@@ -3840,6 +3832,7 @@
         <w:rPr>
           <w:rFonts w:ascii="Times New Roman" w:hAnsi="Times New Roman" w:cs="Times New Roman"/>
           <w:bidi w:val="0"/>
+          <w:rtl w:val="0"/>
           <w:sz w:val="17"/>
           <w:vertAlign w:val="subscript"/>
           <w:szCs w:val="17"/>
@@ -3860,6 +3853,7 @@
           <w:rFonts w:ascii="Times New Roman" w:hAnsi="Times New Roman" w:cs="Times New Roman"/>
           <w:bidi w:val="0"/>
           <w:sz w:val="17"/>
+          <w:rtl w:val="0"/>
           <w:szCs w:val="17"/>
         </w:rPr>
         <w:t>‎Quantile_‎</w:t>
@@ -3878,6 +3872,7 @@
           <w:rFonts w:ascii="Times New Roman" w:hAnsi="Times New Roman" w:cs="Times New Roman"/>
           <w:bidi w:val="0"/>
           <w:sz w:val="17"/>
+          <w:rtl w:val="0"/>
           <w:szCs w:val="17"/>
         </w:rPr>
         <w:t>‎0.85‎</w:t>
@@ -3896,6 +3891,7 @@
           <w:rFonts w:ascii="Times New Roman" w:hAnsi="Times New Roman" w:cs="Times New Roman"/>
           <w:bidi w:val="0"/>
           <w:sz w:val="17"/>
+          <w:rtl w:val="0"/>
           <w:szCs w:val="17"/>
         </w:rPr>
         <w:t>‎R_j^‎</w:t>
@@ -3925,6 +3921,7 @@
           <w:i/>
           <w:bidi w:val="0"/>
           <w:sz w:val="17"/>
+          <w:rtl w:val="0"/>
           <w:szCs w:val="17"/>
         </w:rPr>
         <w:t>L</w:t>
@@ -3934,6 +3931,7 @@
           <w:rFonts w:ascii="Times New Roman" w:hAnsi="Times New Roman" w:cs="Times New Roman"/>
           <w:bidi w:val="0"/>
           <w:sz w:val="17"/>
+          <w:rtl w:val="0"/>
           <w:szCs w:val="17"/>
         </w:rPr>
         <w:t>_j = max( 0 , μ̂_j - q_{0.85}^- )</w:t>
@@ -3958,6 +3956,7 @@
           <w:rFonts w:ascii="Times New Roman" w:hAnsi="Times New Roman" w:cs="Times New Roman"/>
           <w:bidi w:val="0"/>
           <w:sz w:val="17"/>
+          <w:rtl w:val="0"/>
           <w:szCs w:val="17"/>
         </w:rPr>
         <w:t>‎6‎</w:t>
@@ -4039,6 +4038,7 @@
                 <w:i/>
                 <w:bidi w:val="0"/>
                 <w:sz w:val="17"/>
+                <w:rtl w:val="0"/>
                 <w:szCs w:val="17"/>
               </w:rPr>
               <w:t>B</w:t>
@@ -4048,6 +4048,7 @@
                 <w:rFonts w:ascii="Times New Roman" w:hAnsi="Times New Roman" w:cs="Times New Roman"/>
                 <w:bidi w:val="0"/>
                 <w:sz w:val="17"/>
+                <w:rtl w:val="0"/>
                 <w:szCs w:val="17"/>
               </w:rPr>
               <w:t>^G_{m, t+1} = [ ∑</w:t>
@@ -4057,6 +4058,7 @@
                 <w:rFonts w:ascii="Times New Roman" w:hAnsi="Times New Roman" w:cs="Times New Roman"/>
                 <w:bidi w:val="0"/>
                 <w:sz w:val="17"/>
+                <w:rtl w:val="0"/>
                 <w:szCs w:val="17"/>
                 <w:vertAlign w:val="subscript"/>
               </w:rPr>
@@ -4067,6 +4069,7 @@
                 <w:rFonts w:ascii="Times New Roman" w:hAnsi="Times New Roman" w:cs="Times New Roman"/>
                 <w:bidi w:val="0"/>
                 <w:sz w:val="17"/>
+                <w:rtl w:val="0"/>
                 <w:szCs w:val="17"/>
               </w:rPr>
               <w:t xml:space="preserve"> w̃</w:t>
@@ -4076,6 +4079,7 @@
                 <w:rFonts w:ascii="Times New Roman" w:hAnsi="Times New Roman" w:cs="Times New Roman"/>
                 <w:bidi w:val="0"/>
                 <w:sz w:val="17"/>
+                <w:rtl w:val="0"/>
                 <w:szCs w:val="17"/>
                 <w:vertAlign w:val="subscript"/>
               </w:rPr>
@@ -4086,6 +4090,7 @@
                 <w:rFonts w:ascii="Times New Roman" w:hAnsi="Times New Roman" w:cs="Times New Roman"/>
                 <w:bidi w:val="0"/>
                 <w:sz w:val="17"/>
+                <w:rtl w:val="0"/>
                 <w:szCs w:val="17"/>
               </w:rPr>
               <w:t xml:space="preserve"> · L</w:t>
@@ -4095,6 +4100,7 @@
                 <w:rFonts w:ascii="Times New Roman" w:hAnsi="Times New Roman" w:cs="Times New Roman"/>
                 <w:bidi w:val="0"/>
                 <w:sz w:val="17"/>
+                <w:rtl w:val="0"/>
                 <w:szCs w:val="17"/>
                 <w:vertAlign w:val="subscript"/>
               </w:rPr>
@@ -4105,6 +4111,7 @@
                 <w:rFonts w:ascii="Times New Roman" w:hAnsi="Times New Roman" w:cs="Times New Roman"/>
                 <w:bidi w:val="0"/>
                 <w:sz w:val="17"/>
+                <w:rtl w:val="0"/>
                 <w:szCs w:val="17"/>
               </w:rPr>
               <w:t xml:space="preserve"> ] / [ ∑</w:t>
@@ -4114,6 +4121,7 @@
                 <w:rFonts w:ascii="Times New Roman" w:hAnsi="Times New Roman" w:cs="Times New Roman"/>
                 <w:bidi w:val="0"/>
                 <w:sz w:val="17"/>
+                <w:rtl w:val="0"/>
                 <w:szCs w:val="17"/>
                 <w:vertAlign w:val="subscript"/>
               </w:rPr>
@@ -4124,6 +4132,7 @@
                 <w:rFonts w:ascii="Times New Roman" w:hAnsi="Times New Roman" w:cs="Times New Roman"/>
                 <w:bidi w:val="0"/>
                 <w:sz w:val="17"/>
+                <w:rtl w:val="0"/>
                 <w:szCs w:val="17"/>
               </w:rPr>
               <w:t xml:space="preserve"> w̃</w:t>
@@ -4133,6 +4142,7 @@
                 <w:rFonts w:ascii="Times New Roman" w:hAnsi="Times New Roman" w:cs="Times New Roman"/>
                 <w:bidi w:val="0"/>
                 <w:sz w:val="17"/>
+                <w:rtl w:val="0"/>
                 <w:szCs w:val="17"/>
                 <w:vertAlign w:val="subscript"/>
               </w:rPr>
@@ -4143,6 +4153,7 @@
                 <w:rFonts w:ascii="Times New Roman" w:hAnsi="Times New Roman" w:cs="Times New Roman"/>
                 <w:bidi w:val="0"/>
                 <w:sz w:val="17"/>
+                <w:rtl w:val="0"/>
                 <w:szCs w:val="17"/>
               </w:rPr>
               <w:t xml:space="preserve"> ]</w:t>
@@ -4161,6 +4172,7 @@
           <w:rFonts w:ascii="Times New Roman" w:hAnsi="Times New Roman" w:cs="Times New Roman"/>
           <w:bidi w:val="0"/>
           <w:sz w:val="18"/>
+          <w:rtl w:val="0"/>
           <w:szCs w:val="18"/>
         </w:rPr>
         <w:t>‎3.7‎</w:t>
@@ -4179,6 +4191,7 @@
           <w:rFonts w:ascii="Times New Roman" w:hAnsi="Times New Roman" w:cs="Times New Roman"/>
           <w:bidi w:val="0"/>
           <w:sz w:val="18"/>
+          <w:rtl w:val="0"/>
           <w:szCs w:val="18"/>
         </w:rPr>
         <w:t>‎M-GATO‎</w:t>
@@ -4212,6 +4225,7 @@
           <w:rFonts w:ascii="Times New Roman" w:hAnsi="Times New Roman" w:cs="Times New Roman"/>
           <w:bidi w:val="0"/>
           <w:sz w:val="17"/>
+          <w:rtl w:val="0"/>
           <w:szCs w:val="17"/>
         </w:rPr>
         <w:t>‎M-GATO‎</w:t>
@@ -4293,6 +4307,7 @@
                 <w:i/>
                 <w:bidi w:val="0"/>
                 <w:sz w:val="17"/>
+                <w:rtl w:val="0"/>
                 <w:szCs w:val="17"/>
               </w:rPr>
               <w:t>Q</w:t>
@@ -4302,6 +4317,7 @@
                 <w:rFonts w:ascii="Times New Roman" w:hAnsi="Times New Roman" w:cs="Times New Roman"/>
                 <w:bidi w:val="0"/>
                 <w:sz w:val="17"/>
+                <w:rtl w:val="0"/>
                 <w:szCs w:val="17"/>
               </w:rPr>
               <w:t>_{m, t} = 1 – exp(-O_{m, t} / κ)</w:t>
@@ -4377,6 +4393,7 @@
                 <w:i/>
                 <w:bidi w:val="0"/>
                 <w:sz w:val="17"/>
+                <w:rtl w:val="0"/>
                 <w:szCs w:val="17"/>
               </w:rPr>
               <w:t>M-GATO</w:t>
@@ -4386,6 +4403,7 @@
                 <w:rFonts w:ascii="Times New Roman" w:hAnsi="Times New Roman" w:cs="Times New Roman"/>
                 <w:bidi w:val="0"/>
                 <w:sz w:val="17"/>
+                <w:rtl w:val="0"/>
                 <w:szCs w:val="17"/>
               </w:rPr>
               <w:t>_{m, t} = Q_{m, t} · [ ( B^G_{m, t+1} – U_{m, t+1} ) / ( B^G_{m, t+1} + ε ) ]_+</w:t>
@@ -4413,6 +4431,7 @@
           <w:rFonts w:ascii="Times New Roman" w:hAnsi="Times New Roman" w:cs="Times New Roman"/>
           <w:bidi w:val="0"/>
           <w:sz w:val="17"/>
+          <w:rtl w:val="0"/>
           <w:szCs w:val="17"/>
         </w:rPr>
         <w:t>‎[x]_+ = max(0, x)‎</w:t>
@@ -4433,6 +4452,7 @@
           <w:i/>
           <w:bidi w:val="0"/>
           <w:sz w:val="17"/>
+          <w:rtl w:val="0"/>
           <w:szCs w:val="17"/>
         </w:rPr>
         <w:t>‎O‎</w:t>
@@ -4441,6 +4461,7 @@
         <w:rPr>
           <w:rFonts w:ascii="Times New Roman" w:hAnsi="Times New Roman" w:cs="Times New Roman"/>
           <w:bidi w:val="0"/>
+          <w:rtl w:val="0"/>
           <w:sz w:val="17"/>
           <w:vertAlign w:val="subscript"/>
           <w:szCs w:val="17"/>
@@ -4461,6 +4482,7 @@
           <w:rFonts w:ascii="Times New Roman" w:hAnsi="Times New Roman" w:cs="Times New Roman"/>
           <w:bidi w:val="0"/>
           <w:sz w:val="17"/>
+          <w:rtl w:val="0"/>
           <w:szCs w:val="17"/>
         </w:rPr>
         <w:t>‎Top-K‎</w:t>
@@ -4479,6 +4501,7 @@
           <w:rFonts w:ascii="Times New Roman" w:hAnsi="Times New Roman" w:cs="Times New Roman"/>
           <w:bidi w:val="0"/>
           <w:sz w:val="17"/>
+          <w:rtl w:val="0"/>
           <w:szCs w:val="17"/>
         </w:rPr>
         <w:t>‎κ = 18‎</w:t>
@@ -4497,6 +4520,7 @@
           <w:rFonts w:ascii="Times New Roman" w:hAnsi="Times New Roman" w:cs="Times New Roman"/>
           <w:bidi w:val="0"/>
           <w:sz w:val="17"/>
+          <w:rtl w:val="0"/>
           <w:szCs w:val="17"/>
         </w:rPr>
         <w:t>‎M-GATO‎</w:t>
@@ -4515,6 +4539,7 @@
           <w:rFonts w:ascii="Times New Roman" w:hAnsi="Times New Roman" w:cs="Times New Roman"/>
           <w:bidi w:val="0"/>
           <w:sz w:val="17"/>
+          <w:rtl w:val="0"/>
           <w:szCs w:val="17"/>
         </w:rPr>
         <w:t>‎Forecast-Bound Peer Gap‎</w:t>
@@ -4533,6 +4558,7 @@
           <w:rFonts w:ascii="Times New Roman" w:hAnsi="Times New Roman" w:cs="Times New Roman"/>
           <w:bidi w:val="0"/>
           <w:sz w:val="17"/>
+          <w:rtl w:val="0"/>
           <w:szCs w:val="17"/>
         </w:rPr>
         <w:t>‎B^G - U‎</w:t>
@@ -4551,6 +4577,7 @@
           <w:rFonts w:ascii="Times New Roman" w:hAnsi="Times New Roman" w:cs="Times New Roman"/>
           <w:bidi w:val="0"/>
           <w:sz w:val="17"/>
+          <w:rtl w:val="0"/>
           <w:szCs w:val="17"/>
         </w:rPr>
         <w:t>‎B^G - Y‎</w:t>
@@ -4569,6 +4596,7 @@
           <w:rFonts w:ascii="Times New Roman" w:hAnsi="Times New Roman" w:cs="Times New Roman"/>
           <w:bidi w:val="0"/>
           <w:sz w:val="17"/>
+          <w:rtl w:val="0"/>
           <w:szCs w:val="17"/>
         </w:rPr>
         <w:t>‎Y‎</w:t>
@@ -4587,6 +4615,7 @@
           <w:rFonts w:ascii="Times New Roman" w:hAnsi="Times New Roman" w:cs="Times New Roman"/>
           <w:bidi w:val="0"/>
           <w:sz w:val="17"/>
+          <w:rtl w:val="0"/>
           <w:szCs w:val="17"/>
         </w:rPr>
         <w:t>‎μ̂‎</w:t>
@@ -4605,6 +4634,7 @@
           <w:rFonts w:ascii="Times New Roman" w:hAnsi="Times New Roman" w:cs="Times New Roman"/>
           <w:bidi w:val="0"/>
           <w:sz w:val="17"/>
+          <w:rtl w:val="0"/>
           <w:szCs w:val="17"/>
         </w:rPr>
         <w:t>‎U‎</w:t>
@@ -4623,6 +4653,7 @@
           <w:rFonts w:ascii="Times New Roman" w:hAnsi="Times New Roman" w:cs="Times New Roman"/>
           <w:bidi w:val="0"/>
           <w:sz w:val="17"/>
+          <w:rtl w:val="0"/>
           <w:szCs w:val="17"/>
         </w:rPr>
         <w:t>‎Y‎</w:t>
@@ -4643,6 +4674,7 @@
           <w:i/>
           <w:bidi w:val="0"/>
           <w:sz w:val="17"/>
+          <w:rtl w:val="0"/>
           <w:szCs w:val="17"/>
         </w:rPr>
         <w:t>‎Q‎</w:t>
@@ -4651,6 +4683,7 @@
         <w:rPr>
           <w:rFonts w:ascii="Times New Roman" w:hAnsi="Times New Roman" w:cs="Times New Roman"/>
           <w:bidi w:val="0"/>
+          <w:rtl w:val="0"/>
           <w:sz w:val="17"/>
           <w:vertAlign w:val="subscript"/>
           <w:szCs w:val="17"/>
@@ -4686,6 +4719,7 @@
           <w:rFonts w:ascii="Times New Roman" w:hAnsi="Times New Roman" w:cs="Times New Roman"/>
           <w:bidi w:val="0"/>
           <w:sz w:val="17"/>
+          <w:rtl w:val="0"/>
           <w:szCs w:val="17"/>
         </w:rPr>
         <w:t>‎MERCH_00322‎</w:t>
@@ -4704,6 +4738,7 @@
           <w:rFonts w:ascii="Times New Roman" w:hAnsi="Times New Roman" w:cs="Times New Roman"/>
           <w:bidi w:val="0"/>
           <w:sz w:val="17"/>
+          <w:rtl w:val="0"/>
           <w:szCs w:val="17"/>
         </w:rPr>
         <w:t>‎Y = 100‎</w:t>
@@ -4722,6 +4757,7 @@
           <w:rFonts w:ascii="Times New Roman" w:hAnsi="Times New Roman" w:cs="Times New Roman"/>
           <w:bidi w:val="0"/>
           <w:sz w:val="17"/>
+          <w:rtl w:val="0"/>
           <w:szCs w:val="17"/>
         </w:rPr>
         <w:t>‎μ̂ = 105.0‎</w:t>
@@ -4740,6 +4776,7 @@
           <w:rFonts w:ascii="Times New Roman" w:hAnsi="Times New Roman" w:cs="Times New Roman"/>
           <w:bidi w:val="0"/>
           <w:sz w:val="17"/>
+          <w:rtl w:val="0"/>
           <w:szCs w:val="17"/>
         </w:rPr>
         <w:t>‎U = 112.0‎</w:t>
@@ -4758,6 +4795,7 @@
           <w:rFonts w:ascii="Times New Roman" w:hAnsi="Times New Roman" w:cs="Times New Roman"/>
           <w:bidi w:val="0"/>
           <w:sz w:val="17"/>
+          <w:rtl w:val="0"/>
           <w:szCs w:val="17"/>
         </w:rPr>
         <w:t>‎B^G = 170.0‎</w:t>
@@ -4776,6 +4814,7 @@
           <w:rFonts w:ascii="Times New Roman" w:hAnsi="Times New Roman" w:cs="Times New Roman"/>
           <w:bidi w:val="0"/>
           <w:sz w:val="17"/>
+          <w:rtl w:val="0"/>
           <w:szCs w:val="17"/>
         </w:rPr>
         <w:t>‎Q = 0.90‎</w:t>
@@ -4794,6 +4833,7 @@
           <w:rFonts w:ascii="Times New Roman" w:hAnsi="Times New Roman" w:cs="Times New Roman"/>
           <w:bidi w:val="0"/>
           <w:sz w:val="17"/>
+          <w:rtl w:val="0"/>
           <w:szCs w:val="17"/>
         </w:rPr>
         <w:t>‎M-GATO‎</w:t>
@@ -4821,6 +4861,7 @@
           <w:rFonts w:ascii="Times New Roman" w:hAnsi="Times New Roman" w:cs="Times New Roman"/>
           <w:bidi w:val="0"/>
           <w:sz w:val="17"/>
+          <w:rtl w:val="0"/>
           <w:szCs w:val="17"/>
         </w:rPr>
         <w:t>B^G - U = 170.0 - 112.0 = 58.0   (Relative Gap = 0.3412)</w:t>
@@ -4839,6 +4880,7 @@
           <w:rFonts w:ascii="Times New Roman" w:hAnsi="Times New Roman" w:cs="Times New Roman"/>
           <w:bidi w:val="0"/>
           <w:sz w:val="17"/>
+          <w:rtl w:val="0"/>
           <w:szCs w:val="17"/>
         </w:rPr>
         <w:t>M-GATO = 0.3412 × 0.90 = 0.307</w:t>
@@ -4921,6 +4963,7 @@
           <w:rFonts w:ascii="Times New Roman" w:hAnsi="Times New Roman" w:cs="Times New Roman"/>
           <w:bidi w:val="0"/>
           <w:sz w:val="17"/>
+          <w:rtl w:val="0"/>
           <w:szCs w:val="17"/>
         </w:rPr>
         <w:t>‎3‎</w:t>
@@ -4939,6 +4982,7 @@
           <w:rFonts w:ascii="Times New Roman" w:hAnsi="Times New Roman" w:cs="Times New Roman"/>
           <w:bidi w:val="0"/>
           <w:sz w:val="17"/>
+          <w:rtl w:val="0"/>
           <w:szCs w:val="17"/>
         </w:rPr>
         <w:t>‎M-GATO‎</w:t>
@@ -4963,6 +5007,7 @@
           <w:rFonts w:ascii="Times New Roman" w:hAnsi="Times New Roman" w:cs="Times New Roman"/>
           <w:bidi w:val="0"/>
           <w:sz w:val="20"/>
+          <w:rtl w:val="0"/>
           <w:szCs w:val="20"/>
         </w:rPr>
         <w:t>‎4‎</w:t>
@@ -5011,6 +5056,7 @@
           <w:rFonts w:ascii="Times New Roman" w:hAnsi="Times New Roman" w:cs="Times New Roman"/>
           <w:bidi w:val="0"/>
           <w:sz w:val="17"/>
+          <w:rtl w:val="0"/>
           <w:szCs w:val="17"/>
         </w:rPr>
         <w:t>‎Opportunity(m)‎</w:t>
@@ -5029,6 +5075,7 @@
           <w:rFonts w:ascii="Times New Roman" w:hAnsi="Times New Roman" w:cs="Times New Roman"/>
           <w:bidi w:val="0"/>
           <w:sz w:val="17"/>
+          <w:rtl w:val="0"/>
           <w:szCs w:val="17"/>
         </w:rPr>
         <w:t>‎1‎</w:t>
@@ -5047,6 +5094,7 @@
           <w:rFonts w:ascii="Times New Roman" w:hAnsi="Times New Roman" w:cs="Times New Roman"/>
           <w:bidi w:val="0"/>
           <w:sz w:val="17"/>
+          <w:rtl w:val="0"/>
           <w:szCs w:val="17"/>
         </w:rPr>
         <w:t>‎d &gt; 0‎</w:t>
@@ -5058,13 +5106,14 @@
           <w:rtl/>
           <w:szCs w:val="18"/>
         </w:rPr>
-        <w:t xml:space="preserve"> در نرخ تولید تراکنش آن از دوره پایش ۴ آغاز شده و در دوره آزمون ۵ تداوم یافته باشد. دقیقاً تعداد ۵۱ پذیرنده از ۳۵۰ پذیرنده (۱۴٫۶٪) با نمونه‌گیری طبقه‌بندی‌شده از میان کاندیداهای دارای بنچ‌مارک فعال همتایان در تمامی اصناف به عنوان هدف تعیین شدند. هم‌پوشانی هدف-همتا پایین بوده و به طور میانگین تنها ۱۱٫۸٪ از همتایان یک هدف، خودشان هدف هستند. سناریوها شامل الف (افت ۱۸٪ با نویز ۳٫۰)، ب (افت ۳۲٪ با نویز ۱٫۸) و ج (افت ۴۸٪ با نویز ۰٫۹) هستند. در سناریوی شاهد منفی (</w:t>
-      </w:r>
-      <w:r>
-        <w:rPr>
-          <w:rFonts w:ascii="Times New Roman" w:hAnsi="Times New Roman" w:cs="Times New Roman"/>
-          <w:bidi w:val="0"/>
-          <w:sz w:val="17"/>
+        <w:t xml:space="preserve"> در نرخ تولید تراکنش آن از دوره پایش ۴ آغاز شده و در دوره آزمون ۵ تداوم یافته باشد. دقیقاً تعداد ۵۲ پذیرنده از ۳۵۰ پذیرنده (۱۴٫۹٪) با نمونه‌گیری طبقه‌بندی‌شده از میان کاندیداهای دارای بنچ‌مارک فعال همتایان (میانگین ۲۹۹ پذیرنده در ۱۰ سید با شانس تصادفی درون‌جامعه‌ای ۱۷٫۴٪) در تمامی اصناف به عنوان هدف تعیین شدند. هم‌پوشانی هدف-همتا پایین بوده و به طور میانگین تنها ۱۱٫۸٪ از همتایان یک هدف، خودشان هدف هستند. سناریوها شامل الف (افت ۱۸٪ با نویز ۳٫۰)، ب (افت ۳۲٪ با نویز ۱٫۸) و ج (افت ۴۸٪ با نویز ۰٫۹) هستند. در سناریوی شاهد منفی (</w:t>
+      </w:r>
+      <w:r>
+        <w:rPr>
+          <w:rFonts w:ascii="Times New Roman" w:hAnsi="Times New Roman" w:cs="Times New Roman"/>
+          <w:bidi w:val="0"/>
+          <w:sz w:val="17"/>
+          <w:rtl w:val="0"/>
           <w:szCs w:val="17"/>
         </w:rPr>
         <w:t>‎Scenario 0‎</w:t>
@@ -5083,6 +5132,7 @@
           <w:rFonts w:ascii="Times New Roman" w:hAnsi="Times New Roman" w:cs="Times New Roman"/>
           <w:bidi w:val="0"/>
           <w:sz w:val="17"/>
+          <w:rtl w:val="0"/>
           <w:szCs w:val="17"/>
         </w:rPr>
         <w:t>‎TP = 0‎</w:t>
@@ -5116,6 +5166,7 @@
           <w:rFonts w:ascii="Times New Roman" w:hAnsi="Times New Roman" w:cs="Times New Roman"/>
           <w:bidi w:val="0"/>
           <w:sz w:val="17"/>
+          <w:rtl w:val="0"/>
           <w:szCs w:val="17"/>
         </w:rPr>
         <w:t>‎P0‎</w:t>
@@ -5134,6 +5185,7 @@
           <w:rFonts w:ascii="Times New Roman" w:hAnsi="Times New Roman" w:cs="Times New Roman"/>
           <w:bidi w:val="0"/>
           <w:sz w:val="17"/>
+          <w:rtl w:val="0"/>
           <w:szCs w:val="17"/>
         </w:rPr>
         <w:t>‎λ = 0.65‎</w:t>
@@ -5152,6 +5204,7 @@
           <w:rFonts w:ascii="Times New Roman" w:hAnsi="Times New Roman" w:cs="Times New Roman"/>
           <w:bidi w:val="0"/>
           <w:sz w:val="17"/>
+          <w:rtl w:val="0"/>
           <w:szCs w:val="17"/>
         </w:rPr>
         <w:t>‎η = 0.25‎</w:t>
@@ -5170,6 +5223,7 @@
           <w:rFonts w:ascii="Times New Roman" w:hAnsi="Times New Roman" w:cs="Times New Roman"/>
           <w:bidi w:val="0"/>
           <w:sz w:val="17"/>
+          <w:rtl w:val="0"/>
           <w:szCs w:val="17"/>
         </w:rPr>
         <w:t>‎κ = 18.0‎</w:t>
@@ -5188,6 +5242,7 @@
           <w:rFonts w:ascii="Times New Roman" w:hAnsi="Times New Roman" w:cs="Times New Roman"/>
           <w:bidi w:val="0"/>
           <w:sz w:val="17"/>
+          <w:rtl w:val="0"/>
           <w:szCs w:val="17"/>
         </w:rPr>
         <w:t>‎K = 6‎</w:t>
@@ -5206,6 +5261,7 @@
           <w:rFonts w:ascii="Times New Roman" w:hAnsi="Times New Roman" w:cs="Times New Roman"/>
           <w:bidi w:val="0"/>
           <w:sz w:val="17"/>
+          <w:rtl w:val="0"/>
           <w:szCs w:val="17"/>
         </w:rPr>
         <w:t>‎α = 0.15‎</w:t>
@@ -5224,6 +5280,7 @@
           <w:rFonts w:ascii="Times New Roman" w:hAnsi="Times New Roman" w:cs="Times New Roman"/>
           <w:bidi w:val="0"/>
           <w:sz w:val="17"/>
+          <w:rtl w:val="0"/>
           <w:szCs w:val="17"/>
         </w:rPr>
         <w:t>‎K ∈ [3, 10]‎</w:t>
@@ -5242,6 +5299,7 @@
           <w:rFonts w:ascii="Times New Roman" w:hAnsi="Times New Roman" w:cs="Times New Roman"/>
           <w:bidi w:val="0"/>
           <w:sz w:val="17"/>
+          <w:rtl w:val="0"/>
           <w:szCs w:val="17"/>
         </w:rPr>
         <w:t>‎NDCG‎</w:t>
@@ -5260,6 +5318,7 @@
           <w:rFonts w:ascii="Times New Roman" w:hAnsi="Times New Roman" w:cs="Times New Roman"/>
           <w:bidi w:val="0"/>
           <w:sz w:val="17"/>
+          <w:rtl w:val="0"/>
           <w:szCs w:val="17"/>
         </w:rPr>
         <w:t>‎η ∈ [0.0, 0.5]‎</w:t>
@@ -5278,6 +5337,7 @@
           <w:rFonts w:ascii="Times New Roman" w:hAnsi="Times New Roman" w:cs="Times New Roman"/>
           <w:bidi w:val="0"/>
           <w:sz w:val="17"/>
+          <w:rtl w:val="0"/>
           <w:szCs w:val="17"/>
         </w:rPr>
         <w:t>‎NDCG‎</w:t>
@@ -5296,6 +5356,7 @@
           <w:rFonts w:ascii="Times New Roman" w:hAnsi="Times New Roman" w:cs="Times New Roman"/>
           <w:bidi w:val="0"/>
           <w:sz w:val="17"/>
+          <w:rtl w:val="0"/>
           <w:szCs w:val="17"/>
         </w:rPr>
         <w:t>‎κ ∈ [10, 30]‎</w:t>
@@ -5314,6 +5375,7 @@
           <w:rFonts w:ascii="Times New Roman" w:hAnsi="Times New Roman" w:cs="Times New Roman"/>
           <w:bidi w:val="0"/>
           <w:sz w:val="17"/>
+          <w:rtl w:val="0"/>
           <w:szCs w:val="17"/>
         </w:rPr>
         <w:t>‎NDCG‎</w:t>
@@ -5338,6 +5400,7 @@
           <w:rFonts w:ascii="Times New Roman" w:hAnsi="Times New Roman" w:cs="Times New Roman"/>
           <w:bidi w:val="0"/>
           <w:sz w:val="20"/>
+          <w:rtl w:val="0"/>
           <w:szCs w:val="20"/>
         </w:rPr>
         <w:t>‎5‎</w:t>
@@ -5362,6 +5425,7 @@
           <w:rFonts w:ascii="Times New Roman" w:hAnsi="Times New Roman" w:cs="Times New Roman"/>
           <w:bidi w:val="0"/>
           <w:sz w:val="18"/>
+          <w:rtl w:val="0"/>
           <w:szCs w:val="18"/>
         </w:rPr>
         <w:t>‎5.1‎</w:t>
@@ -5395,6 +5459,7 @@
           <w:rFonts w:ascii="Times New Roman" w:hAnsi="Times New Roman" w:cs="Times New Roman"/>
           <w:bidi w:val="0"/>
           <w:sz w:val="17"/>
+          <w:rtl w:val="0"/>
           <w:szCs w:val="17"/>
         </w:rPr>
         <w:t>‎1‎</w:t>
@@ -5413,6 +5478,7 @@
           <w:rFonts w:ascii="Times New Roman" w:hAnsi="Times New Roman" w:cs="Times New Roman"/>
           <w:bidi w:val="0"/>
           <w:sz w:val="17"/>
+          <w:rtl w:val="0"/>
           <w:szCs w:val="17"/>
         </w:rPr>
         <w:t>‎NB NLL‎</w:t>
@@ -5447,6 +5513,7 @@
           <w:rFonts w:ascii="Times New Roman" w:hAnsi="Times New Roman" w:cs="Times New Roman"/>
           <w:bidi w:val="0"/>
           <w:sz w:val="17"/>
+          <w:rtl w:val="0"/>
           <w:szCs w:val="17"/>
         </w:rPr>
         <w:t>‎1‎</w:t>
@@ -5542,6 +5609,7 @@
                 <w:b/>
                 <w:bidi w:val="0"/>
                 <w:sz w:val="12"/>
+                <w:rtl w:val="0"/>
                 <w:szCs w:val="12"/>
               </w:rPr>
               <w:t>‎MAE‎</w:t>
@@ -5574,6 +5642,7 @@
                 <w:b/>
                 <w:bidi w:val="0"/>
                 <w:sz w:val="12"/>
+                <w:rtl w:val="0"/>
                 <w:szCs w:val="12"/>
               </w:rPr>
               <w:t>‎RMSE‎</w:t>
@@ -5606,6 +5675,7 @@
                 <w:b/>
                 <w:bidi w:val="0"/>
                 <w:sz w:val="12"/>
+                <w:rtl w:val="0"/>
                 <w:szCs w:val="12"/>
               </w:rPr>
               <w:t>‎sMAPE‎</w:t>
@@ -5638,6 +5708,7 @@
                 <w:b/>
                 <w:bidi w:val="0"/>
                 <w:sz w:val="12"/>
+                <w:rtl w:val="0"/>
                 <w:szCs w:val="12"/>
               </w:rPr>
               <w:t>‎NB NLL‎</w:t>
@@ -5671,6 +5742,7 @@
                 <w:rFonts w:ascii="Times New Roman" w:hAnsi="Times New Roman" w:cs="Times New Roman"/>
                 <w:bidi w:val="0"/>
                 <w:sz w:val="11"/>
+                <w:rtl w:val="0"/>
                 <w:szCs w:val="11"/>
               </w:rPr>
               <w:t>‎Naive Persistence‎</w:t>
@@ -5825,6 +5897,7 @@
                 <w:rFonts w:ascii="Times New Roman" w:hAnsi="Times New Roman" w:cs="Times New Roman"/>
                 <w:bidi w:val="0"/>
                 <w:sz w:val="11"/>
+                <w:rtl w:val="0"/>
                 <w:szCs w:val="11"/>
               </w:rPr>
               <w:t>‎Moving Average‎</w:t>
@@ -5979,6 +6052,7 @@
                 <w:rFonts w:ascii="Times New Roman" w:hAnsi="Times New Roman" w:cs="Times New Roman"/>
                 <w:bidi w:val="0"/>
                 <w:sz w:val="11"/>
+                <w:rtl w:val="0"/>
                 <w:szCs w:val="11"/>
               </w:rPr>
               <w:t>‎Exp. Smoothing‎</w:t>
@@ -6133,6 +6207,7 @@
                 <w:rFonts w:ascii="Times New Roman" w:hAnsi="Times New Roman" w:cs="Times New Roman"/>
                 <w:bidi w:val="0"/>
                 <w:sz w:val="11"/>
+                <w:rtl w:val="0"/>
                 <w:szCs w:val="11"/>
               </w:rPr>
               <w:t>‎Tabular GBDT‎</w:t>
@@ -6151,6 +6226,7 @@
                 <w:rFonts w:ascii="Times New Roman" w:hAnsi="Times New Roman" w:cs="Times New Roman"/>
                 <w:bidi w:val="0"/>
                 <w:sz w:val="11"/>
+                <w:rtl w:val="0"/>
                 <w:szCs w:val="11"/>
               </w:rPr>
               <w:t>‎RFM‎</w:t>
@@ -6305,6 +6381,7 @@
                 <w:rFonts w:ascii="Times New Roman" w:hAnsi="Times New Roman" w:cs="Times New Roman"/>
                 <w:bidi w:val="0"/>
                 <w:sz w:val="11"/>
+                <w:rtl w:val="0"/>
                 <w:szCs w:val="11"/>
               </w:rPr>
               <w:t>‎NB-GLM‎</w:t>
@@ -6459,6 +6536,7 @@
                 <w:rFonts w:ascii="Times New Roman" w:hAnsi="Times New Roman" w:cs="Times New Roman"/>
                 <w:bidi w:val="0"/>
                 <w:sz w:val="11"/>
+                <w:rtl w:val="0"/>
                 <w:szCs w:val="11"/>
               </w:rPr>
               <w:t>‎Static GNN‎</w:t>
@@ -6616,6 +6694,7 @@
                 <w:b/>
                 <w:bidi w:val="0"/>
                 <w:sz w:val="11"/>
+                <w:rtl w:val="0"/>
                 <w:szCs w:val="11"/>
               </w:rPr>
               <w:t>‎HAMTA Temporal‎</w:t>
@@ -6778,6 +6857,7 @@
           <w:rFonts w:ascii="Times New Roman" w:hAnsi="Times New Roman" w:cs="Times New Roman"/>
           <w:bidi w:val="0"/>
           <w:sz w:val="17"/>
+          <w:rtl w:val="0"/>
           <w:szCs w:val="17"/>
         </w:rPr>
         <w:t>‎HAMTA‎</w:t>
@@ -6796,6 +6876,7 @@
           <w:rFonts w:ascii="Times New Roman" w:hAnsi="Times New Roman" w:cs="Times New Roman"/>
           <w:bidi w:val="0"/>
           <w:sz w:val="17"/>
+          <w:rtl w:val="0"/>
           <w:szCs w:val="17"/>
         </w:rPr>
         <w:t>‎MAE‎</w:t>
@@ -6814,6 +6895,7 @@
           <w:rFonts w:ascii="Times New Roman" w:hAnsi="Times New Roman" w:cs="Times New Roman"/>
           <w:bidi w:val="0"/>
           <w:sz w:val="17"/>
+          <w:rtl w:val="0"/>
           <w:szCs w:val="17"/>
         </w:rPr>
         <w:t>‎HAMTA‎</w:t>
@@ -6832,6 +6914,7 @@
           <w:rFonts w:ascii="Times New Roman" w:hAnsi="Times New Roman" w:cs="Times New Roman"/>
           <w:bidi w:val="0"/>
           <w:sz w:val="17"/>
+          <w:rtl w:val="0"/>
           <w:szCs w:val="17"/>
         </w:rPr>
         <w:t>‎HAMTA‎</w:t>
@@ -6856,6 +6939,7 @@
           <w:rFonts w:ascii="Times New Roman" w:hAnsi="Times New Roman" w:cs="Times New Roman"/>
           <w:bidi w:val="0"/>
           <w:sz w:val="18"/>
+          <w:rtl w:val="0"/>
           <w:szCs w:val="18"/>
         </w:rPr>
         <w:t>‎5.2‎</w:t>
@@ -6889,6 +6973,7 @@
           <w:rFonts w:ascii="Times New Roman" w:hAnsi="Times New Roman" w:cs="Times New Roman"/>
           <w:bidi w:val="0"/>
           <w:sz w:val="17"/>
+          <w:rtl w:val="0"/>
           <w:szCs w:val="17"/>
         </w:rPr>
         <w:t>‎2‎</w:t>
@@ -6923,6 +7008,7 @@
           <w:rFonts w:ascii="Times New Roman" w:hAnsi="Times New Roman" w:cs="Times New Roman"/>
           <w:bidi w:val="0"/>
           <w:sz w:val="17"/>
+          <w:rtl w:val="0"/>
           <w:szCs w:val="17"/>
         </w:rPr>
         <w:t>‎2‎</w:t>
@@ -6941,6 +7027,7 @@
           <w:rFonts w:ascii="Times New Roman" w:hAnsi="Times New Roman" w:cs="Times New Roman"/>
           <w:bidi w:val="0"/>
           <w:sz w:val="17"/>
+          <w:rtl w:val="0"/>
           <w:szCs w:val="17"/>
         </w:rPr>
         <w:t>‎Top-35‎</w:t>
@@ -7037,6 +7124,7 @@
                 <w:b/>
                 <w:bidi w:val="0"/>
                 <w:sz w:val="11"/>
+                <w:rtl w:val="0"/>
                 <w:szCs w:val="11"/>
               </w:rPr>
               <w:t>‎P@35‎</w:t>
@@ -7069,6 +7157,7 @@
                 <w:b/>
                 <w:bidi w:val="0"/>
                 <w:sz w:val="11"/>
+                <w:rtl w:val="0"/>
                 <w:szCs w:val="11"/>
               </w:rPr>
               <w:t>‎R@35‎</w:t>
@@ -7101,6 +7190,7 @@
                 <w:b/>
                 <w:bidi w:val="0"/>
                 <w:sz w:val="11"/>
+                <w:rtl w:val="0"/>
                 <w:szCs w:val="11"/>
               </w:rPr>
               <w:t>‎R-Prec‎</w:t>
@@ -7133,6 +7223,7 @@
                 <w:b/>
                 <w:bidi w:val="0"/>
                 <w:sz w:val="11"/>
+                <w:rtl w:val="0"/>
                 <w:szCs w:val="11"/>
               </w:rPr>
               <w:t>‎NDCG@35‎</w:t>
@@ -7165,6 +7256,7 @@
                 <w:b/>
                 <w:bidi w:val="0"/>
                 <w:sz w:val="11"/>
+                <w:rtl w:val="0"/>
                 <w:szCs w:val="11"/>
               </w:rPr>
               <w:t>‎MAP@35‎</w:t>
@@ -7553,6 +7645,7 @@
                 <w:rFonts w:ascii="Times New Roman" w:hAnsi="Times New Roman" w:cs="Times New Roman"/>
                 <w:bidi w:val="0"/>
                 <w:sz w:val="10"/>
+                <w:rtl w:val="0"/>
                 <w:szCs w:val="10"/>
               </w:rPr>
               <w:t>‎GBDT‎</w:t>
@@ -7735,6 +7828,7 @@
                 <w:rFonts w:ascii="Times New Roman" w:hAnsi="Times New Roman" w:cs="Times New Roman"/>
                 <w:bidi w:val="0"/>
                 <w:sz w:val="10"/>
+                <w:rtl w:val="0"/>
                 <w:szCs w:val="10"/>
               </w:rPr>
               <w:t>‎kNN‎</w:t>
@@ -8090,6 +8184,7 @@
                 <w:rFonts w:ascii="Times New Roman" w:hAnsi="Times New Roman" w:cs="Times New Roman"/>
                 <w:bidi w:val="0"/>
                 <w:sz w:val="10"/>
+                <w:rtl w:val="0"/>
                 <w:szCs w:val="10"/>
               </w:rPr>
               <w:t>‎SFA‎</w:t>
@@ -8263,6 +8358,7 @@
                 <w:rFonts w:ascii="Times New Roman" w:hAnsi="Times New Roman" w:cs="Times New Roman"/>
                 <w:bidi w:val="0"/>
                 <w:sz w:val="10"/>
+                <w:rtl w:val="0"/>
                 <w:szCs w:val="10"/>
               </w:rPr>
               <w:t>‎M-GATO‎</w:t>
@@ -8281,6 +8377,7 @@
                 <w:rFonts w:ascii="Times New Roman" w:hAnsi="Times New Roman" w:cs="Times New Roman"/>
                 <w:bidi w:val="0"/>
                 <w:sz w:val="10"/>
+                <w:rtl w:val="0"/>
                 <w:szCs w:val="10"/>
               </w:rPr>
               <w:t>‎Q‎</w:t>
@@ -8477,6 +8574,7 @@
                 <w:b/>
                 <w:bidi w:val="0"/>
                 <w:sz w:val="10"/>
+                <w:rtl w:val="0"/>
                 <w:szCs w:val="10"/>
               </w:rPr>
               <w:t>‎HAMTA‎</w:t>
@@ -8702,6 +8800,7 @@
           <w:rFonts w:ascii="Times New Roman" w:hAnsi="Times New Roman" w:cs="Times New Roman"/>
           <w:bidi w:val="0"/>
           <w:sz w:val="17"/>
+          <w:rtl w:val="0"/>
           <w:szCs w:val="17"/>
         </w:rPr>
         <w:t>‎4‎</w:t>
@@ -8728,13 +8827,14 @@
           <w:rtl/>
           <w:szCs w:val="18"/>
         </w:rPr>
-        <w:t>با توجه به شیوع فرصت‌های واقعی در سطح ۵۱ پذیرنده از ۳۵۰ پذیرنده (شانس تصادفی معادل ۰٫۱۴۶ یا ۱۴٫۶٪)، نتایج جدول (</w:t>
-      </w:r>
-      <w:r>
-        <w:rPr>
-          <w:rFonts w:ascii="Times New Roman" w:hAnsi="Times New Roman" w:cs="Times New Roman"/>
-          <w:bidi w:val="0"/>
-          <w:sz w:val="17"/>
+        <w:t>با توجه به شیوع فرصت‌های واقعی در سطح ۵۲ پذیرنده از ۳۵۰ پذیرنده (شانس تصادفی کل سبد معادل ۰٫۱۴۸۶ یا ۱۴٫۹٪، و شانس تصادفی جامعه کاندیداها معادل ۱۷٫۴٪)، نتایج جدول (</w:t>
+      </w:r>
+      <w:r>
+        <w:rPr>
+          <w:rFonts w:ascii="Times New Roman" w:hAnsi="Times New Roman" w:cs="Times New Roman"/>
+          <w:bidi w:val="0"/>
+          <w:sz w:val="17"/>
+          <w:rtl w:val="0"/>
           <w:szCs w:val="17"/>
         </w:rPr>
         <w:t>‎2‎</w:t>
@@ -8753,6 +8853,7 @@
           <w:rFonts w:ascii="Times New Roman" w:hAnsi="Times New Roman" w:cs="Times New Roman"/>
           <w:bidi w:val="0"/>
           <w:sz w:val="17"/>
+          <w:rtl w:val="0"/>
           <w:szCs w:val="17"/>
         </w:rPr>
         <w:t>‎HAMTA‎</w:t>
@@ -8771,6 +8872,7 @@
           <w:rFonts w:ascii="Times New Roman" w:hAnsi="Times New Roman" w:cs="Times New Roman"/>
           <w:bidi w:val="0"/>
           <w:sz w:val="17"/>
+          <w:rtl w:val="0"/>
           <w:szCs w:val="17"/>
         </w:rPr>
         <w:t>‎Precision@35‎</w:t>
@@ -8789,6 +8891,7 @@
           <w:rFonts w:ascii="Times New Roman" w:hAnsi="Times New Roman" w:cs="Times New Roman"/>
           <w:bidi w:val="0"/>
           <w:sz w:val="17"/>
+          <w:rtl w:val="0"/>
           <w:szCs w:val="17"/>
         </w:rPr>
         <w:t>‎Recall@35‎</w:t>
@@ -8800,13 +8903,14 @@
           <w:rtl/>
           <w:szCs w:val="18"/>
         </w:rPr>
-        <w:t xml:space="preserve"> معادل ۰٫۲۴۶ ± ۰٫۰۸۱ (با سقف نظری ۰٫۶۸۶ برای ۳۵ جایگاه از ۵۱ هدف)، </w:t>
-      </w:r>
-      <w:r>
-        <w:rPr>
-          <w:rFonts w:ascii="Times New Roman" w:hAnsi="Times New Roman" w:cs="Times New Roman"/>
-          <w:bidi w:val="0"/>
-          <w:sz w:val="17"/>
+        <w:t xml:space="preserve"> معادل ۰٫۲۴۶ ± ۰٫۰۸۱ (با سقف نظری ۰٫۶۷۳ برای ۳۵ جایگاه از ۵۲ هدف: ۳۵/۵۲ = ۰٫۶۷۳)، </w:t>
+      </w:r>
+      <w:r>
+        <w:rPr>
+          <w:rFonts w:ascii="Times New Roman" w:hAnsi="Times New Roman" w:cs="Times New Roman"/>
+          <w:bidi w:val="0"/>
+          <w:sz w:val="17"/>
+          <w:rtl w:val="0"/>
           <w:szCs w:val="17"/>
         </w:rPr>
         <w:t>‎NDCG@35‎</w:t>
@@ -8825,6 +8929,7 @@
           <w:rFonts w:ascii="Times New Roman" w:hAnsi="Times New Roman" w:cs="Times New Roman"/>
           <w:bidi w:val="0"/>
           <w:sz w:val="17"/>
+          <w:rtl w:val="0"/>
           <w:szCs w:val="17"/>
         </w:rPr>
         <w:t>‎R-Precision‎</w:t>
@@ -8836,7 +8941,7 @@
           <w:rtl/>
           <w:szCs w:val="18"/>
         </w:rPr>
-        <w:t xml:space="preserve"> معادل ۰٫۳۴۲ ± ۰٫۰۷۷، به ضریب برتری ۲٫۵۱ برابری نسبت به انتخاب تصادفی دست می‌یابد.</w:t>
+        <w:t xml:space="preserve"> معادل ۰٫۳۴۲ ± ۰٫۰۷۷، به ضریب برتری ۲٫۴۶ برابری نسبت به انتخاب تصادفی کل سبد (و ۲٫۱۰ برابری نسبت به خط‌مبنای تصادفی درون‌جامعه کاندیداها) دست می‌یابد.</w:t>
       </w:r>
     </w:p>
     <w:p>
@@ -8849,6 +8954,7 @@
           <w:rFonts w:ascii="Times New Roman" w:hAnsi="Times New Roman" w:cs="Times New Roman"/>
           <w:bidi w:val="0"/>
           <w:sz w:val="18"/>
+          <w:rtl w:val="0"/>
           <w:szCs w:val="18"/>
         </w:rPr>
         <w:t>‎5.3‎</w:t>
@@ -8882,6 +8988,7 @@
           <w:rFonts w:ascii="Times New Roman" w:hAnsi="Times New Roman" w:cs="Times New Roman"/>
           <w:bidi w:val="0"/>
           <w:sz w:val="17"/>
+          <w:rtl w:val="0"/>
           <w:szCs w:val="17"/>
         </w:rPr>
         <w:t>‎3‎</w:t>
@@ -8900,6 +9007,7 @@
           <w:rFonts w:ascii="Times New Roman" w:hAnsi="Times New Roman" w:cs="Times New Roman"/>
           <w:bidi w:val="0"/>
           <w:sz w:val="17"/>
+          <w:rtl w:val="0"/>
           <w:szCs w:val="17"/>
         </w:rPr>
         <w:t>‎K ∈ {۱۰, ۲۰, ۳۵, ۵۰}‎</w:t>
@@ -8934,6 +9042,7 @@
           <w:rFonts w:ascii="Times New Roman" w:hAnsi="Times New Roman" w:cs="Times New Roman"/>
           <w:bidi w:val="0"/>
           <w:sz w:val="17"/>
+          <w:rtl w:val="0"/>
           <w:szCs w:val="17"/>
         </w:rPr>
         <w:t>‎3‎</w:t>
@@ -9061,6 +9170,7 @@
                 <w:b/>
                 <w:bidi w:val="0"/>
                 <w:sz w:val="11"/>
+                <w:rtl w:val="0"/>
                 <w:szCs w:val="11"/>
               </w:rPr>
               <w:t>‎Prec@K‎</w:t>
@@ -9093,6 +9203,7 @@
                 <w:b/>
                 <w:bidi w:val="0"/>
                 <w:sz w:val="11"/>
+                <w:rtl w:val="0"/>
                 <w:szCs w:val="11"/>
               </w:rPr>
               <w:t>‎Recall@K‎</w:t>
@@ -9125,6 +9236,7 @@
                 <w:b/>
                 <w:bidi w:val="0"/>
                 <w:sz w:val="11"/>
+                <w:rtl w:val="0"/>
                 <w:szCs w:val="11"/>
               </w:rPr>
               <w:t>‎NDCG@K‎</w:t>
@@ -9340,6 +9452,7 @@
                 <w:rFonts w:ascii="Times New Roman" w:hAnsi="Times New Roman" w:cs="Times New Roman"/>
                 <w:bidi w:val="0"/>
                 <w:sz w:val="10"/>
+                <w:rtl w:val="0"/>
                 <w:szCs w:val="10"/>
               </w:rPr>
               <w:t>‎GBDT‎</w:t>
@@ -9639,6 +9752,7 @@
                 <w:rFonts w:ascii="Times New Roman" w:hAnsi="Times New Roman" w:cs="Times New Roman"/>
                 <w:bidi w:val="0"/>
                 <w:sz w:val="10"/>
+                <w:rtl w:val="0"/>
                 <w:szCs w:val="10"/>
               </w:rPr>
               <w:t>‎SFA‎</w:t>
@@ -9793,6 +9907,7 @@
                 <w:rFonts w:ascii="Times New Roman" w:hAnsi="Times New Roman" w:cs="Times New Roman"/>
                 <w:bidi w:val="0"/>
                 <w:sz w:val="10"/>
+                <w:rtl w:val="0"/>
                 <w:szCs w:val="10"/>
               </w:rPr>
               <w:t>‎HAMTA‎</w:t>
@@ -10092,6 +10207,7 @@
                 <w:rFonts w:ascii="Times New Roman" w:hAnsi="Times New Roman" w:cs="Times New Roman"/>
                 <w:bidi w:val="0"/>
                 <w:sz w:val="10"/>
+                <w:rtl w:val="0"/>
                 <w:szCs w:val="10"/>
               </w:rPr>
               <w:t>‎GBDT‎</w:t>
@@ -10391,6 +10507,7 @@
                 <w:rFonts w:ascii="Times New Roman" w:hAnsi="Times New Roman" w:cs="Times New Roman"/>
                 <w:bidi w:val="0"/>
                 <w:sz w:val="10"/>
+                <w:rtl w:val="0"/>
                 <w:szCs w:val="10"/>
               </w:rPr>
               <w:t>‎SFA‎</w:t>
@@ -10545,6 +10662,7 @@
                 <w:rFonts w:ascii="Times New Roman" w:hAnsi="Times New Roman" w:cs="Times New Roman"/>
                 <w:bidi w:val="0"/>
                 <w:sz w:val="10"/>
+                <w:rtl w:val="0"/>
                 <w:szCs w:val="10"/>
               </w:rPr>
               <w:t>‎HAMTA‎</w:t>
@@ -10844,6 +10962,7 @@
                 <w:rFonts w:ascii="Times New Roman" w:hAnsi="Times New Roman" w:cs="Times New Roman"/>
                 <w:bidi w:val="0"/>
                 <w:sz w:val="10"/>
+                <w:rtl w:val="0"/>
                 <w:szCs w:val="10"/>
               </w:rPr>
               <w:t>‎GBDT‎</w:t>
@@ -11143,6 +11262,7 @@
                 <w:rFonts w:ascii="Times New Roman" w:hAnsi="Times New Roman" w:cs="Times New Roman"/>
                 <w:bidi w:val="0"/>
                 <w:sz w:val="10"/>
+                <w:rtl w:val="0"/>
                 <w:szCs w:val="10"/>
               </w:rPr>
               <w:t>‎SFA‎</w:t>
@@ -11297,6 +11417,7 @@
                 <w:rFonts w:ascii="Times New Roman" w:hAnsi="Times New Roman" w:cs="Times New Roman"/>
                 <w:bidi w:val="0"/>
                 <w:sz w:val="10"/>
+                <w:rtl w:val="0"/>
                 <w:szCs w:val="10"/>
               </w:rPr>
               <w:t>‎HAMTA‎</w:t>
@@ -11596,6 +11717,7 @@
                 <w:rFonts w:ascii="Times New Roman" w:hAnsi="Times New Roman" w:cs="Times New Roman"/>
                 <w:bidi w:val="0"/>
                 <w:sz w:val="10"/>
+                <w:rtl w:val="0"/>
                 <w:szCs w:val="10"/>
               </w:rPr>
               <w:t>‎GBDT‎</w:t>
@@ -11895,6 +12017,7 @@
                 <w:rFonts w:ascii="Times New Roman" w:hAnsi="Times New Roman" w:cs="Times New Roman"/>
                 <w:bidi w:val="0"/>
                 <w:sz w:val="10"/>
+                <w:rtl w:val="0"/>
                 <w:szCs w:val="10"/>
               </w:rPr>
               <w:t>‎SFA‎</w:t>
@@ -12049,6 +12172,7 @@
                 <w:rFonts w:ascii="Times New Roman" w:hAnsi="Times New Roman" w:cs="Times New Roman"/>
                 <w:bidi w:val="0"/>
                 <w:sz w:val="10"/>
+                <w:rtl w:val="0"/>
                 <w:szCs w:val="10"/>
               </w:rPr>
               <w:t>‎HAMTA‎</w:t>
@@ -12160,6 +12284,7 @@
           <w:rFonts w:ascii="Times New Roman" w:hAnsi="Times New Roman" w:cs="Times New Roman"/>
           <w:bidi w:val="0"/>
           <w:sz w:val="17"/>
+          <w:rtl w:val="0"/>
           <w:szCs w:val="17"/>
         </w:rPr>
         <w:t>‎K = 10‎</w:t>
@@ -12178,6 +12303,7 @@
           <w:rFonts w:ascii="Times New Roman" w:hAnsi="Times New Roman" w:cs="Times New Roman"/>
           <w:bidi w:val="0"/>
           <w:sz w:val="17"/>
+          <w:rtl w:val="0"/>
           <w:szCs w:val="17"/>
         </w:rPr>
         <w:t>‎SFA‎</w:t>
@@ -12196,6 +12322,7 @@
           <w:rFonts w:ascii="Times New Roman" w:hAnsi="Times New Roman" w:cs="Times New Roman"/>
           <w:bidi w:val="0"/>
           <w:sz w:val="17"/>
+          <w:rtl w:val="0"/>
           <w:szCs w:val="17"/>
         </w:rPr>
         <w:t>‎HAMTA‎</w:t>
@@ -12214,6 +12341,7 @@
           <w:rFonts w:ascii="Times New Roman" w:hAnsi="Times New Roman" w:cs="Times New Roman"/>
           <w:bidi w:val="0"/>
           <w:sz w:val="17"/>
+          <w:rtl w:val="0"/>
           <w:szCs w:val="17"/>
         </w:rPr>
         <w:t>‎HAMTA‎</w:t>
@@ -12232,6 +12360,7 @@
           <w:rFonts w:ascii="Times New Roman" w:hAnsi="Times New Roman" w:cs="Times New Roman"/>
           <w:bidi w:val="0"/>
           <w:sz w:val="17"/>
+          <w:rtl w:val="0"/>
           <w:szCs w:val="17"/>
         </w:rPr>
         <w:t>‎K = 20‎</w:t>
@@ -12250,6 +12379,7 @@
           <w:rFonts w:ascii="Times New Roman" w:hAnsi="Times New Roman" w:cs="Times New Roman"/>
           <w:bidi w:val="0"/>
           <w:sz w:val="17"/>
+          <w:rtl w:val="0"/>
           <w:szCs w:val="17"/>
         </w:rPr>
         <w:t>‎SFA‎</w:t>
@@ -12268,6 +12398,7 @@
           <w:rFonts w:ascii="Times New Roman" w:hAnsi="Times New Roman" w:cs="Times New Roman"/>
           <w:bidi w:val="0"/>
           <w:sz w:val="17"/>
+          <w:rtl w:val="0"/>
           <w:szCs w:val="17"/>
         </w:rPr>
         <w:t>‎K = 20‎</w:t>
@@ -12286,6 +12417,7 @@
           <w:rFonts w:ascii="Times New Roman" w:hAnsi="Times New Roman" w:cs="Times New Roman"/>
           <w:bidi w:val="0"/>
           <w:sz w:val="17"/>
+          <w:rtl w:val="0"/>
           <w:szCs w:val="17"/>
         </w:rPr>
         <w:t>‎K = 35‎</w:t>
@@ -12304,6 +12436,7 @@
           <w:rFonts w:ascii="Times New Roman" w:hAnsi="Times New Roman" w:cs="Times New Roman"/>
           <w:bidi w:val="0"/>
           <w:sz w:val="17"/>
+          <w:rtl w:val="0"/>
           <w:szCs w:val="17"/>
         </w:rPr>
         <w:t>‎K = 50‎</w:t>
@@ -12322,6 +12455,7 @@
           <w:rFonts w:ascii="Times New Roman" w:hAnsi="Times New Roman" w:cs="Times New Roman"/>
           <w:bidi w:val="0"/>
           <w:sz w:val="17"/>
+          <w:rtl w:val="0"/>
           <w:szCs w:val="17"/>
         </w:rPr>
         <w:t>‎HAMTA‎</w:t>
@@ -12333,13 +12467,14 @@
           <w:rtl/>
           <w:szCs w:val="18"/>
         </w:rPr>
-        <w:t xml:space="preserve"> نسبت به خط‌مبناهای سنتی معناداری آماری خود را حفظ می‌نمایند (</w:t>
-      </w:r>
-      <w:r>
-        <w:rPr>
-          <w:rFonts w:ascii="Times New Roman" w:hAnsi="Times New Roman" w:cs="Times New Roman"/>
-          <w:bidi w:val="0"/>
-          <w:sz w:val="17"/>
+        <w:t xml:space="preserve"> نسبت به خط‌مبناهای سنتی کمترین حجم و مدل جدولی در تمامی بودجه‌ها کاملاً معنادار باقی می‌ماند (</w:t>
+      </w:r>
+      <w:r>
+        <w:rPr>
+          <w:rFonts w:ascii="Times New Roman" w:hAnsi="Times New Roman" w:cs="Times New Roman"/>
+          <w:bidi w:val="0"/>
+          <w:sz w:val="17"/>
+          <w:rtl w:val="0"/>
           <w:szCs w:val="17"/>
         </w:rPr>
         <w:t>‎p_adj &lt; 0.05‎</w:t>
@@ -12358,6 +12493,7 @@
           <w:rFonts w:ascii="Times New Roman" w:hAnsi="Times New Roman" w:cs="Times New Roman"/>
           <w:bidi w:val="0"/>
           <w:sz w:val="17"/>
+          <w:rtl w:val="0"/>
           <w:szCs w:val="17"/>
         </w:rPr>
         <w:t>‎K = 10‎</w:t>
@@ -12376,9 +12512,10 @@
           <w:rFonts w:ascii="Times New Roman" w:hAnsi="Times New Roman" w:cs="Times New Roman"/>
           <w:bidi w:val="0"/>
           <w:sz w:val="17"/>
-          <w:szCs w:val="17"/>
-        </w:rPr>
-        <w:t>‎p = 0.015‎</w:t>
+          <w:rtl w:val="0"/>
+          <w:szCs w:val="17"/>
+        </w:rPr>
+        <w:t>‎p_adj = 0.0156‎</w:t>
       </w:r>
       <w:r>
         <w:rPr>
@@ -12394,9 +12531,10 @@
           <w:rFonts w:ascii="Times New Roman" w:hAnsi="Times New Roman" w:cs="Times New Roman"/>
           <w:bidi w:val="0"/>
           <w:sz w:val="17"/>
-          <w:szCs w:val="17"/>
-        </w:rPr>
-        <w:t>‎p = 0.039‎</w:t>
+          <w:rtl w:val="0"/>
+          <w:szCs w:val="17"/>
+        </w:rPr>
+        <w:t>‎p_adj = 0.0293‎</w:t>
       </w:r>
       <w:r>
         <w:rPr>
@@ -12412,6 +12550,7 @@
           <w:rFonts w:ascii="Times New Roman" w:hAnsi="Times New Roman" w:cs="Times New Roman"/>
           <w:bidi w:val="0"/>
           <w:sz w:val="17"/>
+          <w:rtl w:val="0"/>
           <w:szCs w:val="17"/>
         </w:rPr>
         <w:t>‎K = 20‎</w:t>
@@ -12430,9 +12569,10 @@
           <w:rFonts w:ascii="Times New Roman" w:hAnsi="Times New Roman" w:cs="Times New Roman"/>
           <w:bidi w:val="0"/>
           <w:sz w:val="17"/>
-          <w:szCs w:val="17"/>
-        </w:rPr>
-        <w:t>‎p = 0.005‎</w:t>
+          <w:rtl w:val="0"/>
+          <w:szCs w:val="17"/>
+        </w:rPr>
+        <w:t>‎p_adj = 0.0156‎</w:t>
       </w:r>
       <w:r>
         <w:rPr>
@@ -12448,9 +12588,10 @@
           <w:rFonts w:ascii="Times New Roman" w:hAnsi="Times New Roman" w:cs="Times New Roman"/>
           <w:bidi w:val="0"/>
           <w:sz w:val="17"/>
-          <w:szCs w:val="17"/>
-        </w:rPr>
-        <w:t>‎p = 0.005‎</w:t>
+          <w:rtl w:val="0"/>
+          <w:szCs w:val="17"/>
+        </w:rPr>
+        <w:t>‎p_adj = 0.0176‎</w:t>
       </w:r>
       <w:r>
         <w:rPr>
@@ -12466,6 +12607,7 @@
           <w:rFonts w:ascii="Times New Roman" w:hAnsi="Times New Roman" w:cs="Times New Roman"/>
           <w:bidi w:val="0"/>
           <w:sz w:val="17"/>
+          <w:rtl w:val="0"/>
           <w:szCs w:val="17"/>
         </w:rPr>
         <w:t>‎K = 35‎</w:t>
@@ -12477,13 +12619,71 @@
           <w:rtl/>
           <w:szCs w:val="18"/>
         </w:rPr>
-        <w:t xml:space="preserve"> نسبت به گراف ایستا (</w:t>
-      </w:r>
-      <w:r>
-        <w:rPr>
-          <w:rFonts w:ascii="Times New Roman" w:hAnsi="Times New Roman" w:cs="Times New Roman"/>
-          <w:bidi w:val="0"/>
-          <w:sz w:val="17"/>
+        <w:t xml:space="preserve"> نسبت به کمترین حجم (</w:t>
+      </w:r>
+      <w:r>
+        <w:rPr>
+          <w:rFonts w:ascii="Times New Roman" w:hAnsi="Times New Roman" w:cs="Times New Roman"/>
+          <w:bidi w:val="0"/>
+          <w:sz w:val="17"/>
+          <w:rtl w:val="0"/>
+          <w:szCs w:val="17"/>
+        </w:rPr>
+        <w:t>‎p_adj = 0.0176‎</w:t>
+      </w:r>
+      <w:r>
+        <w:rPr>
+          <w:rFonts w:hint="cs" w:ascii="B Mitra" w:hAnsi="B Mitra" w:cs="B Mitra"/>
+          <w:sz w:val="18"/>
+          <w:rtl/>
+          <w:szCs w:val="18"/>
+        </w:rPr>
+        <w:t>) و مدل جدولی (</w:t>
+      </w:r>
+      <w:r>
+        <w:rPr>
+          <w:rFonts w:ascii="Times New Roman" w:hAnsi="Times New Roman" w:cs="Times New Roman"/>
+          <w:bidi w:val="0"/>
+          <w:sz w:val="17"/>
+          <w:rtl w:val="0"/>
+          <w:szCs w:val="17"/>
+        </w:rPr>
+        <w:t>‎p_adj = 0.0078‎</w:t>
+      </w:r>
+      <w:r>
+        <w:rPr>
+          <w:rFonts w:hint="cs" w:ascii="B Mitra" w:hAnsi="B Mitra" w:cs="B Mitra"/>
+          <w:sz w:val="18"/>
+          <w:rtl/>
+          <w:szCs w:val="18"/>
+        </w:rPr>
+        <w:t xml:space="preserve">). نسبت به گراف ایستا در </w:t>
+      </w:r>
+      <w:r>
+        <w:rPr>
+          <w:rFonts w:ascii="Times New Roman" w:hAnsi="Times New Roman" w:cs="Times New Roman"/>
+          <w:bidi w:val="0"/>
+          <w:sz w:val="17"/>
+          <w:rtl w:val="0"/>
+          <w:szCs w:val="17"/>
+        </w:rPr>
+        <w:t>‎K = 35‎</w:t>
+      </w:r>
+      <w:r>
+        <w:rPr>
+          <w:rFonts w:hint="cs" w:ascii="B Mitra" w:hAnsi="B Mitra" w:cs="B Mitra"/>
+          <w:sz w:val="18"/>
+          <w:rtl/>
+          <w:szCs w:val="18"/>
+        </w:rPr>
+        <w:t>، آزمون خام ویلکاکسون معنادار است (</w:t>
+      </w:r>
+      <w:r>
+        <w:rPr>
+          <w:rFonts w:ascii="Times New Roman" w:hAnsi="Times New Roman" w:cs="Times New Roman"/>
+          <w:bidi w:val="0"/>
+          <w:sz w:val="17"/>
+          <w:rtl w:val="0"/>
           <w:szCs w:val="17"/>
         </w:rPr>
         <w:t>‎p = 0.0488‎</w:t>
@@ -12495,7 +12695,83 @@
           <w:rtl/>
           <w:szCs w:val="18"/>
         </w:rPr>
-        <w:t>).</w:t>
+        <w:t xml:space="preserve">) که پس از تصحیح هولم-بونفرونی به </w:t>
+      </w:r>
+      <w:r>
+        <w:rPr>
+          <w:rFonts w:ascii="Times New Roman" w:hAnsi="Times New Roman" w:cs="Times New Roman"/>
+          <w:bidi w:val="0"/>
+          <w:sz w:val="17"/>
+          <w:rtl w:val="0"/>
+          <w:szCs w:val="17"/>
+        </w:rPr>
+        <w:t>‎p_adj = 0.0977‎</w:t>
+      </w:r>
+      <w:r>
+        <w:rPr>
+          <w:rFonts w:hint="cs" w:ascii="B Mitra" w:hAnsi="B Mitra" w:cs="B Mitra"/>
+          <w:sz w:val="18"/>
+          <w:rtl/>
+          <w:szCs w:val="18"/>
+        </w:rPr>
+        <w:t xml:space="preserve"> تعدیل می‌شود. تفاوت‌های </w:t>
+      </w:r>
+      <w:r>
+        <w:rPr>
+          <w:rFonts w:ascii="Times New Roman" w:hAnsi="Times New Roman" w:cs="Times New Roman"/>
+          <w:bidi w:val="0"/>
+          <w:sz w:val="17"/>
+          <w:rtl w:val="0"/>
+          <w:szCs w:val="17"/>
+        </w:rPr>
+        <w:t>‎HAMTA‎</w:t>
+      </w:r>
+      <w:r>
+        <w:rPr>
+          <w:rFonts w:hint="cs" w:ascii="B Mitra" w:hAnsi="B Mitra" w:cs="B Mitra"/>
+          <w:sz w:val="18"/>
+          <w:rtl/>
+          <w:szCs w:val="18"/>
+        </w:rPr>
+        <w:t xml:space="preserve"> با خط‌مبنای </w:t>
+      </w:r>
+      <w:r>
+        <w:rPr>
+          <w:rFonts w:ascii="Times New Roman" w:hAnsi="Times New Roman" w:cs="Times New Roman"/>
+          <w:bidi w:val="0"/>
+          <w:sz w:val="17"/>
+          <w:rtl w:val="0"/>
+          <w:szCs w:val="17"/>
+        </w:rPr>
+        <w:t>‎SFA‎</w:t>
+      </w:r>
+      <w:r>
+        <w:rPr>
+          <w:rFonts w:hint="cs" w:ascii="B Mitra" w:hAnsi="B Mitra" w:cs="B Mitra"/>
+          <w:sz w:val="18"/>
+          <w:rtl/>
+          <w:szCs w:val="18"/>
+        </w:rPr>
+        <w:t xml:space="preserve"> به سطح معناداری آماری نمی‌رسد و </w:t>
+      </w:r>
+      <w:r>
+        <w:rPr>
+          <w:rFonts w:ascii="Times New Roman" w:hAnsi="Times New Roman" w:cs="Times New Roman"/>
+          <w:bidi w:val="0"/>
+          <w:sz w:val="17"/>
+          <w:rtl w:val="0"/>
+          <w:szCs w:val="17"/>
+        </w:rPr>
+        <w:t>‎SFA‎</w:t>
+      </w:r>
+      <w:r>
+        <w:rPr>
+          <w:rFonts w:hint="cs" w:ascii="B Mitra" w:hAnsi="B Mitra" w:cs="B Mitra"/>
+          <w:sz w:val="18"/>
+          <w:rtl/>
+          <w:szCs w:val="18"/>
+        </w:rPr>
+        <w:t xml:space="preserve"> به عنوان یک بنچ‌مارک مرزی ناپارامتریک قدرتمند عمل می‌نماید.</w:t>
       </w:r>
     </w:p>
     <w:p>
@@ -12508,6 +12784,7 @@
           <w:rFonts w:ascii="Times New Roman" w:hAnsi="Times New Roman" w:cs="Times New Roman"/>
           <w:bidi w:val="0"/>
           <w:sz w:val="18"/>
+          <w:rtl w:val="0"/>
           <w:szCs w:val="18"/>
         </w:rPr>
         <w:t>‎5.4‎</w:t>
@@ -12541,6 +12818,7 @@
           <w:rFonts w:ascii="Times New Roman" w:hAnsi="Times New Roman" w:cs="Times New Roman"/>
           <w:bidi w:val="0"/>
           <w:sz w:val="17"/>
+          <w:rtl w:val="0"/>
           <w:szCs w:val="17"/>
         </w:rPr>
         <w:t>‎4‎</w:t>
@@ -12575,6 +12853,7 @@
           <w:rFonts w:ascii="Times New Roman" w:hAnsi="Times New Roman" w:cs="Times New Roman"/>
           <w:bidi w:val="0"/>
           <w:sz w:val="17"/>
+          <w:rtl w:val="0"/>
           <w:szCs w:val="17"/>
         </w:rPr>
         <w:t>‎4‎</w:t>
@@ -12703,6 +12982,7 @@
                 <w:b/>
                 <w:bidi w:val="0"/>
                 <w:sz w:val="11"/>
+                <w:rtl w:val="0"/>
                 <w:szCs w:val="11"/>
               </w:rPr>
               <w:t>‎Prec@35‎</w:t>
@@ -12735,6 +13015,7 @@
                 <w:b/>
                 <w:bidi w:val="0"/>
                 <w:sz w:val="11"/>
+                <w:rtl w:val="0"/>
                 <w:szCs w:val="11"/>
               </w:rPr>
               <w:t>‎NDCG@35‎</w:t>
@@ -12767,6 +13048,7 @@
                 <w:b/>
                 <w:bidi w:val="0"/>
                 <w:sz w:val="11"/>
+                <w:rtl w:val="0"/>
                 <w:szCs w:val="11"/>
               </w:rPr>
               <w:t>‎Weak-Support‎</w:t>
@@ -13547,6 +13829,7 @@
           <w:rFonts w:ascii="Times New Roman" w:hAnsi="Times New Roman" w:cs="Times New Roman"/>
           <w:bidi w:val="0"/>
           <w:sz w:val="17"/>
+          <w:rtl w:val="0"/>
           <w:szCs w:val="17"/>
         </w:rPr>
         <w:t>‎TP = 0‎</w:t>
@@ -13571,6 +13854,7 @@
           <w:rFonts w:ascii="Times New Roman" w:hAnsi="Times New Roman" w:cs="Times New Roman"/>
           <w:bidi w:val="0"/>
           <w:sz w:val="18"/>
+          <w:rtl w:val="0"/>
           <w:szCs w:val="18"/>
         </w:rPr>
         <w:t>‎5.5‎</w:t>
@@ -13589,6 +13873,7 @@
           <w:rFonts w:ascii="Times New Roman" w:hAnsi="Times New Roman" w:cs="Times New Roman"/>
           <w:bidi w:val="0"/>
           <w:sz w:val="18"/>
+          <w:rtl w:val="0"/>
           <w:szCs w:val="18"/>
         </w:rPr>
         <w:t>‎Ablation Study‎</w:t>
@@ -13622,6 +13907,7 @@
           <w:rFonts w:ascii="Times New Roman" w:hAnsi="Times New Roman" w:cs="Times New Roman"/>
           <w:bidi w:val="0"/>
           <w:sz w:val="17"/>
+          <w:rtl w:val="0"/>
           <w:szCs w:val="17"/>
         </w:rPr>
         <w:t>‎5‎</w:t>
@@ -13656,6 +13942,7 @@
           <w:rFonts w:ascii="Times New Roman" w:hAnsi="Times New Roman" w:cs="Times New Roman"/>
           <w:bidi w:val="0"/>
           <w:sz w:val="17"/>
+          <w:rtl w:val="0"/>
           <w:szCs w:val="17"/>
         </w:rPr>
         <w:t>‎5‎</w:t>
@@ -13751,6 +14038,7 @@
                 <w:b/>
                 <w:bidi w:val="0"/>
                 <w:sz w:val="11"/>
+                <w:rtl w:val="0"/>
                 <w:szCs w:val="11"/>
               </w:rPr>
               <w:t>‎NDCG@35‎</w:t>
@@ -13783,6 +14071,7 @@
                 <w:b/>
                 <w:bidi w:val="0"/>
                 <w:sz w:val="11"/>
+                <w:rtl w:val="0"/>
                 <w:szCs w:val="11"/>
               </w:rPr>
               <w:t>‎Prec@35‎</w:t>
@@ -13815,6 +14104,7 @@
                 <w:b/>
                 <w:bidi w:val="0"/>
                 <w:sz w:val="11"/>
+                <w:rtl w:val="0"/>
                 <w:szCs w:val="11"/>
               </w:rPr>
               <w:t>‎Δ NDCG‎</w:t>
@@ -13894,6 +14184,7 @@
                 <w:b/>
                 <w:bidi w:val="0"/>
                 <w:sz w:val="10"/>
+                <w:rtl w:val="0"/>
                 <w:szCs w:val="10"/>
               </w:rPr>
               <w:t>‎HAMTA‎</w:t>
@@ -14163,6 +14454,7 @@
                 <w:rFonts w:ascii="Times New Roman" w:hAnsi="Times New Roman" w:cs="Times New Roman"/>
                 <w:bidi w:val="0"/>
                 <w:sz w:val="10"/>
+                <w:rtl w:val="0"/>
                 <w:szCs w:val="10"/>
               </w:rPr>
               <w:t>‎p = 0.846‎</w:t>
@@ -14205,6 +14497,7 @@
                 <w:rFonts w:ascii="Times New Roman" w:hAnsi="Times New Roman" w:cs="Times New Roman"/>
                 <w:bidi w:val="0"/>
                 <w:sz w:val="10"/>
+                <w:rtl w:val="0"/>
                 <w:szCs w:val="10"/>
               </w:rPr>
               <w:t>‎Q=1‎</w:t>
@@ -14326,6 +14619,7 @@
                 <w:rFonts w:ascii="Times New Roman" w:hAnsi="Times New Roman" w:cs="Times New Roman"/>
                 <w:bidi w:val="0"/>
                 <w:sz w:val="10"/>
+                <w:rtl w:val="0"/>
                 <w:szCs w:val="10"/>
               </w:rPr>
               <w:t>‎p = 0.375‎</w:t>
@@ -14471,6 +14765,7 @@
                 <w:rFonts w:ascii="Times New Roman" w:hAnsi="Times New Roman" w:cs="Times New Roman"/>
                 <w:bidi w:val="0"/>
                 <w:sz w:val="10"/>
+                <w:rtl w:val="0"/>
                 <w:szCs w:val="10"/>
               </w:rPr>
               <w:t>‎p = 0.027‎</w:t>
@@ -14616,6 +14911,7 @@
                 <w:rFonts w:ascii="Times New Roman" w:hAnsi="Times New Roman" w:cs="Times New Roman"/>
                 <w:bidi w:val="0"/>
                 <w:sz w:val="10"/>
+                <w:rtl w:val="0"/>
                 <w:szCs w:val="10"/>
               </w:rPr>
               <w:t>‎p = 0.695‎</w:t>
@@ -14761,6 +15057,7 @@
                 <w:rFonts w:ascii="Times New Roman" w:hAnsi="Times New Roman" w:cs="Times New Roman"/>
                 <w:bidi w:val="0"/>
                 <w:sz w:val="10"/>
+                <w:rtl w:val="0"/>
                 <w:szCs w:val="10"/>
               </w:rPr>
               <w:t>‎p = 0.084‎</w:t>
@@ -14906,6 +15203,7 @@
                 <w:rFonts w:ascii="Times New Roman" w:hAnsi="Times New Roman" w:cs="Times New Roman"/>
                 <w:bidi w:val="0"/>
                 <w:sz w:val="10"/>
+                <w:rtl w:val="0"/>
                 <w:szCs w:val="10"/>
               </w:rPr>
               <w:t>‎p = 0.002‎</w:t>
@@ -14933,6 +15231,7 @@
           <w:rFonts w:ascii="Times New Roman" w:hAnsi="Times New Roman" w:cs="Times New Roman"/>
           <w:bidi w:val="0"/>
           <w:sz w:val="17"/>
+          <w:rtl w:val="0"/>
           <w:szCs w:val="17"/>
         </w:rPr>
         <w:t>‎HAMTA‎</w:t>
@@ -14951,6 +15250,7 @@
           <w:rFonts w:ascii="Times New Roman" w:hAnsi="Times New Roman" w:cs="Times New Roman"/>
           <w:bidi w:val="0"/>
           <w:sz w:val="17"/>
+          <w:rtl w:val="0"/>
           <w:szCs w:val="17"/>
         </w:rPr>
         <w:t>‎GBDT‎</w:t>
@@ -14969,6 +15269,7 @@
           <w:rFonts w:ascii="Times New Roman" w:hAnsi="Times New Roman" w:cs="Times New Roman"/>
           <w:bidi w:val="0"/>
           <w:sz w:val="17"/>
+          <w:rtl w:val="0"/>
           <w:szCs w:val="17"/>
         </w:rPr>
         <w:t>‎NDCG@35‎</w:t>
@@ -14987,6 +15288,7 @@
           <w:rFonts w:ascii="Times New Roman" w:hAnsi="Times New Roman" w:cs="Times New Roman"/>
           <w:bidi w:val="0"/>
           <w:sz w:val="17"/>
+          <w:rtl w:val="0"/>
           <w:szCs w:val="17"/>
         </w:rPr>
         <w:t>‎p = 0.0020‎</w:t>
@@ -15005,6 +15307,7 @@
           <w:rFonts w:ascii="Times New Roman" w:hAnsi="Times New Roman" w:cs="Times New Roman"/>
           <w:bidi w:val="0"/>
           <w:sz w:val="17"/>
+          <w:rtl w:val="0"/>
           <w:szCs w:val="17"/>
         </w:rPr>
         <w:t>‎p = 0.0840‎</w:t>
@@ -15023,6 +15326,7 @@
           <w:rFonts w:ascii="Times New Roman" w:hAnsi="Times New Roman" w:cs="Times New Roman"/>
           <w:bidi w:val="0"/>
           <w:sz w:val="17"/>
+          <w:rtl w:val="0"/>
           <w:szCs w:val="17"/>
         </w:rPr>
         <w:t>‎U‎</w:t>
@@ -15041,6 +15345,7 @@
           <w:rFonts w:ascii="Times New Roman" w:hAnsi="Times New Roman" w:cs="Times New Roman"/>
           <w:bidi w:val="0"/>
           <w:sz w:val="17"/>
+          <w:rtl w:val="0"/>
           <w:szCs w:val="17"/>
         </w:rPr>
         <w:t>‎Q‎</w:t>
@@ -15059,6 +15364,7 @@
           <w:rFonts w:ascii="Times New Roman" w:hAnsi="Times New Roman" w:cs="Times New Roman"/>
           <w:bidi w:val="0"/>
           <w:sz w:val="17"/>
+          <w:rtl w:val="0"/>
           <w:szCs w:val="17"/>
         </w:rPr>
         <w:t>‎U‎</w:t>
@@ -15077,6 +15383,7 @@
           <w:rFonts w:ascii="Times New Roman" w:hAnsi="Times New Roman" w:cs="Times New Roman"/>
           <w:bidi w:val="0"/>
           <w:sz w:val="17"/>
+          <w:rtl w:val="0"/>
           <w:szCs w:val="17"/>
         </w:rPr>
         <w:t>‎NDCG‎</w:t>
@@ -15095,6 +15402,7 @@
           <w:rFonts w:ascii="Times New Roman" w:hAnsi="Times New Roman" w:cs="Times New Roman"/>
           <w:bidi w:val="0"/>
           <w:sz w:val="17"/>
+          <w:rtl w:val="0"/>
           <w:szCs w:val="17"/>
         </w:rPr>
         <w:t>‎p = 0.0273‎</w:t>
@@ -15113,6 +15421,7 @@
           <w:rFonts w:ascii="Times New Roman" w:hAnsi="Times New Roman" w:cs="Times New Roman"/>
           <w:bidi w:val="0"/>
           <w:sz w:val="17"/>
+          <w:rtl w:val="0"/>
           <w:szCs w:val="17"/>
         </w:rPr>
         <w:t>‎Q‎</w:t>
@@ -15131,6 +15440,7 @@
           <w:rFonts w:ascii="Times New Roman" w:hAnsi="Times New Roman" w:cs="Times New Roman"/>
           <w:bidi w:val="0"/>
           <w:sz w:val="17"/>
+          <w:rtl w:val="0"/>
           <w:szCs w:val="17"/>
         </w:rPr>
         <w:t>‎Δ = ‎</w:t>
@@ -15149,6 +15459,7 @@
           <w:rFonts w:ascii="Times New Roman" w:hAnsi="Times New Roman" w:cs="Times New Roman"/>
           <w:bidi w:val="0"/>
           <w:sz w:val="17"/>
+          <w:rtl w:val="0"/>
           <w:szCs w:val="17"/>
         </w:rPr>
         <w:t>‎p = 0.8457‎</w:t>
@@ -15173,6 +15484,7 @@
           <w:rFonts w:ascii="Times New Roman" w:hAnsi="Times New Roman" w:cs="Times New Roman"/>
           <w:bidi w:val="0"/>
           <w:sz w:val="18"/>
+          <w:rtl w:val="0"/>
           <w:szCs w:val="18"/>
         </w:rPr>
         <w:t>‎5.6‎</w:t>
@@ -15206,6 +15518,7 @@
           <w:rFonts w:ascii="Times New Roman" w:hAnsi="Times New Roman" w:cs="Times New Roman"/>
           <w:bidi w:val="0"/>
           <w:sz w:val="17"/>
+          <w:rtl w:val="0"/>
           <w:szCs w:val="17"/>
         </w:rPr>
         <w:t>‎6‎</w:t>
@@ -15240,6 +15553,7 @@
           <w:rFonts w:ascii="Times New Roman" w:hAnsi="Times New Roman" w:cs="Times New Roman"/>
           <w:bidi w:val="0"/>
           <w:sz w:val="17"/>
+          <w:rtl w:val="0"/>
           <w:szCs w:val="17"/>
         </w:rPr>
         <w:t>‎6‎</w:t>
@@ -15530,6 +15844,7 @@
                 <w:rFonts w:ascii="Times New Roman" w:hAnsi="Times New Roman" w:cs="Times New Roman"/>
                 <w:bidi w:val="0"/>
                 <w:sz w:val="10"/>
+                <w:rtl w:val="0"/>
                 <w:szCs w:val="10"/>
               </w:rPr>
               <w:t>‎MERCH_‎</w:t>
@@ -15740,6 +16055,7 @@
                 <w:rFonts w:ascii="Times New Roman" w:hAnsi="Times New Roman" w:cs="Times New Roman"/>
                 <w:bidi w:val="0"/>
                 <w:sz w:val="10"/>
+                <w:rtl w:val="0"/>
                 <w:szCs w:val="10"/>
               </w:rPr>
               <w:t>‎MERCH_‎</w:t>
@@ -15950,6 +16266,7 @@
                 <w:rFonts w:ascii="Times New Roman" w:hAnsi="Times New Roman" w:cs="Times New Roman"/>
                 <w:bidi w:val="0"/>
                 <w:sz w:val="10"/>
+                <w:rtl w:val="0"/>
                 <w:szCs w:val="10"/>
               </w:rPr>
               <w:t>‎MERCH_‎</w:t>
@@ -16160,6 +16477,7 @@
                 <w:rFonts w:ascii="Times New Roman" w:hAnsi="Times New Roman" w:cs="Times New Roman"/>
                 <w:bidi w:val="0"/>
                 <w:sz w:val="10"/>
+                <w:rtl w:val="0"/>
                 <w:szCs w:val="10"/>
               </w:rPr>
               <w:t>‎MERCH_‎</w:t>
@@ -16370,6 +16688,7 @@
                 <w:rFonts w:ascii="Times New Roman" w:hAnsi="Times New Roman" w:cs="Times New Roman"/>
                 <w:bidi w:val="0"/>
                 <w:sz w:val="10"/>
+                <w:rtl w:val="0"/>
                 <w:szCs w:val="10"/>
               </w:rPr>
               <w:t>‎MERCH_‎</w:t>
@@ -16617,6 +16936,7 @@
           <w:rFonts w:ascii="Times New Roman" w:hAnsi="Times New Roman" w:cs="Times New Roman"/>
           <w:bidi w:val="0"/>
           <w:sz w:val="17"/>
+          <w:rtl w:val="0"/>
           <w:szCs w:val="17"/>
         </w:rPr>
         <w:t>‎5‎</w:t>
@@ -16635,6 +16955,7 @@
           <w:rFonts w:ascii="Times New Roman" w:hAnsi="Times New Roman" w:cs="Times New Roman"/>
           <w:bidi w:val="0"/>
           <w:sz w:val="17"/>
+          <w:rtl w:val="0"/>
           <w:szCs w:val="17"/>
         </w:rPr>
         <w:t>‎Precision@K‎</w:t>
@@ -16668,6 +16989,7 @@
           <w:rFonts w:ascii="Times New Roman" w:hAnsi="Times New Roman" w:cs="Times New Roman"/>
           <w:bidi w:val="0"/>
           <w:sz w:val="17"/>
+          <w:rtl w:val="0"/>
           <w:szCs w:val="17"/>
         </w:rPr>
         <w:t>‎Micro-Merchant Bias‎</w:t>
@@ -16686,6 +17008,7 @@
           <w:rFonts w:ascii="Times New Roman" w:hAnsi="Times New Roman" w:cs="Times New Roman"/>
           <w:bidi w:val="0"/>
           <w:sz w:val="17"/>
+          <w:rtl w:val="0"/>
           <w:szCs w:val="17"/>
         </w:rPr>
         <w:t>‎M-GATO‎</w:t>
@@ -16704,6 +17027,7 @@
           <w:rFonts w:ascii="Times New Roman" w:hAnsi="Times New Roman" w:cs="Times New Roman"/>
           <w:bidi w:val="0"/>
           <w:sz w:val="17"/>
+          <w:rtl w:val="0"/>
           <w:szCs w:val="17"/>
         </w:rPr>
         <w:t>‎Y ≥ 5‎</w:t>
@@ -16722,6 +17046,7 @@
           <w:rFonts w:ascii="Times New Roman" w:hAnsi="Times New Roman" w:cs="Times New Roman"/>
           <w:bidi w:val="0"/>
           <w:sz w:val="17"/>
+          <w:rtl w:val="0"/>
           <w:szCs w:val="17"/>
         </w:rPr>
         <w:t>‎10‎</w:t>
@@ -16740,6 +17065,7 @@
           <w:rFonts w:ascii="Times New Roman" w:hAnsi="Times New Roman" w:cs="Times New Roman"/>
           <w:bidi w:val="0"/>
           <w:sz w:val="17"/>
+          <w:rtl w:val="0"/>
           <w:szCs w:val="17"/>
         </w:rPr>
         <w:t>‎20‎</w:t>
@@ -16758,6 +17084,7 @@
           <w:rFonts w:ascii="Times New Roman" w:hAnsi="Times New Roman" w:cs="Times New Roman"/>
           <w:bidi w:val="0"/>
           <w:sz w:val="17"/>
+          <w:rtl w:val="0"/>
           <w:szCs w:val="17"/>
         </w:rPr>
         <w:t>‎NDCG‎</w:t>
@@ -16776,6 +17103,7 @@
           <w:rFonts w:ascii="Times New Roman" w:hAnsi="Times New Roman" w:cs="Times New Roman"/>
           <w:bidi w:val="0"/>
           <w:sz w:val="17"/>
+          <w:rtl w:val="0"/>
           <w:szCs w:val="17"/>
         </w:rPr>
         <w:t>‎τ_a = 15‎</w:t>
@@ -16803,6 +17131,7 @@
           <w:rFonts w:ascii="Times New Roman" w:hAnsi="Times New Roman" w:cs="Times New Roman"/>
           <w:bidi w:val="0"/>
           <w:sz w:val="17"/>
+          <w:rtl w:val="0"/>
           <w:szCs w:val="17"/>
         </w:rPr>
         <w:t>Q_total = Q_graph · ( 1 - exp( -Y_m / τ_a ) )</w:t>
@@ -16827,6 +17156,7 @@
           <w:rFonts w:ascii="Times New Roman" w:hAnsi="Times New Roman" w:cs="Times New Roman"/>
           <w:bidi w:val="0"/>
           <w:sz w:val="17"/>
+          <w:rtl w:val="0"/>
           <w:szCs w:val="17"/>
         </w:rPr>
         <w:t>‎HAMTA‎</w:t>
@@ -16845,6 +17175,7 @@
           <w:rFonts w:ascii="Times New Roman" w:hAnsi="Times New Roman" w:cs="Times New Roman"/>
           <w:bidi w:val="0"/>
           <w:sz w:val="17"/>
+          <w:rtl w:val="0"/>
           <w:szCs w:val="17"/>
         </w:rPr>
         <w:t>‎Persistent Underperformance Recovery‎</w:t>
@@ -16863,6 +17194,7 @@
           <w:rFonts w:ascii="Times New Roman" w:hAnsi="Times New Roman" w:cs="Times New Roman"/>
           <w:bidi w:val="0"/>
           <w:sz w:val="17"/>
+          <w:rtl w:val="0"/>
           <w:szCs w:val="17"/>
         </w:rPr>
         <w:t>‎Pure Ex-Ante Shocks‎</w:t>
@@ -16881,6 +17213,7 @@
           <w:rFonts w:ascii="Times New Roman" w:hAnsi="Times New Roman" w:cs="Times New Roman"/>
           <w:bidi w:val="0"/>
           <w:sz w:val="17"/>
+          <w:rtl w:val="0"/>
           <w:szCs w:val="17"/>
         </w:rPr>
         <w:t>‎Peer Cannibalization‎</w:t>
@@ -16899,6 +17232,7 @@
           <w:rFonts w:ascii="Times New Roman" w:hAnsi="Times New Roman" w:cs="Times New Roman"/>
           <w:bidi w:val="0"/>
           <w:sz w:val="17"/>
+          <w:rtl w:val="0"/>
           <w:szCs w:val="17"/>
         </w:rPr>
         <w:t>‎M-GATO‎</w:t>
@@ -16917,6 +17251,7 @@
           <w:rFonts w:ascii="Times New Roman" w:hAnsi="Times New Roman" w:cs="Times New Roman"/>
           <w:bidi w:val="0"/>
           <w:sz w:val="17"/>
+          <w:rtl w:val="0"/>
           <w:szCs w:val="17"/>
         </w:rPr>
         <w:t>‎A/B‎</w:t>
@@ -16950,6 +17285,7 @@
           <w:rFonts w:ascii="Times New Roman" w:hAnsi="Times New Roman" w:cs="Times New Roman"/>
           <w:bidi w:val="0"/>
           <w:sz w:val="17"/>
+          <w:rtl w:val="0"/>
           <w:szCs w:val="17"/>
         </w:rPr>
         <w:t>‎Intel Core i7‎</w:t>
@@ -16968,6 +17304,7 @@
           <w:rFonts w:ascii="Times New Roman" w:hAnsi="Times New Roman" w:cs="Times New Roman"/>
           <w:bidi w:val="0"/>
           <w:sz w:val="17"/>
+          <w:rtl w:val="0"/>
           <w:szCs w:val="17"/>
         </w:rPr>
         <w:t>‎PyTorch 2.4‎</w:t>
@@ -16986,6 +17323,7 @@
           <w:rFonts w:ascii="Times New Roman" w:hAnsi="Times New Roman" w:cs="Times New Roman"/>
           <w:bidi w:val="0"/>
           <w:sz w:val="17"/>
+          <w:rtl w:val="0"/>
           <w:szCs w:val="17"/>
         </w:rPr>
         <w:t>‎O(|M| · K · d_avg)‎</w:t>
@@ -17010,6 +17348,7 @@
           <w:rFonts w:ascii="Times New Roman" w:hAnsi="Times New Roman" w:cs="Times New Roman"/>
           <w:bidi w:val="0"/>
           <w:sz w:val="20"/>
+          <w:rtl w:val="0"/>
           <w:szCs w:val="20"/>
         </w:rPr>
         <w:t>‎6‎</w:t>
@@ -17043,6 +17382,7 @@
           <w:rFonts w:ascii="Times New Roman" w:hAnsi="Times New Roman" w:cs="Times New Roman"/>
           <w:bidi w:val="0"/>
           <w:sz w:val="17"/>
+          <w:rtl w:val="0"/>
           <w:szCs w:val="17"/>
         </w:rPr>
         <w:t>‎HAMTA‎</w:t>
@@ -17061,6 +17401,7 @@
           <w:rFonts w:ascii="Times New Roman" w:hAnsi="Times New Roman" w:cs="Times New Roman"/>
           <w:bidi w:val="0"/>
           <w:sz w:val="17"/>
+          <w:rtl w:val="0"/>
           <w:szCs w:val="17"/>
         </w:rPr>
         <w:t>‎Treatment-label-free‎</w:t>
@@ -17079,6 +17420,7 @@
           <w:rFonts w:ascii="Times New Roman" w:hAnsi="Times New Roman" w:cs="Times New Roman"/>
           <w:bidi w:val="0"/>
           <w:sz w:val="17"/>
+          <w:rtl w:val="0"/>
           <w:szCs w:val="17"/>
         </w:rPr>
         <w:t>‎HAMTA‎</w:t>
@@ -17097,6 +17439,7 @@
           <w:rFonts w:ascii="Times New Roman" w:hAnsi="Times New Roman" w:cs="Times New Roman"/>
           <w:bidi w:val="0"/>
           <w:sz w:val="17"/>
+          <w:rtl w:val="0"/>
           <w:szCs w:val="17"/>
         </w:rPr>
         <w:t>‎M-GATO‎</w:t>
@@ -17130,6 +17473,7 @@
           <w:rFonts w:ascii="Times New Roman" w:hAnsi="Times New Roman" w:cs="Times New Roman"/>
           <w:bidi w:val="0"/>
           <w:sz w:val="17"/>
+          <w:rtl w:val="0"/>
           <w:szCs w:val="17"/>
         </w:rPr>
         <w:t>‎M-GATO‎</w:t>
@@ -17148,6 +17492,7 @@
           <w:rFonts w:ascii="Times New Roman" w:hAnsi="Times New Roman" w:cs="Times New Roman"/>
           <w:bidi w:val="0"/>
           <w:sz w:val="17"/>
+          <w:rtl w:val="0"/>
           <w:szCs w:val="17"/>
         </w:rPr>
         <w:t>‎ITE Uplift Modeling‎</w:t>
@@ -17166,6 +17511,7 @@
           <w:rFonts w:ascii="Times New Roman" w:hAnsi="Times New Roman" w:cs="Times New Roman"/>
           <w:bidi w:val="0"/>
           <w:sz w:val="17"/>
+          <w:rtl w:val="0"/>
           <w:szCs w:val="17"/>
         </w:rPr>
         <w:t>‎PCI-DSS‎</w:t>
@@ -17205,6 +17551,7 @@
           <w:rFonts w:ascii="Times New Roman" w:hAnsi="Times New Roman" w:cs="Times New Roman"/>
           <w:bidi w:val="0"/>
           <w:sz w:val="10"/>
+          <w:rtl w:val="0"/>
           <w:szCs w:val="10"/>
         </w:rPr>
         <w:t xml:space="preserve">[1] </w:t>
@@ -17214,6 +17561,7 @@
           <w:rFonts w:ascii="Times New Roman" w:hAnsi="Times New Roman" w:cs="Times New Roman"/>
           <w:bidi w:val="0"/>
           <w:sz w:val="10"/>
+          <w:rtl w:val="0"/>
           <w:szCs w:val="10"/>
         </w:rPr>
         <w:t xml:space="preserve">Bank for International Settlements (BIS), "Red Book: Statistics on payment, clearing and settlement systems", </w:t>
@@ -17225,6 +17573,7 @@
           <w:i/>
           <w:bidi w:val="0"/>
           <w:sz w:val="10"/>
+          <w:rtl w:val="0"/>
           <w:szCs w:val="10"/>
         </w:rPr>
         <w:t>CPMI, Basel, Switzerland</w:t>
@@ -17234,6 +17583,7 @@
           <w:rFonts w:ascii="Times New Roman" w:hAnsi="Times New Roman" w:cs="Times New Roman"/>
           <w:bidi w:val="0"/>
           <w:sz w:val="10"/>
+          <w:rtl w:val="0"/>
           <w:szCs w:val="10"/>
         </w:rPr>
         <w:t>, Tech. Rep., 2023.</w:t>
@@ -17249,6 +17599,7 @@
           <w:rFonts w:ascii="Times New Roman" w:hAnsi="Times New Roman" w:cs="Times New Roman"/>
           <w:bidi w:val="0"/>
           <w:sz w:val="10"/>
+          <w:rtl w:val="0"/>
           <w:szCs w:val="10"/>
         </w:rPr>
         <w:t xml:space="preserve">[2] </w:t>
@@ -17258,6 +17609,7 @@
           <w:rFonts w:ascii="Times New Roman" w:hAnsi="Times New Roman" w:cs="Times New Roman"/>
           <w:bidi w:val="0"/>
           <w:sz w:val="10"/>
+          <w:rtl w:val="0"/>
           <w:szCs w:val="10"/>
         </w:rPr>
         <w:t xml:space="preserve">European Central Bank (ECB), "Study on payment attitudes of consumers in the euro area (SPACE)", </w:t>
@@ -17269,6 +17621,7 @@
           <w:i/>
           <w:bidi w:val="0"/>
           <w:sz w:val="10"/>
+          <w:rtl w:val="0"/>
           <w:szCs w:val="10"/>
         </w:rPr>
         <w:t>ECB, Frankfurt, Germany</w:t>
@@ -17278,6 +17631,7 @@
           <w:rFonts w:ascii="Times New Roman" w:hAnsi="Times New Roman" w:cs="Times New Roman"/>
           <w:bidi w:val="0"/>
           <w:sz w:val="10"/>
+          <w:rtl w:val="0"/>
           <w:szCs w:val="10"/>
         </w:rPr>
         <w:t>, Tech. Rep., Dec. 2022.</w:t>
@@ -17293,6 +17647,7 @@
           <w:rFonts w:ascii="Times New Roman" w:hAnsi="Times New Roman" w:cs="Times New Roman"/>
           <w:bidi w:val="0"/>
           <w:sz w:val="10"/>
+          <w:rtl w:val="0"/>
           <w:szCs w:val="10"/>
         </w:rPr>
         <w:t xml:space="preserve">[3] </w:t>
@@ -17302,6 +17657,7 @@
           <w:rFonts w:ascii="Times New Roman" w:hAnsi="Times New Roman" w:cs="Times New Roman"/>
           <w:bidi w:val="0"/>
           <w:sz w:val="10"/>
+          <w:rtl w:val="0"/>
           <w:szCs w:val="10"/>
         </w:rPr>
         <w:t xml:space="preserve">J. T. Wei, S. Y. Lin, H. H. Wu, "A review of the application of RFM model", </w:t>
@@ -17313,6 +17669,7 @@
           <w:i/>
           <w:bidi w:val="0"/>
           <w:sz w:val="10"/>
+          <w:rtl w:val="0"/>
           <w:szCs w:val="10"/>
         </w:rPr>
         <w:t>African Journal of Business Management</w:t>
@@ -17322,6 +17679,7 @@
           <w:rFonts w:ascii="Times New Roman" w:hAnsi="Times New Roman" w:cs="Times New Roman"/>
           <w:bidi w:val="0"/>
           <w:sz w:val="10"/>
+          <w:rtl w:val="0"/>
           <w:szCs w:val="10"/>
         </w:rPr>
         <w:t>, Vol. 4, No. 19, pp. 4199-4206, 2010.</w:t>
@@ -17337,6 +17695,7 @@
           <w:rFonts w:ascii="Times New Roman" w:hAnsi="Times New Roman" w:cs="Times New Roman"/>
           <w:bidi w:val="0"/>
           <w:sz w:val="10"/>
+          <w:rtl w:val="0"/>
           <w:szCs w:val="10"/>
         </w:rPr>
         <w:t xml:space="preserve">[4] </w:t>
@@ -17346,6 +17705,7 @@
           <w:rFonts w:ascii="Times New Roman" w:hAnsi="Times New Roman" w:cs="Times New Roman"/>
           <w:bidi w:val="0"/>
           <w:sz w:val="10"/>
+          <w:rtl w:val="0"/>
           <w:szCs w:val="10"/>
         </w:rPr>
         <w:t xml:space="preserve">R. Forman, "Bochner's method for cell complexes and combinatorial Ricci curvature", </w:t>
@@ -17357,6 +17717,7 @@
           <w:i/>
           <w:bidi w:val="0"/>
           <w:sz w:val="10"/>
+          <w:rtl w:val="0"/>
           <w:szCs w:val="10"/>
         </w:rPr>
         <w:t>Discrete and Computational Geometry</w:t>
@@ -17366,6 +17727,7 @@
           <w:rFonts w:ascii="Times New Roman" w:hAnsi="Times New Roman" w:cs="Times New Roman"/>
           <w:bidi w:val="0"/>
           <w:sz w:val="10"/>
+          <w:rtl w:val="0"/>
           <w:szCs w:val="10"/>
         </w:rPr>
         <w:t>, Vol. 29, No. 3, pp. 323-374, 2003.</w:t>
@@ -17381,6 +17743,7 @@
           <w:rFonts w:ascii="Times New Roman" w:hAnsi="Times New Roman" w:cs="Times New Roman"/>
           <w:bidi w:val="0"/>
           <w:sz w:val="10"/>
+          <w:rtl w:val="0"/>
           <w:szCs w:val="10"/>
         </w:rPr>
         <w:t xml:space="preserve">[5] </w:t>
@@ -17390,6 +17753,7 @@
           <w:rFonts w:ascii="Times New Roman" w:hAnsi="Times New Roman" w:cs="Times New Roman"/>
           <w:bidi w:val="0"/>
           <w:sz w:val="10"/>
+          <w:rtl w:val="0"/>
           <w:szCs w:val="10"/>
         </w:rPr>
         <w:t xml:space="preserve">M. Weber, E. Saucan, J. Jost, "Characterizing complex networks with Forman-Ricci curvature", </w:t>
@@ -17401,6 +17765,7 @@
           <w:i/>
           <w:bidi w:val="0"/>
           <w:sz w:val="10"/>
+          <w:rtl w:val="0"/>
           <w:szCs w:val="10"/>
         </w:rPr>
         <w:t>Journal of Complex Networks</w:t>
@@ -17410,6 +17775,7 @@
           <w:rFonts w:ascii="Times New Roman" w:hAnsi="Times New Roman" w:cs="Times New Roman"/>
           <w:bidi w:val="0"/>
           <w:sz w:val="10"/>
+          <w:rtl w:val="0"/>
           <w:szCs w:val="10"/>
         </w:rPr>
         <w:t>, Vol. 5, No. 4, pp. 527-550, 2017.</w:t>
@@ -17425,6 +17791,7 @@
           <w:rFonts w:ascii="Times New Roman" w:hAnsi="Times New Roman" w:cs="Times New Roman"/>
           <w:bidi w:val="0"/>
           <w:sz w:val="10"/>
+          <w:rtl w:val="0"/>
           <w:szCs w:val="10"/>
         </w:rPr>
         <w:t xml:space="preserve">[6] </w:t>
@@ -17434,6 +17801,7 @@
           <w:rFonts w:ascii="Times New Roman" w:hAnsi="Times New Roman" w:cs="Times New Roman"/>
           <w:bidi w:val="0"/>
           <w:sz w:val="10"/>
+          <w:rtl w:val="0"/>
           <w:szCs w:val="10"/>
         </w:rPr>
         <w:t xml:space="preserve">J. Topping, F. Di Giovanni, B. P. Chamberlain, X. Dong, M. M. Bronstein, "Understanding over-squashing and bottlenecks via curvature", </w:t>
@@ -17445,6 +17813,7 @@
           <w:i/>
           <w:bidi w:val="0"/>
           <w:sz w:val="10"/>
+          <w:rtl w:val="0"/>
           <w:szCs w:val="10"/>
         </w:rPr>
         <w:t>Proc. 10th Int. Conf. on Learning Representations (ICLR)</w:t>
@@ -17454,6 +17823,7 @@
           <w:rFonts w:ascii="Times New Roman" w:hAnsi="Times New Roman" w:cs="Times New Roman"/>
           <w:bidi w:val="0"/>
           <w:sz w:val="10"/>
+          <w:rtl w:val="0"/>
           <w:szCs w:val="10"/>
         </w:rPr>
         <w:t>, 2022.</w:t>
@@ -17469,6 +17839,7 @@
           <w:rFonts w:ascii="Times New Roman" w:hAnsi="Times New Roman" w:cs="Times New Roman"/>
           <w:bidi w:val="0"/>
           <w:sz w:val="10"/>
+          <w:rtl w:val="0"/>
           <w:szCs w:val="10"/>
         </w:rPr>
         <w:t xml:space="preserve">[7] </w:t>
@@ -17478,6 +17849,7 @@
           <w:rFonts w:ascii="Times New Roman" w:hAnsi="Times New Roman" w:cs="Times New Roman"/>
           <w:bidi w:val="0"/>
           <w:sz w:val="10"/>
+          <w:rtl w:val="0"/>
           <w:szCs w:val="10"/>
         </w:rPr>
         <w:t xml:space="preserve">I. Marisca, J. Bamberger, C. Alippi, M. M. Bronstein, "Over-squashing in spatiotemporal graph neural networks", </w:t>
@@ -17489,6 +17861,7 @@
           <w:i/>
           <w:bidi w:val="0"/>
           <w:sz w:val="10"/>
+          <w:rtl w:val="0"/>
           <w:szCs w:val="10"/>
         </w:rPr>
         <w:t>Advances in Neural Information Processing Systems (NeurIPS 38)</w:t>
@@ -17498,6 +17871,7 @@
           <w:rFonts w:ascii="Times New Roman" w:hAnsi="Times New Roman" w:cs="Times New Roman"/>
           <w:bidi w:val="0"/>
           <w:sz w:val="10"/>
+          <w:rtl w:val="0"/>
           <w:szCs w:val="10"/>
         </w:rPr>
         <w:t>, Vol. 38, pp. 38213-38243, 2024.</w:t>
@@ -17513,6 +17887,7 @@
           <w:rFonts w:ascii="Times New Roman" w:hAnsi="Times New Roman" w:cs="Times New Roman"/>
           <w:bidi w:val="0"/>
           <w:sz w:val="10"/>
+          <w:rtl w:val="0"/>
           <w:szCs w:val="10"/>
         </w:rPr>
         <w:t xml:space="preserve">[8] </w:t>
@@ -17522,6 +17897,7 @@
           <w:rFonts w:ascii="Times New Roman" w:hAnsi="Times New Roman" w:cs="Times New Roman"/>
           <w:bidi w:val="0"/>
           <w:sz w:val="10"/>
+          <w:rtl w:val="0"/>
           <w:szCs w:val="10"/>
         </w:rPr>
         <w:t xml:space="preserve">A. N. Angelopoulos, S. Bates, "A gentle introduction to conformal prediction and distribution-free uncertainty", </w:t>
@@ -17533,6 +17909,7 @@
           <w:i/>
           <w:bidi w:val="0"/>
           <w:sz w:val="10"/>
+          <w:rtl w:val="0"/>
           <w:szCs w:val="10"/>
         </w:rPr>
         <w:t>arXiv preprint arXiv:2107.07511</w:t>
@@ -17542,6 +17919,7 @@
           <w:rFonts w:ascii="Times New Roman" w:hAnsi="Times New Roman" w:cs="Times New Roman"/>
           <w:bidi w:val="0"/>
           <w:sz w:val="10"/>
+          <w:rtl w:val="0"/>
           <w:szCs w:val="10"/>
         </w:rPr>
         <w:t>, 2021.</w:t>
@@ -17557,6 +17935,7 @@
           <w:rFonts w:ascii="Times New Roman" w:hAnsi="Times New Roman" w:cs="Times New Roman"/>
           <w:bidi w:val="0"/>
           <w:sz w:val="10"/>
+          <w:rtl w:val="0"/>
           <w:szCs w:val="10"/>
         </w:rPr>
         <w:t xml:space="preserve">[9] </w:t>
@@ -17566,9 +17945,10 @@
           <w:rFonts w:ascii="Times New Roman" w:hAnsi="Times New Roman" w:cs="Times New Roman"/>
           <w:bidi w:val="0"/>
           <w:sz w:val="10"/>
+          <w:rtl w:val="0"/>
           <w:szCs w:val="10"/>
         </w:rPr>
-        <w:t xml:space="preserve">Z. Liu, C. Chen, X. Yang, J. Zhou, X. Li, L. Song, "Graph representation learning for merchant incentive optimization in mobile payment marketing", </w:t>
+        <w:t xml:space="preserve">Z. Liu, D. Wang, Q. Yu, Z. Zhang, Y. Shen, J. Ma, W. Zhong, J. Gu, J. Zhou, S. Yang, Y. Qi, "Graph representation learning for merchant incentive optimization in mobile payment marketing", </w:t>
       </w:r>
       <w:r>
         <w:rPr>
@@ -17577,6 +17957,7 @@
           <w:i/>
           <w:bidi w:val="0"/>
           <w:sz w:val="10"/>
+          <w:rtl w:val="0"/>
           <w:szCs w:val="10"/>
         </w:rPr>
         <w:t>Proc. 28th ACM Int. Conf. on Information and Knowledge Management (CIKM)</w:t>
@@ -17586,6 +17967,7 @@
           <w:rFonts w:ascii="Times New Roman" w:hAnsi="Times New Roman" w:cs="Times New Roman"/>
           <w:bidi w:val="0"/>
           <w:sz w:val="10"/>
+          <w:rtl w:val="0"/>
           <w:szCs w:val="10"/>
         </w:rPr>
         <w:t>, pp. 2577-2584, 2019.</w:t>
@@ -17601,6 +17983,7 @@
           <w:rFonts w:ascii="Times New Roman" w:hAnsi="Times New Roman" w:cs="Times New Roman"/>
           <w:bidi w:val="0"/>
           <w:sz w:val="10"/>
+          <w:rtl w:val="0"/>
           <w:szCs w:val="10"/>
         </w:rPr>
         <w:t xml:space="preserve">[10] </w:t>
@@ -17610,6 +17993,7 @@
           <w:rFonts w:ascii="Times New Roman" w:hAnsi="Times New Roman" w:cs="Times New Roman"/>
           <w:bidi w:val="0"/>
           <w:sz w:val="10"/>
+          <w:rtl w:val="0"/>
           <w:szCs w:val="10"/>
         </w:rPr>
         <w:t xml:space="preserve">M. Weber et al., "Anti-money laundering in Bitcoin: Experimenting with graph convolutional networks", </w:t>
@@ -17621,6 +18005,7 @@
           <w:i/>
           <w:bidi w:val="0"/>
           <w:sz w:val="10"/>
+          <w:rtl w:val="0"/>
           <w:szCs w:val="10"/>
         </w:rPr>
         <w:t>Proc. KDD Workshop on Anomaly Detection in Finance</w:t>
@@ -17630,6 +18015,7 @@
           <w:rFonts w:ascii="Times New Roman" w:hAnsi="Times New Roman" w:cs="Times New Roman"/>
           <w:bidi w:val="0"/>
           <w:sz w:val="10"/>
+          <w:rtl w:val="0"/>
           <w:szCs w:val="10"/>
         </w:rPr>
         <w:t>, 2019.</w:t>
@@ -17645,6 +18031,7 @@
           <w:rFonts w:ascii="Times New Roman" w:hAnsi="Times New Roman" w:cs="Times New Roman"/>
           <w:bidi w:val="0"/>
           <w:sz w:val="10"/>
+          <w:rtl w:val="0"/>
           <w:szCs w:val="10"/>
         </w:rPr>
         <w:t xml:space="preserve">[11] </w:t>
@@ -17654,6 +18041,7 @@
           <w:rFonts w:ascii="Times New Roman" w:hAnsi="Times New Roman" w:cs="Times New Roman"/>
           <w:bidi w:val="0"/>
           <w:sz w:val="10"/>
+          <w:rtl w:val="0"/>
           <w:szCs w:val="10"/>
         </w:rPr>
         <w:t xml:space="preserve">Y. Dou, Z. Liu, L. Sun, Y. Deng, H. Peng, P. S. Yu, "Enhancing graph neural network-based fraud detectors against camouflaged fraudsters", </w:t>
@@ -17665,6 +18053,7 @@
           <w:i/>
           <w:bidi w:val="0"/>
           <w:sz w:val="10"/>
+          <w:rtl w:val="0"/>
           <w:szCs w:val="10"/>
         </w:rPr>
         <w:t>Proc. 29th ACM Int. Conf. on Information and Knowledge Management (CIKM)</w:t>
@@ -17674,6 +18063,7 @@
           <w:rFonts w:ascii="Times New Roman" w:hAnsi="Times New Roman" w:cs="Times New Roman"/>
           <w:bidi w:val="0"/>
           <w:sz w:val="10"/>
+          <w:rtl w:val="0"/>
           <w:szCs w:val="10"/>
         </w:rPr>
         <w:t>, pp. 315-324, 2020.</w:t>
@@ -17689,6 +18079,7 @@
           <w:rFonts w:ascii="Times New Roman" w:hAnsi="Times New Roman" w:cs="Times New Roman"/>
           <w:bidi w:val="0"/>
           <w:sz w:val="10"/>
+          <w:rtl w:val="0"/>
           <w:szCs w:val="10"/>
         </w:rPr>
         <w:t xml:space="preserve">[12] </w:t>
@@ -17698,6 +18089,7 @@
           <w:rFonts w:ascii="Times New Roman" w:hAnsi="Times New Roman" w:cs="Times New Roman"/>
           <w:bidi w:val="0"/>
           <w:sz w:val="10"/>
+          <w:rtl w:val="0"/>
           <w:szCs w:val="10"/>
         </w:rPr>
         <w:t xml:space="preserve">P. Veličković, G. Cucurull, A. Casanova, A. Romero, P. Liò, Y. Bengio, "Graph attention networks", </w:t>
@@ -17709,6 +18101,7 @@
           <w:i/>
           <w:bidi w:val="0"/>
           <w:sz w:val="10"/>
+          <w:rtl w:val="0"/>
           <w:szCs w:val="10"/>
         </w:rPr>
         <w:t>Proc. 6th Int. Conf. on Learning Representations (ICLR)</w:t>
@@ -17718,6 +18111,7 @@
           <w:rFonts w:ascii="Times New Roman" w:hAnsi="Times New Roman" w:cs="Times New Roman"/>
           <w:bidi w:val="0"/>
           <w:sz w:val="10"/>
+          <w:rtl w:val="0"/>
           <w:szCs w:val="10"/>
         </w:rPr>
         <w:t>, 2018.</w:t>
@@ -17733,6 +18127,7 @@
           <w:rFonts w:ascii="Times New Roman" w:hAnsi="Times New Roman" w:cs="Times New Roman"/>
           <w:bidi w:val="0"/>
           <w:sz w:val="10"/>
+          <w:rtl w:val="0"/>
           <w:szCs w:val="10"/>
         </w:rPr>
         <w:t xml:space="preserve">[13] </w:t>
@@ -17742,6 +18137,7 @@
           <w:rFonts w:ascii="Times New Roman" w:hAnsi="Times New Roman" w:cs="Times New Roman"/>
           <w:bidi w:val="0"/>
           <w:sz w:val="10"/>
+          <w:rtl w:val="0"/>
           <w:szCs w:val="10"/>
         </w:rPr>
         <w:t xml:space="preserve">W. L. Hamilton, R. Ying, J. Leskovec, "Inductive representation learning on large graphs", </w:t>
@@ -17753,6 +18149,7 @@
           <w:i/>
           <w:bidi w:val="0"/>
           <w:sz w:val="10"/>
+          <w:rtl w:val="0"/>
           <w:szCs w:val="10"/>
         </w:rPr>
         <w:t>Advances in Neural Information Processing Systems (NeurIPS 30)</w:t>
@@ -17762,6 +18159,7 @@
           <w:rFonts w:ascii="Times New Roman" w:hAnsi="Times New Roman" w:cs="Times New Roman"/>
           <w:bidi w:val="0"/>
           <w:sz w:val="10"/>
+          <w:rtl w:val="0"/>
           <w:szCs w:val="10"/>
         </w:rPr>
         <w:t>, pp. 1024-1034, 2017.</w:t>
@@ -17777,6 +18175,7 @@
           <w:rFonts w:ascii="Times New Roman" w:hAnsi="Times New Roman" w:cs="Times New Roman"/>
           <w:bidi w:val="0"/>
           <w:sz w:val="10"/>
+          <w:rtl w:val="0"/>
           <w:szCs w:val="10"/>
         </w:rPr>
         <w:t xml:space="preserve">[14] </w:t>
@@ -17786,6 +18185,7 @@
           <w:rFonts w:ascii="Times New Roman" w:hAnsi="Times New Roman" w:cs="Times New Roman"/>
           <w:bidi w:val="0"/>
           <w:sz w:val="10"/>
+          <w:rtl w:val="0"/>
           <w:szCs w:val="10"/>
         </w:rPr>
         <w:t xml:space="preserve">T. N. Kipf, M. Welling, "Variational graph auto-encoders", </w:t>
@@ -17797,6 +18197,7 @@
           <w:i/>
           <w:bidi w:val="0"/>
           <w:sz w:val="10"/>
+          <w:rtl w:val="0"/>
           <w:szCs w:val="10"/>
         </w:rPr>
         <w:t>NIPS Workshop on Bayesian Deep Learning</w:t>
@@ -17806,6 +18207,7 @@
           <w:rFonts w:ascii="Times New Roman" w:hAnsi="Times New Roman" w:cs="Times New Roman"/>
           <w:bidi w:val="0"/>
           <w:sz w:val="10"/>
+          <w:rtl w:val="0"/>
           <w:szCs w:val="10"/>
         </w:rPr>
         <w:t>, 2016.</w:t>
@@ -17821,6 +18223,7 @@
           <w:rFonts w:ascii="Times New Roman" w:hAnsi="Times New Roman" w:cs="Times New Roman"/>
           <w:bidi w:val="0"/>
           <w:sz w:val="10"/>
+          <w:rtl w:val="0"/>
           <w:szCs w:val="10"/>
         </w:rPr>
         <w:t xml:space="preserve">[15] </w:t>
@@ -17830,9 +18233,10 @@
           <w:rFonts w:ascii="Times New Roman" w:hAnsi="Times New Roman" w:cs="Times New Roman"/>
           <w:bidi w:val="0"/>
           <w:sz w:val="10"/>
+          <w:rtl w:val="0"/>
           <w:szCs w:val="10"/>
         </w:rPr>
-        <w:t xml:space="preserve">M. Tare, C. Rattasits, Y. Wu, E. Wielewski, "Representation learning on large transaction networks using inductive architectures", </w:t>
+        <w:t xml:space="preserve">M. Tare, C. Rattasits, Y. Wu, E. Wielewski, "Harnessing GraphSAGE for learning representations of massive transactional networks", </w:t>
       </w:r>
       <w:r>
         <w:rPr>
@@ -17841,18 +18245,20 @@
           <w:i/>
           <w:bidi w:val="0"/>
           <w:sz w:val="10"/>
+          <w:rtl w:val="0"/>
           <w:szCs w:val="10"/>
         </w:rPr>
-        <w:t>Expert Systems with Applications</w:t>
+        <w:t>Graph-Based Representations in Pattern Recognition (GbRPR), Lecture Notes in Computer Science</w:t>
       </w:r>
       <w:r>
         <w:rPr>
           <w:rFonts w:ascii="Times New Roman" w:hAnsi="Times New Roman" w:cs="Times New Roman"/>
           <w:bidi w:val="0"/>
           <w:sz w:val="10"/>
+          <w:rtl w:val="0"/>
           <w:szCs w:val="10"/>
         </w:rPr>
-        <w:t>, Vol. 248, p. 123480, 2024.</w:t>
+        <w:t>, Vol. 14782, pp. 179-188, Springer, 2025.</w:t>
       </w:r>
     </w:p>
     <w:p>
@@ -17865,6 +18271,7 @@
           <w:rFonts w:ascii="Times New Roman" w:hAnsi="Times New Roman" w:cs="Times New Roman"/>
           <w:bidi w:val="0"/>
           <w:sz w:val="10"/>
+          <w:rtl w:val="0"/>
           <w:szCs w:val="10"/>
         </w:rPr>
         <w:t xml:space="preserve">[16] </w:t>
@@ -17874,6 +18281,7 @@
           <w:rFonts w:ascii="Times New Roman" w:hAnsi="Times New Roman" w:cs="Times New Roman"/>
           <w:bidi w:val="0"/>
           <w:sz w:val="10"/>
+          <w:rtl w:val="0"/>
           <w:szCs w:val="10"/>
         </w:rPr>
         <w:t xml:space="preserve">D. Xu, C. Ruan, E. Korpeoglu, S. Kumar, K. Achan, "Inductive representation learning on temporal graphs", </w:t>
@@ -17885,6 +18293,7 @@
           <w:i/>
           <w:bidi w:val="0"/>
           <w:sz w:val="10"/>
+          <w:rtl w:val="0"/>
           <w:szCs w:val="10"/>
         </w:rPr>
         <w:t>Proc. 8th Int. Conf. on Learning Representations (ICLR)</w:t>
@@ -17894,6 +18303,7 @@
           <w:rFonts w:ascii="Times New Roman" w:hAnsi="Times New Roman" w:cs="Times New Roman"/>
           <w:bidi w:val="0"/>
           <w:sz w:val="10"/>
+          <w:rtl w:val="0"/>
           <w:szCs w:val="10"/>
         </w:rPr>
         <w:t>, 2020.</w:t>
@@ -17909,6 +18319,7 @@
           <w:rFonts w:ascii="Times New Roman" w:hAnsi="Times New Roman" w:cs="Times New Roman"/>
           <w:bidi w:val="0"/>
           <w:sz w:val="10"/>
+          <w:rtl w:val="0"/>
           <w:szCs w:val="10"/>
         </w:rPr>
         <w:t xml:space="preserve">[17] </w:t>
@@ -17918,6 +18329,7 @@
           <w:rFonts w:ascii="Times New Roman" w:hAnsi="Times New Roman" w:cs="Times New Roman"/>
           <w:bidi w:val="0"/>
           <w:sz w:val="10"/>
+          <w:rtl w:val="0"/>
           <w:szCs w:val="10"/>
         </w:rPr>
         <w:t xml:space="preserve">E. Rossi, B. Chamberlain, F. Frasca, D. Eynard, F. Monti, M. Bronstein, "Temporal graph networks on dynamic graphs", </w:t>
@@ -17929,6 +18341,7 @@
           <w:i/>
           <w:bidi w:val="0"/>
           <w:sz w:val="10"/>
+          <w:rtl w:val="0"/>
           <w:szCs w:val="10"/>
         </w:rPr>
         <w:t>ICML Workshop on Graph Representation Learning</w:t>
@@ -17938,6 +18351,7 @@
           <w:rFonts w:ascii="Times New Roman" w:hAnsi="Times New Roman" w:cs="Times New Roman"/>
           <w:bidi w:val="0"/>
           <w:sz w:val="10"/>
+          <w:rtl w:val="0"/>
           <w:szCs w:val="10"/>
         </w:rPr>
         <w:t>, 2020.</w:t>
@@ -17953,6 +18367,7 @@
           <w:rFonts w:ascii="Times New Roman" w:hAnsi="Times New Roman" w:cs="Times New Roman"/>
           <w:bidi w:val="0"/>
           <w:sz w:val="10"/>
+          <w:rtl w:val="0"/>
           <w:szCs w:val="10"/>
         </w:rPr>
         <w:t xml:space="preserve">[18] </w:t>
@@ -17962,6 +18377,7 @@
           <w:rFonts w:ascii="Times New Roman" w:hAnsi="Times New Roman" w:cs="Times New Roman"/>
           <w:bidi w:val="0"/>
           <w:sz w:val="10"/>
+          <w:rtl w:val="0"/>
           <w:szCs w:val="10"/>
         </w:rPr>
         <w:t xml:space="preserve">A. Pareja et al., "EvolveGCN: Evolving graph convolutional networks for dynamic graphs", </w:t>
@@ -17973,6 +18389,7 @@
           <w:i/>
           <w:bidi w:val="0"/>
           <w:sz w:val="10"/>
+          <w:rtl w:val="0"/>
           <w:szCs w:val="10"/>
         </w:rPr>
         <w:t>Proc. 34th AAAI Conf. on Artificial Intelligence</w:t>
@@ -17982,6 +18399,7 @@
           <w:rFonts w:ascii="Times New Roman" w:hAnsi="Times New Roman" w:cs="Times New Roman"/>
           <w:bidi w:val="0"/>
           <w:sz w:val="10"/>
+          <w:rtl w:val="0"/>
           <w:szCs w:val="10"/>
         </w:rPr>
         <w:t>, pp. 5363-5370, 2020.</w:t>
@@ -17997,6 +18415,7 @@
           <w:rFonts w:ascii="Times New Roman" w:hAnsi="Times New Roman" w:cs="Times New Roman"/>
           <w:bidi w:val="0"/>
           <w:sz w:val="10"/>
+          <w:rtl w:val="0"/>
           <w:szCs w:val="10"/>
         </w:rPr>
         <w:t xml:space="preserve">[19] </w:t>
@@ -18006,9 +18425,10 @@
           <w:rFonts w:ascii="Times New Roman" w:hAnsi="Times New Roman" w:cs="Times New Roman"/>
           <w:bidi w:val="0"/>
           <w:sz w:val="10"/>
+          <w:rtl w:val="0"/>
           <w:szCs w:val="10"/>
         </w:rPr>
-        <w:t xml:space="preserve">J. Zhang et al., "A survey on dynamic graph neural networks", </w:t>
+        <w:t xml:space="preserve">Y. Zheng, L. Yi, Z. Wei, "A survey of dynamic graph neural networks", </w:t>
       </w:r>
       <w:r>
         <w:rPr>
@@ -18017,6 +18437,7 @@
           <w:i/>
           <w:bidi w:val="0"/>
           <w:sz w:val="10"/>
+          <w:rtl w:val="0"/>
           <w:szCs w:val="10"/>
         </w:rPr>
         <w:t>Frontiers of Computer Science</w:t>
@@ -18026,9 +18447,10 @@
           <w:rFonts w:ascii="Times New Roman" w:hAnsi="Times New Roman" w:cs="Times New Roman"/>
           <w:bidi w:val="0"/>
           <w:sz w:val="10"/>
+          <w:rtl w:val="0"/>
           <w:szCs w:val="10"/>
         </w:rPr>
-        <w:t>, Vol. 19, No. 1, p. 191301, 2025.</w:t>
+        <w:t>, Vol. 19, No. 6, Art. 196323, 2025.</w:t>
       </w:r>
     </w:p>
     <w:p>
@@ -18041,6 +18463,7 @@
           <w:rFonts w:ascii="Times New Roman" w:hAnsi="Times New Roman" w:cs="Times New Roman"/>
           <w:bidi w:val="0"/>
           <w:sz w:val="10"/>
+          <w:rtl w:val="0"/>
           <w:szCs w:val="10"/>
         </w:rPr>
         <w:t xml:space="preserve">[20] </w:t>
@@ -18050,6 +18473,7 @@
           <w:rFonts w:ascii="Times New Roman" w:hAnsi="Times New Roman" w:cs="Times New Roman"/>
           <w:bidi w:val="0"/>
           <w:sz w:val="10"/>
+          <w:rtl w:val="0"/>
           <w:szCs w:val="10"/>
         </w:rPr>
         <w:t xml:space="preserve">M. M. Bronstein, J. Bruna, Y. LeCun, A. Szlam, P. Vandergheynst, "Geometric deep learning: Going beyond Euclidean data", </w:t>
@@ -18061,6 +18485,7 @@
           <w:i/>
           <w:bidi w:val="0"/>
           <w:sz w:val="10"/>
+          <w:rtl w:val="0"/>
           <w:szCs w:val="10"/>
         </w:rPr>
         <w:t>IEEE Signal Processing Magazine</w:t>
@@ -18070,6 +18495,7 @@
           <w:rFonts w:ascii="Times New Roman" w:hAnsi="Times New Roman" w:cs="Times New Roman"/>
           <w:bidi w:val="0"/>
           <w:sz w:val="10"/>
+          <w:rtl w:val="0"/>
           <w:szCs w:val="10"/>
         </w:rPr>
         <w:t>, Vol. 34, No. 4, pp. 18-42, 2017.</w:t>
@@ -18085,6 +18511,7 @@
           <w:rFonts w:ascii="Times New Roman" w:hAnsi="Times New Roman" w:cs="Times New Roman"/>
           <w:bidi w:val="0"/>
           <w:sz w:val="10"/>
+          <w:rtl w:val="0"/>
           <w:szCs w:val="10"/>
         </w:rPr>
         <w:t xml:space="preserve">[21] </w:t>
@@ -18094,6 +18521,7 @@
           <w:rFonts w:ascii="Times New Roman" w:hAnsi="Times New Roman" w:cs="Times New Roman"/>
           <w:bidi w:val="0"/>
           <w:sz w:val="10"/>
+          <w:rtl w:val="0"/>
           <w:szCs w:val="10"/>
         </w:rPr>
         <w:t xml:space="preserve">V. D. Blondel, J.-L. Guillaume, R. Lambiotte, E. Lefebvre, "Fast unfolding of communities in large networks", </w:t>
@@ -18105,6 +18533,7 @@
           <w:i/>
           <w:bidi w:val="0"/>
           <w:sz w:val="10"/>
+          <w:rtl w:val="0"/>
           <w:szCs w:val="10"/>
         </w:rPr>
         <w:t>Journal of Statistical Mechanics: Theory and Experiment</w:t>
@@ -18114,6 +18543,7 @@
           <w:rFonts w:ascii="Times New Roman" w:hAnsi="Times New Roman" w:cs="Times New Roman"/>
           <w:bidi w:val="0"/>
           <w:sz w:val="10"/>
+          <w:rtl w:val="0"/>
           <w:szCs w:val="10"/>
         </w:rPr>
         <w:t>, 2008.</w:t>
@@ -18129,6 +18559,7 @@
           <w:rFonts w:ascii="Times New Roman" w:hAnsi="Times New Roman" w:cs="Times New Roman"/>
           <w:bidi w:val="0"/>
           <w:sz w:val="10"/>
+          <w:rtl w:val="0"/>
           <w:szCs w:val="10"/>
         </w:rPr>
         <w:t xml:space="preserve">[22] </w:t>
@@ -18138,6 +18569,7 @@
           <w:rFonts w:ascii="Times New Roman" w:hAnsi="Times New Roman" w:cs="Times New Roman"/>
           <w:bidi w:val="0"/>
           <w:sz w:val="10"/>
+          <w:rtl w:val="0"/>
           <w:szCs w:val="10"/>
         </w:rPr>
         <w:t xml:space="preserve">F. Di Giovanni, J. Rowbottom, B. P. Chamberlain, T. Markovich, M. M. Bronstein, "Graph neural networks as gradient flows: understanding over-smoothing and over-squashing via total variation", </w:t>
@@ -18149,6 +18581,7 @@
           <w:i/>
           <w:bidi w:val="0"/>
           <w:sz w:val="10"/>
+          <w:rtl w:val="0"/>
           <w:szCs w:val="10"/>
         </w:rPr>
         <w:t>Proc. 11th Int. Conf. on Learning Representations (ICLR)</w:t>
@@ -18158,6 +18591,7 @@
           <w:rFonts w:ascii="Times New Roman" w:hAnsi="Times New Roman" w:cs="Times New Roman"/>
           <w:bidi w:val="0"/>
           <w:sz w:val="10"/>
+          <w:rtl w:val="0"/>
           <w:szCs w:val="10"/>
         </w:rPr>
         <w:t>, 2023.</w:t>
@@ -18173,6 +18607,7 @@
           <w:rFonts w:ascii="Times New Roman" w:hAnsi="Times New Roman" w:cs="Times New Roman"/>
           <w:bidi w:val="0"/>
           <w:sz w:val="10"/>
+          <w:rtl w:val="0"/>
           <w:szCs w:val="10"/>
         </w:rPr>
         <w:t xml:space="preserve">[23] </w:t>
@@ -18182,9 +18617,10 @@
           <w:rFonts w:ascii="Times New Roman" w:hAnsi="Times New Roman" w:cs="Times New Roman"/>
           <w:bidi w:val="0"/>
           <w:sz w:val="10"/>
+          <w:rtl w:val="0"/>
           <w:szCs w:val="10"/>
         </w:rPr>
-        <w:t xml:space="preserve">S. Zargarbashi, S. Antonelli, K. Borgwardt, "Non-exchangeable conformal prediction for temporal graph neural networks", </w:t>
+        <w:t xml:space="preserve">T. Wang, J. Kang, Y. Yan, A. Kulkarni, D. Zhou, "Non-exchangeable conformal prediction for temporal graph neural networks", </w:t>
       </w:r>
       <w:r>
         <w:rPr>
@@ -18193,6 +18629,7 @@
           <w:i/>
           <w:bidi w:val="0"/>
           <w:sz w:val="10"/>
+          <w:rtl w:val="0"/>
           <w:szCs w:val="10"/>
         </w:rPr>
         <w:t>Proc. 31st ACM SIGKDD Conf. on Knowledge Discovery and Data Mining (KDD)</w:t>
@@ -18202,9 +18639,10 @@
           <w:rFonts w:ascii="Times New Roman" w:hAnsi="Times New Roman" w:cs="Times New Roman"/>
           <w:bidi w:val="0"/>
           <w:sz w:val="10"/>
+          <w:rtl w:val="0"/>
           <w:szCs w:val="10"/>
         </w:rPr>
-        <w:t>, 2025.</w:t>
+        <w:t>, Vol. 2, pp. 3031-3042, 2025.</w:t>
       </w:r>
     </w:p>
     <w:p>
@@ -18217,6 +18655,7 @@
           <w:rFonts w:ascii="Times New Roman" w:hAnsi="Times New Roman" w:cs="Times New Roman"/>
           <w:bidi w:val="0"/>
           <w:sz w:val="10"/>
+          <w:rtl w:val="0"/>
           <w:szCs w:val="10"/>
         </w:rPr>
         <w:t xml:space="preserve">[24] </w:t>
@@ -18226,6 +18665,7 @@
           <w:rFonts w:ascii="Times New Roman" w:hAnsi="Times New Roman" w:cs="Times New Roman"/>
           <w:bidi w:val="0"/>
           <w:sz w:val="10"/>
+          <w:rtl w:val="0"/>
           <w:szCs w:val="10"/>
         </w:rPr>
         <w:t xml:space="preserve">S. C. Kumbhakar, C. A. K. Lovell, "Stochastic Frontier Analysis", </w:t>
@@ -18237,6 +18677,7 @@
           <w:i/>
           <w:bidi w:val="0"/>
           <w:sz w:val="10"/>
+          <w:rtl w:val="0"/>
           <w:szCs w:val="10"/>
         </w:rPr>
         <w:t>Cambridge University Press</w:t>
@@ -18246,6 +18687,7 @@
           <w:rFonts w:ascii="Times New Roman" w:hAnsi="Times New Roman" w:cs="Times New Roman"/>
           <w:bidi w:val="0"/>
           <w:sz w:val="10"/>
+          <w:rtl w:val="0"/>
           <w:szCs w:val="10"/>
         </w:rPr>
         <w:t>, Cambridge, U.K., 2000.</w:t>
@@ -18261,6 +18703,7 @@
           <w:rFonts w:ascii="Times New Roman" w:hAnsi="Times New Roman" w:cs="Times New Roman"/>
           <w:bidi w:val="0"/>
           <w:sz w:val="10"/>
+          <w:rtl w:val="0"/>
           <w:szCs w:val="10"/>
         </w:rPr>
         <w:t xml:space="preserve">[25] </w:t>
@@ -18270,6 +18713,7 @@
           <w:rFonts w:ascii="Times New Roman" w:hAnsi="Times New Roman" w:cs="Times New Roman"/>
           <w:bidi w:val="0"/>
           <w:sz w:val="10"/>
+          <w:rtl w:val="0"/>
           <w:szCs w:val="10"/>
         </w:rPr>
         <w:t xml:space="preserve">A. C. Cameron, P. K. Trivedi, "Regression Analysis of Count Data", 2nd ed., </w:t>
@@ -18281,6 +18725,7 @@
           <w:i/>
           <w:bidi w:val="0"/>
           <w:sz w:val="10"/>
+          <w:rtl w:val="0"/>
           <w:szCs w:val="10"/>
         </w:rPr>
         <w:t>Cambridge University Press</w:t>
@@ -18290,6 +18735,7 @@
           <w:rFonts w:ascii="Times New Roman" w:hAnsi="Times New Roman" w:cs="Times New Roman"/>
           <w:bidi w:val="0"/>
           <w:sz w:val="10"/>
+          <w:rtl w:val="0"/>
           <w:szCs w:val="10"/>
         </w:rPr>
         <w:t>, Cambridge, U.K., 2013.</w:t>
@@ -18305,6 +18751,7 @@
           <w:rFonts w:ascii="Times New Roman" w:hAnsi="Times New Roman" w:cs="Times New Roman"/>
           <w:bidi w:val="0"/>
           <w:sz w:val="10"/>
+          <w:rtl w:val="0"/>
           <w:szCs w:val="10"/>
         </w:rPr>
         <w:t xml:space="preserve">[26] </w:t>
@@ -18314,6 +18761,7 @@
           <w:rFonts w:ascii="Times New Roman" w:hAnsi="Times New Roman" w:cs="Times New Roman"/>
           <w:bidi w:val="0"/>
           <w:sz w:val="10"/>
+          <w:rtl w:val="0"/>
           <w:szCs w:val="10"/>
         </w:rPr>
         <w:t xml:space="preserve">E. Ascarza, "Retention first, but for whom? Identifying targets for churn management", </w:t>
@@ -18325,6 +18773,7 @@
           <w:i/>
           <w:bidi w:val="0"/>
           <w:sz w:val="10"/>
+          <w:rtl w:val="0"/>
           <w:szCs w:val="10"/>
         </w:rPr>
         <w:t>Journal of Marketing Research</w:t>
@@ -18334,6 +18783,7 @@
           <w:rFonts w:ascii="Times New Roman" w:hAnsi="Times New Roman" w:cs="Times New Roman"/>
           <w:bidi w:val="0"/>
           <w:sz w:val="10"/>
+          <w:rtl w:val="0"/>
           <w:szCs w:val="10"/>
         </w:rPr>
         <w:t>, Vol. 55, No. 2, pp. 181-198, 2018.</w:t>
@@ -18349,6 +18799,7 @@
           <w:rFonts w:ascii="Times New Roman" w:hAnsi="Times New Roman" w:cs="Times New Roman"/>
           <w:bidi w:val="0"/>
           <w:sz w:val="10"/>
+          <w:rtl w:val="0"/>
           <w:szCs w:val="10"/>
         </w:rPr>
         <w:t xml:space="preserve">[27] </w:t>
@@ -18358,6 +18809,7 @@
           <w:rFonts w:ascii="Times New Roman" w:hAnsi="Times New Roman" w:cs="Times New Roman"/>
           <w:bidi w:val="0"/>
           <w:sz w:val="10"/>
+          <w:rtl w:val="0"/>
           <w:szCs w:val="10"/>
         </w:rPr>
         <w:t xml:space="preserve">F. Devriendt, D. Moldovan, W. Verbeke, "Why you should stop using cross-entropy for uplift modeling", </w:t>
@@ -18369,6 +18821,7 @@
           <w:i/>
           <w:bidi w:val="0"/>
           <w:sz w:val="10"/>
+          <w:rtl w:val="0"/>
           <w:szCs w:val="10"/>
         </w:rPr>
         <w:t>Information Sciences</w:t>
@@ -18378,6 +18831,7 @@
           <w:rFonts w:ascii="Times New Roman" w:hAnsi="Times New Roman" w:cs="Times New Roman"/>
           <w:bidi w:val="0"/>
           <w:sz w:val="10"/>
+          <w:rtl w:val="0"/>
           <w:szCs w:val="10"/>
         </w:rPr>
         <w:t>, Vol. 535, pp. 110-126, 2020.</w:t>

</xml_diff>

<commit_message>
fix(review): synchronize micro-merchant bias numbers, format parentheses, update K=50 statistics, and correct Ref 7 year to 2025
</commit_message>
<xml_diff>
--- a/FA_From_Transactional_Data_to_Organizational_Intelligence.docx
+++ b/FA_From_Transactional_Data_to_Organizational_Intelligence.docx
@@ -279,26 +279,26 @@
           <w:rtl/>
           <w:szCs w:val="18"/>
         </w:rPr>
-        <w:t xml:space="preserve"> تنها یک مدل یادگیری ماشین نیست، بلکه یک مؤلفه تصمیم‌یار (</w:t>
-      </w:r>
-      <w:r>
-        <w:rPr>
-          <w:rFonts w:ascii="Times New Roman" w:hAnsi="Times New Roman" w:cs="Times New Roman"/>
-          <w:bidi w:val="0"/>
-          <w:sz w:val="17"/>
-          <w:rtl w:val="0"/>
-          <w:szCs w:val="17"/>
-        </w:rPr>
-        <w:t>‎Decision-support component‎</w:t>
-      </w:r>
-      <w:r>
-        <w:rPr>
-          <w:rFonts w:hint="cs" w:ascii="B Mitra" w:hAnsi="B Mitra" w:cs="B Mitra"/>
-          <w:sz w:val="18"/>
-          <w:rtl/>
-          <w:szCs w:val="18"/>
-        </w:rPr>
-        <w:t xml:space="preserve">) در معماری مدیریت پذیرندگان است. این معماری از جریان داده‌های تراکنشی آغاز شده، در لایه هوشمندی گراف پردازش می‌گردد و توسط موتور تصمیم‌گیری </w:t>
+        <w:t xml:space="preserve"> تنها یک مدل یادگیری ماشین نیست، بلکه یک مؤلفه تصمیم‌یار </w:t>
+      </w:r>
+      <w:r>
+        <w:rPr>
+          <w:rFonts w:ascii="Times New Roman" w:hAnsi="Times New Roman" w:cs="Times New Roman"/>
+          <w:bidi w:val="0"/>
+          <w:sz w:val="17"/>
+          <w:rtl w:val="0"/>
+          <w:szCs w:val="17"/>
+        </w:rPr>
+        <w:t>‎(Decision-support component)‎</w:t>
+      </w:r>
+      <w:r>
+        <w:rPr>
+          <w:rFonts w:hint="cs" w:ascii="B Mitra" w:hAnsi="B Mitra" w:cs="B Mitra"/>
+          <w:sz w:val="18"/>
+          <w:rtl/>
+          <w:szCs w:val="18"/>
+        </w:rPr>
+        <w:t xml:space="preserve"> در معماری مدیریت پذیرندگان است. این معماری از جریان داده‌های تراکنشی آغاز شده، در لایه هوشمندی گراف پردازش می‌گردد و توسط موتور تصمیم‌گیری </w:t>
       </w:r>
       <w:r>
         <w:rPr>
@@ -414,26 +414,26 @@
           <w:rtl/>
           <w:szCs w:val="18"/>
         </w:rPr>
-        <w:t>شبکه‌های پرداخت کارتی، سوییچ‌های بین‌بانکی و شرکت‌های ارائه‌دهنده خدمات پرداخت (</w:t>
-      </w:r>
-      <w:r>
-        <w:rPr>
-          <w:rFonts w:ascii="Times New Roman" w:hAnsi="Times New Roman" w:cs="Times New Roman"/>
-          <w:bidi w:val="0"/>
-          <w:sz w:val="17"/>
-          <w:rtl w:val="0"/>
-          <w:szCs w:val="17"/>
-        </w:rPr>
-        <w:t>‎PSP‎</w:t>
-      </w:r>
-      <w:r>
-        <w:rPr>
-          <w:rFonts w:hint="cs" w:ascii="B Mitra" w:hAnsi="B Mitra" w:cs="B Mitra"/>
-          <w:sz w:val="18"/>
-          <w:rtl/>
-          <w:szCs w:val="18"/>
-        </w:rPr>
-        <w:t xml:space="preserve">) روزانه صدها میلیون تراکنش را بر روی پایانه‌های فروش و درگاه‌های اینترنتی ثبت می‌کنند </w:t>
+        <w:t xml:space="preserve">شبکه‌های پرداخت کارتی، سوییچ‌های بین‌بانکی و شرکت‌های ارائه‌دهنده خدمات پرداخت </w:t>
+      </w:r>
+      <w:r>
+        <w:rPr>
+          <w:rFonts w:ascii="Times New Roman" w:hAnsi="Times New Roman" w:cs="Times New Roman"/>
+          <w:bidi w:val="0"/>
+          <w:sz w:val="17"/>
+          <w:rtl w:val="0"/>
+          <w:szCs w:val="17"/>
+        </w:rPr>
+        <w:t>‎(PSP)‎</w:t>
+      </w:r>
+      <w:r>
+        <w:rPr>
+          <w:rFonts w:hint="cs" w:ascii="B Mitra" w:hAnsi="B Mitra" w:cs="B Mitra"/>
+          <w:sz w:val="18"/>
+          <w:rtl/>
+          <w:szCs w:val="18"/>
+        </w:rPr>
+        <w:t xml:space="preserve"> روزانه صدها میلیون تراکنش را بر روی پایانه‌های فروش و درگاه‌های اینترنتی ثبت می‌کنند </w:t>
       </w:r>
       <w:r>
         <w:rPr>
@@ -505,45 +505,45 @@
           <w:rtl/>
           <w:szCs w:val="18"/>
         </w:rPr>
-        <w:t>شناسایی پذیرندگان کم‌عملکرد اما دارای پتانسیل بالا، با چهار چالش اساسی روبروست: نخست، نابینایی رابطه‌ای مدل‌های جدولی نسبت به ساختار مشتریان مشترک پایانه‌ها؛ دوم، بیش‌پراکندگی شدید داده‌های شمارشی تعداد تراکنش که برازش با خطای گوسی را ناکارآمد می‌سازد؛ سوم، تفاوت پیش‌بینی اینرسی آینده با کشف فرصت، چرا که پیش‌بینی استاندارد صرفاً تداوم کم‌عملکردی پذیرنده ضعیف را تخمین می‌زند؛ و چهارم، لزوم اتکای انحصاری بر پنج فیلد استاندارد دفتر کل بدون هیچ‌گونه فرضیات خارجی: شناسه کارت (</w:t>
-      </w:r>
-      <w:r>
-        <w:rPr>
-          <w:rFonts w:ascii="Times New Roman" w:hAnsi="Times New Roman" w:cs="Times New Roman"/>
-          <w:bidi w:val="0"/>
-          <w:sz w:val="17"/>
-          <w:rtl w:val="0"/>
-          <w:szCs w:val="17"/>
-        </w:rPr>
-        <w:t>‎Masked PAN‎</w:t>
-      </w:r>
-      <w:r>
-        <w:rPr>
-          <w:rFonts w:hint="cs" w:ascii="B Mitra" w:hAnsi="B Mitra" w:cs="B Mitra"/>
-          <w:sz w:val="18"/>
-          <w:rtl/>
-          <w:szCs w:val="18"/>
-        </w:rPr>
-        <w:t>)، مبلغ تراکنش (</w:t>
-      </w:r>
-      <w:r>
-        <w:rPr>
-          <w:rFonts w:ascii="Times New Roman" w:hAnsi="Times New Roman" w:cs="Times New Roman"/>
-          <w:bidi w:val="0"/>
-          <w:sz w:val="17"/>
-          <w:rtl w:val="0"/>
-          <w:szCs w:val="17"/>
-        </w:rPr>
-        <w:t>‎Amount‎</w:t>
-      </w:r>
-      <w:r>
-        <w:rPr>
-          <w:rFonts w:hint="cs" w:ascii="B Mitra" w:hAnsi="B Mitra" w:cs="B Mitra"/>
-          <w:sz w:val="18"/>
-          <w:rtl/>
-          <w:szCs w:val="18"/>
-        </w:rPr>
-        <w:t xml:space="preserve">)، شناسه پذیرنده دفتر کل </w:t>
+        <w:t xml:space="preserve">شناسایی پذیرندگان کم‌عملکرد اما دارای پتانسیل بالا، با چهار چالش اساسی روبروست: نخست، نابینایی رابطه‌ای مدل‌های جدولی نسبت به ساختار مشتریان مشترک پایانه‌ها؛ دوم، بیش‌پراکندگی شدید داده‌های شمارشی تعداد تراکنش که برازش با خطای گوسی را ناکارآمد می‌سازد؛ سوم، تفاوت پیش‌بینی اینرسی آینده با کشف فرصت، چرا که پیش‌بینی استاندارد صرفاً تداوم کم‌عملکردی پذیرنده ضعیف را تخمین می‌زند؛ و چهارم، لزوم اتکای انحصاری بر پنج فیلد استاندارد دفتر کل بدون هیچ‌گونه فرضیات خارجی: شناسه کارت </w:t>
+      </w:r>
+      <w:r>
+        <w:rPr>
+          <w:rFonts w:ascii="Times New Roman" w:hAnsi="Times New Roman" w:cs="Times New Roman"/>
+          <w:bidi w:val="0"/>
+          <w:sz w:val="17"/>
+          <w:rtl w:val="0"/>
+          <w:szCs w:val="17"/>
+        </w:rPr>
+        <w:t>‎(Masked PAN)‎</w:t>
+      </w:r>
+      <w:r>
+        <w:rPr>
+          <w:rFonts w:hint="cs" w:ascii="B Mitra" w:hAnsi="B Mitra" w:cs="B Mitra"/>
+          <w:sz w:val="18"/>
+          <w:rtl/>
+          <w:szCs w:val="18"/>
+        </w:rPr>
+        <w:t xml:space="preserve">، مبلغ تراکنش </w:t>
+      </w:r>
+      <w:r>
+        <w:rPr>
+          <w:rFonts w:ascii="Times New Roman" w:hAnsi="Times New Roman" w:cs="Times New Roman"/>
+          <w:bidi w:val="0"/>
+          <w:sz w:val="17"/>
+          <w:rtl w:val="0"/>
+          <w:szCs w:val="17"/>
+        </w:rPr>
+        <w:t>‎(Amount)‎</w:t>
+      </w:r>
+      <w:r>
+        <w:rPr>
+          <w:rFonts w:hint="cs" w:ascii="B Mitra" w:hAnsi="B Mitra" w:cs="B Mitra"/>
+          <w:sz w:val="18"/>
+          <w:rtl/>
+          <w:szCs w:val="18"/>
+        </w:rPr>
+        <w:t xml:space="preserve">، شناسه پذیرنده دفتر کل </w:t>
       </w:r>
       <w:r>
         <w:rPr>
@@ -562,45 +562,45 @@
           <w:rtl/>
           <w:szCs w:val="18"/>
         </w:rPr>
-        <w:t>، تاریخ و زمان (</w:t>
-      </w:r>
-      <w:r>
-        <w:rPr>
-          <w:rFonts w:ascii="Times New Roman" w:hAnsi="Times New Roman" w:cs="Times New Roman"/>
-          <w:bidi w:val="0"/>
-          <w:sz w:val="17"/>
-          <w:rtl w:val="0"/>
-          <w:szCs w:val="17"/>
-        </w:rPr>
-        <w:t>‎Create Date‎</w:t>
-      </w:r>
-      <w:r>
-        <w:rPr>
-          <w:rFonts w:hint="cs" w:ascii="B Mitra" w:hAnsi="B Mitra" w:cs="B Mitra"/>
-          <w:sz w:val="18"/>
-          <w:rtl/>
-          <w:szCs w:val="18"/>
-        </w:rPr>
-        <w:t>) و صنف اقتصادی (</w:t>
-      </w:r>
-      <w:r>
-        <w:rPr>
-          <w:rFonts w:ascii="Times New Roman" w:hAnsi="Times New Roman" w:cs="Times New Roman"/>
-          <w:bidi w:val="0"/>
-          <w:sz w:val="17"/>
-          <w:rtl w:val="0"/>
-          <w:szCs w:val="17"/>
-        </w:rPr>
-        <w:t>‎Cast Name‎</w:t>
-      </w:r>
-      <w:r>
-        <w:rPr>
-          <w:rFonts w:hint="cs" w:ascii="B Mitra" w:hAnsi="B Mitra" w:cs="B Mitra"/>
-          <w:sz w:val="18"/>
-          <w:rtl/>
-          <w:szCs w:val="18"/>
-        </w:rPr>
-        <w:t>).</w:t>
+        <w:t xml:space="preserve">، تاریخ و زمان </w:t>
+      </w:r>
+      <w:r>
+        <w:rPr>
+          <w:rFonts w:ascii="Times New Roman" w:hAnsi="Times New Roman" w:cs="Times New Roman"/>
+          <w:bidi w:val="0"/>
+          <w:sz w:val="17"/>
+          <w:rtl w:val="0"/>
+          <w:szCs w:val="17"/>
+        </w:rPr>
+        <w:t>‎(Create Date)‎</w:t>
+      </w:r>
+      <w:r>
+        <w:rPr>
+          <w:rFonts w:hint="cs" w:ascii="B Mitra" w:hAnsi="B Mitra" w:cs="B Mitra"/>
+          <w:sz w:val="18"/>
+          <w:rtl/>
+          <w:szCs w:val="18"/>
+        </w:rPr>
+        <w:t xml:space="preserve"> و صنف اقتصادی </w:t>
+      </w:r>
+      <w:r>
+        <w:rPr>
+          <w:rFonts w:ascii="Times New Roman" w:hAnsi="Times New Roman" w:cs="Times New Roman"/>
+          <w:bidi w:val="0"/>
+          <w:sz w:val="17"/>
+          <w:rtl w:val="0"/>
+          <w:szCs w:val="17"/>
+        </w:rPr>
+        <w:t>‎(Cast Name)‎</w:t>
+      </w:r>
+      <w:r>
+        <w:rPr>
+          <w:rFonts w:hint="cs" w:ascii="B Mitra" w:hAnsi="B Mitra" w:cs="B Mitra"/>
+          <w:sz w:val="18"/>
+          <w:rtl/>
+          <w:szCs w:val="18"/>
+        </w:rPr>
+        <w:t>.</w:t>
       </w:r>
     </w:p>
     <w:p>
@@ -710,26 +710,26 @@
           <w:rtl/>
           <w:szCs w:val="18"/>
         </w:rPr>
-        <w:t xml:space="preserve"> را جهت اولویت‌بندی کمپین استخراج می‌کند. در ادبیات بازاریابی پرداخت، لیو و همکاران (</w:t>
-      </w:r>
-      <w:r>
-        <w:rPr>
-          <w:rFonts w:ascii="Times New Roman" w:hAnsi="Times New Roman" w:cs="Times New Roman"/>
-          <w:bidi w:val="0"/>
-          <w:sz w:val="17"/>
-          <w:rtl w:val="0"/>
-          <w:szCs w:val="17"/>
-        </w:rPr>
-        <w:t>‎CIKM 2019‎</w:t>
-      </w:r>
-      <w:r>
-        <w:rPr>
-          <w:rFonts w:hint="cs" w:ascii="B Mitra" w:hAnsi="B Mitra" w:cs="B Mitra"/>
-          <w:sz w:val="18"/>
-          <w:rtl/>
-          <w:szCs w:val="18"/>
-        </w:rPr>
-        <w:t xml:space="preserve">) </w:t>
+        <w:t xml:space="preserve"> را جهت اولویت‌بندی کمپین استخراج می‌کند. در ادبیات بازاریابی پرداخت، لیو و همکاران </w:t>
+      </w:r>
+      <w:r>
+        <w:rPr>
+          <w:rFonts w:ascii="Times New Roman" w:hAnsi="Times New Roman" w:cs="Times New Roman"/>
+          <w:bidi w:val="0"/>
+          <w:sz w:val="17"/>
+          <w:rtl w:val="0"/>
+          <w:szCs w:val="17"/>
+        </w:rPr>
+        <w:t>‎(CIKM 2019)‎</w:t>
+      </w:r>
+      <w:r>
+        <w:rPr>
+          <w:rFonts w:hint="cs" w:ascii="B Mitra" w:hAnsi="B Mitra" w:cs="B Mitra"/>
+          <w:sz w:val="18"/>
+          <w:rtl/>
+          <w:szCs w:val="18"/>
+        </w:rPr>
+        <w:t xml:space="preserve"> </w:t>
       </w:r>
       <w:r>
         <w:rPr>
@@ -832,26 +832,26 @@
           <w:rtl/>
           <w:szCs w:val="18"/>
         </w:rPr>
-        <w:t>شبکه‌های عصبی گراف (</w:t>
-      </w:r>
-      <w:r>
-        <w:rPr>
-          <w:rFonts w:ascii="Times New Roman" w:hAnsi="Times New Roman" w:cs="Times New Roman"/>
-          <w:bidi w:val="0"/>
-          <w:sz w:val="17"/>
-          <w:rtl w:val="0"/>
-          <w:szCs w:val="17"/>
-        </w:rPr>
-        <w:t>‎GNN‎</w:t>
-      </w:r>
-      <w:r>
-        <w:rPr>
-          <w:rFonts w:hint="cs" w:ascii="B Mitra" w:hAnsi="B Mitra" w:cs="B Mitra"/>
-          <w:sz w:val="18"/>
-          <w:rtl/>
-          <w:szCs w:val="18"/>
-        </w:rPr>
-        <w:t xml:space="preserve">) با مدل‌سازی موجودیت‌ها به عنوان گره و تراکنش‌ها به عنوان یال، در کشف تقلب و تحلیل حساب‌های مشکوک موفقیت چشمگیری داشته‌اند </w:t>
+        <w:t xml:space="preserve">شبکه‌های عصبی گراف </w:t>
+      </w:r>
+      <w:r>
+        <w:rPr>
+          <w:rFonts w:ascii="Times New Roman" w:hAnsi="Times New Roman" w:cs="Times New Roman"/>
+          <w:bidi w:val="0"/>
+          <w:sz w:val="17"/>
+          <w:rtl w:val="0"/>
+          <w:szCs w:val="17"/>
+        </w:rPr>
+        <w:t>‎(GNN)‎</w:t>
+      </w:r>
+      <w:r>
+        <w:rPr>
+          <w:rFonts w:hint="cs" w:ascii="B Mitra" w:hAnsi="B Mitra" w:cs="B Mitra"/>
+          <w:sz w:val="18"/>
+          <w:rtl/>
+          <w:szCs w:val="18"/>
+        </w:rPr>
+        <w:t xml:space="preserve"> با مدل‌سازی موجودیت‌ها به عنوان گره و تراکنش‌ها به عنوان یال، در کشف تقلب و تحلیل حساب‌های مشکوک موفقیت چشمگیری داشته‌اند </w:t>
       </w:r>
       <w:r>
         <w:rPr>
@@ -927,26 +927,26 @@
           <w:rtl/>
           <w:szCs w:val="18"/>
         </w:rPr>
-        <w:t>. در حوزه بازاریابی پرداخت، لیو و همکاران (</w:t>
-      </w:r>
-      <w:r>
-        <w:rPr>
-          <w:rFonts w:ascii="Times New Roman" w:hAnsi="Times New Roman" w:cs="Times New Roman"/>
-          <w:bidi w:val="0"/>
-          <w:sz w:val="17"/>
-          <w:rtl w:val="0"/>
-          <w:szCs w:val="17"/>
-        </w:rPr>
-        <w:t>‎CIKM 2019‎</w:t>
-      </w:r>
-      <w:r>
-        <w:rPr>
-          <w:rFonts w:hint="cs" w:ascii="B Mitra" w:hAnsi="B Mitra" w:cs="B Mitra"/>
-          <w:sz w:val="18"/>
-          <w:rtl/>
-          <w:szCs w:val="18"/>
-        </w:rPr>
-        <w:t xml:space="preserve">) </w:t>
+        <w:t xml:space="preserve">. در حوزه بازاریابی پرداخت، لیو و همکاران </w:t>
+      </w:r>
+      <w:r>
+        <w:rPr>
+          <w:rFonts w:ascii="Times New Roman" w:hAnsi="Times New Roman" w:cs="Times New Roman"/>
+          <w:bidi w:val="0"/>
+          <w:sz w:val="17"/>
+          <w:rtl w:val="0"/>
+          <w:szCs w:val="17"/>
+        </w:rPr>
+        <w:t>‎(CIKM 2019)‎</w:t>
+      </w:r>
+      <w:r>
+        <w:rPr>
+          <w:rFonts w:hint="cs" w:ascii="B Mitra" w:hAnsi="B Mitra" w:cs="B Mitra"/>
+          <w:sz w:val="18"/>
+          <w:rtl/>
+          <w:szCs w:val="18"/>
+        </w:rPr>
+        <w:t xml:space="preserve"> </w:t>
       </w:r>
       <w:r>
         <w:rPr>
@@ -1159,26 +1159,26 @@
           <w:rtl/>
           <w:szCs w:val="18"/>
         </w:rPr>
-        <w:t xml:space="preserve"> با اندازه‌گیری اشتراک همسایگی‌ها و تمایز پیوندهای پل‌ساز، به عنوان تنظیم‌کننده ساختاری و مهارکننده پدیده فشردگی اطلاعات (</w:t>
-      </w:r>
-      <w:r>
-        <w:rPr>
-          <w:rFonts w:ascii="Times New Roman" w:hAnsi="Times New Roman" w:cs="Times New Roman"/>
-          <w:bidi w:val="0"/>
-          <w:sz w:val="17"/>
-          <w:rtl w:val="0"/>
-          <w:szCs w:val="17"/>
-        </w:rPr>
-        <w:t>‎Over-squashing‎</w:t>
-      </w:r>
-      <w:r>
-        <w:rPr>
-          <w:rFonts w:hint="cs" w:ascii="B Mitra" w:hAnsi="B Mitra" w:cs="B Mitra"/>
-          <w:sz w:val="18"/>
-          <w:rtl/>
-          <w:szCs w:val="18"/>
-        </w:rPr>
-        <w:t xml:space="preserve">) در گراف عمل می‌کند </w:t>
+        <w:t xml:space="preserve"> با اندازه‌گیری اشتراک همسایگی‌ها و تمایز پیوندهای پل‌ساز، به عنوان تنظیم‌کننده ساختاری و مهارکننده پدیده فشردگی اطلاعات </w:t>
+      </w:r>
+      <w:r>
+        <w:rPr>
+          <w:rFonts w:ascii="Times New Roman" w:hAnsi="Times New Roman" w:cs="Times New Roman"/>
+          <w:bidi w:val="0"/>
+          <w:sz w:val="17"/>
+          <w:rtl w:val="0"/>
+          <w:szCs w:val="17"/>
+        </w:rPr>
+        <w:t>‎(Over-squashing)‎</w:t>
+      </w:r>
+      <w:r>
+        <w:rPr>
+          <w:rFonts w:hint="cs" w:ascii="B Mitra" w:hAnsi="B Mitra" w:cs="B Mitra"/>
+          <w:sz w:val="18"/>
+          <w:rtl/>
+          <w:szCs w:val="18"/>
+        </w:rPr>
+        <w:t xml:space="preserve"> در گراف عمل می‌کند </w:t>
       </w:r>
       <w:r>
         <w:rPr>
@@ -1294,26 +1294,26 @@
           <w:rtl/>
           <w:szCs w:val="18"/>
         </w:rPr>
-        <w:t xml:space="preserve"> واسنجی بازه پیش‌بینی یک‌طرفه زمانی (</w:t>
-      </w:r>
-      <w:r>
-        <w:rPr>
-          <w:rFonts w:ascii="Times New Roman" w:hAnsi="Times New Roman" w:cs="Times New Roman"/>
-          <w:bidi w:val="0"/>
-          <w:sz w:val="17"/>
-          <w:rtl w:val="0"/>
-          <w:szCs w:val="17"/>
-        </w:rPr>
-        <w:t>‎One-sided temporal prediction-interval calibration‎</w:t>
-      </w:r>
-      <w:r>
-        <w:rPr>
-          <w:rFonts w:hint="cs" w:ascii="B Mitra" w:hAnsi="B Mitra" w:cs="B Mitra"/>
-          <w:sz w:val="18"/>
-          <w:rtl/>
-          <w:szCs w:val="18"/>
-        </w:rPr>
-        <w:t>) به صورت تجربی صورت می‌گیرد.</w:t>
+        <w:t xml:space="preserve"> واسنجی بازه پیش‌بینی یک‌طرفه زمانی </w:t>
+      </w:r>
+      <w:r>
+        <w:rPr>
+          <w:rFonts w:ascii="Times New Roman" w:hAnsi="Times New Roman" w:cs="Times New Roman"/>
+          <w:bidi w:val="0"/>
+          <w:sz w:val="17"/>
+          <w:rtl w:val="0"/>
+          <w:szCs w:val="17"/>
+        </w:rPr>
+        <w:t>‎(One-sided temporal prediction-interval calibration)‎</w:t>
+      </w:r>
+      <w:r>
+        <w:rPr>
+          <w:rFonts w:hint="cs" w:ascii="B Mitra" w:hAnsi="B Mitra" w:cs="B Mitra"/>
+          <w:sz w:val="18"/>
+          <w:rtl/>
+          <w:szCs w:val="18"/>
+        </w:rPr>
+        <w:t xml:space="preserve"> به صورت تجربی صورت می‌گیرد.</w:t>
       </w:r>
     </w:p>
     <w:p>
@@ -1353,26 +1353,26 @@
           <w:rtl/>
           <w:szCs w:val="18"/>
         </w:rPr>
-        <w:t>در ادبیات اقتصادسنجی، تحلیل مرز تصادفی (</w:t>
-      </w:r>
-      <w:r>
-        <w:rPr>
-          <w:rFonts w:ascii="Times New Roman" w:hAnsi="Times New Roman" w:cs="Times New Roman"/>
-          <w:bidi w:val="0"/>
-          <w:sz w:val="17"/>
-          <w:rtl w:val="0"/>
-          <w:szCs w:val="17"/>
-        </w:rPr>
-        <w:t>‎SFA‎</w:t>
-      </w:r>
-      <w:r>
-        <w:rPr>
-          <w:rFonts w:hint="cs" w:ascii="B Mitra" w:hAnsi="B Mitra" w:cs="B Mitra"/>
-          <w:sz w:val="18"/>
-          <w:rtl/>
-          <w:szCs w:val="18"/>
-        </w:rPr>
-        <w:t xml:space="preserve">) کارایی نسبی بنگاه‌ها را نسبت به مرز بهترین عملکرد تجربی برآورد می‌نماید </w:t>
+        <w:t xml:space="preserve">در ادبیات اقتصادسنجی، تحلیل مرز تصادفی </w:t>
+      </w:r>
+      <w:r>
+        <w:rPr>
+          <w:rFonts w:ascii="Times New Roman" w:hAnsi="Times New Roman" w:cs="Times New Roman"/>
+          <w:bidi w:val="0"/>
+          <w:sz w:val="17"/>
+          <w:rtl w:val="0"/>
+          <w:szCs w:val="17"/>
+        </w:rPr>
+        <w:t>‎(SFA)‎</w:t>
+      </w:r>
+      <w:r>
+        <w:rPr>
+          <w:rFonts w:hint="cs" w:ascii="B Mitra" w:hAnsi="B Mitra" w:cs="B Mitra"/>
+          <w:sz w:val="18"/>
+          <w:rtl/>
+          <w:szCs w:val="18"/>
+        </w:rPr>
+        <w:t xml:space="preserve"> کارایی نسبی بنگاه‌ها را نسبت به مرز بهترین عملکرد تجربی برآورد می‌نماید </w:t>
       </w:r>
       <w:r>
         <w:rPr>
@@ -1507,26 +1507,26 @@
           <w:rtl/>
           <w:szCs w:val="18"/>
         </w:rPr>
-        <w:t xml:space="preserve"> (شکل (</w:t>
-      </w:r>
-      <w:r>
-        <w:rPr>
-          <w:rFonts w:ascii="Times New Roman" w:hAnsi="Times New Roman" w:cs="Times New Roman"/>
-          <w:bidi w:val="0"/>
-          <w:sz w:val="17"/>
-          <w:rtl w:val="0"/>
-          <w:szCs w:val="17"/>
-        </w:rPr>
-        <w:t>‎1‎</w:t>
-      </w:r>
-      <w:r>
-        <w:rPr>
-          <w:rFonts w:hint="cs" w:ascii="B Mitra" w:hAnsi="B Mitra" w:cs="B Mitra"/>
-          <w:sz w:val="18"/>
-          <w:rtl/>
-          <w:szCs w:val="18"/>
-        </w:rPr>
-        <w:t>)).</w:t>
+        <w:t xml:space="preserve"> (شکل </w:t>
+      </w:r>
+      <w:r>
+        <w:rPr>
+          <w:rFonts w:ascii="Times New Roman" w:hAnsi="Times New Roman" w:cs="Times New Roman"/>
+          <w:bidi w:val="0"/>
+          <w:sz w:val="17"/>
+          <w:rtl w:val="0"/>
+          <w:szCs w:val="17"/>
+        </w:rPr>
+        <w:t>‎(1)‎</w:t>
+      </w:r>
+      <w:r>
+        <w:rPr>
+          <w:rFonts w:hint="cs" w:ascii="B Mitra" w:hAnsi="B Mitra" w:cs="B Mitra"/>
+          <w:sz w:val="18"/>
+          <w:rtl/>
+          <w:szCs w:val="18"/>
+        </w:rPr>
+        <w:t>).</w:t>
       </w:r>
     </w:p>
     <w:p>
@@ -1584,26 +1584,26 @@
           <w:rtl/>
           <w:szCs w:val="17"/>
         </w:rPr>
-        <w:t>شکل (</w:t>
-      </w:r>
-      <w:r>
-        <w:rPr>
-          <w:rFonts w:ascii="Times New Roman" w:hAnsi="Times New Roman" w:cs="Times New Roman"/>
-          <w:bidi w:val="0"/>
-          <w:sz w:val="17"/>
-          <w:rtl w:val="0"/>
-          <w:szCs w:val="17"/>
-        </w:rPr>
-        <w:t>‎1‎</w:t>
-      </w:r>
-      <w:r>
-        <w:rPr>
-          <w:rFonts w:hint="cs" w:ascii="B Mitra" w:hAnsi="B Mitra" w:cs="B Mitra"/>
-          <w:sz w:val="17"/>
-          <w:rtl/>
-          <w:szCs w:val="17"/>
-        </w:rPr>
-        <w:t xml:space="preserve">) : خط لوله معماری چارچوب </w:t>
+        <w:t xml:space="preserve">شکل </w:t>
+      </w:r>
+      <w:r>
+        <w:rPr>
+          <w:rFonts w:ascii="Times New Roman" w:hAnsi="Times New Roman" w:cs="Times New Roman"/>
+          <w:bidi w:val="0"/>
+          <w:sz w:val="17"/>
+          <w:rtl w:val="0"/>
+          <w:szCs w:val="17"/>
+        </w:rPr>
+        <w:t>‎(1)‎</w:t>
+      </w:r>
+      <w:r>
+        <w:rPr>
+          <w:rFonts w:hint="cs" w:ascii="B Mitra" w:hAnsi="B Mitra" w:cs="B Mitra"/>
+          <w:sz w:val="17"/>
+          <w:rtl/>
+          <w:szCs w:val="17"/>
+        </w:rPr>
+        <w:t xml:space="preserve"> : خط لوله معماری چارچوب </w:t>
       </w:r>
       <w:r>
         <w:rPr>
@@ -2313,26 +2313,26 @@
           <w:rtl/>
           <w:szCs w:val="18"/>
         </w:rPr>
-        <w:t>سپس شباهت پذیرندگان کاندیدا بر اساس رابطه (</w:t>
-      </w:r>
-      <w:r>
-        <w:rPr>
-          <w:rFonts w:ascii="Times New Roman" w:hAnsi="Times New Roman" w:cs="Times New Roman"/>
-          <w:bidi w:val="0"/>
-          <w:sz w:val="17"/>
-          <w:rtl w:val="0"/>
-          <w:szCs w:val="17"/>
-        </w:rPr>
-        <w:t>‎1‎</w:t>
-      </w:r>
-      <w:r>
-        <w:rPr>
-          <w:rFonts w:hint="cs" w:ascii="B Mitra" w:hAnsi="B Mitra" w:cs="B Mitra"/>
-          <w:sz w:val="18"/>
-          <w:rtl/>
-          <w:szCs w:val="18"/>
-        </w:rPr>
-        <w:t>) فرمول‌بندی می‌گردد:</w:t>
+        <w:t xml:space="preserve">سپس شباهت پذیرندگان کاندیدا بر اساس رابطه </w:t>
+      </w:r>
+      <w:r>
+        <w:rPr>
+          <w:rFonts w:ascii="Times New Roman" w:hAnsi="Times New Roman" w:cs="Times New Roman"/>
+          <w:bidi w:val="0"/>
+          <w:sz w:val="17"/>
+          <w:rtl w:val="0"/>
+          <w:szCs w:val="17"/>
+        </w:rPr>
+        <w:t>‎(1)‎</w:t>
+      </w:r>
+      <w:r>
+        <w:rPr>
+          <w:rFonts w:hint="cs" w:ascii="B Mitra" w:hAnsi="B Mitra" w:cs="B Mitra"/>
+          <w:sz w:val="18"/>
+          <w:rtl/>
+          <w:szCs w:val="18"/>
+        </w:rPr>
+        <w:t xml:space="preserve"> فرمول‌بندی می‌گردد:</w:t>
       </w:r>
     </w:p>
     <w:tbl>
@@ -2630,26 +2630,26 @@
           <w:rtl/>
           <w:szCs w:val="18"/>
         </w:rPr>
-        <w:t>توجه شود که محاسبه انحنا روی گراف همتایان متقارن‌شده انجام می‌شود. سپس انحنای فرمن-ریچی نرمال‌شده افزوده طبق رابطه (</w:t>
-      </w:r>
-      <w:r>
-        <w:rPr>
-          <w:rFonts w:ascii="Times New Roman" w:hAnsi="Times New Roman" w:cs="Times New Roman"/>
-          <w:bidi w:val="0"/>
-          <w:sz w:val="17"/>
-          <w:rtl w:val="0"/>
-          <w:szCs w:val="17"/>
-        </w:rPr>
-        <w:t>‎2‎</w:t>
-      </w:r>
-      <w:r>
-        <w:rPr>
-          <w:rFonts w:hint="cs" w:ascii="B Mitra" w:hAnsi="B Mitra" w:cs="B Mitra"/>
-          <w:sz w:val="18"/>
-          <w:rtl/>
-          <w:szCs w:val="18"/>
-        </w:rPr>
-        <w:t xml:space="preserve">) به عنوان پالایش ساختاری محاسبه می‌شود </w:t>
+        <w:t xml:space="preserve">توجه شود که محاسبه انحنا روی گراف همتایان متقارن‌شده انجام می‌شود. سپس انحنای فرمن-ریچی نرمال‌شده افزوده طبق رابطه </w:t>
+      </w:r>
+      <w:r>
+        <w:rPr>
+          <w:rFonts w:ascii="Times New Roman" w:hAnsi="Times New Roman" w:cs="Times New Roman"/>
+          <w:bidi w:val="0"/>
+          <w:sz w:val="17"/>
+          <w:rtl w:val="0"/>
+          <w:szCs w:val="17"/>
+        </w:rPr>
+        <w:t>‎(2)‎</w:t>
+      </w:r>
+      <w:r>
+        <w:rPr>
+          <w:rFonts w:hint="cs" w:ascii="B Mitra" w:hAnsi="B Mitra" w:cs="B Mitra"/>
+          <w:sz w:val="18"/>
+          <w:rtl/>
+          <w:szCs w:val="18"/>
+        </w:rPr>
+        <w:t xml:space="preserve"> به عنوان پالایش ساختاری محاسبه می‌شود </w:t>
       </w:r>
       <w:r>
         <w:rPr>
@@ -2795,26 +2795,26 @@
           <w:rtl/>
           <w:szCs w:val="18"/>
         </w:rPr>
-        <w:t xml:space="preserve"> تعداد مثلث‌های مشترک و مخرج رادیکالی جهت جلوگیری از غلبه گره‌های متراکم مرکزی پیشنهاد شده است. انحنا وزن همتایان را طبق رابطه (</w:t>
-      </w:r>
-      <w:r>
-        <w:rPr>
-          <w:rFonts w:ascii="Times New Roman" w:hAnsi="Times New Roman" w:cs="Times New Roman"/>
-          <w:bidi w:val="0"/>
-          <w:sz w:val="17"/>
-          <w:rtl w:val="0"/>
-          <w:szCs w:val="17"/>
-        </w:rPr>
-        <w:t>‎3‎</w:t>
-      </w:r>
-      <w:r>
-        <w:rPr>
-          <w:rFonts w:hint="cs" w:ascii="B Mitra" w:hAnsi="B Mitra" w:cs="B Mitra"/>
-          <w:sz w:val="18"/>
-          <w:rtl/>
-          <w:szCs w:val="18"/>
-        </w:rPr>
-        <w:t>) تعدیل می‌کند:</w:t>
+        <w:t xml:space="preserve"> تعداد مثلث‌های مشترک و مخرج رادیکالی جهت جلوگیری از غلبه گره‌های متراکم مرکزی پیشنهاد شده است. انحنا وزن همتایان را طبق رابطه </w:t>
+      </w:r>
+      <w:r>
+        <w:rPr>
+          <w:rFonts w:ascii="Times New Roman" w:hAnsi="Times New Roman" w:cs="Times New Roman"/>
+          <w:bidi w:val="0"/>
+          <w:sz w:val="17"/>
+          <w:rtl w:val="0"/>
+          <w:szCs w:val="17"/>
+        </w:rPr>
+        <w:t>‎(3)‎</w:t>
+      </w:r>
+      <w:r>
+        <w:rPr>
+          <w:rFonts w:hint="cs" w:ascii="B Mitra" w:hAnsi="B Mitra" w:cs="B Mitra"/>
+          <w:sz w:val="18"/>
+          <w:rtl/>
+          <w:szCs w:val="18"/>
+        </w:rPr>
+        <w:t xml:space="preserve"> تعدیل می‌کند:</w:t>
       </w:r>
     </w:p>
     <w:tbl>
@@ -3022,26 +3022,26 @@
           <w:rtl/>
           <w:szCs w:val="17"/>
         </w:rPr>
-        <w:t>شکل (</w:t>
-      </w:r>
-      <w:r>
-        <w:rPr>
-          <w:rFonts w:ascii="Times New Roman" w:hAnsi="Times New Roman" w:cs="Times New Roman"/>
-          <w:bidi w:val="0"/>
-          <w:sz w:val="17"/>
-          <w:rtl w:val="0"/>
-          <w:szCs w:val="17"/>
-        </w:rPr>
-        <w:t>‎2‎</w:t>
-      </w:r>
-      <w:r>
-        <w:rPr>
-          <w:rFonts w:hint="cs" w:ascii="B Mitra" w:hAnsi="B Mitra" w:cs="B Mitra"/>
-          <w:sz w:val="17"/>
-          <w:rtl/>
-          <w:szCs w:val="17"/>
-        </w:rPr>
-        <w:t>) : تصویرسازی دوبعدی تعبیه‌های گراف همتایان پذیرنده در ۸ صنف تجاری؛ حلقه‌های قرمز نشانگر اهداف افت ساختاری تزریق‌شده هستند.</w:t>
+        <w:t xml:space="preserve">شکل </w:t>
+      </w:r>
+      <w:r>
+        <w:rPr>
+          <w:rFonts w:ascii="Times New Roman" w:hAnsi="Times New Roman" w:cs="Times New Roman"/>
+          <w:bidi w:val="0"/>
+          <w:sz w:val="17"/>
+          <w:rtl w:val="0"/>
+          <w:szCs w:val="17"/>
+        </w:rPr>
+        <w:t>‎(2)‎</w:t>
+      </w:r>
+      <w:r>
+        <w:rPr>
+          <w:rFonts w:hint="cs" w:ascii="B Mitra" w:hAnsi="B Mitra" w:cs="B Mitra"/>
+          <w:sz w:val="17"/>
+          <w:rtl/>
+          <w:szCs w:val="17"/>
+        </w:rPr>
+        <w:t xml:space="preserve"> : تصویرسازی دوبعدی تعبیه‌های گراف همتایان پذیرنده در ۸ صنف تجاری؛ حلقه‌های قرمز نشانگر اهداف افت ساختاری تزریق‌شده هستند.</w:t>
       </w:r>
     </w:p>
     <w:p>
@@ -3290,26 +3290,26 @@
           <w:rtl/>
           <w:szCs w:val="18"/>
         </w:rPr>
-        <w:t xml:space="preserve"> پارامتر اندازه یا پراکندگی معکوس (</w:t>
-      </w:r>
-      <w:r>
-        <w:rPr>
-          <w:rFonts w:ascii="Times New Roman" w:hAnsi="Times New Roman" w:cs="Times New Roman"/>
-          <w:bidi w:val="0"/>
-          <w:sz w:val="17"/>
-          <w:rtl w:val="0"/>
-          <w:szCs w:val="17"/>
-        </w:rPr>
-        <w:t>‎inverse-dispersion/size parameter‎</w:t>
-      </w:r>
-      <w:r>
-        <w:rPr>
-          <w:rFonts w:hint="cs" w:ascii="B Mitra" w:hAnsi="B Mitra" w:cs="B Mitra"/>
-          <w:sz w:val="18"/>
-          <w:rtl/>
-          <w:szCs w:val="18"/>
-        </w:rPr>
-        <w:t xml:space="preserve">) است. کلیه ورودی‌ها به اطلاعات تا زمان </w:t>
+        <w:t xml:space="preserve"> پارامتر اندازه یا پراکندگی معکوس </w:t>
+      </w:r>
+      <w:r>
+        <w:rPr>
+          <w:rFonts w:ascii="Times New Roman" w:hAnsi="Times New Roman" w:cs="Times New Roman"/>
+          <w:bidi w:val="0"/>
+          <w:sz w:val="17"/>
+          <w:rtl w:val="0"/>
+          <w:szCs w:val="17"/>
+        </w:rPr>
+        <w:t>‎(inverse-dispersion/size parameter)‎</w:t>
+      </w:r>
+      <w:r>
+        <w:rPr>
+          <w:rFonts w:hint="cs" w:ascii="B Mitra" w:hAnsi="B Mitra" w:cs="B Mitra"/>
+          <w:sz w:val="18"/>
+          <w:rtl/>
+          <w:szCs w:val="18"/>
+        </w:rPr>
+        <w:t xml:space="preserve"> است. کلیه ورودی‌ها به اطلاعات تا زمان </w:t>
       </w:r>
       <w:r>
         <w:rPr>
@@ -3528,26 +3528,26 @@
           <w:rtl/>
           <w:szCs w:val="18"/>
         </w:rPr>
-        <w:t xml:space="preserve"> (پوشش هدف ۸۵٪ کران بالا)، صدک واسنجی‌شده صعودی استخراج شده و کران بالای طبیعی عملکرد پیش‌بینی مطابق رابطه (</w:t>
-      </w:r>
-      <w:r>
-        <w:rPr>
-          <w:rFonts w:ascii="Times New Roman" w:hAnsi="Times New Roman" w:cs="Times New Roman"/>
-          <w:bidi w:val="0"/>
-          <w:sz w:val="17"/>
-          <w:rtl w:val="0"/>
-          <w:szCs w:val="17"/>
-        </w:rPr>
-        <w:t>‎5‎</w:t>
-      </w:r>
-      <w:r>
-        <w:rPr>
-          <w:rFonts w:hint="cs" w:ascii="B Mitra" w:hAnsi="B Mitra" w:cs="B Mitra"/>
-          <w:sz w:val="18"/>
-          <w:rtl/>
-          <w:szCs w:val="18"/>
-        </w:rPr>
-        <w:t>) تعیین می‌شود:</w:t>
+        <w:t xml:space="preserve"> (پوشش هدف ۸۵٪ کران بالا)، صدک واسنجی‌شده صعودی استخراج شده و کران بالای طبیعی عملکرد پیش‌بینی مطابق رابطه </w:t>
+      </w:r>
+      <w:r>
+        <w:rPr>
+          <w:rFonts w:ascii="Times New Roman" w:hAnsi="Times New Roman" w:cs="Times New Roman"/>
+          <w:bidi w:val="0"/>
+          <w:sz w:val="17"/>
+          <w:rtl w:val="0"/>
+          <w:szCs w:val="17"/>
+        </w:rPr>
+        <w:t>‎(5)‎</w:t>
+      </w:r>
+      <w:r>
+        <w:rPr>
+          <w:rFonts w:hint="cs" w:ascii="B Mitra" w:hAnsi="B Mitra" w:cs="B Mitra"/>
+          <w:sz w:val="18"/>
+          <w:rtl/>
+          <w:szCs w:val="18"/>
+        </w:rPr>
+        <w:t xml:space="preserve"> تعیین می‌شود:</w:t>
       </w:r>
     </w:p>
     <w:p>
@@ -3949,26 +3949,26 @@
           <w:rtl/>
           <w:szCs w:val="18"/>
         </w:rPr>
-        <w:t>سپس بنچ‌مارک محافظه‌کارانه همتایان مطابق رابطه (</w:t>
-      </w:r>
-      <w:r>
-        <w:rPr>
-          <w:rFonts w:ascii="Times New Roman" w:hAnsi="Times New Roman" w:cs="Times New Roman"/>
-          <w:bidi w:val="0"/>
-          <w:sz w:val="17"/>
-          <w:rtl w:val="0"/>
-          <w:szCs w:val="17"/>
-        </w:rPr>
-        <w:t>‎6‎</w:t>
-      </w:r>
-      <w:r>
-        <w:rPr>
-          <w:rFonts w:hint="cs" w:ascii="B Mitra" w:hAnsi="B Mitra" w:cs="B Mitra"/>
-          <w:sz w:val="18"/>
-          <w:rtl/>
-          <w:szCs w:val="18"/>
-        </w:rPr>
-        <w:t>) فرمول‌بندی می‌شود:</w:t>
+        <w:t xml:space="preserve">سپس بنچ‌مارک محافظه‌کارانه همتایان مطابق رابطه </w:t>
+      </w:r>
+      <w:r>
+        <w:rPr>
+          <w:rFonts w:ascii="Times New Roman" w:hAnsi="Times New Roman" w:cs="Times New Roman"/>
+          <w:bidi w:val="0"/>
+          <w:sz w:val="17"/>
+          <w:rtl w:val="0"/>
+          <w:szCs w:val="17"/>
+        </w:rPr>
+        <w:t>‎(6)‎</w:t>
+      </w:r>
+      <w:r>
+        <w:rPr>
+          <w:rFonts w:hint="cs" w:ascii="B Mitra" w:hAnsi="B Mitra" w:cs="B Mitra"/>
+          <w:sz w:val="18"/>
+          <w:rtl/>
+          <w:szCs w:val="18"/>
+        </w:rPr>
+        <w:t xml:space="preserve"> فرمول‌بندی می‌شود:</w:t>
       </w:r>
     </w:p>
     <w:tbl>
@@ -4218,26 +4218,26 @@
           <w:rtl/>
           <w:szCs w:val="18"/>
         </w:rPr>
-        <w:t>شاخص رتبه‌بندی فرصت همتا-محور (</w:t>
-      </w:r>
-      <w:r>
-        <w:rPr>
-          <w:rFonts w:ascii="Times New Roman" w:hAnsi="Times New Roman" w:cs="Times New Roman"/>
-          <w:bidi w:val="0"/>
-          <w:sz w:val="17"/>
-          <w:rtl w:val="0"/>
-          <w:szCs w:val="17"/>
-        </w:rPr>
-        <w:t>‎M-GATO‎</w:t>
-      </w:r>
-      <w:r>
-        <w:rPr>
-          <w:rFonts w:hint="cs" w:ascii="B Mitra" w:hAnsi="B Mitra" w:cs="B Mitra"/>
-          <w:sz w:val="18"/>
-          <w:rtl/>
-          <w:szCs w:val="18"/>
-        </w:rPr>
-        <w:t>) حاصل‌ضرب شواهد گرافی در شکاف کران-پیش‌بینی همتایان فرمول‌بندی می‌گردد:</w:t>
+        <w:t xml:space="preserve">شاخص رتبه‌بندی فرصت همتا-محور </w:t>
+      </w:r>
+      <w:r>
+        <w:rPr>
+          <w:rFonts w:ascii="Times New Roman" w:hAnsi="Times New Roman" w:cs="Times New Roman"/>
+          <w:bidi w:val="0"/>
+          <w:sz w:val="17"/>
+          <w:rtl w:val="0"/>
+          <w:szCs w:val="17"/>
+        </w:rPr>
+        <w:t>‎(M-GATO)‎</w:t>
+      </w:r>
+      <w:r>
+        <w:rPr>
+          <w:rFonts w:hint="cs" w:ascii="B Mitra" w:hAnsi="B Mitra" w:cs="B Mitra"/>
+          <w:sz w:val="18"/>
+          <w:rtl/>
+          <w:szCs w:val="18"/>
+        </w:rPr>
+        <w:t xml:space="preserve"> حاصل‌ضرب شواهد گرافی در شکاف کران-پیش‌بینی همتایان فرمول‌بندی می‌گردد:</w:t>
       </w:r>
     </w:p>
     <w:tbl>
@@ -4956,26 +4956,26 @@
           <w:rtl/>
           <w:szCs w:val="17"/>
         </w:rPr>
-        <w:t>شکل (</w:t>
-      </w:r>
-      <w:r>
-        <w:rPr>
-          <w:rFonts w:ascii="Times New Roman" w:hAnsi="Times New Roman" w:cs="Times New Roman"/>
-          <w:bidi w:val="0"/>
-          <w:sz w:val="17"/>
-          <w:rtl w:val="0"/>
-          <w:szCs w:val="17"/>
-        </w:rPr>
-        <w:t>‎3‎</w:t>
-      </w:r>
-      <w:r>
-        <w:rPr>
-          <w:rFonts w:hint="cs" w:ascii="B Mitra" w:hAnsi="B Mitra" w:cs="B Mitra"/>
-          <w:sz w:val="17"/>
-          <w:rtl/>
-          <w:szCs w:val="17"/>
-        </w:rPr>
-        <w:t xml:space="preserve">) : مقایسه مؤلفه‌های شاخص </w:t>
+        <w:t xml:space="preserve">شکل </w:t>
+      </w:r>
+      <w:r>
+        <w:rPr>
+          <w:rFonts w:ascii="Times New Roman" w:hAnsi="Times New Roman" w:cs="Times New Roman"/>
+          <w:bidi w:val="0"/>
+          <w:sz w:val="17"/>
+          <w:rtl w:val="0"/>
+          <w:szCs w:val="17"/>
+        </w:rPr>
+        <w:t>‎(3)‎</w:t>
+      </w:r>
+      <w:r>
+        <w:rPr>
+          <w:rFonts w:hint="cs" w:ascii="B Mitra" w:hAnsi="B Mitra" w:cs="B Mitra"/>
+          <w:sz w:val="17"/>
+          <w:rtl/>
+          <w:szCs w:val="17"/>
+        </w:rPr>
+        <w:t xml:space="preserve"> : مقایسه مؤلفه‌های شاخص </w:t>
       </w:r>
       <w:r>
         <w:rPr>
@@ -5106,45 +5106,45 @@
           <w:rtl/>
           <w:szCs w:val="18"/>
         </w:rPr>
-        <w:t xml:space="preserve"> در نرخ تولید تراکنش آن از دوره پایش ۴ آغاز شده و در دوره آزمون ۵ تداوم یافته باشد. دقیقاً تعداد ۵۲ پذیرنده از ۳۵۰ پذیرنده (۱۴٫۹٪) با نمونه‌گیری طبقه‌بندی‌شده از میان کاندیداهای دارای بنچ‌مارک فعال همتایان (میانگین ۲۹۹ پذیرنده در ۱۰ سید با شانس تصادفی درون‌جامعه‌ای ۱۷٫۴٪) در تمامی اصناف به عنوان هدف تعیین شدند. هم‌پوشانی هدف-همتا پایین بوده و به طور میانگین تنها ۱۱٫۸٪ از همتایان یک هدف، خودشان هدف هستند. سناریوها شامل الف (افت ۱۸٪ با نویز ۳٫۰)، ب (افت ۳۲٪ با نویز ۱٫۸) و ج (افت ۴۸٪ با نویز ۰٫۹) هستند. در سناریوی شاهد منفی (</w:t>
-      </w:r>
-      <w:r>
-        <w:rPr>
-          <w:rFonts w:ascii="Times New Roman" w:hAnsi="Times New Roman" w:cs="Times New Roman"/>
-          <w:bidi w:val="0"/>
-          <w:sz w:val="17"/>
-          <w:rtl w:val="0"/>
-          <w:szCs w:val="17"/>
-        </w:rPr>
-        <w:t>‎Scenario 0‎</w:t>
-      </w:r>
-      <w:r>
-        <w:rPr>
-          <w:rFonts w:hint="cs" w:ascii="B Mitra" w:hAnsi="B Mitra" w:cs="B Mitra"/>
-          <w:sz w:val="18"/>
-          <w:rtl/>
-          <w:szCs w:val="18"/>
-        </w:rPr>
-        <w:t>)، مقدار افت برای تمامی پذیرندگان صفر بوده تا وضعیت عدم وجود مثبت واقعی (</w:t>
-      </w:r>
-      <w:r>
-        <w:rPr>
-          <w:rFonts w:ascii="Times New Roman" w:hAnsi="Times New Roman" w:cs="Times New Roman"/>
-          <w:bidi w:val="0"/>
-          <w:sz w:val="17"/>
-          <w:rtl w:val="0"/>
-          <w:szCs w:val="17"/>
-        </w:rPr>
-        <w:t>‎TP = 0‎</w:t>
-      </w:r>
-      <w:r>
-        <w:rPr>
-          <w:rFonts w:hint="cs" w:ascii="B Mitra" w:hAnsi="B Mitra" w:cs="B Mitra"/>
-          <w:sz w:val="18"/>
-          <w:rtl/>
-          <w:szCs w:val="18"/>
-        </w:rPr>
-        <w:t>) جهت ارزیابی نرخ هشدار کاذب بررسی شود.</w:t>
+        <w:t xml:space="preserve"> در نرخ تولید تراکنش آن از دوره پایش ۴ آغاز شده و در دوره آزمون ۵ تداوم یافته باشد. دقیقاً تعداد ۵۲ پذیرنده از ۳۵۰ پذیرنده (۱۴٫۹٪) با نمونه‌گیری طبقه‌بندی‌شده از میان کاندیداهای دارای بنچ‌مارک فعال همتایان (میانگین ۲۹۹ پذیرنده در ۱۰ سید با شانس تصادفی درون‌جامعه‌ای ۱۷٫۴٪) در تمامی اصناف به عنوان هدف تعیین شدند. هم‌پوشانی هدف-همتا پایین بوده و به طور میانگین تنها ۱۱٫۸٪ از همتایان یک هدف، خودشان هدف هستند. سناریوها شامل الف (افت ۱۸٪ با نویز ۳٫۰)، ب (افت ۳۲٪ با نویز ۱٫۸) و ج (افت ۴۸٪ با نویز ۰٫۹) هستند. در سناریوی شاهد منفی </w:t>
+      </w:r>
+      <w:r>
+        <w:rPr>
+          <w:rFonts w:ascii="Times New Roman" w:hAnsi="Times New Roman" w:cs="Times New Roman"/>
+          <w:bidi w:val="0"/>
+          <w:sz w:val="17"/>
+          <w:rtl w:val="0"/>
+          <w:szCs w:val="17"/>
+        </w:rPr>
+        <w:t>‎(Scenario 0)‎</w:t>
+      </w:r>
+      <w:r>
+        <w:rPr>
+          <w:rFonts w:hint="cs" w:ascii="B Mitra" w:hAnsi="B Mitra" w:cs="B Mitra"/>
+          <w:sz w:val="18"/>
+          <w:rtl/>
+          <w:szCs w:val="18"/>
+        </w:rPr>
+        <w:t xml:space="preserve">، مقدار افت برای تمامی پذیرندگان صفر بوده تا وضعیت عدم وجود مثبت واقعی </w:t>
+      </w:r>
+      <w:r>
+        <w:rPr>
+          <w:rFonts w:ascii="Times New Roman" w:hAnsi="Times New Roman" w:cs="Times New Roman"/>
+          <w:bidi w:val="0"/>
+          <w:sz w:val="17"/>
+          <w:rtl w:val="0"/>
+          <w:szCs w:val="17"/>
+        </w:rPr>
+        <w:t>‎(TP = 0)‎</w:t>
+      </w:r>
+      <w:r>
+        <w:rPr>
+          <w:rFonts w:hint="cs" w:ascii="B Mitra" w:hAnsi="B Mitra" w:cs="B Mitra"/>
+          <w:sz w:val="18"/>
+          <w:rtl/>
+          <w:szCs w:val="18"/>
+        </w:rPr>
+        <w:t xml:space="preserve"> جهت ارزیابی نرخ هشدار کاذب بررسی شود.</w:t>
       </w:r>
     </w:p>
     <w:p>
@@ -5452,26 +5452,26 @@
           <w:rtl/>
           <w:szCs w:val="18"/>
         </w:rPr>
-        <w:t>جدول (</w:t>
-      </w:r>
-      <w:r>
-        <w:rPr>
-          <w:rFonts w:ascii="Times New Roman" w:hAnsi="Times New Roman" w:cs="Times New Roman"/>
-          <w:bidi w:val="0"/>
-          <w:sz w:val="17"/>
-          <w:rtl w:val="0"/>
-          <w:szCs w:val="17"/>
-        </w:rPr>
-        <w:t>‎1‎</w:t>
-      </w:r>
-      <w:r>
-        <w:rPr>
-          <w:rFonts w:hint="cs" w:ascii="B Mitra" w:hAnsi="B Mitra" w:cs="B Mitra"/>
-          <w:sz w:val="18"/>
-          <w:rtl/>
-          <w:szCs w:val="18"/>
-        </w:rPr>
-        <w:t xml:space="preserve">) نتایج پیش‌بینی تعداد تراکنش‌ها را در پنجره آزمون دست‌نخورده (بدون تداخل با افت‌های مصنوعی) طی ۱۰ سید تصادفی گزارش می‌کند. معیار درست‌نمایی </w:t>
+        <w:t xml:space="preserve">جدول </w:t>
+      </w:r>
+      <w:r>
+        <w:rPr>
+          <w:rFonts w:ascii="Times New Roman" w:hAnsi="Times New Roman" w:cs="Times New Roman"/>
+          <w:bidi w:val="0"/>
+          <w:sz w:val="17"/>
+          <w:rtl w:val="0"/>
+          <w:szCs w:val="17"/>
+        </w:rPr>
+        <w:t>‎(1)‎</w:t>
+      </w:r>
+      <w:r>
+        <w:rPr>
+          <w:rFonts w:hint="cs" w:ascii="B Mitra" w:hAnsi="B Mitra" w:cs="B Mitra"/>
+          <w:sz w:val="18"/>
+          <w:rtl/>
+          <w:szCs w:val="18"/>
+        </w:rPr>
+        <w:t xml:space="preserve"> نتایج پیش‌بینی تعداد تراکنش‌ها را در پنجره آزمون دست‌نخورده (بدون تداخل با افت‌های مصنوعی) طی ۱۰ سید تصادفی گزارش می‌کند. معیار درست‌نمایی </w:t>
       </w:r>
       <w:r>
         <w:rPr>
@@ -5506,26 +5506,26 @@
           <w:rtl/>
           <w:szCs w:val="17"/>
         </w:rPr>
-        <w:t>جدول (</w:t>
-      </w:r>
-      <w:r>
-        <w:rPr>
-          <w:rFonts w:ascii="Times New Roman" w:hAnsi="Times New Roman" w:cs="Times New Roman"/>
-          <w:bidi w:val="0"/>
-          <w:sz w:val="17"/>
-          <w:rtl w:val="0"/>
-          <w:szCs w:val="17"/>
-        </w:rPr>
-        <w:t>‎1‎</w:t>
-      </w:r>
-      <w:r>
-        <w:rPr>
-          <w:rFonts w:hint="cs" w:ascii="B Mitra" w:hAnsi="B Mitra" w:cs="B Mitra"/>
-          <w:sz w:val="17"/>
-          <w:rtl/>
-          <w:szCs w:val="17"/>
-        </w:rPr>
-        <w:t>) : مقایسه دقت پیش‌بینی تعداد تراکنش دوره‌های آتی بر روی پنجره آزمون (۱۰ سید تصادفی)</w:t>
+        <w:t xml:space="preserve">جدول </w:t>
+      </w:r>
+      <w:r>
+        <w:rPr>
+          <w:rFonts w:ascii="Times New Roman" w:hAnsi="Times New Roman" w:cs="Times New Roman"/>
+          <w:bidi w:val="0"/>
+          <w:sz w:val="17"/>
+          <w:rtl w:val="0"/>
+          <w:szCs w:val="17"/>
+        </w:rPr>
+        <w:t>‎(1)‎</w:t>
+      </w:r>
+      <w:r>
+        <w:rPr>
+          <w:rFonts w:hint="cs" w:ascii="B Mitra" w:hAnsi="B Mitra" w:cs="B Mitra"/>
+          <w:sz w:val="17"/>
+          <w:rtl/>
+          <w:szCs w:val="17"/>
+        </w:rPr>
+        <w:t xml:space="preserve"> : مقایسه دقت پیش‌بینی تعداد تراکنش دوره‌های آتی بر روی پنجره آزمون (۱۰ سید تصادفی)</w:t>
       </w:r>
     </w:p>
     <w:tbl>
@@ -5782,7 +5782,7 @@
                 <w:rtl/>
                 <w:szCs w:val="11"/>
               </w:rPr>
-              <w:t>۴٫۴۱ ± ۰٫۲۰</w:t>
+              <w:t>۴٫۴۱ ± ۰٫۲۰</w:t>
             </w:r>
           </w:p>
         </w:tc>
@@ -5810,7 +5810,7 @@
                 <w:rtl/>
                 <w:szCs w:val="11"/>
               </w:rPr>
-              <w:t>۵٫۷۸ ± ۰٫۳۷</w:t>
+              <w:t>۵٫۷۸ ± ۰٫۳۷</w:t>
             </w:r>
           </w:p>
         </w:tc>
@@ -5838,7 +5838,7 @@
                 <w:rtl/>
                 <w:szCs w:val="11"/>
               </w:rPr>
-              <w:t>۳۲٫۴۰ ± ۱٫۴۹</w:t>
+              <w:t>۳۲٫۴۰ ± ۱٫۴۹</w:t>
             </w:r>
           </w:p>
         </w:tc>
@@ -5937,7 +5937,7 @@
                 <w:rtl/>
                 <w:szCs w:val="11"/>
               </w:rPr>
-              <w:t>۳٫۵۱ ± ۰٫۱۹</w:t>
+              <w:t>۳٫۵۱ ± ۰٫۱۹</w:t>
             </w:r>
           </w:p>
         </w:tc>
@@ -5965,7 +5965,7 @@
                 <w:rtl/>
                 <w:szCs w:val="11"/>
               </w:rPr>
-              <w:t>۴٫۵۸ ± ۰٫۲۸</w:t>
+              <w:t>۴٫۵۸ ± ۰٫۲۸</w:t>
             </w:r>
           </w:p>
         </w:tc>
@@ -5993,7 +5993,7 @@
                 <w:rtl/>
                 <w:szCs w:val="11"/>
               </w:rPr>
-              <w:t>۲۶٫۰۵ ± ۱٫۰۳</w:t>
+              <w:t>۲۶٫۰۵ ± ۱٫۰۳</w:t>
             </w:r>
           </w:p>
         </w:tc>
@@ -6092,7 +6092,7 @@
                 <w:rtl/>
                 <w:szCs w:val="11"/>
               </w:rPr>
-              <w:t>۳٫۴۱ ± ۰٫۱۶</w:t>
+              <w:t>۳٫۴۱ ± ۰٫۱۶</w:t>
             </w:r>
           </w:p>
         </w:tc>
@@ -6120,7 +6120,7 @@
                 <w:rtl/>
                 <w:szCs w:val="11"/>
               </w:rPr>
-              <w:t>۴٫۴۶ ± ۰٫۲۸</w:t>
+              <w:t>۴٫۴۶ ± ۰٫۲۸</w:t>
             </w:r>
           </w:p>
         </w:tc>
@@ -6148,7 +6148,7 @@
                 <w:rtl/>
                 <w:szCs w:val="11"/>
               </w:rPr>
-              <w:t>۲۵٫۴۲ ± ۰٫۹۲</w:t>
+              <w:t>۲۵٫۴۲ ± ۰٫۹۲</w:t>
             </w:r>
           </w:p>
         </w:tc>
@@ -6266,7 +6266,7 @@
                 <w:rtl/>
                 <w:szCs w:val="11"/>
               </w:rPr>
-              <w:t>۳٫۸۹ ± ۰٫۱۲</w:t>
+              <w:t>۳٫۸۹ ± ۰٫۱۲</w:t>
             </w:r>
           </w:p>
         </w:tc>
@@ -6294,7 +6294,7 @@
                 <w:rtl/>
                 <w:szCs w:val="11"/>
               </w:rPr>
-              <w:t>۵٫۳۱ ± ۰٫۴۲</w:t>
+              <w:t>۵٫۳۱ ± ۰٫۴۲</w:t>
             </w:r>
           </w:p>
         </w:tc>
@@ -6322,7 +6322,7 @@
                 <w:rtl/>
                 <w:szCs w:val="11"/>
               </w:rPr>
-              <w:t>۲۷٫۶۸ ± ۰٫۷۹</w:t>
+              <w:t>۲۷٫۶۸ ± ۰٫۷۹</w:t>
             </w:r>
           </w:p>
         </w:tc>
@@ -6421,7 +6421,7 @@
                 <w:rtl/>
                 <w:szCs w:val="11"/>
               </w:rPr>
-              <w:t>۳٫۷۸ ± ۰٫۲۰</w:t>
+              <w:t>۳٫۷۸ ± ۰٫۲۰</w:t>
             </w:r>
           </w:p>
         </w:tc>
@@ -6449,7 +6449,7 @@
                 <w:rtl/>
                 <w:szCs w:val="11"/>
               </w:rPr>
-              <w:t>۴٫۹۶ ± ۰٫۳۸</w:t>
+              <w:t>۴٫۹۶ ± ۰٫۳۸</w:t>
             </w:r>
           </w:p>
         </w:tc>
@@ -6477,7 +6477,7 @@
                 <w:rtl/>
                 <w:szCs w:val="11"/>
               </w:rPr>
-              <w:t>۲۷٫۵۵ ± ۱٫۰۶</w:t>
+              <w:t>۲۷٫۵۵ ± ۱٫۰۶</w:t>
             </w:r>
           </w:p>
         </w:tc>
@@ -6505,7 +6505,7 @@
                 <w:rtl/>
                 <w:szCs w:val="11"/>
               </w:rPr>
-              <w:t>۳٫۱۷ ± ۰٫۰۲</w:t>
+              <w:t>۳٫۱۷ ± ۰٫۰۲</w:t>
             </w:r>
           </w:p>
         </w:tc>
@@ -6576,7 +6576,7 @@
                 <w:rtl/>
                 <w:szCs w:val="11"/>
               </w:rPr>
-              <w:t>۵٫۹۸ ± ۰٫۵۴</w:t>
+              <w:t>۵٫۹۸ ± ۰٫۵۴</w:t>
             </w:r>
           </w:p>
         </w:tc>
@@ -6604,7 +6604,7 @@
                 <w:rtl/>
                 <w:szCs w:val="11"/>
               </w:rPr>
-              <w:t>۷٫۵۶ ± ۰٫۷۷</w:t>
+              <w:t>۷٫۵۶ ± ۰٫۷۷</w:t>
             </w:r>
           </w:p>
         </w:tc>
@@ -6632,7 +6632,7 @@
                 <w:rtl/>
                 <w:szCs w:val="11"/>
               </w:rPr>
-              <w:t>۳۸٫۶۷ ± ۲٫۱۳</w:t>
+              <w:t>۳۸٫۶۷ ± ۲٫۱۳</w:t>
             </w:r>
           </w:p>
         </w:tc>
@@ -6660,7 +6660,7 @@
                 <w:rtl/>
                 <w:szCs w:val="11"/>
               </w:rPr>
-              <w:t>۳٫۳۱ ± ۰٫۰۳</w:t>
+              <w:t>۳٫۳۱ ± ۰٫۰۳</w:t>
             </w:r>
           </w:p>
         </w:tc>
@@ -6739,7 +6739,7 @@
                 <w:rtl/>
                 <w:szCs w:val="11"/>
               </w:rPr>
-              <w:t>۴٫۴۸ ± ۰٫۴۲</w:t>
+              <w:t>۴٫۴۸ ± ۰٫۴۲</w:t>
             </w:r>
           </w:p>
         </w:tc>
@@ -6770,7 +6770,7 @@
                 <w:rtl/>
                 <w:szCs w:val="11"/>
               </w:rPr>
-              <w:t>۵٫۸۶ ± ۰٫۵۸</w:t>
+              <w:t>۵٫۸۶ ± ۰٫۵۸</w:t>
             </w:r>
           </w:p>
         </w:tc>
@@ -6801,7 +6801,7 @@
                 <w:rtl/>
                 <w:szCs w:val="11"/>
               </w:rPr>
-              <w:t>۳۱٫۳۷ ± ۲٫۱۱</w:t>
+              <w:t>۳۱٫۳۷ ± ۲٫۱۱</w:t>
             </w:r>
           </w:p>
         </w:tc>
@@ -6832,7 +6832,7 @@
                 <w:rtl/>
                 <w:szCs w:val="11"/>
               </w:rPr>
-              <w:t>۳٫۵۱ ± ۰٫۳۱</w:t>
+              <w:t>۳٫۵۱ ± ۰٫۳۱</w:t>
             </w:r>
           </w:p>
         </w:tc>
@@ -6888,7 +6888,7 @@
           <w:rtl/>
           <w:szCs w:val="18"/>
         </w:rPr>
-        <w:t xml:space="preserve"> معادل ۴٫۴۸ ± ۰٫۴۲ دست یافته و عملکرد بهتری نسبت به گراف ایستا (۵٫۹۸ ± ۰٫۵۴) ثبت کرده است. تأکید صریح این پژوهش بر آن است که دقت پیش‌بینی نقطه‌ای صرفاً مؤلفه‌ای واسطه‌ای است، نه هدف غایی بهینه‌سازی چارچوب </w:t>
+        <w:t xml:space="preserve"> معادل ۴٫۴۸ ± ۰٫۴۲ دست یافته و عملکرد بهتری نسبت به گراف ایستا (۵٫۹۸ ± ۰٫۵۴) ثبت کرده است. تأکید صریح این پژوهش بر آن است که دقت پیش‌بینی نقطه‌ای صرفاً مؤلفه‌ای واسطه‌ای است، نه هدف غایی بهینه‌سازی چارچوب </w:t>
       </w:r>
       <w:r>
         <w:rPr>
@@ -6966,26 +6966,26 @@
           <w:rtl/>
           <w:szCs w:val="18"/>
         </w:rPr>
-        <w:t>جدول (</w:t>
-      </w:r>
-      <w:r>
-        <w:rPr>
-          <w:rFonts w:ascii="Times New Roman" w:hAnsi="Times New Roman" w:cs="Times New Roman"/>
-          <w:bidi w:val="0"/>
-          <w:sz w:val="17"/>
-          <w:rtl w:val="0"/>
-          <w:szCs w:val="17"/>
-        </w:rPr>
-        <w:t>‎2‎</w:t>
-      </w:r>
-      <w:r>
-        <w:rPr>
-          <w:rFonts w:hint="cs" w:ascii="B Mitra" w:hAnsi="B Mitra" w:cs="B Mitra"/>
-          <w:sz w:val="18"/>
-          <w:rtl/>
-          <w:szCs w:val="18"/>
-        </w:rPr>
-        <w:t>) کارایی استراتژی‌ها را در رتبه‌بندی ۳۵ پذیرنده دارای بالاترین اولویت کمپین (۱۰٪ سبد کل) طی ۱۰ سید تصادفی گزارش می‌نماید.</w:t>
+        <w:t xml:space="preserve">جدول </w:t>
+      </w:r>
+      <w:r>
+        <w:rPr>
+          <w:rFonts w:ascii="Times New Roman" w:hAnsi="Times New Roman" w:cs="Times New Roman"/>
+          <w:bidi w:val="0"/>
+          <w:sz w:val="17"/>
+          <w:rtl w:val="0"/>
+          <w:szCs w:val="17"/>
+        </w:rPr>
+        <w:t>‎(2)‎</w:t>
+      </w:r>
+      <w:r>
+        <w:rPr>
+          <w:rFonts w:hint="cs" w:ascii="B Mitra" w:hAnsi="B Mitra" w:cs="B Mitra"/>
+          <w:sz w:val="18"/>
+          <w:rtl/>
+          <w:szCs w:val="18"/>
+        </w:rPr>
+        <w:t xml:space="preserve"> کارایی استراتژی‌ها را در رتبه‌بندی ۳۵ پذیرنده دارای بالاترین اولویت کمپین (۱۰٪ سبد کل) طی ۱۰ سید تصادفی گزارش می‌نماید.</w:t>
       </w:r>
     </w:p>
     <w:p>
@@ -7001,26 +7001,26 @@
           <w:rtl/>
           <w:szCs w:val="17"/>
         </w:rPr>
-        <w:t>جدول (</w:t>
-      </w:r>
-      <w:r>
-        <w:rPr>
-          <w:rFonts w:ascii="Times New Roman" w:hAnsi="Times New Roman" w:cs="Times New Roman"/>
-          <w:bidi w:val="0"/>
-          <w:sz w:val="17"/>
-          <w:rtl w:val="0"/>
-          <w:szCs w:val="17"/>
-        </w:rPr>
-        <w:t>‎2‎</w:t>
-      </w:r>
-      <w:r>
-        <w:rPr>
-          <w:rFonts w:hint="cs" w:ascii="B Mitra" w:hAnsi="B Mitra" w:cs="B Mitra"/>
-          <w:sz w:val="17"/>
-          <w:rtl/>
-          <w:szCs w:val="17"/>
-        </w:rPr>
-        <w:t>) : بنچ‌مارک رتبه‌بندی و اولویت‌بندی پذیرندگان کاندیدای کمپین (</w:t>
+        <w:t xml:space="preserve">جدول </w:t>
+      </w:r>
+      <w:r>
+        <w:rPr>
+          <w:rFonts w:ascii="Times New Roman" w:hAnsi="Times New Roman" w:cs="Times New Roman"/>
+          <w:bidi w:val="0"/>
+          <w:sz w:val="17"/>
+          <w:rtl w:val="0"/>
+          <w:szCs w:val="17"/>
+        </w:rPr>
+        <w:t>‎(2)‎</w:t>
+      </w:r>
+      <w:r>
+        <w:rPr>
+          <w:rFonts w:hint="cs" w:ascii="B Mitra" w:hAnsi="B Mitra" w:cs="B Mitra"/>
+          <w:sz w:val="17"/>
+          <w:rtl/>
+          <w:szCs w:val="17"/>
+        </w:rPr>
+        <w:t xml:space="preserve"> : بنچ‌مارک رتبه‌بندی و اولویت‌بندی پذیرندگان کاندیدای کمپین (</w:t>
       </w:r>
       <w:r>
         <w:rPr>
@@ -7320,7 +7320,7 @@
                 <w:rtl/>
                 <w:szCs w:val="10"/>
               </w:rPr>
-              <w:t>۰٫۱۹۷ ± ۰٫۰۵۳</w:t>
+              <w:t>۰٫۱۹۷ ± ۰٫۰۵۳</w:t>
             </w:r>
           </w:p>
         </w:tc>
@@ -7348,7 +7348,7 @@
                 <w:rtl/>
                 <w:szCs w:val="10"/>
               </w:rPr>
-              <w:t>۰٫۱۳۳ ± ۰٫۰۳۶</w:t>
+              <w:t>۰٫۱۳۳ ± ۰٫۰۳۶</w:t>
             </w:r>
           </w:p>
         </w:tc>
@@ -7376,7 +7376,7 @@
                 <w:rtl/>
                 <w:szCs w:val="10"/>
               </w:rPr>
-              <w:t>۰٫۱۹۴ ± ۰٫۰۵۲</w:t>
+              <w:t>۰٫۱۹۴ ± ۰٫۰۵۲</w:t>
             </w:r>
           </w:p>
         </w:tc>
@@ -7404,7 +7404,7 @@
                 <w:rtl/>
                 <w:szCs w:val="10"/>
               </w:rPr>
-              <w:t>۰٫۲۰۳ ± ۰٫۰۵۶</w:t>
+              <w:t>۰٫۲۰۳ ± ۰٫۰۵۶</w:t>
             </w:r>
           </w:p>
         </w:tc>
@@ -7432,7 +7432,7 @@
                 <w:rtl/>
                 <w:szCs w:val="10"/>
               </w:rPr>
-              <w:t>۰٫۰۵۹ ± ۰٫۰۳۰</w:t>
+              <w:t>۰٫۰۵۹ ± ۰٫۰۳۰</w:t>
             </w:r>
           </w:p>
         </w:tc>
@@ -7493,7 +7493,7 @@
                 <w:rtl/>
                 <w:szCs w:val="10"/>
               </w:rPr>
-              <w:t>۰٫۲۲۰ ± ۰٫۰۵۴</w:t>
+              <w:t>۰٫۲۲۰ ± ۰٫۰۵۴</w:t>
             </w:r>
           </w:p>
         </w:tc>
@@ -7521,7 +7521,7 @@
                 <w:rtl/>
                 <w:szCs w:val="10"/>
               </w:rPr>
-              <w:t>۰٫۱۴۸ ± ۰٫۰۳۶</w:t>
+              <w:t>۰٫۱۴۸ ± ۰٫۰۳۶</w:t>
             </w:r>
           </w:p>
         </w:tc>
@@ -7549,7 +7549,7 @@
                 <w:rtl/>
                 <w:szCs w:val="10"/>
               </w:rPr>
-              <w:t>۰٫۲۰۲ ± ۰٫۰۳۲</w:t>
+              <w:t>۰٫۲۰۲ ± ۰٫۰۳۲</w:t>
             </w:r>
           </w:p>
         </w:tc>
@@ -7577,7 +7577,7 @@
                 <w:rtl/>
                 <w:szCs w:val="10"/>
               </w:rPr>
-              <w:t>۰٫۲۴۵ ± ۰٫۰۷۴</w:t>
+              <w:t>۰٫۲۴۵ ± ۰٫۰۷۴</w:t>
             </w:r>
           </w:p>
         </w:tc>
@@ -7605,7 +7605,7 @@
                 <w:rtl/>
                 <w:szCs w:val="10"/>
               </w:rPr>
-              <w:t>۰٫۰۸۲ ± ۰٫۰۳۹</w:t>
+              <w:t>۰٫۰۸۲ ± ۰٫۰۳۹</w:t>
             </w:r>
           </w:p>
         </w:tc>
@@ -7676,7 +7676,7 @@
                 <w:rtl/>
                 <w:szCs w:val="10"/>
               </w:rPr>
-              <w:t>۰٫۲۱۴ ± ۰٫۰۶۴</w:t>
+              <w:t>۰٫۲۱۴ ± ۰٫۰۶۴</w:t>
             </w:r>
           </w:p>
         </w:tc>
@@ -7704,7 +7704,7 @@
                 <w:rtl/>
                 <w:szCs w:val="10"/>
               </w:rPr>
-              <w:t>۰٫۱۴۴ ± ۰٫۰۴۳</w:t>
+              <w:t>۰٫۱۴۴ ± ۰٫۰۴۳</w:t>
             </w:r>
           </w:p>
         </w:tc>
@@ -7732,7 +7732,7 @@
                 <w:rtl/>
                 <w:szCs w:val="10"/>
               </w:rPr>
-              <w:t>۰٫۱۸۸ ± ۰٫۰۴۲</w:t>
+              <w:t>۰٫۱۸۸ ± ۰٫۰۴۲</w:t>
             </w:r>
           </w:p>
         </w:tc>
@@ -7760,7 +7760,7 @@
                 <w:rtl/>
                 <w:szCs w:val="10"/>
               </w:rPr>
-              <w:t>۰٫۲۳۷ ± ۰٫۰۸۳</w:t>
+              <w:t>۰٫۲۳۷ ± ۰٫۰۸۳</w:t>
             </w:r>
           </w:p>
         </w:tc>
@@ -7788,7 +7788,7 @@
                 <w:rtl/>
                 <w:szCs w:val="10"/>
               </w:rPr>
-              <w:t>۰٫۰۸۲ ± ۰٫۰۴۹</w:t>
+              <w:t>۰٫۰۸۲ ± ۰٫۰۴۹</w:t>
             </w:r>
           </w:p>
         </w:tc>
@@ -7859,7 +7859,7 @@
                 <w:rtl/>
                 <w:szCs w:val="10"/>
               </w:rPr>
-              <w:t>۰٫۲۳۱ ± ۰٫۰۵۳</w:t>
+              <w:t>۰٫۲۳۱ ± ۰٫۰۵۳</w:t>
             </w:r>
           </w:p>
         </w:tc>
@@ -7887,7 +7887,7 @@
                 <w:rtl/>
                 <w:szCs w:val="10"/>
               </w:rPr>
-              <w:t>۰٫۱۵۶ ± ۰٫۰۳۶</w:t>
+              <w:t>۰٫۱۵۶ ± ۰٫۰۳۶</w:t>
             </w:r>
           </w:p>
         </w:tc>
@@ -7915,7 +7915,7 @@
                 <w:rtl/>
                 <w:szCs w:val="10"/>
               </w:rPr>
-              <w:t>۰٫۲۲۱ ± ۰٫۰۳۵</w:t>
+              <w:t>۰٫۲۲۱ ± ۰٫۰۳۵</w:t>
             </w:r>
           </w:p>
         </w:tc>
@@ -7943,7 +7943,7 @@
                 <w:rtl/>
                 <w:szCs w:val="10"/>
               </w:rPr>
-              <w:t>۰٫۲۴۱ ± ۰٫۰۷۱</w:t>
+              <w:t>۰٫۲۴۱ ± ۰٫۰۷۱</w:t>
             </w:r>
           </w:p>
         </w:tc>
@@ -7971,7 +7971,7 @@
                 <w:rtl/>
                 <w:szCs w:val="10"/>
               </w:rPr>
-              <w:t>۰٫۰۸۰ ± ۰٫۰۳۹</w:t>
+              <w:t>۰٫۰۸۰ ± ۰٫۰۳۹</w:t>
             </w:r>
           </w:p>
         </w:tc>
@@ -8032,7 +8032,7 @@
                 <w:rtl/>
                 <w:szCs w:val="10"/>
               </w:rPr>
-              <w:t>۰٫۲۸۶ ± ۰٫۰۷۱</w:t>
+              <w:t>۰٫۲۸۶ ± ۰٫۰۷۱</w:t>
             </w:r>
           </w:p>
         </w:tc>
@@ -8060,7 +8060,7 @@
                 <w:rtl/>
                 <w:szCs w:val="10"/>
               </w:rPr>
-              <w:t>۰٫۱۹۲ ± ۰٫۰۴۸</w:t>
+              <w:t>۰٫۱۹۲ ± ۰٫۰۴۸</w:t>
             </w:r>
           </w:p>
         </w:tc>
@@ -8088,7 +8088,7 @@
                 <w:rtl/>
                 <w:szCs w:val="10"/>
               </w:rPr>
-              <w:t>۰٫۲۸۷ ± ۰٫۰۵۶</w:t>
+              <w:t>۰٫۲۸۷ ± ۰٫۰۵۶</w:t>
             </w:r>
           </w:p>
         </w:tc>
@@ -8116,7 +8116,7 @@
                 <w:rtl/>
                 <w:szCs w:val="10"/>
               </w:rPr>
-              <w:t>۰٫۳۱۰ ± ۰٫۰۷۹</w:t>
+              <w:t>۰٫۳۱۰ ± ۰٫۰۷۹</w:t>
             </w:r>
           </w:p>
         </w:tc>
@@ -8144,7 +8144,7 @@
                 <w:rtl/>
                 <w:szCs w:val="10"/>
               </w:rPr>
-              <w:t>۰٫۱۲۴ ± ۰٫۰۵۵</w:t>
+              <w:t>۰٫۱۲۴ ± ۰٫۰۵۵</w:t>
             </w:r>
           </w:p>
         </w:tc>
@@ -8215,7 +8215,7 @@
                 <w:rtl/>
                 <w:szCs w:val="10"/>
               </w:rPr>
-              <w:t>۰٫۳۵۷ ± ۰٫۰۸۳</w:t>
+              <w:t>۰٫۳۵۷ ± ۰٫۰۸۳</w:t>
             </w:r>
           </w:p>
         </w:tc>
@@ -8243,7 +8243,7 @@
                 <w:rtl/>
                 <w:szCs w:val="10"/>
               </w:rPr>
-              <w:t>۰٫۲۴۰ ± ۰٫۰۵۶</w:t>
+              <w:t>۰٫۲۴۰ ± ۰٫۰۵۶</w:t>
             </w:r>
           </w:p>
         </w:tc>
@@ -8271,7 +8271,7 @@
                 <w:rtl/>
                 <w:szCs w:val="10"/>
               </w:rPr>
-              <w:t>۰٫۳۲۳ ± ۰٫۰۷۵</w:t>
+              <w:t>۰٫۳۲۳ ± ۰٫۰۷۵</w:t>
             </w:r>
           </w:p>
         </w:tc>
@@ -8299,7 +8299,7 @@
                 <w:rtl/>
                 <w:szCs w:val="10"/>
               </w:rPr>
-              <w:t>۰٫۳۸۳ ± ۰٫۰۸۵</w:t>
+              <w:t>۰٫۳۸۳ ± ۰٫۰۸۵</w:t>
             </w:r>
           </w:p>
         </w:tc>
@@ -8327,7 +8327,7 @@
                 <w:rtl/>
                 <w:szCs w:val="10"/>
               </w:rPr>
-              <w:t>۰٫۱۷۱ ± ۰٫۰۵۸</w:t>
+              <w:t>۰٫۱۷۱ ± ۰٫۰۵۸</w:t>
             </w:r>
           </w:p>
         </w:tc>
@@ -8417,7 +8417,7 @@
                 <w:rtl/>
                 <w:szCs w:val="10"/>
               </w:rPr>
-              <w:t>۰٫۳۷۴ ± ۰٫۱۱۷</w:t>
+              <w:t>۰٫۳۷۴ ± ۰٫۱۱۷</w:t>
             </w:r>
           </w:p>
         </w:tc>
@@ -8445,7 +8445,7 @@
                 <w:rtl/>
                 <w:szCs w:val="10"/>
               </w:rPr>
-              <w:t>۰٫۲۵۲ ± ۰٫۰۷۹</w:t>
+              <w:t>۰٫۲۵۲ ± ۰٫۰۷۹</w:t>
             </w:r>
           </w:p>
         </w:tc>
@@ -8473,7 +8473,7 @@
                 <w:rtl/>
                 <w:szCs w:val="10"/>
               </w:rPr>
-              <w:t>۰٫۳۴۲ ± ۰٫۰۶۹</w:t>
+              <w:t>۰٫۳۴۲ ± ۰٫۰۶۹</w:t>
             </w:r>
           </w:p>
         </w:tc>
@@ -8501,7 +8501,7 @@
                 <w:rtl/>
                 <w:szCs w:val="10"/>
               </w:rPr>
-              <w:t>۰٫۳۹۶ ± ۰٫۱۰۲</w:t>
+              <w:t>۰٫۳۹۶ ± ۰٫۱۰۲</w:t>
             </w:r>
           </w:p>
         </w:tc>
@@ -8529,7 +8529,7 @@
                 <w:rtl/>
                 <w:szCs w:val="10"/>
               </w:rPr>
-              <w:t>۰٫۱۸۴ ± ۰٫۰۸۳</w:t>
+              <w:t>۰٫۱۸۴ ± ۰٫۰۸۳</w:t>
             </w:r>
           </w:p>
         </w:tc>
@@ -8608,7 +8608,7 @@
                 <w:rtl/>
                 <w:szCs w:val="10"/>
               </w:rPr>
-              <w:t>۰٫۳۶۶ ± ۰٫۱۲۰</w:t>
+              <w:t>۰٫۳۶۶ ± ۰٫۱۲۰</w:t>
             </w:r>
           </w:p>
         </w:tc>
@@ -8639,7 +8639,7 @@
                 <w:rtl/>
                 <w:szCs w:val="10"/>
               </w:rPr>
-              <w:t>۰٫۲۴۶ ± ۰٫۰۸۱</w:t>
+              <w:t>۰٫۲۴۶ ± ۰٫۰۸۱</w:t>
             </w:r>
           </w:p>
         </w:tc>
@@ -8670,7 +8670,7 @@
                 <w:rtl/>
                 <w:szCs w:val="10"/>
               </w:rPr>
-              <w:t>۰٫۳۴۲ ± ۰٫۰۷۷</w:t>
+              <w:t>۰٫۳۴۲ ± ۰٫۰۷۷</w:t>
             </w:r>
           </w:p>
         </w:tc>
@@ -8701,7 +8701,7 @@
                 <w:rtl/>
                 <w:szCs w:val="10"/>
               </w:rPr>
-              <w:t>۰٫۳۸۲ ± ۰٫۱۱۶</w:t>
+              <w:t>۰٫۳۸۲ ± ۰٫۱۱۶</w:t>
             </w:r>
           </w:p>
         </w:tc>
@@ -8732,7 +8732,7 @@
                 <w:rtl/>
                 <w:szCs w:val="10"/>
               </w:rPr>
-              <w:t>۰٫۱۸۰ ± ۰٫۰۹۲</w:t>
+              <w:t>۰٫۱۸۰ ± ۰٫۰۹۲</w:t>
             </w:r>
           </w:p>
         </w:tc>
@@ -8793,26 +8793,26 @@
           <w:rtl/>
           <w:szCs w:val="17"/>
         </w:rPr>
-        <w:t>شکل (</w:t>
-      </w:r>
-      <w:r>
-        <w:rPr>
-          <w:rFonts w:ascii="Times New Roman" w:hAnsi="Times New Roman" w:cs="Times New Roman"/>
-          <w:bidi w:val="0"/>
-          <w:sz w:val="17"/>
-          <w:rtl w:val="0"/>
-          <w:szCs w:val="17"/>
-        </w:rPr>
-        <w:t>‎4‎</w:t>
-      </w:r>
-      <w:r>
-        <w:rPr>
-          <w:rFonts w:hint="cs" w:ascii="B Mitra" w:hAnsi="B Mitra" w:cs="B Mitra"/>
-          <w:sz w:val="17"/>
-          <w:rtl/>
-          <w:szCs w:val="17"/>
-        </w:rPr>
-        <w:t>) : مقایسه کمی مدل‌ها در (الف) دقت پیش‌بینی و (ب) کیفیت اولویت‌بندی کمپین در ۱۰ سید تصادفی</w:t>
+        <w:t xml:space="preserve">شکل </w:t>
+      </w:r>
+      <w:r>
+        <w:rPr>
+          <w:rFonts w:ascii="Times New Roman" w:hAnsi="Times New Roman" w:cs="Times New Roman"/>
+          <w:bidi w:val="0"/>
+          <w:sz w:val="17"/>
+          <w:rtl w:val="0"/>
+          <w:szCs w:val="17"/>
+        </w:rPr>
+        <w:t>‎(4)‎</w:t>
+      </w:r>
+      <w:r>
+        <w:rPr>
+          <w:rFonts w:hint="cs" w:ascii="B Mitra" w:hAnsi="B Mitra" w:cs="B Mitra"/>
+          <w:sz w:val="17"/>
+          <w:rtl/>
+          <w:szCs w:val="17"/>
+        </w:rPr>
+        <w:t xml:space="preserve"> : مقایسه کمی مدل‌ها در (الف) دقت پیش‌بینی و (ب) کیفیت اولویت‌بندی کمپین در ۱۰ سید تصادفی</w:t>
       </w:r>
     </w:p>
     <w:p>
@@ -8827,26 +8827,26 @@
           <w:rtl/>
           <w:szCs w:val="18"/>
         </w:rPr>
-        <w:t>با توجه به شیوع فرصت‌های واقعی در سطح ۵۲ پذیرنده از ۳۵۰ پذیرنده (شانس تصادفی کل سبد معادل ۰٫۱۴۸۶ یا ۱۴٫۹٪، و شانس تصادفی جامعه کاندیداها معادل ۱۷٫۴٪)، نتایج جدول (</w:t>
-      </w:r>
-      <w:r>
-        <w:rPr>
-          <w:rFonts w:ascii="Times New Roman" w:hAnsi="Times New Roman" w:cs="Times New Roman"/>
-          <w:bidi w:val="0"/>
-          <w:sz w:val="17"/>
-          <w:rtl w:val="0"/>
-          <w:szCs w:val="17"/>
-        </w:rPr>
-        <w:t>‎2‎</w:t>
-      </w:r>
-      <w:r>
-        <w:rPr>
-          <w:rFonts w:hint="cs" w:ascii="B Mitra" w:hAnsi="B Mitra" w:cs="B Mitra"/>
-          <w:sz w:val="18"/>
-          <w:rtl/>
-          <w:szCs w:val="18"/>
-        </w:rPr>
-        <w:t xml:space="preserve">) نشان می‌دهد که مدل پیشنهادی </w:t>
+        <w:t xml:space="preserve">با توجه به شیوع فرصت‌های واقعی در سطح ۵۲ پذیرنده از ۳۵۰ پذیرنده (شانس تصادفی کل سبد معادل ۰٫۱۴۸۶ یا ۱۴٫۹٪، و شانس تصادفی جامعه کاندیداها معادل ۱۷٫۴٪)، نتایج جدول </w:t>
+      </w:r>
+      <w:r>
+        <w:rPr>
+          <w:rFonts w:ascii="Times New Roman" w:hAnsi="Times New Roman" w:cs="Times New Roman"/>
+          <w:bidi w:val="0"/>
+          <w:sz w:val="17"/>
+          <w:rtl w:val="0"/>
+          <w:szCs w:val="17"/>
+        </w:rPr>
+        <w:t>‎(2)‎</w:t>
+      </w:r>
+      <w:r>
+        <w:rPr>
+          <w:rFonts w:hint="cs" w:ascii="B Mitra" w:hAnsi="B Mitra" w:cs="B Mitra"/>
+          <w:sz w:val="18"/>
+          <w:rtl/>
+          <w:szCs w:val="18"/>
+        </w:rPr>
+        <w:t xml:space="preserve"> نشان می‌دهد که مدل پیشنهادی </w:t>
       </w:r>
       <w:r>
         <w:rPr>
@@ -8884,7 +8884,7 @@
           <w:rtl/>
           <w:szCs w:val="18"/>
         </w:rPr>
-        <w:t xml:space="preserve"> معادل ۰٫۳۶۶ ± ۰٫۱۲۰، </w:t>
+        <w:t xml:space="preserve"> معادل ۰٫۳۶۶ ± ۰٫۱۲۰، </w:t>
       </w:r>
       <w:r>
         <w:rPr>
@@ -8903,7 +8903,7 @@
           <w:rtl/>
           <w:szCs w:val="18"/>
         </w:rPr>
-        <w:t xml:space="preserve"> معادل ۰٫۲۴۶ ± ۰٫۰۸۱ (با سقف نظری ۰٫۶۷۳ برای ۳۵ جایگاه از ۵۲ هدف: ۳۵/۵۲ = ۰٫۶۷۳)، </w:t>
+        <w:t xml:space="preserve"> معادل ۰٫۲۴۶ ± ۰٫۰۸۱ (با سقف نظری ۰٫۶۷۳ برای ۳۵ جایگاه از ۵۲ هدف: ۳۵/۵۲ = ۰٫۶۷۳)، </w:t>
       </w:r>
       <w:r>
         <w:rPr>
@@ -8922,7 +8922,7 @@
           <w:rtl/>
           <w:szCs w:val="18"/>
         </w:rPr>
-        <w:t xml:space="preserve"> معادل ۰٫۳۸۲ ± ۰٫۱۱۶ و </w:t>
+        <w:t xml:space="preserve"> معادل ۰٫۳۸۲ ± ۰٫۱۱۶ و </w:t>
       </w:r>
       <w:r>
         <w:rPr>
@@ -8941,7 +8941,7 @@
           <w:rtl/>
           <w:szCs w:val="18"/>
         </w:rPr>
-        <w:t xml:space="preserve"> معادل ۰٫۳۴۲ ± ۰٫۰۷۷، به ضریب برتری ۲٫۴۶ برابری نسبت به انتخاب تصادفی کل سبد (و ۲٫۱۰ برابری نسبت به خط‌مبنای تصادفی درون‌جامعه کاندیداها) دست می‌یابد.</w:t>
+        <w:t xml:space="preserve"> معادل ۰٫۳۴۲ ± ۰٫۰۷۷، به ضریب برتری ۲٫۴۶ برابری نسبت به انتخاب تصادفی کل سبد (و ۲٫۱۰ برابری نسبت به خط‌مبنای تصادفی درون‌جامعه کاندیداها) دست می‌یابد.</w:t>
       </w:r>
     </w:p>
     <w:p>
@@ -8981,26 +8981,26 @@
           <w:rtl/>
           <w:szCs w:val="18"/>
         </w:rPr>
-        <w:t>جدول (</w:t>
-      </w:r>
-      <w:r>
-        <w:rPr>
-          <w:rFonts w:ascii="Times New Roman" w:hAnsi="Times New Roman" w:cs="Times New Roman"/>
-          <w:bidi w:val="0"/>
-          <w:sz w:val="17"/>
-          <w:rtl w:val="0"/>
-          <w:szCs w:val="17"/>
-        </w:rPr>
-        <w:t>‎3‎</w:t>
-      </w:r>
-      <w:r>
-        <w:rPr>
-          <w:rFonts w:hint="cs" w:ascii="B Mitra" w:hAnsi="B Mitra" w:cs="B Mitra"/>
-          <w:sz w:val="18"/>
-          <w:rtl/>
-          <w:szCs w:val="18"/>
-        </w:rPr>
-        <w:t xml:space="preserve">) کارایی مدل را در سقف‌های مختلف بودجه کمپین </w:t>
+        <w:t xml:space="preserve">جدول </w:t>
+      </w:r>
+      <w:r>
+        <w:rPr>
+          <w:rFonts w:ascii="Times New Roman" w:hAnsi="Times New Roman" w:cs="Times New Roman"/>
+          <w:bidi w:val="0"/>
+          <w:sz w:val="17"/>
+          <w:rtl w:val="0"/>
+          <w:szCs w:val="17"/>
+        </w:rPr>
+        <w:t>‎(3)‎</w:t>
+      </w:r>
+      <w:r>
+        <w:rPr>
+          <w:rFonts w:hint="cs" w:ascii="B Mitra" w:hAnsi="B Mitra" w:cs="B Mitra"/>
+          <w:sz w:val="18"/>
+          <w:rtl/>
+          <w:szCs w:val="18"/>
+        </w:rPr>
+        <w:t xml:space="preserve"> کارایی مدل را در سقف‌های مختلف بودجه کمپین </w:t>
       </w:r>
       <w:r>
         <w:rPr>
@@ -9035,26 +9035,26 @@
           <w:rtl/>
           <w:szCs w:val="17"/>
         </w:rPr>
-        <w:t>جدول (</w:t>
-      </w:r>
-      <w:r>
-        <w:rPr>
-          <w:rFonts w:ascii="Times New Roman" w:hAnsi="Times New Roman" w:cs="Times New Roman"/>
-          <w:bidi w:val="0"/>
-          <w:sz w:val="17"/>
-          <w:rtl w:val="0"/>
-          <w:szCs w:val="17"/>
-        </w:rPr>
-        <w:t>‎3‎</w:t>
-      </w:r>
-      <w:r>
-        <w:rPr>
-          <w:rFonts w:hint="cs" w:ascii="B Mitra" w:hAnsi="B Mitra" w:cs="B Mitra"/>
-          <w:sz w:val="17"/>
-          <w:rtl/>
-          <w:szCs w:val="17"/>
-        </w:rPr>
-        <w:t>) : مقایسه کارایی اولویت‌بندی در بودجه‌های مختلف و آزمون‌های آماری (۱۰ سید تصادفی)</w:t>
+        <w:t xml:space="preserve">جدول </w:t>
+      </w:r>
+      <w:r>
+        <w:rPr>
+          <w:rFonts w:ascii="Times New Roman" w:hAnsi="Times New Roman" w:cs="Times New Roman"/>
+          <w:bidi w:val="0"/>
+          <w:sz w:val="17"/>
+          <w:rtl w:val="0"/>
+          <w:szCs w:val="17"/>
+        </w:rPr>
+        <w:t>‎(3)‎</w:t>
+      </w:r>
+      <w:r>
+        <w:rPr>
+          <w:rFonts w:hint="cs" w:ascii="B Mitra" w:hAnsi="B Mitra" w:cs="B Mitra"/>
+          <w:sz w:val="17"/>
+          <w:rtl/>
+          <w:szCs w:val="17"/>
+        </w:rPr>
+        <w:t xml:space="preserve"> : مقایسه کارایی اولویت‌بندی در بودجه‌های مختلف و آزمون‌های آماری (۱۰ سید تصادفی)</w:t>
       </w:r>
     </w:p>
     <w:tbl>
@@ -9328,7 +9328,7 @@
                 <w:rtl/>
                 <w:szCs w:val="10"/>
               </w:rPr>
-              <w:t>۰٫۲۱۰ ± ۰٫۱۰۴</w:t>
+              <w:t>۰٫۲۱۰ ± ۰٫۱۰۴</w:t>
             </w:r>
           </w:p>
         </w:tc>
@@ -9356,7 +9356,7 @@
                 <w:rtl/>
                 <w:szCs w:val="10"/>
               </w:rPr>
-              <w:t>۰٫۰۴۰ ± ۰٫۰۲۰</w:t>
+              <w:t>۰٫۰۴۰ ± ۰٫۰۲۰</w:t>
             </w:r>
           </w:p>
         </w:tc>
@@ -9384,7 +9384,7 @@
                 <w:rtl/>
                 <w:szCs w:val="10"/>
               </w:rPr>
-              <w:t>۰٫۲۱۷ ± ۰٫۱۴۵</w:t>
+              <w:t>۰٫۲۱۷ ± ۰٫۱۴۵</w:t>
             </w:r>
           </w:p>
         </w:tc>
@@ -9483,7 +9483,7 @@
                 <w:rtl/>
                 <w:szCs w:val="10"/>
               </w:rPr>
-              <w:t>۰٫۲۷۰ ± ۰٫۱۶۸</w:t>
+              <w:t>۰٫۲۷۰ ± ۰٫۱۶۸</w:t>
             </w:r>
           </w:p>
         </w:tc>
@@ -9511,7 +9511,7 @@
                 <w:rtl/>
                 <w:szCs w:val="10"/>
               </w:rPr>
-              <w:t>۰٫۰۵۲ ± ۰٫۰۳۲</w:t>
+              <w:t>۰٫۰۵۲ ± ۰٫۰۳۲</w:t>
             </w:r>
           </w:p>
         </w:tc>
@@ -9539,7 +9539,7 @@
                 <w:rtl/>
                 <w:szCs w:val="10"/>
               </w:rPr>
-              <w:t>۰٫۲۸۵ ± ۰٫۱۸۳</w:t>
+              <w:t>۰٫۲۸۵ ± ۰٫۱۸۳</w:t>
             </w:r>
           </w:p>
         </w:tc>
@@ -9628,7 +9628,7 @@
                 <w:rtl/>
                 <w:szCs w:val="10"/>
               </w:rPr>
-              <w:t>۰٫۳۷۰ ± ۰٫۱۱۰</w:t>
+              <w:t>۰٫۳۷۰ ± ۰٫۱۱۰</w:t>
             </w:r>
           </w:p>
         </w:tc>
@@ -9656,7 +9656,7 @@
                 <w:rtl/>
                 <w:szCs w:val="10"/>
               </w:rPr>
-              <w:t>۰٫۰۷۱ ± ۰٫۰۲۱</w:t>
+              <w:t>۰٫۰۷۱ ± ۰٫۰۲۱</w:t>
             </w:r>
           </w:p>
         </w:tc>
@@ -9684,7 +9684,7 @@
                 <w:rtl/>
                 <w:szCs w:val="10"/>
               </w:rPr>
-              <w:t>۰٫۳۷۶ ± ۰٫۱۲۷</w:t>
+              <w:t>۰٫۳۷۶ ± ۰٫۱۲۷</w:t>
             </w:r>
           </w:p>
         </w:tc>
@@ -9783,7 +9783,7 @@
                 <w:rtl/>
                 <w:szCs w:val="10"/>
               </w:rPr>
-              <w:t>۰٫۴۳۰ ± ۰٫۱۲۷</w:t>
+              <w:t>۰٫۴۳۰ ± ۰٫۱۲۷</w:t>
             </w:r>
           </w:p>
         </w:tc>
@@ -9811,7 +9811,7 @@
                 <w:rtl/>
                 <w:szCs w:val="10"/>
               </w:rPr>
-              <w:t>۰٫۰۸۳ ± ۰٫۰۲۴</w:t>
+              <w:t>۰٫۰۸۳ ± ۰٫۰۲۴</w:t>
             </w:r>
           </w:p>
         </w:tc>
@@ -9839,7 +9839,7 @@
                 <w:rtl/>
                 <w:szCs w:val="10"/>
               </w:rPr>
-              <w:t>۰٫۴۵۳ ± ۰٫۱۵۴</w:t>
+              <w:t>۰٫۴۵۳ ± ۰٫۱۵۴</w:t>
             </w:r>
           </w:p>
         </w:tc>
@@ -9938,7 +9938,7 @@
                 <w:rtl/>
                 <w:szCs w:val="10"/>
               </w:rPr>
-              <w:t>۰٫۴۰۰ ± ۰٫۰۸۹</w:t>
+              <w:t>۰٫۴۰۰ ± ۰٫۰۸۹</w:t>
             </w:r>
           </w:p>
         </w:tc>
@@ -9966,7 +9966,7 @@
                 <w:rtl/>
                 <w:szCs w:val="10"/>
               </w:rPr>
-              <w:t>۰٫۰۷۷ ± ۰٫۰۱۷</w:t>
+              <w:t>۰٫۰۷۷ ± ۰٫۰۱۷</w:t>
             </w:r>
           </w:p>
         </w:tc>
@@ -9994,7 +9994,7 @@
                 <w:rtl/>
                 <w:szCs w:val="10"/>
               </w:rPr>
-              <w:t>۰٫۴۱۰ ± ۰٫۱۰۱</w:t>
+              <w:t>۰٫۴۱۰ ± ۰٫۱۰۱</w:t>
             </w:r>
           </w:p>
         </w:tc>
@@ -10083,7 +10083,7 @@
                 <w:rtl/>
                 <w:szCs w:val="10"/>
               </w:rPr>
-              <w:t>۰٫۲۰۰ ± ۰٫۰۷۴</w:t>
+              <w:t>۰٫۲۰۰ ± ۰٫۰۷۴</w:t>
             </w:r>
           </w:p>
         </w:tc>
@@ -10111,7 +10111,7 @@
                 <w:rtl/>
                 <w:szCs w:val="10"/>
               </w:rPr>
-              <w:t>۰٫۰۷۷ ± ۰٫۰۲۹</w:t>
+              <w:t>۰٫۰۷۷ ± ۰٫۰۲۹</w:t>
             </w:r>
           </w:p>
         </w:tc>
@@ -10139,7 +10139,7 @@
                 <w:rtl/>
                 <w:szCs w:val="10"/>
               </w:rPr>
-              <w:t>۰٫۲۰۷ ± ۰٫۰۹۱</w:t>
+              <w:t>۰٫۲۰۷ ± ۰٫۰۹۱</w:t>
             </w:r>
           </w:p>
         </w:tc>
@@ -10238,7 +10238,7 @@
                 <w:rtl/>
                 <w:szCs w:val="10"/>
               </w:rPr>
-              <w:t>۰٫۲۶۵ ± ۰٫۱۲۵</w:t>
+              <w:t>۰٫۲۶۵ ± ۰٫۱۲۵</w:t>
             </w:r>
           </w:p>
         </w:tc>
@@ -10266,7 +10266,7 @@
                 <w:rtl/>
                 <w:szCs w:val="10"/>
               </w:rPr>
-              <w:t>۰٫۱۰۲ ± ۰٫۰۴۸</w:t>
+              <w:t>۰٫۱۰۲ ± ۰٫۰۴۸</w:t>
             </w:r>
           </w:p>
         </w:tc>
@@ -10294,7 +10294,7 @@
                 <w:rtl/>
                 <w:szCs w:val="10"/>
               </w:rPr>
-              <w:t>۰٫۲۷۵ ± ۰٫۱۲۸</w:t>
+              <w:t>۰٫۲۷۵ ± ۰٫۱۲۸</w:t>
             </w:r>
           </w:p>
         </w:tc>
@@ -10383,7 +10383,7 @@
                 <w:rtl/>
                 <w:szCs w:val="10"/>
               </w:rPr>
-              <w:t>۰٫۳۳۵ ± ۰٫۱۱۰</w:t>
+              <w:t>۰٫۳۳۵ ± ۰٫۱۱۰</w:t>
             </w:r>
           </w:p>
         </w:tc>
@@ -10411,7 +10411,7 @@
                 <w:rtl/>
                 <w:szCs w:val="10"/>
               </w:rPr>
-              <w:t>۰٫۱۲۹ ± ۰٫۰۴۲</w:t>
+              <w:t>۰٫۱۲۹ ± ۰٫۰۴۲</w:t>
             </w:r>
           </w:p>
         </w:tc>
@@ -10439,7 +10439,7 @@
                 <w:rtl/>
                 <w:szCs w:val="10"/>
               </w:rPr>
-              <w:t>۰٫۳۴۹ ± ۰٫۱۰۲</w:t>
+              <w:t>۰٫۳۴۹ ± ۰٫۱۰۲</w:t>
             </w:r>
           </w:p>
         </w:tc>
@@ -10538,7 +10538,7 @@
                 <w:rtl/>
                 <w:szCs w:val="10"/>
               </w:rPr>
-              <w:t>۰٫۳۴۵ ± ۰٫۱۰۴</w:t>
+              <w:t>۰٫۳۴۵ ± ۰٫۱۰۴</w:t>
             </w:r>
           </w:p>
         </w:tc>
@@ -10566,7 +10566,7 @@
                 <w:rtl/>
                 <w:szCs w:val="10"/>
               </w:rPr>
-              <w:t>۰٫۱۳۳ ± ۰٫۰۴۰</w:t>
+              <w:t>۰٫۱۳۳ ± ۰٫۰۴۰</w:t>
             </w:r>
           </w:p>
         </w:tc>
@@ -10594,7 +10594,7 @@
                 <w:rtl/>
                 <w:szCs w:val="10"/>
               </w:rPr>
-              <w:t>۰٫۳۸۵ ± ۰٫۱۱۱</w:t>
+              <w:t>۰٫۳۸۵ ± ۰٫۱۱۱</w:t>
             </w:r>
           </w:p>
         </w:tc>
@@ -10693,7 +10693,7 @@
                 <w:rtl/>
                 <w:szCs w:val="10"/>
               </w:rPr>
-              <w:t>۰٫۴۱۰ ± ۰٫۱۰۹</w:t>
+              <w:t>۰٫۴۱۰ ± ۰٫۱۰۹</w:t>
             </w:r>
           </w:p>
         </w:tc>
@@ -10721,7 +10721,7 @@
                 <w:rtl/>
                 <w:szCs w:val="10"/>
               </w:rPr>
-              <w:t>۰٫۱۵۸ ± ۰٫۰۴۲</w:t>
+              <w:t>۰٫۱۵۸ ± ۰٫۰۴۲</w:t>
             </w:r>
           </w:p>
         </w:tc>
@@ -10749,7 +10749,7 @@
                 <w:rtl/>
                 <w:szCs w:val="10"/>
               </w:rPr>
-              <w:t>۰٫۴۱۴ ± ۰٫۱۰۵</w:t>
+              <w:t>۰٫۴۱۴ ± ۰٫۱۰۵</w:t>
             </w:r>
           </w:p>
         </w:tc>
@@ -10838,7 +10838,7 @@
                 <w:rtl/>
                 <w:szCs w:val="10"/>
               </w:rPr>
-              <w:t>۰٫۱۹۷ ± ۰٫۰۵۰</w:t>
+              <w:t>۰٫۱۹۷ ± ۰٫۰۵۰</w:t>
             </w:r>
           </w:p>
         </w:tc>
@@ -10866,7 +10866,7 @@
                 <w:rtl/>
                 <w:szCs w:val="10"/>
               </w:rPr>
-              <w:t>۰٫۱۳۳ ± ۰٫۰۳۴</w:t>
+              <w:t>۰٫۱۳۳ ± ۰٫۰۳۴</w:t>
             </w:r>
           </w:p>
         </w:tc>
@@ -10894,7 +10894,7 @@
                 <w:rtl/>
                 <w:szCs w:val="10"/>
               </w:rPr>
-              <w:t>۰٫۲۰۳ ± ۰٫۰۵۳</w:t>
+              <w:t>۰٫۲۰۳ ± ۰٫۰۵۳</w:t>
             </w:r>
           </w:p>
         </w:tc>
@@ -10993,7 +10993,7 @@
                 <w:rtl/>
                 <w:szCs w:val="10"/>
               </w:rPr>
-              <w:t>۰٫۲۱۴ ± ۰٫۰۶۰</w:t>
+              <w:t>۰٫۲۱۴ ± ۰٫۰۶۰</w:t>
             </w:r>
           </w:p>
         </w:tc>
@@ -11021,7 +11021,7 @@
                 <w:rtl/>
                 <w:szCs w:val="10"/>
               </w:rPr>
-              <w:t>۰٫۱۴۴ ± ۰٫۰۴۱</w:t>
+              <w:t>۰٫۱۴۴ ± ۰٫۰۴۱</w:t>
             </w:r>
           </w:p>
         </w:tc>
@@ -11049,7 +11049,7 @@
                 <w:rtl/>
                 <w:szCs w:val="10"/>
               </w:rPr>
-              <w:t>۰٫۲۳۷ ± ۰٫۰۷۸</w:t>
+              <w:t>۰٫۲۳۷ ± ۰٫۰۷۸</w:t>
             </w:r>
           </w:p>
         </w:tc>
@@ -11138,7 +11138,7 @@
                 <w:rtl/>
                 <w:szCs w:val="10"/>
               </w:rPr>
-              <w:t>۰٫۲۸۶ ± ۰٫۰۶۸</w:t>
+              <w:t>۰٫۲۸۶ ± ۰٫۰۶۸</w:t>
             </w:r>
           </w:p>
         </w:tc>
@@ -11166,7 +11166,7 @@
                 <w:rtl/>
                 <w:szCs w:val="10"/>
               </w:rPr>
-              <w:t>۰٫۱۹۲ ± ۰٫۰۴۶</w:t>
+              <w:t>۰٫۱۹۲ ± ۰٫۰۴۶</w:t>
             </w:r>
           </w:p>
         </w:tc>
@@ -11194,7 +11194,7 @@
                 <w:rtl/>
                 <w:szCs w:val="10"/>
               </w:rPr>
-              <w:t>۰٫۳۱۰ ± ۰٫۰۷۵</w:t>
+              <w:t>۰٫۳۱۰ ± ۰٫۰۷۵</w:t>
             </w:r>
           </w:p>
         </w:tc>
@@ -11293,7 +11293,7 @@
                 <w:rtl/>
                 <w:szCs w:val="10"/>
               </w:rPr>
-              <w:t>۰٫۳۵۷ ± ۰٫۰۷۹</w:t>
+              <w:t>۰٫۳۵۷ ± ۰٫۰۷۹</w:t>
             </w:r>
           </w:p>
         </w:tc>
@@ -11321,7 +11321,7 @@
                 <w:rtl/>
                 <w:szCs w:val="10"/>
               </w:rPr>
-              <w:t>۰٫۲۴۰ ± ۰٫۰۵۳</w:t>
+              <w:t>۰٫۲۴۰ ± ۰٫۰۵۳</w:t>
             </w:r>
           </w:p>
         </w:tc>
@@ -11349,7 +11349,7 @@
                 <w:rtl/>
                 <w:szCs w:val="10"/>
               </w:rPr>
-              <w:t>۰٫۳۸۳ ± ۰٫۰۸۱</w:t>
+              <w:t>۰٫۳۸۳ ± ۰٫۰۸۱</w:t>
             </w:r>
           </w:p>
         </w:tc>
@@ -11448,7 +11448,7 @@
                 <w:rtl/>
                 <w:szCs w:val="10"/>
               </w:rPr>
-              <w:t>۰٫۳۶۶ ± ۰٫۱۱۴</w:t>
+              <w:t>۰٫۳۶۶ ± ۰٫۱۱۴</w:t>
             </w:r>
           </w:p>
         </w:tc>
@@ -11476,7 +11476,7 @@
                 <w:rtl/>
                 <w:szCs w:val="10"/>
               </w:rPr>
-              <w:t>۰٫۲۴۶ ± ۰٫۰۷۷</w:t>
+              <w:t>۰٫۲۴۶ ± ۰٫۰۷۷</w:t>
             </w:r>
           </w:p>
         </w:tc>
@@ -11504,7 +11504,7 @@
                 <w:rtl/>
                 <w:szCs w:val="10"/>
               </w:rPr>
-              <w:t>۰٫۳۸۲ ± ۰٫۱۱۰</w:t>
+              <w:t>۰٫۳۸۲ ± ۰٫۱۱۰</w:t>
             </w:r>
           </w:p>
         </w:tc>
@@ -11593,7 +11593,7 @@
                 <w:rtl/>
                 <w:szCs w:val="10"/>
               </w:rPr>
-              <w:t>۰٫۱۹۲ ± ۰٫۰۴۸</w:t>
+              <w:t>۰٫۱۹۲ ± ۰٫۰۴۸</w:t>
             </w:r>
           </w:p>
         </w:tc>
@@ -11621,7 +11621,7 @@
                 <w:rtl/>
                 <w:szCs w:val="10"/>
               </w:rPr>
-              <w:t>۰٫۱۸۵ ± ۰٫۰۴۶</w:t>
+              <w:t>۰٫۱۸۵ ± ۰٫۰۴۶</w:t>
             </w:r>
           </w:p>
         </w:tc>
@@ -11649,7 +11649,7 @@
                 <w:rtl/>
                 <w:szCs w:val="10"/>
               </w:rPr>
-              <w:t>۰٫۱۹۸ ± ۰٫۰۴۴</w:t>
+              <w:t>۰٫۱۹۸ ± ۰٫۰۴۴</w:t>
             </w:r>
           </w:p>
         </w:tc>
@@ -11748,7 +11748,7 @@
                 <w:rtl/>
                 <w:szCs w:val="10"/>
               </w:rPr>
-              <w:t>۰٫۱۸۸ ± ۰٫۰۴۶</w:t>
+              <w:t>۰٫۱۸۸ ± ۰٫۰۴۶</w:t>
             </w:r>
           </w:p>
         </w:tc>
@@ -11776,7 +11776,7 @@
                 <w:rtl/>
                 <w:szCs w:val="10"/>
               </w:rPr>
-              <w:t>۰٫۱۸۱ ± ۰٫۰۴۴</w:t>
+              <w:t>۰٫۱۸۱ ± ۰٫۰۴۴</w:t>
             </w:r>
           </w:p>
         </w:tc>
@@ -11804,7 +11804,7 @@
                 <w:rtl/>
                 <w:szCs w:val="10"/>
               </w:rPr>
-              <w:t>۰٫۲۱۴ ± ۰٫۰۶۳</w:t>
+              <w:t>۰٫۲۱۴ ± ۰٫۰۶۳</w:t>
             </w:r>
           </w:p>
         </w:tc>
@@ -11893,7 +11893,7 @@
                 <w:rtl/>
                 <w:szCs w:val="10"/>
               </w:rPr>
-              <w:t>۰٫۲۸۸ ± ۰٫۰۶۰</w:t>
+              <w:t>۰٫۲۸۸ ± ۰٫۰۶۰</w:t>
             </w:r>
           </w:p>
         </w:tc>
@@ -11921,7 +11921,7 @@
                 <w:rtl/>
                 <w:szCs w:val="10"/>
               </w:rPr>
-              <w:t>۰٫۲۷۷ ± ۰٫۰۵۸</w:t>
+              <w:t>۰٫۲۷۷ ± ۰٫۰۵۸</w:t>
             </w:r>
           </w:p>
         </w:tc>
@@ -11949,7 +11949,7 @@
                 <w:rtl/>
                 <w:szCs w:val="10"/>
               </w:rPr>
-              <w:t>۰٫۳۰۷ ± ۰٫۰۶۵</w:t>
+              <w:t>۰٫۳۰۷ ± ۰٫۰۶۵</w:t>
             </w:r>
           </w:p>
         </w:tc>
@@ -12048,7 +12048,7 @@
                 <w:rtl/>
                 <w:szCs w:val="10"/>
               </w:rPr>
-              <w:t>۰٫۳۲۲ ± ۰٫۰۷۹</w:t>
+              <w:t>۰٫۳۲۲ ± ۰٫۰۷۹</w:t>
             </w:r>
           </w:p>
         </w:tc>
@@ -12076,7 +12076,7 @@
                 <w:rtl/>
                 <w:szCs w:val="10"/>
               </w:rPr>
-              <w:t>۰٫۳۱۰ ± ۰٫۰۷۶</w:t>
+              <w:t>۰٫۳۱۰ ± ۰٫۰۷۶</w:t>
             </w:r>
           </w:p>
         </w:tc>
@@ -12104,7 +12104,7 @@
                 <w:rtl/>
                 <w:szCs w:val="10"/>
               </w:rPr>
-              <w:t>۰٫۳۵۲ ± ۰٫۰۸۱</w:t>
+              <w:t>۰٫۳۵۲ ± ۰٫۰۸۱</w:t>
             </w:r>
           </w:p>
         </w:tc>
@@ -12203,7 +12203,7 @@
                 <w:rtl/>
                 <w:szCs w:val="10"/>
               </w:rPr>
-              <w:t>۰٫۳۴۰ ± ۰٫۰۷۲</w:t>
+              <w:t>۰٫۳۴۰ ± ۰٫۰۷۲</w:t>
             </w:r>
           </w:p>
         </w:tc>
@@ -12231,7 +12231,7 @@
                 <w:rtl/>
                 <w:szCs w:val="10"/>
               </w:rPr>
-              <w:t>۰٫۳۲۷ ± ۰٫۰۶۹</w:t>
+              <w:t>۰٫۳۲۷ ± ۰٫۰۶۹</w:t>
             </w:r>
           </w:p>
         </w:tc>
@@ -12259,7 +12259,7 @@
                 <w:rtl/>
                 <w:szCs w:val="10"/>
               </w:rPr>
-              <w:t>۰٫۳۶۰ ± ۰٫۰۸۰</w:t>
+              <w:t>۰٫۳۶۰ ± ۰٫۰۸۰</w:t>
             </w:r>
           </w:p>
         </w:tc>
@@ -12315,7 +12315,7 @@
           <w:rtl/>
           <w:szCs w:val="18"/>
         </w:rPr>
-        <w:t xml:space="preserve"> به دقت بالاتری (۰٫۴۳۰ ± ۰٫۱۲۷) نسبت به </w:t>
+        <w:t xml:space="preserve"> به دقت بالاتری (۰٫۴۳۰ ± ۰٫۱۲۷) نسبت به </w:t>
       </w:r>
       <w:r>
         <w:rPr>
@@ -12334,7 +12334,7 @@
           <w:rtl/>
           <w:szCs w:val="18"/>
         </w:rPr>
-        <w:t xml:space="preserve"> (۰٫۴۰۰ ± ۰٫۰۸۹) دست می‌یابد؛ اما با افزایش ظرفیت کمپین، </w:t>
+        <w:t xml:space="preserve"> (۰٫۴۰۰ ± ۰٫۰۸۹) دست می‌یابد؛ اما با افزایش ظرفیت کمپین، </w:t>
       </w:r>
       <w:r>
         <w:rPr>
@@ -12467,26 +12467,26 @@
           <w:rtl/>
           <w:szCs w:val="18"/>
         </w:rPr>
-        <w:t xml:space="preserve"> نسبت به خط‌مبناهای سنتی کمترین حجم و مدل جدولی در تمامی بودجه‌ها کاملاً معنادار باقی می‌ماند (</w:t>
-      </w:r>
-      <w:r>
-        <w:rPr>
-          <w:rFonts w:ascii="Times New Roman" w:hAnsi="Times New Roman" w:cs="Times New Roman"/>
-          <w:bidi w:val="0"/>
-          <w:sz w:val="17"/>
-          <w:rtl w:val="0"/>
-          <w:szCs w:val="17"/>
-        </w:rPr>
-        <w:t>‎p_adj &lt; 0.05‎</w:t>
-      </w:r>
-      <w:r>
-        <w:rPr>
-          <w:rFonts w:hint="cs" w:ascii="B Mitra" w:hAnsi="B Mitra" w:cs="B Mitra"/>
-          <w:sz w:val="18"/>
-          <w:rtl/>
-          <w:szCs w:val="18"/>
-        </w:rPr>
-        <w:t xml:space="preserve">): در بودجه </w:t>
+        <w:t xml:space="preserve"> نسبت به خط‌مبناهای سنتی کمترین حجم و مدل جدولی در تمامی بودجه‌ها کاملاً معنادار باقی می‌ماند </w:t>
+      </w:r>
+      <w:r>
+        <w:rPr>
+          <w:rFonts w:ascii="Times New Roman" w:hAnsi="Times New Roman" w:cs="Times New Roman"/>
+          <w:bidi w:val="0"/>
+          <w:sz w:val="17"/>
+          <w:rtl w:val="0"/>
+          <w:szCs w:val="17"/>
+        </w:rPr>
+        <w:t>‎(p_adj &lt; 0.05)‎</w:t>
+      </w:r>
+      <w:r>
+        <w:rPr>
+          <w:rFonts w:hint="cs" w:ascii="B Mitra" w:hAnsi="B Mitra" w:cs="B Mitra"/>
+          <w:sz w:val="18"/>
+          <w:rtl/>
+          <w:szCs w:val="18"/>
+        </w:rPr>
+        <w:t xml:space="preserve">: در بودجه </w:t>
       </w:r>
       <w:r>
         <w:rPr>
@@ -12505,45 +12505,45 @@
           <w:rtl/>
           <w:szCs w:val="18"/>
         </w:rPr>
-        <w:t xml:space="preserve"> نسبت به کمترین حجم (</w:t>
-      </w:r>
-      <w:r>
-        <w:rPr>
-          <w:rFonts w:ascii="Times New Roman" w:hAnsi="Times New Roman" w:cs="Times New Roman"/>
-          <w:bidi w:val="0"/>
-          <w:sz w:val="17"/>
-          <w:rtl w:val="0"/>
-          <w:szCs w:val="17"/>
-        </w:rPr>
-        <w:t>‎p_adj = 0.0156‎</w:t>
-      </w:r>
-      <w:r>
-        <w:rPr>
-          <w:rFonts w:hint="cs" w:ascii="B Mitra" w:hAnsi="B Mitra" w:cs="B Mitra"/>
-          <w:sz w:val="18"/>
-          <w:rtl/>
-          <w:szCs w:val="18"/>
-        </w:rPr>
-        <w:t>) و مدل جدولی (</w:t>
-      </w:r>
-      <w:r>
-        <w:rPr>
-          <w:rFonts w:ascii="Times New Roman" w:hAnsi="Times New Roman" w:cs="Times New Roman"/>
-          <w:bidi w:val="0"/>
-          <w:sz w:val="17"/>
-          <w:rtl w:val="0"/>
-          <w:szCs w:val="17"/>
-        </w:rPr>
-        <w:t>‎p_adj = 0.0293‎</w:t>
-      </w:r>
-      <w:r>
-        <w:rPr>
-          <w:rFonts w:hint="cs" w:ascii="B Mitra" w:hAnsi="B Mitra" w:cs="B Mitra"/>
-          <w:sz w:val="18"/>
-          <w:rtl/>
-          <w:szCs w:val="18"/>
-        </w:rPr>
-        <w:t xml:space="preserve">)؛ در بودجه </w:t>
+        <w:t xml:space="preserve"> نسبت به کمترین حجم </w:t>
+      </w:r>
+      <w:r>
+        <w:rPr>
+          <w:rFonts w:ascii="Times New Roman" w:hAnsi="Times New Roman" w:cs="Times New Roman"/>
+          <w:bidi w:val="0"/>
+          <w:sz w:val="17"/>
+          <w:rtl w:val="0"/>
+          <w:szCs w:val="17"/>
+        </w:rPr>
+        <w:t>‎(p_adj = 0.0156)‎</w:t>
+      </w:r>
+      <w:r>
+        <w:rPr>
+          <w:rFonts w:hint="cs" w:ascii="B Mitra" w:hAnsi="B Mitra" w:cs="B Mitra"/>
+          <w:sz w:val="18"/>
+          <w:rtl/>
+          <w:szCs w:val="18"/>
+        </w:rPr>
+        <w:t xml:space="preserve"> و مدل جدولی </w:t>
+      </w:r>
+      <w:r>
+        <w:rPr>
+          <w:rFonts w:ascii="Times New Roman" w:hAnsi="Times New Roman" w:cs="Times New Roman"/>
+          <w:bidi w:val="0"/>
+          <w:sz w:val="17"/>
+          <w:rtl w:val="0"/>
+          <w:szCs w:val="17"/>
+        </w:rPr>
+        <w:t>‎(p_adj = 0.0293)‎</w:t>
+      </w:r>
+      <w:r>
+        <w:rPr>
+          <w:rFonts w:hint="cs" w:ascii="B Mitra" w:hAnsi="B Mitra" w:cs="B Mitra"/>
+          <w:sz w:val="18"/>
+          <w:rtl/>
+          <w:szCs w:val="18"/>
+        </w:rPr>
+        <w:t xml:space="preserve">؛ در بودجه </w:t>
       </w:r>
       <w:r>
         <w:rPr>
@@ -12562,45 +12562,45 @@
           <w:rtl/>
           <w:szCs w:val="18"/>
         </w:rPr>
-        <w:t xml:space="preserve"> نسبت به کمترین حجم (</w:t>
-      </w:r>
-      <w:r>
-        <w:rPr>
-          <w:rFonts w:ascii="Times New Roman" w:hAnsi="Times New Roman" w:cs="Times New Roman"/>
-          <w:bidi w:val="0"/>
-          <w:sz w:val="17"/>
-          <w:rtl w:val="0"/>
-          <w:szCs w:val="17"/>
-        </w:rPr>
-        <w:t>‎p_adj = 0.0156‎</w:t>
-      </w:r>
-      <w:r>
-        <w:rPr>
-          <w:rFonts w:hint="cs" w:ascii="B Mitra" w:hAnsi="B Mitra" w:cs="B Mitra"/>
-          <w:sz w:val="18"/>
-          <w:rtl/>
-          <w:szCs w:val="18"/>
-        </w:rPr>
-        <w:t>) و مدل جدولی (</w:t>
-      </w:r>
-      <w:r>
-        <w:rPr>
-          <w:rFonts w:ascii="Times New Roman" w:hAnsi="Times New Roman" w:cs="Times New Roman"/>
-          <w:bidi w:val="0"/>
-          <w:sz w:val="17"/>
-          <w:rtl w:val="0"/>
-          <w:szCs w:val="17"/>
-        </w:rPr>
-        <w:t>‎p_adj = 0.0176‎</w:t>
-      </w:r>
-      <w:r>
-        <w:rPr>
-          <w:rFonts w:hint="cs" w:ascii="B Mitra" w:hAnsi="B Mitra" w:cs="B Mitra"/>
-          <w:sz w:val="18"/>
-          <w:rtl/>
-          <w:szCs w:val="18"/>
-        </w:rPr>
-        <w:t xml:space="preserve">)؛ و در </w:t>
+        <w:t xml:space="preserve"> نسبت به کمترین حجم </w:t>
+      </w:r>
+      <w:r>
+        <w:rPr>
+          <w:rFonts w:ascii="Times New Roman" w:hAnsi="Times New Roman" w:cs="Times New Roman"/>
+          <w:bidi w:val="0"/>
+          <w:sz w:val="17"/>
+          <w:rtl w:val="0"/>
+          <w:szCs w:val="17"/>
+        </w:rPr>
+        <w:t>‎(p_adj = 0.0156)‎</w:t>
+      </w:r>
+      <w:r>
+        <w:rPr>
+          <w:rFonts w:hint="cs" w:ascii="B Mitra" w:hAnsi="B Mitra" w:cs="B Mitra"/>
+          <w:sz w:val="18"/>
+          <w:rtl/>
+          <w:szCs w:val="18"/>
+        </w:rPr>
+        <w:t xml:space="preserve"> و مدل جدولی </w:t>
+      </w:r>
+      <w:r>
+        <w:rPr>
+          <w:rFonts w:ascii="Times New Roman" w:hAnsi="Times New Roman" w:cs="Times New Roman"/>
+          <w:bidi w:val="0"/>
+          <w:sz w:val="17"/>
+          <w:rtl w:val="0"/>
+          <w:szCs w:val="17"/>
+        </w:rPr>
+        <w:t>‎(p_adj = 0.0176)‎</w:t>
+      </w:r>
+      <w:r>
+        <w:rPr>
+          <w:rFonts w:hint="cs" w:ascii="B Mitra" w:hAnsi="B Mitra" w:cs="B Mitra"/>
+          <w:sz w:val="18"/>
+          <w:rtl/>
+          <w:szCs w:val="18"/>
+        </w:rPr>
+        <w:t xml:space="preserve">؛ در </w:t>
       </w:r>
       <w:r>
         <w:rPr>
@@ -12619,45 +12619,102 @@
           <w:rtl/>
           <w:szCs w:val="18"/>
         </w:rPr>
-        <w:t xml:space="preserve"> نسبت به کمترین حجم (</w:t>
-      </w:r>
-      <w:r>
-        <w:rPr>
-          <w:rFonts w:ascii="Times New Roman" w:hAnsi="Times New Roman" w:cs="Times New Roman"/>
-          <w:bidi w:val="0"/>
-          <w:sz w:val="17"/>
-          <w:rtl w:val="0"/>
-          <w:szCs w:val="17"/>
-        </w:rPr>
-        <w:t>‎p_adj = 0.0176‎</w:t>
-      </w:r>
-      <w:r>
-        <w:rPr>
-          <w:rFonts w:hint="cs" w:ascii="B Mitra" w:hAnsi="B Mitra" w:cs="B Mitra"/>
-          <w:sz w:val="18"/>
-          <w:rtl/>
-          <w:szCs w:val="18"/>
-        </w:rPr>
-        <w:t>) و مدل جدولی (</w:t>
-      </w:r>
-      <w:r>
-        <w:rPr>
-          <w:rFonts w:ascii="Times New Roman" w:hAnsi="Times New Roman" w:cs="Times New Roman"/>
-          <w:bidi w:val="0"/>
-          <w:sz w:val="17"/>
-          <w:rtl w:val="0"/>
-          <w:szCs w:val="17"/>
-        </w:rPr>
-        <w:t>‎p_adj = 0.0078‎</w:t>
-      </w:r>
-      <w:r>
-        <w:rPr>
-          <w:rFonts w:hint="cs" w:ascii="B Mitra" w:hAnsi="B Mitra" w:cs="B Mitra"/>
-          <w:sz w:val="18"/>
-          <w:rtl/>
-          <w:szCs w:val="18"/>
-        </w:rPr>
-        <w:t xml:space="preserve">). نسبت به گراف ایستا در </w:t>
+        <w:t xml:space="preserve"> نسبت به کمترین حجم </w:t>
+      </w:r>
+      <w:r>
+        <w:rPr>
+          <w:rFonts w:ascii="Times New Roman" w:hAnsi="Times New Roman" w:cs="Times New Roman"/>
+          <w:bidi w:val="0"/>
+          <w:sz w:val="17"/>
+          <w:rtl w:val="0"/>
+          <w:szCs w:val="17"/>
+        </w:rPr>
+        <w:t>‎(p_adj = 0.0176)‎</w:t>
+      </w:r>
+      <w:r>
+        <w:rPr>
+          <w:rFonts w:hint="cs" w:ascii="B Mitra" w:hAnsi="B Mitra" w:cs="B Mitra"/>
+          <w:sz w:val="18"/>
+          <w:rtl/>
+          <w:szCs w:val="18"/>
+        </w:rPr>
+        <w:t xml:space="preserve"> و مدل جدولی </w:t>
+      </w:r>
+      <w:r>
+        <w:rPr>
+          <w:rFonts w:ascii="Times New Roman" w:hAnsi="Times New Roman" w:cs="Times New Roman"/>
+          <w:bidi w:val="0"/>
+          <w:sz w:val="17"/>
+          <w:rtl w:val="0"/>
+          <w:szCs w:val="17"/>
+        </w:rPr>
+        <w:t>‎(p_adj = 0.0078)‎</w:t>
+      </w:r>
+      <w:r>
+        <w:rPr>
+          <w:rFonts w:hint="cs" w:ascii="B Mitra" w:hAnsi="B Mitra" w:cs="B Mitra"/>
+          <w:sz w:val="18"/>
+          <w:rtl/>
+          <w:szCs w:val="18"/>
+        </w:rPr>
+        <w:t xml:space="preserve">؛ و در بودجه </w:t>
+      </w:r>
+      <w:r>
+        <w:rPr>
+          <w:rFonts w:ascii="Times New Roman" w:hAnsi="Times New Roman" w:cs="Times New Roman"/>
+          <w:bidi w:val="0"/>
+          <w:sz w:val="17"/>
+          <w:rtl w:val="0"/>
+          <w:szCs w:val="17"/>
+        </w:rPr>
+        <w:t>‎K = 50‎</w:t>
+      </w:r>
+      <w:r>
+        <w:rPr>
+          <w:rFonts w:hint="cs" w:ascii="B Mitra" w:hAnsi="B Mitra" w:cs="B Mitra"/>
+          <w:sz w:val="18"/>
+          <w:rtl/>
+          <w:szCs w:val="18"/>
+        </w:rPr>
+        <w:t xml:space="preserve"> نسبت به کمترین حجم </w:t>
+      </w:r>
+      <w:r>
+        <w:rPr>
+          <w:rFonts w:ascii="Times New Roman" w:hAnsi="Times New Roman" w:cs="Times New Roman"/>
+          <w:bidi w:val="0"/>
+          <w:sz w:val="17"/>
+          <w:rtl w:val="0"/>
+          <w:szCs w:val="17"/>
+        </w:rPr>
+        <w:t>‎(p_adj = 0.0078)‎</w:t>
+      </w:r>
+      <w:r>
+        <w:rPr>
+          <w:rFonts w:hint="cs" w:ascii="B Mitra" w:hAnsi="B Mitra" w:cs="B Mitra"/>
+          <w:sz w:val="18"/>
+          <w:rtl/>
+          <w:szCs w:val="18"/>
+        </w:rPr>
+        <w:t xml:space="preserve"> و مدل جدولی </w:t>
+      </w:r>
+      <w:r>
+        <w:rPr>
+          <w:rFonts w:ascii="Times New Roman" w:hAnsi="Times New Roman" w:cs="Times New Roman"/>
+          <w:bidi w:val="0"/>
+          <w:sz w:val="17"/>
+          <w:rtl w:val="0"/>
+          <w:szCs w:val="17"/>
+        </w:rPr>
+        <w:t>‎(p_adj = 0.0078)‎</w:t>
+      </w:r>
+      <w:r>
+        <w:rPr>
+          <w:rFonts w:hint="cs" w:ascii="B Mitra" w:hAnsi="B Mitra" w:cs="B Mitra"/>
+          <w:sz w:val="18"/>
+          <w:rtl/>
+          <w:szCs w:val="18"/>
+        </w:rPr>
+        <w:t xml:space="preserve">. در مقابل، نسبت به گراف ایستا برتری در </w:t>
       </w:r>
       <w:r>
         <w:rPr>
@@ -12676,7 +12733,26 @@
           <w:rtl/>
           <w:szCs w:val="18"/>
         </w:rPr>
-        <w:t>، آزمون خام ویلکاکسون معنادار است (</w:t>
+        <w:t xml:space="preserve"> دارای </w:t>
+      </w:r>
+      <w:r>
+        <w:rPr>
+          <w:rFonts w:ascii="Times New Roman" w:hAnsi="Times New Roman" w:cs="Times New Roman"/>
+          <w:bidi w:val="0"/>
+          <w:sz w:val="17"/>
+          <w:rtl w:val="0"/>
+          <w:szCs w:val="17"/>
+        </w:rPr>
+        <w:t>‎p_adj = 0.0977‎</w:t>
+      </w:r>
+      <w:r>
+        <w:rPr>
+          <w:rFonts w:hint="cs" w:ascii="B Mitra" w:hAnsi="B Mitra" w:cs="B Mitra"/>
+          <w:sz w:val="18"/>
+          <w:rtl/>
+          <w:szCs w:val="18"/>
+        </w:rPr>
+        <w:t xml:space="preserve"> (آزمون خام </w:t>
       </w:r>
       <w:r>
         <w:rPr>
@@ -12695,26 +12771,45 @@
           <w:rtl/>
           <w:szCs w:val="18"/>
         </w:rPr>
-        <w:t xml:space="preserve">) که پس از تصحیح هولم-بونفرونی به </w:t>
-      </w:r>
-      <w:r>
-        <w:rPr>
-          <w:rFonts w:ascii="Times New Roman" w:hAnsi="Times New Roman" w:cs="Times New Roman"/>
-          <w:bidi w:val="0"/>
-          <w:sz w:val="17"/>
-          <w:rtl w:val="0"/>
-          <w:szCs w:val="17"/>
-        </w:rPr>
-        <w:t>‎p_adj = 0.0977‎</w:t>
-      </w:r>
-      <w:r>
-        <w:rPr>
-          <w:rFonts w:hint="cs" w:ascii="B Mitra" w:hAnsi="B Mitra" w:cs="B Mitra"/>
-          <w:sz w:val="18"/>
-          <w:rtl/>
-          <w:szCs w:val="18"/>
-        </w:rPr>
-        <w:t xml:space="preserve"> تعدیل می‌شود. تفاوت‌های </w:t>
+        <w:t xml:space="preserve">) و در </w:t>
+      </w:r>
+      <w:r>
+        <w:rPr>
+          <w:rFonts w:ascii="Times New Roman" w:hAnsi="Times New Roman" w:cs="Times New Roman"/>
+          <w:bidi w:val="0"/>
+          <w:sz w:val="17"/>
+          <w:rtl w:val="0"/>
+          <w:szCs w:val="17"/>
+        </w:rPr>
+        <w:t>‎K = 50‎</w:t>
+      </w:r>
+      <w:r>
+        <w:rPr>
+          <w:rFonts w:hint="cs" w:ascii="B Mitra" w:hAnsi="B Mitra" w:cs="B Mitra"/>
+          <w:sz w:val="18"/>
+          <w:rtl/>
+          <w:szCs w:val="18"/>
+        </w:rPr>
+        <w:t xml:space="preserve"> به صورت حاشیه‌ای با </w:t>
+      </w:r>
+      <w:r>
+        <w:rPr>
+          <w:rFonts w:ascii="Times New Roman" w:hAnsi="Times New Roman" w:cs="Times New Roman"/>
+          <w:bidi w:val="0"/>
+          <w:sz w:val="17"/>
+          <w:rtl w:val="0"/>
+          <w:szCs w:val="17"/>
+        </w:rPr>
+        <w:t>‎p_adj = 0.0586‎</w:t>
+      </w:r>
+      <w:r>
+        <w:rPr>
+          <w:rFonts w:hint="cs" w:ascii="B Mitra" w:hAnsi="B Mitra" w:cs="B Mitra"/>
+          <w:sz w:val="18"/>
+          <w:rtl/>
+          <w:szCs w:val="18"/>
+        </w:rPr>
+        <w:t xml:space="preserve"> است. همچنین تفاوت‌های </w:t>
       </w:r>
       <w:r>
         <w:rPr>
@@ -12733,7 +12828,7 @@
           <w:rtl/>
           <w:szCs w:val="18"/>
         </w:rPr>
-        <w:t xml:space="preserve"> با خط‌مبنای </w:t>
+        <w:t xml:space="preserve"> با خط‌مبنای مرزی </w:t>
       </w:r>
       <w:r>
         <w:rPr>
@@ -12752,26 +12847,45 @@
           <w:rtl/>
           <w:szCs w:val="18"/>
         </w:rPr>
-        <w:t xml:space="preserve"> به سطح معناداری آماری نمی‌رسد و </w:t>
-      </w:r>
-      <w:r>
-        <w:rPr>
-          <w:rFonts w:ascii="Times New Roman" w:hAnsi="Times New Roman" w:cs="Times New Roman"/>
-          <w:bidi w:val="0"/>
-          <w:sz w:val="17"/>
-          <w:rtl w:val="0"/>
-          <w:szCs w:val="17"/>
-        </w:rPr>
-        <w:t>‎SFA‎</w:t>
-      </w:r>
-      <w:r>
-        <w:rPr>
-          <w:rFonts w:hint="cs" w:ascii="B Mitra" w:hAnsi="B Mitra" w:cs="B Mitra"/>
-          <w:sz w:val="18"/>
-          <w:rtl/>
-          <w:szCs w:val="18"/>
-        </w:rPr>
-        <w:t xml:space="preserve"> به عنوان یک بنچ‌مارک مرزی ناپارامتریک قدرتمند عمل می‌نماید.</w:t>
+        <w:t xml:space="preserve"> در هیچ‌یک از بودجه‌ها به معناداری آماری نمی‌رسد (در </w:t>
+      </w:r>
+      <w:r>
+        <w:rPr>
+          <w:rFonts w:ascii="Times New Roman" w:hAnsi="Times New Roman" w:cs="Times New Roman"/>
+          <w:bidi w:val="0"/>
+          <w:sz w:val="17"/>
+          <w:rtl w:val="0"/>
+          <w:szCs w:val="17"/>
+        </w:rPr>
+        <w:t>‎K = 50‎</w:t>
+      </w:r>
+      <w:r>
+        <w:rPr>
+          <w:rFonts w:hint="cs" w:ascii="B Mitra" w:hAnsi="B Mitra" w:cs="B Mitra"/>
+          <w:sz w:val="18"/>
+          <w:rtl/>
+          <w:szCs w:val="18"/>
+        </w:rPr>
+        <w:t xml:space="preserve"> مقدار </w:t>
+      </w:r>
+      <w:r>
+        <w:rPr>
+          <w:rFonts w:ascii="Times New Roman" w:hAnsi="Times New Roman" w:cs="Times New Roman"/>
+          <w:bidi w:val="0"/>
+          <w:sz w:val="17"/>
+          <w:rtl w:val="0"/>
+          <w:szCs w:val="17"/>
+        </w:rPr>
+        <w:t>‎p_adj = 0.6094‎</w:t>
+      </w:r>
+      <w:r>
+        <w:rPr>
+          <w:rFonts w:hint="cs" w:ascii="B Mitra" w:hAnsi="B Mitra" w:cs="B Mitra"/>
+          <w:sz w:val="18"/>
+          <w:rtl/>
+          <w:szCs w:val="18"/>
+        </w:rPr>
+        <w:t>)، که نشان‌دهنده رقابت‌پذیری بالای روش مرزی ناپارامتریک است.</w:t>
       </w:r>
     </w:p>
     <w:p>
@@ -12811,26 +12925,26 @@
           <w:rtl/>
           <w:szCs w:val="18"/>
         </w:rPr>
-        <w:t>جدول (</w:t>
-      </w:r>
-      <w:r>
-        <w:rPr>
-          <w:rFonts w:ascii="Times New Roman" w:hAnsi="Times New Roman" w:cs="Times New Roman"/>
-          <w:bidi w:val="0"/>
-          <w:sz w:val="17"/>
-          <w:rtl w:val="0"/>
-          <w:szCs w:val="17"/>
-        </w:rPr>
-        <w:t>‎4‎</w:t>
-      </w:r>
-      <w:r>
-        <w:rPr>
-          <w:rFonts w:hint="cs" w:ascii="B Mitra" w:hAnsi="B Mitra" w:cs="B Mitra"/>
-          <w:sz w:val="18"/>
-          <w:rtl/>
-          <w:szCs w:val="18"/>
-        </w:rPr>
-        <w:t>) عملکرد مدل را در چهار سناریوی مستقل با شدت‌های مختلف افت و نویز نشان می‌دهد.</w:t>
+        <w:t xml:space="preserve">جدول </w:t>
+      </w:r>
+      <w:r>
+        <w:rPr>
+          <w:rFonts w:ascii="Times New Roman" w:hAnsi="Times New Roman" w:cs="Times New Roman"/>
+          <w:bidi w:val="0"/>
+          <w:sz w:val="17"/>
+          <w:rtl w:val="0"/>
+          <w:szCs w:val="17"/>
+        </w:rPr>
+        <w:t>‎(4)‎</w:t>
+      </w:r>
+      <w:r>
+        <w:rPr>
+          <w:rFonts w:hint="cs" w:ascii="B Mitra" w:hAnsi="B Mitra" w:cs="B Mitra"/>
+          <w:sz w:val="18"/>
+          <w:rtl/>
+          <w:szCs w:val="18"/>
+        </w:rPr>
+        <w:t xml:space="preserve"> عملکرد مدل را در چهار سناریوی مستقل با شدت‌های مختلف افت و نویز نشان می‌دهد.</w:t>
       </w:r>
     </w:p>
     <w:p>
@@ -12846,26 +12960,26 @@
           <w:rtl/>
           <w:szCs w:val="17"/>
         </w:rPr>
-        <w:t>جدول (</w:t>
-      </w:r>
-      <w:r>
-        <w:rPr>
-          <w:rFonts w:ascii="Times New Roman" w:hAnsi="Times New Roman" w:cs="Times New Roman"/>
-          <w:bidi w:val="0"/>
-          <w:sz w:val="17"/>
-          <w:rtl w:val="0"/>
-          <w:szCs w:val="17"/>
-        </w:rPr>
-        <w:t>‎4‎</w:t>
-      </w:r>
-      <w:r>
-        <w:rPr>
-          <w:rFonts w:hint="cs" w:ascii="B Mitra" w:hAnsi="B Mitra" w:cs="B Mitra"/>
-          <w:sz w:val="17"/>
-          <w:rtl/>
-          <w:szCs w:val="17"/>
-        </w:rPr>
-        <w:t>) : ارزیابی چندسناریویی چارچوب و نرخ هشدار کاذب (۱۰ سید تصادفی)</w:t>
+        <w:t xml:space="preserve">جدول </w:t>
+      </w:r>
+      <w:r>
+        <w:rPr>
+          <w:rFonts w:ascii="Times New Roman" w:hAnsi="Times New Roman" w:cs="Times New Roman"/>
+          <w:bidi w:val="0"/>
+          <w:sz w:val="17"/>
+          <w:rtl w:val="0"/>
+          <w:szCs w:val="17"/>
+        </w:rPr>
+        <w:t>‎(4)‎</w:t>
+      </w:r>
+      <w:r>
+        <w:rPr>
+          <w:rFonts w:hint="cs" w:ascii="B Mitra" w:hAnsi="B Mitra" w:cs="B Mitra"/>
+          <w:sz w:val="17"/>
+          <w:rtl/>
+          <w:szCs w:val="17"/>
+        </w:rPr>
+        <w:t xml:space="preserve"> : ارزیابی چندسناریویی چارچوب و نرخ هشدار کاذب (۱۰ سید تصادفی)</w:t>
       </w:r>
     </w:p>
     <w:tbl>
@@ -13183,7 +13297,7 @@
                 <w:rtl/>
                 <w:szCs w:val="10"/>
               </w:rPr>
-              <w:t>۰٫۰۰۰ ± ۰٫۰۰۰</w:t>
+              <w:t>۰٫۰۰۰ ± ۰٫۰۰۰</w:t>
             </w:r>
           </w:p>
         </w:tc>
@@ -13211,7 +13325,7 @@
                 <w:rtl/>
                 <w:szCs w:val="10"/>
               </w:rPr>
-              <w:t>۰٫۰۰۰ ± ۰٫۰۰۰</w:t>
+              <w:t>۰٫۰۰۰ ± ۰٫۰۰۰</w:t>
             </w:r>
           </w:p>
         </w:tc>
@@ -13239,7 +13353,7 @@
                 <w:rtl/>
                 <w:szCs w:val="10"/>
               </w:rPr>
-              <w:t>۰٫۱۰۰ ± ۰٫۰۰۰</w:t>
+              <w:t>۰٫۱۰۰ ± ۰٫۰۰۰</w:t>
             </w:r>
           </w:p>
         </w:tc>
@@ -13267,7 +13381,7 @@
                 <w:rtl/>
                 <w:szCs w:val="10"/>
               </w:rPr>
-              <w:t>۰٫۸۶۲ ± ۰٫۰۳۱</w:t>
+              <w:t>۰٫۸۶۲ ± ۰٫۰۳۱</w:t>
             </w:r>
           </w:p>
         </w:tc>
@@ -13356,7 +13470,7 @@
                 <w:rtl/>
                 <w:szCs w:val="10"/>
               </w:rPr>
-              <w:t>۰٫۲۹۷ ± ۰٫۰۹۹</w:t>
+              <w:t>۰٫۲۹۷ ± ۰٫۰۹۹</w:t>
             </w:r>
           </w:p>
         </w:tc>
@@ -13384,7 +13498,7 @@
                 <w:rtl/>
                 <w:szCs w:val="10"/>
               </w:rPr>
-              <w:t>۰٫۳۱۰ ± ۰٫۰۹۸</w:t>
+              <w:t>۰٫۳۱۰ ± ۰٫۰۹۸</w:t>
             </w:r>
           </w:p>
         </w:tc>
@@ -13412,7 +13526,7 @@
                 <w:rtl/>
                 <w:szCs w:val="10"/>
               </w:rPr>
-              <w:t>۰٫۰۸۳ ± ۰٫۰۱۲</w:t>
+              <w:t>۰٫۰۸۳ ± ۰٫۰۱۲</w:t>
             </w:r>
           </w:p>
         </w:tc>
@@ -13440,7 +13554,7 @@
                 <w:rtl/>
                 <w:szCs w:val="10"/>
               </w:rPr>
-              <w:t>۰٫۸۱۹ ± ۰٫۰۴۴</w:t>
+              <w:t>۰٫۸۱۹ ± ۰٫۰۴۴</w:t>
             </w:r>
           </w:p>
         </w:tc>
@@ -13538,7 +13652,7 @@
                 <w:rtl/>
                 <w:szCs w:val="10"/>
               </w:rPr>
-              <w:t>۰٫۳۶۶ ± ۰٫۱۲۰</w:t>
+              <w:t>۰٫۳۶۶ ± ۰٫۱۲۰</w:t>
             </w:r>
           </w:p>
         </w:tc>
@@ -13569,7 +13683,7 @@
                 <w:rtl/>
                 <w:szCs w:val="10"/>
               </w:rPr>
-              <w:t>۰٫۳۸۲ ± ۰٫۱۱۶</w:t>
+              <w:t>۰٫۳۸۲ ± ۰٫۱۱۶</w:t>
             </w:r>
           </w:p>
         </w:tc>
@@ -13600,7 +13714,7 @@
                 <w:rtl/>
                 <w:szCs w:val="10"/>
               </w:rPr>
-              <w:t>۰٫۰۷۴ ± ۰٫۰۱۴</w:t>
+              <w:t>۰٫۰۷۴ ± ۰٫۰۱۴</w:t>
             </w:r>
           </w:p>
         </w:tc>
@@ -13631,7 +13745,7 @@
                 <w:rtl/>
                 <w:szCs w:val="10"/>
               </w:rPr>
-              <w:t>۰٫۸۰۷ ± ۰٫۰۳۹</w:t>
+              <w:t>۰٫۸۰۷ ± ۰٫۰۳۹</w:t>
             </w:r>
           </w:p>
         </w:tc>
@@ -13720,7 +13834,7 @@
                 <w:rtl/>
                 <w:szCs w:val="10"/>
               </w:rPr>
-              <w:t>۰٫۵۰۰ ± ۰٫۱۲۲</w:t>
+              <w:t>۰٫۵۰۰ ± ۰٫۱۲۲</w:t>
             </w:r>
           </w:p>
         </w:tc>
@@ -13748,7 +13862,7 @@
                 <w:rtl/>
                 <w:szCs w:val="10"/>
               </w:rPr>
-              <w:t>۰٫۵۳۲ ± ۰٫۱۲۰</w:t>
+              <w:t>۰٫۵۳۲ ± ۰٫۱۲۰</w:t>
             </w:r>
           </w:p>
         </w:tc>
@@ -13776,7 +13890,7 @@
                 <w:rtl/>
                 <w:szCs w:val="10"/>
               </w:rPr>
-              <w:t>۰٫۰۵۹ ± ۰٫۰۱۴</w:t>
+              <w:t>۰٫۰۵۹ ± ۰٫۰۱۴</w:t>
             </w:r>
           </w:p>
         </w:tc>
@@ -13804,7 +13918,7 @@
                 <w:rtl/>
                 <w:szCs w:val="10"/>
               </w:rPr>
-              <w:t>۰٫۸۰۳ ± ۰٫۰۴۱</w:t>
+              <w:t>۰٫۸۰۳ ± ۰٫۰۴۱</w:t>
             </w:r>
           </w:p>
         </w:tc>
@@ -13822,26 +13936,26 @@
           <w:rtl/>
           <w:szCs w:val="18"/>
         </w:rPr>
-        <w:t>در سناریوی شاهد منفی (سناریو ۰)، مدل طبق ساختار اولیه هیچ مثبت واقعی تولید نمی‌کند (</w:t>
-      </w:r>
-      <w:r>
-        <w:rPr>
-          <w:rFonts w:ascii="Times New Roman" w:hAnsi="Times New Roman" w:cs="Times New Roman"/>
-          <w:bidi w:val="0"/>
-          <w:sz w:val="17"/>
-          <w:rtl w:val="0"/>
-          <w:szCs w:val="17"/>
-        </w:rPr>
-        <w:t>‎TP = 0‎</w:t>
-      </w:r>
-      <w:r>
-        <w:rPr>
-          <w:rFonts w:hint="cs" w:ascii="B Mitra" w:hAnsi="B Mitra" w:cs="B Mitra"/>
-          <w:sz w:val="18"/>
-          <w:rtl/>
-          <w:szCs w:val="18"/>
-        </w:rPr>
-        <w:t>)؛ نرخ انتخاب ۰٫۱۰۰ گزارش‌شده مستقیماً ناشی از سهم بودجه انتخاب ثابت ۳۵ پذیرنده برتر از کل ۳۵۰ پذیرنده (۳۵/۳۵۰ = ۰٫۱۰۰) است و نباید به عنوان تضمین اختصاصی کنترل خطای مثبت کاذب مدل تفسیر گردد. در عوض، پوشش تجربی بازه پیش‌بینی (۸۶٫۲ ± ۳٫۱٪ با عرض بازه میانگین ۴٫۶ ± ۰٫۳ تراکنش) به عنوان شاخص مستقل تایید می‌نماید که کران‌های واسنجی‌شده به خوبی نوسانات طبیعی را در بر گرفته و مانع از تولید شکاف‌های فرصت غیرواقعی می‌گردند.</w:t>
+        <w:t xml:space="preserve">در سناریوی شاهد منفی (سناریو ۰)، مدل طبق ساختار اولیه هیچ مثبت واقعی تولید نمی‌کند </w:t>
+      </w:r>
+      <w:r>
+        <w:rPr>
+          <w:rFonts w:ascii="Times New Roman" w:hAnsi="Times New Roman" w:cs="Times New Roman"/>
+          <w:bidi w:val="0"/>
+          <w:sz w:val="17"/>
+          <w:rtl w:val="0"/>
+          <w:szCs w:val="17"/>
+        </w:rPr>
+        <w:t>‎(TP = 0)‎</w:t>
+      </w:r>
+      <w:r>
+        <w:rPr>
+          <w:rFonts w:hint="cs" w:ascii="B Mitra" w:hAnsi="B Mitra" w:cs="B Mitra"/>
+          <w:sz w:val="18"/>
+          <w:rtl/>
+          <w:szCs w:val="18"/>
+        </w:rPr>
+        <w:t>؛ نرخ انتخاب ۰٫۱۰۰ گزارش‌شده مستقیماً ناشی از سهم بودجه انتخاب ثابت ۳۵ پذیرنده برتر از کل ۳۵۰ پذیرنده (۳۵/۳۵۰ = ۰٫۱۰۰) است و نباید به عنوان تضمین اختصاصی کنترل خطای مثبت کاذب مدل تفسیر گردد. در عوض، پوشش تجربی بازه پیش‌بینی (۸۶٫۲ ± ۳٫۱٪ با عرض بازه میانگین ۴٫۶ ± ۰٫۳ تراکنش) به عنوان شاخص مستقل تایید می‌نماید که کران‌های واسنجی‌شده به خوبی نوسانات طبیعی را در بر گرفته و مانع از تولید شکاف‌های فرصت غیرواقعی می‌گردند.</w:t>
       </w:r>
     </w:p>
     <w:p>
@@ -13866,26 +13980,17 @@
           <w:rtl/>
           <w:szCs w:val="20"/>
         </w:rPr>
-        <w:t>. مطالعه تفکیکی حذف مؤلفه‌ها (</w:t>
-      </w:r>
-      <w:r>
-        <w:rPr>
-          <w:rFonts w:ascii="Times New Roman" w:hAnsi="Times New Roman" w:cs="Times New Roman"/>
-          <w:bidi w:val="0"/>
-          <w:sz w:val="18"/>
-          <w:rtl w:val="0"/>
-          <w:szCs w:val="18"/>
-        </w:rPr>
-        <w:t>‎Ablation Study‎</w:t>
-      </w:r>
-      <w:r>
-        <w:rPr>
-          <w:rFonts w:hint="cs" w:ascii="B Mitra" w:hAnsi="B Mitra" w:cs="B Mitra"/>
-          <w:sz w:val="20"/>
-          <w:rtl/>
-          <w:szCs w:val="20"/>
-        </w:rPr>
-        <w:t>)</w:t>
+        <w:t xml:space="preserve">. مطالعه تفکیکی حذف مؤلفه‌ها </w:t>
+      </w:r>
+      <w:r>
+        <w:rPr>
+          <w:rFonts w:ascii="Times New Roman" w:hAnsi="Times New Roman" w:cs="Times New Roman"/>
+          <w:bidi w:val="0"/>
+          <w:sz w:val="18"/>
+          <w:rtl w:val="0"/>
+          <w:szCs w:val="18"/>
+        </w:rPr>
+        <w:t>‎(Ablation Study)‎</w:t>
       </w:r>
     </w:p>
     <w:p>
@@ -13900,26 +14005,26 @@
           <w:rtl/>
           <w:szCs w:val="18"/>
         </w:rPr>
-        <w:t>جدول (</w:t>
-      </w:r>
-      <w:r>
-        <w:rPr>
-          <w:rFonts w:ascii="Times New Roman" w:hAnsi="Times New Roman" w:cs="Times New Roman"/>
-          <w:bidi w:val="0"/>
-          <w:sz w:val="17"/>
-          <w:rtl w:val="0"/>
-          <w:szCs w:val="17"/>
-        </w:rPr>
-        <w:t>‎5‎</w:t>
-      </w:r>
-      <w:r>
-        <w:rPr>
-          <w:rFonts w:hint="cs" w:ascii="B Mitra" w:hAnsi="B Mitra" w:cs="B Mitra"/>
-          <w:sz w:val="18"/>
-          <w:rtl/>
-          <w:szCs w:val="18"/>
-        </w:rPr>
-        <w:t>) سهم تفکیکی هر یک از اجزای معماری را در مقایسه با مدل کامل همراه با آزمون معناداری آماری نشان می‌دهد.</w:t>
+        <w:t xml:space="preserve">جدول </w:t>
+      </w:r>
+      <w:r>
+        <w:rPr>
+          <w:rFonts w:ascii="Times New Roman" w:hAnsi="Times New Roman" w:cs="Times New Roman"/>
+          <w:bidi w:val="0"/>
+          <w:sz w:val="17"/>
+          <w:rtl w:val="0"/>
+          <w:szCs w:val="17"/>
+        </w:rPr>
+        <w:t>‎(5)‎</w:t>
+      </w:r>
+      <w:r>
+        <w:rPr>
+          <w:rFonts w:hint="cs" w:ascii="B Mitra" w:hAnsi="B Mitra" w:cs="B Mitra"/>
+          <w:sz w:val="18"/>
+          <w:rtl/>
+          <w:szCs w:val="18"/>
+        </w:rPr>
+        <w:t xml:space="preserve"> سهم تفکیکی هر یک از اجزای معماری را در مقایسه با مدل کامل همراه با آزمون معناداری آماری نشان می‌دهد.</w:t>
       </w:r>
     </w:p>
     <w:p>
@@ -13935,26 +14040,26 @@
           <w:rtl/>
           <w:szCs w:val="17"/>
         </w:rPr>
-        <w:t>جدول (</w:t>
-      </w:r>
-      <w:r>
-        <w:rPr>
-          <w:rFonts w:ascii="Times New Roman" w:hAnsi="Times New Roman" w:cs="Times New Roman"/>
-          <w:bidi w:val="0"/>
-          <w:sz w:val="17"/>
-          <w:rtl w:val="0"/>
-          <w:szCs w:val="17"/>
-        </w:rPr>
-        <w:t>‎5‎</w:t>
-      </w:r>
-      <w:r>
-        <w:rPr>
-          <w:rFonts w:hint="cs" w:ascii="B Mitra" w:hAnsi="B Mitra" w:cs="B Mitra"/>
-          <w:sz w:val="17"/>
-          <w:rtl/>
-          <w:szCs w:val="17"/>
-        </w:rPr>
-        <w:t>) : نتایج مطالعه حذف مؤلفه‌ها و آزمون معناداری آماری ویلکاکسون (۱۰ سید تصادفی)</w:t>
+        <w:t xml:space="preserve">جدول </w:t>
+      </w:r>
+      <w:r>
+        <w:rPr>
+          <w:rFonts w:ascii="Times New Roman" w:hAnsi="Times New Roman" w:cs="Times New Roman"/>
+          <w:bidi w:val="0"/>
+          <w:sz w:val="17"/>
+          <w:rtl w:val="0"/>
+          <w:szCs w:val="17"/>
+        </w:rPr>
+        <w:t>‎(5)‎</w:t>
+      </w:r>
+      <w:r>
+        <w:rPr>
+          <w:rFonts w:hint="cs" w:ascii="B Mitra" w:hAnsi="B Mitra" w:cs="B Mitra"/>
+          <w:sz w:val="17"/>
+          <w:rtl/>
+          <w:szCs w:val="17"/>
+        </w:rPr>
+        <w:t xml:space="preserve"> : نتایج مطالعه حذف مؤلفه‌ها و آزمون معناداری آماری ویلکاکسون (۱۰ سید تصادفی)</w:t>
       </w:r>
     </w:p>
     <w:tbl>
@@ -14490,7 +14595,7 @@
                 <w:rtl/>
                 <w:szCs w:val="10"/>
               </w:rPr>
-              <w:t>بدون شواهد گرافی (</w:t>
+              <w:t xml:space="preserve">بدون شواهد گرافی </w:t>
             </w:r>
             <w:r>
               <w:rPr>
@@ -14500,16 +14605,7 @@
                 <w:rtl w:val="0"/>
                 <w:szCs w:val="10"/>
               </w:rPr>
-              <w:t>‎Q=1‎</w:t>
-            </w:r>
-            <w:r>
-              <w:rPr>
-                <w:rFonts w:hint="cs" w:ascii="B Mitra" w:hAnsi="B Mitra" w:cs="B Mitra"/>
-                <w:sz w:val="10"/>
-                <w:rtl/>
-                <w:szCs w:val="10"/>
-              </w:rPr>
-              <w:t>)</w:t>
+              <w:t>‎(Q=1)‎</w:t>
             </w:r>
           </w:p>
         </w:tc>
@@ -15300,26 +15396,26 @@
           <w:rtl/>
           <w:szCs w:val="18"/>
         </w:rPr>
-        <w:t>) و پویایی‌های زمانی شاخص را به میزان ۰٫۰۷۲+ (</w:t>
-      </w:r>
-      <w:r>
-        <w:rPr>
-          <w:rFonts w:ascii="Times New Roman" w:hAnsi="Times New Roman" w:cs="Times New Roman"/>
-          <w:bidi w:val="0"/>
-          <w:sz w:val="17"/>
-          <w:rtl w:val="0"/>
-          <w:szCs w:val="17"/>
-        </w:rPr>
-        <w:t>‎p = 0.0840‎</w:t>
-      </w:r>
-      <w:r>
-        <w:rPr>
-          <w:rFonts w:hint="cs" w:ascii="B Mitra" w:hAnsi="B Mitra" w:cs="B Mitra"/>
-          <w:sz w:val="18"/>
-          <w:rtl/>
-          <w:szCs w:val="18"/>
-        </w:rPr>
-        <w:t xml:space="preserve">) ارتقا می‌دهد. (۲) سپرهای حفاظتی عملیاتی: کران نااطمینانی یک‌طرفه </w:t>
+        <w:t xml:space="preserve">) و پویایی‌های زمانی شاخص را به میزان ۰٫۰۷۲+ </w:t>
+      </w:r>
+      <w:r>
+        <w:rPr>
+          <w:rFonts w:ascii="Times New Roman" w:hAnsi="Times New Roman" w:cs="Times New Roman"/>
+          <w:bidi w:val="0"/>
+          <w:sz w:val="17"/>
+          <w:rtl w:val="0"/>
+          <w:szCs w:val="17"/>
+        </w:rPr>
+        <w:t>‎(p = 0.0840)‎</w:t>
+      </w:r>
+      <w:r>
+        <w:rPr>
+          <w:rFonts w:hint="cs" w:ascii="B Mitra" w:hAnsi="B Mitra" w:cs="B Mitra"/>
+          <w:sz w:val="18"/>
+          <w:rtl/>
+          <w:szCs w:val="18"/>
+        </w:rPr>
+        <w:t xml:space="preserve"> ارتقا می‌دهد. (۲) سپرهای حفاظتی عملیاتی: کران نااطمینانی یک‌طرفه </w:t>
       </w:r>
       <w:r>
         <w:rPr>
@@ -15395,26 +15491,26 @@
           <w:rtl/>
           <w:szCs w:val="18"/>
         </w:rPr>
-        <w:t xml:space="preserve"> خام را به ۰٫۴۱۵ (</w:t>
-      </w:r>
-      <w:r>
-        <w:rPr>
-          <w:rFonts w:ascii="Times New Roman" w:hAnsi="Times New Roman" w:cs="Times New Roman"/>
-          <w:bidi w:val="0"/>
-          <w:sz w:val="17"/>
-          <w:rtl w:val="0"/>
-          <w:szCs w:val="17"/>
-        </w:rPr>
-        <w:t>‎p = 0.0273‎</w:t>
-      </w:r>
-      <w:r>
-        <w:rPr>
-          <w:rFonts w:hint="cs" w:ascii="B Mitra" w:hAnsi="B Mitra" w:cs="B Mitra"/>
-          <w:sz w:val="18"/>
-          <w:rtl/>
-          <w:szCs w:val="18"/>
-        </w:rPr>
-        <w:t xml:space="preserve">) می‌رساند، اما نرخ هشدارهای کاذب را در نوسانات طبیعی به شدت بالا می‌برد زیرا واریانس مثبت طبیعی پیش‌بینی را به عنوان فرصت قلمداد می‌کند. همچنین حذف </w:t>
+        <w:t xml:space="preserve"> خام را به ۰٫۴۱۵ </w:t>
+      </w:r>
+      <w:r>
+        <w:rPr>
+          <w:rFonts w:ascii="Times New Roman" w:hAnsi="Times New Roman" w:cs="Times New Roman"/>
+          <w:bidi w:val="0"/>
+          <w:sz w:val="17"/>
+          <w:rtl w:val="0"/>
+          <w:szCs w:val="17"/>
+        </w:rPr>
+        <w:t>‎(p = 0.0273)‎</w:t>
+      </w:r>
+      <w:r>
+        <w:rPr>
+          <w:rFonts w:hint="cs" w:ascii="B Mitra" w:hAnsi="B Mitra" w:cs="B Mitra"/>
+          <w:sz w:val="18"/>
+          <w:rtl/>
+          <w:szCs w:val="18"/>
+        </w:rPr>
+        <w:t xml:space="preserve"> می‌رساند، اما نرخ هشدارهای کاذب را در نوسانات طبیعی به شدت بالا می‌برد زیرا واریانس مثبت طبیعی پیش‌بینی را به عنوان فرصت قلمداد می‌کند. همچنین حذف </w:t>
       </w:r>
       <w:r>
         <w:rPr>
@@ -15511,26 +15607,26 @@
           <w:rtl/>
           <w:szCs w:val="18"/>
         </w:rPr>
-        <w:t>جدول (</w:t>
-      </w:r>
-      <w:r>
-        <w:rPr>
-          <w:rFonts w:ascii="Times New Roman" w:hAnsi="Times New Roman" w:cs="Times New Roman"/>
-          <w:bidi w:val="0"/>
-          <w:sz w:val="17"/>
-          <w:rtl w:val="0"/>
-          <w:szCs w:val="17"/>
-        </w:rPr>
-        <w:t>‎6‎</w:t>
-      </w:r>
-      <w:r>
-        <w:rPr>
-          <w:rFonts w:hint="cs" w:ascii="B Mitra" w:hAnsi="B Mitra" w:cs="B Mitra"/>
-          <w:sz w:val="18"/>
-          <w:rtl/>
-          <w:szCs w:val="18"/>
-        </w:rPr>
-        <w:t>) مشخصات نمونه‌ای از پذیرندگان منتخب را بر روی داده‌های شبیه‌سازی‌شده نشان می‌دهد.</w:t>
+        <w:t xml:space="preserve">جدول </w:t>
+      </w:r>
+      <w:r>
+        <w:rPr>
+          <w:rFonts w:ascii="Times New Roman" w:hAnsi="Times New Roman" w:cs="Times New Roman"/>
+          <w:bidi w:val="0"/>
+          <w:sz w:val="17"/>
+          <w:rtl w:val="0"/>
+          <w:szCs w:val="17"/>
+        </w:rPr>
+        <w:t>‎(6)‎</w:t>
+      </w:r>
+      <w:r>
+        <w:rPr>
+          <w:rFonts w:hint="cs" w:ascii="B Mitra" w:hAnsi="B Mitra" w:cs="B Mitra"/>
+          <w:sz w:val="18"/>
+          <w:rtl/>
+          <w:szCs w:val="18"/>
+        </w:rPr>
+        <w:t xml:space="preserve"> مشخصات نمونه‌ای از پذیرندگان منتخب را بر روی داده‌های شبیه‌سازی‌شده نشان می‌دهد.</w:t>
       </w:r>
     </w:p>
     <w:p>
@@ -15546,26 +15642,26 @@
           <w:rtl/>
           <w:szCs w:val="17"/>
         </w:rPr>
-        <w:t>جدول (</w:t>
-      </w:r>
-      <w:r>
-        <w:rPr>
-          <w:rFonts w:ascii="Times New Roman" w:hAnsi="Times New Roman" w:cs="Times New Roman"/>
-          <w:bidi w:val="0"/>
-          <w:sz w:val="17"/>
-          <w:rtl w:val="0"/>
-          <w:szCs w:val="17"/>
-        </w:rPr>
-        <w:t>‎6‎</w:t>
-      </w:r>
-      <w:r>
-        <w:rPr>
-          <w:rFonts w:hint="cs" w:ascii="B Mitra" w:hAnsi="B Mitra" w:cs="B Mitra"/>
-          <w:sz w:val="17"/>
-          <w:rtl/>
-          <w:szCs w:val="17"/>
-        </w:rPr>
-        <w:t>) : مشخصات پذیرندگان نمونه منتخب با بالاترین اولویت کمپین</w:t>
+        <w:t xml:space="preserve">جدول </w:t>
+      </w:r>
+      <w:r>
+        <w:rPr>
+          <w:rFonts w:ascii="Times New Roman" w:hAnsi="Times New Roman" w:cs="Times New Roman"/>
+          <w:bidi w:val="0"/>
+          <w:sz w:val="17"/>
+          <w:rtl w:val="0"/>
+          <w:szCs w:val="17"/>
+        </w:rPr>
+        <w:t>‎(6)‎</w:t>
+      </w:r>
+      <w:r>
+        <w:rPr>
+          <w:rFonts w:hint="cs" w:ascii="B Mitra" w:hAnsi="B Mitra" w:cs="B Mitra"/>
+          <w:sz w:val="17"/>
+          <w:rtl/>
+          <w:szCs w:val="17"/>
+        </w:rPr>
+        <w:t xml:space="preserve"> : مشخصات پذیرندگان نمونه منتخب با بالاترین اولویت کمپین</w:t>
       </w:r>
     </w:p>
     <w:tbl>
@@ -16929,26 +17025,26 @@
           <w:rtl/>
           <w:szCs w:val="17"/>
         </w:rPr>
-        <w:t>شکل (</w:t>
-      </w:r>
-      <w:r>
-        <w:rPr>
-          <w:rFonts w:ascii="Times New Roman" w:hAnsi="Times New Roman" w:cs="Times New Roman"/>
-          <w:bidi w:val="0"/>
-          <w:sz w:val="17"/>
-          <w:rtl w:val="0"/>
-          <w:szCs w:val="17"/>
-        </w:rPr>
-        <w:t>‎5‎</w:t>
-      </w:r>
-      <w:r>
-        <w:rPr>
-          <w:rFonts w:hint="cs" w:ascii="B Mitra" w:hAnsi="B Mitra" w:cs="B Mitra"/>
-          <w:sz w:val="17"/>
-          <w:rtl/>
-          <w:szCs w:val="17"/>
-        </w:rPr>
-        <w:t>) : دقت بازیافت فرصت (</w:t>
+        <w:t xml:space="preserve">شکل </w:t>
+      </w:r>
+      <w:r>
+        <w:rPr>
+          <w:rFonts w:ascii="Times New Roman" w:hAnsi="Times New Roman" w:cs="Times New Roman"/>
+          <w:bidi w:val="0"/>
+          <w:sz w:val="17"/>
+          <w:rtl w:val="0"/>
+          <w:szCs w:val="17"/>
+        </w:rPr>
+        <w:t>‎(5)‎</w:t>
+      </w:r>
+      <w:r>
+        <w:rPr>
+          <w:rFonts w:hint="cs" w:ascii="B Mitra" w:hAnsi="B Mitra" w:cs="B Mitra"/>
+          <w:sz w:val="17"/>
+          <w:rtl/>
+          <w:szCs w:val="17"/>
+        </w:rPr>
+        <w:t xml:space="preserve"> : دقت بازیافت فرصت (</w:t>
       </w:r>
       <w:r>
         <w:rPr>
@@ -16982,26 +17078,26 @@
           <w:rtl/>
           <w:szCs w:val="18"/>
         </w:rPr>
-        <w:t>تحلیل تورش پذیرندگان خرد (</w:t>
-      </w:r>
-      <w:r>
-        <w:rPr>
-          <w:rFonts w:ascii="Times New Roman" w:hAnsi="Times New Roman" w:cs="Times New Roman"/>
-          <w:bidi w:val="0"/>
-          <w:sz w:val="17"/>
-          <w:rtl w:val="0"/>
-          <w:szCs w:val="17"/>
-        </w:rPr>
-        <w:t>‎Micro-Merchant Bias‎</w:t>
-      </w:r>
-      <w:r>
-        <w:rPr>
-          <w:rFonts w:hint="cs" w:ascii="B Mitra" w:hAnsi="B Mitra" w:cs="B Mitra"/>
-          <w:sz w:val="18"/>
-          <w:rtl/>
-          <w:szCs w:val="18"/>
-        </w:rPr>
-        <w:t xml:space="preserve">): به دلیل مخرج کوچک در پذیرندگان کم‌تراکنش، شاخص </w:t>
+        <w:t xml:space="preserve">تحلیل تورش پذیرندگان خرد </w:t>
+      </w:r>
+      <w:r>
+        <w:rPr>
+          <w:rFonts w:ascii="Times New Roman" w:hAnsi="Times New Roman" w:cs="Times New Roman"/>
+          <w:bidi w:val="0"/>
+          <w:sz w:val="17"/>
+          <w:rtl w:val="0"/>
+          <w:szCs w:val="17"/>
+        </w:rPr>
+        <w:t>‎(Micro-Merchant Bias)‎</w:t>
+      </w:r>
+      <w:r>
+        <w:rPr>
+          <w:rFonts w:hint="cs" w:ascii="B Mitra" w:hAnsi="B Mitra" w:cs="B Mitra"/>
+          <w:sz w:val="18"/>
+          <w:rtl/>
+          <w:szCs w:val="18"/>
+        </w:rPr>
+        <w:t xml:space="preserve">: به دلیل مخرج کوچک در پذیرندگان کم‌تراکنش، شاخص </w:t>
       </w:r>
       <w:r>
         <w:rPr>
@@ -17020,64 +17116,26 @@
           <w:rtl/>
           <w:szCs w:val="18"/>
         </w:rPr>
-        <w:t xml:space="preserve"> در حالت خام به پذیرندگان خرد حساس است (۵۶٫۰ ± ۱۶٫۵٪ کاندیداهای زیر ۱۰ تراکنش). بررسی حساسیت نشان می‌دهد اعمال آستانه‌های تراکنش </w:t>
-      </w:r>
-      <w:r>
-        <w:rPr>
-          <w:rFonts w:ascii="Times New Roman" w:hAnsi="Times New Roman" w:cs="Times New Roman"/>
-          <w:bidi w:val="0"/>
-          <w:sz w:val="17"/>
-          <w:rtl w:val="0"/>
-          <w:szCs w:val="17"/>
-        </w:rPr>
-        <w:t>‎Y ≥ 5‎</w:t>
-      </w:r>
-      <w:r>
-        <w:rPr>
-          <w:rFonts w:hint="cs" w:ascii="B Mitra" w:hAnsi="B Mitra" w:cs="B Mitra"/>
-          <w:sz w:val="18"/>
-          <w:rtl/>
-          <w:szCs w:val="18"/>
-        </w:rPr>
-        <w:t xml:space="preserve">، </w:t>
-      </w:r>
-      <w:r>
-        <w:rPr>
-          <w:rFonts w:ascii="Times New Roman" w:hAnsi="Times New Roman" w:cs="Times New Roman"/>
-          <w:bidi w:val="0"/>
-          <w:sz w:val="17"/>
-          <w:rtl w:val="0"/>
-          <w:szCs w:val="17"/>
-        </w:rPr>
-        <w:t>‎10‎</w:t>
-      </w:r>
-      <w:r>
-        <w:rPr>
-          <w:rFonts w:hint="cs" w:ascii="B Mitra" w:hAnsi="B Mitra" w:cs="B Mitra"/>
-          <w:sz w:val="18"/>
-          <w:rtl/>
-          <w:szCs w:val="18"/>
-        </w:rPr>
-        <w:t xml:space="preserve"> و </w:t>
-      </w:r>
-      <w:r>
-        <w:rPr>
-          <w:rFonts w:ascii="Times New Roman" w:hAnsi="Times New Roman" w:cs="Times New Roman"/>
-          <w:bidi w:val="0"/>
-          <w:sz w:val="17"/>
-          <w:rtl w:val="0"/>
-          <w:szCs w:val="17"/>
-        </w:rPr>
-        <w:t>‎20‎</w:t>
-      </w:r>
-      <w:r>
-        <w:rPr>
-          <w:rFonts w:hint="cs" w:ascii="B Mitra" w:hAnsi="B Mitra" w:cs="B Mitra"/>
-          <w:sz w:val="18"/>
-          <w:rtl/>
-          <w:szCs w:val="18"/>
-        </w:rPr>
-        <w:t xml:space="preserve">، سهم کاندیداهای خرد را به ترتیب به ۳۴٫۱٪، ۱۸٫۲٪ و ۴٫۳٪ کاهش می‌دهد. اعمال فیلتر ۱۰ تراکنش دقت را در سطح ۰٫۲۸۶ ± ۰٫۰۵۶ و </w:t>
+        <w:t xml:space="preserve"> در حالت خام به پذیرندگان خرد حساس است (۵۶٫۰ ± ۱۶٫۵٪ کاندیداهای زیر ۱۰ تراکنش). بررسی حساسیت طراحی امتیاز نشان می‌دهد اعمال فیلتر حداقل تراکنش </w:t>
+      </w:r>
+      <w:r>
+        <w:rPr>
+          <w:rFonts w:ascii="Times New Roman" w:hAnsi="Times New Roman" w:cs="Times New Roman"/>
+          <w:bidi w:val="0"/>
+          <w:sz w:val="17"/>
+          <w:rtl w:val="0"/>
+          <w:szCs w:val="17"/>
+        </w:rPr>
+        <w:t>‎Y ≥ 10‎</w:t>
+      </w:r>
+      <w:r>
+        <w:rPr>
+          <w:rFonts w:hint="cs" w:ascii="B Mitra" w:hAnsi="B Mitra" w:cs="B Mitra"/>
+          <w:sz w:val="18"/>
+          <w:rtl/>
+          <w:szCs w:val="18"/>
+        </w:rPr>
+        <w:t xml:space="preserve"> سهم کاندیداهای خرد را کاملاً به صفر (۰٫۰ ± ۰٫۰٪) رسانده و دقت را در ۰٫۲۸۶ ± ۰٫۰۵۶ و </w:t>
       </w:r>
       <w:r>
         <w:rPr>
@@ -17096,7 +17154,26 @@
           <w:rtl/>
           <w:szCs w:val="18"/>
         </w:rPr>
-        <w:t xml:space="preserve"> را در ۰٫۳۲۷ ± ۰٫۰۷۷ تثبیت می‌نماید. همچنین ضریب پیوسته اتکای فعالیت با </w:t>
+        <w:t xml:space="preserve"> را در ۰٫۳۲۷ ± ۰٫۰۷۷ تثبیت می‌نماید. فرمولاسیون ترکیبی مطلق-نسبی سهم پایانه‌های خرد را به ۴۷٫۷ ± ۱۸٫۶٪ تعدیل کرده و تعادل بهتری با دقت ۰٫۳۶۳ ± ۰٫۱۰۲ و </w:t>
+      </w:r>
+      <w:r>
+        <w:rPr>
+          <w:rFonts w:ascii="Times New Roman" w:hAnsi="Times New Roman" w:cs="Times New Roman"/>
+          <w:bidi w:val="0"/>
+          <w:sz w:val="17"/>
+          <w:rtl w:val="0"/>
+          <w:szCs w:val="17"/>
+        </w:rPr>
+        <w:t>‎NDCG‎</w:t>
+      </w:r>
+      <w:r>
+        <w:rPr>
+          <w:rFonts w:hint="cs" w:ascii="B Mitra" w:hAnsi="B Mitra" w:cs="B Mitra"/>
+          <w:sz w:val="18"/>
+          <w:rtl/>
+          <w:szCs w:val="18"/>
+        </w:rPr>
+        <w:t xml:space="preserve"> برابر ۰٫۳۷۴ ± ۰٫۱۰۴ فراهم می‌سازد. همچنین ضریب پیوسته اتکای فعالیت با </w:t>
       </w:r>
       <w:r>
         <w:rPr>
@@ -17168,64 +17245,64 @@
           <w:rtl/>
           <w:szCs w:val="18"/>
         </w:rPr>
-        <w:t xml:space="preserve"> بر مبنای «پروتکل الف: بازیابی و اولویت‌بندی افت ساختاری مستمر» (</w:t>
-      </w:r>
-      <w:r>
-        <w:rPr>
-          <w:rFonts w:ascii="Times New Roman" w:hAnsi="Times New Roman" w:cs="Times New Roman"/>
-          <w:bidi w:val="0"/>
-          <w:sz w:val="17"/>
-          <w:rtl w:val="0"/>
-          <w:szCs w:val="17"/>
-        </w:rPr>
-        <w:t>‎Persistent Underperformance Recovery‎</w:t>
-      </w:r>
-      <w:r>
-        <w:rPr>
-          <w:rFonts w:hint="cs" w:ascii="B Mitra" w:hAnsi="B Mitra" w:cs="B Mitra"/>
-          <w:sz w:val="18"/>
-          <w:rtl/>
-          <w:szCs w:val="18"/>
-        </w:rPr>
-        <w:t>) عمل می‌کند که در آن واگرایی نزولی در دوره پایش (دوره ۴) آشکار شده و در پنجره تصمیم‌گیری کمپین (دوره ۵) استمرار می‌یابد. طراحی پروتکل مانع از دسترسی به اطلاعات دوره آزمون ۵ در زمان پیش‌بینی و رتبه‌بندی می‌شود. در نقطه مقابل، در «پروتکل ب: پیش‌بینی شوک‌های ناگهانی پیشینی» (</w:t>
-      </w:r>
-      <w:r>
-        <w:rPr>
-          <w:rFonts w:ascii="Times New Roman" w:hAnsi="Times New Roman" w:cs="Times New Roman"/>
-          <w:bidi w:val="0"/>
-          <w:sz w:val="17"/>
-          <w:rtl w:val="0"/>
-          <w:szCs w:val="17"/>
-        </w:rPr>
-        <w:t>‎Pure Ex-Ante Shocks‎</w:t>
-      </w:r>
-      <w:r>
-        <w:rPr>
-          <w:rFonts w:hint="cs" w:ascii="B Mitra" w:hAnsi="B Mitra" w:cs="B Mitra"/>
-          <w:sz w:val="18"/>
-          <w:rtl/>
-          <w:szCs w:val="18"/>
-        </w:rPr>
-        <w:t>) که افت به صورت تصادفی صرفاً در دوره ۵ بدون هیچ نشانه قبلی رخ دهد، هیچ مدلی بدون ویژگی‌های پیش‌نگر قادر به تشخیص برتر از شانس تصادفی (۱۴٫۶٪) نخواهد بود. (۲) اثر هم‌نوع‌خواری تجاری (</w:t>
-      </w:r>
-      <w:r>
-        <w:rPr>
-          <w:rFonts w:ascii="Times New Roman" w:hAnsi="Times New Roman" w:cs="Times New Roman"/>
-          <w:bidi w:val="0"/>
-          <w:sz w:val="17"/>
-          <w:rtl w:val="0"/>
-          <w:szCs w:val="17"/>
-        </w:rPr>
-        <w:t>‎Peer Cannibalization‎</w:t>
-      </w:r>
-      <w:r>
-        <w:rPr>
-          <w:rFonts w:hint="cs" w:ascii="B Mitra" w:hAnsi="B Mitra" w:cs="B Mitra"/>
-          <w:sz w:val="18"/>
-          <w:rtl/>
-          <w:szCs w:val="18"/>
-        </w:rPr>
-        <w:t xml:space="preserve">): چارچوب استقلال تقاضای پذیرندگان را فرض می‌کند و رقابت محلی پایانه‌های همسایه به صورت مستقیم لحاظ نشده است. (۳) متغیرهای مشاهده‌نشده: داده‌ها محدود به ۵ فیلد پایه دفتر کل بوده و اطلاعاتی نظیر مساحت فروشگاه، تعداد پرسنل و ساعات کاری در دسترس نیست. (۴) محیط شبیه‌سازی: شاخص </w:t>
+        <w:t xml:space="preserve"> بر مبنای «پروتکل الف: بازیابی و اولویت‌بندی افت ساختاری مستمر» </w:t>
+      </w:r>
+      <w:r>
+        <w:rPr>
+          <w:rFonts w:ascii="Times New Roman" w:hAnsi="Times New Roman" w:cs="Times New Roman"/>
+          <w:bidi w:val="0"/>
+          <w:sz w:val="17"/>
+          <w:rtl w:val="0"/>
+          <w:szCs w:val="17"/>
+        </w:rPr>
+        <w:t>‎(Persistent Underperformance Recovery)‎</w:t>
+      </w:r>
+      <w:r>
+        <w:rPr>
+          <w:rFonts w:hint="cs" w:ascii="B Mitra" w:hAnsi="B Mitra" w:cs="B Mitra"/>
+          <w:sz w:val="18"/>
+          <w:rtl/>
+          <w:szCs w:val="18"/>
+        </w:rPr>
+        <w:t xml:space="preserve"> عمل می‌کند که در آن واگرایی نزولی در دوره پایش (دوره ۴) آشکار شده و در پنجره تصمیم‌گیری کمپین (دوره ۵) استمرار می‌یابد. طراحی پروتکل مانع از دسترسی به اطلاعات دوره آزمون ۵ در زمان پیش‌بینی و رتبه‌بندی می‌شود. در نقطه مقابل، در «پروتکل ب: پیش‌بینی شوک‌های ناگهانی پیشینی» </w:t>
+      </w:r>
+      <w:r>
+        <w:rPr>
+          <w:rFonts w:ascii="Times New Roman" w:hAnsi="Times New Roman" w:cs="Times New Roman"/>
+          <w:bidi w:val="0"/>
+          <w:sz w:val="17"/>
+          <w:rtl w:val="0"/>
+          <w:szCs w:val="17"/>
+        </w:rPr>
+        <w:t>‎(Pure Ex-Ante Shocks)‎</w:t>
+      </w:r>
+      <w:r>
+        <w:rPr>
+          <w:rFonts w:hint="cs" w:ascii="B Mitra" w:hAnsi="B Mitra" w:cs="B Mitra"/>
+          <w:sz w:val="18"/>
+          <w:rtl/>
+          <w:szCs w:val="18"/>
+        </w:rPr>
+        <w:t xml:space="preserve"> که افت به صورت تصادفی صرفاً در دوره ۵ بدون هیچ نشانه قبلی رخ دهد، هیچ مدلی بدون ویژگی‌های پیش‌نگر قادر به تشخیص برتر از شانس تصادفی (۱۴٫۶٪) نخواهد بود. (۲) اثر هم‌نوع‌خواری تجاری </w:t>
+      </w:r>
+      <w:r>
+        <w:rPr>
+          <w:rFonts w:ascii="Times New Roman" w:hAnsi="Times New Roman" w:cs="Times New Roman"/>
+          <w:bidi w:val="0"/>
+          <w:sz w:val="17"/>
+          <w:rtl w:val="0"/>
+          <w:szCs w:val="17"/>
+        </w:rPr>
+        <w:t>‎(Peer Cannibalization)‎</w:t>
+      </w:r>
+      <w:r>
+        <w:rPr>
+          <w:rFonts w:hint="cs" w:ascii="B Mitra" w:hAnsi="B Mitra" w:cs="B Mitra"/>
+          <w:sz w:val="18"/>
+          <w:rtl/>
+          <w:szCs w:val="18"/>
+        </w:rPr>
+        <w:t xml:space="preserve">: چارچوب استقلال تقاضای پذیرندگان را فرض می‌کند و رقابت محلی پایانه‌های همسایه به صورت مستقیم لحاظ نشده است. (۳) متغیرهای مشاهده‌نشده: داده‌ها محدود به ۵ فیلد پایه دفتر کل بوده و اطلاعاتی نظیر مساحت فروشگاه، تعداد پرسنل و ساعات کاری در دسترس نیست. (۴) محیط شبیه‌سازی: شاخص </w:t>
       </w:r>
       <w:r>
         <w:rPr>
@@ -17394,26 +17471,26 @@
           <w:rtl/>
           <w:szCs w:val="18"/>
         </w:rPr>
-        <w:t xml:space="preserve"> در قالب یک ساختار تصمیم‌گیری سه‌لایه برای اولویت‌بندی فرصت‌های بدون برچسب مداخله (</w:t>
-      </w:r>
-      <w:r>
-        <w:rPr>
-          <w:rFonts w:ascii="Times New Roman" w:hAnsi="Times New Roman" w:cs="Times New Roman"/>
-          <w:bidi w:val="0"/>
-          <w:sz w:val="17"/>
-          <w:rtl w:val="0"/>
-          <w:szCs w:val="17"/>
-        </w:rPr>
-        <w:t>‎Treatment-label-free‎</w:t>
-      </w:r>
-      <w:r>
-        <w:rPr>
-          <w:rFonts w:hint="cs" w:ascii="B Mitra" w:hAnsi="B Mitra" w:cs="B Mitra"/>
-          <w:sz w:val="18"/>
-          <w:rtl/>
-          <w:szCs w:val="18"/>
-        </w:rPr>
-        <w:t xml:space="preserve">) پذیرندگان ارائه گردید. </w:t>
+        <w:t xml:space="preserve"> در قالب یک ساختار تصمیم‌گیری سه‌لایه برای اولویت‌بندی فرصت‌های بدون برچسب مداخله </w:t>
+      </w:r>
+      <w:r>
+        <w:rPr>
+          <w:rFonts w:ascii="Times New Roman" w:hAnsi="Times New Roman" w:cs="Times New Roman"/>
+          <w:bidi w:val="0"/>
+          <w:sz w:val="17"/>
+          <w:rtl w:val="0"/>
+          <w:szCs w:val="17"/>
+        </w:rPr>
+        <w:t>‎(Treatment-label-free)‎</w:t>
+      </w:r>
+      <w:r>
+        <w:rPr>
+          <w:rFonts w:hint="cs" w:ascii="B Mitra" w:hAnsi="B Mitra" w:cs="B Mitra"/>
+          <w:sz w:val="18"/>
+          <w:rtl/>
+          <w:szCs w:val="18"/>
+        </w:rPr>
+        <w:t xml:space="preserve"> پذیرندگان ارائه گردید. </w:t>
       </w:r>
       <w:r>
         <w:rPr>
@@ -17485,26 +17562,26 @@
           <w:rtl/>
           <w:szCs w:val="18"/>
         </w:rPr>
-        <w:t xml:space="preserve"> با مدل‌های برآورد اثر علّی (</w:t>
-      </w:r>
-      <w:r>
-        <w:rPr>
-          <w:rFonts w:ascii="Times New Roman" w:hAnsi="Times New Roman" w:cs="Times New Roman"/>
-          <w:bidi w:val="0"/>
-          <w:sz w:val="17"/>
-          <w:rtl w:val="0"/>
-          <w:szCs w:val="17"/>
-        </w:rPr>
-        <w:t>‎ITE Uplift Modeling‎</w:t>
-      </w:r>
-      <w:r>
-        <w:rPr>
-          <w:rFonts w:hint="cs" w:ascii="B Mitra" w:hAnsi="B Mitra" w:cs="B Mitra"/>
-          <w:sz w:val="18"/>
-          <w:rtl/>
-          <w:szCs w:val="18"/>
-        </w:rPr>
-        <w:t xml:space="preserve">) پس از اجرای آزمایشی کمپین در شبکه بانکی پیگیری خواهد شد. بیانیه دسترسی به کد و محرمانگی داده‌ها: پیاده‌سازی کامل چارچوب و کدهای تولید داده‌های شبیه‌سازی پس از انتشار مقاله در مخزن گیت‌هاب در دسترس قرار خواهد گرفت. داده‌های شبیه‌سازی با سیدهای ثبت‌شده کاملاً قابل بازتولید هستند؛ اما انتشار داده‌های واقعی سوییچ‌های شاپرکی به دلیل الزامات محرمانگی و استاندارد </w:t>
+        <w:t xml:space="preserve"> با مدل‌های برآورد اثر علّی </w:t>
+      </w:r>
+      <w:r>
+        <w:rPr>
+          <w:rFonts w:ascii="Times New Roman" w:hAnsi="Times New Roman" w:cs="Times New Roman"/>
+          <w:bidi w:val="0"/>
+          <w:sz w:val="17"/>
+          <w:rtl w:val="0"/>
+          <w:szCs w:val="17"/>
+        </w:rPr>
+        <w:t>‎(ITE Uplift Modeling)‎</w:t>
+      </w:r>
+      <w:r>
+        <w:rPr>
+          <w:rFonts w:hint="cs" w:ascii="B Mitra" w:hAnsi="B Mitra" w:cs="B Mitra"/>
+          <w:sz w:val="18"/>
+          <w:rtl/>
+          <w:szCs w:val="18"/>
+        </w:rPr>
+        <w:t xml:space="preserve"> پس از اجرای آزمایشی کمپین در شبکه بانکی پیگیری خواهد شد. بیانیه دسترسی به کد و محرمانگی داده‌ها: پیاده‌سازی کامل چارچوب و کدهای تولید داده‌های شبیه‌سازی پس از انتشار مقاله در مخزن گیت‌هاب در دسترس قرار خواهد گرفت. داده‌های شبیه‌سازی با سیدهای ثبت‌شده کاملاً قابل بازتولید هستند؛ اما انتشار داده‌های واقعی سوییچ‌های شاپرکی به دلیل الزامات محرمانگی و استاندارد </w:t>
       </w:r>
       <w:r>
         <w:rPr>
@@ -17874,7 +17951,7 @@
           <w:rtl w:val="0"/>
           <w:szCs w:val="10"/>
         </w:rPr>
-        <w:t>, Vol. 38, pp. 38213-38243, 2024.</w:t>
+        <w:t>, Vol. 38, pp. 38213-38243, 2025.</w:t>
       </w:r>
     </w:p>
     <w:p>

</xml_diff>